<commit_message>
feat(can): add deterministic arbitration evidence
</commit_message>
<xml_diff>
--- a/docs/ATEP_Volume_IV_CAN_Network_Engineering_Workbook.docx
+++ b/docs/ATEP_Volume_IV_CAN_Network_Engineering_Workbook.docx
@@ -143,7 +143,7 @@
                 <w:color w:val="0B2545"/>
                 <w:sz w:val="19"/>
               </w:rPr>
-              <w:t>0.1.0</w:t>
+              <w:t>0.2.0</w:t>
             </w:r>
           </w:p>
         </w:tc>
@@ -265,7 +265,7 @@
                 <w:color w:val="111827"/>
                 <w:sz w:val="19"/>
               </w:rPr>
-              <w:t>Increment IV-1 implemented</w:t>
+              <w:t>Increments IV-1 and IV-2 implemented</w:t>
             </w:r>
           </w:p>
         </w:tc>
@@ -390,7 +390,7 @@
           <w:color w:val="0B2545"/>
           <w:sz w:val="21"/>
         </w:rPr>
-        <w:t>1. Document Purpose</w:t>
+        <w:t>Document Purpose</w:t>
       </w:r>
     </w:p>
     <w:p>
@@ -409,7 +409,7 @@
           <w:color w:val="0B2545"/>
           <w:sz w:val="21"/>
         </w:rPr>
-        <w:t>2. Document Control</w:t>
+        <w:t>Document Control</w:t>
       </w:r>
     </w:p>
     <w:p>
@@ -428,7 +428,7 @@
           <w:color w:val="0B2545"/>
           <w:sz w:val="21"/>
         </w:rPr>
-        <w:t>3. Revision History</w:t>
+        <w:t>Revision History</w:t>
       </w:r>
     </w:p>
     <w:p>
@@ -447,7 +447,7 @@
           <w:color w:val="0B2545"/>
           <w:sz w:val="21"/>
         </w:rPr>
-        <w:t>4. Scope and Boundaries</w:t>
+        <w:t>Scope and Boundaries</w:t>
       </w:r>
     </w:p>
     <w:p>
@@ -466,7 +466,7 @@
           <w:color w:val="0B2545"/>
           <w:sz w:val="21"/>
         </w:rPr>
-        <w:t>5. Architecture</w:t>
+        <w:t>Architecture</w:t>
       </w:r>
     </w:p>
     <w:p>
@@ -485,7 +485,7 @@
           <w:color w:val="0B2545"/>
           <w:sz w:val="21"/>
         </w:rPr>
-        <w:t>6. Domain Model</w:t>
+        <w:t>Domain Model</w:t>
       </w:r>
     </w:p>
     <w:p>
@@ -504,7 +504,7 @@
           <w:color w:val="0B2545"/>
           <w:sz w:val="21"/>
         </w:rPr>
-        <w:t>7. Public API and Security</w:t>
+        <w:t>Public API and Security</w:t>
       </w:r>
     </w:p>
     <w:p>
@@ -523,7 +523,7 @@
           <w:color w:val="0B2545"/>
           <w:sz w:val="21"/>
         </w:rPr>
-        <w:t>8. Consistency and Evidence</w:t>
+        <w:t>Consistency and Evidence</w:t>
       </w:r>
     </w:p>
     <w:p>
@@ -542,7 +542,7 @@
           <w:color w:val="0B2545"/>
           <w:sz w:val="21"/>
         </w:rPr>
-        <w:t>9. Functional Requirements</w:t>
+        <w:t>Functional Requirements</w:t>
       </w:r>
     </w:p>
     <w:p>
@@ -561,7 +561,7 @@
           <w:color w:val="0B2545"/>
           <w:sz w:val="21"/>
         </w:rPr>
-        <w:t>10. Architecture Decisions</w:t>
+        <w:t>Architecture Decisions</w:t>
       </w:r>
     </w:p>
     <w:p>
@@ -580,7 +580,7 @@
           <w:color w:val="0B2545"/>
           <w:sz w:val="21"/>
         </w:rPr>
-        <w:t>11. Verification Catalogue</w:t>
+        <w:t>Verification Catalogue</w:t>
       </w:r>
     </w:p>
     <w:p>
@@ -599,7 +599,7 @@
           <w:color w:val="0B2545"/>
           <w:sz w:val="21"/>
         </w:rPr>
-        <w:t>12. Implemented Evidence</w:t>
+        <w:t>Implemented Evidence</w:t>
       </w:r>
     </w:p>
     <w:p>
@@ -618,7 +618,7 @@
           <w:color w:val="0B2545"/>
           <w:sz w:val="21"/>
         </w:rPr>
-        <w:t>13. Risks and Technical Debt</w:t>
+        <w:t>Risks and Technical Debt</w:t>
       </w:r>
     </w:p>
     <w:p>
@@ -637,7 +637,7 @@
           <w:color w:val="0B2545"/>
           <w:sz w:val="21"/>
         </w:rPr>
-        <w:t>14. Roadmap</w:t>
+        <w:t>Roadmap</w:t>
       </w:r>
     </w:p>
     <w:p>
@@ -656,7 +656,7 @@
           <w:color w:val="0B2545"/>
           <w:sz w:val="21"/>
         </w:rPr>
-        <w:t>15. Study Exercises</w:t>
+        <w:t>Study Exercises</w:t>
       </w:r>
     </w:p>
     <w:p>
@@ -893,7 +893,7 @@
                 <w:color w:val="111827"/>
                 <w:sz w:val="17"/>
               </w:rPr>
-              <w:t>Increment IV-1</w:t>
+              <w:t>Increments IV-1 and IV-2</w:t>
             </w:r>
           </w:p>
         </w:tc>
@@ -1297,6 +1297,95 @@
           </w:p>
         </w:tc>
       </w:tr>
+      <w:tr>
+        <w:trPr>
+          <w:cantSplit/>
+        </w:trPr>
+        <w:tc>
+          <w:tcPr>
+            <w:tcW w:type="dxa" w:w="1650"/>
+            <w:tcMar>
+              <w:top w:w="80" w:type="dxa"/>
+              <w:start w:w="120" w:type="dxa"/>
+              <w:bottom w:w="80" w:type="dxa"/>
+              <w:end w:w="120" w:type="dxa"/>
+            </w:tcMar>
+            <w:vAlign w:val="center"/>
+            <w:shd w:fill="FFFFFF"/>
+          </w:tcPr>
+          <w:p>
+            <w:pPr>
+              <w:spacing w:before="0" w:after="40" w:line="252" w:lineRule="auto"/>
+              <w:jc w:val="center"/>
+            </w:pPr>
+            <w:r>
+              <w:rPr>
+                <w:rFonts w:ascii="Calibri" w:hAnsi="Calibri"/>
+                <w:b w:val="0"/>
+                <w:color w:val="111827"/>
+                <w:sz w:val="17"/>
+              </w:rPr>
+              <w:t>0.2.0</w:t>
+            </w:r>
+          </w:p>
+        </w:tc>
+        <w:tc>
+          <w:tcPr>
+            <w:tcW w:type="dxa" w:w="4450"/>
+            <w:tcMar>
+              <w:top w:w="80" w:type="dxa"/>
+              <w:start w:w="120" w:type="dxa"/>
+              <w:bottom w:w="80" w:type="dxa"/>
+              <w:end w:w="120" w:type="dxa"/>
+            </w:tcMar>
+            <w:vAlign w:val="center"/>
+            <w:shd w:fill="FFFFFF"/>
+          </w:tcPr>
+          <w:p>
+            <w:pPr>
+              <w:spacing w:before="0" w:after="40" w:line="252" w:lineRule="auto"/>
+              <w:jc w:val="left"/>
+            </w:pPr>
+            <w:r>
+              <w:rPr>
+                <w:rFonts w:ascii="Calibri" w:hAnsi="Calibri"/>
+                <w:b w:val="0"/>
+                <w:color w:val="111827"/>
+                <w:sz w:val="17"/>
+              </w:rPr>
+              <w:t>2026-08-24</w:t>
+            </w:r>
+          </w:p>
+        </w:tc>
+        <w:tc>
+          <w:tcPr>
+            <w:tcW w:type="dxa" w:w="3260"/>
+            <w:tcMar>
+              <w:top w:w="80" w:type="dxa"/>
+              <w:start w:w="120" w:type="dxa"/>
+              <w:bottom w:w="80" w:type="dxa"/>
+              <w:end w:w="120" w:type="dxa"/>
+            </w:tcMar>
+            <w:vAlign w:val="center"/>
+            <w:shd w:fill="FFFFFF"/>
+          </w:tcPr>
+          <w:p>
+            <w:pPr>
+              <w:spacing w:before="0" w:after="40" w:line="252" w:lineRule="auto"/>
+              <w:jc w:val="left"/>
+            </w:pPr>
+            <w:r>
+              <w:rPr>
+                <w:rFonts w:ascii="Calibri" w:hAnsi="Calibri"/>
+                <w:b w:val="0"/>
+                <w:color w:val="111827"/>
+                <w:sz w:val="17"/>
+              </w:rPr>
+              <w:t>Added deterministic arbitration, nominal transmission duration, delivery evidence, utilization metrics, replay-safe persistence, APIs, migration, and tests.</w:t>
+            </w:r>
+          </w:p>
+        </w:tc>
+      </w:tr>
     </w:tbl>
     <w:p>
       <w:pPr>
@@ -1478,6 +1567,57 @@
     </w:p>
     <w:p>
       <w:pPr>
+        <w:pStyle w:val="ListBullet"/>
+        <w:numPr>
+          <w:ilvl w:val="0"/>
+          <w:numId w:val="11"/>
+        </w:numPr>
+      </w:pPr>
+      <w:r>
+        <w:rPr>
+          <w:rFonts w:ascii="Calibri" w:hAnsi="Calibri"/>
+          <w:color w:val="111827"/>
+          <w:sz w:val="22"/>
+        </w:rPr>
+        <w:t>Batches of one to 64 unique contenders with explicit readiness offsets.</w:t>
+      </w:r>
+    </w:p>
+    <w:p>
+      <w:pPr>
+        <w:pStyle w:val="ListBullet"/>
+        <w:numPr>
+          <w:ilvl w:val="0"/>
+          <w:numId w:val="11"/>
+        </w:numPr>
+      </w:pPr>
+      <w:r>
+        <w:rPr>
+          <w:rFonts w:ascii="Calibri" w:hAnsi="Calibri"/>
+          <w:color w:val="111827"/>
+          <w:sz w:val="22"/>
+        </w:rPr>
+        <w:t>CAN-ID priority, standard/extended tie-break, calculated nominal duration, and serial delivery.</w:t>
+      </w:r>
+    </w:p>
+    <w:p>
+      <w:pPr>
+        <w:pStyle w:val="ListBullet"/>
+        <w:numPr>
+          <w:ilvl w:val="0"/>
+          <w:numId w:val="11"/>
+        </w:numPr>
+      </w:pPr>
+      <w:r>
+        <w:rPr>
+          <w:rFonts w:ascii="Calibri" w:hAnsi="Calibri"/>
+          <w:color w:val="111827"/>
+          <w:sz w:val="22"/>
+        </w:rPr>
+        <w:t>Occupied, idle, utilization, latency, ordered transmission, and consumer delivery evidence.</w:t>
+      </w:r>
+    </w:p>
+    <w:p>
+      <w:pPr>
         <w:pStyle w:val="Heading2"/>
         <w:keepNext/>
         <w:keepLines/>
@@ -1500,7 +1640,7 @@
           <w:color w:val="111827"/>
           <w:sz w:val="22"/>
         </w:rPr>
-        <w:t>CAN arbitration and calculated bus timing.</w:t>
+        <w:t>Bit stuffing, acknowledgement, retransmission, and oscillator/physical-layer effects.</w:t>
       </w:r>
     </w:p>
     <w:p>
@@ -1614,7 +1754,7 @@
           <w:color w:val="111827"/>
           <w:sz w:val="22"/>
         </w:rPr>
-        <w:t>Request flow: authenticated client -&gt; FastAPI router -&gt; CAN RBAC dependency -&gt; vehicle lookup -&gt; CAN domain service -&gt; PostgreSQL aggregate/transmission + audit + transactional outbox -&gt; response.</w:t>
+        <w:t>Request flow: authenticated client -&gt; FastAPI router -&gt; CAN RBAC dependency -&gt; vehicle lookup -&gt; CAN domain/arbitration service -&gt; PostgreSQL aggregate/evidence + audit + transactional outbox -&gt; response.</w:t>
       </w:r>
     </w:p>
     <w:p>
@@ -1659,6 +1799,24 @@
           <w:sz w:val="22"/>
         </w:rPr>
         <w:t xml:space="preserve"> stores command identity, contract, producer, CAN ID and format, request, payload, sequence, logical time, versions, and actor.</w:t>
+      </w:r>
+    </w:p>
+    <w:p>
+      <w:r>
+        <w:rPr>
+          <w:rFonts w:ascii="Consolas" w:hAnsi="Consolas"/>
+          <w:color w:val="1F4D78"/>
+          <w:sz w:val="19"/>
+        </w:rPr>
+        <w:t>CanArbitrationExecution</w:t>
+      </w:r>
+      <w:r>
+        <w:rPr>
+          <w:rFonts w:ascii="Calibri" w:hAnsi="Calibri"/>
+          <w:color w:val="111827"/>
+          <w:sz w:val="22"/>
+        </w:rPr>
+        <w:t xml:space="preserve"> stores the canonical batch request, ordered result, contender count, aggregate versions, requesting actor, and timestamps. Each winner also creates normal transmission evidence so history remains coherent across individual and arbitrated sends.</w:t>
       </w:r>
     </w:p>
     <w:p>
@@ -2289,6 +2447,357 @@
           </w:p>
         </w:tc>
       </w:tr>
+      <w:tr>
+        <w:trPr>
+          <w:cantSplit/>
+        </w:trPr>
+        <w:tc>
+          <w:tcPr>
+            <w:tcW w:type="dxa" w:w="1150"/>
+            <w:tcMar>
+              <w:top w:w="80" w:type="dxa"/>
+              <w:start w:w="120" w:type="dxa"/>
+              <w:bottom w:w="80" w:type="dxa"/>
+              <w:end w:w="120" w:type="dxa"/>
+            </w:tcMar>
+            <w:vAlign w:val="center"/>
+            <w:shd w:fill="FFFFFF"/>
+          </w:tcPr>
+          <w:p>
+            <w:pPr>
+              <w:spacing w:before="0" w:after="40" w:line="252" w:lineRule="auto"/>
+              <w:jc w:val="center"/>
+            </w:pPr>
+            <w:r>
+              <w:rPr>
+                <w:rFonts w:ascii="Calibri" w:hAnsi="Calibri"/>
+                <w:b w:val="0"/>
+                <w:color w:val="111827"/>
+                <w:sz w:val="16"/>
+              </w:rPr>
+              <w:t>POST</w:t>
+            </w:r>
+          </w:p>
+        </w:tc>
+        <w:tc>
+          <w:tcPr>
+            <w:tcW w:type="dxa" w:w="3700"/>
+            <w:tcMar>
+              <w:top w:w="80" w:type="dxa"/>
+              <w:start w:w="120" w:type="dxa"/>
+              <w:bottom w:w="80" w:type="dxa"/>
+              <w:end w:w="120" w:type="dxa"/>
+            </w:tcMar>
+            <w:vAlign w:val="center"/>
+            <w:shd w:fill="FFFFFF"/>
+          </w:tcPr>
+          <w:p>
+            <w:pPr>
+              <w:spacing w:before="0" w:after="40" w:line="252" w:lineRule="auto"/>
+              <w:jc w:val="left"/>
+            </w:pPr>
+            <w:r>
+              <w:rPr>
+                <w:rFonts w:ascii="Calibri" w:hAnsi="Calibri"/>
+                <w:b w:val="0"/>
+                <w:color w:val="111827"/>
+                <w:sz w:val="16"/>
+              </w:rPr>
+              <w:t>/api/v1/vehicles/{vehicle_id}/can-networks/arbitrations/execute</w:t>
+            </w:r>
+          </w:p>
+        </w:tc>
+        <w:tc>
+          <w:tcPr>
+            <w:tcW w:type="dxa" w:w="3100"/>
+            <w:tcMar>
+              <w:top w:w="80" w:type="dxa"/>
+              <w:start w:w="120" w:type="dxa"/>
+              <w:bottom w:w="80" w:type="dxa"/>
+              <w:end w:w="120" w:type="dxa"/>
+            </w:tcMar>
+            <w:vAlign w:val="center"/>
+            <w:shd w:fill="FFFFFF"/>
+          </w:tcPr>
+          <w:p>
+            <w:pPr>
+              <w:spacing w:before="0" w:after="40" w:line="252" w:lineRule="auto"/>
+              <w:jc w:val="left"/>
+            </w:pPr>
+            <w:r>
+              <w:rPr>
+                <w:rFonts w:ascii="Calibri" w:hAnsi="Calibri"/>
+                <w:b w:val="0"/>
+                <w:color w:val="111827"/>
+                <w:sz w:val="16"/>
+              </w:rPr>
+              <w:t>can_networks:manage</w:t>
+            </w:r>
+          </w:p>
+        </w:tc>
+        <w:tc>
+          <w:tcPr>
+            <w:tcW w:type="dxa" w:w="1410"/>
+            <w:tcMar>
+              <w:top w:w="80" w:type="dxa"/>
+              <w:start w:w="120" w:type="dxa"/>
+              <w:bottom w:w="80" w:type="dxa"/>
+              <w:end w:w="120" w:type="dxa"/>
+            </w:tcMar>
+            <w:vAlign w:val="center"/>
+            <w:shd w:fill="FFFFFF"/>
+          </w:tcPr>
+          <w:p>
+            <w:pPr>
+              <w:spacing w:before="0" w:after="40" w:line="252" w:lineRule="auto"/>
+              <w:jc w:val="left"/>
+            </w:pPr>
+            <w:r>
+              <w:rPr>
+                <w:rFonts w:ascii="Calibri" w:hAnsi="Calibri"/>
+                <w:b w:val="0"/>
+                <w:color w:val="111827"/>
+                <w:sz w:val="16"/>
+              </w:rPr>
+              <w:t>Execute a bounded arbitration batch.</w:t>
+            </w:r>
+          </w:p>
+        </w:tc>
+      </w:tr>
+      <w:tr>
+        <w:trPr>
+          <w:cantSplit/>
+        </w:trPr>
+        <w:tc>
+          <w:tcPr>
+            <w:tcW w:type="dxa" w:w="1150"/>
+            <w:tcMar>
+              <w:top w:w="80" w:type="dxa"/>
+              <w:start w:w="120" w:type="dxa"/>
+              <w:bottom w:w="80" w:type="dxa"/>
+              <w:end w:w="120" w:type="dxa"/>
+            </w:tcMar>
+            <w:vAlign w:val="center"/>
+            <w:shd w:fill="FFFFFF"/>
+          </w:tcPr>
+          <w:p>
+            <w:pPr>
+              <w:spacing w:before="0" w:after="40" w:line="252" w:lineRule="auto"/>
+              <w:jc w:val="center"/>
+            </w:pPr>
+            <w:r>
+              <w:rPr>
+                <w:rFonts w:ascii="Calibri" w:hAnsi="Calibri"/>
+                <w:b w:val="0"/>
+                <w:color w:val="111827"/>
+                <w:sz w:val="16"/>
+              </w:rPr>
+              <w:t>GET</w:t>
+            </w:r>
+          </w:p>
+        </w:tc>
+        <w:tc>
+          <w:tcPr>
+            <w:tcW w:type="dxa" w:w="3700"/>
+            <w:tcMar>
+              <w:top w:w="80" w:type="dxa"/>
+              <w:start w:w="120" w:type="dxa"/>
+              <w:bottom w:w="80" w:type="dxa"/>
+              <w:end w:w="120" w:type="dxa"/>
+            </w:tcMar>
+            <w:vAlign w:val="center"/>
+            <w:shd w:fill="FFFFFF"/>
+          </w:tcPr>
+          <w:p>
+            <w:pPr>
+              <w:spacing w:before="0" w:after="40" w:line="252" w:lineRule="auto"/>
+              <w:jc w:val="left"/>
+            </w:pPr>
+            <w:r>
+              <w:rPr>
+                <w:rFonts w:ascii="Calibri" w:hAnsi="Calibri"/>
+                <w:b w:val="0"/>
+                <w:color w:val="111827"/>
+                <w:sz w:val="16"/>
+              </w:rPr>
+              <w:t>/api/v1/vehicles/{vehicle_id}/can-networks/arbitrations</w:t>
+            </w:r>
+          </w:p>
+        </w:tc>
+        <w:tc>
+          <w:tcPr>
+            <w:tcW w:type="dxa" w:w="3100"/>
+            <w:tcMar>
+              <w:top w:w="80" w:type="dxa"/>
+              <w:start w:w="120" w:type="dxa"/>
+              <w:bottom w:w="80" w:type="dxa"/>
+              <w:end w:w="120" w:type="dxa"/>
+            </w:tcMar>
+            <w:vAlign w:val="center"/>
+            <w:shd w:fill="FFFFFF"/>
+          </w:tcPr>
+          <w:p>
+            <w:pPr>
+              <w:spacing w:before="0" w:after="40" w:line="252" w:lineRule="auto"/>
+              <w:jc w:val="left"/>
+            </w:pPr>
+            <w:r>
+              <w:rPr>
+                <w:rFonts w:ascii="Calibri" w:hAnsi="Calibri"/>
+                <w:b w:val="0"/>
+                <w:color w:val="111827"/>
+                <w:sz w:val="16"/>
+              </w:rPr>
+              <w:t>can_networks:read</w:t>
+            </w:r>
+          </w:p>
+        </w:tc>
+        <w:tc>
+          <w:tcPr>
+            <w:tcW w:type="dxa" w:w="1410"/>
+            <w:tcMar>
+              <w:top w:w="80" w:type="dxa"/>
+              <w:start w:w="120" w:type="dxa"/>
+              <w:bottom w:w="80" w:type="dxa"/>
+              <w:end w:w="120" w:type="dxa"/>
+            </w:tcMar>
+            <w:vAlign w:val="center"/>
+            <w:shd w:fill="FFFFFF"/>
+          </w:tcPr>
+          <w:p>
+            <w:pPr>
+              <w:spacing w:before="0" w:after="40" w:line="252" w:lineRule="auto"/>
+              <w:jc w:val="left"/>
+            </w:pPr>
+            <w:r>
+              <w:rPr>
+                <w:rFonts w:ascii="Calibri" w:hAnsi="Calibri"/>
+                <w:b w:val="0"/>
+                <w:color w:val="111827"/>
+                <w:sz w:val="16"/>
+              </w:rPr>
+              <w:t>List persisted arbitration evidence.</w:t>
+            </w:r>
+          </w:p>
+        </w:tc>
+      </w:tr>
+      <w:tr>
+        <w:trPr>
+          <w:cantSplit/>
+        </w:trPr>
+        <w:tc>
+          <w:tcPr>
+            <w:tcW w:type="dxa" w:w="1150"/>
+            <w:tcMar>
+              <w:top w:w="80" w:type="dxa"/>
+              <w:start w:w="120" w:type="dxa"/>
+              <w:bottom w:w="80" w:type="dxa"/>
+              <w:end w:w="120" w:type="dxa"/>
+            </w:tcMar>
+            <w:vAlign w:val="center"/>
+            <w:shd w:fill="FFFFFF"/>
+          </w:tcPr>
+          <w:p>
+            <w:pPr>
+              <w:spacing w:before="0" w:after="40" w:line="252" w:lineRule="auto"/>
+              <w:jc w:val="center"/>
+            </w:pPr>
+            <w:r>
+              <w:rPr>
+                <w:rFonts w:ascii="Calibri" w:hAnsi="Calibri"/>
+                <w:b w:val="0"/>
+                <w:color w:val="111827"/>
+                <w:sz w:val="16"/>
+              </w:rPr>
+              <w:t>GET</w:t>
+            </w:r>
+          </w:p>
+        </w:tc>
+        <w:tc>
+          <w:tcPr>
+            <w:tcW w:type="dxa" w:w="3700"/>
+            <w:tcMar>
+              <w:top w:w="80" w:type="dxa"/>
+              <w:start w:w="120" w:type="dxa"/>
+              <w:bottom w:w="80" w:type="dxa"/>
+              <w:end w:w="120" w:type="dxa"/>
+            </w:tcMar>
+            <w:vAlign w:val="center"/>
+            <w:shd w:fill="FFFFFF"/>
+          </w:tcPr>
+          <w:p>
+            <w:pPr>
+              <w:spacing w:before="0" w:after="40" w:line="252" w:lineRule="auto"/>
+              <w:jc w:val="left"/>
+            </w:pPr>
+            <w:r>
+              <w:rPr>
+                <w:rFonts w:ascii="Calibri" w:hAnsi="Calibri"/>
+                <w:b w:val="0"/>
+                <w:color w:val="111827"/>
+                <w:sz w:val="16"/>
+              </w:rPr>
+              <w:t>/api/v1/vehicles/{vehicle_id}/can-networks/arbitrations/{command_id}</w:t>
+            </w:r>
+          </w:p>
+        </w:tc>
+        <w:tc>
+          <w:tcPr>
+            <w:tcW w:type="dxa" w:w="3100"/>
+            <w:tcMar>
+              <w:top w:w="80" w:type="dxa"/>
+              <w:start w:w="120" w:type="dxa"/>
+              <w:bottom w:w="80" w:type="dxa"/>
+              <w:end w:w="120" w:type="dxa"/>
+            </w:tcMar>
+            <w:vAlign w:val="center"/>
+            <w:shd w:fill="FFFFFF"/>
+          </w:tcPr>
+          <w:p>
+            <w:pPr>
+              <w:spacing w:before="0" w:after="40" w:line="252" w:lineRule="auto"/>
+              <w:jc w:val="left"/>
+            </w:pPr>
+            <w:r>
+              <w:rPr>
+                <w:rFonts w:ascii="Calibri" w:hAnsi="Calibri"/>
+                <w:b w:val="0"/>
+                <w:color w:val="111827"/>
+                <w:sz w:val="16"/>
+              </w:rPr>
+              <w:t>can_networks:read</w:t>
+            </w:r>
+          </w:p>
+        </w:tc>
+        <w:tc>
+          <w:tcPr>
+            <w:tcW w:type="dxa" w:w="1410"/>
+            <w:tcMar>
+              <w:top w:w="80" w:type="dxa"/>
+              <w:start w:w="120" w:type="dxa"/>
+              <w:bottom w:w="80" w:type="dxa"/>
+              <w:end w:w="120" w:type="dxa"/>
+            </w:tcMar>
+            <w:vAlign w:val="center"/>
+            <w:shd w:fill="FFFFFF"/>
+          </w:tcPr>
+          <w:p>
+            <w:pPr>
+              <w:spacing w:before="0" w:after="40" w:line="252" w:lineRule="auto"/>
+              <w:jc w:val="left"/>
+            </w:pPr>
+            <w:r>
+              <w:rPr>
+                <w:rFonts w:ascii="Calibri" w:hAnsi="Calibri"/>
+                <w:b w:val="0"/>
+                <w:color w:val="111827"/>
+                <w:sz w:val="16"/>
+              </w:rPr>
+              <w:t>Retrieve one arbitration result.</w:t>
+            </w:r>
+          </w:p>
+        </w:tc>
+      </w:tr>
     </w:tbl>
     <w:p>
       <w:pPr>
@@ -2353,6 +2862,94 @@
     </w:p>
     <w:p>
       <w:pPr>
+        <w:pStyle w:val="Heading2"/>
+        <w:keepNext/>
+        <w:keepLines/>
+      </w:pPr>
+      <w:r>
+        <w:t>8.1 Arbitration Semantics</w:t>
+      </w:r>
+    </w:p>
+    <w:p>
+      <w:r>
+        <w:rPr>
+          <w:rFonts w:ascii="Calibri" w:hAnsi="Calibri"/>
+          <w:color w:val="111827"/>
+          <w:sz w:val="22"/>
+        </w:rPr>
+        <w:t>Each contender is resolved against an immutable frame contract and checked for producer ownership and exact DLC. The bus selects only ready contenders. Lowest numeric CAN ID wins; standard format precedes extended format for an equal numeric ID; contract identity provides a stable final tie-break. When no frame is ready, the logical clock advances to the next readiness instant.</w:t>
+      </w:r>
+    </w:p>
+    <w:p>
+      <w:r>
+        <w:rPr>
+          <w:rFonts w:ascii="Calibri" w:hAnsi="Calibri"/>
+          <w:color w:val="111827"/>
+          <w:sz w:val="22"/>
+        </w:rPr>
+        <w:t xml:space="preserve">Nominal size is </w:t>
+      </w:r>
+      <w:r>
+        <w:rPr>
+          <w:rFonts w:ascii="Consolas" w:hAnsi="Consolas"/>
+          <w:color w:val="1F4D78"/>
+          <w:sz w:val="19"/>
+        </w:rPr>
+        <w:t>47 + 8 * DLC</w:t>
+      </w:r>
+      <w:r>
+        <w:rPr>
+          <w:rFonts w:ascii="Calibri" w:hAnsi="Calibri"/>
+          <w:color w:val="111827"/>
+          <w:sz w:val="22"/>
+        </w:rPr>
+        <w:t xml:space="preserve"> bits for standard and </w:t>
+      </w:r>
+      <w:r>
+        <w:rPr>
+          <w:rFonts w:ascii="Consolas" w:hAnsi="Consolas"/>
+          <w:color w:val="1F4D78"/>
+          <w:sz w:val="19"/>
+        </w:rPr>
+        <w:t>67 + 8 * DLC</w:t>
+      </w:r>
+      <w:r>
+        <w:rPr>
+          <w:rFonts w:ascii="Calibri" w:hAnsi="Calibri"/>
+          <w:color w:val="111827"/>
+          <w:sz w:val="22"/>
+        </w:rPr>
+        <w:t xml:space="preserve"> bits for extended classic CAN. This includes a three-bit intermission and excludes bit stuffing. Duration uses the ceiling of </w:t>
+      </w:r>
+      <w:r>
+        <w:rPr>
+          <w:rFonts w:ascii="Consolas" w:hAnsi="Consolas"/>
+          <w:color w:val="1F4D78"/>
+          <w:sz w:val="19"/>
+        </w:rPr>
+        <w:t>bit_count * 1000 / bitrate_kbps</w:t>
+      </w:r>
+      <w:r>
+        <w:rPr>
+          <w:rFonts w:ascii="Calibri" w:hAnsi="Calibri"/>
+          <w:color w:val="111827"/>
+          <w:sz w:val="22"/>
+        </w:rPr>
+        <w:t>. Frames are serialized, delivered to every declared consumer at completion, and assigned latency from readiness to completion.</w:t>
+      </w:r>
+    </w:p>
+    <w:p>
+      <w:r>
+        <w:rPr>
+          <w:rFonts w:ascii="Calibri" w:hAnsi="Calibri"/>
+          <w:color w:val="111827"/>
+          <w:sz w:val="22"/>
+        </w:rPr>
+        <w:t>The utilization window begins at the prior network time and ends at the last completion. Occupied time is the sum of nominal durations; idle time is the remainder. A batch advances the network version once and the sequence once per winner. Exact retry returns stored evidence without another mutation, event, or audit record.</w:t>
+      </w:r>
+    </w:p>
+    <w:p>
+      <w:pPr>
         <w:pStyle w:val="Heading1"/>
         <w:keepNext/>
         <w:keepLines/>
@@ -2384,7 +2981,7 @@
           <w:color w:val="111827"/>
           <w:sz w:val="22"/>
         </w:rPr>
-        <w:t>. IV-1 implements CAN-F-001 through CAN-F-012 and CAN-NF-001 through CAN-NF-006.</w:t>
+        <w:t>. IV-1 and IV-2 implement CAN-F-001 through CAN-F-020 and CAN-NF-001 through CAN-NF-008.</w:t>
       </w:r>
     </w:p>
     <w:p>
@@ -2514,7 +3111,47 @@
           <w:color w:val="111827"/>
           <w:sz w:val="22"/>
         </w:rPr>
-        <w:t>A submitted frame is not yet a physically arbitrated transmission. IV-2 will define priority, duration, delivery, and bus-load semantics rather than hiding them in IV-1.</w:t>
+        <w:t>A submitted frame is distinct from a batch contender. IV-2 makes priority, duration, delivery, and bus-load assumptions explicit and independently testable.</w:t>
+      </w:r>
+    </w:p>
+    <w:p>
+      <w:pPr>
+        <w:pStyle w:val="Heading2"/>
+        <w:keepNext/>
+        <w:keepLines/>
+      </w:pPr>
+      <w:r>
+        <w:t>ADR-CAN-007 - Model Nominal Timing Before Physical Effects</w:t>
+      </w:r>
+    </w:p>
+    <w:p>
+      <w:r>
+        <w:rPr>
+          <w:rFonts w:ascii="Calibri" w:hAnsi="Calibri"/>
+          <w:color w:val="111827"/>
+          <w:sz w:val="22"/>
+        </w:rPr>
+        <w:t>The first timing model includes fixed classic CAN fields and intermission but excludes bit stuffing, acknowledgement failure, retransmission, propagation delay, and oscillator drift. This produces a reproducible engineering baseline without claiming electrical-bus fidelity.</w:t>
+      </w:r>
+    </w:p>
+    <w:p>
+      <w:pPr>
+        <w:pStyle w:val="Heading2"/>
+        <w:keepNext/>
+        <w:keepLines/>
+      </w:pPr>
+      <w:r>
+        <w:t>ADR-CAN-008 - Persist Both Batch and Frame Evidence</w:t>
+      </w:r>
+    </w:p>
+    <w:p>
+      <w:r>
+        <w:rPr>
+          <w:rFonts w:ascii="Calibri" w:hAnsi="Calibri"/>
+          <w:color w:val="111827"/>
+          <w:sz w:val="22"/>
+        </w:rPr>
+        <w:t>The batch preserves arbitration context and metrics. Winner transmissions preserve a unified frame history. A single aggregate version increment represents the atomic command, while each frame gets its own monotonically increasing sequence.</w:t>
       </w:r>
     </w:p>
     <w:p>
@@ -4258,6 +4895,1074 @@
           </w:p>
         </w:tc>
       </w:tr>
+      <w:tr>
+        <w:trPr>
+          <w:cantSplit/>
+        </w:trPr>
+        <w:tc>
+          <w:tcPr>
+            <w:tcW w:type="dxa" w:w="1650"/>
+            <w:tcMar>
+              <w:top w:w="80" w:type="dxa"/>
+              <w:start w:w="120" w:type="dxa"/>
+              <w:bottom w:w="80" w:type="dxa"/>
+              <w:end w:w="120" w:type="dxa"/>
+            </w:tcMar>
+            <w:vAlign w:val="center"/>
+            <w:shd w:fill="FFFFFF"/>
+          </w:tcPr>
+          <w:p>
+            <w:pPr>
+              <w:spacing w:before="0" w:after="40" w:line="252" w:lineRule="auto"/>
+              <w:jc w:val="center"/>
+            </w:pPr>
+            <w:r>
+              <w:rPr>
+                <w:rFonts w:ascii="Calibri" w:hAnsi="Calibri"/>
+                <w:b w:val="0"/>
+                <w:color w:val="111827"/>
+                <w:sz w:val="17"/>
+              </w:rPr>
+              <w:t>Arbitration priority</w:t>
+            </w:r>
+          </w:p>
+        </w:tc>
+        <w:tc>
+          <w:tcPr>
+            <w:tcW w:type="dxa" w:w="4450"/>
+            <w:tcMar>
+              <w:top w:w="80" w:type="dxa"/>
+              <w:start w:w="120" w:type="dxa"/>
+              <w:bottom w:w="80" w:type="dxa"/>
+              <w:end w:w="120" w:type="dxa"/>
+            </w:tcMar>
+            <w:vAlign w:val="center"/>
+            <w:shd w:fill="FFFFFF"/>
+          </w:tcPr>
+          <w:p>
+            <w:pPr>
+              <w:spacing w:before="0" w:after="40" w:line="252" w:lineRule="auto"/>
+              <w:jc w:val="left"/>
+            </w:pPr>
+            <w:r>
+              <w:rPr>
+                <w:rFonts w:ascii="Calibri" w:hAnsi="Calibri"/>
+                <w:b w:val="0"/>
+                <w:color w:val="111827"/>
+                <w:sz w:val="17"/>
+              </w:rPr>
+              <w:t>Select lowest ready CAN ID and standard before extended on equal ID.</w:t>
+            </w:r>
+          </w:p>
+        </w:tc>
+        <w:tc>
+          <w:tcPr>
+            <w:tcW w:type="dxa" w:w="3260"/>
+            <w:tcMar>
+              <w:top w:w="80" w:type="dxa"/>
+              <w:start w:w="120" w:type="dxa"/>
+              <w:bottom w:w="80" w:type="dxa"/>
+              <w:end w:w="120" w:type="dxa"/>
+            </w:tcMar>
+            <w:vAlign w:val="center"/>
+            <w:shd w:fill="FFFFFF"/>
+          </w:tcPr>
+          <w:p>
+            <w:pPr>
+              <w:spacing w:before="0" w:after="40" w:line="252" w:lineRule="auto"/>
+              <w:jc w:val="left"/>
+            </w:pPr>
+            <w:r>
+              <w:rPr>
+                <w:rFonts w:ascii="Calibri" w:hAnsi="Calibri"/>
+                <w:b w:val="0"/>
+                <w:color w:val="111827"/>
+                <w:sz w:val="17"/>
+              </w:rPr>
+              <w:t>Service</w:t>
+            </w:r>
+          </w:p>
+        </w:tc>
+      </w:tr>
+      <w:tr>
+        <w:trPr>
+          <w:cantSplit/>
+        </w:trPr>
+        <w:tc>
+          <w:tcPr>
+            <w:tcW w:type="dxa" w:w="1650"/>
+            <w:tcMar>
+              <w:top w:w="80" w:type="dxa"/>
+              <w:start w:w="120" w:type="dxa"/>
+              <w:bottom w:w="80" w:type="dxa"/>
+              <w:end w:w="120" w:type="dxa"/>
+            </w:tcMar>
+            <w:vAlign w:val="center"/>
+            <w:shd w:fill="FFFFFF"/>
+          </w:tcPr>
+          <w:p>
+            <w:pPr>
+              <w:spacing w:before="0" w:after="40" w:line="252" w:lineRule="auto"/>
+              <w:jc w:val="center"/>
+            </w:pPr>
+            <w:r>
+              <w:rPr>
+                <w:rFonts w:ascii="Calibri" w:hAnsi="Calibri"/>
+                <w:b w:val="0"/>
+                <w:color w:val="111827"/>
+                <w:sz w:val="17"/>
+              </w:rPr>
+              <w:t>Readiness</w:t>
+            </w:r>
+          </w:p>
+        </w:tc>
+        <w:tc>
+          <w:tcPr>
+            <w:tcW w:type="dxa" w:w="4450"/>
+            <w:tcMar>
+              <w:top w:w="80" w:type="dxa"/>
+              <w:start w:w="120" w:type="dxa"/>
+              <w:bottom w:w="80" w:type="dxa"/>
+              <w:end w:w="120" w:type="dxa"/>
+            </w:tcMar>
+            <w:vAlign w:val="center"/>
+            <w:shd w:fill="FFFFFF"/>
+          </w:tcPr>
+          <w:p>
+            <w:pPr>
+              <w:spacing w:before="0" w:after="40" w:line="252" w:lineRule="auto"/>
+              <w:jc w:val="left"/>
+            </w:pPr>
+            <w:r>
+              <w:rPr>
+                <w:rFonts w:ascii="Calibri" w:hAnsi="Calibri"/>
+                <w:b w:val="0"/>
+                <w:color w:val="111827"/>
+                <w:sz w:val="17"/>
+              </w:rPr>
+              <w:t>Advance only logical time when the bus has no ready contender.</w:t>
+            </w:r>
+          </w:p>
+        </w:tc>
+        <w:tc>
+          <w:tcPr>
+            <w:tcW w:type="dxa" w:w="3260"/>
+            <w:tcMar>
+              <w:top w:w="80" w:type="dxa"/>
+              <w:start w:w="120" w:type="dxa"/>
+              <w:bottom w:w="80" w:type="dxa"/>
+              <w:end w:w="120" w:type="dxa"/>
+            </w:tcMar>
+            <w:vAlign w:val="center"/>
+            <w:shd w:fill="FFFFFF"/>
+          </w:tcPr>
+          <w:p>
+            <w:pPr>
+              <w:spacing w:before="0" w:after="40" w:line="252" w:lineRule="auto"/>
+              <w:jc w:val="left"/>
+            </w:pPr>
+            <w:r>
+              <w:rPr>
+                <w:rFonts w:ascii="Calibri" w:hAnsi="Calibri"/>
+                <w:b w:val="0"/>
+                <w:color w:val="111827"/>
+                <w:sz w:val="17"/>
+              </w:rPr>
+              <w:t>Service</w:t>
+            </w:r>
+          </w:p>
+        </w:tc>
+      </w:tr>
+      <w:tr>
+        <w:trPr>
+          <w:cantSplit/>
+        </w:trPr>
+        <w:tc>
+          <w:tcPr>
+            <w:tcW w:type="dxa" w:w="1650"/>
+            <w:tcMar>
+              <w:top w:w="80" w:type="dxa"/>
+              <w:start w:w="120" w:type="dxa"/>
+              <w:bottom w:w="80" w:type="dxa"/>
+              <w:end w:w="120" w:type="dxa"/>
+            </w:tcMar>
+            <w:vAlign w:val="center"/>
+            <w:shd w:fill="FFFFFF"/>
+          </w:tcPr>
+          <w:p>
+            <w:pPr>
+              <w:spacing w:before="0" w:after="40" w:line="252" w:lineRule="auto"/>
+              <w:jc w:val="center"/>
+            </w:pPr>
+            <w:r>
+              <w:rPr>
+                <w:rFonts w:ascii="Calibri" w:hAnsi="Calibri"/>
+                <w:b w:val="0"/>
+                <w:color w:val="111827"/>
+                <w:sz w:val="17"/>
+              </w:rPr>
+              <w:t>Nominal bit count</w:t>
+            </w:r>
+          </w:p>
+        </w:tc>
+        <w:tc>
+          <w:tcPr>
+            <w:tcW w:type="dxa" w:w="4450"/>
+            <w:tcMar>
+              <w:top w:w="80" w:type="dxa"/>
+              <w:start w:w="120" w:type="dxa"/>
+              <w:bottom w:w="80" w:type="dxa"/>
+              <w:end w:w="120" w:type="dxa"/>
+            </w:tcMar>
+            <w:vAlign w:val="center"/>
+            <w:shd w:fill="FFFFFF"/>
+          </w:tcPr>
+          <w:p>
+            <w:pPr>
+              <w:spacing w:before="0" w:after="40" w:line="252" w:lineRule="auto"/>
+              <w:jc w:val="left"/>
+            </w:pPr>
+            <w:r>
+              <w:rPr>
+                <w:rFonts w:ascii="Calibri" w:hAnsi="Calibri"/>
+                <w:b w:val="0"/>
+                <w:color w:val="111827"/>
+                <w:sz w:val="17"/>
+              </w:rPr>
+              <w:t>Apply documented standard and extended classic CAN formulas.</w:t>
+            </w:r>
+          </w:p>
+        </w:tc>
+        <w:tc>
+          <w:tcPr>
+            <w:tcW w:type="dxa" w:w="3260"/>
+            <w:tcMar>
+              <w:top w:w="80" w:type="dxa"/>
+              <w:start w:w="120" w:type="dxa"/>
+              <w:bottom w:w="80" w:type="dxa"/>
+              <w:end w:w="120" w:type="dxa"/>
+            </w:tcMar>
+            <w:vAlign w:val="center"/>
+            <w:shd w:fill="FFFFFF"/>
+          </w:tcPr>
+          <w:p>
+            <w:pPr>
+              <w:spacing w:before="0" w:after="40" w:line="252" w:lineRule="auto"/>
+              <w:jc w:val="left"/>
+            </w:pPr>
+            <w:r>
+              <w:rPr>
+                <w:rFonts w:ascii="Calibri" w:hAnsi="Calibri"/>
+                <w:b w:val="0"/>
+                <w:color w:val="111827"/>
+                <w:sz w:val="17"/>
+              </w:rPr>
+              <w:t>Unit</w:t>
+            </w:r>
+          </w:p>
+        </w:tc>
+      </w:tr>
+      <w:tr>
+        <w:trPr>
+          <w:cantSplit/>
+        </w:trPr>
+        <w:tc>
+          <w:tcPr>
+            <w:tcW w:type="dxa" w:w="1650"/>
+            <w:tcMar>
+              <w:top w:w="80" w:type="dxa"/>
+              <w:start w:w="120" w:type="dxa"/>
+              <w:bottom w:w="80" w:type="dxa"/>
+              <w:end w:w="120" w:type="dxa"/>
+            </w:tcMar>
+            <w:vAlign w:val="center"/>
+            <w:shd w:fill="FFFFFF"/>
+          </w:tcPr>
+          <w:p>
+            <w:pPr>
+              <w:spacing w:before="0" w:after="40" w:line="252" w:lineRule="auto"/>
+              <w:jc w:val="center"/>
+            </w:pPr>
+            <w:r>
+              <w:rPr>
+                <w:rFonts w:ascii="Calibri" w:hAnsi="Calibri"/>
+                <w:b w:val="0"/>
+                <w:color w:val="111827"/>
+                <w:sz w:val="17"/>
+              </w:rPr>
+              <w:t>Duration rounding</w:t>
+            </w:r>
+          </w:p>
+        </w:tc>
+        <w:tc>
+          <w:tcPr>
+            <w:tcW w:type="dxa" w:w="4450"/>
+            <w:tcMar>
+              <w:top w:w="80" w:type="dxa"/>
+              <w:start w:w="120" w:type="dxa"/>
+              <w:bottom w:w="80" w:type="dxa"/>
+              <w:end w:w="120" w:type="dxa"/>
+            </w:tcMar>
+            <w:vAlign w:val="center"/>
+            <w:shd w:fill="FFFFFF"/>
+          </w:tcPr>
+          <w:p>
+            <w:pPr>
+              <w:spacing w:before="0" w:after="40" w:line="252" w:lineRule="auto"/>
+              <w:jc w:val="left"/>
+            </w:pPr>
+            <w:r>
+              <w:rPr>
+                <w:rFonts w:ascii="Calibri" w:hAnsi="Calibri"/>
+                <w:b w:val="0"/>
+                <w:color w:val="111827"/>
+                <w:sz w:val="17"/>
+              </w:rPr>
+              <w:t>Round calculated microseconds upward to avoid zero or partial evidence.</w:t>
+            </w:r>
+          </w:p>
+        </w:tc>
+        <w:tc>
+          <w:tcPr>
+            <w:tcW w:type="dxa" w:w="3260"/>
+            <w:tcMar>
+              <w:top w:w="80" w:type="dxa"/>
+              <w:start w:w="120" w:type="dxa"/>
+              <w:bottom w:w="80" w:type="dxa"/>
+              <w:end w:w="120" w:type="dxa"/>
+            </w:tcMar>
+            <w:vAlign w:val="center"/>
+            <w:shd w:fill="FFFFFF"/>
+          </w:tcPr>
+          <w:p>
+            <w:pPr>
+              <w:spacing w:before="0" w:after="40" w:line="252" w:lineRule="auto"/>
+              <w:jc w:val="left"/>
+            </w:pPr>
+            <w:r>
+              <w:rPr>
+                <w:rFonts w:ascii="Calibri" w:hAnsi="Calibri"/>
+                <w:b w:val="0"/>
+                <w:color w:val="111827"/>
+                <w:sz w:val="17"/>
+              </w:rPr>
+              <w:t>Unit</w:t>
+            </w:r>
+          </w:p>
+        </w:tc>
+      </w:tr>
+      <w:tr>
+        <w:trPr>
+          <w:cantSplit/>
+        </w:trPr>
+        <w:tc>
+          <w:tcPr>
+            <w:tcW w:type="dxa" w:w="1650"/>
+            <w:tcMar>
+              <w:top w:w="80" w:type="dxa"/>
+              <w:start w:w="120" w:type="dxa"/>
+              <w:bottom w:w="80" w:type="dxa"/>
+              <w:end w:w="120" w:type="dxa"/>
+            </w:tcMar>
+            <w:vAlign w:val="center"/>
+            <w:shd w:fill="FFFFFF"/>
+          </w:tcPr>
+          <w:p>
+            <w:pPr>
+              <w:spacing w:before="0" w:after="40" w:line="252" w:lineRule="auto"/>
+              <w:jc w:val="center"/>
+            </w:pPr>
+            <w:r>
+              <w:rPr>
+                <w:rFonts w:ascii="Calibri" w:hAnsi="Calibri"/>
+                <w:b w:val="0"/>
+                <w:color w:val="111827"/>
+                <w:sz w:val="17"/>
+              </w:rPr>
+              <w:t>Serial delivery</w:t>
+            </w:r>
+          </w:p>
+        </w:tc>
+        <w:tc>
+          <w:tcPr>
+            <w:tcW w:type="dxa" w:w="4450"/>
+            <w:tcMar>
+              <w:top w:w="80" w:type="dxa"/>
+              <w:start w:w="120" w:type="dxa"/>
+              <w:bottom w:w="80" w:type="dxa"/>
+              <w:end w:w="120" w:type="dxa"/>
+            </w:tcMar>
+            <w:vAlign w:val="center"/>
+            <w:shd w:fill="FFFFFF"/>
+          </w:tcPr>
+          <w:p>
+            <w:pPr>
+              <w:spacing w:before="0" w:after="40" w:line="252" w:lineRule="auto"/>
+              <w:jc w:val="left"/>
+            </w:pPr>
+            <w:r>
+              <w:rPr>
+                <w:rFonts w:ascii="Calibri" w:hAnsi="Calibri"/>
+                <w:b w:val="0"/>
+                <w:color w:val="111827"/>
+                <w:sz w:val="17"/>
+              </w:rPr>
+              <w:t>Start the next winner only after prior completion.</w:t>
+            </w:r>
+          </w:p>
+        </w:tc>
+        <w:tc>
+          <w:tcPr>
+            <w:tcW w:type="dxa" w:w="3260"/>
+            <w:tcMar>
+              <w:top w:w="80" w:type="dxa"/>
+              <w:start w:w="120" w:type="dxa"/>
+              <w:bottom w:w="80" w:type="dxa"/>
+              <w:end w:w="120" w:type="dxa"/>
+            </w:tcMar>
+            <w:vAlign w:val="center"/>
+            <w:shd w:fill="FFFFFF"/>
+          </w:tcPr>
+          <w:p>
+            <w:pPr>
+              <w:spacing w:before="0" w:after="40" w:line="252" w:lineRule="auto"/>
+              <w:jc w:val="left"/>
+            </w:pPr>
+            <w:r>
+              <w:rPr>
+                <w:rFonts w:ascii="Calibri" w:hAnsi="Calibri"/>
+                <w:b w:val="0"/>
+                <w:color w:val="111827"/>
+                <w:sz w:val="17"/>
+              </w:rPr>
+              <w:t>Service</w:t>
+            </w:r>
+          </w:p>
+        </w:tc>
+      </w:tr>
+      <w:tr>
+        <w:trPr>
+          <w:cantSplit/>
+        </w:trPr>
+        <w:tc>
+          <w:tcPr>
+            <w:tcW w:type="dxa" w:w="1650"/>
+            <w:tcMar>
+              <w:top w:w="80" w:type="dxa"/>
+              <w:start w:w="120" w:type="dxa"/>
+              <w:bottom w:w="80" w:type="dxa"/>
+              <w:end w:w="120" w:type="dxa"/>
+            </w:tcMar>
+            <w:vAlign w:val="center"/>
+            <w:shd w:fill="FFFFFF"/>
+          </w:tcPr>
+          <w:p>
+            <w:pPr>
+              <w:spacing w:before="0" w:after="40" w:line="252" w:lineRule="auto"/>
+              <w:jc w:val="center"/>
+            </w:pPr>
+            <w:r>
+              <w:rPr>
+                <w:rFonts w:ascii="Calibri" w:hAnsi="Calibri"/>
+                <w:b w:val="0"/>
+                <w:color w:val="111827"/>
+                <w:sz w:val="17"/>
+              </w:rPr>
+              <w:t>Consumer evidence</w:t>
+            </w:r>
+          </w:p>
+        </w:tc>
+        <w:tc>
+          <w:tcPr>
+            <w:tcW w:type="dxa" w:w="4450"/>
+            <w:tcMar>
+              <w:top w:w="80" w:type="dxa"/>
+              <w:start w:w="120" w:type="dxa"/>
+              <w:bottom w:w="80" w:type="dxa"/>
+              <w:end w:w="120" w:type="dxa"/>
+            </w:tcMar>
+            <w:vAlign w:val="center"/>
+            <w:shd w:fill="FFFFFF"/>
+          </w:tcPr>
+          <w:p>
+            <w:pPr>
+              <w:spacing w:before="0" w:after="40" w:line="252" w:lineRule="auto"/>
+              <w:jc w:val="left"/>
+            </w:pPr>
+            <w:r>
+              <w:rPr>
+                <w:rFonts w:ascii="Calibri" w:hAnsi="Calibri"/>
+                <w:b w:val="0"/>
+                <w:color w:val="111827"/>
+                <w:sz w:val="17"/>
+              </w:rPr>
+              <w:t>Record receipt and readiness-to-completion latency per declared consumer.</w:t>
+            </w:r>
+          </w:p>
+        </w:tc>
+        <w:tc>
+          <w:tcPr>
+            <w:tcW w:type="dxa" w:w="3260"/>
+            <w:tcMar>
+              <w:top w:w="80" w:type="dxa"/>
+              <w:start w:w="120" w:type="dxa"/>
+              <w:bottom w:w="80" w:type="dxa"/>
+              <w:end w:w="120" w:type="dxa"/>
+            </w:tcMar>
+            <w:vAlign w:val="center"/>
+            <w:shd w:fill="FFFFFF"/>
+          </w:tcPr>
+          <w:p>
+            <w:pPr>
+              <w:spacing w:before="0" w:after="40" w:line="252" w:lineRule="auto"/>
+              <w:jc w:val="left"/>
+            </w:pPr>
+            <w:r>
+              <w:rPr>
+                <w:rFonts w:ascii="Calibri" w:hAnsi="Calibri"/>
+                <w:b w:val="0"/>
+                <w:color w:val="111827"/>
+                <w:sz w:val="17"/>
+              </w:rPr>
+              <w:t>Service</w:t>
+            </w:r>
+          </w:p>
+        </w:tc>
+      </w:tr>
+      <w:tr>
+        <w:trPr>
+          <w:cantSplit/>
+        </w:trPr>
+        <w:tc>
+          <w:tcPr>
+            <w:tcW w:type="dxa" w:w="1650"/>
+            <w:tcMar>
+              <w:top w:w="80" w:type="dxa"/>
+              <w:start w:w="120" w:type="dxa"/>
+              <w:bottom w:w="80" w:type="dxa"/>
+              <w:end w:w="120" w:type="dxa"/>
+            </w:tcMar>
+            <w:vAlign w:val="center"/>
+            <w:shd w:fill="FFFFFF"/>
+          </w:tcPr>
+          <w:p>
+            <w:pPr>
+              <w:spacing w:before="0" w:after="40" w:line="252" w:lineRule="auto"/>
+              <w:jc w:val="center"/>
+            </w:pPr>
+            <w:r>
+              <w:rPr>
+                <w:rFonts w:ascii="Calibri" w:hAnsi="Calibri"/>
+                <w:b w:val="0"/>
+                <w:color w:val="111827"/>
+                <w:sz w:val="17"/>
+              </w:rPr>
+              <w:t>Utilization</w:t>
+            </w:r>
+          </w:p>
+        </w:tc>
+        <w:tc>
+          <w:tcPr>
+            <w:tcW w:type="dxa" w:w="4450"/>
+            <w:tcMar>
+              <w:top w:w="80" w:type="dxa"/>
+              <w:start w:w="120" w:type="dxa"/>
+              <w:bottom w:w="80" w:type="dxa"/>
+              <w:end w:w="120" w:type="dxa"/>
+            </w:tcMar>
+            <w:vAlign w:val="center"/>
+            <w:shd w:fill="FFFFFF"/>
+          </w:tcPr>
+          <w:p>
+            <w:pPr>
+              <w:spacing w:before="0" w:after="40" w:line="252" w:lineRule="auto"/>
+              <w:jc w:val="left"/>
+            </w:pPr>
+            <w:r>
+              <w:rPr>
+                <w:rFonts w:ascii="Calibri" w:hAnsi="Calibri"/>
+                <w:b w:val="0"/>
+                <w:color w:val="111827"/>
+                <w:sz w:val="17"/>
+              </w:rPr>
+              <w:t>Derive window, occupied, idle, percentage, and maximum latency consistently.</w:t>
+            </w:r>
+          </w:p>
+        </w:tc>
+        <w:tc>
+          <w:tcPr>
+            <w:tcW w:type="dxa" w:w="3260"/>
+            <w:tcMar>
+              <w:top w:w="80" w:type="dxa"/>
+              <w:start w:w="120" w:type="dxa"/>
+              <w:bottom w:w="80" w:type="dxa"/>
+              <w:end w:w="120" w:type="dxa"/>
+            </w:tcMar>
+            <w:vAlign w:val="center"/>
+            <w:shd w:fill="FFFFFF"/>
+          </w:tcPr>
+          <w:p>
+            <w:pPr>
+              <w:spacing w:before="0" w:after="40" w:line="252" w:lineRule="auto"/>
+              <w:jc w:val="left"/>
+            </w:pPr>
+            <w:r>
+              <w:rPr>
+                <w:rFonts w:ascii="Calibri" w:hAnsi="Calibri"/>
+                <w:b w:val="0"/>
+                <w:color w:val="111827"/>
+                <w:sz w:val="17"/>
+              </w:rPr>
+              <w:t>Service</w:t>
+            </w:r>
+          </w:p>
+        </w:tc>
+      </w:tr>
+      <w:tr>
+        <w:trPr>
+          <w:cantSplit/>
+        </w:trPr>
+        <w:tc>
+          <w:tcPr>
+            <w:tcW w:type="dxa" w:w="1650"/>
+            <w:tcMar>
+              <w:top w:w="80" w:type="dxa"/>
+              <w:start w:w="120" w:type="dxa"/>
+              <w:bottom w:w="80" w:type="dxa"/>
+              <w:end w:w="120" w:type="dxa"/>
+            </w:tcMar>
+            <w:vAlign w:val="center"/>
+            <w:shd w:fill="FFFFFF"/>
+          </w:tcPr>
+          <w:p>
+            <w:pPr>
+              <w:spacing w:before="0" w:after="40" w:line="252" w:lineRule="auto"/>
+              <w:jc w:val="center"/>
+            </w:pPr>
+            <w:r>
+              <w:rPr>
+                <w:rFonts w:ascii="Calibri" w:hAnsi="Calibri"/>
+                <w:b w:val="0"/>
+                <w:color w:val="111827"/>
+                <w:sz w:val="17"/>
+              </w:rPr>
+              <w:t>Batch versioning</w:t>
+            </w:r>
+          </w:p>
+        </w:tc>
+        <w:tc>
+          <w:tcPr>
+            <w:tcW w:type="dxa" w:w="4450"/>
+            <w:tcMar>
+              <w:top w:w="80" w:type="dxa"/>
+              <w:start w:w="120" w:type="dxa"/>
+              <w:bottom w:w="80" w:type="dxa"/>
+              <w:end w:w="120" w:type="dxa"/>
+            </w:tcMar>
+            <w:vAlign w:val="center"/>
+            <w:shd w:fill="FFFFFF"/>
+          </w:tcPr>
+          <w:p>
+            <w:pPr>
+              <w:spacing w:before="0" w:after="40" w:line="252" w:lineRule="auto"/>
+              <w:jc w:val="left"/>
+            </w:pPr>
+            <w:r>
+              <w:rPr>
+                <w:rFonts w:ascii="Calibri" w:hAnsi="Calibri"/>
+                <w:b w:val="0"/>
+                <w:color w:val="111827"/>
+                <w:sz w:val="17"/>
+              </w:rPr>
+              <w:t>Increment version once and sequence once per winning frame.</w:t>
+            </w:r>
+          </w:p>
+        </w:tc>
+        <w:tc>
+          <w:tcPr>
+            <w:tcW w:type="dxa" w:w="3260"/>
+            <w:tcMar>
+              <w:top w:w="80" w:type="dxa"/>
+              <w:start w:w="120" w:type="dxa"/>
+              <w:bottom w:w="80" w:type="dxa"/>
+              <w:end w:w="120" w:type="dxa"/>
+            </w:tcMar>
+            <w:vAlign w:val="center"/>
+            <w:shd w:fill="FFFFFF"/>
+          </w:tcPr>
+          <w:p>
+            <w:pPr>
+              <w:spacing w:before="0" w:after="40" w:line="252" w:lineRule="auto"/>
+              <w:jc w:val="left"/>
+            </w:pPr>
+            <w:r>
+              <w:rPr>
+                <w:rFonts w:ascii="Calibri" w:hAnsi="Calibri"/>
+                <w:b w:val="0"/>
+                <w:color w:val="111827"/>
+                <w:sz w:val="17"/>
+              </w:rPr>
+              <w:t>Service</w:t>
+            </w:r>
+          </w:p>
+        </w:tc>
+      </w:tr>
+      <w:tr>
+        <w:trPr>
+          <w:cantSplit/>
+        </w:trPr>
+        <w:tc>
+          <w:tcPr>
+            <w:tcW w:type="dxa" w:w="1650"/>
+            <w:tcMar>
+              <w:top w:w="80" w:type="dxa"/>
+              <w:start w:w="120" w:type="dxa"/>
+              <w:bottom w:w="80" w:type="dxa"/>
+              <w:end w:w="120" w:type="dxa"/>
+            </w:tcMar>
+            <w:vAlign w:val="center"/>
+            <w:shd w:fill="FFFFFF"/>
+          </w:tcPr>
+          <w:p>
+            <w:pPr>
+              <w:spacing w:before="0" w:after="40" w:line="252" w:lineRule="auto"/>
+              <w:jc w:val="center"/>
+            </w:pPr>
+            <w:r>
+              <w:rPr>
+                <w:rFonts w:ascii="Calibri" w:hAnsi="Calibri"/>
+                <w:b w:val="0"/>
+                <w:color w:val="111827"/>
+                <w:sz w:val="17"/>
+              </w:rPr>
+              <w:t>Arbitration replay</w:t>
+            </w:r>
+          </w:p>
+        </w:tc>
+        <w:tc>
+          <w:tcPr>
+            <w:tcW w:type="dxa" w:w="4450"/>
+            <w:tcMar>
+              <w:top w:w="80" w:type="dxa"/>
+              <w:start w:w="120" w:type="dxa"/>
+              <w:bottom w:w="80" w:type="dxa"/>
+              <w:end w:w="120" w:type="dxa"/>
+            </w:tcMar>
+            <w:vAlign w:val="center"/>
+            <w:shd w:fill="FFFFFF"/>
+          </w:tcPr>
+          <w:p>
+            <w:pPr>
+              <w:spacing w:before="0" w:after="40" w:line="252" w:lineRule="auto"/>
+              <w:jc w:val="left"/>
+            </w:pPr>
+            <w:r>
+              <w:rPr>
+                <w:rFonts w:ascii="Calibri" w:hAnsi="Calibri"/>
+                <w:b w:val="0"/>
+                <w:color w:val="111827"/>
+                <w:sz w:val="17"/>
+              </w:rPr>
+              <w:t>Return persisted result without advancing simulation state twice.</w:t>
+            </w:r>
+          </w:p>
+        </w:tc>
+        <w:tc>
+          <w:tcPr>
+            <w:tcW w:type="dxa" w:w="3260"/>
+            <w:tcMar>
+              <w:top w:w="80" w:type="dxa"/>
+              <w:start w:w="120" w:type="dxa"/>
+              <w:bottom w:w="80" w:type="dxa"/>
+              <w:end w:w="120" w:type="dxa"/>
+            </w:tcMar>
+            <w:vAlign w:val="center"/>
+            <w:shd w:fill="FFFFFF"/>
+          </w:tcPr>
+          <w:p>
+            <w:pPr>
+              <w:spacing w:before="0" w:after="40" w:line="252" w:lineRule="auto"/>
+              <w:jc w:val="left"/>
+            </w:pPr>
+            <w:r>
+              <w:rPr>
+                <w:rFonts w:ascii="Calibri" w:hAnsi="Calibri"/>
+                <w:b w:val="0"/>
+                <w:color w:val="111827"/>
+                <w:sz w:val="17"/>
+              </w:rPr>
+              <w:t>Service/API</w:t>
+            </w:r>
+          </w:p>
+        </w:tc>
+      </w:tr>
+      <w:tr>
+        <w:trPr>
+          <w:cantSplit/>
+        </w:trPr>
+        <w:tc>
+          <w:tcPr>
+            <w:tcW w:type="dxa" w:w="1650"/>
+            <w:tcMar>
+              <w:top w:w="80" w:type="dxa"/>
+              <w:start w:w="120" w:type="dxa"/>
+              <w:bottom w:w="80" w:type="dxa"/>
+              <w:end w:w="120" w:type="dxa"/>
+            </w:tcMar>
+            <w:vAlign w:val="center"/>
+            <w:shd w:fill="FFFFFF"/>
+          </w:tcPr>
+          <w:p>
+            <w:pPr>
+              <w:spacing w:before="0" w:after="40" w:line="252" w:lineRule="auto"/>
+              <w:jc w:val="center"/>
+            </w:pPr>
+            <w:r>
+              <w:rPr>
+                <w:rFonts w:ascii="Calibri" w:hAnsi="Calibri"/>
+                <w:b w:val="0"/>
+                <w:color w:val="111827"/>
+                <w:sz w:val="17"/>
+              </w:rPr>
+              <w:t>Arbitration conflict</w:t>
+            </w:r>
+          </w:p>
+        </w:tc>
+        <w:tc>
+          <w:tcPr>
+            <w:tcW w:type="dxa" w:w="4450"/>
+            <w:tcMar>
+              <w:top w:w="80" w:type="dxa"/>
+              <w:start w:w="120" w:type="dxa"/>
+              <w:bottom w:w="80" w:type="dxa"/>
+              <w:end w:w="120" w:type="dxa"/>
+            </w:tcMar>
+            <w:vAlign w:val="center"/>
+            <w:shd w:fill="FFFFFF"/>
+          </w:tcPr>
+          <w:p>
+            <w:pPr>
+              <w:spacing w:before="0" w:after="40" w:line="252" w:lineRule="auto"/>
+              <w:jc w:val="left"/>
+            </w:pPr>
+            <w:r>
+              <w:rPr>
+                <w:rFonts w:ascii="Calibri" w:hAnsi="Calibri"/>
+                <w:b w:val="0"/>
+                <w:color w:val="111827"/>
+                <w:sz w:val="17"/>
+              </w:rPr>
+              <w:t>Reject changed command reuse with a stable error.</w:t>
+            </w:r>
+          </w:p>
+        </w:tc>
+        <w:tc>
+          <w:tcPr>
+            <w:tcW w:type="dxa" w:w="3260"/>
+            <w:tcMar>
+              <w:top w:w="80" w:type="dxa"/>
+              <w:start w:w="120" w:type="dxa"/>
+              <w:bottom w:w="80" w:type="dxa"/>
+              <w:end w:w="120" w:type="dxa"/>
+            </w:tcMar>
+            <w:vAlign w:val="center"/>
+            <w:shd w:fill="FFFFFF"/>
+          </w:tcPr>
+          <w:p>
+            <w:pPr>
+              <w:spacing w:before="0" w:after="40" w:line="252" w:lineRule="auto"/>
+              <w:jc w:val="left"/>
+            </w:pPr>
+            <w:r>
+              <w:rPr>
+                <w:rFonts w:ascii="Calibri" w:hAnsi="Calibri"/>
+                <w:b w:val="0"/>
+                <w:color w:val="111827"/>
+                <w:sz w:val="17"/>
+              </w:rPr>
+              <w:t>Service/API</w:t>
+            </w:r>
+          </w:p>
+        </w:tc>
+      </w:tr>
+      <w:tr>
+        <w:trPr>
+          <w:cantSplit/>
+        </w:trPr>
+        <w:tc>
+          <w:tcPr>
+            <w:tcW w:type="dxa" w:w="1650"/>
+            <w:tcMar>
+              <w:top w:w="80" w:type="dxa"/>
+              <w:start w:w="120" w:type="dxa"/>
+              <w:bottom w:w="80" w:type="dxa"/>
+              <w:end w:w="120" w:type="dxa"/>
+            </w:tcMar>
+            <w:vAlign w:val="center"/>
+            <w:shd w:fill="FFFFFF"/>
+          </w:tcPr>
+          <w:p>
+            <w:pPr>
+              <w:spacing w:before="0" w:after="40" w:line="252" w:lineRule="auto"/>
+              <w:jc w:val="center"/>
+            </w:pPr>
+            <w:r>
+              <w:rPr>
+                <w:rFonts w:ascii="Calibri" w:hAnsi="Calibri"/>
+                <w:b w:val="0"/>
+                <w:color w:val="111827"/>
+                <w:sz w:val="17"/>
+              </w:rPr>
+              <w:t>Arbitration RBAC</w:t>
+            </w:r>
+          </w:p>
+        </w:tc>
+        <w:tc>
+          <w:tcPr>
+            <w:tcW w:type="dxa" w:w="4450"/>
+            <w:tcMar>
+              <w:top w:w="80" w:type="dxa"/>
+              <w:start w:w="120" w:type="dxa"/>
+              <w:bottom w:w="80" w:type="dxa"/>
+              <w:end w:w="120" w:type="dxa"/>
+            </w:tcMar>
+            <w:vAlign w:val="center"/>
+            <w:shd w:fill="FFFFFF"/>
+          </w:tcPr>
+          <w:p>
+            <w:pPr>
+              <w:spacing w:before="0" w:after="40" w:line="252" w:lineRule="auto"/>
+              <w:jc w:val="left"/>
+            </w:pPr>
+            <w:r>
+              <w:rPr>
+                <w:rFonts w:ascii="Calibri" w:hAnsi="Calibri"/>
+                <w:b w:val="0"/>
+                <w:color w:val="111827"/>
+                <w:sz w:val="17"/>
+              </w:rPr>
+              <w:t>Require manage to execute and read to query evidence.</w:t>
+            </w:r>
+          </w:p>
+        </w:tc>
+        <w:tc>
+          <w:tcPr>
+            <w:tcW w:type="dxa" w:w="3260"/>
+            <w:tcMar>
+              <w:top w:w="80" w:type="dxa"/>
+              <w:start w:w="120" w:type="dxa"/>
+              <w:bottom w:w="80" w:type="dxa"/>
+              <w:end w:w="120" w:type="dxa"/>
+            </w:tcMar>
+            <w:vAlign w:val="center"/>
+            <w:shd w:fill="FFFFFF"/>
+          </w:tcPr>
+          <w:p>
+            <w:pPr>
+              <w:spacing w:before="0" w:after="40" w:line="252" w:lineRule="auto"/>
+              <w:jc w:val="left"/>
+            </w:pPr>
+            <w:r>
+              <w:rPr>
+                <w:rFonts w:ascii="Calibri" w:hAnsi="Calibri"/>
+                <w:b w:val="0"/>
+                <w:color w:val="111827"/>
+                <w:sz w:val="17"/>
+              </w:rPr>
+              <w:t>API/integration</w:t>
+            </w:r>
+          </w:p>
+        </w:tc>
+      </w:tr>
+      <w:tr>
+        <w:trPr>
+          <w:cantSplit/>
+        </w:trPr>
+        <w:tc>
+          <w:tcPr>
+            <w:tcW w:type="dxa" w:w="1650"/>
+            <w:tcMar>
+              <w:top w:w="80" w:type="dxa"/>
+              <w:start w:w="120" w:type="dxa"/>
+              <w:bottom w:w="80" w:type="dxa"/>
+              <w:end w:w="120" w:type="dxa"/>
+            </w:tcMar>
+            <w:vAlign w:val="center"/>
+            <w:shd w:fill="FFFFFF"/>
+          </w:tcPr>
+          <w:p>
+            <w:pPr>
+              <w:spacing w:before="0" w:after="40" w:line="252" w:lineRule="auto"/>
+              <w:jc w:val="center"/>
+            </w:pPr>
+            <w:r>
+              <w:rPr>
+                <w:rFonts w:ascii="Calibri" w:hAnsi="Calibri"/>
+                <w:b w:val="0"/>
+                <w:color w:val="111827"/>
+                <w:sz w:val="17"/>
+              </w:rPr>
+              <w:t>Arbitration minimization</w:t>
+            </w:r>
+          </w:p>
+        </w:tc>
+        <w:tc>
+          <w:tcPr>
+            <w:tcW w:type="dxa" w:w="4450"/>
+            <w:tcMar>
+              <w:top w:w="80" w:type="dxa"/>
+              <w:start w:w="120" w:type="dxa"/>
+              <w:bottom w:w="80" w:type="dxa"/>
+              <w:end w:w="120" w:type="dxa"/>
+            </w:tcMar>
+            <w:vAlign w:val="center"/>
+            <w:shd w:fill="FFFFFF"/>
+          </w:tcPr>
+          <w:p>
+            <w:pPr>
+              <w:spacing w:before="0" w:after="40" w:line="252" w:lineRule="auto"/>
+              <w:jc w:val="left"/>
+            </w:pPr>
+            <w:r>
+              <w:rPr>
+                <w:rFonts w:ascii="Calibri" w:hAnsi="Calibri"/>
+                <w:b w:val="0"/>
+                <w:color w:val="111827"/>
+                <w:sz w:val="17"/>
+              </w:rPr>
+              <w:t>Exclude CAN payload bytes from event and audit metrics.</w:t>
+            </w:r>
+          </w:p>
+        </w:tc>
+        <w:tc>
+          <w:tcPr>
+            <w:tcW w:type="dxa" w:w="3260"/>
+            <w:tcMar>
+              <w:top w:w="80" w:type="dxa"/>
+              <w:start w:w="120" w:type="dxa"/>
+              <w:bottom w:w="80" w:type="dxa"/>
+              <w:end w:w="120" w:type="dxa"/>
+            </w:tcMar>
+            <w:vAlign w:val="center"/>
+            <w:shd w:fill="FFFFFF"/>
+          </w:tcPr>
+          <w:p>
+            <w:pPr>
+              <w:spacing w:before="0" w:after="40" w:line="252" w:lineRule="auto"/>
+              <w:jc w:val="left"/>
+            </w:pPr>
+            <w:r>
+              <w:rPr>
+                <w:rFonts w:ascii="Calibri" w:hAnsi="Calibri"/>
+                <w:b w:val="0"/>
+                <w:color w:val="111827"/>
+                <w:sz w:val="17"/>
+              </w:rPr>
+              <w:t>Service</w:t>
+            </w:r>
+          </w:p>
+        </w:tc>
+      </w:tr>
     </w:tbl>
     <w:p>
       <w:pPr>
@@ -4313,7 +6018,7 @@
           <w:color w:val="111827"/>
           <w:sz w:val="22"/>
         </w:rPr>
-        <w:t xml:space="preserve">Migration </w:t>
+        <w:t xml:space="preserve">Migrations </w:t>
       </w:r>
       <w:r>
         <w:rPr>
@@ -4329,7 +6034,23 @@
           <w:color w:val="111827"/>
           <w:sz w:val="22"/>
         </w:rPr>
-        <w:t xml:space="preserve"> owns the database schema.</w:t>
+        <w:t xml:space="preserve"> and </w:t>
+      </w:r>
+      <w:r>
+        <w:rPr>
+          <w:rFonts w:ascii="Consolas" w:hAnsi="Consolas"/>
+          <w:color w:val="1F4D78"/>
+          <w:sz w:val="19"/>
+        </w:rPr>
+        <w:t>0025_can_arbitration</w:t>
+      </w:r>
+      <w:r>
+        <w:rPr>
+          <w:rFonts w:ascii="Calibri" w:hAnsi="Calibri"/>
+          <w:color w:val="111827"/>
+          <w:sz w:val="22"/>
+        </w:rPr>
+        <w:t xml:space="preserve"> own the database schema.</w:t>
       </w:r>
     </w:p>
     <w:p>
@@ -4346,7 +6067,7 @@
           <w:color w:val="111827"/>
           <w:sz w:val="22"/>
         </w:rPr>
-        <w:t xml:space="preserve">Events are </w:t>
+        <w:t xml:space="preserve">Events include </w:t>
       </w:r>
       <w:r>
         <w:rPr>
@@ -4362,7 +6083,7 @@
           <w:color w:val="111827"/>
           <w:sz w:val="22"/>
         </w:rPr>
-        <w:t xml:space="preserve"> and </w:t>
+        <w:t xml:space="preserve">, </w:t>
       </w:r>
       <w:r>
         <w:rPr>
@@ -4378,6 +6099,24 @@
           <w:color w:val="111827"/>
           <w:sz w:val="22"/>
         </w:rPr>
+        <w:t>, and</w:t>
+      </w:r>
+    </w:p>
+    <w:p>
+      <w:r>
+        <w:rPr>
+          <w:rFonts w:ascii="Consolas" w:hAnsi="Consolas"/>
+          <w:color w:val="1F4D78"/>
+          <w:sz w:val="19"/>
+        </w:rPr>
+        <w:t>atep.can.arbitration.completed.v1</w:t>
+      </w:r>
+      <w:r>
+        <w:rPr>
+          <w:rFonts w:ascii="Calibri" w:hAnsi="Calibri"/>
+          <w:color w:val="111827"/>
+          <w:sz w:val="22"/>
+        </w:rPr>
         <w:t>.</w:t>
       </w:r>
     </w:p>
@@ -4386,7 +6125,7 @@
         <w:pStyle w:val="ListBullet"/>
         <w:numPr>
           <w:ilvl w:val="0"/>
-          <w:numId w:val="13"/>
+          <w:numId w:val="14"/>
         </w:numPr>
       </w:pPr>
       <w:r>
@@ -4435,7 +6174,7 @@
         <w:pStyle w:val="ListBullet"/>
         <w:numPr>
           <w:ilvl w:val="0"/>
-          <w:numId w:val="13"/>
+          <w:numId w:val="14"/>
         </w:numPr>
       </w:pPr>
       <w:r>
@@ -4444,7 +6183,17 @@
           <w:color w:val="111827"/>
           <w:sz w:val="22"/>
         </w:rPr>
-        <w:t>Automated tests cover validation, deterministic mutation, replay, errors, evidence, and OpenAPI.</w:t>
+        <w:t>Automated tests cover validation, priority, timing mathematics, readiness, delivery, utilization,</w:t>
+      </w:r>
+    </w:p>
+    <w:p>
+      <w:r>
+        <w:rPr>
+          <w:rFonts w:ascii="Calibri" w:hAnsi="Calibri"/>
+          <w:color w:val="111827"/>
+          <w:sz w:val="22"/>
+        </w:rPr>
+        <w:t>versioning, replay, errors, evidence minimization, persistence, and OpenAPI.</w:t>
       </w:r>
     </w:p>
     <w:p>
@@ -4462,7 +6211,7 @@
         <w:pStyle w:val="ListBullet"/>
         <w:numPr>
           <w:ilvl w:val="0"/>
-          <w:numId w:val="14"/>
+          <w:numId w:val="15"/>
         </w:numPr>
       </w:pPr>
       <w:r>
@@ -4479,7 +6228,7 @@
         <w:pStyle w:val="ListBullet"/>
         <w:numPr>
           <w:ilvl w:val="0"/>
-          <w:numId w:val="14"/>
+          <w:numId w:val="15"/>
         </w:numPr>
       </w:pPr>
       <w:r>
@@ -4496,7 +6245,7 @@
         <w:pStyle w:val="ListBullet"/>
         <w:numPr>
           <w:ilvl w:val="0"/>
-          <w:numId w:val="14"/>
+          <w:numId w:val="15"/>
         </w:numPr>
       </w:pPr>
       <w:r>
@@ -4513,7 +6262,7 @@
         <w:pStyle w:val="ListBullet"/>
         <w:numPr>
           <w:ilvl w:val="0"/>
-          <w:numId w:val="14"/>
+          <w:numId w:val="15"/>
         </w:numPr>
       </w:pPr>
       <w:r>
@@ -4522,7 +6271,7 @@
           <w:color w:val="111827"/>
           <w:sz w:val="22"/>
         </w:rPr>
-        <w:t>Submission order is not arbitration order until IV-2 defines timing and priority behavior.</w:t>
+        <w:t>Nominal duration excludes variable bit stuffing and physical-layer effects.</w:t>
       </w:r>
     </w:p>
     <w:p>
@@ -4530,7 +6279,24 @@
         <w:pStyle w:val="ListBullet"/>
         <w:numPr>
           <w:ilvl w:val="0"/>
-          <w:numId w:val="14"/>
+          <w:numId w:val="15"/>
+        </w:numPr>
+      </w:pPr>
+      <w:r>
+        <w:rPr>
+          <w:rFonts w:ascii="Calibri" w:hAnsi="Calibri"/>
+          <w:color w:val="111827"/>
+          <w:sz w:val="22"/>
+        </w:rPr>
+        <w:t>Arbitration currently models one attempt; acknowledgement and retransmission are future work.</w:t>
+      </w:r>
+    </w:p>
+    <w:p>
+      <w:pPr>
+        <w:pStyle w:val="ListBullet"/>
+        <w:numPr>
+          <w:ilvl w:val="0"/>
+          <w:numId w:val="15"/>
         </w:numPr>
       </w:pPr>
       <w:r>
@@ -4559,7 +6325,7 @@
           <w:color w:val="111827"/>
           <w:sz w:val="22"/>
         </w:rPr>
-        <w:t xml:space="preserve">The recommended next increment is IV-2: deterministic arbitration, calculated transmission duration, receive delivery, and bounded bus-load evidence. See </w:t>
+        <w:t xml:space="preserve">The recommended next increment is IV-3: a DBC catalogue with signal encoding/decoding, scaling, offsets, signed values, and byte order. See </w:t>
       </w:r>
       <w:r>
         <w:rPr>
@@ -4593,7 +6359,7 @@
         <w:pStyle w:val="ListNumber"/>
         <w:numPr>
           <w:ilvl w:val="0"/>
-          <w:numId w:val="15"/>
+          <w:numId w:val="16"/>
         </w:numPr>
       </w:pPr>
       <w:r>
@@ -4610,7 +6376,7 @@
         <w:pStyle w:val="ListNumber"/>
         <w:numPr>
           <w:ilvl w:val="0"/>
-          <w:numId w:val="15"/>
+          <w:numId w:val="16"/>
         </w:numPr>
       </w:pPr>
       <w:r>
@@ -4627,7 +6393,7 @@
         <w:pStyle w:val="ListNumber"/>
         <w:numPr>
           <w:ilvl w:val="0"/>
-          <w:numId w:val="15"/>
+          <w:numId w:val="16"/>
         </w:numPr>
       </w:pPr>
       <w:r>
@@ -4644,7 +6410,7 @@
         <w:pStyle w:val="ListNumber"/>
         <w:numPr>
           <w:ilvl w:val="0"/>
-          <w:numId w:val="15"/>
+          <w:numId w:val="16"/>
         </w:numPr>
       </w:pPr>
       <w:r>
@@ -4661,7 +6427,7 @@
         <w:pStyle w:val="ListNumber"/>
         <w:numPr>
           <w:ilvl w:val="0"/>
-          <w:numId w:val="15"/>
+          <w:numId w:val="16"/>
         </w:numPr>
       </w:pPr>
       <w:r>
@@ -4678,7 +6444,7 @@
         <w:pStyle w:val="ListNumber"/>
         <w:numPr>
           <w:ilvl w:val="0"/>
-          <w:numId w:val="15"/>
+          <w:numId w:val="16"/>
         </w:numPr>
       </w:pPr>
       <w:r>
@@ -4695,7 +6461,7 @@
         <w:pStyle w:val="ListNumber"/>
         <w:numPr>
           <w:ilvl w:val="0"/>
-          <w:numId w:val="15"/>
+          <w:numId w:val="16"/>
         </w:numPr>
       </w:pPr>
       <w:r>
@@ -4744,7 +6510,7 @@
         <w:pStyle w:val="ListNumber"/>
         <w:numPr>
           <w:ilvl w:val="0"/>
-          <w:numId w:val="15"/>
+          <w:numId w:val="16"/>
         </w:numPr>
       </w:pPr>
       <w:r>
@@ -4761,7 +6527,7 @@
         <w:pStyle w:val="ListNumber"/>
         <w:numPr>
           <w:ilvl w:val="0"/>
-          <w:numId w:val="15"/>
+          <w:numId w:val="16"/>
         </w:numPr>
       </w:pPr>
       <w:r>
@@ -4770,7 +6536,55 @@
           <w:color w:val="111827"/>
           <w:sz w:val="22"/>
         </w:rPr>
-        <w:t>Propose an IV-2 arbitration rule for simultaneous standard frames.</w:t>
+        <w:t xml:space="preserve">Prove the winner order for simultaneous IDs </w:t>
+      </w:r>
+      <w:r>
+        <w:rPr>
+          <w:rFonts w:ascii="Consolas" w:hAnsi="Consolas"/>
+          <w:color w:val="1F4D78"/>
+          <w:sz w:val="19"/>
+        </w:rPr>
+        <w:t>0x100</w:t>
+      </w:r>
+      <w:r>
+        <w:rPr>
+          <w:rFonts w:ascii="Calibri" w:hAnsi="Calibri"/>
+          <w:color w:val="111827"/>
+          <w:sz w:val="22"/>
+        </w:rPr>
+        <w:t xml:space="preserve">, </w:t>
+      </w:r>
+      <w:r>
+        <w:rPr>
+          <w:rFonts w:ascii="Consolas" w:hAnsi="Consolas"/>
+          <w:color w:val="1F4D78"/>
+          <w:sz w:val="19"/>
+        </w:rPr>
+        <w:t>0x180</w:t>
+      </w:r>
+      <w:r>
+        <w:rPr>
+          <w:rFonts w:ascii="Calibri" w:hAnsi="Calibri"/>
+          <w:color w:val="111827"/>
+          <w:sz w:val="22"/>
+        </w:rPr>
+        <w:t xml:space="preserve">, and </w:t>
+      </w:r>
+      <w:r>
+        <w:rPr>
+          <w:rFonts w:ascii="Consolas" w:hAnsi="Consolas"/>
+          <w:color w:val="1F4D78"/>
+          <w:sz w:val="19"/>
+        </w:rPr>
+        <w:t>0x200</w:t>
+      </w:r>
+      <w:r>
+        <w:rPr>
+          <w:rFonts w:ascii="Calibri" w:hAnsi="Calibri"/>
+          <w:color w:val="111827"/>
+          <w:sz w:val="22"/>
+        </w:rPr>
+        <w:t>.</w:t>
       </w:r>
     </w:p>
     <w:p>
@@ -4778,7 +6592,7 @@
         <w:pStyle w:val="ListNumber"/>
         <w:numPr>
           <w:ilvl w:val="0"/>
-          <w:numId w:val="15"/>
+          <w:numId w:val="16"/>
         </w:numPr>
       </w:pPr>
       <w:r>
@@ -4787,7 +6601,7 @@
           <w:color w:val="111827"/>
           <w:sz w:val="22"/>
         </w:rPr>
-        <w:t>Calculate approximate classic CAN frame duration and list the assumptions still required.</w:t>
+        <w:t>Calculate nominal duration for standard DLC 8 at 500 kbit/s and list omitted effects.</w:t>
       </w:r>
     </w:p>
     <w:p>
@@ -4795,7 +6609,7 @@
         <w:pStyle w:val="ListNumber"/>
         <w:numPr>
           <w:ilvl w:val="0"/>
-          <w:numId w:val="15"/>
+          <w:numId w:val="16"/>
         </w:numPr>
       </w:pPr>
       <w:r>
@@ -4812,7 +6626,7 @@
         <w:pStyle w:val="ListNumber"/>
         <w:numPr>
           <w:ilvl w:val="0"/>
-          <w:numId w:val="15"/>
+          <w:numId w:val="16"/>
         </w:numPr>
       </w:pPr>
       <w:r>
@@ -4822,6 +6636,74 @@
           <w:sz w:val="22"/>
         </w:rPr>
         <w:t>Propose how multiple buses per vehicle could be added without breaking current identifiers.</w:t>
+      </w:r>
+    </w:p>
+    <w:p>
+      <w:pPr>
+        <w:pStyle w:val="ListNumber"/>
+        <w:numPr>
+          <w:ilvl w:val="0"/>
+          <w:numId w:val="16"/>
+        </w:numPr>
+      </w:pPr>
+      <w:r>
+        <w:rPr>
+          <w:rFonts w:ascii="Calibri" w:hAnsi="Calibri"/>
+          <w:color w:val="111827"/>
+          <w:sz w:val="22"/>
+        </w:rPr>
+        <w:t>Explain why standard format precedes extended format for an equal numeric identifier.</w:t>
+      </w:r>
+    </w:p>
+    <w:p>
+      <w:pPr>
+        <w:pStyle w:val="ListNumber"/>
+        <w:numPr>
+          <w:ilvl w:val="0"/>
+          <w:numId w:val="16"/>
+        </w:numPr>
+      </w:pPr>
+      <w:r>
+        <w:rPr>
+          <w:rFonts w:ascii="Calibri" w:hAnsi="Calibri"/>
+          <w:color w:val="111827"/>
+          <w:sz w:val="22"/>
+        </w:rPr>
+        <w:t>Calculate utilization when a frame becomes ready 50 microseconds after the window begins.</w:t>
+      </w:r>
+    </w:p>
+    <w:p>
+      <w:pPr>
+        <w:pStyle w:val="ListNumber"/>
+        <w:numPr>
+          <w:ilvl w:val="0"/>
+          <w:numId w:val="16"/>
+        </w:numPr>
+      </w:pPr>
+      <w:r>
+        <w:rPr>
+          <w:rFonts w:ascii="Calibri" w:hAnsi="Calibri"/>
+          <w:color w:val="111827"/>
+          <w:sz w:val="22"/>
+        </w:rPr>
+        <w:t>Explain why one batch increments aggregate version once but sequence once per winner.</w:t>
+      </w:r>
+    </w:p>
+    <w:p>
+      <w:pPr>
+        <w:pStyle w:val="ListNumber"/>
+        <w:numPr>
+          <w:ilvl w:val="0"/>
+          <w:numId w:val="16"/>
+        </w:numPr>
+      </w:pPr>
+      <w:r>
+        <w:rPr>
+          <w:rFonts w:ascii="Calibri" w:hAnsi="Calibri"/>
+          <w:color w:val="111827"/>
+          <w:sz w:val="22"/>
+        </w:rPr>
+        <w:t>Design an acknowledgement-failure extension without changing the nominal IV-2 evidence.</w:t>
       </w:r>
     </w:p>
     <w:sectPr>
@@ -4853,7 +6735,7 @@
         <w:color w:val="667085"/>
         <w:sz w:val="17"/>
       </w:rPr>
-      <w:t>ATEP Volume IV Workbook  |  Version 0.1.0</w:t>
+      <w:t>ATEP Volume IV Workbook  |  Version 0.2.0</w:t>
     </w:r>
     <w:r>
       <w:rPr>
@@ -5165,6 +7047,12 @@
     </w:lvlOverride>
   </w:num>
   <w:num w:numId="15">
+    <w:abstractNumId w:val="10"/>
+    <w:lvlOverride w:ilvl="0">
+      <w:startOverride w:val="1"/>
+    </w:lvlOverride>
+  </w:num>
+  <w:num w:numId="16">
     <w:abstractNumId w:val="9"/>
     <w:lvlOverride w:ilvl="0">
       <w:startOverride w:val="1"/>

</xml_diff>

<commit_message>
feat(can): add deterministic arbitration evidence (#58)
</commit_message>
<xml_diff>
--- a/docs/ATEP_Volume_IV_CAN_Network_Engineering_Workbook.docx
+++ b/docs/ATEP_Volume_IV_CAN_Network_Engineering_Workbook.docx
@@ -143,7 +143,7 @@
                 <w:color w:val="0B2545"/>
                 <w:sz w:val="19"/>
               </w:rPr>
-              <w:t>0.1.0</w:t>
+              <w:t>0.2.0</w:t>
             </w:r>
           </w:p>
         </w:tc>
@@ -265,7 +265,7 @@
                 <w:color w:val="111827"/>
                 <w:sz w:val="19"/>
               </w:rPr>
-              <w:t>Increment IV-1 implemented</w:t>
+              <w:t>Increments IV-1 and IV-2 implemented</w:t>
             </w:r>
           </w:p>
         </w:tc>
@@ -390,7 +390,7 @@
           <w:color w:val="0B2545"/>
           <w:sz w:val="21"/>
         </w:rPr>
-        <w:t>1. Document Purpose</w:t>
+        <w:t>Document Purpose</w:t>
       </w:r>
     </w:p>
     <w:p>
@@ -409,7 +409,7 @@
           <w:color w:val="0B2545"/>
           <w:sz w:val="21"/>
         </w:rPr>
-        <w:t>2. Document Control</w:t>
+        <w:t>Document Control</w:t>
       </w:r>
     </w:p>
     <w:p>
@@ -428,7 +428,7 @@
           <w:color w:val="0B2545"/>
           <w:sz w:val="21"/>
         </w:rPr>
-        <w:t>3. Revision History</w:t>
+        <w:t>Revision History</w:t>
       </w:r>
     </w:p>
     <w:p>
@@ -447,7 +447,7 @@
           <w:color w:val="0B2545"/>
           <w:sz w:val="21"/>
         </w:rPr>
-        <w:t>4. Scope and Boundaries</w:t>
+        <w:t>Scope and Boundaries</w:t>
       </w:r>
     </w:p>
     <w:p>
@@ -466,7 +466,7 @@
           <w:color w:val="0B2545"/>
           <w:sz w:val="21"/>
         </w:rPr>
-        <w:t>5. Architecture</w:t>
+        <w:t>Architecture</w:t>
       </w:r>
     </w:p>
     <w:p>
@@ -485,7 +485,7 @@
           <w:color w:val="0B2545"/>
           <w:sz w:val="21"/>
         </w:rPr>
-        <w:t>6. Domain Model</w:t>
+        <w:t>Domain Model</w:t>
       </w:r>
     </w:p>
     <w:p>
@@ -504,7 +504,7 @@
           <w:color w:val="0B2545"/>
           <w:sz w:val="21"/>
         </w:rPr>
-        <w:t>7. Public API and Security</w:t>
+        <w:t>Public API and Security</w:t>
       </w:r>
     </w:p>
     <w:p>
@@ -523,7 +523,7 @@
           <w:color w:val="0B2545"/>
           <w:sz w:val="21"/>
         </w:rPr>
-        <w:t>8. Consistency and Evidence</w:t>
+        <w:t>Consistency and Evidence</w:t>
       </w:r>
     </w:p>
     <w:p>
@@ -542,7 +542,7 @@
           <w:color w:val="0B2545"/>
           <w:sz w:val="21"/>
         </w:rPr>
-        <w:t>9. Functional Requirements</w:t>
+        <w:t>Functional Requirements</w:t>
       </w:r>
     </w:p>
     <w:p>
@@ -561,7 +561,7 @@
           <w:color w:val="0B2545"/>
           <w:sz w:val="21"/>
         </w:rPr>
-        <w:t>10. Architecture Decisions</w:t>
+        <w:t>Architecture Decisions</w:t>
       </w:r>
     </w:p>
     <w:p>
@@ -580,7 +580,7 @@
           <w:color w:val="0B2545"/>
           <w:sz w:val="21"/>
         </w:rPr>
-        <w:t>11. Verification Catalogue</w:t>
+        <w:t>Verification Catalogue</w:t>
       </w:r>
     </w:p>
     <w:p>
@@ -599,7 +599,7 @@
           <w:color w:val="0B2545"/>
           <w:sz w:val="21"/>
         </w:rPr>
-        <w:t>12. Implemented Evidence</w:t>
+        <w:t>Implemented Evidence</w:t>
       </w:r>
     </w:p>
     <w:p>
@@ -618,7 +618,7 @@
           <w:color w:val="0B2545"/>
           <w:sz w:val="21"/>
         </w:rPr>
-        <w:t>13. Risks and Technical Debt</w:t>
+        <w:t>Risks and Technical Debt</w:t>
       </w:r>
     </w:p>
     <w:p>
@@ -637,7 +637,7 @@
           <w:color w:val="0B2545"/>
           <w:sz w:val="21"/>
         </w:rPr>
-        <w:t>14. Roadmap</w:t>
+        <w:t>Roadmap</w:t>
       </w:r>
     </w:p>
     <w:p>
@@ -656,7 +656,7 @@
           <w:color w:val="0B2545"/>
           <w:sz w:val="21"/>
         </w:rPr>
-        <w:t>15. Study Exercises</w:t>
+        <w:t>Study Exercises</w:t>
       </w:r>
     </w:p>
     <w:p>
@@ -893,7 +893,7 @@
                 <w:color w:val="111827"/>
                 <w:sz w:val="17"/>
               </w:rPr>
-              <w:t>Increment IV-1</w:t>
+              <w:t>Increments IV-1 and IV-2</w:t>
             </w:r>
           </w:p>
         </w:tc>
@@ -1297,6 +1297,95 @@
           </w:p>
         </w:tc>
       </w:tr>
+      <w:tr>
+        <w:trPr>
+          <w:cantSplit/>
+        </w:trPr>
+        <w:tc>
+          <w:tcPr>
+            <w:tcW w:type="dxa" w:w="1650"/>
+            <w:tcMar>
+              <w:top w:w="80" w:type="dxa"/>
+              <w:start w:w="120" w:type="dxa"/>
+              <w:bottom w:w="80" w:type="dxa"/>
+              <w:end w:w="120" w:type="dxa"/>
+            </w:tcMar>
+            <w:vAlign w:val="center"/>
+            <w:shd w:fill="FFFFFF"/>
+          </w:tcPr>
+          <w:p>
+            <w:pPr>
+              <w:spacing w:before="0" w:after="40" w:line="252" w:lineRule="auto"/>
+              <w:jc w:val="center"/>
+            </w:pPr>
+            <w:r>
+              <w:rPr>
+                <w:rFonts w:ascii="Calibri" w:hAnsi="Calibri"/>
+                <w:b w:val="0"/>
+                <w:color w:val="111827"/>
+                <w:sz w:val="17"/>
+              </w:rPr>
+              <w:t>0.2.0</w:t>
+            </w:r>
+          </w:p>
+        </w:tc>
+        <w:tc>
+          <w:tcPr>
+            <w:tcW w:type="dxa" w:w="4450"/>
+            <w:tcMar>
+              <w:top w:w="80" w:type="dxa"/>
+              <w:start w:w="120" w:type="dxa"/>
+              <w:bottom w:w="80" w:type="dxa"/>
+              <w:end w:w="120" w:type="dxa"/>
+            </w:tcMar>
+            <w:vAlign w:val="center"/>
+            <w:shd w:fill="FFFFFF"/>
+          </w:tcPr>
+          <w:p>
+            <w:pPr>
+              <w:spacing w:before="0" w:after="40" w:line="252" w:lineRule="auto"/>
+              <w:jc w:val="left"/>
+            </w:pPr>
+            <w:r>
+              <w:rPr>
+                <w:rFonts w:ascii="Calibri" w:hAnsi="Calibri"/>
+                <w:b w:val="0"/>
+                <w:color w:val="111827"/>
+                <w:sz w:val="17"/>
+              </w:rPr>
+              <w:t>2026-08-24</w:t>
+            </w:r>
+          </w:p>
+        </w:tc>
+        <w:tc>
+          <w:tcPr>
+            <w:tcW w:type="dxa" w:w="3260"/>
+            <w:tcMar>
+              <w:top w:w="80" w:type="dxa"/>
+              <w:start w:w="120" w:type="dxa"/>
+              <w:bottom w:w="80" w:type="dxa"/>
+              <w:end w:w="120" w:type="dxa"/>
+            </w:tcMar>
+            <w:vAlign w:val="center"/>
+            <w:shd w:fill="FFFFFF"/>
+          </w:tcPr>
+          <w:p>
+            <w:pPr>
+              <w:spacing w:before="0" w:after="40" w:line="252" w:lineRule="auto"/>
+              <w:jc w:val="left"/>
+            </w:pPr>
+            <w:r>
+              <w:rPr>
+                <w:rFonts w:ascii="Calibri" w:hAnsi="Calibri"/>
+                <w:b w:val="0"/>
+                <w:color w:val="111827"/>
+                <w:sz w:val="17"/>
+              </w:rPr>
+              <w:t>Added deterministic arbitration, nominal transmission duration, delivery evidence, utilization metrics, replay-safe persistence, APIs, migration, and tests.</w:t>
+            </w:r>
+          </w:p>
+        </w:tc>
+      </w:tr>
     </w:tbl>
     <w:p>
       <w:pPr>
@@ -1478,6 +1567,57 @@
     </w:p>
     <w:p>
       <w:pPr>
+        <w:pStyle w:val="ListBullet"/>
+        <w:numPr>
+          <w:ilvl w:val="0"/>
+          <w:numId w:val="11"/>
+        </w:numPr>
+      </w:pPr>
+      <w:r>
+        <w:rPr>
+          <w:rFonts w:ascii="Calibri" w:hAnsi="Calibri"/>
+          <w:color w:val="111827"/>
+          <w:sz w:val="22"/>
+        </w:rPr>
+        <w:t>Batches of one to 64 unique contenders with explicit readiness offsets.</w:t>
+      </w:r>
+    </w:p>
+    <w:p>
+      <w:pPr>
+        <w:pStyle w:val="ListBullet"/>
+        <w:numPr>
+          <w:ilvl w:val="0"/>
+          <w:numId w:val="11"/>
+        </w:numPr>
+      </w:pPr>
+      <w:r>
+        <w:rPr>
+          <w:rFonts w:ascii="Calibri" w:hAnsi="Calibri"/>
+          <w:color w:val="111827"/>
+          <w:sz w:val="22"/>
+        </w:rPr>
+        <w:t>CAN-ID priority, standard/extended tie-break, calculated nominal duration, and serial delivery.</w:t>
+      </w:r>
+    </w:p>
+    <w:p>
+      <w:pPr>
+        <w:pStyle w:val="ListBullet"/>
+        <w:numPr>
+          <w:ilvl w:val="0"/>
+          <w:numId w:val="11"/>
+        </w:numPr>
+      </w:pPr>
+      <w:r>
+        <w:rPr>
+          <w:rFonts w:ascii="Calibri" w:hAnsi="Calibri"/>
+          <w:color w:val="111827"/>
+          <w:sz w:val="22"/>
+        </w:rPr>
+        <w:t>Occupied, idle, utilization, latency, ordered transmission, and consumer delivery evidence.</w:t>
+      </w:r>
+    </w:p>
+    <w:p>
+      <w:pPr>
         <w:pStyle w:val="Heading2"/>
         <w:keepNext/>
         <w:keepLines/>
@@ -1500,7 +1640,7 @@
           <w:color w:val="111827"/>
           <w:sz w:val="22"/>
         </w:rPr>
-        <w:t>CAN arbitration and calculated bus timing.</w:t>
+        <w:t>Bit stuffing, acknowledgement, retransmission, and oscillator/physical-layer effects.</w:t>
       </w:r>
     </w:p>
     <w:p>
@@ -1614,7 +1754,7 @@
           <w:color w:val="111827"/>
           <w:sz w:val="22"/>
         </w:rPr>
-        <w:t>Request flow: authenticated client -&gt; FastAPI router -&gt; CAN RBAC dependency -&gt; vehicle lookup -&gt; CAN domain service -&gt; PostgreSQL aggregate/transmission + audit + transactional outbox -&gt; response.</w:t>
+        <w:t>Request flow: authenticated client -&gt; FastAPI router -&gt; CAN RBAC dependency -&gt; vehicle lookup -&gt; CAN domain/arbitration service -&gt; PostgreSQL aggregate/evidence + audit + transactional outbox -&gt; response.</w:t>
       </w:r>
     </w:p>
     <w:p>
@@ -1659,6 +1799,24 @@
           <w:sz w:val="22"/>
         </w:rPr>
         <w:t xml:space="preserve"> stores command identity, contract, producer, CAN ID and format, request, payload, sequence, logical time, versions, and actor.</w:t>
+      </w:r>
+    </w:p>
+    <w:p>
+      <w:r>
+        <w:rPr>
+          <w:rFonts w:ascii="Consolas" w:hAnsi="Consolas"/>
+          <w:color w:val="1F4D78"/>
+          <w:sz w:val="19"/>
+        </w:rPr>
+        <w:t>CanArbitrationExecution</w:t>
+      </w:r>
+      <w:r>
+        <w:rPr>
+          <w:rFonts w:ascii="Calibri" w:hAnsi="Calibri"/>
+          <w:color w:val="111827"/>
+          <w:sz w:val="22"/>
+        </w:rPr>
+        <w:t xml:space="preserve"> stores the canonical batch request, ordered result, contender count, aggregate versions, requesting actor, and timestamps. Each winner also creates normal transmission evidence so history remains coherent across individual and arbitrated sends.</w:t>
       </w:r>
     </w:p>
     <w:p>
@@ -2289,6 +2447,357 @@
           </w:p>
         </w:tc>
       </w:tr>
+      <w:tr>
+        <w:trPr>
+          <w:cantSplit/>
+        </w:trPr>
+        <w:tc>
+          <w:tcPr>
+            <w:tcW w:type="dxa" w:w="1150"/>
+            <w:tcMar>
+              <w:top w:w="80" w:type="dxa"/>
+              <w:start w:w="120" w:type="dxa"/>
+              <w:bottom w:w="80" w:type="dxa"/>
+              <w:end w:w="120" w:type="dxa"/>
+            </w:tcMar>
+            <w:vAlign w:val="center"/>
+            <w:shd w:fill="FFFFFF"/>
+          </w:tcPr>
+          <w:p>
+            <w:pPr>
+              <w:spacing w:before="0" w:after="40" w:line="252" w:lineRule="auto"/>
+              <w:jc w:val="center"/>
+            </w:pPr>
+            <w:r>
+              <w:rPr>
+                <w:rFonts w:ascii="Calibri" w:hAnsi="Calibri"/>
+                <w:b w:val="0"/>
+                <w:color w:val="111827"/>
+                <w:sz w:val="16"/>
+              </w:rPr>
+              <w:t>POST</w:t>
+            </w:r>
+          </w:p>
+        </w:tc>
+        <w:tc>
+          <w:tcPr>
+            <w:tcW w:type="dxa" w:w="3700"/>
+            <w:tcMar>
+              <w:top w:w="80" w:type="dxa"/>
+              <w:start w:w="120" w:type="dxa"/>
+              <w:bottom w:w="80" w:type="dxa"/>
+              <w:end w:w="120" w:type="dxa"/>
+            </w:tcMar>
+            <w:vAlign w:val="center"/>
+            <w:shd w:fill="FFFFFF"/>
+          </w:tcPr>
+          <w:p>
+            <w:pPr>
+              <w:spacing w:before="0" w:after="40" w:line="252" w:lineRule="auto"/>
+              <w:jc w:val="left"/>
+            </w:pPr>
+            <w:r>
+              <w:rPr>
+                <w:rFonts w:ascii="Calibri" w:hAnsi="Calibri"/>
+                <w:b w:val="0"/>
+                <w:color w:val="111827"/>
+                <w:sz w:val="16"/>
+              </w:rPr>
+              <w:t>/api/v1/vehicles/{vehicle_id}/can-networks/arbitrations/execute</w:t>
+            </w:r>
+          </w:p>
+        </w:tc>
+        <w:tc>
+          <w:tcPr>
+            <w:tcW w:type="dxa" w:w="3100"/>
+            <w:tcMar>
+              <w:top w:w="80" w:type="dxa"/>
+              <w:start w:w="120" w:type="dxa"/>
+              <w:bottom w:w="80" w:type="dxa"/>
+              <w:end w:w="120" w:type="dxa"/>
+            </w:tcMar>
+            <w:vAlign w:val="center"/>
+            <w:shd w:fill="FFFFFF"/>
+          </w:tcPr>
+          <w:p>
+            <w:pPr>
+              <w:spacing w:before="0" w:after="40" w:line="252" w:lineRule="auto"/>
+              <w:jc w:val="left"/>
+            </w:pPr>
+            <w:r>
+              <w:rPr>
+                <w:rFonts w:ascii="Calibri" w:hAnsi="Calibri"/>
+                <w:b w:val="0"/>
+                <w:color w:val="111827"/>
+                <w:sz w:val="16"/>
+              </w:rPr>
+              <w:t>can_networks:manage</w:t>
+            </w:r>
+          </w:p>
+        </w:tc>
+        <w:tc>
+          <w:tcPr>
+            <w:tcW w:type="dxa" w:w="1410"/>
+            <w:tcMar>
+              <w:top w:w="80" w:type="dxa"/>
+              <w:start w:w="120" w:type="dxa"/>
+              <w:bottom w:w="80" w:type="dxa"/>
+              <w:end w:w="120" w:type="dxa"/>
+            </w:tcMar>
+            <w:vAlign w:val="center"/>
+            <w:shd w:fill="FFFFFF"/>
+          </w:tcPr>
+          <w:p>
+            <w:pPr>
+              <w:spacing w:before="0" w:after="40" w:line="252" w:lineRule="auto"/>
+              <w:jc w:val="left"/>
+            </w:pPr>
+            <w:r>
+              <w:rPr>
+                <w:rFonts w:ascii="Calibri" w:hAnsi="Calibri"/>
+                <w:b w:val="0"/>
+                <w:color w:val="111827"/>
+                <w:sz w:val="16"/>
+              </w:rPr>
+              <w:t>Execute a bounded arbitration batch.</w:t>
+            </w:r>
+          </w:p>
+        </w:tc>
+      </w:tr>
+      <w:tr>
+        <w:trPr>
+          <w:cantSplit/>
+        </w:trPr>
+        <w:tc>
+          <w:tcPr>
+            <w:tcW w:type="dxa" w:w="1150"/>
+            <w:tcMar>
+              <w:top w:w="80" w:type="dxa"/>
+              <w:start w:w="120" w:type="dxa"/>
+              <w:bottom w:w="80" w:type="dxa"/>
+              <w:end w:w="120" w:type="dxa"/>
+            </w:tcMar>
+            <w:vAlign w:val="center"/>
+            <w:shd w:fill="FFFFFF"/>
+          </w:tcPr>
+          <w:p>
+            <w:pPr>
+              <w:spacing w:before="0" w:after="40" w:line="252" w:lineRule="auto"/>
+              <w:jc w:val="center"/>
+            </w:pPr>
+            <w:r>
+              <w:rPr>
+                <w:rFonts w:ascii="Calibri" w:hAnsi="Calibri"/>
+                <w:b w:val="0"/>
+                <w:color w:val="111827"/>
+                <w:sz w:val="16"/>
+              </w:rPr>
+              <w:t>GET</w:t>
+            </w:r>
+          </w:p>
+        </w:tc>
+        <w:tc>
+          <w:tcPr>
+            <w:tcW w:type="dxa" w:w="3700"/>
+            <w:tcMar>
+              <w:top w:w="80" w:type="dxa"/>
+              <w:start w:w="120" w:type="dxa"/>
+              <w:bottom w:w="80" w:type="dxa"/>
+              <w:end w:w="120" w:type="dxa"/>
+            </w:tcMar>
+            <w:vAlign w:val="center"/>
+            <w:shd w:fill="FFFFFF"/>
+          </w:tcPr>
+          <w:p>
+            <w:pPr>
+              <w:spacing w:before="0" w:after="40" w:line="252" w:lineRule="auto"/>
+              <w:jc w:val="left"/>
+            </w:pPr>
+            <w:r>
+              <w:rPr>
+                <w:rFonts w:ascii="Calibri" w:hAnsi="Calibri"/>
+                <w:b w:val="0"/>
+                <w:color w:val="111827"/>
+                <w:sz w:val="16"/>
+              </w:rPr>
+              <w:t>/api/v1/vehicles/{vehicle_id}/can-networks/arbitrations</w:t>
+            </w:r>
+          </w:p>
+        </w:tc>
+        <w:tc>
+          <w:tcPr>
+            <w:tcW w:type="dxa" w:w="3100"/>
+            <w:tcMar>
+              <w:top w:w="80" w:type="dxa"/>
+              <w:start w:w="120" w:type="dxa"/>
+              <w:bottom w:w="80" w:type="dxa"/>
+              <w:end w:w="120" w:type="dxa"/>
+            </w:tcMar>
+            <w:vAlign w:val="center"/>
+            <w:shd w:fill="FFFFFF"/>
+          </w:tcPr>
+          <w:p>
+            <w:pPr>
+              <w:spacing w:before="0" w:after="40" w:line="252" w:lineRule="auto"/>
+              <w:jc w:val="left"/>
+            </w:pPr>
+            <w:r>
+              <w:rPr>
+                <w:rFonts w:ascii="Calibri" w:hAnsi="Calibri"/>
+                <w:b w:val="0"/>
+                <w:color w:val="111827"/>
+                <w:sz w:val="16"/>
+              </w:rPr>
+              <w:t>can_networks:read</w:t>
+            </w:r>
+          </w:p>
+        </w:tc>
+        <w:tc>
+          <w:tcPr>
+            <w:tcW w:type="dxa" w:w="1410"/>
+            <w:tcMar>
+              <w:top w:w="80" w:type="dxa"/>
+              <w:start w:w="120" w:type="dxa"/>
+              <w:bottom w:w="80" w:type="dxa"/>
+              <w:end w:w="120" w:type="dxa"/>
+            </w:tcMar>
+            <w:vAlign w:val="center"/>
+            <w:shd w:fill="FFFFFF"/>
+          </w:tcPr>
+          <w:p>
+            <w:pPr>
+              <w:spacing w:before="0" w:after="40" w:line="252" w:lineRule="auto"/>
+              <w:jc w:val="left"/>
+            </w:pPr>
+            <w:r>
+              <w:rPr>
+                <w:rFonts w:ascii="Calibri" w:hAnsi="Calibri"/>
+                <w:b w:val="0"/>
+                <w:color w:val="111827"/>
+                <w:sz w:val="16"/>
+              </w:rPr>
+              <w:t>List persisted arbitration evidence.</w:t>
+            </w:r>
+          </w:p>
+        </w:tc>
+      </w:tr>
+      <w:tr>
+        <w:trPr>
+          <w:cantSplit/>
+        </w:trPr>
+        <w:tc>
+          <w:tcPr>
+            <w:tcW w:type="dxa" w:w="1150"/>
+            <w:tcMar>
+              <w:top w:w="80" w:type="dxa"/>
+              <w:start w:w="120" w:type="dxa"/>
+              <w:bottom w:w="80" w:type="dxa"/>
+              <w:end w:w="120" w:type="dxa"/>
+            </w:tcMar>
+            <w:vAlign w:val="center"/>
+            <w:shd w:fill="FFFFFF"/>
+          </w:tcPr>
+          <w:p>
+            <w:pPr>
+              <w:spacing w:before="0" w:after="40" w:line="252" w:lineRule="auto"/>
+              <w:jc w:val="center"/>
+            </w:pPr>
+            <w:r>
+              <w:rPr>
+                <w:rFonts w:ascii="Calibri" w:hAnsi="Calibri"/>
+                <w:b w:val="0"/>
+                <w:color w:val="111827"/>
+                <w:sz w:val="16"/>
+              </w:rPr>
+              <w:t>GET</w:t>
+            </w:r>
+          </w:p>
+        </w:tc>
+        <w:tc>
+          <w:tcPr>
+            <w:tcW w:type="dxa" w:w="3700"/>
+            <w:tcMar>
+              <w:top w:w="80" w:type="dxa"/>
+              <w:start w:w="120" w:type="dxa"/>
+              <w:bottom w:w="80" w:type="dxa"/>
+              <w:end w:w="120" w:type="dxa"/>
+            </w:tcMar>
+            <w:vAlign w:val="center"/>
+            <w:shd w:fill="FFFFFF"/>
+          </w:tcPr>
+          <w:p>
+            <w:pPr>
+              <w:spacing w:before="0" w:after="40" w:line="252" w:lineRule="auto"/>
+              <w:jc w:val="left"/>
+            </w:pPr>
+            <w:r>
+              <w:rPr>
+                <w:rFonts w:ascii="Calibri" w:hAnsi="Calibri"/>
+                <w:b w:val="0"/>
+                <w:color w:val="111827"/>
+                <w:sz w:val="16"/>
+              </w:rPr>
+              <w:t>/api/v1/vehicles/{vehicle_id}/can-networks/arbitrations/{command_id}</w:t>
+            </w:r>
+          </w:p>
+        </w:tc>
+        <w:tc>
+          <w:tcPr>
+            <w:tcW w:type="dxa" w:w="3100"/>
+            <w:tcMar>
+              <w:top w:w="80" w:type="dxa"/>
+              <w:start w:w="120" w:type="dxa"/>
+              <w:bottom w:w="80" w:type="dxa"/>
+              <w:end w:w="120" w:type="dxa"/>
+            </w:tcMar>
+            <w:vAlign w:val="center"/>
+            <w:shd w:fill="FFFFFF"/>
+          </w:tcPr>
+          <w:p>
+            <w:pPr>
+              <w:spacing w:before="0" w:after="40" w:line="252" w:lineRule="auto"/>
+              <w:jc w:val="left"/>
+            </w:pPr>
+            <w:r>
+              <w:rPr>
+                <w:rFonts w:ascii="Calibri" w:hAnsi="Calibri"/>
+                <w:b w:val="0"/>
+                <w:color w:val="111827"/>
+                <w:sz w:val="16"/>
+              </w:rPr>
+              <w:t>can_networks:read</w:t>
+            </w:r>
+          </w:p>
+        </w:tc>
+        <w:tc>
+          <w:tcPr>
+            <w:tcW w:type="dxa" w:w="1410"/>
+            <w:tcMar>
+              <w:top w:w="80" w:type="dxa"/>
+              <w:start w:w="120" w:type="dxa"/>
+              <w:bottom w:w="80" w:type="dxa"/>
+              <w:end w:w="120" w:type="dxa"/>
+            </w:tcMar>
+            <w:vAlign w:val="center"/>
+            <w:shd w:fill="FFFFFF"/>
+          </w:tcPr>
+          <w:p>
+            <w:pPr>
+              <w:spacing w:before="0" w:after="40" w:line="252" w:lineRule="auto"/>
+              <w:jc w:val="left"/>
+            </w:pPr>
+            <w:r>
+              <w:rPr>
+                <w:rFonts w:ascii="Calibri" w:hAnsi="Calibri"/>
+                <w:b w:val="0"/>
+                <w:color w:val="111827"/>
+                <w:sz w:val="16"/>
+              </w:rPr>
+              <w:t>Retrieve one arbitration result.</w:t>
+            </w:r>
+          </w:p>
+        </w:tc>
+      </w:tr>
     </w:tbl>
     <w:p>
       <w:pPr>
@@ -2353,6 +2862,94 @@
     </w:p>
     <w:p>
       <w:pPr>
+        <w:pStyle w:val="Heading2"/>
+        <w:keepNext/>
+        <w:keepLines/>
+      </w:pPr>
+      <w:r>
+        <w:t>8.1 Arbitration Semantics</w:t>
+      </w:r>
+    </w:p>
+    <w:p>
+      <w:r>
+        <w:rPr>
+          <w:rFonts w:ascii="Calibri" w:hAnsi="Calibri"/>
+          <w:color w:val="111827"/>
+          <w:sz w:val="22"/>
+        </w:rPr>
+        <w:t>Each contender is resolved against an immutable frame contract and checked for producer ownership and exact DLC. The bus selects only ready contenders. Lowest numeric CAN ID wins; standard format precedes extended format for an equal numeric ID; contract identity provides a stable final tie-break. When no frame is ready, the logical clock advances to the next readiness instant.</w:t>
+      </w:r>
+    </w:p>
+    <w:p>
+      <w:r>
+        <w:rPr>
+          <w:rFonts w:ascii="Calibri" w:hAnsi="Calibri"/>
+          <w:color w:val="111827"/>
+          <w:sz w:val="22"/>
+        </w:rPr>
+        <w:t xml:space="preserve">Nominal size is </w:t>
+      </w:r>
+      <w:r>
+        <w:rPr>
+          <w:rFonts w:ascii="Consolas" w:hAnsi="Consolas"/>
+          <w:color w:val="1F4D78"/>
+          <w:sz w:val="19"/>
+        </w:rPr>
+        <w:t>47 + 8 * DLC</w:t>
+      </w:r>
+      <w:r>
+        <w:rPr>
+          <w:rFonts w:ascii="Calibri" w:hAnsi="Calibri"/>
+          <w:color w:val="111827"/>
+          <w:sz w:val="22"/>
+        </w:rPr>
+        <w:t xml:space="preserve"> bits for standard and </w:t>
+      </w:r>
+      <w:r>
+        <w:rPr>
+          <w:rFonts w:ascii="Consolas" w:hAnsi="Consolas"/>
+          <w:color w:val="1F4D78"/>
+          <w:sz w:val="19"/>
+        </w:rPr>
+        <w:t>67 + 8 * DLC</w:t>
+      </w:r>
+      <w:r>
+        <w:rPr>
+          <w:rFonts w:ascii="Calibri" w:hAnsi="Calibri"/>
+          <w:color w:val="111827"/>
+          <w:sz w:val="22"/>
+        </w:rPr>
+        <w:t xml:space="preserve"> bits for extended classic CAN. This includes a three-bit intermission and excludes bit stuffing. Duration uses the ceiling of </w:t>
+      </w:r>
+      <w:r>
+        <w:rPr>
+          <w:rFonts w:ascii="Consolas" w:hAnsi="Consolas"/>
+          <w:color w:val="1F4D78"/>
+          <w:sz w:val="19"/>
+        </w:rPr>
+        <w:t>bit_count * 1000 / bitrate_kbps</w:t>
+      </w:r>
+      <w:r>
+        <w:rPr>
+          <w:rFonts w:ascii="Calibri" w:hAnsi="Calibri"/>
+          <w:color w:val="111827"/>
+          <w:sz w:val="22"/>
+        </w:rPr>
+        <w:t>. Frames are serialized, delivered to every declared consumer at completion, and assigned latency from readiness to completion.</w:t>
+      </w:r>
+    </w:p>
+    <w:p>
+      <w:r>
+        <w:rPr>
+          <w:rFonts w:ascii="Calibri" w:hAnsi="Calibri"/>
+          <w:color w:val="111827"/>
+          <w:sz w:val="22"/>
+        </w:rPr>
+        <w:t>The utilization window begins at the prior network time and ends at the last completion. Occupied time is the sum of nominal durations; idle time is the remainder. A batch advances the network version once and the sequence once per winner. Exact retry returns stored evidence without another mutation, event, or audit record.</w:t>
+      </w:r>
+    </w:p>
+    <w:p>
+      <w:pPr>
         <w:pStyle w:val="Heading1"/>
         <w:keepNext/>
         <w:keepLines/>
@@ -2384,7 +2981,7 @@
           <w:color w:val="111827"/>
           <w:sz w:val="22"/>
         </w:rPr>
-        <w:t>. IV-1 implements CAN-F-001 through CAN-F-012 and CAN-NF-001 through CAN-NF-006.</w:t>
+        <w:t>. IV-1 and IV-2 implement CAN-F-001 through CAN-F-020 and CAN-NF-001 through CAN-NF-008.</w:t>
       </w:r>
     </w:p>
     <w:p>
@@ -2514,7 +3111,47 @@
           <w:color w:val="111827"/>
           <w:sz w:val="22"/>
         </w:rPr>
-        <w:t>A submitted frame is not yet a physically arbitrated transmission. IV-2 will define priority, duration, delivery, and bus-load semantics rather than hiding them in IV-1.</w:t>
+        <w:t>A submitted frame is distinct from a batch contender. IV-2 makes priority, duration, delivery, and bus-load assumptions explicit and independently testable.</w:t>
+      </w:r>
+    </w:p>
+    <w:p>
+      <w:pPr>
+        <w:pStyle w:val="Heading2"/>
+        <w:keepNext/>
+        <w:keepLines/>
+      </w:pPr>
+      <w:r>
+        <w:t>ADR-CAN-007 - Model Nominal Timing Before Physical Effects</w:t>
+      </w:r>
+    </w:p>
+    <w:p>
+      <w:r>
+        <w:rPr>
+          <w:rFonts w:ascii="Calibri" w:hAnsi="Calibri"/>
+          <w:color w:val="111827"/>
+          <w:sz w:val="22"/>
+        </w:rPr>
+        <w:t>The first timing model includes fixed classic CAN fields and intermission but excludes bit stuffing, acknowledgement failure, retransmission, propagation delay, and oscillator drift. This produces a reproducible engineering baseline without claiming electrical-bus fidelity.</w:t>
+      </w:r>
+    </w:p>
+    <w:p>
+      <w:pPr>
+        <w:pStyle w:val="Heading2"/>
+        <w:keepNext/>
+        <w:keepLines/>
+      </w:pPr>
+      <w:r>
+        <w:t>ADR-CAN-008 - Persist Both Batch and Frame Evidence</w:t>
+      </w:r>
+    </w:p>
+    <w:p>
+      <w:r>
+        <w:rPr>
+          <w:rFonts w:ascii="Calibri" w:hAnsi="Calibri"/>
+          <w:color w:val="111827"/>
+          <w:sz w:val="22"/>
+        </w:rPr>
+        <w:t>The batch preserves arbitration context and metrics. Winner transmissions preserve a unified frame history. A single aggregate version increment represents the atomic command, while each frame gets its own monotonically increasing sequence.</w:t>
       </w:r>
     </w:p>
     <w:p>
@@ -4258,6 +4895,1074 @@
           </w:p>
         </w:tc>
       </w:tr>
+      <w:tr>
+        <w:trPr>
+          <w:cantSplit/>
+        </w:trPr>
+        <w:tc>
+          <w:tcPr>
+            <w:tcW w:type="dxa" w:w="1650"/>
+            <w:tcMar>
+              <w:top w:w="80" w:type="dxa"/>
+              <w:start w:w="120" w:type="dxa"/>
+              <w:bottom w:w="80" w:type="dxa"/>
+              <w:end w:w="120" w:type="dxa"/>
+            </w:tcMar>
+            <w:vAlign w:val="center"/>
+            <w:shd w:fill="FFFFFF"/>
+          </w:tcPr>
+          <w:p>
+            <w:pPr>
+              <w:spacing w:before="0" w:after="40" w:line="252" w:lineRule="auto"/>
+              <w:jc w:val="center"/>
+            </w:pPr>
+            <w:r>
+              <w:rPr>
+                <w:rFonts w:ascii="Calibri" w:hAnsi="Calibri"/>
+                <w:b w:val="0"/>
+                <w:color w:val="111827"/>
+                <w:sz w:val="17"/>
+              </w:rPr>
+              <w:t>Arbitration priority</w:t>
+            </w:r>
+          </w:p>
+        </w:tc>
+        <w:tc>
+          <w:tcPr>
+            <w:tcW w:type="dxa" w:w="4450"/>
+            <w:tcMar>
+              <w:top w:w="80" w:type="dxa"/>
+              <w:start w:w="120" w:type="dxa"/>
+              <w:bottom w:w="80" w:type="dxa"/>
+              <w:end w:w="120" w:type="dxa"/>
+            </w:tcMar>
+            <w:vAlign w:val="center"/>
+            <w:shd w:fill="FFFFFF"/>
+          </w:tcPr>
+          <w:p>
+            <w:pPr>
+              <w:spacing w:before="0" w:after="40" w:line="252" w:lineRule="auto"/>
+              <w:jc w:val="left"/>
+            </w:pPr>
+            <w:r>
+              <w:rPr>
+                <w:rFonts w:ascii="Calibri" w:hAnsi="Calibri"/>
+                <w:b w:val="0"/>
+                <w:color w:val="111827"/>
+                <w:sz w:val="17"/>
+              </w:rPr>
+              <w:t>Select lowest ready CAN ID and standard before extended on equal ID.</w:t>
+            </w:r>
+          </w:p>
+        </w:tc>
+        <w:tc>
+          <w:tcPr>
+            <w:tcW w:type="dxa" w:w="3260"/>
+            <w:tcMar>
+              <w:top w:w="80" w:type="dxa"/>
+              <w:start w:w="120" w:type="dxa"/>
+              <w:bottom w:w="80" w:type="dxa"/>
+              <w:end w:w="120" w:type="dxa"/>
+            </w:tcMar>
+            <w:vAlign w:val="center"/>
+            <w:shd w:fill="FFFFFF"/>
+          </w:tcPr>
+          <w:p>
+            <w:pPr>
+              <w:spacing w:before="0" w:after="40" w:line="252" w:lineRule="auto"/>
+              <w:jc w:val="left"/>
+            </w:pPr>
+            <w:r>
+              <w:rPr>
+                <w:rFonts w:ascii="Calibri" w:hAnsi="Calibri"/>
+                <w:b w:val="0"/>
+                <w:color w:val="111827"/>
+                <w:sz w:val="17"/>
+              </w:rPr>
+              <w:t>Service</w:t>
+            </w:r>
+          </w:p>
+        </w:tc>
+      </w:tr>
+      <w:tr>
+        <w:trPr>
+          <w:cantSplit/>
+        </w:trPr>
+        <w:tc>
+          <w:tcPr>
+            <w:tcW w:type="dxa" w:w="1650"/>
+            <w:tcMar>
+              <w:top w:w="80" w:type="dxa"/>
+              <w:start w:w="120" w:type="dxa"/>
+              <w:bottom w:w="80" w:type="dxa"/>
+              <w:end w:w="120" w:type="dxa"/>
+            </w:tcMar>
+            <w:vAlign w:val="center"/>
+            <w:shd w:fill="FFFFFF"/>
+          </w:tcPr>
+          <w:p>
+            <w:pPr>
+              <w:spacing w:before="0" w:after="40" w:line="252" w:lineRule="auto"/>
+              <w:jc w:val="center"/>
+            </w:pPr>
+            <w:r>
+              <w:rPr>
+                <w:rFonts w:ascii="Calibri" w:hAnsi="Calibri"/>
+                <w:b w:val="0"/>
+                <w:color w:val="111827"/>
+                <w:sz w:val="17"/>
+              </w:rPr>
+              <w:t>Readiness</w:t>
+            </w:r>
+          </w:p>
+        </w:tc>
+        <w:tc>
+          <w:tcPr>
+            <w:tcW w:type="dxa" w:w="4450"/>
+            <w:tcMar>
+              <w:top w:w="80" w:type="dxa"/>
+              <w:start w:w="120" w:type="dxa"/>
+              <w:bottom w:w="80" w:type="dxa"/>
+              <w:end w:w="120" w:type="dxa"/>
+            </w:tcMar>
+            <w:vAlign w:val="center"/>
+            <w:shd w:fill="FFFFFF"/>
+          </w:tcPr>
+          <w:p>
+            <w:pPr>
+              <w:spacing w:before="0" w:after="40" w:line="252" w:lineRule="auto"/>
+              <w:jc w:val="left"/>
+            </w:pPr>
+            <w:r>
+              <w:rPr>
+                <w:rFonts w:ascii="Calibri" w:hAnsi="Calibri"/>
+                <w:b w:val="0"/>
+                <w:color w:val="111827"/>
+                <w:sz w:val="17"/>
+              </w:rPr>
+              <w:t>Advance only logical time when the bus has no ready contender.</w:t>
+            </w:r>
+          </w:p>
+        </w:tc>
+        <w:tc>
+          <w:tcPr>
+            <w:tcW w:type="dxa" w:w="3260"/>
+            <w:tcMar>
+              <w:top w:w="80" w:type="dxa"/>
+              <w:start w:w="120" w:type="dxa"/>
+              <w:bottom w:w="80" w:type="dxa"/>
+              <w:end w:w="120" w:type="dxa"/>
+            </w:tcMar>
+            <w:vAlign w:val="center"/>
+            <w:shd w:fill="FFFFFF"/>
+          </w:tcPr>
+          <w:p>
+            <w:pPr>
+              <w:spacing w:before="0" w:after="40" w:line="252" w:lineRule="auto"/>
+              <w:jc w:val="left"/>
+            </w:pPr>
+            <w:r>
+              <w:rPr>
+                <w:rFonts w:ascii="Calibri" w:hAnsi="Calibri"/>
+                <w:b w:val="0"/>
+                <w:color w:val="111827"/>
+                <w:sz w:val="17"/>
+              </w:rPr>
+              <w:t>Service</w:t>
+            </w:r>
+          </w:p>
+        </w:tc>
+      </w:tr>
+      <w:tr>
+        <w:trPr>
+          <w:cantSplit/>
+        </w:trPr>
+        <w:tc>
+          <w:tcPr>
+            <w:tcW w:type="dxa" w:w="1650"/>
+            <w:tcMar>
+              <w:top w:w="80" w:type="dxa"/>
+              <w:start w:w="120" w:type="dxa"/>
+              <w:bottom w:w="80" w:type="dxa"/>
+              <w:end w:w="120" w:type="dxa"/>
+            </w:tcMar>
+            <w:vAlign w:val="center"/>
+            <w:shd w:fill="FFFFFF"/>
+          </w:tcPr>
+          <w:p>
+            <w:pPr>
+              <w:spacing w:before="0" w:after="40" w:line="252" w:lineRule="auto"/>
+              <w:jc w:val="center"/>
+            </w:pPr>
+            <w:r>
+              <w:rPr>
+                <w:rFonts w:ascii="Calibri" w:hAnsi="Calibri"/>
+                <w:b w:val="0"/>
+                <w:color w:val="111827"/>
+                <w:sz w:val="17"/>
+              </w:rPr>
+              <w:t>Nominal bit count</w:t>
+            </w:r>
+          </w:p>
+        </w:tc>
+        <w:tc>
+          <w:tcPr>
+            <w:tcW w:type="dxa" w:w="4450"/>
+            <w:tcMar>
+              <w:top w:w="80" w:type="dxa"/>
+              <w:start w:w="120" w:type="dxa"/>
+              <w:bottom w:w="80" w:type="dxa"/>
+              <w:end w:w="120" w:type="dxa"/>
+            </w:tcMar>
+            <w:vAlign w:val="center"/>
+            <w:shd w:fill="FFFFFF"/>
+          </w:tcPr>
+          <w:p>
+            <w:pPr>
+              <w:spacing w:before="0" w:after="40" w:line="252" w:lineRule="auto"/>
+              <w:jc w:val="left"/>
+            </w:pPr>
+            <w:r>
+              <w:rPr>
+                <w:rFonts w:ascii="Calibri" w:hAnsi="Calibri"/>
+                <w:b w:val="0"/>
+                <w:color w:val="111827"/>
+                <w:sz w:val="17"/>
+              </w:rPr>
+              <w:t>Apply documented standard and extended classic CAN formulas.</w:t>
+            </w:r>
+          </w:p>
+        </w:tc>
+        <w:tc>
+          <w:tcPr>
+            <w:tcW w:type="dxa" w:w="3260"/>
+            <w:tcMar>
+              <w:top w:w="80" w:type="dxa"/>
+              <w:start w:w="120" w:type="dxa"/>
+              <w:bottom w:w="80" w:type="dxa"/>
+              <w:end w:w="120" w:type="dxa"/>
+            </w:tcMar>
+            <w:vAlign w:val="center"/>
+            <w:shd w:fill="FFFFFF"/>
+          </w:tcPr>
+          <w:p>
+            <w:pPr>
+              <w:spacing w:before="0" w:after="40" w:line="252" w:lineRule="auto"/>
+              <w:jc w:val="left"/>
+            </w:pPr>
+            <w:r>
+              <w:rPr>
+                <w:rFonts w:ascii="Calibri" w:hAnsi="Calibri"/>
+                <w:b w:val="0"/>
+                <w:color w:val="111827"/>
+                <w:sz w:val="17"/>
+              </w:rPr>
+              <w:t>Unit</w:t>
+            </w:r>
+          </w:p>
+        </w:tc>
+      </w:tr>
+      <w:tr>
+        <w:trPr>
+          <w:cantSplit/>
+        </w:trPr>
+        <w:tc>
+          <w:tcPr>
+            <w:tcW w:type="dxa" w:w="1650"/>
+            <w:tcMar>
+              <w:top w:w="80" w:type="dxa"/>
+              <w:start w:w="120" w:type="dxa"/>
+              <w:bottom w:w="80" w:type="dxa"/>
+              <w:end w:w="120" w:type="dxa"/>
+            </w:tcMar>
+            <w:vAlign w:val="center"/>
+            <w:shd w:fill="FFFFFF"/>
+          </w:tcPr>
+          <w:p>
+            <w:pPr>
+              <w:spacing w:before="0" w:after="40" w:line="252" w:lineRule="auto"/>
+              <w:jc w:val="center"/>
+            </w:pPr>
+            <w:r>
+              <w:rPr>
+                <w:rFonts w:ascii="Calibri" w:hAnsi="Calibri"/>
+                <w:b w:val="0"/>
+                <w:color w:val="111827"/>
+                <w:sz w:val="17"/>
+              </w:rPr>
+              <w:t>Duration rounding</w:t>
+            </w:r>
+          </w:p>
+        </w:tc>
+        <w:tc>
+          <w:tcPr>
+            <w:tcW w:type="dxa" w:w="4450"/>
+            <w:tcMar>
+              <w:top w:w="80" w:type="dxa"/>
+              <w:start w:w="120" w:type="dxa"/>
+              <w:bottom w:w="80" w:type="dxa"/>
+              <w:end w:w="120" w:type="dxa"/>
+            </w:tcMar>
+            <w:vAlign w:val="center"/>
+            <w:shd w:fill="FFFFFF"/>
+          </w:tcPr>
+          <w:p>
+            <w:pPr>
+              <w:spacing w:before="0" w:after="40" w:line="252" w:lineRule="auto"/>
+              <w:jc w:val="left"/>
+            </w:pPr>
+            <w:r>
+              <w:rPr>
+                <w:rFonts w:ascii="Calibri" w:hAnsi="Calibri"/>
+                <w:b w:val="0"/>
+                <w:color w:val="111827"/>
+                <w:sz w:val="17"/>
+              </w:rPr>
+              <w:t>Round calculated microseconds upward to avoid zero or partial evidence.</w:t>
+            </w:r>
+          </w:p>
+        </w:tc>
+        <w:tc>
+          <w:tcPr>
+            <w:tcW w:type="dxa" w:w="3260"/>
+            <w:tcMar>
+              <w:top w:w="80" w:type="dxa"/>
+              <w:start w:w="120" w:type="dxa"/>
+              <w:bottom w:w="80" w:type="dxa"/>
+              <w:end w:w="120" w:type="dxa"/>
+            </w:tcMar>
+            <w:vAlign w:val="center"/>
+            <w:shd w:fill="FFFFFF"/>
+          </w:tcPr>
+          <w:p>
+            <w:pPr>
+              <w:spacing w:before="0" w:after="40" w:line="252" w:lineRule="auto"/>
+              <w:jc w:val="left"/>
+            </w:pPr>
+            <w:r>
+              <w:rPr>
+                <w:rFonts w:ascii="Calibri" w:hAnsi="Calibri"/>
+                <w:b w:val="0"/>
+                <w:color w:val="111827"/>
+                <w:sz w:val="17"/>
+              </w:rPr>
+              <w:t>Unit</w:t>
+            </w:r>
+          </w:p>
+        </w:tc>
+      </w:tr>
+      <w:tr>
+        <w:trPr>
+          <w:cantSplit/>
+        </w:trPr>
+        <w:tc>
+          <w:tcPr>
+            <w:tcW w:type="dxa" w:w="1650"/>
+            <w:tcMar>
+              <w:top w:w="80" w:type="dxa"/>
+              <w:start w:w="120" w:type="dxa"/>
+              <w:bottom w:w="80" w:type="dxa"/>
+              <w:end w:w="120" w:type="dxa"/>
+            </w:tcMar>
+            <w:vAlign w:val="center"/>
+            <w:shd w:fill="FFFFFF"/>
+          </w:tcPr>
+          <w:p>
+            <w:pPr>
+              <w:spacing w:before="0" w:after="40" w:line="252" w:lineRule="auto"/>
+              <w:jc w:val="center"/>
+            </w:pPr>
+            <w:r>
+              <w:rPr>
+                <w:rFonts w:ascii="Calibri" w:hAnsi="Calibri"/>
+                <w:b w:val="0"/>
+                <w:color w:val="111827"/>
+                <w:sz w:val="17"/>
+              </w:rPr>
+              <w:t>Serial delivery</w:t>
+            </w:r>
+          </w:p>
+        </w:tc>
+        <w:tc>
+          <w:tcPr>
+            <w:tcW w:type="dxa" w:w="4450"/>
+            <w:tcMar>
+              <w:top w:w="80" w:type="dxa"/>
+              <w:start w:w="120" w:type="dxa"/>
+              <w:bottom w:w="80" w:type="dxa"/>
+              <w:end w:w="120" w:type="dxa"/>
+            </w:tcMar>
+            <w:vAlign w:val="center"/>
+            <w:shd w:fill="FFFFFF"/>
+          </w:tcPr>
+          <w:p>
+            <w:pPr>
+              <w:spacing w:before="0" w:after="40" w:line="252" w:lineRule="auto"/>
+              <w:jc w:val="left"/>
+            </w:pPr>
+            <w:r>
+              <w:rPr>
+                <w:rFonts w:ascii="Calibri" w:hAnsi="Calibri"/>
+                <w:b w:val="0"/>
+                <w:color w:val="111827"/>
+                <w:sz w:val="17"/>
+              </w:rPr>
+              <w:t>Start the next winner only after prior completion.</w:t>
+            </w:r>
+          </w:p>
+        </w:tc>
+        <w:tc>
+          <w:tcPr>
+            <w:tcW w:type="dxa" w:w="3260"/>
+            <w:tcMar>
+              <w:top w:w="80" w:type="dxa"/>
+              <w:start w:w="120" w:type="dxa"/>
+              <w:bottom w:w="80" w:type="dxa"/>
+              <w:end w:w="120" w:type="dxa"/>
+            </w:tcMar>
+            <w:vAlign w:val="center"/>
+            <w:shd w:fill="FFFFFF"/>
+          </w:tcPr>
+          <w:p>
+            <w:pPr>
+              <w:spacing w:before="0" w:after="40" w:line="252" w:lineRule="auto"/>
+              <w:jc w:val="left"/>
+            </w:pPr>
+            <w:r>
+              <w:rPr>
+                <w:rFonts w:ascii="Calibri" w:hAnsi="Calibri"/>
+                <w:b w:val="0"/>
+                <w:color w:val="111827"/>
+                <w:sz w:val="17"/>
+              </w:rPr>
+              <w:t>Service</w:t>
+            </w:r>
+          </w:p>
+        </w:tc>
+      </w:tr>
+      <w:tr>
+        <w:trPr>
+          <w:cantSplit/>
+        </w:trPr>
+        <w:tc>
+          <w:tcPr>
+            <w:tcW w:type="dxa" w:w="1650"/>
+            <w:tcMar>
+              <w:top w:w="80" w:type="dxa"/>
+              <w:start w:w="120" w:type="dxa"/>
+              <w:bottom w:w="80" w:type="dxa"/>
+              <w:end w:w="120" w:type="dxa"/>
+            </w:tcMar>
+            <w:vAlign w:val="center"/>
+            <w:shd w:fill="FFFFFF"/>
+          </w:tcPr>
+          <w:p>
+            <w:pPr>
+              <w:spacing w:before="0" w:after="40" w:line="252" w:lineRule="auto"/>
+              <w:jc w:val="center"/>
+            </w:pPr>
+            <w:r>
+              <w:rPr>
+                <w:rFonts w:ascii="Calibri" w:hAnsi="Calibri"/>
+                <w:b w:val="0"/>
+                <w:color w:val="111827"/>
+                <w:sz w:val="17"/>
+              </w:rPr>
+              <w:t>Consumer evidence</w:t>
+            </w:r>
+          </w:p>
+        </w:tc>
+        <w:tc>
+          <w:tcPr>
+            <w:tcW w:type="dxa" w:w="4450"/>
+            <w:tcMar>
+              <w:top w:w="80" w:type="dxa"/>
+              <w:start w:w="120" w:type="dxa"/>
+              <w:bottom w:w="80" w:type="dxa"/>
+              <w:end w:w="120" w:type="dxa"/>
+            </w:tcMar>
+            <w:vAlign w:val="center"/>
+            <w:shd w:fill="FFFFFF"/>
+          </w:tcPr>
+          <w:p>
+            <w:pPr>
+              <w:spacing w:before="0" w:after="40" w:line="252" w:lineRule="auto"/>
+              <w:jc w:val="left"/>
+            </w:pPr>
+            <w:r>
+              <w:rPr>
+                <w:rFonts w:ascii="Calibri" w:hAnsi="Calibri"/>
+                <w:b w:val="0"/>
+                <w:color w:val="111827"/>
+                <w:sz w:val="17"/>
+              </w:rPr>
+              <w:t>Record receipt and readiness-to-completion latency per declared consumer.</w:t>
+            </w:r>
+          </w:p>
+        </w:tc>
+        <w:tc>
+          <w:tcPr>
+            <w:tcW w:type="dxa" w:w="3260"/>
+            <w:tcMar>
+              <w:top w:w="80" w:type="dxa"/>
+              <w:start w:w="120" w:type="dxa"/>
+              <w:bottom w:w="80" w:type="dxa"/>
+              <w:end w:w="120" w:type="dxa"/>
+            </w:tcMar>
+            <w:vAlign w:val="center"/>
+            <w:shd w:fill="FFFFFF"/>
+          </w:tcPr>
+          <w:p>
+            <w:pPr>
+              <w:spacing w:before="0" w:after="40" w:line="252" w:lineRule="auto"/>
+              <w:jc w:val="left"/>
+            </w:pPr>
+            <w:r>
+              <w:rPr>
+                <w:rFonts w:ascii="Calibri" w:hAnsi="Calibri"/>
+                <w:b w:val="0"/>
+                <w:color w:val="111827"/>
+                <w:sz w:val="17"/>
+              </w:rPr>
+              <w:t>Service</w:t>
+            </w:r>
+          </w:p>
+        </w:tc>
+      </w:tr>
+      <w:tr>
+        <w:trPr>
+          <w:cantSplit/>
+        </w:trPr>
+        <w:tc>
+          <w:tcPr>
+            <w:tcW w:type="dxa" w:w="1650"/>
+            <w:tcMar>
+              <w:top w:w="80" w:type="dxa"/>
+              <w:start w:w="120" w:type="dxa"/>
+              <w:bottom w:w="80" w:type="dxa"/>
+              <w:end w:w="120" w:type="dxa"/>
+            </w:tcMar>
+            <w:vAlign w:val="center"/>
+            <w:shd w:fill="FFFFFF"/>
+          </w:tcPr>
+          <w:p>
+            <w:pPr>
+              <w:spacing w:before="0" w:after="40" w:line="252" w:lineRule="auto"/>
+              <w:jc w:val="center"/>
+            </w:pPr>
+            <w:r>
+              <w:rPr>
+                <w:rFonts w:ascii="Calibri" w:hAnsi="Calibri"/>
+                <w:b w:val="0"/>
+                <w:color w:val="111827"/>
+                <w:sz w:val="17"/>
+              </w:rPr>
+              <w:t>Utilization</w:t>
+            </w:r>
+          </w:p>
+        </w:tc>
+        <w:tc>
+          <w:tcPr>
+            <w:tcW w:type="dxa" w:w="4450"/>
+            <w:tcMar>
+              <w:top w:w="80" w:type="dxa"/>
+              <w:start w:w="120" w:type="dxa"/>
+              <w:bottom w:w="80" w:type="dxa"/>
+              <w:end w:w="120" w:type="dxa"/>
+            </w:tcMar>
+            <w:vAlign w:val="center"/>
+            <w:shd w:fill="FFFFFF"/>
+          </w:tcPr>
+          <w:p>
+            <w:pPr>
+              <w:spacing w:before="0" w:after="40" w:line="252" w:lineRule="auto"/>
+              <w:jc w:val="left"/>
+            </w:pPr>
+            <w:r>
+              <w:rPr>
+                <w:rFonts w:ascii="Calibri" w:hAnsi="Calibri"/>
+                <w:b w:val="0"/>
+                <w:color w:val="111827"/>
+                <w:sz w:val="17"/>
+              </w:rPr>
+              <w:t>Derive window, occupied, idle, percentage, and maximum latency consistently.</w:t>
+            </w:r>
+          </w:p>
+        </w:tc>
+        <w:tc>
+          <w:tcPr>
+            <w:tcW w:type="dxa" w:w="3260"/>
+            <w:tcMar>
+              <w:top w:w="80" w:type="dxa"/>
+              <w:start w:w="120" w:type="dxa"/>
+              <w:bottom w:w="80" w:type="dxa"/>
+              <w:end w:w="120" w:type="dxa"/>
+            </w:tcMar>
+            <w:vAlign w:val="center"/>
+            <w:shd w:fill="FFFFFF"/>
+          </w:tcPr>
+          <w:p>
+            <w:pPr>
+              <w:spacing w:before="0" w:after="40" w:line="252" w:lineRule="auto"/>
+              <w:jc w:val="left"/>
+            </w:pPr>
+            <w:r>
+              <w:rPr>
+                <w:rFonts w:ascii="Calibri" w:hAnsi="Calibri"/>
+                <w:b w:val="0"/>
+                <w:color w:val="111827"/>
+                <w:sz w:val="17"/>
+              </w:rPr>
+              <w:t>Service</w:t>
+            </w:r>
+          </w:p>
+        </w:tc>
+      </w:tr>
+      <w:tr>
+        <w:trPr>
+          <w:cantSplit/>
+        </w:trPr>
+        <w:tc>
+          <w:tcPr>
+            <w:tcW w:type="dxa" w:w="1650"/>
+            <w:tcMar>
+              <w:top w:w="80" w:type="dxa"/>
+              <w:start w:w="120" w:type="dxa"/>
+              <w:bottom w:w="80" w:type="dxa"/>
+              <w:end w:w="120" w:type="dxa"/>
+            </w:tcMar>
+            <w:vAlign w:val="center"/>
+            <w:shd w:fill="FFFFFF"/>
+          </w:tcPr>
+          <w:p>
+            <w:pPr>
+              <w:spacing w:before="0" w:after="40" w:line="252" w:lineRule="auto"/>
+              <w:jc w:val="center"/>
+            </w:pPr>
+            <w:r>
+              <w:rPr>
+                <w:rFonts w:ascii="Calibri" w:hAnsi="Calibri"/>
+                <w:b w:val="0"/>
+                <w:color w:val="111827"/>
+                <w:sz w:val="17"/>
+              </w:rPr>
+              <w:t>Batch versioning</w:t>
+            </w:r>
+          </w:p>
+        </w:tc>
+        <w:tc>
+          <w:tcPr>
+            <w:tcW w:type="dxa" w:w="4450"/>
+            <w:tcMar>
+              <w:top w:w="80" w:type="dxa"/>
+              <w:start w:w="120" w:type="dxa"/>
+              <w:bottom w:w="80" w:type="dxa"/>
+              <w:end w:w="120" w:type="dxa"/>
+            </w:tcMar>
+            <w:vAlign w:val="center"/>
+            <w:shd w:fill="FFFFFF"/>
+          </w:tcPr>
+          <w:p>
+            <w:pPr>
+              <w:spacing w:before="0" w:after="40" w:line="252" w:lineRule="auto"/>
+              <w:jc w:val="left"/>
+            </w:pPr>
+            <w:r>
+              <w:rPr>
+                <w:rFonts w:ascii="Calibri" w:hAnsi="Calibri"/>
+                <w:b w:val="0"/>
+                <w:color w:val="111827"/>
+                <w:sz w:val="17"/>
+              </w:rPr>
+              <w:t>Increment version once and sequence once per winning frame.</w:t>
+            </w:r>
+          </w:p>
+        </w:tc>
+        <w:tc>
+          <w:tcPr>
+            <w:tcW w:type="dxa" w:w="3260"/>
+            <w:tcMar>
+              <w:top w:w="80" w:type="dxa"/>
+              <w:start w:w="120" w:type="dxa"/>
+              <w:bottom w:w="80" w:type="dxa"/>
+              <w:end w:w="120" w:type="dxa"/>
+            </w:tcMar>
+            <w:vAlign w:val="center"/>
+            <w:shd w:fill="FFFFFF"/>
+          </w:tcPr>
+          <w:p>
+            <w:pPr>
+              <w:spacing w:before="0" w:after="40" w:line="252" w:lineRule="auto"/>
+              <w:jc w:val="left"/>
+            </w:pPr>
+            <w:r>
+              <w:rPr>
+                <w:rFonts w:ascii="Calibri" w:hAnsi="Calibri"/>
+                <w:b w:val="0"/>
+                <w:color w:val="111827"/>
+                <w:sz w:val="17"/>
+              </w:rPr>
+              <w:t>Service</w:t>
+            </w:r>
+          </w:p>
+        </w:tc>
+      </w:tr>
+      <w:tr>
+        <w:trPr>
+          <w:cantSplit/>
+        </w:trPr>
+        <w:tc>
+          <w:tcPr>
+            <w:tcW w:type="dxa" w:w="1650"/>
+            <w:tcMar>
+              <w:top w:w="80" w:type="dxa"/>
+              <w:start w:w="120" w:type="dxa"/>
+              <w:bottom w:w="80" w:type="dxa"/>
+              <w:end w:w="120" w:type="dxa"/>
+            </w:tcMar>
+            <w:vAlign w:val="center"/>
+            <w:shd w:fill="FFFFFF"/>
+          </w:tcPr>
+          <w:p>
+            <w:pPr>
+              <w:spacing w:before="0" w:after="40" w:line="252" w:lineRule="auto"/>
+              <w:jc w:val="center"/>
+            </w:pPr>
+            <w:r>
+              <w:rPr>
+                <w:rFonts w:ascii="Calibri" w:hAnsi="Calibri"/>
+                <w:b w:val="0"/>
+                <w:color w:val="111827"/>
+                <w:sz w:val="17"/>
+              </w:rPr>
+              <w:t>Arbitration replay</w:t>
+            </w:r>
+          </w:p>
+        </w:tc>
+        <w:tc>
+          <w:tcPr>
+            <w:tcW w:type="dxa" w:w="4450"/>
+            <w:tcMar>
+              <w:top w:w="80" w:type="dxa"/>
+              <w:start w:w="120" w:type="dxa"/>
+              <w:bottom w:w="80" w:type="dxa"/>
+              <w:end w:w="120" w:type="dxa"/>
+            </w:tcMar>
+            <w:vAlign w:val="center"/>
+            <w:shd w:fill="FFFFFF"/>
+          </w:tcPr>
+          <w:p>
+            <w:pPr>
+              <w:spacing w:before="0" w:after="40" w:line="252" w:lineRule="auto"/>
+              <w:jc w:val="left"/>
+            </w:pPr>
+            <w:r>
+              <w:rPr>
+                <w:rFonts w:ascii="Calibri" w:hAnsi="Calibri"/>
+                <w:b w:val="0"/>
+                <w:color w:val="111827"/>
+                <w:sz w:val="17"/>
+              </w:rPr>
+              <w:t>Return persisted result without advancing simulation state twice.</w:t>
+            </w:r>
+          </w:p>
+        </w:tc>
+        <w:tc>
+          <w:tcPr>
+            <w:tcW w:type="dxa" w:w="3260"/>
+            <w:tcMar>
+              <w:top w:w="80" w:type="dxa"/>
+              <w:start w:w="120" w:type="dxa"/>
+              <w:bottom w:w="80" w:type="dxa"/>
+              <w:end w:w="120" w:type="dxa"/>
+            </w:tcMar>
+            <w:vAlign w:val="center"/>
+            <w:shd w:fill="FFFFFF"/>
+          </w:tcPr>
+          <w:p>
+            <w:pPr>
+              <w:spacing w:before="0" w:after="40" w:line="252" w:lineRule="auto"/>
+              <w:jc w:val="left"/>
+            </w:pPr>
+            <w:r>
+              <w:rPr>
+                <w:rFonts w:ascii="Calibri" w:hAnsi="Calibri"/>
+                <w:b w:val="0"/>
+                <w:color w:val="111827"/>
+                <w:sz w:val="17"/>
+              </w:rPr>
+              <w:t>Service/API</w:t>
+            </w:r>
+          </w:p>
+        </w:tc>
+      </w:tr>
+      <w:tr>
+        <w:trPr>
+          <w:cantSplit/>
+        </w:trPr>
+        <w:tc>
+          <w:tcPr>
+            <w:tcW w:type="dxa" w:w="1650"/>
+            <w:tcMar>
+              <w:top w:w="80" w:type="dxa"/>
+              <w:start w:w="120" w:type="dxa"/>
+              <w:bottom w:w="80" w:type="dxa"/>
+              <w:end w:w="120" w:type="dxa"/>
+            </w:tcMar>
+            <w:vAlign w:val="center"/>
+            <w:shd w:fill="FFFFFF"/>
+          </w:tcPr>
+          <w:p>
+            <w:pPr>
+              <w:spacing w:before="0" w:after="40" w:line="252" w:lineRule="auto"/>
+              <w:jc w:val="center"/>
+            </w:pPr>
+            <w:r>
+              <w:rPr>
+                <w:rFonts w:ascii="Calibri" w:hAnsi="Calibri"/>
+                <w:b w:val="0"/>
+                <w:color w:val="111827"/>
+                <w:sz w:val="17"/>
+              </w:rPr>
+              <w:t>Arbitration conflict</w:t>
+            </w:r>
+          </w:p>
+        </w:tc>
+        <w:tc>
+          <w:tcPr>
+            <w:tcW w:type="dxa" w:w="4450"/>
+            <w:tcMar>
+              <w:top w:w="80" w:type="dxa"/>
+              <w:start w:w="120" w:type="dxa"/>
+              <w:bottom w:w="80" w:type="dxa"/>
+              <w:end w:w="120" w:type="dxa"/>
+            </w:tcMar>
+            <w:vAlign w:val="center"/>
+            <w:shd w:fill="FFFFFF"/>
+          </w:tcPr>
+          <w:p>
+            <w:pPr>
+              <w:spacing w:before="0" w:after="40" w:line="252" w:lineRule="auto"/>
+              <w:jc w:val="left"/>
+            </w:pPr>
+            <w:r>
+              <w:rPr>
+                <w:rFonts w:ascii="Calibri" w:hAnsi="Calibri"/>
+                <w:b w:val="0"/>
+                <w:color w:val="111827"/>
+                <w:sz w:val="17"/>
+              </w:rPr>
+              <w:t>Reject changed command reuse with a stable error.</w:t>
+            </w:r>
+          </w:p>
+        </w:tc>
+        <w:tc>
+          <w:tcPr>
+            <w:tcW w:type="dxa" w:w="3260"/>
+            <w:tcMar>
+              <w:top w:w="80" w:type="dxa"/>
+              <w:start w:w="120" w:type="dxa"/>
+              <w:bottom w:w="80" w:type="dxa"/>
+              <w:end w:w="120" w:type="dxa"/>
+            </w:tcMar>
+            <w:vAlign w:val="center"/>
+            <w:shd w:fill="FFFFFF"/>
+          </w:tcPr>
+          <w:p>
+            <w:pPr>
+              <w:spacing w:before="0" w:after="40" w:line="252" w:lineRule="auto"/>
+              <w:jc w:val="left"/>
+            </w:pPr>
+            <w:r>
+              <w:rPr>
+                <w:rFonts w:ascii="Calibri" w:hAnsi="Calibri"/>
+                <w:b w:val="0"/>
+                <w:color w:val="111827"/>
+                <w:sz w:val="17"/>
+              </w:rPr>
+              <w:t>Service/API</w:t>
+            </w:r>
+          </w:p>
+        </w:tc>
+      </w:tr>
+      <w:tr>
+        <w:trPr>
+          <w:cantSplit/>
+        </w:trPr>
+        <w:tc>
+          <w:tcPr>
+            <w:tcW w:type="dxa" w:w="1650"/>
+            <w:tcMar>
+              <w:top w:w="80" w:type="dxa"/>
+              <w:start w:w="120" w:type="dxa"/>
+              <w:bottom w:w="80" w:type="dxa"/>
+              <w:end w:w="120" w:type="dxa"/>
+            </w:tcMar>
+            <w:vAlign w:val="center"/>
+            <w:shd w:fill="FFFFFF"/>
+          </w:tcPr>
+          <w:p>
+            <w:pPr>
+              <w:spacing w:before="0" w:after="40" w:line="252" w:lineRule="auto"/>
+              <w:jc w:val="center"/>
+            </w:pPr>
+            <w:r>
+              <w:rPr>
+                <w:rFonts w:ascii="Calibri" w:hAnsi="Calibri"/>
+                <w:b w:val="0"/>
+                <w:color w:val="111827"/>
+                <w:sz w:val="17"/>
+              </w:rPr>
+              <w:t>Arbitration RBAC</w:t>
+            </w:r>
+          </w:p>
+        </w:tc>
+        <w:tc>
+          <w:tcPr>
+            <w:tcW w:type="dxa" w:w="4450"/>
+            <w:tcMar>
+              <w:top w:w="80" w:type="dxa"/>
+              <w:start w:w="120" w:type="dxa"/>
+              <w:bottom w:w="80" w:type="dxa"/>
+              <w:end w:w="120" w:type="dxa"/>
+            </w:tcMar>
+            <w:vAlign w:val="center"/>
+            <w:shd w:fill="FFFFFF"/>
+          </w:tcPr>
+          <w:p>
+            <w:pPr>
+              <w:spacing w:before="0" w:after="40" w:line="252" w:lineRule="auto"/>
+              <w:jc w:val="left"/>
+            </w:pPr>
+            <w:r>
+              <w:rPr>
+                <w:rFonts w:ascii="Calibri" w:hAnsi="Calibri"/>
+                <w:b w:val="0"/>
+                <w:color w:val="111827"/>
+                <w:sz w:val="17"/>
+              </w:rPr>
+              <w:t>Require manage to execute and read to query evidence.</w:t>
+            </w:r>
+          </w:p>
+        </w:tc>
+        <w:tc>
+          <w:tcPr>
+            <w:tcW w:type="dxa" w:w="3260"/>
+            <w:tcMar>
+              <w:top w:w="80" w:type="dxa"/>
+              <w:start w:w="120" w:type="dxa"/>
+              <w:bottom w:w="80" w:type="dxa"/>
+              <w:end w:w="120" w:type="dxa"/>
+            </w:tcMar>
+            <w:vAlign w:val="center"/>
+            <w:shd w:fill="FFFFFF"/>
+          </w:tcPr>
+          <w:p>
+            <w:pPr>
+              <w:spacing w:before="0" w:after="40" w:line="252" w:lineRule="auto"/>
+              <w:jc w:val="left"/>
+            </w:pPr>
+            <w:r>
+              <w:rPr>
+                <w:rFonts w:ascii="Calibri" w:hAnsi="Calibri"/>
+                <w:b w:val="0"/>
+                <w:color w:val="111827"/>
+                <w:sz w:val="17"/>
+              </w:rPr>
+              <w:t>API/integration</w:t>
+            </w:r>
+          </w:p>
+        </w:tc>
+      </w:tr>
+      <w:tr>
+        <w:trPr>
+          <w:cantSplit/>
+        </w:trPr>
+        <w:tc>
+          <w:tcPr>
+            <w:tcW w:type="dxa" w:w="1650"/>
+            <w:tcMar>
+              <w:top w:w="80" w:type="dxa"/>
+              <w:start w:w="120" w:type="dxa"/>
+              <w:bottom w:w="80" w:type="dxa"/>
+              <w:end w:w="120" w:type="dxa"/>
+            </w:tcMar>
+            <w:vAlign w:val="center"/>
+            <w:shd w:fill="FFFFFF"/>
+          </w:tcPr>
+          <w:p>
+            <w:pPr>
+              <w:spacing w:before="0" w:after="40" w:line="252" w:lineRule="auto"/>
+              <w:jc w:val="center"/>
+            </w:pPr>
+            <w:r>
+              <w:rPr>
+                <w:rFonts w:ascii="Calibri" w:hAnsi="Calibri"/>
+                <w:b w:val="0"/>
+                <w:color w:val="111827"/>
+                <w:sz w:val="17"/>
+              </w:rPr>
+              <w:t>Arbitration minimization</w:t>
+            </w:r>
+          </w:p>
+        </w:tc>
+        <w:tc>
+          <w:tcPr>
+            <w:tcW w:type="dxa" w:w="4450"/>
+            <w:tcMar>
+              <w:top w:w="80" w:type="dxa"/>
+              <w:start w:w="120" w:type="dxa"/>
+              <w:bottom w:w="80" w:type="dxa"/>
+              <w:end w:w="120" w:type="dxa"/>
+            </w:tcMar>
+            <w:vAlign w:val="center"/>
+            <w:shd w:fill="FFFFFF"/>
+          </w:tcPr>
+          <w:p>
+            <w:pPr>
+              <w:spacing w:before="0" w:after="40" w:line="252" w:lineRule="auto"/>
+              <w:jc w:val="left"/>
+            </w:pPr>
+            <w:r>
+              <w:rPr>
+                <w:rFonts w:ascii="Calibri" w:hAnsi="Calibri"/>
+                <w:b w:val="0"/>
+                <w:color w:val="111827"/>
+                <w:sz w:val="17"/>
+              </w:rPr>
+              <w:t>Exclude CAN payload bytes from event and audit metrics.</w:t>
+            </w:r>
+          </w:p>
+        </w:tc>
+        <w:tc>
+          <w:tcPr>
+            <w:tcW w:type="dxa" w:w="3260"/>
+            <w:tcMar>
+              <w:top w:w="80" w:type="dxa"/>
+              <w:start w:w="120" w:type="dxa"/>
+              <w:bottom w:w="80" w:type="dxa"/>
+              <w:end w:w="120" w:type="dxa"/>
+            </w:tcMar>
+            <w:vAlign w:val="center"/>
+            <w:shd w:fill="FFFFFF"/>
+          </w:tcPr>
+          <w:p>
+            <w:pPr>
+              <w:spacing w:before="0" w:after="40" w:line="252" w:lineRule="auto"/>
+              <w:jc w:val="left"/>
+            </w:pPr>
+            <w:r>
+              <w:rPr>
+                <w:rFonts w:ascii="Calibri" w:hAnsi="Calibri"/>
+                <w:b w:val="0"/>
+                <w:color w:val="111827"/>
+                <w:sz w:val="17"/>
+              </w:rPr>
+              <w:t>Service</w:t>
+            </w:r>
+          </w:p>
+        </w:tc>
+      </w:tr>
     </w:tbl>
     <w:p>
       <w:pPr>
@@ -4313,7 +6018,7 @@
           <w:color w:val="111827"/>
           <w:sz w:val="22"/>
         </w:rPr>
-        <w:t xml:space="preserve">Migration </w:t>
+        <w:t xml:space="preserve">Migrations </w:t>
       </w:r>
       <w:r>
         <w:rPr>
@@ -4329,7 +6034,23 @@
           <w:color w:val="111827"/>
           <w:sz w:val="22"/>
         </w:rPr>
-        <w:t xml:space="preserve"> owns the database schema.</w:t>
+        <w:t xml:space="preserve"> and </w:t>
+      </w:r>
+      <w:r>
+        <w:rPr>
+          <w:rFonts w:ascii="Consolas" w:hAnsi="Consolas"/>
+          <w:color w:val="1F4D78"/>
+          <w:sz w:val="19"/>
+        </w:rPr>
+        <w:t>0025_can_arbitration</w:t>
+      </w:r>
+      <w:r>
+        <w:rPr>
+          <w:rFonts w:ascii="Calibri" w:hAnsi="Calibri"/>
+          <w:color w:val="111827"/>
+          <w:sz w:val="22"/>
+        </w:rPr>
+        <w:t xml:space="preserve"> own the database schema.</w:t>
       </w:r>
     </w:p>
     <w:p>
@@ -4346,7 +6067,7 @@
           <w:color w:val="111827"/>
           <w:sz w:val="22"/>
         </w:rPr>
-        <w:t xml:space="preserve">Events are </w:t>
+        <w:t xml:space="preserve">Events include </w:t>
       </w:r>
       <w:r>
         <w:rPr>
@@ -4362,7 +6083,7 @@
           <w:color w:val="111827"/>
           <w:sz w:val="22"/>
         </w:rPr>
-        <w:t xml:space="preserve"> and </w:t>
+        <w:t xml:space="preserve">, </w:t>
       </w:r>
       <w:r>
         <w:rPr>
@@ -4378,6 +6099,24 @@
           <w:color w:val="111827"/>
           <w:sz w:val="22"/>
         </w:rPr>
+        <w:t>, and</w:t>
+      </w:r>
+    </w:p>
+    <w:p>
+      <w:r>
+        <w:rPr>
+          <w:rFonts w:ascii="Consolas" w:hAnsi="Consolas"/>
+          <w:color w:val="1F4D78"/>
+          <w:sz w:val="19"/>
+        </w:rPr>
+        <w:t>atep.can.arbitration.completed.v1</w:t>
+      </w:r>
+      <w:r>
+        <w:rPr>
+          <w:rFonts w:ascii="Calibri" w:hAnsi="Calibri"/>
+          <w:color w:val="111827"/>
+          <w:sz w:val="22"/>
+        </w:rPr>
         <w:t>.</w:t>
       </w:r>
     </w:p>
@@ -4386,7 +6125,7 @@
         <w:pStyle w:val="ListBullet"/>
         <w:numPr>
           <w:ilvl w:val="0"/>
-          <w:numId w:val="13"/>
+          <w:numId w:val="14"/>
         </w:numPr>
       </w:pPr>
       <w:r>
@@ -4435,7 +6174,7 @@
         <w:pStyle w:val="ListBullet"/>
         <w:numPr>
           <w:ilvl w:val="0"/>
-          <w:numId w:val="13"/>
+          <w:numId w:val="14"/>
         </w:numPr>
       </w:pPr>
       <w:r>
@@ -4444,7 +6183,17 @@
           <w:color w:val="111827"/>
           <w:sz w:val="22"/>
         </w:rPr>
-        <w:t>Automated tests cover validation, deterministic mutation, replay, errors, evidence, and OpenAPI.</w:t>
+        <w:t>Automated tests cover validation, priority, timing mathematics, readiness, delivery, utilization,</w:t>
+      </w:r>
+    </w:p>
+    <w:p>
+      <w:r>
+        <w:rPr>
+          <w:rFonts w:ascii="Calibri" w:hAnsi="Calibri"/>
+          <w:color w:val="111827"/>
+          <w:sz w:val="22"/>
+        </w:rPr>
+        <w:t>versioning, replay, errors, evidence minimization, persistence, and OpenAPI.</w:t>
       </w:r>
     </w:p>
     <w:p>
@@ -4462,7 +6211,7 @@
         <w:pStyle w:val="ListBullet"/>
         <w:numPr>
           <w:ilvl w:val="0"/>
-          <w:numId w:val="14"/>
+          <w:numId w:val="15"/>
         </w:numPr>
       </w:pPr>
       <w:r>
@@ -4479,7 +6228,7 @@
         <w:pStyle w:val="ListBullet"/>
         <w:numPr>
           <w:ilvl w:val="0"/>
-          <w:numId w:val="14"/>
+          <w:numId w:val="15"/>
         </w:numPr>
       </w:pPr>
       <w:r>
@@ -4496,7 +6245,7 @@
         <w:pStyle w:val="ListBullet"/>
         <w:numPr>
           <w:ilvl w:val="0"/>
-          <w:numId w:val="14"/>
+          <w:numId w:val="15"/>
         </w:numPr>
       </w:pPr>
       <w:r>
@@ -4513,7 +6262,7 @@
         <w:pStyle w:val="ListBullet"/>
         <w:numPr>
           <w:ilvl w:val="0"/>
-          <w:numId w:val="14"/>
+          <w:numId w:val="15"/>
         </w:numPr>
       </w:pPr>
       <w:r>
@@ -4522,7 +6271,7 @@
           <w:color w:val="111827"/>
           <w:sz w:val="22"/>
         </w:rPr>
-        <w:t>Submission order is not arbitration order until IV-2 defines timing and priority behavior.</w:t>
+        <w:t>Nominal duration excludes variable bit stuffing and physical-layer effects.</w:t>
       </w:r>
     </w:p>
     <w:p>
@@ -4530,7 +6279,24 @@
         <w:pStyle w:val="ListBullet"/>
         <w:numPr>
           <w:ilvl w:val="0"/>
-          <w:numId w:val="14"/>
+          <w:numId w:val="15"/>
+        </w:numPr>
+      </w:pPr>
+      <w:r>
+        <w:rPr>
+          <w:rFonts w:ascii="Calibri" w:hAnsi="Calibri"/>
+          <w:color w:val="111827"/>
+          <w:sz w:val="22"/>
+        </w:rPr>
+        <w:t>Arbitration currently models one attempt; acknowledgement and retransmission are future work.</w:t>
+      </w:r>
+    </w:p>
+    <w:p>
+      <w:pPr>
+        <w:pStyle w:val="ListBullet"/>
+        <w:numPr>
+          <w:ilvl w:val="0"/>
+          <w:numId w:val="15"/>
         </w:numPr>
       </w:pPr>
       <w:r>
@@ -4559,7 +6325,7 @@
           <w:color w:val="111827"/>
           <w:sz w:val="22"/>
         </w:rPr>
-        <w:t xml:space="preserve">The recommended next increment is IV-2: deterministic arbitration, calculated transmission duration, receive delivery, and bounded bus-load evidence. See </w:t>
+        <w:t xml:space="preserve">The recommended next increment is IV-3: a DBC catalogue with signal encoding/decoding, scaling, offsets, signed values, and byte order. See </w:t>
       </w:r>
       <w:r>
         <w:rPr>
@@ -4593,7 +6359,7 @@
         <w:pStyle w:val="ListNumber"/>
         <w:numPr>
           <w:ilvl w:val="0"/>
-          <w:numId w:val="15"/>
+          <w:numId w:val="16"/>
         </w:numPr>
       </w:pPr>
       <w:r>
@@ -4610,7 +6376,7 @@
         <w:pStyle w:val="ListNumber"/>
         <w:numPr>
           <w:ilvl w:val="0"/>
-          <w:numId w:val="15"/>
+          <w:numId w:val="16"/>
         </w:numPr>
       </w:pPr>
       <w:r>
@@ -4627,7 +6393,7 @@
         <w:pStyle w:val="ListNumber"/>
         <w:numPr>
           <w:ilvl w:val="0"/>
-          <w:numId w:val="15"/>
+          <w:numId w:val="16"/>
         </w:numPr>
       </w:pPr>
       <w:r>
@@ -4644,7 +6410,7 @@
         <w:pStyle w:val="ListNumber"/>
         <w:numPr>
           <w:ilvl w:val="0"/>
-          <w:numId w:val="15"/>
+          <w:numId w:val="16"/>
         </w:numPr>
       </w:pPr>
       <w:r>
@@ -4661,7 +6427,7 @@
         <w:pStyle w:val="ListNumber"/>
         <w:numPr>
           <w:ilvl w:val="0"/>
-          <w:numId w:val="15"/>
+          <w:numId w:val="16"/>
         </w:numPr>
       </w:pPr>
       <w:r>
@@ -4678,7 +6444,7 @@
         <w:pStyle w:val="ListNumber"/>
         <w:numPr>
           <w:ilvl w:val="0"/>
-          <w:numId w:val="15"/>
+          <w:numId w:val="16"/>
         </w:numPr>
       </w:pPr>
       <w:r>
@@ -4695,7 +6461,7 @@
         <w:pStyle w:val="ListNumber"/>
         <w:numPr>
           <w:ilvl w:val="0"/>
-          <w:numId w:val="15"/>
+          <w:numId w:val="16"/>
         </w:numPr>
       </w:pPr>
       <w:r>
@@ -4744,7 +6510,7 @@
         <w:pStyle w:val="ListNumber"/>
         <w:numPr>
           <w:ilvl w:val="0"/>
-          <w:numId w:val="15"/>
+          <w:numId w:val="16"/>
         </w:numPr>
       </w:pPr>
       <w:r>
@@ -4761,7 +6527,7 @@
         <w:pStyle w:val="ListNumber"/>
         <w:numPr>
           <w:ilvl w:val="0"/>
-          <w:numId w:val="15"/>
+          <w:numId w:val="16"/>
         </w:numPr>
       </w:pPr>
       <w:r>
@@ -4770,7 +6536,55 @@
           <w:color w:val="111827"/>
           <w:sz w:val="22"/>
         </w:rPr>
-        <w:t>Propose an IV-2 arbitration rule for simultaneous standard frames.</w:t>
+        <w:t xml:space="preserve">Prove the winner order for simultaneous IDs </w:t>
+      </w:r>
+      <w:r>
+        <w:rPr>
+          <w:rFonts w:ascii="Consolas" w:hAnsi="Consolas"/>
+          <w:color w:val="1F4D78"/>
+          <w:sz w:val="19"/>
+        </w:rPr>
+        <w:t>0x100</w:t>
+      </w:r>
+      <w:r>
+        <w:rPr>
+          <w:rFonts w:ascii="Calibri" w:hAnsi="Calibri"/>
+          <w:color w:val="111827"/>
+          <w:sz w:val="22"/>
+        </w:rPr>
+        <w:t xml:space="preserve">, </w:t>
+      </w:r>
+      <w:r>
+        <w:rPr>
+          <w:rFonts w:ascii="Consolas" w:hAnsi="Consolas"/>
+          <w:color w:val="1F4D78"/>
+          <w:sz w:val="19"/>
+        </w:rPr>
+        <w:t>0x180</w:t>
+      </w:r>
+      <w:r>
+        <w:rPr>
+          <w:rFonts w:ascii="Calibri" w:hAnsi="Calibri"/>
+          <w:color w:val="111827"/>
+          <w:sz w:val="22"/>
+        </w:rPr>
+        <w:t xml:space="preserve">, and </w:t>
+      </w:r>
+      <w:r>
+        <w:rPr>
+          <w:rFonts w:ascii="Consolas" w:hAnsi="Consolas"/>
+          <w:color w:val="1F4D78"/>
+          <w:sz w:val="19"/>
+        </w:rPr>
+        <w:t>0x200</w:t>
+      </w:r>
+      <w:r>
+        <w:rPr>
+          <w:rFonts w:ascii="Calibri" w:hAnsi="Calibri"/>
+          <w:color w:val="111827"/>
+          <w:sz w:val="22"/>
+        </w:rPr>
+        <w:t>.</w:t>
       </w:r>
     </w:p>
     <w:p>
@@ -4778,7 +6592,7 @@
         <w:pStyle w:val="ListNumber"/>
         <w:numPr>
           <w:ilvl w:val="0"/>
-          <w:numId w:val="15"/>
+          <w:numId w:val="16"/>
         </w:numPr>
       </w:pPr>
       <w:r>
@@ -4787,7 +6601,7 @@
           <w:color w:val="111827"/>
           <w:sz w:val="22"/>
         </w:rPr>
-        <w:t>Calculate approximate classic CAN frame duration and list the assumptions still required.</w:t>
+        <w:t>Calculate nominal duration for standard DLC 8 at 500 kbit/s and list omitted effects.</w:t>
       </w:r>
     </w:p>
     <w:p>
@@ -4795,7 +6609,7 @@
         <w:pStyle w:val="ListNumber"/>
         <w:numPr>
           <w:ilvl w:val="0"/>
-          <w:numId w:val="15"/>
+          <w:numId w:val="16"/>
         </w:numPr>
       </w:pPr>
       <w:r>
@@ -4812,7 +6626,7 @@
         <w:pStyle w:val="ListNumber"/>
         <w:numPr>
           <w:ilvl w:val="0"/>
-          <w:numId w:val="15"/>
+          <w:numId w:val="16"/>
         </w:numPr>
       </w:pPr>
       <w:r>
@@ -4822,6 +6636,74 @@
           <w:sz w:val="22"/>
         </w:rPr>
         <w:t>Propose how multiple buses per vehicle could be added without breaking current identifiers.</w:t>
+      </w:r>
+    </w:p>
+    <w:p>
+      <w:pPr>
+        <w:pStyle w:val="ListNumber"/>
+        <w:numPr>
+          <w:ilvl w:val="0"/>
+          <w:numId w:val="16"/>
+        </w:numPr>
+      </w:pPr>
+      <w:r>
+        <w:rPr>
+          <w:rFonts w:ascii="Calibri" w:hAnsi="Calibri"/>
+          <w:color w:val="111827"/>
+          <w:sz w:val="22"/>
+        </w:rPr>
+        <w:t>Explain why standard format precedes extended format for an equal numeric identifier.</w:t>
+      </w:r>
+    </w:p>
+    <w:p>
+      <w:pPr>
+        <w:pStyle w:val="ListNumber"/>
+        <w:numPr>
+          <w:ilvl w:val="0"/>
+          <w:numId w:val="16"/>
+        </w:numPr>
+      </w:pPr>
+      <w:r>
+        <w:rPr>
+          <w:rFonts w:ascii="Calibri" w:hAnsi="Calibri"/>
+          <w:color w:val="111827"/>
+          <w:sz w:val="22"/>
+        </w:rPr>
+        <w:t>Calculate utilization when a frame becomes ready 50 microseconds after the window begins.</w:t>
+      </w:r>
+    </w:p>
+    <w:p>
+      <w:pPr>
+        <w:pStyle w:val="ListNumber"/>
+        <w:numPr>
+          <w:ilvl w:val="0"/>
+          <w:numId w:val="16"/>
+        </w:numPr>
+      </w:pPr>
+      <w:r>
+        <w:rPr>
+          <w:rFonts w:ascii="Calibri" w:hAnsi="Calibri"/>
+          <w:color w:val="111827"/>
+          <w:sz w:val="22"/>
+        </w:rPr>
+        <w:t>Explain why one batch increments aggregate version once but sequence once per winner.</w:t>
+      </w:r>
+    </w:p>
+    <w:p>
+      <w:pPr>
+        <w:pStyle w:val="ListNumber"/>
+        <w:numPr>
+          <w:ilvl w:val="0"/>
+          <w:numId w:val="16"/>
+        </w:numPr>
+      </w:pPr>
+      <w:r>
+        <w:rPr>
+          <w:rFonts w:ascii="Calibri" w:hAnsi="Calibri"/>
+          <w:color w:val="111827"/>
+          <w:sz w:val="22"/>
+        </w:rPr>
+        <w:t>Design an acknowledgement-failure extension without changing the nominal IV-2 evidence.</w:t>
       </w:r>
     </w:p>
     <w:sectPr>
@@ -4853,7 +6735,7 @@
         <w:color w:val="667085"/>
         <w:sz w:val="17"/>
       </w:rPr>
-      <w:t>ATEP Volume IV Workbook  |  Version 0.1.0</w:t>
+      <w:t>ATEP Volume IV Workbook  |  Version 0.2.0</w:t>
     </w:r>
     <w:r>
       <w:rPr>
@@ -5165,6 +7047,12 @@
     </w:lvlOverride>
   </w:num>
   <w:num w:numId="15">
+    <w:abstractNumId w:val="10"/>
+    <w:lvlOverride w:ilvl="0">
+      <w:startOverride w:val="1"/>
+    </w:lvlOverride>
+  </w:num>
+  <w:num w:numId="16">
     <w:abstractNumId w:val="9"/>
     <w:lvlOverride w:ilvl="0">
       <w:startOverride w:val="1"/>

</xml_diff>

<commit_message>
feat(can): add deterministic DBC signal codec
</commit_message>
<xml_diff>
--- a/docs/ATEP_Volume_IV_CAN_Network_Engineering_Workbook.docx
+++ b/docs/ATEP_Volume_IV_CAN_Network_Engineering_Workbook.docx
@@ -143,7 +143,7 @@
                 <w:color w:val="0B2545"/>
                 <w:sz w:val="19"/>
               </w:rPr>
-              <w:t>0.2.0</w:t>
+              <w:t>0.3.0</w:t>
             </w:r>
           </w:p>
         </w:tc>
@@ -265,7 +265,7 @@
                 <w:color w:val="111827"/>
                 <w:sz w:val="19"/>
               </w:rPr>
-              <w:t>Increments IV-1 and IV-2 implemented</w:t>
+              <w:t>Increments IV-1 through IV-3 implemented</w:t>
             </w:r>
           </w:p>
         </w:tc>
@@ -893,7 +893,7 @@
                 <w:color w:val="111827"/>
                 <w:sz w:val="17"/>
               </w:rPr>
-              <w:t>Increments IV-1 and IV-2</w:t>
+              <w:t>Increments IV-1 through IV-3</w:t>
             </w:r>
           </w:p>
         </w:tc>
@@ -1386,6 +1386,95 @@
           </w:p>
         </w:tc>
       </w:tr>
+      <w:tr>
+        <w:trPr>
+          <w:cantSplit/>
+        </w:trPr>
+        <w:tc>
+          <w:tcPr>
+            <w:tcW w:type="dxa" w:w="1650"/>
+            <w:tcMar>
+              <w:top w:w="80" w:type="dxa"/>
+              <w:start w:w="120" w:type="dxa"/>
+              <w:bottom w:w="80" w:type="dxa"/>
+              <w:end w:w="120" w:type="dxa"/>
+            </w:tcMar>
+            <w:vAlign w:val="center"/>
+            <w:shd w:fill="FFFFFF"/>
+          </w:tcPr>
+          <w:p>
+            <w:pPr>
+              <w:spacing w:before="0" w:after="40" w:line="252" w:lineRule="auto"/>
+              <w:jc w:val="center"/>
+            </w:pPr>
+            <w:r>
+              <w:rPr>
+                <w:rFonts w:ascii="Calibri" w:hAnsi="Calibri"/>
+                <w:b w:val="0"/>
+                <w:color w:val="111827"/>
+                <w:sz w:val="17"/>
+              </w:rPr>
+              <w:t>0.3.0</w:t>
+            </w:r>
+          </w:p>
+        </w:tc>
+        <w:tc>
+          <w:tcPr>
+            <w:tcW w:type="dxa" w:w="4450"/>
+            <w:tcMar>
+              <w:top w:w="80" w:type="dxa"/>
+              <w:start w:w="120" w:type="dxa"/>
+              <w:bottom w:w="80" w:type="dxa"/>
+              <w:end w:w="120" w:type="dxa"/>
+            </w:tcMar>
+            <w:vAlign w:val="center"/>
+            <w:shd w:fill="FFFFFF"/>
+          </w:tcPr>
+          <w:p>
+            <w:pPr>
+              <w:spacing w:before="0" w:after="40" w:line="252" w:lineRule="auto"/>
+              <w:jc w:val="left"/>
+            </w:pPr>
+            <w:r>
+              <w:rPr>
+                <w:rFonts w:ascii="Calibri" w:hAnsi="Calibri"/>
+                <w:b w:val="0"/>
+                <w:color w:val="111827"/>
+                <w:sz w:val="17"/>
+              </w:rPr>
+              <w:t>2026-08-24</w:t>
+            </w:r>
+          </w:p>
+        </w:tc>
+        <w:tc>
+          <w:tcPr>
+            <w:tcW w:type="dxa" w:w="3260"/>
+            <w:tcMar>
+              <w:top w:w="80" w:type="dxa"/>
+              <w:start w:w="120" w:type="dxa"/>
+              <w:bottom w:w="80" w:type="dxa"/>
+              <w:end w:w="120" w:type="dxa"/>
+            </w:tcMar>
+            <w:vAlign w:val="center"/>
+            <w:shd w:fill="FFFFFF"/>
+          </w:tcPr>
+          <w:p>
+            <w:pPr>
+              <w:spacing w:before="0" w:after="40" w:line="252" w:lineRule="auto"/>
+              <w:jc w:val="left"/>
+            </w:pPr>
+            <w:r>
+              <w:rPr>
+                <w:rFonts w:ascii="Calibri" w:hAnsi="Calibri"/>
+                <w:b w:val="0"/>
+                <w:color w:val="111827"/>
+                <w:sz w:val="17"/>
+              </w:rPr>
+              <w:t>Added structured DBC catalogues, Intel/Motorola signal placement, exact decimal scaling, signed codec evidence, APIs, migration, and tests.</w:t>
+            </w:r>
+          </w:p>
+        </w:tc>
+      </w:tr>
     </w:tbl>
     <w:p>
       <w:pPr>
@@ -1618,6 +1707,57 @@
     </w:p>
     <w:p>
       <w:pPr>
+        <w:pStyle w:val="ListBullet"/>
+        <w:numPr>
+          <w:ilvl w:val="0"/>
+          <w:numId w:val="11"/>
+        </w:numPr>
+      </w:pPr>
+      <w:r>
+        <w:rPr>
+          <w:rFonts w:ascii="Calibri" w:hAnsi="Calibri"/>
+          <w:color w:val="111827"/>
+          <w:sz w:val="22"/>
+        </w:rPr>
+        <w:t>One structured DBC catalogue mapped to existing frame contracts.</w:t>
+      </w:r>
+    </w:p>
+    <w:p>
+      <w:pPr>
+        <w:pStyle w:val="ListBullet"/>
+        <w:numPr>
+          <w:ilvl w:val="0"/>
+          <w:numId w:val="11"/>
+        </w:numPr>
+      </w:pPr>
+      <w:r>
+        <w:rPr>
+          <w:rFonts w:ascii="Calibri" w:hAnsi="Calibri"/>
+          <w:color w:val="111827"/>
+          <w:sz w:val="22"/>
+        </w:rPr>
+        <w:t>Exact signal encode/decode with Intel and Motorola byte order, signedness, scaling, and offsets.</w:t>
+      </w:r>
+    </w:p>
+    <w:p>
+      <w:pPr>
+        <w:pStyle w:val="ListBullet"/>
+        <w:numPr>
+          <w:ilvl w:val="0"/>
+          <w:numId w:val="11"/>
+        </w:numPr>
+      </w:pPr>
+      <w:r>
+        <w:rPr>
+          <w:rFonts w:ascii="Calibri" w:hAnsi="Calibri"/>
+          <w:color w:val="111827"/>
+          <w:sz w:val="22"/>
+        </w:rPr>
+        <w:t>Replay-safe codec evidence with payload-free audit and outbox metrics.</w:t>
+      </w:r>
+    </w:p>
+    <w:p>
+      <w:pPr>
         <w:pStyle w:val="Heading2"/>
         <w:keepNext/>
         <w:keepLines/>
@@ -1657,7 +1797,23 @@
           <w:color w:val="111827"/>
           <w:sz w:val="22"/>
         </w:rPr>
-        <w:t>DBC parsing, scaling, byte order, multiplexing, and semantic-signal encoding.</w:t>
+        <w:t xml:space="preserve">Textual </w:t>
+      </w:r>
+      <w:r>
+        <w:rPr>
+          <w:rFonts w:ascii="Consolas" w:hAnsi="Consolas"/>
+          <w:color w:val="1F4D78"/>
+          <w:sz w:val="19"/>
+        </w:rPr>
+        <w:t>.dbc</w:t>
+      </w:r>
+      <w:r>
+        <w:rPr>
+          <w:rFonts w:ascii="Calibri" w:hAnsi="Calibri"/>
+          <w:color w:val="111827"/>
+          <w:sz w:val="22"/>
+        </w:rPr>
+        <w:t xml:space="preserve"> parsing, attributes, value tables, comments, and multiplexing.</w:t>
       </w:r>
     </w:p>
     <w:p>
@@ -1754,7 +1910,7 @@
           <w:color w:val="111827"/>
           <w:sz w:val="22"/>
         </w:rPr>
-        <w:t>Request flow: authenticated client -&gt; FastAPI router -&gt; CAN RBAC dependency -&gt; vehicle lookup -&gt; CAN domain/arbitration service -&gt; PostgreSQL aggregate/evidence + audit + transactional outbox -&gt; response.</w:t>
+        <w:t>Request flow: authenticated client -&gt; FastAPI router -&gt; CAN RBAC dependency -&gt; vehicle lookup -&gt; CAN domain/arbitration/DBC service -&gt; PostgreSQL aggregate/evidence + audit + transactional outbox -&gt; response.</w:t>
       </w:r>
     </w:p>
     <w:p>
@@ -1817,6 +1973,40 @@
           <w:sz w:val="22"/>
         </w:rPr>
         <w:t xml:space="preserve"> stores the canonical batch request, ordered result, contender count, aggregate versions, requesting actor, and timestamps. Each winner also creates normal transmission evidence so history remains coherent across individual and arbitrated sends.</w:t>
+      </w:r>
+    </w:p>
+    <w:p>
+      <w:r>
+        <w:rPr>
+          <w:rFonts w:ascii="Consolas" w:hAnsi="Consolas"/>
+          <w:color w:val="1F4D78"/>
+          <w:sz w:val="19"/>
+        </w:rPr>
+        <w:t>CanDbcCatalogue</w:t>
+      </w:r>
+      <w:r>
+        <w:rPr>
+          <w:rFonts w:ascii="Calibri" w:hAnsi="Calibri"/>
+          <w:color w:val="111827"/>
+          <w:sz w:val="22"/>
+        </w:rPr>
+        <w:t xml:space="preserve"> stores bounded structured messages and signals for one network. Each message references a frame contract rather than duplicating ID, DLC, producer, or consumers. </w:t>
+      </w:r>
+      <w:r>
+        <w:rPr>
+          <w:rFonts w:ascii="Consolas" w:hAnsi="Consolas"/>
+          <w:color w:val="1F4D78"/>
+          <w:sz w:val="19"/>
+        </w:rPr>
+        <w:t>CanSignalCodecExecution</w:t>
+      </w:r>
+      <w:r>
+        <w:rPr>
+          <w:rFonts w:ascii="Calibri" w:hAnsi="Calibri"/>
+          <w:color w:val="111827"/>
+          <w:sz w:val="22"/>
+        </w:rPr>
+        <w:t xml:space="preserve"> stores the canonical encode/decode request and deterministic payload, raw, and physical result for exact replay.</w:t>
       </w:r>
     </w:p>
     <w:p>
@@ -2798,6 +2988,708 @@
           </w:p>
         </w:tc>
       </w:tr>
+      <w:tr>
+        <w:trPr>
+          <w:cantSplit/>
+        </w:trPr>
+        <w:tc>
+          <w:tcPr>
+            <w:tcW w:type="dxa" w:w="1150"/>
+            <w:tcMar>
+              <w:top w:w="80" w:type="dxa"/>
+              <w:start w:w="120" w:type="dxa"/>
+              <w:bottom w:w="80" w:type="dxa"/>
+              <w:end w:w="120" w:type="dxa"/>
+            </w:tcMar>
+            <w:vAlign w:val="center"/>
+            <w:shd w:fill="FFFFFF"/>
+          </w:tcPr>
+          <w:p>
+            <w:pPr>
+              <w:spacing w:before="0" w:after="40" w:line="252" w:lineRule="auto"/>
+              <w:jc w:val="center"/>
+            </w:pPr>
+            <w:r>
+              <w:rPr>
+                <w:rFonts w:ascii="Calibri" w:hAnsi="Calibri"/>
+                <w:b w:val="0"/>
+                <w:color w:val="111827"/>
+                <w:sz w:val="16"/>
+              </w:rPr>
+              <w:t>POST</w:t>
+            </w:r>
+          </w:p>
+        </w:tc>
+        <w:tc>
+          <w:tcPr>
+            <w:tcW w:type="dxa" w:w="3700"/>
+            <w:tcMar>
+              <w:top w:w="80" w:type="dxa"/>
+              <w:start w:w="120" w:type="dxa"/>
+              <w:bottom w:w="80" w:type="dxa"/>
+              <w:end w:w="120" w:type="dxa"/>
+            </w:tcMar>
+            <w:vAlign w:val="center"/>
+            <w:shd w:fill="FFFFFF"/>
+          </w:tcPr>
+          <w:p>
+            <w:pPr>
+              <w:spacing w:before="0" w:after="40" w:line="252" w:lineRule="auto"/>
+              <w:jc w:val="left"/>
+            </w:pPr>
+            <w:r>
+              <w:rPr>
+                <w:rFonts w:ascii="Calibri" w:hAnsi="Calibri"/>
+                <w:b w:val="0"/>
+                <w:color w:val="111827"/>
+                <w:sz w:val="16"/>
+              </w:rPr>
+              <w:t>/api/v1/vehicles/{vehicle_id}/can-networks/dbc-catalogues</w:t>
+            </w:r>
+          </w:p>
+        </w:tc>
+        <w:tc>
+          <w:tcPr>
+            <w:tcW w:type="dxa" w:w="3100"/>
+            <w:tcMar>
+              <w:top w:w="80" w:type="dxa"/>
+              <w:start w:w="120" w:type="dxa"/>
+              <w:bottom w:w="80" w:type="dxa"/>
+              <w:end w:w="120" w:type="dxa"/>
+            </w:tcMar>
+            <w:vAlign w:val="center"/>
+            <w:shd w:fill="FFFFFF"/>
+          </w:tcPr>
+          <w:p>
+            <w:pPr>
+              <w:spacing w:before="0" w:after="40" w:line="252" w:lineRule="auto"/>
+              <w:jc w:val="left"/>
+            </w:pPr>
+            <w:r>
+              <w:rPr>
+                <w:rFonts w:ascii="Calibri" w:hAnsi="Calibri"/>
+                <w:b w:val="0"/>
+                <w:color w:val="111827"/>
+                <w:sz w:val="16"/>
+              </w:rPr>
+              <w:t>can_networks:manage</w:t>
+            </w:r>
+          </w:p>
+        </w:tc>
+        <w:tc>
+          <w:tcPr>
+            <w:tcW w:type="dxa" w:w="1410"/>
+            <w:tcMar>
+              <w:top w:w="80" w:type="dxa"/>
+              <w:start w:w="120" w:type="dxa"/>
+              <w:bottom w:w="80" w:type="dxa"/>
+              <w:end w:w="120" w:type="dxa"/>
+            </w:tcMar>
+            <w:vAlign w:val="center"/>
+            <w:shd w:fill="FFFFFF"/>
+          </w:tcPr>
+          <w:p>
+            <w:pPr>
+              <w:spacing w:before="0" w:after="40" w:line="252" w:lineRule="auto"/>
+              <w:jc w:val="left"/>
+            </w:pPr>
+            <w:r>
+              <w:rPr>
+                <w:rFonts w:ascii="Calibri" w:hAnsi="Calibri"/>
+                <w:b w:val="0"/>
+                <w:color w:val="111827"/>
+                <w:sz w:val="16"/>
+              </w:rPr>
+              <w:t>Create the structured DBC catalogue.</w:t>
+            </w:r>
+          </w:p>
+        </w:tc>
+      </w:tr>
+      <w:tr>
+        <w:trPr>
+          <w:cantSplit/>
+        </w:trPr>
+        <w:tc>
+          <w:tcPr>
+            <w:tcW w:type="dxa" w:w="1150"/>
+            <w:tcMar>
+              <w:top w:w="80" w:type="dxa"/>
+              <w:start w:w="120" w:type="dxa"/>
+              <w:bottom w:w="80" w:type="dxa"/>
+              <w:end w:w="120" w:type="dxa"/>
+            </w:tcMar>
+            <w:vAlign w:val="center"/>
+            <w:shd w:fill="FFFFFF"/>
+          </w:tcPr>
+          <w:p>
+            <w:pPr>
+              <w:spacing w:before="0" w:after="40" w:line="252" w:lineRule="auto"/>
+              <w:jc w:val="center"/>
+            </w:pPr>
+            <w:r>
+              <w:rPr>
+                <w:rFonts w:ascii="Calibri" w:hAnsi="Calibri"/>
+                <w:b w:val="0"/>
+                <w:color w:val="111827"/>
+                <w:sz w:val="16"/>
+              </w:rPr>
+              <w:t>GET</w:t>
+            </w:r>
+          </w:p>
+        </w:tc>
+        <w:tc>
+          <w:tcPr>
+            <w:tcW w:type="dxa" w:w="3700"/>
+            <w:tcMar>
+              <w:top w:w="80" w:type="dxa"/>
+              <w:start w:w="120" w:type="dxa"/>
+              <w:bottom w:w="80" w:type="dxa"/>
+              <w:end w:w="120" w:type="dxa"/>
+            </w:tcMar>
+            <w:vAlign w:val="center"/>
+            <w:shd w:fill="FFFFFF"/>
+          </w:tcPr>
+          <w:p>
+            <w:pPr>
+              <w:spacing w:before="0" w:after="40" w:line="252" w:lineRule="auto"/>
+              <w:jc w:val="left"/>
+            </w:pPr>
+            <w:r>
+              <w:rPr>
+                <w:rFonts w:ascii="Calibri" w:hAnsi="Calibri"/>
+                <w:b w:val="0"/>
+                <w:color w:val="111827"/>
+                <w:sz w:val="16"/>
+              </w:rPr>
+              <w:t>/api/v1/vehicles/{vehicle_id}/can-networks/dbc-catalogues</w:t>
+            </w:r>
+          </w:p>
+        </w:tc>
+        <w:tc>
+          <w:tcPr>
+            <w:tcW w:type="dxa" w:w="3100"/>
+            <w:tcMar>
+              <w:top w:w="80" w:type="dxa"/>
+              <w:start w:w="120" w:type="dxa"/>
+              <w:bottom w:w="80" w:type="dxa"/>
+              <w:end w:w="120" w:type="dxa"/>
+            </w:tcMar>
+            <w:vAlign w:val="center"/>
+            <w:shd w:fill="FFFFFF"/>
+          </w:tcPr>
+          <w:p>
+            <w:pPr>
+              <w:spacing w:before="0" w:after="40" w:line="252" w:lineRule="auto"/>
+              <w:jc w:val="left"/>
+            </w:pPr>
+            <w:r>
+              <w:rPr>
+                <w:rFonts w:ascii="Calibri" w:hAnsi="Calibri"/>
+                <w:b w:val="0"/>
+                <w:color w:val="111827"/>
+                <w:sz w:val="16"/>
+              </w:rPr>
+              <w:t>can_networks:read</w:t>
+            </w:r>
+          </w:p>
+        </w:tc>
+        <w:tc>
+          <w:tcPr>
+            <w:tcW w:type="dxa" w:w="1410"/>
+            <w:tcMar>
+              <w:top w:w="80" w:type="dxa"/>
+              <w:start w:w="120" w:type="dxa"/>
+              <w:bottom w:w="80" w:type="dxa"/>
+              <w:end w:w="120" w:type="dxa"/>
+            </w:tcMar>
+            <w:vAlign w:val="center"/>
+            <w:shd w:fill="FFFFFF"/>
+          </w:tcPr>
+          <w:p>
+            <w:pPr>
+              <w:spacing w:before="0" w:after="40" w:line="252" w:lineRule="auto"/>
+              <w:jc w:val="left"/>
+            </w:pPr>
+            <w:r>
+              <w:rPr>
+                <w:rFonts w:ascii="Calibri" w:hAnsi="Calibri"/>
+                <w:b w:val="0"/>
+                <w:color w:val="111827"/>
+                <w:sz w:val="16"/>
+              </w:rPr>
+              <w:t>Retrieve the DBC catalogue.</w:t>
+            </w:r>
+          </w:p>
+        </w:tc>
+      </w:tr>
+      <w:tr>
+        <w:trPr>
+          <w:cantSplit/>
+        </w:trPr>
+        <w:tc>
+          <w:tcPr>
+            <w:tcW w:type="dxa" w:w="1150"/>
+            <w:tcMar>
+              <w:top w:w="80" w:type="dxa"/>
+              <w:start w:w="120" w:type="dxa"/>
+              <w:bottom w:w="80" w:type="dxa"/>
+              <w:end w:w="120" w:type="dxa"/>
+            </w:tcMar>
+            <w:vAlign w:val="center"/>
+            <w:shd w:fill="FFFFFF"/>
+          </w:tcPr>
+          <w:p>
+            <w:pPr>
+              <w:spacing w:before="0" w:after="40" w:line="252" w:lineRule="auto"/>
+              <w:jc w:val="center"/>
+            </w:pPr>
+            <w:r>
+              <w:rPr>
+                <w:rFonts w:ascii="Calibri" w:hAnsi="Calibri"/>
+                <w:b w:val="0"/>
+                <w:color w:val="111827"/>
+                <w:sz w:val="16"/>
+              </w:rPr>
+              <w:t>POST</w:t>
+            </w:r>
+          </w:p>
+        </w:tc>
+        <w:tc>
+          <w:tcPr>
+            <w:tcW w:type="dxa" w:w="3700"/>
+            <w:tcMar>
+              <w:top w:w="80" w:type="dxa"/>
+              <w:start w:w="120" w:type="dxa"/>
+              <w:bottom w:w="80" w:type="dxa"/>
+              <w:end w:w="120" w:type="dxa"/>
+            </w:tcMar>
+            <w:vAlign w:val="center"/>
+            <w:shd w:fill="FFFFFF"/>
+          </w:tcPr>
+          <w:p>
+            <w:pPr>
+              <w:spacing w:before="0" w:after="40" w:line="252" w:lineRule="auto"/>
+              <w:jc w:val="left"/>
+            </w:pPr>
+            <w:r>
+              <w:rPr>
+                <w:rFonts w:ascii="Calibri" w:hAnsi="Calibri"/>
+                <w:b w:val="0"/>
+                <w:color w:val="111827"/>
+                <w:sz w:val="16"/>
+              </w:rPr>
+              <w:t>/api/v1/vehicles/{vehicle_id}/can-networks/dbc/encode</w:t>
+            </w:r>
+          </w:p>
+        </w:tc>
+        <w:tc>
+          <w:tcPr>
+            <w:tcW w:type="dxa" w:w="3100"/>
+            <w:tcMar>
+              <w:top w:w="80" w:type="dxa"/>
+              <w:start w:w="120" w:type="dxa"/>
+              <w:bottom w:w="80" w:type="dxa"/>
+              <w:end w:w="120" w:type="dxa"/>
+            </w:tcMar>
+            <w:vAlign w:val="center"/>
+            <w:shd w:fill="FFFFFF"/>
+          </w:tcPr>
+          <w:p>
+            <w:pPr>
+              <w:spacing w:before="0" w:after="40" w:line="252" w:lineRule="auto"/>
+              <w:jc w:val="left"/>
+            </w:pPr>
+            <w:r>
+              <w:rPr>
+                <w:rFonts w:ascii="Calibri" w:hAnsi="Calibri"/>
+                <w:b w:val="0"/>
+                <w:color w:val="111827"/>
+                <w:sz w:val="16"/>
+              </w:rPr>
+              <w:t>can_networks:manage</w:t>
+            </w:r>
+          </w:p>
+        </w:tc>
+        <w:tc>
+          <w:tcPr>
+            <w:tcW w:type="dxa" w:w="1410"/>
+            <w:tcMar>
+              <w:top w:w="80" w:type="dxa"/>
+              <w:start w:w="120" w:type="dxa"/>
+              <w:bottom w:w="80" w:type="dxa"/>
+              <w:end w:w="120" w:type="dxa"/>
+            </w:tcMar>
+            <w:vAlign w:val="center"/>
+            <w:shd w:fill="FFFFFF"/>
+          </w:tcPr>
+          <w:p>
+            <w:pPr>
+              <w:spacing w:before="0" w:after="40" w:line="252" w:lineRule="auto"/>
+              <w:jc w:val="left"/>
+            </w:pPr>
+            <w:r>
+              <w:rPr>
+                <w:rFonts w:ascii="Calibri" w:hAnsi="Calibri"/>
+                <w:b w:val="0"/>
+                <w:color w:val="111827"/>
+                <w:sz w:val="16"/>
+              </w:rPr>
+              <w:t>Encode physical values into payload bytes.</w:t>
+            </w:r>
+          </w:p>
+        </w:tc>
+      </w:tr>
+      <w:tr>
+        <w:trPr>
+          <w:cantSplit/>
+        </w:trPr>
+        <w:tc>
+          <w:tcPr>
+            <w:tcW w:type="dxa" w:w="1150"/>
+            <w:tcMar>
+              <w:top w:w="80" w:type="dxa"/>
+              <w:start w:w="120" w:type="dxa"/>
+              <w:bottom w:w="80" w:type="dxa"/>
+              <w:end w:w="120" w:type="dxa"/>
+            </w:tcMar>
+            <w:vAlign w:val="center"/>
+            <w:shd w:fill="FFFFFF"/>
+          </w:tcPr>
+          <w:p>
+            <w:pPr>
+              <w:spacing w:before="0" w:after="40" w:line="252" w:lineRule="auto"/>
+              <w:jc w:val="center"/>
+            </w:pPr>
+            <w:r>
+              <w:rPr>
+                <w:rFonts w:ascii="Calibri" w:hAnsi="Calibri"/>
+                <w:b w:val="0"/>
+                <w:color w:val="111827"/>
+                <w:sz w:val="16"/>
+              </w:rPr>
+              <w:t>POST</w:t>
+            </w:r>
+          </w:p>
+        </w:tc>
+        <w:tc>
+          <w:tcPr>
+            <w:tcW w:type="dxa" w:w="3700"/>
+            <w:tcMar>
+              <w:top w:w="80" w:type="dxa"/>
+              <w:start w:w="120" w:type="dxa"/>
+              <w:bottom w:w="80" w:type="dxa"/>
+              <w:end w:w="120" w:type="dxa"/>
+            </w:tcMar>
+            <w:vAlign w:val="center"/>
+            <w:shd w:fill="FFFFFF"/>
+          </w:tcPr>
+          <w:p>
+            <w:pPr>
+              <w:spacing w:before="0" w:after="40" w:line="252" w:lineRule="auto"/>
+              <w:jc w:val="left"/>
+            </w:pPr>
+            <w:r>
+              <w:rPr>
+                <w:rFonts w:ascii="Calibri" w:hAnsi="Calibri"/>
+                <w:b w:val="0"/>
+                <w:color w:val="111827"/>
+                <w:sz w:val="16"/>
+              </w:rPr>
+              <w:t>/api/v1/vehicles/{vehicle_id}/can-networks/dbc/decode</w:t>
+            </w:r>
+          </w:p>
+        </w:tc>
+        <w:tc>
+          <w:tcPr>
+            <w:tcW w:type="dxa" w:w="3100"/>
+            <w:tcMar>
+              <w:top w:w="80" w:type="dxa"/>
+              <w:start w:w="120" w:type="dxa"/>
+              <w:bottom w:w="80" w:type="dxa"/>
+              <w:end w:w="120" w:type="dxa"/>
+            </w:tcMar>
+            <w:vAlign w:val="center"/>
+            <w:shd w:fill="FFFFFF"/>
+          </w:tcPr>
+          <w:p>
+            <w:pPr>
+              <w:spacing w:before="0" w:after="40" w:line="252" w:lineRule="auto"/>
+              <w:jc w:val="left"/>
+            </w:pPr>
+            <w:r>
+              <w:rPr>
+                <w:rFonts w:ascii="Calibri" w:hAnsi="Calibri"/>
+                <w:b w:val="0"/>
+                <w:color w:val="111827"/>
+                <w:sz w:val="16"/>
+              </w:rPr>
+              <w:t>can_networks:manage</w:t>
+            </w:r>
+          </w:p>
+        </w:tc>
+        <w:tc>
+          <w:tcPr>
+            <w:tcW w:type="dxa" w:w="1410"/>
+            <w:tcMar>
+              <w:top w:w="80" w:type="dxa"/>
+              <w:start w:w="120" w:type="dxa"/>
+              <w:bottom w:w="80" w:type="dxa"/>
+              <w:end w:w="120" w:type="dxa"/>
+            </w:tcMar>
+            <w:vAlign w:val="center"/>
+            <w:shd w:fill="FFFFFF"/>
+          </w:tcPr>
+          <w:p>
+            <w:pPr>
+              <w:spacing w:before="0" w:after="40" w:line="252" w:lineRule="auto"/>
+              <w:jc w:val="left"/>
+            </w:pPr>
+            <w:r>
+              <w:rPr>
+                <w:rFonts w:ascii="Calibri" w:hAnsi="Calibri"/>
+                <w:b w:val="0"/>
+                <w:color w:val="111827"/>
+                <w:sz w:val="16"/>
+              </w:rPr>
+              <w:t>Decode payload bytes into signal values.</w:t>
+            </w:r>
+          </w:p>
+        </w:tc>
+      </w:tr>
+      <w:tr>
+        <w:trPr>
+          <w:cantSplit/>
+        </w:trPr>
+        <w:tc>
+          <w:tcPr>
+            <w:tcW w:type="dxa" w:w="1150"/>
+            <w:tcMar>
+              <w:top w:w="80" w:type="dxa"/>
+              <w:start w:w="120" w:type="dxa"/>
+              <w:bottom w:w="80" w:type="dxa"/>
+              <w:end w:w="120" w:type="dxa"/>
+            </w:tcMar>
+            <w:vAlign w:val="center"/>
+            <w:shd w:fill="FFFFFF"/>
+          </w:tcPr>
+          <w:p>
+            <w:pPr>
+              <w:spacing w:before="0" w:after="40" w:line="252" w:lineRule="auto"/>
+              <w:jc w:val="center"/>
+            </w:pPr>
+            <w:r>
+              <w:rPr>
+                <w:rFonts w:ascii="Calibri" w:hAnsi="Calibri"/>
+                <w:b w:val="0"/>
+                <w:color w:val="111827"/>
+                <w:sz w:val="16"/>
+              </w:rPr>
+              <w:t>GET</w:t>
+            </w:r>
+          </w:p>
+        </w:tc>
+        <w:tc>
+          <w:tcPr>
+            <w:tcW w:type="dxa" w:w="3700"/>
+            <w:tcMar>
+              <w:top w:w="80" w:type="dxa"/>
+              <w:start w:w="120" w:type="dxa"/>
+              <w:bottom w:w="80" w:type="dxa"/>
+              <w:end w:w="120" w:type="dxa"/>
+            </w:tcMar>
+            <w:vAlign w:val="center"/>
+            <w:shd w:fill="FFFFFF"/>
+          </w:tcPr>
+          <w:p>
+            <w:pPr>
+              <w:spacing w:before="0" w:after="40" w:line="252" w:lineRule="auto"/>
+              <w:jc w:val="left"/>
+            </w:pPr>
+            <w:r>
+              <w:rPr>
+                <w:rFonts w:ascii="Calibri" w:hAnsi="Calibri"/>
+                <w:b w:val="0"/>
+                <w:color w:val="111827"/>
+                <w:sz w:val="16"/>
+              </w:rPr>
+              <w:t>/api/v1/vehicles/{vehicle_id}/can-networks/dbc/executions</w:t>
+            </w:r>
+          </w:p>
+        </w:tc>
+        <w:tc>
+          <w:tcPr>
+            <w:tcW w:type="dxa" w:w="3100"/>
+            <w:tcMar>
+              <w:top w:w="80" w:type="dxa"/>
+              <w:start w:w="120" w:type="dxa"/>
+              <w:bottom w:w="80" w:type="dxa"/>
+              <w:end w:w="120" w:type="dxa"/>
+            </w:tcMar>
+            <w:vAlign w:val="center"/>
+            <w:shd w:fill="FFFFFF"/>
+          </w:tcPr>
+          <w:p>
+            <w:pPr>
+              <w:spacing w:before="0" w:after="40" w:line="252" w:lineRule="auto"/>
+              <w:jc w:val="left"/>
+            </w:pPr>
+            <w:r>
+              <w:rPr>
+                <w:rFonts w:ascii="Calibri" w:hAnsi="Calibri"/>
+                <w:b w:val="0"/>
+                <w:color w:val="111827"/>
+                <w:sz w:val="16"/>
+              </w:rPr>
+              <w:t>can_networks:read</w:t>
+            </w:r>
+          </w:p>
+        </w:tc>
+        <w:tc>
+          <w:tcPr>
+            <w:tcW w:type="dxa" w:w="1410"/>
+            <w:tcMar>
+              <w:top w:w="80" w:type="dxa"/>
+              <w:start w:w="120" w:type="dxa"/>
+              <w:bottom w:w="80" w:type="dxa"/>
+              <w:end w:w="120" w:type="dxa"/>
+            </w:tcMar>
+            <w:vAlign w:val="center"/>
+            <w:shd w:fill="FFFFFF"/>
+          </w:tcPr>
+          <w:p>
+            <w:pPr>
+              <w:spacing w:before="0" w:after="40" w:line="252" w:lineRule="auto"/>
+              <w:jc w:val="left"/>
+            </w:pPr>
+            <w:r>
+              <w:rPr>
+                <w:rFonts w:ascii="Calibri" w:hAnsi="Calibri"/>
+                <w:b w:val="0"/>
+                <w:color w:val="111827"/>
+                <w:sz w:val="16"/>
+              </w:rPr>
+              <w:t>List safely paginated codec evidence.</w:t>
+            </w:r>
+          </w:p>
+        </w:tc>
+      </w:tr>
+      <w:tr>
+        <w:trPr>
+          <w:cantSplit/>
+        </w:trPr>
+        <w:tc>
+          <w:tcPr>
+            <w:tcW w:type="dxa" w:w="1150"/>
+            <w:tcMar>
+              <w:top w:w="80" w:type="dxa"/>
+              <w:start w:w="120" w:type="dxa"/>
+              <w:bottom w:w="80" w:type="dxa"/>
+              <w:end w:w="120" w:type="dxa"/>
+            </w:tcMar>
+            <w:vAlign w:val="center"/>
+            <w:shd w:fill="FFFFFF"/>
+          </w:tcPr>
+          <w:p>
+            <w:pPr>
+              <w:spacing w:before="0" w:after="40" w:line="252" w:lineRule="auto"/>
+              <w:jc w:val="center"/>
+            </w:pPr>
+            <w:r>
+              <w:rPr>
+                <w:rFonts w:ascii="Calibri" w:hAnsi="Calibri"/>
+                <w:b w:val="0"/>
+                <w:color w:val="111827"/>
+                <w:sz w:val="16"/>
+              </w:rPr>
+              <w:t>GET</w:t>
+            </w:r>
+          </w:p>
+        </w:tc>
+        <w:tc>
+          <w:tcPr>
+            <w:tcW w:type="dxa" w:w="3700"/>
+            <w:tcMar>
+              <w:top w:w="80" w:type="dxa"/>
+              <w:start w:w="120" w:type="dxa"/>
+              <w:bottom w:w="80" w:type="dxa"/>
+              <w:end w:w="120" w:type="dxa"/>
+            </w:tcMar>
+            <w:vAlign w:val="center"/>
+            <w:shd w:fill="FFFFFF"/>
+          </w:tcPr>
+          <w:p>
+            <w:pPr>
+              <w:spacing w:before="0" w:after="40" w:line="252" w:lineRule="auto"/>
+              <w:jc w:val="left"/>
+            </w:pPr>
+            <w:r>
+              <w:rPr>
+                <w:rFonts w:ascii="Calibri" w:hAnsi="Calibri"/>
+                <w:b w:val="0"/>
+                <w:color w:val="111827"/>
+                <w:sz w:val="16"/>
+              </w:rPr>
+              <w:t>/api/v1/vehicles/{vehicle_id}/can-networks/dbc/executions/{command_id}</w:t>
+            </w:r>
+          </w:p>
+        </w:tc>
+        <w:tc>
+          <w:tcPr>
+            <w:tcW w:type="dxa" w:w="3100"/>
+            <w:tcMar>
+              <w:top w:w="80" w:type="dxa"/>
+              <w:start w:w="120" w:type="dxa"/>
+              <w:bottom w:w="80" w:type="dxa"/>
+              <w:end w:w="120" w:type="dxa"/>
+            </w:tcMar>
+            <w:vAlign w:val="center"/>
+            <w:shd w:fill="FFFFFF"/>
+          </w:tcPr>
+          <w:p>
+            <w:pPr>
+              <w:spacing w:before="0" w:after="40" w:line="252" w:lineRule="auto"/>
+              <w:jc w:val="left"/>
+            </w:pPr>
+            <w:r>
+              <w:rPr>
+                <w:rFonts w:ascii="Calibri" w:hAnsi="Calibri"/>
+                <w:b w:val="0"/>
+                <w:color w:val="111827"/>
+                <w:sz w:val="16"/>
+              </w:rPr>
+              <w:t>can_networks:read</w:t>
+            </w:r>
+          </w:p>
+        </w:tc>
+        <w:tc>
+          <w:tcPr>
+            <w:tcW w:type="dxa" w:w="1410"/>
+            <w:tcMar>
+              <w:top w:w="80" w:type="dxa"/>
+              <w:start w:w="120" w:type="dxa"/>
+              <w:bottom w:w="80" w:type="dxa"/>
+              <w:end w:w="120" w:type="dxa"/>
+            </w:tcMar>
+            <w:vAlign w:val="center"/>
+            <w:shd w:fill="FFFFFF"/>
+          </w:tcPr>
+          <w:p>
+            <w:pPr>
+              <w:spacing w:before="0" w:after="40" w:line="252" w:lineRule="auto"/>
+              <w:jc w:val="left"/>
+            </w:pPr>
+            <w:r>
+              <w:rPr>
+                <w:rFonts w:ascii="Calibri" w:hAnsi="Calibri"/>
+                <w:b w:val="0"/>
+                <w:color w:val="111827"/>
+                <w:sz w:val="16"/>
+              </w:rPr>
+              <w:t>Retrieve one codec result.</w:t>
+            </w:r>
+          </w:p>
+        </w:tc>
+      </w:tr>
     </w:tbl>
     <w:p>
       <w:pPr>
@@ -2950,6 +3842,104 @@
     </w:p>
     <w:p>
       <w:pPr>
+        <w:pStyle w:val="Heading2"/>
+        <w:keepNext/>
+        <w:keepLines/>
+      </w:pPr>
+      <w:r>
+        <w:t>8.2 DBC Signal Semantics</w:t>
+      </w:r>
+    </w:p>
+    <w:p>
+      <w:r>
+        <w:rPr>
+          <w:rFonts w:ascii="Calibri" w:hAnsi="Calibri"/>
+          <w:color w:val="111827"/>
+          <w:sz w:val="22"/>
+        </w:rPr>
+        <w:t>Catalogue creation locks the network, verifies optimistic version, resolves every message against an existing frame contract, and rejects duplicate messages, duplicate signals, occupied-bit overlap, or positions outside the contracted DLC. One catalogue is allowed per network in this increment.</w:t>
+      </w:r>
+    </w:p>
+    <w:p>
+      <w:r>
+        <w:rPr>
+          <w:rFonts w:ascii="Calibri" w:hAnsi="Calibri"/>
+          <w:color w:val="111827"/>
+          <w:sz w:val="22"/>
+        </w:rPr>
+        <w:t>Intel signals begin at their least-significant bit and occupy increasing bit positions. Motorola signals begin at their most-significant bit and follow DBC sawtooth numbering: bits descend within a byte, then bit 0 advances to bit 15 of the next byte. Signed signals use two's complement.</w:t>
+      </w:r>
+    </w:p>
+    <w:p>
+      <w:r>
+        <w:rPr>
+          <w:rFonts w:ascii="Calibri" w:hAnsi="Calibri"/>
+          <w:color w:val="111827"/>
+          <w:sz w:val="22"/>
+        </w:rPr>
+        <w:t xml:space="preserve">Physical-to-raw conversion uses decimal arithmetic: </w:t>
+      </w:r>
+      <w:r>
+        <w:rPr>
+          <w:rFonts w:ascii="Consolas" w:hAnsi="Consolas"/>
+          <w:color w:val="1F4D78"/>
+          <w:sz w:val="19"/>
+        </w:rPr>
+        <w:t>(physical - offset) / factor</w:t>
+      </w:r>
+      <w:r>
+        <w:rPr>
+          <w:rFonts w:ascii="Calibri" w:hAnsi="Calibri"/>
+          <w:color w:val="111827"/>
+          <w:sz w:val="22"/>
+        </w:rPr>
+        <w:t xml:space="preserve">. A value is rejected if it violates optional physical bounds, exceeds its signed or unsigned raw range, or would require fractional rounding. Decode applies </w:t>
+      </w:r>
+      <w:r>
+        <w:rPr>
+          <w:rFonts w:ascii="Consolas" w:hAnsi="Consolas"/>
+          <w:color w:val="1F4D78"/>
+          <w:sz w:val="19"/>
+        </w:rPr>
+        <w:t>raw * factor + offset</w:t>
+      </w:r>
+      <w:r>
+        <w:rPr>
+          <w:rFonts w:ascii="Calibri" w:hAnsi="Calibri"/>
+          <w:color w:val="111827"/>
+          <w:sz w:val="22"/>
+        </w:rPr>
+        <w:t>. Encode requires exactly the declared signal set, preventing accidental default values or ignored names.</w:t>
+      </w:r>
+    </w:p>
+    <w:p>
+      <w:r>
+        <w:rPr>
+          <w:rFonts w:ascii="Calibri" w:hAnsi="Calibri"/>
+          <w:color w:val="111827"/>
+          <w:sz w:val="22"/>
+        </w:rPr>
+        <w:t xml:space="preserve">Codec commands lock the network row to serialize command identity checks. Exact retry returns the stored result; changed reuse fails with </w:t>
+      </w:r>
+      <w:r>
+        <w:rPr>
+          <w:rFonts w:ascii="Consolas" w:hAnsi="Consolas"/>
+          <w:color w:val="1F4D78"/>
+          <w:sz w:val="19"/>
+        </w:rPr>
+        <w:t>can_signal_codec_command_conflict</w:t>
+      </w:r>
+      <w:r>
+        <w:rPr>
+          <w:rFonts w:ascii="Calibri" w:hAnsi="Calibri"/>
+          <w:color w:val="111827"/>
+          <w:sz w:val="22"/>
+        </w:rPr>
+        <w:t>. Payload, raw values, and physical values are persisted as engineering evidence but excluded from audit and outbox messages.</w:t>
+      </w:r>
+    </w:p>
+    <w:p>
+      <w:pPr>
         <w:pStyle w:val="Heading1"/>
         <w:keepNext/>
         <w:keepLines/>
@@ -2981,7 +3971,7 @@
           <w:color w:val="111827"/>
           <w:sz w:val="22"/>
         </w:rPr>
-        <w:t>. IV-1 and IV-2 implement CAN-F-001 through CAN-F-020 and CAN-NF-001 through CAN-NF-008.</w:t>
+        <w:t>. IV-1 through IV-3 implement CAN-F-001 through CAN-F-030 and CAN-NF-001 through CAN-NF-011.</w:t>
       </w:r>
     </w:p>
     <w:p>
@@ -3152,6 +4142,86 @@
           <w:sz w:val="22"/>
         </w:rPr>
         <w:t>The batch preserves arbitration context and metrics. Winner transmissions preserve a unified frame history. A single aggregate version increment represents the atomic command, while each frame gets its own monotonically increasing sequence.</w:t>
+      </w:r>
+    </w:p>
+    <w:p>
+      <w:pPr>
+        <w:pStyle w:val="Heading2"/>
+        <w:keepNext/>
+        <w:keepLines/>
+      </w:pPr>
+      <w:r>
+        <w:t>ADR-CAN-009 - Reference Frame Contracts from DBC Messages</w:t>
+      </w:r>
+    </w:p>
+    <w:p>
+      <w:r>
+        <w:rPr>
+          <w:rFonts w:ascii="Calibri" w:hAnsi="Calibri"/>
+          <w:color w:val="111827"/>
+          <w:sz w:val="22"/>
+        </w:rPr>
+        <w:t>DBC messages do not duplicate frame ID, format, DLC, producer, or consumers. The CAN contract stays authoritative while the catalogue supplies signal interpretation.</w:t>
+      </w:r>
+    </w:p>
+    <w:p>
+      <w:pPr>
+        <w:pStyle w:val="Heading2"/>
+        <w:keepNext/>
+        <w:keepLines/>
+      </w:pPr>
+      <w:r>
+        <w:t>ADR-CAN-010 - Implement Explicit Intel and Motorola Bit Traversal</w:t>
+      </w:r>
+    </w:p>
+    <w:p>
+      <w:r>
+        <w:rPr>
+          <w:rFonts w:ascii="Calibri" w:hAnsi="Calibri"/>
+          <w:color w:val="111827"/>
+          <w:sz w:val="22"/>
+        </w:rPr>
+        <w:t>Intel uses increasing LSB-first positions. Motorola uses MSB-first DBC sawtooth traversal. The bit position function is independently tested so byte-order behavior remains reviewable.</w:t>
+      </w:r>
+    </w:p>
+    <w:p>
+      <w:pPr>
+        <w:pStyle w:val="Heading2"/>
+        <w:keepNext/>
+        <w:keepLines/>
+      </w:pPr>
+      <w:r>
+        <w:t>ADR-CAN-011 - Reject Inexact Physical Values</w:t>
+      </w:r>
+    </w:p>
+    <w:p>
+      <w:r>
+        <w:rPr>
+          <w:rFonts w:ascii="Calibri" w:hAnsi="Calibri"/>
+          <w:color w:val="111827"/>
+          <w:sz w:val="22"/>
+        </w:rPr>
+        <w:t>Decimal arithmetic avoids binary floating-point drift. Encoding rejects non-integral raw results instead of selecting an implicit rounding policy that could hide test-data errors.</w:t>
+      </w:r>
+    </w:p>
+    <w:p>
+      <w:pPr>
+        <w:pStyle w:val="Heading2"/>
+        <w:keepNext/>
+        <w:keepLines/>
+      </w:pPr>
+      <w:r>
+        <w:t>ADR-CAN-012 - Separate Codec Evidence from Bus Transmission</w:t>
+      </w:r>
+    </w:p>
+    <w:p>
+      <w:r>
+        <w:rPr>
+          <w:rFonts w:ascii="Calibri" w:hAnsi="Calibri"/>
+          <w:color w:val="111827"/>
+          <w:sz w:val="22"/>
+        </w:rPr>
+        <w:t>Encoding creates a payload but does not automatically transmit it. A later caller may submit or arbitrate that payload, keeping semantic conversion and transport execution independently testable.</w:t>
       </w:r>
     </w:p>
     <w:p>
@@ -5963,6 +7033,1430 @@
           </w:p>
         </w:tc>
       </w:tr>
+      <w:tr>
+        <w:trPr>
+          <w:cantSplit/>
+        </w:trPr>
+        <w:tc>
+          <w:tcPr>
+            <w:tcW w:type="dxa" w:w="1650"/>
+            <w:tcMar>
+              <w:top w:w="80" w:type="dxa"/>
+              <w:start w:w="120" w:type="dxa"/>
+              <w:bottom w:w="80" w:type="dxa"/>
+              <w:end w:w="120" w:type="dxa"/>
+            </w:tcMar>
+            <w:vAlign w:val="center"/>
+            <w:shd w:fill="FFFFFF"/>
+          </w:tcPr>
+          <w:p>
+            <w:pPr>
+              <w:spacing w:before="0" w:after="40" w:line="252" w:lineRule="auto"/>
+              <w:jc w:val="center"/>
+            </w:pPr>
+            <w:r>
+              <w:rPr>
+                <w:rFonts w:ascii="Calibri" w:hAnsi="Calibri"/>
+                <w:b w:val="0"/>
+                <w:color w:val="111827"/>
+                <w:sz w:val="17"/>
+              </w:rPr>
+              <w:t>Catalogue uniqueness</w:t>
+            </w:r>
+          </w:p>
+        </w:tc>
+        <w:tc>
+          <w:tcPr>
+            <w:tcW w:type="dxa" w:w="4450"/>
+            <w:tcMar>
+              <w:top w:w="80" w:type="dxa"/>
+              <w:start w:w="120" w:type="dxa"/>
+              <w:bottom w:w="80" w:type="dxa"/>
+              <w:end w:w="120" w:type="dxa"/>
+            </w:tcMar>
+            <w:vAlign w:val="center"/>
+            <w:shd w:fill="FFFFFF"/>
+          </w:tcPr>
+          <w:p>
+            <w:pPr>
+              <w:spacing w:before="0" w:after="40" w:line="252" w:lineRule="auto"/>
+              <w:jc w:val="left"/>
+            </w:pPr>
+            <w:r>
+              <w:rPr>
+                <w:rFonts w:ascii="Calibri" w:hAnsi="Calibri"/>
+                <w:b w:val="0"/>
+                <w:color w:val="111827"/>
+                <w:sz w:val="17"/>
+              </w:rPr>
+              <w:t>Reject a second catalogue for the same CAN network.</w:t>
+            </w:r>
+          </w:p>
+        </w:tc>
+        <w:tc>
+          <w:tcPr>
+            <w:tcW w:type="dxa" w:w="3260"/>
+            <w:tcMar>
+              <w:top w:w="80" w:type="dxa"/>
+              <w:start w:w="120" w:type="dxa"/>
+              <w:bottom w:w="80" w:type="dxa"/>
+              <w:end w:w="120" w:type="dxa"/>
+            </w:tcMar>
+            <w:vAlign w:val="center"/>
+            <w:shd w:fill="FFFFFF"/>
+          </w:tcPr>
+          <w:p>
+            <w:pPr>
+              <w:spacing w:before="0" w:after="40" w:line="252" w:lineRule="auto"/>
+              <w:jc w:val="left"/>
+            </w:pPr>
+            <w:r>
+              <w:rPr>
+                <w:rFonts w:ascii="Calibri" w:hAnsi="Calibri"/>
+                <w:b w:val="0"/>
+                <w:color w:val="111827"/>
+                <w:sz w:val="17"/>
+              </w:rPr>
+              <w:t>Service/database</w:t>
+            </w:r>
+          </w:p>
+        </w:tc>
+      </w:tr>
+      <w:tr>
+        <w:trPr>
+          <w:cantSplit/>
+        </w:trPr>
+        <w:tc>
+          <w:tcPr>
+            <w:tcW w:type="dxa" w:w="1650"/>
+            <w:tcMar>
+              <w:top w:w="80" w:type="dxa"/>
+              <w:start w:w="120" w:type="dxa"/>
+              <w:bottom w:w="80" w:type="dxa"/>
+              <w:end w:w="120" w:type="dxa"/>
+            </w:tcMar>
+            <w:vAlign w:val="center"/>
+            <w:shd w:fill="FFFFFF"/>
+          </w:tcPr>
+          <w:p>
+            <w:pPr>
+              <w:spacing w:before="0" w:after="40" w:line="252" w:lineRule="auto"/>
+              <w:jc w:val="center"/>
+            </w:pPr>
+            <w:r>
+              <w:rPr>
+                <w:rFonts w:ascii="Calibri" w:hAnsi="Calibri"/>
+                <w:b w:val="0"/>
+                <w:color w:val="111827"/>
+                <w:sz w:val="17"/>
+              </w:rPr>
+              <w:t>Contract mapping</w:t>
+            </w:r>
+          </w:p>
+        </w:tc>
+        <w:tc>
+          <w:tcPr>
+            <w:tcW w:type="dxa" w:w="4450"/>
+            <w:tcMar>
+              <w:top w:w="80" w:type="dxa"/>
+              <w:start w:w="120" w:type="dxa"/>
+              <w:bottom w:w="80" w:type="dxa"/>
+              <w:end w:w="120" w:type="dxa"/>
+            </w:tcMar>
+            <w:vAlign w:val="center"/>
+            <w:shd w:fill="FFFFFF"/>
+          </w:tcPr>
+          <w:p>
+            <w:pPr>
+              <w:spacing w:before="0" w:after="40" w:line="252" w:lineRule="auto"/>
+              <w:jc w:val="left"/>
+            </w:pPr>
+            <w:r>
+              <w:rPr>
+                <w:rFonts w:ascii="Calibri" w:hAnsi="Calibri"/>
+                <w:b w:val="0"/>
+                <w:color w:val="111827"/>
+                <w:sz w:val="17"/>
+              </w:rPr>
+              <w:t>Reject a DBC message without an existing frame contract.</w:t>
+            </w:r>
+          </w:p>
+        </w:tc>
+        <w:tc>
+          <w:tcPr>
+            <w:tcW w:type="dxa" w:w="3260"/>
+            <w:tcMar>
+              <w:top w:w="80" w:type="dxa"/>
+              <w:start w:w="120" w:type="dxa"/>
+              <w:bottom w:w="80" w:type="dxa"/>
+              <w:end w:w="120" w:type="dxa"/>
+            </w:tcMar>
+            <w:vAlign w:val="center"/>
+            <w:shd w:fill="FFFFFF"/>
+          </w:tcPr>
+          <w:p>
+            <w:pPr>
+              <w:spacing w:before="0" w:after="40" w:line="252" w:lineRule="auto"/>
+              <w:jc w:val="left"/>
+            </w:pPr>
+            <w:r>
+              <w:rPr>
+                <w:rFonts w:ascii="Calibri" w:hAnsi="Calibri"/>
+                <w:b w:val="0"/>
+                <w:color w:val="111827"/>
+                <w:sz w:val="17"/>
+              </w:rPr>
+              <w:t>Service</w:t>
+            </w:r>
+          </w:p>
+        </w:tc>
+      </w:tr>
+      <w:tr>
+        <w:trPr>
+          <w:cantSplit/>
+        </w:trPr>
+        <w:tc>
+          <w:tcPr>
+            <w:tcW w:type="dxa" w:w="1650"/>
+            <w:tcMar>
+              <w:top w:w="80" w:type="dxa"/>
+              <w:start w:w="120" w:type="dxa"/>
+              <w:bottom w:w="80" w:type="dxa"/>
+              <w:end w:w="120" w:type="dxa"/>
+            </w:tcMar>
+            <w:vAlign w:val="center"/>
+            <w:shd w:fill="FFFFFF"/>
+          </w:tcPr>
+          <w:p>
+            <w:pPr>
+              <w:spacing w:before="0" w:after="40" w:line="252" w:lineRule="auto"/>
+              <w:jc w:val="center"/>
+            </w:pPr>
+            <w:r>
+              <w:rPr>
+                <w:rFonts w:ascii="Calibri" w:hAnsi="Calibri"/>
+                <w:b w:val="0"/>
+                <w:color w:val="111827"/>
+                <w:sz w:val="17"/>
+              </w:rPr>
+              <w:t>Signal uniqueness</w:t>
+            </w:r>
+          </w:p>
+        </w:tc>
+        <w:tc>
+          <w:tcPr>
+            <w:tcW w:type="dxa" w:w="4450"/>
+            <w:tcMar>
+              <w:top w:w="80" w:type="dxa"/>
+              <w:start w:w="120" w:type="dxa"/>
+              <w:bottom w:w="80" w:type="dxa"/>
+              <w:end w:w="120" w:type="dxa"/>
+            </w:tcMar>
+            <w:vAlign w:val="center"/>
+            <w:shd w:fill="FFFFFF"/>
+          </w:tcPr>
+          <w:p>
+            <w:pPr>
+              <w:spacing w:before="0" w:after="40" w:line="252" w:lineRule="auto"/>
+              <w:jc w:val="left"/>
+            </w:pPr>
+            <w:r>
+              <w:rPr>
+                <w:rFonts w:ascii="Calibri" w:hAnsi="Calibri"/>
+                <w:b w:val="0"/>
+                <w:color w:val="111827"/>
+                <w:sz w:val="17"/>
+              </w:rPr>
+              <w:t>Reject duplicate signal names within one message.</w:t>
+            </w:r>
+          </w:p>
+        </w:tc>
+        <w:tc>
+          <w:tcPr>
+            <w:tcW w:type="dxa" w:w="3260"/>
+            <w:tcMar>
+              <w:top w:w="80" w:type="dxa"/>
+              <w:start w:w="120" w:type="dxa"/>
+              <w:bottom w:w="80" w:type="dxa"/>
+              <w:end w:w="120" w:type="dxa"/>
+            </w:tcMar>
+            <w:vAlign w:val="center"/>
+            <w:shd w:fill="FFFFFF"/>
+          </w:tcPr>
+          <w:p>
+            <w:pPr>
+              <w:spacing w:before="0" w:after="40" w:line="252" w:lineRule="auto"/>
+              <w:jc w:val="left"/>
+            </w:pPr>
+            <w:r>
+              <w:rPr>
+                <w:rFonts w:ascii="Calibri" w:hAnsi="Calibri"/>
+                <w:b w:val="0"/>
+                <w:color w:val="111827"/>
+                <w:sz w:val="17"/>
+              </w:rPr>
+              <w:t>Schema</w:t>
+            </w:r>
+          </w:p>
+        </w:tc>
+      </w:tr>
+      <w:tr>
+        <w:trPr>
+          <w:cantSplit/>
+        </w:trPr>
+        <w:tc>
+          <w:tcPr>
+            <w:tcW w:type="dxa" w:w="1650"/>
+            <w:tcMar>
+              <w:top w:w="80" w:type="dxa"/>
+              <w:start w:w="120" w:type="dxa"/>
+              <w:bottom w:w="80" w:type="dxa"/>
+              <w:end w:w="120" w:type="dxa"/>
+            </w:tcMar>
+            <w:vAlign w:val="center"/>
+            <w:shd w:fill="FFFFFF"/>
+          </w:tcPr>
+          <w:p>
+            <w:pPr>
+              <w:spacing w:before="0" w:after="40" w:line="252" w:lineRule="auto"/>
+              <w:jc w:val="center"/>
+            </w:pPr>
+            <w:r>
+              <w:rPr>
+                <w:rFonts w:ascii="Calibri" w:hAnsi="Calibri"/>
+                <w:b w:val="0"/>
+                <w:color w:val="111827"/>
+                <w:sz w:val="17"/>
+              </w:rPr>
+              <w:t>DLC boundary</w:t>
+            </w:r>
+          </w:p>
+        </w:tc>
+        <w:tc>
+          <w:tcPr>
+            <w:tcW w:type="dxa" w:w="4450"/>
+            <w:tcMar>
+              <w:top w:w="80" w:type="dxa"/>
+              <w:start w:w="120" w:type="dxa"/>
+              <w:bottom w:w="80" w:type="dxa"/>
+              <w:end w:w="120" w:type="dxa"/>
+            </w:tcMar>
+            <w:vAlign w:val="center"/>
+            <w:shd w:fill="FFFFFF"/>
+          </w:tcPr>
+          <w:p>
+            <w:pPr>
+              <w:spacing w:before="0" w:after="40" w:line="252" w:lineRule="auto"/>
+              <w:jc w:val="left"/>
+            </w:pPr>
+            <w:r>
+              <w:rPr>
+                <w:rFonts w:ascii="Calibri" w:hAnsi="Calibri"/>
+                <w:b w:val="0"/>
+                <w:color w:val="111827"/>
+                <w:sz w:val="17"/>
+              </w:rPr>
+              <w:t>Reject Intel or Motorola positions outside contracted payload bits.</w:t>
+            </w:r>
+          </w:p>
+        </w:tc>
+        <w:tc>
+          <w:tcPr>
+            <w:tcW w:type="dxa" w:w="3260"/>
+            <w:tcMar>
+              <w:top w:w="80" w:type="dxa"/>
+              <w:start w:w="120" w:type="dxa"/>
+              <w:bottom w:w="80" w:type="dxa"/>
+              <w:end w:w="120" w:type="dxa"/>
+            </w:tcMar>
+            <w:vAlign w:val="center"/>
+            <w:shd w:fill="FFFFFF"/>
+          </w:tcPr>
+          <w:p>
+            <w:pPr>
+              <w:spacing w:before="0" w:after="40" w:line="252" w:lineRule="auto"/>
+              <w:jc w:val="left"/>
+            </w:pPr>
+            <w:r>
+              <w:rPr>
+                <w:rFonts w:ascii="Calibri" w:hAnsi="Calibri"/>
+                <w:b w:val="0"/>
+                <w:color w:val="111827"/>
+                <w:sz w:val="17"/>
+              </w:rPr>
+              <w:t>Service</w:t>
+            </w:r>
+          </w:p>
+        </w:tc>
+      </w:tr>
+      <w:tr>
+        <w:trPr>
+          <w:cantSplit/>
+        </w:trPr>
+        <w:tc>
+          <w:tcPr>
+            <w:tcW w:type="dxa" w:w="1650"/>
+            <w:tcMar>
+              <w:top w:w="80" w:type="dxa"/>
+              <w:start w:w="120" w:type="dxa"/>
+              <w:bottom w:w="80" w:type="dxa"/>
+              <w:end w:w="120" w:type="dxa"/>
+            </w:tcMar>
+            <w:vAlign w:val="center"/>
+            <w:shd w:fill="FFFFFF"/>
+          </w:tcPr>
+          <w:p>
+            <w:pPr>
+              <w:spacing w:before="0" w:after="40" w:line="252" w:lineRule="auto"/>
+              <w:jc w:val="center"/>
+            </w:pPr>
+            <w:r>
+              <w:rPr>
+                <w:rFonts w:ascii="Calibri" w:hAnsi="Calibri"/>
+                <w:b w:val="0"/>
+                <w:color w:val="111827"/>
+                <w:sz w:val="17"/>
+              </w:rPr>
+              <w:t>Signal overlap</w:t>
+            </w:r>
+          </w:p>
+        </w:tc>
+        <w:tc>
+          <w:tcPr>
+            <w:tcW w:type="dxa" w:w="4450"/>
+            <w:tcMar>
+              <w:top w:w="80" w:type="dxa"/>
+              <w:start w:w="120" w:type="dxa"/>
+              <w:bottom w:w="80" w:type="dxa"/>
+              <w:end w:w="120" w:type="dxa"/>
+            </w:tcMar>
+            <w:vAlign w:val="center"/>
+            <w:shd w:fill="FFFFFF"/>
+          </w:tcPr>
+          <w:p>
+            <w:pPr>
+              <w:spacing w:before="0" w:after="40" w:line="252" w:lineRule="auto"/>
+              <w:jc w:val="left"/>
+            </w:pPr>
+            <w:r>
+              <w:rPr>
+                <w:rFonts w:ascii="Calibri" w:hAnsi="Calibri"/>
+                <w:b w:val="0"/>
+                <w:color w:val="111827"/>
+                <w:sz w:val="17"/>
+              </w:rPr>
+              <w:t>Reject any two signals that occupy a common payload bit.</w:t>
+            </w:r>
+          </w:p>
+        </w:tc>
+        <w:tc>
+          <w:tcPr>
+            <w:tcW w:type="dxa" w:w="3260"/>
+            <w:tcMar>
+              <w:top w:w="80" w:type="dxa"/>
+              <w:start w:w="120" w:type="dxa"/>
+              <w:bottom w:w="80" w:type="dxa"/>
+              <w:end w:w="120" w:type="dxa"/>
+            </w:tcMar>
+            <w:vAlign w:val="center"/>
+            <w:shd w:fill="FFFFFF"/>
+          </w:tcPr>
+          <w:p>
+            <w:pPr>
+              <w:spacing w:before="0" w:after="40" w:line="252" w:lineRule="auto"/>
+              <w:jc w:val="left"/>
+            </w:pPr>
+            <w:r>
+              <w:rPr>
+                <w:rFonts w:ascii="Calibri" w:hAnsi="Calibri"/>
+                <w:b w:val="0"/>
+                <w:color w:val="111827"/>
+                <w:sz w:val="17"/>
+              </w:rPr>
+              <w:t>Service</w:t>
+            </w:r>
+          </w:p>
+        </w:tc>
+      </w:tr>
+      <w:tr>
+        <w:trPr>
+          <w:cantSplit/>
+        </w:trPr>
+        <w:tc>
+          <w:tcPr>
+            <w:tcW w:type="dxa" w:w="1650"/>
+            <w:tcMar>
+              <w:top w:w="80" w:type="dxa"/>
+              <w:start w:w="120" w:type="dxa"/>
+              <w:bottom w:w="80" w:type="dxa"/>
+              <w:end w:w="120" w:type="dxa"/>
+            </w:tcMar>
+            <w:vAlign w:val="center"/>
+            <w:shd w:fill="FFFFFF"/>
+          </w:tcPr>
+          <w:p>
+            <w:pPr>
+              <w:spacing w:before="0" w:after="40" w:line="252" w:lineRule="auto"/>
+              <w:jc w:val="center"/>
+            </w:pPr>
+            <w:r>
+              <w:rPr>
+                <w:rFonts w:ascii="Calibri" w:hAnsi="Calibri"/>
+                <w:b w:val="0"/>
+                <w:color w:val="111827"/>
+                <w:sz w:val="17"/>
+              </w:rPr>
+              <w:t>Intel placement</w:t>
+            </w:r>
+          </w:p>
+        </w:tc>
+        <w:tc>
+          <w:tcPr>
+            <w:tcW w:type="dxa" w:w="4450"/>
+            <w:tcMar>
+              <w:top w:w="80" w:type="dxa"/>
+              <w:start w:w="120" w:type="dxa"/>
+              <w:bottom w:w="80" w:type="dxa"/>
+              <w:end w:w="120" w:type="dxa"/>
+            </w:tcMar>
+            <w:vAlign w:val="center"/>
+            <w:shd w:fill="FFFFFF"/>
+          </w:tcPr>
+          <w:p>
+            <w:pPr>
+              <w:spacing w:before="0" w:after="40" w:line="252" w:lineRule="auto"/>
+              <w:jc w:val="left"/>
+            </w:pPr>
+            <w:r>
+              <w:rPr>
+                <w:rFonts w:ascii="Calibri" w:hAnsi="Calibri"/>
+                <w:b w:val="0"/>
+                <w:color w:val="111827"/>
+                <w:sz w:val="17"/>
+              </w:rPr>
+              <w:t>Verify LSB-first contiguous positions and payload bytes.</w:t>
+            </w:r>
+          </w:p>
+        </w:tc>
+        <w:tc>
+          <w:tcPr>
+            <w:tcW w:type="dxa" w:w="3260"/>
+            <w:tcMar>
+              <w:top w:w="80" w:type="dxa"/>
+              <w:start w:w="120" w:type="dxa"/>
+              <w:bottom w:w="80" w:type="dxa"/>
+              <w:end w:w="120" w:type="dxa"/>
+            </w:tcMar>
+            <w:vAlign w:val="center"/>
+            <w:shd w:fill="FFFFFF"/>
+          </w:tcPr>
+          <w:p>
+            <w:pPr>
+              <w:spacing w:before="0" w:after="40" w:line="252" w:lineRule="auto"/>
+              <w:jc w:val="left"/>
+            </w:pPr>
+            <w:r>
+              <w:rPr>
+                <w:rFonts w:ascii="Calibri" w:hAnsi="Calibri"/>
+                <w:b w:val="0"/>
+                <w:color w:val="111827"/>
+                <w:sz w:val="17"/>
+              </w:rPr>
+              <w:t>Unit</w:t>
+            </w:r>
+          </w:p>
+        </w:tc>
+      </w:tr>
+      <w:tr>
+        <w:trPr>
+          <w:cantSplit/>
+        </w:trPr>
+        <w:tc>
+          <w:tcPr>
+            <w:tcW w:type="dxa" w:w="1650"/>
+            <w:tcMar>
+              <w:top w:w="80" w:type="dxa"/>
+              <w:start w:w="120" w:type="dxa"/>
+              <w:bottom w:w="80" w:type="dxa"/>
+              <w:end w:w="120" w:type="dxa"/>
+            </w:tcMar>
+            <w:vAlign w:val="center"/>
+            <w:shd w:fill="FFFFFF"/>
+          </w:tcPr>
+          <w:p>
+            <w:pPr>
+              <w:spacing w:before="0" w:after="40" w:line="252" w:lineRule="auto"/>
+              <w:jc w:val="center"/>
+            </w:pPr>
+            <w:r>
+              <w:rPr>
+                <w:rFonts w:ascii="Calibri" w:hAnsi="Calibri"/>
+                <w:b w:val="0"/>
+                <w:color w:val="111827"/>
+                <w:sz w:val="17"/>
+              </w:rPr>
+              <w:t>Motorola placement</w:t>
+            </w:r>
+          </w:p>
+        </w:tc>
+        <w:tc>
+          <w:tcPr>
+            <w:tcW w:type="dxa" w:w="4450"/>
+            <w:tcMar>
+              <w:top w:w="80" w:type="dxa"/>
+              <w:start w:w="120" w:type="dxa"/>
+              <w:bottom w:w="80" w:type="dxa"/>
+              <w:end w:w="120" w:type="dxa"/>
+            </w:tcMar>
+            <w:vAlign w:val="center"/>
+            <w:shd w:fill="FFFFFF"/>
+          </w:tcPr>
+          <w:p>
+            <w:pPr>
+              <w:spacing w:before="0" w:after="40" w:line="252" w:lineRule="auto"/>
+              <w:jc w:val="left"/>
+            </w:pPr>
+            <w:r>
+              <w:rPr>
+                <w:rFonts w:ascii="Calibri" w:hAnsi="Calibri"/>
+                <w:b w:val="0"/>
+                <w:color w:val="111827"/>
+                <w:sz w:val="17"/>
+              </w:rPr>
+              <w:t>Verify MSB-first sawtooth positions and payload bytes.</w:t>
+            </w:r>
+          </w:p>
+        </w:tc>
+        <w:tc>
+          <w:tcPr>
+            <w:tcW w:type="dxa" w:w="3260"/>
+            <w:tcMar>
+              <w:top w:w="80" w:type="dxa"/>
+              <w:start w:w="120" w:type="dxa"/>
+              <w:bottom w:w="80" w:type="dxa"/>
+              <w:end w:w="120" w:type="dxa"/>
+            </w:tcMar>
+            <w:vAlign w:val="center"/>
+            <w:shd w:fill="FFFFFF"/>
+          </w:tcPr>
+          <w:p>
+            <w:pPr>
+              <w:spacing w:before="0" w:after="40" w:line="252" w:lineRule="auto"/>
+              <w:jc w:val="left"/>
+            </w:pPr>
+            <w:r>
+              <w:rPr>
+                <w:rFonts w:ascii="Calibri" w:hAnsi="Calibri"/>
+                <w:b w:val="0"/>
+                <w:color w:val="111827"/>
+                <w:sz w:val="17"/>
+              </w:rPr>
+              <w:t>Unit</w:t>
+            </w:r>
+          </w:p>
+        </w:tc>
+      </w:tr>
+      <w:tr>
+        <w:trPr>
+          <w:cantSplit/>
+        </w:trPr>
+        <w:tc>
+          <w:tcPr>
+            <w:tcW w:type="dxa" w:w="1650"/>
+            <w:tcMar>
+              <w:top w:w="80" w:type="dxa"/>
+              <w:start w:w="120" w:type="dxa"/>
+              <w:bottom w:w="80" w:type="dxa"/>
+              <w:end w:w="120" w:type="dxa"/>
+            </w:tcMar>
+            <w:vAlign w:val="center"/>
+            <w:shd w:fill="FFFFFF"/>
+          </w:tcPr>
+          <w:p>
+            <w:pPr>
+              <w:spacing w:before="0" w:after="40" w:line="252" w:lineRule="auto"/>
+              <w:jc w:val="center"/>
+            </w:pPr>
+            <w:r>
+              <w:rPr>
+                <w:rFonts w:ascii="Calibri" w:hAnsi="Calibri"/>
+                <w:b w:val="0"/>
+                <w:color w:val="111827"/>
+                <w:sz w:val="17"/>
+              </w:rPr>
+              <w:t>Signed round-trip</w:t>
+            </w:r>
+          </w:p>
+        </w:tc>
+        <w:tc>
+          <w:tcPr>
+            <w:tcW w:type="dxa" w:w="4450"/>
+            <w:tcMar>
+              <w:top w:w="80" w:type="dxa"/>
+              <w:start w:w="120" w:type="dxa"/>
+              <w:bottom w:w="80" w:type="dxa"/>
+              <w:end w:w="120" w:type="dxa"/>
+            </w:tcMar>
+            <w:vAlign w:val="center"/>
+            <w:shd w:fill="FFFFFF"/>
+          </w:tcPr>
+          <w:p>
+            <w:pPr>
+              <w:spacing w:before="0" w:after="40" w:line="252" w:lineRule="auto"/>
+              <w:jc w:val="left"/>
+            </w:pPr>
+            <w:r>
+              <w:rPr>
+                <w:rFonts w:ascii="Calibri" w:hAnsi="Calibri"/>
+                <w:b w:val="0"/>
+                <w:color w:val="111827"/>
+                <w:sz w:val="17"/>
+              </w:rPr>
+              <w:t>Preserve negative two's-complement raw values.</w:t>
+            </w:r>
+          </w:p>
+        </w:tc>
+        <w:tc>
+          <w:tcPr>
+            <w:tcW w:type="dxa" w:w="3260"/>
+            <w:tcMar>
+              <w:top w:w="80" w:type="dxa"/>
+              <w:start w:w="120" w:type="dxa"/>
+              <w:bottom w:w="80" w:type="dxa"/>
+              <w:end w:w="120" w:type="dxa"/>
+            </w:tcMar>
+            <w:vAlign w:val="center"/>
+            <w:shd w:fill="FFFFFF"/>
+          </w:tcPr>
+          <w:p>
+            <w:pPr>
+              <w:spacing w:before="0" w:after="40" w:line="252" w:lineRule="auto"/>
+              <w:jc w:val="left"/>
+            </w:pPr>
+            <w:r>
+              <w:rPr>
+                <w:rFonts w:ascii="Calibri" w:hAnsi="Calibri"/>
+                <w:b w:val="0"/>
+                <w:color w:val="111827"/>
+                <w:sz w:val="17"/>
+              </w:rPr>
+              <w:t>Unit/service</w:t>
+            </w:r>
+          </w:p>
+        </w:tc>
+      </w:tr>
+      <w:tr>
+        <w:trPr>
+          <w:cantSplit/>
+        </w:trPr>
+        <w:tc>
+          <w:tcPr>
+            <w:tcW w:type="dxa" w:w="1650"/>
+            <w:tcMar>
+              <w:top w:w="80" w:type="dxa"/>
+              <w:start w:w="120" w:type="dxa"/>
+              <w:bottom w:w="80" w:type="dxa"/>
+              <w:end w:w="120" w:type="dxa"/>
+            </w:tcMar>
+            <w:vAlign w:val="center"/>
+            <w:shd w:fill="FFFFFF"/>
+          </w:tcPr>
+          <w:p>
+            <w:pPr>
+              <w:spacing w:before="0" w:after="40" w:line="252" w:lineRule="auto"/>
+              <w:jc w:val="center"/>
+            </w:pPr>
+            <w:r>
+              <w:rPr>
+                <w:rFonts w:ascii="Calibri" w:hAnsi="Calibri"/>
+                <w:b w:val="0"/>
+                <w:color w:val="111827"/>
+                <w:sz w:val="17"/>
+              </w:rPr>
+              <w:t>Decimal conversion</w:t>
+            </w:r>
+          </w:p>
+        </w:tc>
+        <w:tc>
+          <w:tcPr>
+            <w:tcW w:type="dxa" w:w="4450"/>
+            <w:tcMar>
+              <w:top w:w="80" w:type="dxa"/>
+              <w:start w:w="120" w:type="dxa"/>
+              <w:bottom w:w="80" w:type="dxa"/>
+              <w:end w:w="120" w:type="dxa"/>
+            </w:tcMar>
+            <w:vAlign w:val="center"/>
+            <w:shd w:fill="FFFFFF"/>
+          </w:tcPr>
+          <w:p>
+            <w:pPr>
+              <w:spacing w:before="0" w:after="40" w:line="252" w:lineRule="auto"/>
+              <w:jc w:val="left"/>
+            </w:pPr>
+            <w:r>
+              <w:rPr>
+                <w:rFonts w:ascii="Calibri" w:hAnsi="Calibri"/>
+                <w:b w:val="0"/>
+                <w:color w:val="111827"/>
+                <w:sz w:val="17"/>
+              </w:rPr>
+              <w:t>Apply factor and offset without binary floating-point drift.</w:t>
+            </w:r>
+          </w:p>
+        </w:tc>
+        <w:tc>
+          <w:tcPr>
+            <w:tcW w:type="dxa" w:w="3260"/>
+            <w:tcMar>
+              <w:top w:w="80" w:type="dxa"/>
+              <w:start w:w="120" w:type="dxa"/>
+              <w:bottom w:w="80" w:type="dxa"/>
+              <w:end w:w="120" w:type="dxa"/>
+            </w:tcMar>
+            <w:vAlign w:val="center"/>
+            <w:shd w:fill="FFFFFF"/>
+          </w:tcPr>
+          <w:p>
+            <w:pPr>
+              <w:spacing w:before="0" w:after="40" w:line="252" w:lineRule="auto"/>
+              <w:jc w:val="left"/>
+            </w:pPr>
+            <w:r>
+              <w:rPr>
+                <w:rFonts w:ascii="Calibri" w:hAnsi="Calibri"/>
+                <w:b w:val="0"/>
+                <w:color w:val="111827"/>
+                <w:sz w:val="17"/>
+              </w:rPr>
+              <w:t>Unit</w:t>
+            </w:r>
+          </w:p>
+        </w:tc>
+      </w:tr>
+      <w:tr>
+        <w:trPr>
+          <w:cantSplit/>
+        </w:trPr>
+        <w:tc>
+          <w:tcPr>
+            <w:tcW w:type="dxa" w:w="1650"/>
+            <w:tcMar>
+              <w:top w:w="80" w:type="dxa"/>
+              <w:start w:w="120" w:type="dxa"/>
+              <w:bottom w:w="80" w:type="dxa"/>
+              <w:end w:w="120" w:type="dxa"/>
+            </w:tcMar>
+            <w:vAlign w:val="center"/>
+            <w:shd w:fill="FFFFFF"/>
+          </w:tcPr>
+          <w:p>
+            <w:pPr>
+              <w:spacing w:before="0" w:after="40" w:line="252" w:lineRule="auto"/>
+              <w:jc w:val="center"/>
+            </w:pPr>
+            <w:r>
+              <w:rPr>
+                <w:rFonts w:ascii="Calibri" w:hAnsi="Calibri"/>
+                <w:b w:val="0"/>
+                <w:color w:val="111827"/>
+                <w:sz w:val="17"/>
+              </w:rPr>
+              <w:t>Exact representation</w:t>
+            </w:r>
+          </w:p>
+        </w:tc>
+        <w:tc>
+          <w:tcPr>
+            <w:tcW w:type="dxa" w:w="4450"/>
+            <w:tcMar>
+              <w:top w:w="80" w:type="dxa"/>
+              <w:start w:w="120" w:type="dxa"/>
+              <w:bottom w:w="80" w:type="dxa"/>
+              <w:end w:w="120" w:type="dxa"/>
+            </w:tcMar>
+            <w:vAlign w:val="center"/>
+            <w:shd w:fill="FFFFFF"/>
+          </w:tcPr>
+          <w:p>
+            <w:pPr>
+              <w:spacing w:before="0" w:after="40" w:line="252" w:lineRule="auto"/>
+              <w:jc w:val="left"/>
+            </w:pPr>
+            <w:r>
+              <w:rPr>
+                <w:rFonts w:ascii="Calibri" w:hAnsi="Calibri"/>
+                <w:b w:val="0"/>
+                <w:color w:val="111827"/>
+                <w:sz w:val="17"/>
+              </w:rPr>
+              <w:t>Reject physical values requiring fractional raw rounding.</w:t>
+            </w:r>
+          </w:p>
+        </w:tc>
+        <w:tc>
+          <w:tcPr>
+            <w:tcW w:type="dxa" w:w="3260"/>
+            <w:tcMar>
+              <w:top w:w="80" w:type="dxa"/>
+              <w:start w:w="120" w:type="dxa"/>
+              <w:bottom w:w="80" w:type="dxa"/>
+              <w:end w:w="120" w:type="dxa"/>
+            </w:tcMar>
+            <w:vAlign w:val="center"/>
+            <w:shd w:fill="FFFFFF"/>
+          </w:tcPr>
+          <w:p>
+            <w:pPr>
+              <w:spacing w:before="0" w:after="40" w:line="252" w:lineRule="auto"/>
+              <w:jc w:val="left"/>
+            </w:pPr>
+            <w:r>
+              <w:rPr>
+                <w:rFonts w:ascii="Calibri" w:hAnsi="Calibri"/>
+                <w:b w:val="0"/>
+                <w:color w:val="111827"/>
+                <w:sz w:val="17"/>
+              </w:rPr>
+              <w:t>Unit/service</w:t>
+            </w:r>
+          </w:p>
+        </w:tc>
+      </w:tr>
+      <w:tr>
+        <w:trPr>
+          <w:cantSplit/>
+        </w:trPr>
+        <w:tc>
+          <w:tcPr>
+            <w:tcW w:type="dxa" w:w="1650"/>
+            <w:tcMar>
+              <w:top w:w="80" w:type="dxa"/>
+              <w:start w:w="120" w:type="dxa"/>
+              <w:bottom w:w="80" w:type="dxa"/>
+              <w:end w:w="120" w:type="dxa"/>
+            </w:tcMar>
+            <w:vAlign w:val="center"/>
+            <w:shd w:fill="FFFFFF"/>
+          </w:tcPr>
+          <w:p>
+            <w:pPr>
+              <w:spacing w:before="0" w:after="40" w:line="252" w:lineRule="auto"/>
+              <w:jc w:val="center"/>
+            </w:pPr>
+            <w:r>
+              <w:rPr>
+                <w:rFonts w:ascii="Calibri" w:hAnsi="Calibri"/>
+                <w:b w:val="0"/>
+                <w:color w:val="111827"/>
+                <w:sz w:val="17"/>
+              </w:rPr>
+              <w:t>Physical bounds</w:t>
+            </w:r>
+          </w:p>
+        </w:tc>
+        <w:tc>
+          <w:tcPr>
+            <w:tcW w:type="dxa" w:w="4450"/>
+            <w:tcMar>
+              <w:top w:w="80" w:type="dxa"/>
+              <w:start w:w="120" w:type="dxa"/>
+              <w:bottom w:w="80" w:type="dxa"/>
+              <w:end w:w="120" w:type="dxa"/>
+            </w:tcMar>
+            <w:vAlign w:val="center"/>
+            <w:shd w:fill="FFFFFF"/>
+          </w:tcPr>
+          <w:p>
+            <w:pPr>
+              <w:spacing w:before="0" w:after="40" w:line="252" w:lineRule="auto"/>
+              <w:jc w:val="left"/>
+            </w:pPr>
+            <w:r>
+              <w:rPr>
+                <w:rFonts w:ascii="Calibri" w:hAnsi="Calibri"/>
+                <w:b w:val="0"/>
+                <w:color w:val="111827"/>
+                <w:sz w:val="17"/>
+              </w:rPr>
+              <w:t>Reject values below minimum or above maximum.</w:t>
+            </w:r>
+          </w:p>
+        </w:tc>
+        <w:tc>
+          <w:tcPr>
+            <w:tcW w:type="dxa" w:w="3260"/>
+            <w:tcMar>
+              <w:top w:w="80" w:type="dxa"/>
+              <w:start w:w="120" w:type="dxa"/>
+              <w:bottom w:w="80" w:type="dxa"/>
+              <w:end w:w="120" w:type="dxa"/>
+            </w:tcMar>
+            <w:vAlign w:val="center"/>
+            <w:shd w:fill="FFFFFF"/>
+          </w:tcPr>
+          <w:p>
+            <w:pPr>
+              <w:spacing w:before="0" w:after="40" w:line="252" w:lineRule="auto"/>
+              <w:jc w:val="left"/>
+            </w:pPr>
+            <w:r>
+              <w:rPr>
+                <w:rFonts w:ascii="Calibri" w:hAnsi="Calibri"/>
+                <w:b w:val="0"/>
+                <w:color w:val="111827"/>
+                <w:sz w:val="17"/>
+              </w:rPr>
+              <w:t>Unit/service</w:t>
+            </w:r>
+          </w:p>
+        </w:tc>
+      </w:tr>
+      <w:tr>
+        <w:trPr>
+          <w:cantSplit/>
+        </w:trPr>
+        <w:tc>
+          <w:tcPr>
+            <w:tcW w:type="dxa" w:w="1650"/>
+            <w:tcMar>
+              <w:top w:w="80" w:type="dxa"/>
+              <w:start w:w="120" w:type="dxa"/>
+              <w:bottom w:w="80" w:type="dxa"/>
+              <w:end w:w="120" w:type="dxa"/>
+            </w:tcMar>
+            <w:vAlign w:val="center"/>
+            <w:shd w:fill="FFFFFF"/>
+          </w:tcPr>
+          <w:p>
+            <w:pPr>
+              <w:spacing w:before="0" w:after="40" w:line="252" w:lineRule="auto"/>
+              <w:jc w:val="center"/>
+            </w:pPr>
+            <w:r>
+              <w:rPr>
+                <w:rFonts w:ascii="Calibri" w:hAnsi="Calibri"/>
+                <w:b w:val="0"/>
+                <w:color w:val="111827"/>
+                <w:sz w:val="17"/>
+              </w:rPr>
+              <w:t>Exact signal set</w:t>
+            </w:r>
+          </w:p>
+        </w:tc>
+        <w:tc>
+          <w:tcPr>
+            <w:tcW w:type="dxa" w:w="4450"/>
+            <w:tcMar>
+              <w:top w:w="80" w:type="dxa"/>
+              <w:start w:w="120" w:type="dxa"/>
+              <w:bottom w:w="80" w:type="dxa"/>
+              <w:end w:w="120" w:type="dxa"/>
+            </w:tcMar>
+            <w:vAlign w:val="center"/>
+            <w:shd w:fill="FFFFFF"/>
+          </w:tcPr>
+          <w:p>
+            <w:pPr>
+              <w:spacing w:before="0" w:after="40" w:line="252" w:lineRule="auto"/>
+              <w:jc w:val="left"/>
+            </w:pPr>
+            <w:r>
+              <w:rPr>
+                <w:rFonts w:ascii="Calibri" w:hAnsi="Calibri"/>
+                <w:b w:val="0"/>
+                <w:color w:val="111827"/>
+                <w:sz w:val="17"/>
+              </w:rPr>
+              <w:t>Reject missing or unexpected encode values.</w:t>
+            </w:r>
+          </w:p>
+        </w:tc>
+        <w:tc>
+          <w:tcPr>
+            <w:tcW w:type="dxa" w:w="3260"/>
+            <w:tcMar>
+              <w:top w:w="80" w:type="dxa"/>
+              <w:start w:w="120" w:type="dxa"/>
+              <w:bottom w:w="80" w:type="dxa"/>
+              <w:end w:w="120" w:type="dxa"/>
+            </w:tcMar>
+            <w:vAlign w:val="center"/>
+            <w:shd w:fill="FFFFFF"/>
+          </w:tcPr>
+          <w:p>
+            <w:pPr>
+              <w:spacing w:before="0" w:after="40" w:line="252" w:lineRule="auto"/>
+              <w:jc w:val="left"/>
+            </w:pPr>
+            <w:r>
+              <w:rPr>
+                <w:rFonts w:ascii="Calibri" w:hAnsi="Calibri"/>
+                <w:b w:val="0"/>
+                <w:color w:val="111827"/>
+                <w:sz w:val="17"/>
+              </w:rPr>
+              <w:t>Unit/service</w:t>
+            </w:r>
+          </w:p>
+        </w:tc>
+      </w:tr>
+      <w:tr>
+        <w:trPr>
+          <w:cantSplit/>
+        </w:trPr>
+        <w:tc>
+          <w:tcPr>
+            <w:tcW w:type="dxa" w:w="1650"/>
+            <w:tcMar>
+              <w:top w:w="80" w:type="dxa"/>
+              <w:start w:w="120" w:type="dxa"/>
+              <w:bottom w:w="80" w:type="dxa"/>
+              <w:end w:w="120" w:type="dxa"/>
+            </w:tcMar>
+            <w:vAlign w:val="center"/>
+            <w:shd w:fill="FFFFFF"/>
+          </w:tcPr>
+          <w:p>
+            <w:pPr>
+              <w:spacing w:before="0" w:after="40" w:line="252" w:lineRule="auto"/>
+              <w:jc w:val="center"/>
+            </w:pPr>
+            <w:r>
+              <w:rPr>
+                <w:rFonts w:ascii="Calibri" w:hAnsi="Calibri"/>
+                <w:b w:val="0"/>
+                <w:color w:val="111827"/>
+                <w:sz w:val="17"/>
+              </w:rPr>
+              <w:t>Codec replay</w:t>
+            </w:r>
+          </w:p>
+        </w:tc>
+        <w:tc>
+          <w:tcPr>
+            <w:tcW w:type="dxa" w:w="4450"/>
+            <w:tcMar>
+              <w:top w:w="80" w:type="dxa"/>
+              <w:start w:w="120" w:type="dxa"/>
+              <w:bottom w:w="80" w:type="dxa"/>
+              <w:end w:w="120" w:type="dxa"/>
+            </w:tcMar>
+            <w:vAlign w:val="center"/>
+            <w:shd w:fill="FFFFFF"/>
+          </w:tcPr>
+          <w:p>
+            <w:pPr>
+              <w:spacing w:before="0" w:after="40" w:line="252" w:lineRule="auto"/>
+              <w:jc w:val="left"/>
+            </w:pPr>
+            <w:r>
+              <w:rPr>
+                <w:rFonts w:ascii="Calibri" w:hAnsi="Calibri"/>
+                <w:b w:val="0"/>
+                <w:color w:val="111827"/>
+                <w:sz w:val="17"/>
+              </w:rPr>
+              <w:t>Reuse exact command evidence without duplicate observability.</w:t>
+            </w:r>
+          </w:p>
+        </w:tc>
+        <w:tc>
+          <w:tcPr>
+            <w:tcW w:type="dxa" w:w="3260"/>
+            <w:tcMar>
+              <w:top w:w="80" w:type="dxa"/>
+              <w:start w:w="120" w:type="dxa"/>
+              <w:bottom w:w="80" w:type="dxa"/>
+              <w:end w:w="120" w:type="dxa"/>
+            </w:tcMar>
+            <w:vAlign w:val="center"/>
+            <w:shd w:fill="FFFFFF"/>
+          </w:tcPr>
+          <w:p>
+            <w:pPr>
+              <w:spacing w:before="0" w:after="40" w:line="252" w:lineRule="auto"/>
+              <w:jc w:val="left"/>
+            </w:pPr>
+            <w:r>
+              <w:rPr>
+                <w:rFonts w:ascii="Calibri" w:hAnsi="Calibri"/>
+                <w:b w:val="0"/>
+                <w:color w:val="111827"/>
+                <w:sz w:val="17"/>
+              </w:rPr>
+              <w:t>Service/API</w:t>
+            </w:r>
+          </w:p>
+        </w:tc>
+      </w:tr>
+      <w:tr>
+        <w:trPr>
+          <w:cantSplit/>
+        </w:trPr>
+        <w:tc>
+          <w:tcPr>
+            <w:tcW w:type="dxa" w:w="1650"/>
+            <w:tcMar>
+              <w:top w:w="80" w:type="dxa"/>
+              <w:start w:w="120" w:type="dxa"/>
+              <w:bottom w:w="80" w:type="dxa"/>
+              <w:end w:w="120" w:type="dxa"/>
+            </w:tcMar>
+            <w:vAlign w:val="center"/>
+            <w:shd w:fill="FFFFFF"/>
+          </w:tcPr>
+          <w:p>
+            <w:pPr>
+              <w:spacing w:before="0" w:after="40" w:line="252" w:lineRule="auto"/>
+              <w:jc w:val="center"/>
+            </w:pPr>
+            <w:r>
+              <w:rPr>
+                <w:rFonts w:ascii="Calibri" w:hAnsi="Calibri"/>
+                <w:b w:val="0"/>
+                <w:color w:val="111827"/>
+                <w:sz w:val="17"/>
+              </w:rPr>
+              <w:t>Codec conflict</w:t>
+            </w:r>
+          </w:p>
+        </w:tc>
+        <w:tc>
+          <w:tcPr>
+            <w:tcW w:type="dxa" w:w="4450"/>
+            <w:tcMar>
+              <w:top w:w="80" w:type="dxa"/>
+              <w:start w:w="120" w:type="dxa"/>
+              <w:bottom w:w="80" w:type="dxa"/>
+              <w:end w:w="120" w:type="dxa"/>
+            </w:tcMar>
+            <w:vAlign w:val="center"/>
+            <w:shd w:fill="FFFFFF"/>
+          </w:tcPr>
+          <w:p>
+            <w:pPr>
+              <w:spacing w:before="0" w:after="40" w:line="252" w:lineRule="auto"/>
+              <w:jc w:val="left"/>
+            </w:pPr>
+            <w:r>
+              <w:rPr>
+                <w:rFonts w:ascii="Calibri" w:hAnsi="Calibri"/>
+                <w:b w:val="0"/>
+                <w:color w:val="111827"/>
+                <w:sz w:val="17"/>
+              </w:rPr>
+              <w:t>Reject changed command reuse with a stable error.</w:t>
+            </w:r>
+          </w:p>
+        </w:tc>
+        <w:tc>
+          <w:tcPr>
+            <w:tcW w:type="dxa" w:w="3260"/>
+            <w:tcMar>
+              <w:top w:w="80" w:type="dxa"/>
+              <w:start w:w="120" w:type="dxa"/>
+              <w:bottom w:w="80" w:type="dxa"/>
+              <w:end w:w="120" w:type="dxa"/>
+            </w:tcMar>
+            <w:vAlign w:val="center"/>
+            <w:shd w:fill="FFFFFF"/>
+          </w:tcPr>
+          <w:p>
+            <w:pPr>
+              <w:spacing w:before="0" w:after="40" w:line="252" w:lineRule="auto"/>
+              <w:jc w:val="left"/>
+            </w:pPr>
+            <w:r>
+              <w:rPr>
+                <w:rFonts w:ascii="Calibri" w:hAnsi="Calibri"/>
+                <w:b w:val="0"/>
+                <w:color w:val="111827"/>
+                <w:sz w:val="17"/>
+              </w:rPr>
+              <w:t>Service/API</w:t>
+            </w:r>
+          </w:p>
+        </w:tc>
+      </w:tr>
+      <w:tr>
+        <w:trPr>
+          <w:cantSplit/>
+        </w:trPr>
+        <w:tc>
+          <w:tcPr>
+            <w:tcW w:type="dxa" w:w="1650"/>
+            <w:tcMar>
+              <w:top w:w="80" w:type="dxa"/>
+              <w:start w:w="120" w:type="dxa"/>
+              <w:bottom w:w="80" w:type="dxa"/>
+              <w:end w:w="120" w:type="dxa"/>
+            </w:tcMar>
+            <w:vAlign w:val="center"/>
+            <w:shd w:fill="FFFFFF"/>
+          </w:tcPr>
+          <w:p>
+            <w:pPr>
+              <w:spacing w:before="0" w:after="40" w:line="252" w:lineRule="auto"/>
+              <w:jc w:val="center"/>
+            </w:pPr>
+            <w:r>
+              <w:rPr>
+                <w:rFonts w:ascii="Calibri" w:hAnsi="Calibri"/>
+                <w:b w:val="0"/>
+                <w:color w:val="111827"/>
+                <w:sz w:val="17"/>
+              </w:rPr>
+              <w:t>Codec concurrency</w:t>
+            </w:r>
+          </w:p>
+        </w:tc>
+        <w:tc>
+          <w:tcPr>
+            <w:tcW w:type="dxa" w:w="4450"/>
+            <w:tcMar>
+              <w:top w:w="80" w:type="dxa"/>
+              <w:start w:w="120" w:type="dxa"/>
+              <w:bottom w:w="80" w:type="dxa"/>
+              <w:end w:w="120" w:type="dxa"/>
+            </w:tcMar>
+            <w:vAlign w:val="center"/>
+            <w:shd w:fill="FFFFFF"/>
+          </w:tcPr>
+          <w:p>
+            <w:pPr>
+              <w:spacing w:before="0" w:after="40" w:line="252" w:lineRule="auto"/>
+              <w:jc w:val="left"/>
+            </w:pPr>
+            <w:r>
+              <w:rPr>
+                <w:rFonts w:ascii="Calibri" w:hAnsi="Calibri"/>
+                <w:b w:val="0"/>
+                <w:color w:val="111827"/>
+                <w:sz w:val="17"/>
+              </w:rPr>
+              <w:t>Serialize command identity checks on the network row.</w:t>
+            </w:r>
+          </w:p>
+        </w:tc>
+        <w:tc>
+          <w:tcPr>
+            <w:tcW w:type="dxa" w:w="3260"/>
+            <w:tcMar>
+              <w:top w:w="80" w:type="dxa"/>
+              <w:start w:w="120" w:type="dxa"/>
+              <w:bottom w:w="80" w:type="dxa"/>
+              <w:end w:w="120" w:type="dxa"/>
+            </w:tcMar>
+            <w:vAlign w:val="center"/>
+            <w:shd w:fill="FFFFFF"/>
+          </w:tcPr>
+          <w:p>
+            <w:pPr>
+              <w:spacing w:before="0" w:after="40" w:line="252" w:lineRule="auto"/>
+              <w:jc w:val="left"/>
+            </w:pPr>
+            <w:r>
+              <w:rPr>
+                <w:rFonts w:ascii="Calibri" w:hAnsi="Calibri"/>
+                <w:b w:val="0"/>
+                <w:color w:val="111827"/>
+                <w:sz w:val="17"/>
+              </w:rPr>
+              <w:t>Integration</w:t>
+            </w:r>
+          </w:p>
+        </w:tc>
+      </w:tr>
+      <w:tr>
+        <w:trPr>
+          <w:cantSplit/>
+        </w:trPr>
+        <w:tc>
+          <w:tcPr>
+            <w:tcW w:type="dxa" w:w="1650"/>
+            <w:tcMar>
+              <w:top w:w="80" w:type="dxa"/>
+              <w:start w:w="120" w:type="dxa"/>
+              <w:bottom w:w="80" w:type="dxa"/>
+              <w:end w:w="120" w:type="dxa"/>
+            </w:tcMar>
+            <w:vAlign w:val="center"/>
+            <w:shd w:fill="FFFFFF"/>
+          </w:tcPr>
+          <w:p>
+            <w:pPr>
+              <w:spacing w:before="0" w:after="40" w:line="252" w:lineRule="auto"/>
+              <w:jc w:val="center"/>
+            </w:pPr>
+            <w:r>
+              <w:rPr>
+                <w:rFonts w:ascii="Calibri" w:hAnsi="Calibri"/>
+                <w:b w:val="0"/>
+                <w:color w:val="111827"/>
+                <w:sz w:val="17"/>
+              </w:rPr>
+              <w:t>Codec minimization</w:t>
+            </w:r>
+          </w:p>
+        </w:tc>
+        <w:tc>
+          <w:tcPr>
+            <w:tcW w:type="dxa" w:w="4450"/>
+            <w:tcMar>
+              <w:top w:w="80" w:type="dxa"/>
+              <w:start w:w="120" w:type="dxa"/>
+              <w:bottom w:w="80" w:type="dxa"/>
+              <w:end w:w="120" w:type="dxa"/>
+            </w:tcMar>
+            <w:vAlign w:val="center"/>
+            <w:shd w:fill="FFFFFF"/>
+          </w:tcPr>
+          <w:p>
+            <w:pPr>
+              <w:spacing w:before="0" w:after="40" w:line="252" w:lineRule="auto"/>
+              <w:jc w:val="left"/>
+            </w:pPr>
+            <w:r>
+              <w:rPr>
+                <w:rFonts w:ascii="Calibri" w:hAnsi="Calibri"/>
+                <w:b w:val="0"/>
+                <w:color w:val="111827"/>
+                <w:sz w:val="17"/>
+              </w:rPr>
+              <w:t>Exclude payload and values from audit and events.</w:t>
+            </w:r>
+          </w:p>
+        </w:tc>
+        <w:tc>
+          <w:tcPr>
+            <w:tcW w:type="dxa" w:w="3260"/>
+            <w:tcMar>
+              <w:top w:w="80" w:type="dxa"/>
+              <w:start w:w="120" w:type="dxa"/>
+              <w:bottom w:w="80" w:type="dxa"/>
+              <w:end w:w="120" w:type="dxa"/>
+            </w:tcMar>
+            <w:vAlign w:val="center"/>
+            <w:shd w:fill="FFFFFF"/>
+          </w:tcPr>
+          <w:p>
+            <w:pPr>
+              <w:spacing w:before="0" w:after="40" w:line="252" w:lineRule="auto"/>
+              <w:jc w:val="left"/>
+            </w:pPr>
+            <w:r>
+              <w:rPr>
+                <w:rFonts w:ascii="Calibri" w:hAnsi="Calibri"/>
+                <w:b w:val="0"/>
+                <w:color w:val="111827"/>
+                <w:sz w:val="17"/>
+              </w:rPr>
+              <w:t>Service</w:t>
+            </w:r>
+          </w:p>
+        </w:tc>
+      </w:tr>
     </w:tbl>
     <w:p>
       <w:pPr>
@@ -6034,7 +8528,7 @@
           <w:color w:val="111827"/>
           <w:sz w:val="22"/>
         </w:rPr>
-        <w:t xml:space="preserve"> and </w:t>
+        <w:t xml:space="preserve">, </w:t>
       </w:r>
       <w:r>
         <w:rPr>
@@ -6043,6 +8537,22 @@
           <w:sz w:val="19"/>
         </w:rPr>
         <w:t>0025_can_arbitration</w:t>
+      </w:r>
+      <w:r>
+        <w:rPr>
+          <w:rFonts w:ascii="Calibri" w:hAnsi="Calibri"/>
+          <w:color w:val="111827"/>
+          <w:sz w:val="22"/>
+        </w:rPr>
+        <w:t xml:space="preserve">, and </w:t>
+      </w:r>
+      <w:r>
+        <w:rPr>
+          <w:rFonts w:ascii="Consolas" w:hAnsi="Consolas"/>
+          <w:color w:val="1F4D78"/>
+          <w:sz w:val="19"/>
+        </w:rPr>
+        <w:t>0026_can_dbc_codec</w:t>
       </w:r>
       <w:r>
         <w:rPr>
@@ -6099,10 +8609,8 @@
           <w:color w:val="111827"/>
           <w:sz w:val="22"/>
         </w:rPr>
-        <w:t>, and</w:t>
+        <w:t xml:space="preserve">, and </w:t>
       </w:r>
-    </w:p>
-    <w:p>
       <w:r>
         <w:rPr>
           <w:rFonts w:ascii="Consolas" w:hAnsi="Consolas"/>
@@ -6125,7 +8633,56 @@
         <w:pStyle w:val="ListBullet"/>
         <w:numPr>
           <w:ilvl w:val="0"/>
-          <w:numId w:val="14"/>
+          <w:numId w:val="13"/>
+        </w:numPr>
+      </w:pPr>
+      <w:r>
+        <w:rPr>
+          <w:rFonts w:ascii="Calibri" w:hAnsi="Calibri"/>
+          <w:color w:val="111827"/>
+          <w:sz w:val="22"/>
+        </w:rPr>
+        <w:t xml:space="preserve">DBC events are </w:t>
+      </w:r>
+      <w:r>
+        <w:rPr>
+          <w:rFonts w:ascii="Consolas" w:hAnsi="Consolas"/>
+          <w:color w:val="1F4D78"/>
+          <w:sz w:val="19"/>
+        </w:rPr>
+        <w:t>atep.can.dbc.catalogue.created.v1</w:t>
+      </w:r>
+      <w:r>
+        <w:rPr>
+          <w:rFonts w:ascii="Calibri" w:hAnsi="Calibri"/>
+          <w:color w:val="111827"/>
+          <w:sz w:val="22"/>
+        </w:rPr>
+        <w:t xml:space="preserve"> and </w:t>
+      </w:r>
+      <w:r>
+        <w:rPr>
+          <w:rFonts w:ascii="Consolas" w:hAnsi="Consolas"/>
+          <w:color w:val="1F4D78"/>
+          <w:sz w:val="19"/>
+        </w:rPr>
+        <w:t>atep.can.signal.codec.completed.v1</w:t>
+      </w:r>
+      <w:r>
+        <w:rPr>
+          <w:rFonts w:ascii="Calibri" w:hAnsi="Calibri"/>
+          <w:color w:val="111827"/>
+          <w:sz w:val="22"/>
+        </w:rPr>
+        <w:t>.</w:t>
+      </w:r>
+    </w:p>
+    <w:p>
+      <w:pPr>
+        <w:pStyle w:val="ListBullet"/>
+        <w:numPr>
+          <w:ilvl w:val="0"/>
+          <w:numId w:val="13"/>
         </w:numPr>
       </w:pPr>
       <w:r>
@@ -6174,7 +8731,7 @@
         <w:pStyle w:val="ListBullet"/>
         <w:numPr>
           <w:ilvl w:val="0"/>
-          <w:numId w:val="14"/>
+          <w:numId w:val="13"/>
         </w:numPr>
       </w:pPr>
       <w:r>
@@ -6183,17 +8740,7 @@
           <w:color w:val="111827"/>
           <w:sz w:val="22"/>
         </w:rPr>
-        <w:t>Automated tests cover validation, priority, timing mathematics, readiness, delivery, utilization,</w:t>
-      </w:r>
-    </w:p>
-    <w:p>
-      <w:r>
-        <w:rPr>
-          <w:rFonts w:ascii="Calibri" w:hAnsi="Calibri"/>
-          <w:color w:val="111827"/>
-          <w:sz w:val="22"/>
-        </w:rPr>
-        <w:t>versioning, replay, errors, evidence minimization, persistence, and OpenAPI.</w:t>
+        <w:t>Automated tests cover validation, priority, timing mathematics, readiness, delivery, utilization, versioning, replay, errors, DBC bit placement, signed scaling, exact conversion, evidence minimization, persistence, and OpenAPI.</w:t>
       </w:r>
     </w:p>
     <w:p>
@@ -6211,7 +8758,7 @@
         <w:pStyle w:val="ListBullet"/>
         <w:numPr>
           <w:ilvl w:val="0"/>
-          <w:numId w:val="15"/>
+          <w:numId w:val="14"/>
         </w:numPr>
       </w:pPr>
       <w:r>
@@ -6228,7 +8775,7 @@
         <w:pStyle w:val="ListBullet"/>
         <w:numPr>
           <w:ilvl w:val="0"/>
-          <w:numId w:val="15"/>
+          <w:numId w:val="14"/>
         </w:numPr>
       </w:pPr>
       <w:r>
@@ -6245,7 +8792,7 @@
         <w:pStyle w:val="ListBullet"/>
         <w:numPr>
           <w:ilvl w:val="0"/>
-          <w:numId w:val="15"/>
+          <w:numId w:val="14"/>
         </w:numPr>
       </w:pPr>
       <w:r>
@@ -6262,7 +8809,7 @@
         <w:pStyle w:val="ListBullet"/>
         <w:numPr>
           <w:ilvl w:val="0"/>
-          <w:numId w:val="15"/>
+          <w:numId w:val="14"/>
         </w:numPr>
       </w:pPr>
       <w:r>
@@ -6279,7 +8826,7 @@
         <w:pStyle w:val="ListBullet"/>
         <w:numPr>
           <w:ilvl w:val="0"/>
-          <w:numId w:val="15"/>
+          <w:numId w:val="14"/>
         </w:numPr>
       </w:pPr>
       <w:r>
@@ -6296,7 +8843,7 @@
         <w:pStyle w:val="ListBullet"/>
         <w:numPr>
           <w:ilvl w:val="0"/>
-          <w:numId w:val="15"/>
+          <w:numId w:val="14"/>
         </w:numPr>
       </w:pPr>
       <w:r>
@@ -6305,7 +8852,57 @@
           <w:color w:val="111827"/>
           <w:sz w:val="22"/>
         </w:rPr>
-        <w:t>No DBC adapter currently maps Volume III semantic values into payload bytes.</w:t>
+        <w:t xml:space="preserve">The catalogue is structured JSON; importing and exporting textual </w:t>
+      </w:r>
+      <w:r>
+        <w:rPr>
+          <w:rFonts w:ascii="Consolas" w:hAnsi="Consolas"/>
+          <w:color w:val="1F4D78"/>
+          <w:sz w:val="19"/>
+        </w:rPr>
+        <w:t>.dbc</w:t>
+      </w:r>
+      <w:r>
+        <w:rPr>
+          <w:rFonts w:ascii="Calibri" w:hAnsi="Calibri"/>
+          <w:color w:val="111827"/>
+          <w:sz w:val="22"/>
+        </w:rPr>
+        <w:t xml:space="preserve"> files remains future work.</w:t>
+      </w:r>
+    </w:p>
+    <w:p>
+      <w:pPr>
+        <w:pStyle w:val="ListBullet"/>
+        <w:numPr>
+          <w:ilvl w:val="0"/>
+          <w:numId w:val="14"/>
+        </w:numPr>
+      </w:pPr>
+      <w:r>
+        <w:rPr>
+          <w:rFonts w:ascii="Calibri" w:hAnsi="Calibri"/>
+          <w:color w:val="111827"/>
+          <w:sz w:val="22"/>
+        </w:rPr>
+        <w:t>Multiplexed signals, value tables, attributes, and comments are not yet represented.</w:t>
+      </w:r>
+    </w:p>
+    <w:p>
+      <w:pPr>
+        <w:pStyle w:val="ListBullet"/>
+        <w:numPr>
+          <w:ilvl w:val="0"/>
+          <w:numId w:val="14"/>
+        </w:numPr>
+      </w:pPr>
+      <w:r>
+        <w:rPr>
+          <w:rFonts w:ascii="Calibri" w:hAnsi="Calibri"/>
+          <w:color w:val="111827"/>
+          <w:sz w:val="22"/>
+        </w:rPr>
+        <w:t>Encoding produces evidence but does not automatically submit the frame to the simulated bus.</w:t>
       </w:r>
     </w:p>
     <w:p>
@@ -6325,7 +8922,7 @@
           <w:color w:val="111827"/>
           <w:sz w:val="22"/>
         </w:rPr>
-        <w:t xml:space="preserve">The recommended next increment is IV-3: a DBC catalogue with signal encoding/decoding, scaling, offsets, signed values, and byte order. See </w:t>
+        <w:t xml:space="preserve">The recommended next increment is IV-4: CAN FD payload and timing contracts with explicit nominal and data-phase bitrate plus mixed classic/FD compatibility. See </w:t>
       </w:r>
       <w:r>
         <w:rPr>
@@ -6359,7 +8956,7 @@
         <w:pStyle w:val="ListNumber"/>
         <w:numPr>
           <w:ilvl w:val="0"/>
-          <w:numId w:val="16"/>
+          <w:numId w:val="15"/>
         </w:numPr>
       </w:pPr>
       <w:r>
@@ -6376,7 +8973,7 @@
         <w:pStyle w:val="ListNumber"/>
         <w:numPr>
           <w:ilvl w:val="0"/>
-          <w:numId w:val="16"/>
+          <w:numId w:val="15"/>
         </w:numPr>
       </w:pPr>
       <w:r>
@@ -6393,7 +8990,7 @@
         <w:pStyle w:val="ListNumber"/>
         <w:numPr>
           <w:ilvl w:val="0"/>
-          <w:numId w:val="16"/>
+          <w:numId w:val="15"/>
         </w:numPr>
       </w:pPr>
       <w:r>
@@ -6410,7 +9007,7 @@
         <w:pStyle w:val="ListNumber"/>
         <w:numPr>
           <w:ilvl w:val="0"/>
-          <w:numId w:val="16"/>
+          <w:numId w:val="15"/>
         </w:numPr>
       </w:pPr>
       <w:r>
@@ -6427,7 +9024,7 @@
         <w:pStyle w:val="ListNumber"/>
         <w:numPr>
           <w:ilvl w:val="0"/>
-          <w:numId w:val="16"/>
+          <w:numId w:val="15"/>
         </w:numPr>
       </w:pPr>
       <w:r>
@@ -6444,7 +9041,7 @@
         <w:pStyle w:val="ListNumber"/>
         <w:numPr>
           <w:ilvl w:val="0"/>
-          <w:numId w:val="16"/>
+          <w:numId w:val="15"/>
         </w:numPr>
       </w:pPr>
       <w:r>
@@ -6461,7 +9058,7 @@
         <w:pStyle w:val="ListNumber"/>
         <w:numPr>
           <w:ilvl w:val="0"/>
-          <w:numId w:val="16"/>
+          <w:numId w:val="15"/>
         </w:numPr>
       </w:pPr>
       <w:r>
@@ -6510,7 +9107,7 @@
         <w:pStyle w:val="ListNumber"/>
         <w:numPr>
           <w:ilvl w:val="0"/>
-          <w:numId w:val="16"/>
+          <w:numId w:val="15"/>
         </w:numPr>
       </w:pPr>
       <w:r>
@@ -6527,7 +9124,7 @@
         <w:pStyle w:val="ListNumber"/>
         <w:numPr>
           <w:ilvl w:val="0"/>
-          <w:numId w:val="16"/>
+          <w:numId w:val="15"/>
         </w:numPr>
       </w:pPr>
       <w:r>
@@ -6592,7 +9189,7 @@
         <w:pStyle w:val="ListNumber"/>
         <w:numPr>
           <w:ilvl w:val="0"/>
-          <w:numId w:val="16"/>
+          <w:numId w:val="15"/>
         </w:numPr>
       </w:pPr>
       <w:r>
@@ -6609,7 +9206,7 @@
         <w:pStyle w:val="ListNumber"/>
         <w:numPr>
           <w:ilvl w:val="0"/>
-          <w:numId w:val="16"/>
+          <w:numId w:val="15"/>
         </w:numPr>
       </w:pPr>
       <w:r>
@@ -6626,7 +9223,7 @@
         <w:pStyle w:val="ListNumber"/>
         <w:numPr>
           <w:ilvl w:val="0"/>
-          <w:numId w:val="16"/>
+          <w:numId w:val="15"/>
         </w:numPr>
       </w:pPr>
       <w:r>
@@ -6643,7 +9240,7 @@
         <w:pStyle w:val="ListNumber"/>
         <w:numPr>
           <w:ilvl w:val="0"/>
-          <w:numId w:val="16"/>
+          <w:numId w:val="15"/>
         </w:numPr>
       </w:pPr>
       <w:r>
@@ -6660,7 +9257,7 @@
         <w:pStyle w:val="ListNumber"/>
         <w:numPr>
           <w:ilvl w:val="0"/>
-          <w:numId w:val="16"/>
+          <w:numId w:val="15"/>
         </w:numPr>
       </w:pPr>
       <w:r>
@@ -6677,7 +9274,7 @@
         <w:pStyle w:val="ListNumber"/>
         <w:numPr>
           <w:ilvl w:val="0"/>
-          <w:numId w:val="16"/>
+          <w:numId w:val="15"/>
         </w:numPr>
       </w:pPr>
       <w:r>
@@ -6694,7 +9291,7 @@
         <w:pStyle w:val="ListNumber"/>
         <w:numPr>
           <w:ilvl w:val="0"/>
-          <w:numId w:val="16"/>
+          <w:numId w:val="15"/>
         </w:numPr>
       </w:pPr>
       <w:r>
@@ -6704,6 +9301,206 @@
           <w:sz w:val="22"/>
         </w:rPr>
         <w:t>Design an acknowledgement-failure extension without changing the nominal IV-2 evidence.</w:t>
+      </w:r>
+    </w:p>
+    <w:p>
+      <w:pPr>
+        <w:pStyle w:val="ListNumber"/>
+        <w:numPr>
+          <w:ilvl w:val="0"/>
+          <w:numId w:val="15"/>
+        </w:numPr>
+      </w:pPr>
+      <w:r>
+        <w:rPr>
+          <w:rFonts w:ascii="Calibri" w:hAnsi="Calibri"/>
+          <w:color w:val="111827"/>
+          <w:sz w:val="22"/>
+        </w:rPr>
+        <w:t xml:space="preserve">Encode a 12-bit Intel value </w:t>
+      </w:r>
+      <w:r>
+        <w:rPr>
+          <w:rFonts w:ascii="Consolas" w:hAnsi="Consolas"/>
+          <w:color w:val="1F4D78"/>
+          <w:sz w:val="19"/>
+        </w:rPr>
+        <w:t>0xABC</w:t>
+      </w:r>
+      <w:r>
+        <w:rPr>
+          <w:rFonts w:ascii="Calibri" w:hAnsi="Calibri"/>
+          <w:color w:val="111827"/>
+          <w:sz w:val="22"/>
+        </w:rPr>
+        <w:t xml:space="preserve"> beginning at bit 0 and list the resulting bytes.</w:t>
+      </w:r>
+    </w:p>
+    <w:p>
+      <w:pPr>
+        <w:pStyle w:val="ListNumber"/>
+        <w:numPr>
+          <w:ilvl w:val="0"/>
+          <w:numId w:val="15"/>
+        </w:numPr>
+      </w:pPr>
+      <w:r>
+        <w:rPr>
+          <w:rFonts w:ascii="Calibri" w:hAnsi="Calibri"/>
+          <w:color w:val="111827"/>
+          <w:sz w:val="22"/>
+        </w:rPr>
+        <w:t>Trace a 12-bit Motorola value beginning at bit 7 through sawtooth bit positions.</w:t>
+      </w:r>
+    </w:p>
+    <w:p>
+      <w:pPr>
+        <w:pStyle w:val="ListNumber"/>
+        <w:numPr>
+          <w:ilvl w:val="0"/>
+          <w:numId w:val="15"/>
+        </w:numPr>
+      </w:pPr>
+      <w:r>
+        <w:rPr>
+          <w:rFonts w:ascii="Calibri" w:hAnsi="Calibri"/>
+          <w:color w:val="111827"/>
+          <w:sz w:val="22"/>
+        </w:rPr>
+        <w:t>Explain how two's-complement decoding reconstructs a negative raw value.</w:t>
+      </w:r>
+    </w:p>
+    <w:p>
+      <w:pPr>
+        <w:pStyle w:val="ListNumber"/>
+        <w:numPr>
+          <w:ilvl w:val="0"/>
+          <w:numId w:val="15"/>
+        </w:numPr>
+      </w:pPr>
+      <w:r>
+        <w:rPr>
+          <w:rFonts w:ascii="Calibri" w:hAnsi="Calibri"/>
+          <w:color w:val="111827"/>
+          <w:sz w:val="22"/>
+        </w:rPr>
+        <w:t xml:space="preserve">Prove why </w:t>
+      </w:r>
+      <w:r>
+        <w:rPr>
+          <w:rFonts w:ascii="Consolas" w:hAnsi="Consolas"/>
+          <w:color w:val="1F4D78"/>
+          <w:sz w:val="19"/>
+        </w:rPr>
+        <w:t>300.05</w:t>
+      </w:r>
+      <w:r>
+        <w:rPr>
+          <w:rFonts w:ascii="Calibri" w:hAnsi="Calibri"/>
+          <w:color w:val="111827"/>
+          <w:sz w:val="22"/>
+        </w:rPr>
+        <w:t xml:space="preserve"> is not representable when factor is </w:t>
+      </w:r>
+      <w:r>
+        <w:rPr>
+          <w:rFonts w:ascii="Consolas" w:hAnsi="Consolas"/>
+          <w:color w:val="1F4D78"/>
+          <w:sz w:val="19"/>
+        </w:rPr>
+        <w:t>0.1</w:t>
+      </w:r>
+      <w:r>
+        <w:rPr>
+          <w:rFonts w:ascii="Calibri" w:hAnsi="Calibri"/>
+          <w:color w:val="111827"/>
+          <w:sz w:val="22"/>
+        </w:rPr>
+        <w:t xml:space="preserve"> and offset is zero.</w:t>
+      </w:r>
+    </w:p>
+    <w:p>
+      <w:pPr>
+        <w:pStyle w:val="ListNumber"/>
+        <w:numPr>
+          <w:ilvl w:val="0"/>
+          <w:numId w:val="15"/>
+        </w:numPr>
+      </w:pPr>
+      <w:r>
+        <w:rPr>
+          <w:rFonts w:ascii="Calibri" w:hAnsi="Calibri"/>
+          <w:color w:val="111827"/>
+          <w:sz w:val="22"/>
+        </w:rPr>
+        <w:t>Explain why DBC messages reference frame contracts instead of repeating their metadata.</w:t>
+      </w:r>
+    </w:p>
+    <w:p>
+      <w:pPr>
+        <w:pStyle w:val="ListNumber"/>
+        <w:numPr>
+          <w:ilvl w:val="0"/>
+          <w:numId w:val="15"/>
+        </w:numPr>
+      </w:pPr>
+      <w:r>
+        <w:rPr>
+          <w:rFonts w:ascii="Calibri" w:hAnsi="Calibri"/>
+          <w:color w:val="111827"/>
+          <w:sz w:val="22"/>
+        </w:rPr>
+        <w:t>Design a test that detects overlap between one Intel and one Motorola signal.</w:t>
+      </w:r>
+    </w:p>
+    <w:p>
+      <w:pPr>
+        <w:pStyle w:val="ListNumber"/>
+        <w:numPr>
+          <w:ilvl w:val="0"/>
+          <w:numId w:val="15"/>
+        </w:numPr>
+      </w:pPr>
+      <w:r>
+        <w:rPr>
+          <w:rFonts w:ascii="Calibri" w:hAnsi="Calibri"/>
+          <w:color w:val="111827"/>
+          <w:sz w:val="22"/>
+        </w:rPr>
+        <w:t>Trace encode evidence into a later arbitration command without coupling the two operations.</w:t>
+      </w:r>
+    </w:p>
+    <w:p>
+      <w:pPr>
+        <w:pStyle w:val="ListNumber"/>
+        <w:numPr>
+          <w:ilvl w:val="0"/>
+          <w:numId w:val="15"/>
+        </w:numPr>
+      </w:pPr>
+      <w:r>
+        <w:rPr>
+          <w:rFonts w:ascii="Calibri" w:hAnsi="Calibri"/>
+          <w:color w:val="111827"/>
+          <w:sz w:val="22"/>
+        </w:rPr>
+        <w:t xml:space="preserve">Propose a backward-compatible textual </w:t>
+      </w:r>
+      <w:r>
+        <w:rPr>
+          <w:rFonts w:ascii="Consolas" w:hAnsi="Consolas"/>
+          <w:color w:val="1F4D78"/>
+          <w:sz w:val="19"/>
+        </w:rPr>
+        <w:t>.dbc</w:t>
+      </w:r>
+      <w:r>
+        <w:rPr>
+          <w:rFonts w:ascii="Calibri" w:hAnsi="Calibri"/>
+          <w:color w:val="111827"/>
+          <w:sz w:val="22"/>
+        </w:rPr>
+        <w:t xml:space="preserve"> import boundary.</w:t>
       </w:r>
     </w:p>
     <w:sectPr>
@@ -6735,7 +9532,7 @@
         <w:color w:val="667085"/>
         <w:sz w:val="17"/>
       </w:rPr>
-      <w:t>ATEP Volume IV Workbook  |  Version 0.2.0</w:t>
+      <w:t>ATEP Volume IV Workbook  |  Version 0.3.0</w:t>
     </w:r>
     <w:r>
       <w:rPr>
@@ -7047,12 +9844,6 @@
     </w:lvlOverride>
   </w:num>
   <w:num w:numId="15">
-    <w:abstractNumId w:val="10"/>
-    <w:lvlOverride w:ilvl="0">
-      <w:startOverride w:val="1"/>
-    </w:lvlOverride>
-  </w:num>
-  <w:num w:numId="16">
     <w:abstractNumId w:val="9"/>
     <w:lvlOverride w:ilvl="0">
       <w:startOverride w:val="1"/>

</xml_diff>

<commit_message>
feat(can): add deterministic DBC signal codec (#59)
</commit_message>
<xml_diff>
--- a/docs/ATEP_Volume_IV_CAN_Network_Engineering_Workbook.docx
+++ b/docs/ATEP_Volume_IV_CAN_Network_Engineering_Workbook.docx
@@ -143,7 +143,7 @@
                 <w:color w:val="0B2545"/>
                 <w:sz w:val="19"/>
               </w:rPr>
-              <w:t>0.2.0</w:t>
+              <w:t>0.3.0</w:t>
             </w:r>
           </w:p>
         </w:tc>
@@ -265,7 +265,7 @@
                 <w:color w:val="111827"/>
                 <w:sz w:val="19"/>
               </w:rPr>
-              <w:t>Increments IV-1 and IV-2 implemented</w:t>
+              <w:t>Increments IV-1 through IV-3 implemented</w:t>
             </w:r>
           </w:p>
         </w:tc>
@@ -893,7 +893,7 @@
                 <w:color w:val="111827"/>
                 <w:sz w:val="17"/>
               </w:rPr>
-              <w:t>Increments IV-1 and IV-2</w:t>
+              <w:t>Increments IV-1 through IV-3</w:t>
             </w:r>
           </w:p>
         </w:tc>
@@ -1386,6 +1386,95 @@
           </w:p>
         </w:tc>
       </w:tr>
+      <w:tr>
+        <w:trPr>
+          <w:cantSplit/>
+        </w:trPr>
+        <w:tc>
+          <w:tcPr>
+            <w:tcW w:type="dxa" w:w="1650"/>
+            <w:tcMar>
+              <w:top w:w="80" w:type="dxa"/>
+              <w:start w:w="120" w:type="dxa"/>
+              <w:bottom w:w="80" w:type="dxa"/>
+              <w:end w:w="120" w:type="dxa"/>
+            </w:tcMar>
+            <w:vAlign w:val="center"/>
+            <w:shd w:fill="FFFFFF"/>
+          </w:tcPr>
+          <w:p>
+            <w:pPr>
+              <w:spacing w:before="0" w:after="40" w:line="252" w:lineRule="auto"/>
+              <w:jc w:val="center"/>
+            </w:pPr>
+            <w:r>
+              <w:rPr>
+                <w:rFonts w:ascii="Calibri" w:hAnsi="Calibri"/>
+                <w:b w:val="0"/>
+                <w:color w:val="111827"/>
+                <w:sz w:val="17"/>
+              </w:rPr>
+              <w:t>0.3.0</w:t>
+            </w:r>
+          </w:p>
+        </w:tc>
+        <w:tc>
+          <w:tcPr>
+            <w:tcW w:type="dxa" w:w="4450"/>
+            <w:tcMar>
+              <w:top w:w="80" w:type="dxa"/>
+              <w:start w:w="120" w:type="dxa"/>
+              <w:bottom w:w="80" w:type="dxa"/>
+              <w:end w:w="120" w:type="dxa"/>
+            </w:tcMar>
+            <w:vAlign w:val="center"/>
+            <w:shd w:fill="FFFFFF"/>
+          </w:tcPr>
+          <w:p>
+            <w:pPr>
+              <w:spacing w:before="0" w:after="40" w:line="252" w:lineRule="auto"/>
+              <w:jc w:val="left"/>
+            </w:pPr>
+            <w:r>
+              <w:rPr>
+                <w:rFonts w:ascii="Calibri" w:hAnsi="Calibri"/>
+                <w:b w:val="0"/>
+                <w:color w:val="111827"/>
+                <w:sz w:val="17"/>
+              </w:rPr>
+              <w:t>2026-08-24</w:t>
+            </w:r>
+          </w:p>
+        </w:tc>
+        <w:tc>
+          <w:tcPr>
+            <w:tcW w:type="dxa" w:w="3260"/>
+            <w:tcMar>
+              <w:top w:w="80" w:type="dxa"/>
+              <w:start w:w="120" w:type="dxa"/>
+              <w:bottom w:w="80" w:type="dxa"/>
+              <w:end w:w="120" w:type="dxa"/>
+            </w:tcMar>
+            <w:vAlign w:val="center"/>
+            <w:shd w:fill="FFFFFF"/>
+          </w:tcPr>
+          <w:p>
+            <w:pPr>
+              <w:spacing w:before="0" w:after="40" w:line="252" w:lineRule="auto"/>
+              <w:jc w:val="left"/>
+            </w:pPr>
+            <w:r>
+              <w:rPr>
+                <w:rFonts w:ascii="Calibri" w:hAnsi="Calibri"/>
+                <w:b w:val="0"/>
+                <w:color w:val="111827"/>
+                <w:sz w:val="17"/>
+              </w:rPr>
+              <w:t>Added structured DBC catalogues, Intel/Motorola signal placement, exact decimal scaling, signed codec evidence, APIs, migration, and tests.</w:t>
+            </w:r>
+          </w:p>
+        </w:tc>
+      </w:tr>
     </w:tbl>
     <w:p>
       <w:pPr>
@@ -1618,6 +1707,57 @@
     </w:p>
     <w:p>
       <w:pPr>
+        <w:pStyle w:val="ListBullet"/>
+        <w:numPr>
+          <w:ilvl w:val="0"/>
+          <w:numId w:val="11"/>
+        </w:numPr>
+      </w:pPr>
+      <w:r>
+        <w:rPr>
+          <w:rFonts w:ascii="Calibri" w:hAnsi="Calibri"/>
+          <w:color w:val="111827"/>
+          <w:sz w:val="22"/>
+        </w:rPr>
+        <w:t>One structured DBC catalogue mapped to existing frame contracts.</w:t>
+      </w:r>
+    </w:p>
+    <w:p>
+      <w:pPr>
+        <w:pStyle w:val="ListBullet"/>
+        <w:numPr>
+          <w:ilvl w:val="0"/>
+          <w:numId w:val="11"/>
+        </w:numPr>
+      </w:pPr>
+      <w:r>
+        <w:rPr>
+          <w:rFonts w:ascii="Calibri" w:hAnsi="Calibri"/>
+          <w:color w:val="111827"/>
+          <w:sz w:val="22"/>
+        </w:rPr>
+        <w:t>Exact signal encode/decode with Intel and Motorola byte order, signedness, scaling, and offsets.</w:t>
+      </w:r>
+    </w:p>
+    <w:p>
+      <w:pPr>
+        <w:pStyle w:val="ListBullet"/>
+        <w:numPr>
+          <w:ilvl w:val="0"/>
+          <w:numId w:val="11"/>
+        </w:numPr>
+      </w:pPr>
+      <w:r>
+        <w:rPr>
+          <w:rFonts w:ascii="Calibri" w:hAnsi="Calibri"/>
+          <w:color w:val="111827"/>
+          <w:sz w:val="22"/>
+        </w:rPr>
+        <w:t>Replay-safe codec evidence with payload-free audit and outbox metrics.</w:t>
+      </w:r>
+    </w:p>
+    <w:p>
+      <w:pPr>
         <w:pStyle w:val="Heading2"/>
         <w:keepNext/>
         <w:keepLines/>
@@ -1657,7 +1797,23 @@
           <w:color w:val="111827"/>
           <w:sz w:val="22"/>
         </w:rPr>
-        <w:t>DBC parsing, scaling, byte order, multiplexing, and semantic-signal encoding.</w:t>
+        <w:t xml:space="preserve">Textual </w:t>
+      </w:r>
+      <w:r>
+        <w:rPr>
+          <w:rFonts w:ascii="Consolas" w:hAnsi="Consolas"/>
+          <w:color w:val="1F4D78"/>
+          <w:sz w:val="19"/>
+        </w:rPr>
+        <w:t>.dbc</w:t>
+      </w:r>
+      <w:r>
+        <w:rPr>
+          <w:rFonts w:ascii="Calibri" w:hAnsi="Calibri"/>
+          <w:color w:val="111827"/>
+          <w:sz w:val="22"/>
+        </w:rPr>
+        <w:t xml:space="preserve"> parsing, attributes, value tables, comments, and multiplexing.</w:t>
       </w:r>
     </w:p>
     <w:p>
@@ -1754,7 +1910,7 @@
           <w:color w:val="111827"/>
           <w:sz w:val="22"/>
         </w:rPr>
-        <w:t>Request flow: authenticated client -&gt; FastAPI router -&gt; CAN RBAC dependency -&gt; vehicle lookup -&gt; CAN domain/arbitration service -&gt; PostgreSQL aggregate/evidence + audit + transactional outbox -&gt; response.</w:t>
+        <w:t>Request flow: authenticated client -&gt; FastAPI router -&gt; CAN RBAC dependency -&gt; vehicle lookup -&gt; CAN domain/arbitration/DBC service -&gt; PostgreSQL aggregate/evidence + audit + transactional outbox -&gt; response.</w:t>
       </w:r>
     </w:p>
     <w:p>
@@ -1817,6 +1973,40 @@
           <w:sz w:val="22"/>
         </w:rPr>
         <w:t xml:space="preserve"> stores the canonical batch request, ordered result, contender count, aggregate versions, requesting actor, and timestamps. Each winner also creates normal transmission evidence so history remains coherent across individual and arbitrated sends.</w:t>
+      </w:r>
+    </w:p>
+    <w:p>
+      <w:r>
+        <w:rPr>
+          <w:rFonts w:ascii="Consolas" w:hAnsi="Consolas"/>
+          <w:color w:val="1F4D78"/>
+          <w:sz w:val="19"/>
+        </w:rPr>
+        <w:t>CanDbcCatalogue</w:t>
+      </w:r>
+      <w:r>
+        <w:rPr>
+          <w:rFonts w:ascii="Calibri" w:hAnsi="Calibri"/>
+          <w:color w:val="111827"/>
+          <w:sz w:val="22"/>
+        </w:rPr>
+        <w:t xml:space="preserve"> stores bounded structured messages and signals for one network. Each message references a frame contract rather than duplicating ID, DLC, producer, or consumers. </w:t>
+      </w:r>
+      <w:r>
+        <w:rPr>
+          <w:rFonts w:ascii="Consolas" w:hAnsi="Consolas"/>
+          <w:color w:val="1F4D78"/>
+          <w:sz w:val="19"/>
+        </w:rPr>
+        <w:t>CanSignalCodecExecution</w:t>
+      </w:r>
+      <w:r>
+        <w:rPr>
+          <w:rFonts w:ascii="Calibri" w:hAnsi="Calibri"/>
+          <w:color w:val="111827"/>
+          <w:sz w:val="22"/>
+        </w:rPr>
+        <w:t xml:space="preserve"> stores the canonical encode/decode request and deterministic payload, raw, and physical result for exact replay.</w:t>
       </w:r>
     </w:p>
     <w:p>
@@ -2798,6 +2988,708 @@
           </w:p>
         </w:tc>
       </w:tr>
+      <w:tr>
+        <w:trPr>
+          <w:cantSplit/>
+        </w:trPr>
+        <w:tc>
+          <w:tcPr>
+            <w:tcW w:type="dxa" w:w="1150"/>
+            <w:tcMar>
+              <w:top w:w="80" w:type="dxa"/>
+              <w:start w:w="120" w:type="dxa"/>
+              <w:bottom w:w="80" w:type="dxa"/>
+              <w:end w:w="120" w:type="dxa"/>
+            </w:tcMar>
+            <w:vAlign w:val="center"/>
+            <w:shd w:fill="FFFFFF"/>
+          </w:tcPr>
+          <w:p>
+            <w:pPr>
+              <w:spacing w:before="0" w:after="40" w:line="252" w:lineRule="auto"/>
+              <w:jc w:val="center"/>
+            </w:pPr>
+            <w:r>
+              <w:rPr>
+                <w:rFonts w:ascii="Calibri" w:hAnsi="Calibri"/>
+                <w:b w:val="0"/>
+                <w:color w:val="111827"/>
+                <w:sz w:val="16"/>
+              </w:rPr>
+              <w:t>POST</w:t>
+            </w:r>
+          </w:p>
+        </w:tc>
+        <w:tc>
+          <w:tcPr>
+            <w:tcW w:type="dxa" w:w="3700"/>
+            <w:tcMar>
+              <w:top w:w="80" w:type="dxa"/>
+              <w:start w:w="120" w:type="dxa"/>
+              <w:bottom w:w="80" w:type="dxa"/>
+              <w:end w:w="120" w:type="dxa"/>
+            </w:tcMar>
+            <w:vAlign w:val="center"/>
+            <w:shd w:fill="FFFFFF"/>
+          </w:tcPr>
+          <w:p>
+            <w:pPr>
+              <w:spacing w:before="0" w:after="40" w:line="252" w:lineRule="auto"/>
+              <w:jc w:val="left"/>
+            </w:pPr>
+            <w:r>
+              <w:rPr>
+                <w:rFonts w:ascii="Calibri" w:hAnsi="Calibri"/>
+                <w:b w:val="0"/>
+                <w:color w:val="111827"/>
+                <w:sz w:val="16"/>
+              </w:rPr>
+              <w:t>/api/v1/vehicles/{vehicle_id}/can-networks/dbc-catalogues</w:t>
+            </w:r>
+          </w:p>
+        </w:tc>
+        <w:tc>
+          <w:tcPr>
+            <w:tcW w:type="dxa" w:w="3100"/>
+            <w:tcMar>
+              <w:top w:w="80" w:type="dxa"/>
+              <w:start w:w="120" w:type="dxa"/>
+              <w:bottom w:w="80" w:type="dxa"/>
+              <w:end w:w="120" w:type="dxa"/>
+            </w:tcMar>
+            <w:vAlign w:val="center"/>
+            <w:shd w:fill="FFFFFF"/>
+          </w:tcPr>
+          <w:p>
+            <w:pPr>
+              <w:spacing w:before="0" w:after="40" w:line="252" w:lineRule="auto"/>
+              <w:jc w:val="left"/>
+            </w:pPr>
+            <w:r>
+              <w:rPr>
+                <w:rFonts w:ascii="Calibri" w:hAnsi="Calibri"/>
+                <w:b w:val="0"/>
+                <w:color w:val="111827"/>
+                <w:sz w:val="16"/>
+              </w:rPr>
+              <w:t>can_networks:manage</w:t>
+            </w:r>
+          </w:p>
+        </w:tc>
+        <w:tc>
+          <w:tcPr>
+            <w:tcW w:type="dxa" w:w="1410"/>
+            <w:tcMar>
+              <w:top w:w="80" w:type="dxa"/>
+              <w:start w:w="120" w:type="dxa"/>
+              <w:bottom w:w="80" w:type="dxa"/>
+              <w:end w:w="120" w:type="dxa"/>
+            </w:tcMar>
+            <w:vAlign w:val="center"/>
+            <w:shd w:fill="FFFFFF"/>
+          </w:tcPr>
+          <w:p>
+            <w:pPr>
+              <w:spacing w:before="0" w:after="40" w:line="252" w:lineRule="auto"/>
+              <w:jc w:val="left"/>
+            </w:pPr>
+            <w:r>
+              <w:rPr>
+                <w:rFonts w:ascii="Calibri" w:hAnsi="Calibri"/>
+                <w:b w:val="0"/>
+                <w:color w:val="111827"/>
+                <w:sz w:val="16"/>
+              </w:rPr>
+              <w:t>Create the structured DBC catalogue.</w:t>
+            </w:r>
+          </w:p>
+        </w:tc>
+      </w:tr>
+      <w:tr>
+        <w:trPr>
+          <w:cantSplit/>
+        </w:trPr>
+        <w:tc>
+          <w:tcPr>
+            <w:tcW w:type="dxa" w:w="1150"/>
+            <w:tcMar>
+              <w:top w:w="80" w:type="dxa"/>
+              <w:start w:w="120" w:type="dxa"/>
+              <w:bottom w:w="80" w:type="dxa"/>
+              <w:end w:w="120" w:type="dxa"/>
+            </w:tcMar>
+            <w:vAlign w:val="center"/>
+            <w:shd w:fill="FFFFFF"/>
+          </w:tcPr>
+          <w:p>
+            <w:pPr>
+              <w:spacing w:before="0" w:after="40" w:line="252" w:lineRule="auto"/>
+              <w:jc w:val="center"/>
+            </w:pPr>
+            <w:r>
+              <w:rPr>
+                <w:rFonts w:ascii="Calibri" w:hAnsi="Calibri"/>
+                <w:b w:val="0"/>
+                <w:color w:val="111827"/>
+                <w:sz w:val="16"/>
+              </w:rPr>
+              <w:t>GET</w:t>
+            </w:r>
+          </w:p>
+        </w:tc>
+        <w:tc>
+          <w:tcPr>
+            <w:tcW w:type="dxa" w:w="3700"/>
+            <w:tcMar>
+              <w:top w:w="80" w:type="dxa"/>
+              <w:start w:w="120" w:type="dxa"/>
+              <w:bottom w:w="80" w:type="dxa"/>
+              <w:end w:w="120" w:type="dxa"/>
+            </w:tcMar>
+            <w:vAlign w:val="center"/>
+            <w:shd w:fill="FFFFFF"/>
+          </w:tcPr>
+          <w:p>
+            <w:pPr>
+              <w:spacing w:before="0" w:after="40" w:line="252" w:lineRule="auto"/>
+              <w:jc w:val="left"/>
+            </w:pPr>
+            <w:r>
+              <w:rPr>
+                <w:rFonts w:ascii="Calibri" w:hAnsi="Calibri"/>
+                <w:b w:val="0"/>
+                <w:color w:val="111827"/>
+                <w:sz w:val="16"/>
+              </w:rPr>
+              <w:t>/api/v1/vehicles/{vehicle_id}/can-networks/dbc-catalogues</w:t>
+            </w:r>
+          </w:p>
+        </w:tc>
+        <w:tc>
+          <w:tcPr>
+            <w:tcW w:type="dxa" w:w="3100"/>
+            <w:tcMar>
+              <w:top w:w="80" w:type="dxa"/>
+              <w:start w:w="120" w:type="dxa"/>
+              <w:bottom w:w="80" w:type="dxa"/>
+              <w:end w:w="120" w:type="dxa"/>
+            </w:tcMar>
+            <w:vAlign w:val="center"/>
+            <w:shd w:fill="FFFFFF"/>
+          </w:tcPr>
+          <w:p>
+            <w:pPr>
+              <w:spacing w:before="0" w:after="40" w:line="252" w:lineRule="auto"/>
+              <w:jc w:val="left"/>
+            </w:pPr>
+            <w:r>
+              <w:rPr>
+                <w:rFonts w:ascii="Calibri" w:hAnsi="Calibri"/>
+                <w:b w:val="0"/>
+                <w:color w:val="111827"/>
+                <w:sz w:val="16"/>
+              </w:rPr>
+              <w:t>can_networks:read</w:t>
+            </w:r>
+          </w:p>
+        </w:tc>
+        <w:tc>
+          <w:tcPr>
+            <w:tcW w:type="dxa" w:w="1410"/>
+            <w:tcMar>
+              <w:top w:w="80" w:type="dxa"/>
+              <w:start w:w="120" w:type="dxa"/>
+              <w:bottom w:w="80" w:type="dxa"/>
+              <w:end w:w="120" w:type="dxa"/>
+            </w:tcMar>
+            <w:vAlign w:val="center"/>
+            <w:shd w:fill="FFFFFF"/>
+          </w:tcPr>
+          <w:p>
+            <w:pPr>
+              <w:spacing w:before="0" w:after="40" w:line="252" w:lineRule="auto"/>
+              <w:jc w:val="left"/>
+            </w:pPr>
+            <w:r>
+              <w:rPr>
+                <w:rFonts w:ascii="Calibri" w:hAnsi="Calibri"/>
+                <w:b w:val="0"/>
+                <w:color w:val="111827"/>
+                <w:sz w:val="16"/>
+              </w:rPr>
+              <w:t>Retrieve the DBC catalogue.</w:t>
+            </w:r>
+          </w:p>
+        </w:tc>
+      </w:tr>
+      <w:tr>
+        <w:trPr>
+          <w:cantSplit/>
+        </w:trPr>
+        <w:tc>
+          <w:tcPr>
+            <w:tcW w:type="dxa" w:w="1150"/>
+            <w:tcMar>
+              <w:top w:w="80" w:type="dxa"/>
+              <w:start w:w="120" w:type="dxa"/>
+              <w:bottom w:w="80" w:type="dxa"/>
+              <w:end w:w="120" w:type="dxa"/>
+            </w:tcMar>
+            <w:vAlign w:val="center"/>
+            <w:shd w:fill="FFFFFF"/>
+          </w:tcPr>
+          <w:p>
+            <w:pPr>
+              <w:spacing w:before="0" w:after="40" w:line="252" w:lineRule="auto"/>
+              <w:jc w:val="center"/>
+            </w:pPr>
+            <w:r>
+              <w:rPr>
+                <w:rFonts w:ascii="Calibri" w:hAnsi="Calibri"/>
+                <w:b w:val="0"/>
+                <w:color w:val="111827"/>
+                <w:sz w:val="16"/>
+              </w:rPr>
+              <w:t>POST</w:t>
+            </w:r>
+          </w:p>
+        </w:tc>
+        <w:tc>
+          <w:tcPr>
+            <w:tcW w:type="dxa" w:w="3700"/>
+            <w:tcMar>
+              <w:top w:w="80" w:type="dxa"/>
+              <w:start w:w="120" w:type="dxa"/>
+              <w:bottom w:w="80" w:type="dxa"/>
+              <w:end w:w="120" w:type="dxa"/>
+            </w:tcMar>
+            <w:vAlign w:val="center"/>
+            <w:shd w:fill="FFFFFF"/>
+          </w:tcPr>
+          <w:p>
+            <w:pPr>
+              <w:spacing w:before="0" w:after="40" w:line="252" w:lineRule="auto"/>
+              <w:jc w:val="left"/>
+            </w:pPr>
+            <w:r>
+              <w:rPr>
+                <w:rFonts w:ascii="Calibri" w:hAnsi="Calibri"/>
+                <w:b w:val="0"/>
+                <w:color w:val="111827"/>
+                <w:sz w:val="16"/>
+              </w:rPr>
+              <w:t>/api/v1/vehicles/{vehicle_id}/can-networks/dbc/encode</w:t>
+            </w:r>
+          </w:p>
+        </w:tc>
+        <w:tc>
+          <w:tcPr>
+            <w:tcW w:type="dxa" w:w="3100"/>
+            <w:tcMar>
+              <w:top w:w="80" w:type="dxa"/>
+              <w:start w:w="120" w:type="dxa"/>
+              <w:bottom w:w="80" w:type="dxa"/>
+              <w:end w:w="120" w:type="dxa"/>
+            </w:tcMar>
+            <w:vAlign w:val="center"/>
+            <w:shd w:fill="FFFFFF"/>
+          </w:tcPr>
+          <w:p>
+            <w:pPr>
+              <w:spacing w:before="0" w:after="40" w:line="252" w:lineRule="auto"/>
+              <w:jc w:val="left"/>
+            </w:pPr>
+            <w:r>
+              <w:rPr>
+                <w:rFonts w:ascii="Calibri" w:hAnsi="Calibri"/>
+                <w:b w:val="0"/>
+                <w:color w:val="111827"/>
+                <w:sz w:val="16"/>
+              </w:rPr>
+              <w:t>can_networks:manage</w:t>
+            </w:r>
+          </w:p>
+        </w:tc>
+        <w:tc>
+          <w:tcPr>
+            <w:tcW w:type="dxa" w:w="1410"/>
+            <w:tcMar>
+              <w:top w:w="80" w:type="dxa"/>
+              <w:start w:w="120" w:type="dxa"/>
+              <w:bottom w:w="80" w:type="dxa"/>
+              <w:end w:w="120" w:type="dxa"/>
+            </w:tcMar>
+            <w:vAlign w:val="center"/>
+            <w:shd w:fill="FFFFFF"/>
+          </w:tcPr>
+          <w:p>
+            <w:pPr>
+              <w:spacing w:before="0" w:after="40" w:line="252" w:lineRule="auto"/>
+              <w:jc w:val="left"/>
+            </w:pPr>
+            <w:r>
+              <w:rPr>
+                <w:rFonts w:ascii="Calibri" w:hAnsi="Calibri"/>
+                <w:b w:val="0"/>
+                <w:color w:val="111827"/>
+                <w:sz w:val="16"/>
+              </w:rPr>
+              <w:t>Encode physical values into payload bytes.</w:t>
+            </w:r>
+          </w:p>
+        </w:tc>
+      </w:tr>
+      <w:tr>
+        <w:trPr>
+          <w:cantSplit/>
+        </w:trPr>
+        <w:tc>
+          <w:tcPr>
+            <w:tcW w:type="dxa" w:w="1150"/>
+            <w:tcMar>
+              <w:top w:w="80" w:type="dxa"/>
+              <w:start w:w="120" w:type="dxa"/>
+              <w:bottom w:w="80" w:type="dxa"/>
+              <w:end w:w="120" w:type="dxa"/>
+            </w:tcMar>
+            <w:vAlign w:val="center"/>
+            <w:shd w:fill="FFFFFF"/>
+          </w:tcPr>
+          <w:p>
+            <w:pPr>
+              <w:spacing w:before="0" w:after="40" w:line="252" w:lineRule="auto"/>
+              <w:jc w:val="center"/>
+            </w:pPr>
+            <w:r>
+              <w:rPr>
+                <w:rFonts w:ascii="Calibri" w:hAnsi="Calibri"/>
+                <w:b w:val="0"/>
+                <w:color w:val="111827"/>
+                <w:sz w:val="16"/>
+              </w:rPr>
+              <w:t>POST</w:t>
+            </w:r>
+          </w:p>
+        </w:tc>
+        <w:tc>
+          <w:tcPr>
+            <w:tcW w:type="dxa" w:w="3700"/>
+            <w:tcMar>
+              <w:top w:w="80" w:type="dxa"/>
+              <w:start w:w="120" w:type="dxa"/>
+              <w:bottom w:w="80" w:type="dxa"/>
+              <w:end w:w="120" w:type="dxa"/>
+            </w:tcMar>
+            <w:vAlign w:val="center"/>
+            <w:shd w:fill="FFFFFF"/>
+          </w:tcPr>
+          <w:p>
+            <w:pPr>
+              <w:spacing w:before="0" w:after="40" w:line="252" w:lineRule="auto"/>
+              <w:jc w:val="left"/>
+            </w:pPr>
+            <w:r>
+              <w:rPr>
+                <w:rFonts w:ascii="Calibri" w:hAnsi="Calibri"/>
+                <w:b w:val="0"/>
+                <w:color w:val="111827"/>
+                <w:sz w:val="16"/>
+              </w:rPr>
+              <w:t>/api/v1/vehicles/{vehicle_id}/can-networks/dbc/decode</w:t>
+            </w:r>
+          </w:p>
+        </w:tc>
+        <w:tc>
+          <w:tcPr>
+            <w:tcW w:type="dxa" w:w="3100"/>
+            <w:tcMar>
+              <w:top w:w="80" w:type="dxa"/>
+              <w:start w:w="120" w:type="dxa"/>
+              <w:bottom w:w="80" w:type="dxa"/>
+              <w:end w:w="120" w:type="dxa"/>
+            </w:tcMar>
+            <w:vAlign w:val="center"/>
+            <w:shd w:fill="FFFFFF"/>
+          </w:tcPr>
+          <w:p>
+            <w:pPr>
+              <w:spacing w:before="0" w:after="40" w:line="252" w:lineRule="auto"/>
+              <w:jc w:val="left"/>
+            </w:pPr>
+            <w:r>
+              <w:rPr>
+                <w:rFonts w:ascii="Calibri" w:hAnsi="Calibri"/>
+                <w:b w:val="0"/>
+                <w:color w:val="111827"/>
+                <w:sz w:val="16"/>
+              </w:rPr>
+              <w:t>can_networks:manage</w:t>
+            </w:r>
+          </w:p>
+        </w:tc>
+        <w:tc>
+          <w:tcPr>
+            <w:tcW w:type="dxa" w:w="1410"/>
+            <w:tcMar>
+              <w:top w:w="80" w:type="dxa"/>
+              <w:start w:w="120" w:type="dxa"/>
+              <w:bottom w:w="80" w:type="dxa"/>
+              <w:end w:w="120" w:type="dxa"/>
+            </w:tcMar>
+            <w:vAlign w:val="center"/>
+            <w:shd w:fill="FFFFFF"/>
+          </w:tcPr>
+          <w:p>
+            <w:pPr>
+              <w:spacing w:before="0" w:after="40" w:line="252" w:lineRule="auto"/>
+              <w:jc w:val="left"/>
+            </w:pPr>
+            <w:r>
+              <w:rPr>
+                <w:rFonts w:ascii="Calibri" w:hAnsi="Calibri"/>
+                <w:b w:val="0"/>
+                <w:color w:val="111827"/>
+                <w:sz w:val="16"/>
+              </w:rPr>
+              <w:t>Decode payload bytes into signal values.</w:t>
+            </w:r>
+          </w:p>
+        </w:tc>
+      </w:tr>
+      <w:tr>
+        <w:trPr>
+          <w:cantSplit/>
+        </w:trPr>
+        <w:tc>
+          <w:tcPr>
+            <w:tcW w:type="dxa" w:w="1150"/>
+            <w:tcMar>
+              <w:top w:w="80" w:type="dxa"/>
+              <w:start w:w="120" w:type="dxa"/>
+              <w:bottom w:w="80" w:type="dxa"/>
+              <w:end w:w="120" w:type="dxa"/>
+            </w:tcMar>
+            <w:vAlign w:val="center"/>
+            <w:shd w:fill="FFFFFF"/>
+          </w:tcPr>
+          <w:p>
+            <w:pPr>
+              <w:spacing w:before="0" w:after="40" w:line="252" w:lineRule="auto"/>
+              <w:jc w:val="center"/>
+            </w:pPr>
+            <w:r>
+              <w:rPr>
+                <w:rFonts w:ascii="Calibri" w:hAnsi="Calibri"/>
+                <w:b w:val="0"/>
+                <w:color w:val="111827"/>
+                <w:sz w:val="16"/>
+              </w:rPr>
+              <w:t>GET</w:t>
+            </w:r>
+          </w:p>
+        </w:tc>
+        <w:tc>
+          <w:tcPr>
+            <w:tcW w:type="dxa" w:w="3700"/>
+            <w:tcMar>
+              <w:top w:w="80" w:type="dxa"/>
+              <w:start w:w="120" w:type="dxa"/>
+              <w:bottom w:w="80" w:type="dxa"/>
+              <w:end w:w="120" w:type="dxa"/>
+            </w:tcMar>
+            <w:vAlign w:val="center"/>
+            <w:shd w:fill="FFFFFF"/>
+          </w:tcPr>
+          <w:p>
+            <w:pPr>
+              <w:spacing w:before="0" w:after="40" w:line="252" w:lineRule="auto"/>
+              <w:jc w:val="left"/>
+            </w:pPr>
+            <w:r>
+              <w:rPr>
+                <w:rFonts w:ascii="Calibri" w:hAnsi="Calibri"/>
+                <w:b w:val="0"/>
+                <w:color w:val="111827"/>
+                <w:sz w:val="16"/>
+              </w:rPr>
+              <w:t>/api/v1/vehicles/{vehicle_id}/can-networks/dbc/executions</w:t>
+            </w:r>
+          </w:p>
+        </w:tc>
+        <w:tc>
+          <w:tcPr>
+            <w:tcW w:type="dxa" w:w="3100"/>
+            <w:tcMar>
+              <w:top w:w="80" w:type="dxa"/>
+              <w:start w:w="120" w:type="dxa"/>
+              <w:bottom w:w="80" w:type="dxa"/>
+              <w:end w:w="120" w:type="dxa"/>
+            </w:tcMar>
+            <w:vAlign w:val="center"/>
+            <w:shd w:fill="FFFFFF"/>
+          </w:tcPr>
+          <w:p>
+            <w:pPr>
+              <w:spacing w:before="0" w:after="40" w:line="252" w:lineRule="auto"/>
+              <w:jc w:val="left"/>
+            </w:pPr>
+            <w:r>
+              <w:rPr>
+                <w:rFonts w:ascii="Calibri" w:hAnsi="Calibri"/>
+                <w:b w:val="0"/>
+                <w:color w:val="111827"/>
+                <w:sz w:val="16"/>
+              </w:rPr>
+              <w:t>can_networks:read</w:t>
+            </w:r>
+          </w:p>
+        </w:tc>
+        <w:tc>
+          <w:tcPr>
+            <w:tcW w:type="dxa" w:w="1410"/>
+            <w:tcMar>
+              <w:top w:w="80" w:type="dxa"/>
+              <w:start w:w="120" w:type="dxa"/>
+              <w:bottom w:w="80" w:type="dxa"/>
+              <w:end w:w="120" w:type="dxa"/>
+            </w:tcMar>
+            <w:vAlign w:val="center"/>
+            <w:shd w:fill="FFFFFF"/>
+          </w:tcPr>
+          <w:p>
+            <w:pPr>
+              <w:spacing w:before="0" w:after="40" w:line="252" w:lineRule="auto"/>
+              <w:jc w:val="left"/>
+            </w:pPr>
+            <w:r>
+              <w:rPr>
+                <w:rFonts w:ascii="Calibri" w:hAnsi="Calibri"/>
+                <w:b w:val="0"/>
+                <w:color w:val="111827"/>
+                <w:sz w:val="16"/>
+              </w:rPr>
+              <w:t>List safely paginated codec evidence.</w:t>
+            </w:r>
+          </w:p>
+        </w:tc>
+      </w:tr>
+      <w:tr>
+        <w:trPr>
+          <w:cantSplit/>
+        </w:trPr>
+        <w:tc>
+          <w:tcPr>
+            <w:tcW w:type="dxa" w:w="1150"/>
+            <w:tcMar>
+              <w:top w:w="80" w:type="dxa"/>
+              <w:start w:w="120" w:type="dxa"/>
+              <w:bottom w:w="80" w:type="dxa"/>
+              <w:end w:w="120" w:type="dxa"/>
+            </w:tcMar>
+            <w:vAlign w:val="center"/>
+            <w:shd w:fill="FFFFFF"/>
+          </w:tcPr>
+          <w:p>
+            <w:pPr>
+              <w:spacing w:before="0" w:after="40" w:line="252" w:lineRule="auto"/>
+              <w:jc w:val="center"/>
+            </w:pPr>
+            <w:r>
+              <w:rPr>
+                <w:rFonts w:ascii="Calibri" w:hAnsi="Calibri"/>
+                <w:b w:val="0"/>
+                <w:color w:val="111827"/>
+                <w:sz w:val="16"/>
+              </w:rPr>
+              <w:t>GET</w:t>
+            </w:r>
+          </w:p>
+        </w:tc>
+        <w:tc>
+          <w:tcPr>
+            <w:tcW w:type="dxa" w:w="3700"/>
+            <w:tcMar>
+              <w:top w:w="80" w:type="dxa"/>
+              <w:start w:w="120" w:type="dxa"/>
+              <w:bottom w:w="80" w:type="dxa"/>
+              <w:end w:w="120" w:type="dxa"/>
+            </w:tcMar>
+            <w:vAlign w:val="center"/>
+            <w:shd w:fill="FFFFFF"/>
+          </w:tcPr>
+          <w:p>
+            <w:pPr>
+              <w:spacing w:before="0" w:after="40" w:line="252" w:lineRule="auto"/>
+              <w:jc w:val="left"/>
+            </w:pPr>
+            <w:r>
+              <w:rPr>
+                <w:rFonts w:ascii="Calibri" w:hAnsi="Calibri"/>
+                <w:b w:val="0"/>
+                <w:color w:val="111827"/>
+                <w:sz w:val="16"/>
+              </w:rPr>
+              <w:t>/api/v1/vehicles/{vehicle_id}/can-networks/dbc/executions/{command_id}</w:t>
+            </w:r>
+          </w:p>
+        </w:tc>
+        <w:tc>
+          <w:tcPr>
+            <w:tcW w:type="dxa" w:w="3100"/>
+            <w:tcMar>
+              <w:top w:w="80" w:type="dxa"/>
+              <w:start w:w="120" w:type="dxa"/>
+              <w:bottom w:w="80" w:type="dxa"/>
+              <w:end w:w="120" w:type="dxa"/>
+            </w:tcMar>
+            <w:vAlign w:val="center"/>
+            <w:shd w:fill="FFFFFF"/>
+          </w:tcPr>
+          <w:p>
+            <w:pPr>
+              <w:spacing w:before="0" w:after="40" w:line="252" w:lineRule="auto"/>
+              <w:jc w:val="left"/>
+            </w:pPr>
+            <w:r>
+              <w:rPr>
+                <w:rFonts w:ascii="Calibri" w:hAnsi="Calibri"/>
+                <w:b w:val="0"/>
+                <w:color w:val="111827"/>
+                <w:sz w:val="16"/>
+              </w:rPr>
+              <w:t>can_networks:read</w:t>
+            </w:r>
+          </w:p>
+        </w:tc>
+        <w:tc>
+          <w:tcPr>
+            <w:tcW w:type="dxa" w:w="1410"/>
+            <w:tcMar>
+              <w:top w:w="80" w:type="dxa"/>
+              <w:start w:w="120" w:type="dxa"/>
+              <w:bottom w:w="80" w:type="dxa"/>
+              <w:end w:w="120" w:type="dxa"/>
+            </w:tcMar>
+            <w:vAlign w:val="center"/>
+            <w:shd w:fill="FFFFFF"/>
+          </w:tcPr>
+          <w:p>
+            <w:pPr>
+              <w:spacing w:before="0" w:after="40" w:line="252" w:lineRule="auto"/>
+              <w:jc w:val="left"/>
+            </w:pPr>
+            <w:r>
+              <w:rPr>
+                <w:rFonts w:ascii="Calibri" w:hAnsi="Calibri"/>
+                <w:b w:val="0"/>
+                <w:color w:val="111827"/>
+                <w:sz w:val="16"/>
+              </w:rPr>
+              <w:t>Retrieve one codec result.</w:t>
+            </w:r>
+          </w:p>
+        </w:tc>
+      </w:tr>
     </w:tbl>
     <w:p>
       <w:pPr>
@@ -2950,6 +3842,104 @@
     </w:p>
     <w:p>
       <w:pPr>
+        <w:pStyle w:val="Heading2"/>
+        <w:keepNext/>
+        <w:keepLines/>
+      </w:pPr>
+      <w:r>
+        <w:t>8.2 DBC Signal Semantics</w:t>
+      </w:r>
+    </w:p>
+    <w:p>
+      <w:r>
+        <w:rPr>
+          <w:rFonts w:ascii="Calibri" w:hAnsi="Calibri"/>
+          <w:color w:val="111827"/>
+          <w:sz w:val="22"/>
+        </w:rPr>
+        <w:t>Catalogue creation locks the network, verifies optimistic version, resolves every message against an existing frame contract, and rejects duplicate messages, duplicate signals, occupied-bit overlap, or positions outside the contracted DLC. One catalogue is allowed per network in this increment.</w:t>
+      </w:r>
+    </w:p>
+    <w:p>
+      <w:r>
+        <w:rPr>
+          <w:rFonts w:ascii="Calibri" w:hAnsi="Calibri"/>
+          <w:color w:val="111827"/>
+          <w:sz w:val="22"/>
+        </w:rPr>
+        <w:t>Intel signals begin at their least-significant bit and occupy increasing bit positions. Motorola signals begin at their most-significant bit and follow DBC sawtooth numbering: bits descend within a byte, then bit 0 advances to bit 15 of the next byte. Signed signals use two's complement.</w:t>
+      </w:r>
+    </w:p>
+    <w:p>
+      <w:r>
+        <w:rPr>
+          <w:rFonts w:ascii="Calibri" w:hAnsi="Calibri"/>
+          <w:color w:val="111827"/>
+          <w:sz w:val="22"/>
+        </w:rPr>
+        <w:t xml:space="preserve">Physical-to-raw conversion uses decimal arithmetic: </w:t>
+      </w:r>
+      <w:r>
+        <w:rPr>
+          <w:rFonts w:ascii="Consolas" w:hAnsi="Consolas"/>
+          <w:color w:val="1F4D78"/>
+          <w:sz w:val="19"/>
+        </w:rPr>
+        <w:t>(physical - offset) / factor</w:t>
+      </w:r>
+      <w:r>
+        <w:rPr>
+          <w:rFonts w:ascii="Calibri" w:hAnsi="Calibri"/>
+          <w:color w:val="111827"/>
+          <w:sz w:val="22"/>
+        </w:rPr>
+        <w:t xml:space="preserve">. A value is rejected if it violates optional physical bounds, exceeds its signed or unsigned raw range, or would require fractional rounding. Decode applies </w:t>
+      </w:r>
+      <w:r>
+        <w:rPr>
+          <w:rFonts w:ascii="Consolas" w:hAnsi="Consolas"/>
+          <w:color w:val="1F4D78"/>
+          <w:sz w:val="19"/>
+        </w:rPr>
+        <w:t>raw * factor + offset</w:t>
+      </w:r>
+      <w:r>
+        <w:rPr>
+          <w:rFonts w:ascii="Calibri" w:hAnsi="Calibri"/>
+          <w:color w:val="111827"/>
+          <w:sz w:val="22"/>
+        </w:rPr>
+        <w:t>. Encode requires exactly the declared signal set, preventing accidental default values or ignored names.</w:t>
+      </w:r>
+    </w:p>
+    <w:p>
+      <w:r>
+        <w:rPr>
+          <w:rFonts w:ascii="Calibri" w:hAnsi="Calibri"/>
+          <w:color w:val="111827"/>
+          <w:sz w:val="22"/>
+        </w:rPr>
+        <w:t xml:space="preserve">Codec commands lock the network row to serialize command identity checks. Exact retry returns the stored result; changed reuse fails with </w:t>
+      </w:r>
+      <w:r>
+        <w:rPr>
+          <w:rFonts w:ascii="Consolas" w:hAnsi="Consolas"/>
+          <w:color w:val="1F4D78"/>
+          <w:sz w:val="19"/>
+        </w:rPr>
+        <w:t>can_signal_codec_command_conflict</w:t>
+      </w:r>
+      <w:r>
+        <w:rPr>
+          <w:rFonts w:ascii="Calibri" w:hAnsi="Calibri"/>
+          <w:color w:val="111827"/>
+          <w:sz w:val="22"/>
+        </w:rPr>
+        <w:t>. Payload, raw values, and physical values are persisted as engineering evidence but excluded from audit and outbox messages.</w:t>
+      </w:r>
+    </w:p>
+    <w:p>
+      <w:pPr>
         <w:pStyle w:val="Heading1"/>
         <w:keepNext/>
         <w:keepLines/>
@@ -2981,7 +3971,7 @@
           <w:color w:val="111827"/>
           <w:sz w:val="22"/>
         </w:rPr>
-        <w:t>. IV-1 and IV-2 implement CAN-F-001 through CAN-F-020 and CAN-NF-001 through CAN-NF-008.</w:t>
+        <w:t>. IV-1 through IV-3 implement CAN-F-001 through CAN-F-030 and CAN-NF-001 through CAN-NF-011.</w:t>
       </w:r>
     </w:p>
     <w:p>
@@ -3152,6 +4142,86 @@
           <w:sz w:val="22"/>
         </w:rPr>
         <w:t>The batch preserves arbitration context and metrics. Winner transmissions preserve a unified frame history. A single aggregate version increment represents the atomic command, while each frame gets its own monotonically increasing sequence.</w:t>
+      </w:r>
+    </w:p>
+    <w:p>
+      <w:pPr>
+        <w:pStyle w:val="Heading2"/>
+        <w:keepNext/>
+        <w:keepLines/>
+      </w:pPr>
+      <w:r>
+        <w:t>ADR-CAN-009 - Reference Frame Contracts from DBC Messages</w:t>
+      </w:r>
+    </w:p>
+    <w:p>
+      <w:r>
+        <w:rPr>
+          <w:rFonts w:ascii="Calibri" w:hAnsi="Calibri"/>
+          <w:color w:val="111827"/>
+          <w:sz w:val="22"/>
+        </w:rPr>
+        <w:t>DBC messages do not duplicate frame ID, format, DLC, producer, or consumers. The CAN contract stays authoritative while the catalogue supplies signal interpretation.</w:t>
+      </w:r>
+    </w:p>
+    <w:p>
+      <w:pPr>
+        <w:pStyle w:val="Heading2"/>
+        <w:keepNext/>
+        <w:keepLines/>
+      </w:pPr>
+      <w:r>
+        <w:t>ADR-CAN-010 - Implement Explicit Intel and Motorola Bit Traversal</w:t>
+      </w:r>
+    </w:p>
+    <w:p>
+      <w:r>
+        <w:rPr>
+          <w:rFonts w:ascii="Calibri" w:hAnsi="Calibri"/>
+          <w:color w:val="111827"/>
+          <w:sz w:val="22"/>
+        </w:rPr>
+        <w:t>Intel uses increasing LSB-first positions. Motorola uses MSB-first DBC sawtooth traversal. The bit position function is independently tested so byte-order behavior remains reviewable.</w:t>
+      </w:r>
+    </w:p>
+    <w:p>
+      <w:pPr>
+        <w:pStyle w:val="Heading2"/>
+        <w:keepNext/>
+        <w:keepLines/>
+      </w:pPr>
+      <w:r>
+        <w:t>ADR-CAN-011 - Reject Inexact Physical Values</w:t>
+      </w:r>
+    </w:p>
+    <w:p>
+      <w:r>
+        <w:rPr>
+          <w:rFonts w:ascii="Calibri" w:hAnsi="Calibri"/>
+          <w:color w:val="111827"/>
+          <w:sz w:val="22"/>
+        </w:rPr>
+        <w:t>Decimal arithmetic avoids binary floating-point drift. Encoding rejects non-integral raw results instead of selecting an implicit rounding policy that could hide test-data errors.</w:t>
+      </w:r>
+    </w:p>
+    <w:p>
+      <w:pPr>
+        <w:pStyle w:val="Heading2"/>
+        <w:keepNext/>
+        <w:keepLines/>
+      </w:pPr>
+      <w:r>
+        <w:t>ADR-CAN-012 - Separate Codec Evidence from Bus Transmission</w:t>
+      </w:r>
+    </w:p>
+    <w:p>
+      <w:r>
+        <w:rPr>
+          <w:rFonts w:ascii="Calibri" w:hAnsi="Calibri"/>
+          <w:color w:val="111827"/>
+          <w:sz w:val="22"/>
+        </w:rPr>
+        <w:t>Encoding creates a payload but does not automatically transmit it. A later caller may submit or arbitrate that payload, keeping semantic conversion and transport execution independently testable.</w:t>
       </w:r>
     </w:p>
     <w:p>
@@ -5963,6 +7033,1430 @@
           </w:p>
         </w:tc>
       </w:tr>
+      <w:tr>
+        <w:trPr>
+          <w:cantSplit/>
+        </w:trPr>
+        <w:tc>
+          <w:tcPr>
+            <w:tcW w:type="dxa" w:w="1650"/>
+            <w:tcMar>
+              <w:top w:w="80" w:type="dxa"/>
+              <w:start w:w="120" w:type="dxa"/>
+              <w:bottom w:w="80" w:type="dxa"/>
+              <w:end w:w="120" w:type="dxa"/>
+            </w:tcMar>
+            <w:vAlign w:val="center"/>
+            <w:shd w:fill="FFFFFF"/>
+          </w:tcPr>
+          <w:p>
+            <w:pPr>
+              <w:spacing w:before="0" w:after="40" w:line="252" w:lineRule="auto"/>
+              <w:jc w:val="center"/>
+            </w:pPr>
+            <w:r>
+              <w:rPr>
+                <w:rFonts w:ascii="Calibri" w:hAnsi="Calibri"/>
+                <w:b w:val="0"/>
+                <w:color w:val="111827"/>
+                <w:sz w:val="17"/>
+              </w:rPr>
+              <w:t>Catalogue uniqueness</w:t>
+            </w:r>
+          </w:p>
+        </w:tc>
+        <w:tc>
+          <w:tcPr>
+            <w:tcW w:type="dxa" w:w="4450"/>
+            <w:tcMar>
+              <w:top w:w="80" w:type="dxa"/>
+              <w:start w:w="120" w:type="dxa"/>
+              <w:bottom w:w="80" w:type="dxa"/>
+              <w:end w:w="120" w:type="dxa"/>
+            </w:tcMar>
+            <w:vAlign w:val="center"/>
+            <w:shd w:fill="FFFFFF"/>
+          </w:tcPr>
+          <w:p>
+            <w:pPr>
+              <w:spacing w:before="0" w:after="40" w:line="252" w:lineRule="auto"/>
+              <w:jc w:val="left"/>
+            </w:pPr>
+            <w:r>
+              <w:rPr>
+                <w:rFonts w:ascii="Calibri" w:hAnsi="Calibri"/>
+                <w:b w:val="0"/>
+                <w:color w:val="111827"/>
+                <w:sz w:val="17"/>
+              </w:rPr>
+              <w:t>Reject a second catalogue for the same CAN network.</w:t>
+            </w:r>
+          </w:p>
+        </w:tc>
+        <w:tc>
+          <w:tcPr>
+            <w:tcW w:type="dxa" w:w="3260"/>
+            <w:tcMar>
+              <w:top w:w="80" w:type="dxa"/>
+              <w:start w:w="120" w:type="dxa"/>
+              <w:bottom w:w="80" w:type="dxa"/>
+              <w:end w:w="120" w:type="dxa"/>
+            </w:tcMar>
+            <w:vAlign w:val="center"/>
+            <w:shd w:fill="FFFFFF"/>
+          </w:tcPr>
+          <w:p>
+            <w:pPr>
+              <w:spacing w:before="0" w:after="40" w:line="252" w:lineRule="auto"/>
+              <w:jc w:val="left"/>
+            </w:pPr>
+            <w:r>
+              <w:rPr>
+                <w:rFonts w:ascii="Calibri" w:hAnsi="Calibri"/>
+                <w:b w:val="0"/>
+                <w:color w:val="111827"/>
+                <w:sz w:val="17"/>
+              </w:rPr>
+              <w:t>Service/database</w:t>
+            </w:r>
+          </w:p>
+        </w:tc>
+      </w:tr>
+      <w:tr>
+        <w:trPr>
+          <w:cantSplit/>
+        </w:trPr>
+        <w:tc>
+          <w:tcPr>
+            <w:tcW w:type="dxa" w:w="1650"/>
+            <w:tcMar>
+              <w:top w:w="80" w:type="dxa"/>
+              <w:start w:w="120" w:type="dxa"/>
+              <w:bottom w:w="80" w:type="dxa"/>
+              <w:end w:w="120" w:type="dxa"/>
+            </w:tcMar>
+            <w:vAlign w:val="center"/>
+            <w:shd w:fill="FFFFFF"/>
+          </w:tcPr>
+          <w:p>
+            <w:pPr>
+              <w:spacing w:before="0" w:after="40" w:line="252" w:lineRule="auto"/>
+              <w:jc w:val="center"/>
+            </w:pPr>
+            <w:r>
+              <w:rPr>
+                <w:rFonts w:ascii="Calibri" w:hAnsi="Calibri"/>
+                <w:b w:val="0"/>
+                <w:color w:val="111827"/>
+                <w:sz w:val="17"/>
+              </w:rPr>
+              <w:t>Contract mapping</w:t>
+            </w:r>
+          </w:p>
+        </w:tc>
+        <w:tc>
+          <w:tcPr>
+            <w:tcW w:type="dxa" w:w="4450"/>
+            <w:tcMar>
+              <w:top w:w="80" w:type="dxa"/>
+              <w:start w:w="120" w:type="dxa"/>
+              <w:bottom w:w="80" w:type="dxa"/>
+              <w:end w:w="120" w:type="dxa"/>
+            </w:tcMar>
+            <w:vAlign w:val="center"/>
+            <w:shd w:fill="FFFFFF"/>
+          </w:tcPr>
+          <w:p>
+            <w:pPr>
+              <w:spacing w:before="0" w:after="40" w:line="252" w:lineRule="auto"/>
+              <w:jc w:val="left"/>
+            </w:pPr>
+            <w:r>
+              <w:rPr>
+                <w:rFonts w:ascii="Calibri" w:hAnsi="Calibri"/>
+                <w:b w:val="0"/>
+                <w:color w:val="111827"/>
+                <w:sz w:val="17"/>
+              </w:rPr>
+              <w:t>Reject a DBC message without an existing frame contract.</w:t>
+            </w:r>
+          </w:p>
+        </w:tc>
+        <w:tc>
+          <w:tcPr>
+            <w:tcW w:type="dxa" w:w="3260"/>
+            <w:tcMar>
+              <w:top w:w="80" w:type="dxa"/>
+              <w:start w:w="120" w:type="dxa"/>
+              <w:bottom w:w="80" w:type="dxa"/>
+              <w:end w:w="120" w:type="dxa"/>
+            </w:tcMar>
+            <w:vAlign w:val="center"/>
+            <w:shd w:fill="FFFFFF"/>
+          </w:tcPr>
+          <w:p>
+            <w:pPr>
+              <w:spacing w:before="0" w:after="40" w:line="252" w:lineRule="auto"/>
+              <w:jc w:val="left"/>
+            </w:pPr>
+            <w:r>
+              <w:rPr>
+                <w:rFonts w:ascii="Calibri" w:hAnsi="Calibri"/>
+                <w:b w:val="0"/>
+                <w:color w:val="111827"/>
+                <w:sz w:val="17"/>
+              </w:rPr>
+              <w:t>Service</w:t>
+            </w:r>
+          </w:p>
+        </w:tc>
+      </w:tr>
+      <w:tr>
+        <w:trPr>
+          <w:cantSplit/>
+        </w:trPr>
+        <w:tc>
+          <w:tcPr>
+            <w:tcW w:type="dxa" w:w="1650"/>
+            <w:tcMar>
+              <w:top w:w="80" w:type="dxa"/>
+              <w:start w:w="120" w:type="dxa"/>
+              <w:bottom w:w="80" w:type="dxa"/>
+              <w:end w:w="120" w:type="dxa"/>
+            </w:tcMar>
+            <w:vAlign w:val="center"/>
+            <w:shd w:fill="FFFFFF"/>
+          </w:tcPr>
+          <w:p>
+            <w:pPr>
+              <w:spacing w:before="0" w:after="40" w:line="252" w:lineRule="auto"/>
+              <w:jc w:val="center"/>
+            </w:pPr>
+            <w:r>
+              <w:rPr>
+                <w:rFonts w:ascii="Calibri" w:hAnsi="Calibri"/>
+                <w:b w:val="0"/>
+                <w:color w:val="111827"/>
+                <w:sz w:val="17"/>
+              </w:rPr>
+              <w:t>Signal uniqueness</w:t>
+            </w:r>
+          </w:p>
+        </w:tc>
+        <w:tc>
+          <w:tcPr>
+            <w:tcW w:type="dxa" w:w="4450"/>
+            <w:tcMar>
+              <w:top w:w="80" w:type="dxa"/>
+              <w:start w:w="120" w:type="dxa"/>
+              <w:bottom w:w="80" w:type="dxa"/>
+              <w:end w:w="120" w:type="dxa"/>
+            </w:tcMar>
+            <w:vAlign w:val="center"/>
+            <w:shd w:fill="FFFFFF"/>
+          </w:tcPr>
+          <w:p>
+            <w:pPr>
+              <w:spacing w:before="0" w:after="40" w:line="252" w:lineRule="auto"/>
+              <w:jc w:val="left"/>
+            </w:pPr>
+            <w:r>
+              <w:rPr>
+                <w:rFonts w:ascii="Calibri" w:hAnsi="Calibri"/>
+                <w:b w:val="0"/>
+                <w:color w:val="111827"/>
+                <w:sz w:val="17"/>
+              </w:rPr>
+              <w:t>Reject duplicate signal names within one message.</w:t>
+            </w:r>
+          </w:p>
+        </w:tc>
+        <w:tc>
+          <w:tcPr>
+            <w:tcW w:type="dxa" w:w="3260"/>
+            <w:tcMar>
+              <w:top w:w="80" w:type="dxa"/>
+              <w:start w:w="120" w:type="dxa"/>
+              <w:bottom w:w="80" w:type="dxa"/>
+              <w:end w:w="120" w:type="dxa"/>
+            </w:tcMar>
+            <w:vAlign w:val="center"/>
+            <w:shd w:fill="FFFFFF"/>
+          </w:tcPr>
+          <w:p>
+            <w:pPr>
+              <w:spacing w:before="0" w:after="40" w:line="252" w:lineRule="auto"/>
+              <w:jc w:val="left"/>
+            </w:pPr>
+            <w:r>
+              <w:rPr>
+                <w:rFonts w:ascii="Calibri" w:hAnsi="Calibri"/>
+                <w:b w:val="0"/>
+                <w:color w:val="111827"/>
+                <w:sz w:val="17"/>
+              </w:rPr>
+              <w:t>Schema</w:t>
+            </w:r>
+          </w:p>
+        </w:tc>
+      </w:tr>
+      <w:tr>
+        <w:trPr>
+          <w:cantSplit/>
+        </w:trPr>
+        <w:tc>
+          <w:tcPr>
+            <w:tcW w:type="dxa" w:w="1650"/>
+            <w:tcMar>
+              <w:top w:w="80" w:type="dxa"/>
+              <w:start w:w="120" w:type="dxa"/>
+              <w:bottom w:w="80" w:type="dxa"/>
+              <w:end w:w="120" w:type="dxa"/>
+            </w:tcMar>
+            <w:vAlign w:val="center"/>
+            <w:shd w:fill="FFFFFF"/>
+          </w:tcPr>
+          <w:p>
+            <w:pPr>
+              <w:spacing w:before="0" w:after="40" w:line="252" w:lineRule="auto"/>
+              <w:jc w:val="center"/>
+            </w:pPr>
+            <w:r>
+              <w:rPr>
+                <w:rFonts w:ascii="Calibri" w:hAnsi="Calibri"/>
+                <w:b w:val="0"/>
+                <w:color w:val="111827"/>
+                <w:sz w:val="17"/>
+              </w:rPr>
+              <w:t>DLC boundary</w:t>
+            </w:r>
+          </w:p>
+        </w:tc>
+        <w:tc>
+          <w:tcPr>
+            <w:tcW w:type="dxa" w:w="4450"/>
+            <w:tcMar>
+              <w:top w:w="80" w:type="dxa"/>
+              <w:start w:w="120" w:type="dxa"/>
+              <w:bottom w:w="80" w:type="dxa"/>
+              <w:end w:w="120" w:type="dxa"/>
+            </w:tcMar>
+            <w:vAlign w:val="center"/>
+            <w:shd w:fill="FFFFFF"/>
+          </w:tcPr>
+          <w:p>
+            <w:pPr>
+              <w:spacing w:before="0" w:after="40" w:line="252" w:lineRule="auto"/>
+              <w:jc w:val="left"/>
+            </w:pPr>
+            <w:r>
+              <w:rPr>
+                <w:rFonts w:ascii="Calibri" w:hAnsi="Calibri"/>
+                <w:b w:val="0"/>
+                <w:color w:val="111827"/>
+                <w:sz w:val="17"/>
+              </w:rPr>
+              <w:t>Reject Intel or Motorola positions outside contracted payload bits.</w:t>
+            </w:r>
+          </w:p>
+        </w:tc>
+        <w:tc>
+          <w:tcPr>
+            <w:tcW w:type="dxa" w:w="3260"/>
+            <w:tcMar>
+              <w:top w:w="80" w:type="dxa"/>
+              <w:start w:w="120" w:type="dxa"/>
+              <w:bottom w:w="80" w:type="dxa"/>
+              <w:end w:w="120" w:type="dxa"/>
+            </w:tcMar>
+            <w:vAlign w:val="center"/>
+            <w:shd w:fill="FFFFFF"/>
+          </w:tcPr>
+          <w:p>
+            <w:pPr>
+              <w:spacing w:before="0" w:after="40" w:line="252" w:lineRule="auto"/>
+              <w:jc w:val="left"/>
+            </w:pPr>
+            <w:r>
+              <w:rPr>
+                <w:rFonts w:ascii="Calibri" w:hAnsi="Calibri"/>
+                <w:b w:val="0"/>
+                <w:color w:val="111827"/>
+                <w:sz w:val="17"/>
+              </w:rPr>
+              <w:t>Service</w:t>
+            </w:r>
+          </w:p>
+        </w:tc>
+      </w:tr>
+      <w:tr>
+        <w:trPr>
+          <w:cantSplit/>
+        </w:trPr>
+        <w:tc>
+          <w:tcPr>
+            <w:tcW w:type="dxa" w:w="1650"/>
+            <w:tcMar>
+              <w:top w:w="80" w:type="dxa"/>
+              <w:start w:w="120" w:type="dxa"/>
+              <w:bottom w:w="80" w:type="dxa"/>
+              <w:end w:w="120" w:type="dxa"/>
+            </w:tcMar>
+            <w:vAlign w:val="center"/>
+            <w:shd w:fill="FFFFFF"/>
+          </w:tcPr>
+          <w:p>
+            <w:pPr>
+              <w:spacing w:before="0" w:after="40" w:line="252" w:lineRule="auto"/>
+              <w:jc w:val="center"/>
+            </w:pPr>
+            <w:r>
+              <w:rPr>
+                <w:rFonts w:ascii="Calibri" w:hAnsi="Calibri"/>
+                <w:b w:val="0"/>
+                <w:color w:val="111827"/>
+                <w:sz w:val="17"/>
+              </w:rPr>
+              <w:t>Signal overlap</w:t>
+            </w:r>
+          </w:p>
+        </w:tc>
+        <w:tc>
+          <w:tcPr>
+            <w:tcW w:type="dxa" w:w="4450"/>
+            <w:tcMar>
+              <w:top w:w="80" w:type="dxa"/>
+              <w:start w:w="120" w:type="dxa"/>
+              <w:bottom w:w="80" w:type="dxa"/>
+              <w:end w:w="120" w:type="dxa"/>
+            </w:tcMar>
+            <w:vAlign w:val="center"/>
+            <w:shd w:fill="FFFFFF"/>
+          </w:tcPr>
+          <w:p>
+            <w:pPr>
+              <w:spacing w:before="0" w:after="40" w:line="252" w:lineRule="auto"/>
+              <w:jc w:val="left"/>
+            </w:pPr>
+            <w:r>
+              <w:rPr>
+                <w:rFonts w:ascii="Calibri" w:hAnsi="Calibri"/>
+                <w:b w:val="0"/>
+                <w:color w:val="111827"/>
+                <w:sz w:val="17"/>
+              </w:rPr>
+              <w:t>Reject any two signals that occupy a common payload bit.</w:t>
+            </w:r>
+          </w:p>
+        </w:tc>
+        <w:tc>
+          <w:tcPr>
+            <w:tcW w:type="dxa" w:w="3260"/>
+            <w:tcMar>
+              <w:top w:w="80" w:type="dxa"/>
+              <w:start w:w="120" w:type="dxa"/>
+              <w:bottom w:w="80" w:type="dxa"/>
+              <w:end w:w="120" w:type="dxa"/>
+            </w:tcMar>
+            <w:vAlign w:val="center"/>
+            <w:shd w:fill="FFFFFF"/>
+          </w:tcPr>
+          <w:p>
+            <w:pPr>
+              <w:spacing w:before="0" w:after="40" w:line="252" w:lineRule="auto"/>
+              <w:jc w:val="left"/>
+            </w:pPr>
+            <w:r>
+              <w:rPr>
+                <w:rFonts w:ascii="Calibri" w:hAnsi="Calibri"/>
+                <w:b w:val="0"/>
+                <w:color w:val="111827"/>
+                <w:sz w:val="17"/>
+              </w:rPr>
+              <w:t>Service</w:t>
+            </w:r>
+          </w:p>
+        </w:tc>
+      </w:tr>
+      <w:tr>
+        <w:trPr>
+          <w:cantSplit/>
+        </w:trPr>
+        <w:tc>
+          <w:tcPr>
+            <w:tcW w:type="dxa" w:w="1650"/>
+            <w:tcMar>
+              <w:top w:w="80" w:type="dxa"/>
+              <w:start w:w="120" w:type="dxa"/>
+              <w:bottom w:w="80" w:type="dxa"/>
+              <w:end w:w="120" w:type="dxa"/>
+            </w:tcMar>
+            <w:vAlign w:val="center"/>
+            <w:shd w:fill="FFFFFF"/>
+          </w:tcPr>
+          <w:p>
+            <w:pPr>
+              <w:spacing w:before="0" w:after="40" w:line="252" w:lineRule="auto"/>
+              <w:jc w:val="center"/>
+            </w:pPr>
+            <w:r>
+              <w:rPr>
+                <w:rFonts w:ascii="Calibri" w:hAnsi="Calibri"/>
+                <w:b w:val="0"/>
+                <w:color w:val="111827"/>
+                <w:sz w:val="17"/>
+              </w:rPr>
+              <w:t>Intel placement</w:t>
+            </w:r>
+          </w:p>
+        </w:tc>
+        <w:tc>
+          <w:tcPr>
+            <w:tcW w:type="dxa" w:w="4450"/>
+            <w:tcMar>
+              <w:top w:w="80" w:type="dxa"/>
+              <w:start w:w="120" w:type="dxa"/>
+              <w:bottom w:w="80" w:type="dxa"/>
+              <w:end w:w="120" w:type="dxa"/>
+            </w:tcMar>
+            <w:vAlign w:val="center"/>
+            <w:shd w:fill="FFFFFF"/>
+          </w:tcPr>
+          <w:p>
+            <w:pPr>
+              <w:spacing w:before="0" w:after="40" w:line="252" w:lineRule="auto"/>
+              <w:jc w:val="left"/>
+            </w:pPr>
+            <w:r>
+              <w:rPr>
+                <w:rFonts w:ascii="Calibri" w:hAnsi="Calibri"/>
+                <w:b w:val="0"/>
+                <w:color w:val="111827"/>
+                <w:sz w:val="17"/>
+              </w:rPr>
+              <w:t>Verify LSB-first contiguous positions and payload bytes.</w:t>
+            </w:r>
+          </w:p>
+        </w:tc>
+        <w:tc>
+          <w:tcPr>
+            <w:tcW w:type="dxa" w:w="3260"/>
+            <w:tcMar>
+              <w:top w:w="80" w:type="dxa"/>
+              <w:start w:w="120" w:type="dxa"/>
+              <w:bottom w:w="80" w:type="dxa"/>
+              <w:end w:w="120" w:type="dxa"/>
+            </w:tcMar>
+            <w:vAlign w:val="center"/>
+            <w:shd w:fill="FFFFFF"/>
+          </w:tcPr>
+          <w:p>
+            <w:pPr>
+              <w:spacing w:before="0" w:after="40" w:line="252" w:lineRule="auto"/>
+              <w:jc w:val="left"/>
+            </w:pPr>
+            <w:r>
+              <w:rPr>
+                <w:rFonts w:ascii="Calibri" w:hAnsi="Calibri"/>
+                <w:b w:val="0"/>
+                <w:color w:val="111827"/>
+                <w:sz w:val="17"/>
+              </w:rPr>
+              <w:t>Unit</w:t>
+            </w:r>
+          </w:p>
+        </w:tc>
+      </w:tr>
+      <w:tr>
+        <w:trPr>
+          <w:cantSplit/>
+        </w:trPr>
+        <w:tc>
+          <w:tcPr>
+            <w:tcW w:type="dxa" w:w="1650"/>
+            <w:tcMar>
+              <w:top w:w="80" w:type="dxa"/>
+              <w:start w:w="120" w:type="dxa"/>
+              <w:bottom w:w="80" w:type="dxa"/>
+              <w:end w:w="120" w:type="dxa"/>
+            </w:tcMar>
+            <w:vAlign w:val="center"/>
+            <w:shd w:fill="FFFFFF"/>
+          </w:tcPr>
+          <w:p>
+            <w:pPr>
+              <w:spacing w:before="0" w:after="40" w:line="252" w:lineRule="auto"/>
+              <w:jc w:val="center"/>
+            </w:pPr>
+            <w:r>
+              <w:rPr>
+                <w:rFonts w:ascii="Calibri" w:hAnsi="Calibri"/>
+                <w:b w:val="0"/>
+                <w:color w:val="111827"/>
+                <w:sz w:val="17"/>
+              </w:rPr>
+              <w:t>Motorola placement</w:t>
+            </w:r>
+          </w:p>
+        </w:tc>
+        <w:tc>
+          <w:tcPr>
+            <w:tcW w:type="dxa" w:w="4450"/>
+            <w:tcMar>
+              <w:top w:w="80" w:type="dxa"/>
+              <w:start w:w="120" w:type="dxa"/>
+              <w:bottom w:w="80" w:type="dxa"/>
+              <w:end w:w="120" w:type="dxa"/>
+            </w:tcMar>
+            <w:vAlign w:val="center"/>
+            <w:shd w:fill="FFFFFF"/>
+          </w:tcPr>
+          <w:p>
+            <w:pPr>
+              <w:spacing w:before="0" w:after="40" w:line="252" w:lineRule="auto"/>
+              <w:jc w:val="left"/>
+            </w:pPr>
+            <w:r>
+              <w:rPr>
+                <w:rFonts w:ascii="Calibri" w:hAnsi="Calibri"/>
+                <w:b w:val="0"/>
+                <w:color w:val="111827"/>
+                <w:sz w:val="17"/>
+              </w:rPr>
+              <w:t>Verify MSB-first sawtooth positions and payload bytes.</w:t>
+            </w:r>
+          </w:p>
+        </w:tc>
+        <w:tc>
+          <w:tcPr>
+            <w:tcW w:type="dxa" w:w="3260"/>
+            <w:tcMar>
+              <w:top w:w="80" w:type="dxa"/>
+              <w:start w:w="120" w:type="dxa"/>
+              <w:bottom w:w="80" w:type="dxa"/>
+              <w:end w:w="120" w:type="dxa"/>
+            </w:tcMar>
+            <w:vAlign w:val="center"/>
+            <w:shd w:fill="FFFFFF"/>
+          </w:tcPr>
+          <w:p>
+            <w:pPr>
+              <w:spacing w:before="0" w:after="40" w:line="252" w:lineRule="auto"/>
+              <w:jc w:val="left"/>
+            </w:pPr>
+            <w:r>
+              <w:rPr>
+                <w:rFonts w:ascii="Calibri" w:hAnsi="Calibri"/>
+                <w:b w:val="0"/>
+                <w:color w:val="111827"/>
+                <w:sz w:val="17"/>
+              </w:rPr>
+              <w:t>Unit</w:t>
+            </w:r>
+          </w:p>
+        </w:tc>
+      </w:tr>
+      <w:tr>
+        <w:trPr>
+          <w:cantSplit/>
+        </w:trPr>
+        <w:tc>
+          <w:tcPr>
+            <w:tcW w:type="dxa" w:w="1650"/>
+            <w:tcMar>
+              <w:top w:w="80" w:type="dxa"/>
+              <w:start w:w="120" w:type="dxa"/>
+              <w:bottom w:w="80" w:type="dxa"/>
+              <w:end w:w="120" w:type="dxa"/>
+            </w:tcMar>
+            <w:vAlign w:val="center"/>
+            <w:shd w:fill="FFFFFF"/>
+          </w:tcPr>
+          <w:p>
+            <w:pPr>
+              <w:spacing w:before="0" w:after="40" w:line="252" w:lineRule="auto"/>
+              <w:jc w:val="center"/>
+            </w:pPr>
+            <w:r>
+              <w:rPr>
+                <w:rFonts w:ascii="Calibri" w:hAnsi="Calibri"/>
+                <w:b w:val="0"/>
+                <w:color w:val="111827"/>
+                <w:sz w:val="17"/>
+              </w:rPr>
+              <w:t>Signed round-trip</w:t>
+            </w:r>
+          </w:p>
+        </w:tc>
+        <w:tc>
+          <w:tcPr>
+            <w:tcW w:type="dxa" w:w="4450"/>
+            <w:tcMar>
+              <w:top w:w="80" w:type="dxa"/>
+              <w:start w:w="120" w:type="dxa"/>
+              <w:bottom w:w="80" w:type="dxa"/>
+              <w:end w:w="120" w:type="dxa"/>
+            </w:tcMar>
+            <w:vAlign w:val="center"/>
+            <w:shd w:fill="FFFFFF"/>
+          </w:tcPr>
+          <w:p>
+            <w:pPr>
+              <w:spacing w:before="0" w:after="40" w:line="252" w:lineRule="auto"/>
+              <w:jc w:val="left"/>
+            </w:pPr>
+            <w:r>
+              <w:rPr>
+                <w:rFonts w:ascii="Calibri" w:hAnsi="Calibri"/>
+                <w:b w:val="0"/>
+                <w:color w:val="111827"/>
+                <w:sz w:val="17"/>
+              </w:rPr>
+              <w:t>Preserve negative two's-complement raw values.</w:t>
+            </w:r>
+          </w:p>
+        </w:tc>
+        <w:tc>
+          <w:tcPr>
+            <w:tcW w:type="dxa" w:w="3260"/>
+            <w:tcMar>
+              <w:top w:w="80" w:type="dxa"/>
+              <w:start w:w="120" w:type="dxa"/>
+              <w:bottom w:w="80" w:type="dxa"/>
+              <w:end w:w="120" w:type="dxa"/>
+            </w:tcMar>
+            <w:vAlign w:val="center"/>
+            <w:shd w:fill="FFFFFF"/>
+          </w:tcPr>
+          <w:p>
+            <w:pPr>
+              <w:spacing w:before="0" w:after="40" w:line="252" w:lineRule="auto"/>
+              <w:jc w:val="left"/>
+            </w:pPr>
+            <w:r>
+              <w:rPr>
+                <w:rFonts w:ascii="Calibri" w:hAnsi="Calibri"/>
+                <w:b w:val="0"/>
+                <w:color w:val="111827"/>
+                <w:sz w:val="17"/>
+              </w:rPr>
+              <w:t>Unit/service</w:t>
+            </w:r>
+          </w:p>
+        </w:tc>
+      </w:tr>
+      <w:tr>
+        <w:trPr>
+          <w:cantSplit/>
+        </w:trPr>
+        <w:tc>
+          <w:tcPr>
+            <w:tcW w:type="dxa" w:w="1650"/>
+            <w:tcMar>
+              <w:top w:w="80" w:type="dxa"/>
+              <w:start w:w="120" w:type="dxa"/>
+              <w:bottom w:w="80" w:type="dxa"/>
+              <w:end w:w="120" w:type="dxa"/>
+            </w:tcMar>
+            <w:vAlign w:val="center"/>
+            <w:shd w:fill="FFFFFF"/>
+          </w:tcPr>
+          <w:p>
+            <w:pPr>
+              <w:spacing w:before="0" w:after="40" w:line="252" w:lineRule="auto"/>
+              <w:jc w:val="center"/>
+            </w:pPr>
+            <w:r>
+              <w:rPr>
+                <w:rFonts w:ascii="Calibri" w:hAnsi="Calibri"/>
+                <w:b w:val="0"/>
+                <w:color w:val="111827"/>
+                <w:sz w:val="17"/>
+              </w:rPr>
+              <w:t>Decimal conversion</w:t>
+            </w:r>
+          </w:p>
+        </w:tc>
+        <w:tc>
+          <w:tcPr>
+            <w:tcW w:type="dxa" w:w="4450"/>
+            <w:tcMar>
+              <w:top w:w="80" w:type="dxa"/>
+              <w:start w:w="120" w:type="dxa"/>
+              <w:bottom w:w="80" w:type="dxa"/>
+              <w:end w:w="120" w:type="dxa"/>
+            </w:tcMar>
+            <w:vAlign w:val="center"/>
+            <w:shd w:fill="FFFFFF"/>
+          </w:tcPr>
+          <w:p>
+            <w:pPr>
+              <w:spacing w:before="0" w:after="40" w:line="252" w:lineRule="auto"/>
+              <w:jc w:val="left"/>
+            </w:pPr>
+            <w:r>
+              <w:rPr>
+                <w:rFonts w:ascii="Calibri" w:hAnsi="Calibri"/>
+                <w:b w:val="0"/>
+                <w:color w:val="111827"/>
+                <w:sz w:val="17"/>
+              </w:rPr>
+              <w:t>Apply factor and offset without binary floating-point drift.</w:t>
+            </w:r>
+          </w:p>
+        </w:tc>
+        <w:tc>
+          <w:tcPr>
+            <w:tcW w:type="dxa" w:w="3260"/>
+            <w:tcMar>
+              <w:top w:w="80" w:type="dxa"/>
+              <w:start w:w="120" w:type="dxa"/>
+              <w:bottom w:w="80" w:type="dxa"/>
+              <w:end w:w="120" w:type="dxa"/>
+            </w:tcMar>
+            <w:vAlign w:val="center"/>
+            <w:shd w:fill="FFFFFF"/>
+          </w:tcPr>
+          <w:p>
+            <w:pPr>
+              <w:spacing w:before="0" w:after="40" w:line="252" w:lineRule="auto"/>
+              <w:jc w:val="left"/>
+            </w:pPr>
+            <w:r>
+              <w:rPr>
+                <w:rFonts w:ascii="Calibri" w:hAnsi="Calibri"/>
+                <w:b w:val="0"/>
+                <w:color w:val="111827"/>
+                <w:sz w:val="17"/>
+              </w:rPr>
+              <w:t>Unit</w:t>
+            </w:r>
+          </w:p>
+        </w:tc>
+      </w:tr>
+      <w:tr>
+        <w:trPr>
+          <w:cantSplit/>
+        </w:trPr>
+        <w:tc>
+          <w:tcPr>
+            <w:tcW w:type="dxa" w:w="1650"/>
+            <w:tcMar>
+              <w:top w:w="80" w:type="dxa"/>
+              <w:start w:w="120" w:type="dxa"/>
+              <w:bottom w:w="80" w:type="dxa"/>
+              <w:end w:w="120" w:type="dxa"/>
+            </w:tcMar>
+            <w:vAlign w:val="center"/>
+            <w:shd w:fill="FFFFFF"/>
+          </w:tcPr>
+          <w:p>
+            <w:pPr>
+              <w:spacing w:before="0" w:after="40" w:line="252" w:lineRule="auto"/>
+              <w:jc w:val="center"/>
+            </w:pPr>
+            <w:r>
+              <w:rPr>
+                <w:rFonts w:ascii="Calibri" w:hAnsi="Calibri"/>
+                <w:b w:val="0"/>
+                <w:color w:val="111827"/>
+                <w:sz w:val="17"/>
+              </w:rPr>
+              <w:t>Exact representation</w:t>
+            </w:r>
+          </w:p>
+        </w:tc>
+        <w:tc>
+          <w:tcPr>
+            <w:tcW w:type="dxa" w:w="4450"/>
+            <w:tcMar>
+              <w:top w:w="80" w:type="dxa"/>
+              <w:start w:w="120" w:type="dxa"/>
+              <w:bottom w:w="80" w:type="dxa"/>
+              <w:end w:w="120" w:type="dxa"/>
+            </w:tcMar>
+            <w:vAlign w:val="center"/>
+            <w:shd w:fill="FFFFFF"/>
+          </w:tcPr>
+          <w:p>
+            <w:pPr>
+              <w:spacing w:before="0" w:after="40" w:line="252" w:lineRule="auto"/>
+              <w:jc w:val="left"/>
+            </w:pPr>
+            <w:r>
+              <w:rPr>
+                <w:rFonts w:ascii="Calibri" w:hAnsi="Calibri"/>
+                <w:b w:val="0"/>
+                <w:color w:val="111827"/>
+                <w:sz w:val="17"/>
+              </w:rPr>
+              <w:t>Reject physical values requiring fractional raw rounding.</w:t>
+            </w:r>
+          </w:p>
+        </w:tc>
+        <w:tc>
+          <w:tcPr>
+            <w:tcW w:type="dxa" w:w="3260"/>
+            <w:tcMar>
+              <w:top w:w="80" w:type="dxa"/>
+              <w:start w:w="120" w:type="dxa"/>
+              <w:bottom w:w="80" w:type="dxa"/>
+              <w:end w:w="120" w:type="dxa"/>
+            </w:tcMar>
+            <w:vAlign w:val="center"/>
+            <w:shd w:fill="FFFFFF"/>
+          </w:tcPr>
+          <w:p>
+            <w:pPr>
+              <w:spacing w:before="0" w:after="40" w:line="252" w:lineRule="auto"/>
+              <w:jc w:val="left"/>
+            </w:pPr>
+            <w:r>
+              <w:rPr>
+                <w:rFonts w:ascii="Calibri" w:hAnsi="Calibri"/>
+                <w:b w:val="0"/>
+                <w:color w:val="111827"/>
+                <w:sz w:val="17"/>
+              </w:rPr>
+              <w:t>Unit/service</w:t>
+            </w:r>
+          </w:p>
+        </w:tc>
+      </w:tr>
+      <w:tr>
+        <w:trPr>
+          <w:cantSplit/>
+        </w:trPr>
+        <w:tc>
+          <w:tcPr>
+            <w:tcW w:type="dxa" w:w="1650"/>
+            <w:tcMar>
+              <w:top w:w="80" w:type="dxa"/>
+              <w:start w:w="120" w:type="dxa"/>
+              <w:bottom w:w="80" w:type="dxa"/>
+              <w:end w:w="120" w:type="dxa"/>
+            </w:tcMar>
+            <w:vAlign w:val="center"/>
+            <w:shd w:fill="FFFFFF"/>
+          </w:tcPr>
+          <w:p>
+            <w:pPr>
+              <w:spacing w:before="0" w:after="40" w:line="252" w:lineRule="auto"/>
+              <w:jc w:val="center"/>
+            </w:pPr>
+            <w:r>
+              <w:rPr>
+                <w:rFonts w:ascii="Calibri" w:hAnsi="Calibri"/>
+                <w:b w:val="0"/>
+                <w:color w:val="111827"/>
+                <w:sz w:val="17"/>
+              </w:rPr>
+              <w:t>Physical bounds</w:t>
+            </w:r>
+          </w:p>
+        </w:tc>
+        <w:tc>
+          <w:tcPr>
+            <w:tcW w:type="dxa" w:w="4450"/>
+            <w:tcMar>
+              <w:top w:w="80" w:type="dxa"/>
+              <w:start w:w="120" w:type="dxa"/>
+              <w:bottom w:w="80" w:type="dxa"/>
+              <w:end w:w="120" w:type="dxa"/>
+            </w:tcMar>
+            <w:vAlign w:val="center"/>
+            <w:shd w:fill="FFFFFF"/>
+          </w:tcPr>
+          <w:p>
+            <w:pPr>
+              <w:spacing w:before="0" w:after="40" w:line="252" w:lineRule="auto"/>
+              <w:jc w:val="left"/>
+            </w:pPr>
+            <w:r>
+              <w:rPr>
+                <w:rFonts w:ascii="Calibri" w:hAnsi="Calibri"/>
+                <w:b w:val="0"/>
+                <w:color w:val="111827"/>
+                <w:sz w:val="17"/>
+              </w:rPr>
+              <w:t>Reject values below minimum or above maximum.</w:t>
+            </w:r>
+          </w:p>
+        </w:tc>
+        <w:tc>
+          <w:tcPr>
+            <w:tcW w:type="dxa" w:w="3260"/>
+            <w:tcMar>
+              <w:top w:w="80" w:type="dxa"/>
+              <w:start w:w="120" w:type="dxa"/>
+              <w:bottom w:w="80" w:type="dxa"/>
+              <w:end w:w="120" w:type="dxa"/>
+            </w:tcMar>
+            <w:vAlign w:val="center"/>
+            <w:shd w:fill="FFFFFF"/>
+          </w:tcPr>
+          <w:p>
+            <w:pPr>
+              <w:spacing w:before="0" w:after="40" w:line="252" w:lineRule="auto"/>
+              <w:jc w:val="left"/>
+            </w:pPr>
+            <w:r>
+              <w:rPr>
+                <w:rFonts w:ascii="Calibri" w:hAnsi="Calibri"/>
+                <w:b w:val="0"/>
+                <w:color w:val="111827"/>
+                <w:sz w:val="17"/>
+              </w:rPr>
+              <w:t>Unit/service</w:t>
+            </w:r>
+          </w:p>
+        </w:tc>
+      </w:tr>
+      <w:tr>
+        <w:trPr>
+          <w:cantSplit/>
+        </w:trPr>
+        <w:tc>
+          <w:tcPr>
+            <w:tcW w:type="dxa" w:w="1650"/>
+            <w:tcMar>
+              <w:top w:w="80" w:type="dxa"/>
+              <w:start w:w="120" w:type="dxa"/>
+              <w:bottom w:w="80" w:type="dxa"/>
+              <w:end w:w="120" w:type="dxa"/>
+            </w:tcMar>
+            <w:vAlign w:val="center"/>
+            <w:shd w:fill="FFFFFF"/>
+          </w:tcPr>
+          <w:p>
+            <w:pPr>
+              <w:spacing w:before="0" w:after="40" w:line="252" w:lineRule="auto"/>
+              <w:jc w:val="center"/>
+            </w:pPr>
+            <w:r>
+              <w:rPr>
+                <w:rFonts w:ascii="Calibri" w:hAnsi="Calibri"/>
+                <w:b w:val="0"/>
+                <w:color w:val="111827"/>
+                <w:sz w:val="17"/>
+              </w:rPr>
+              <w:t>Exact signal set</w:t>
+            </w:r>
+          </w:p>
+        </w:tc>
+        <w:tc>
+          <w:tcPr>
+            <w:tcW w:type="dxa" w:w="4450"/>
+            <w:tcMar>
+              <w:top w:w="80" w:type="dxa"/>
+              <w:start w:w="120" w:type="dxa"/>
+              <w:bottom w:w="80" w:type="dxa"/>
+              <w:end w:w="120" w:type="dxa"/>
+            </w:tcMar>
+            <w:vAlign w:val="center"/>
+            <w:shd w:fill="FFFFFF"/>
+          </w:tcPr>
+          <w:p>
+            <w:pPr>
+              <w:spacing w:before="0" w:after="40" w:line="252" w:lineRule="auto"/>
+              <w:jc w:val="left"/>
+            </w:pPr>
+            <w:r>
+              <w:rPr>
+                <w:rFonts w:ascii="Calibri" w:hAnsi="Calibri"/>
+                <w:b w:val="0"/>
+                <w:color w:val="111827"/>
+                <w:sz w:val="17"/>
+              </w:rPr>
+              <w:t>Reject missing or unexpected encode values.</w:t>
+            </w:r>
+          </w:p>
+        </w:tc>
+        <w:tc>
+          <w:tcPr>
+            <w:tcW w:type="dxa" w:w="3260"/>
+            <w:tcMar>
+              <w:top w:w="80" w:type="dxa"/>
+              <w:start w:w="120" w:type="dxa"/>
+              <w:bottom w:w="80" w:type="dxa"/>
+              <w:end w:w="120" w:type="dxa"/>
+            </w:tcMar>
+            <w:vAlign w:val="center"/>
+            <w:shd w:fill="FFFFFF"/>
+          </w:tcPr>
+          <w:p>
+            <w:pPr>
+              <w:spacing w:before="0" w:after="40" w:line="252" w:lineRule="auto"/>
+              <w:jc w:val="left"/>
+            </w:pPr>
+            <w:r>
+              <w:rPr>
+                <w:rFonts w:ascii="Calibri" w:hAnsi="Calibri"/>
+                <w:b w:val="0"/>
+                <w:color w:val="111827"/>
+                <w:sz w:val="17"/>
+              </w:rPr>
+              <w:t>Unit/service</w:t>
+            </w:r>
+          </w:p>
+        </w:tc>
+      </w:tr>
+      <w:tr>
+        <w:trPr>
+          <w:cantSplit/>
+        </w:trPr>
+        <w:tc>
+          <w:tcPr>
+            <w:tcW w:type="dxa" w:w="1650"/>
+            <w:tcMar>
+              <w:top w:w="80" w:type="dxa"/>
+              <w:start w:w="120" w:type="dxa"/>
+              <w:bottom w:w="80" w:type="dxa"/>
+              <w:end w:w="120" w:type="dxa"/>
+            </w:tcMar>
+            <w:vAlign w:val="center"/>
+            <w:shd w:fill="FFFFFF"/>
+          </w:tcPr>
+          <w:p>
+            <w:pPr>
+              <w:spacing w:before="0" w:after="40" w:line="252" w:lineRule="auto"/>
+              <w:jc w:val="center"/>
+            </w:pPr>
+            <w:r>
+              <w:rPr>
+                <w:rFonts w:ascii="Calibri" w:hAnsi="Calibri"/>
+                <w:b w:val="0"/>
+                <w:color w:val="111827"/>
+                <w:sz w:val="17"/>
+              </w:rPr>
+              <w:t>Codec replay</w:t>
+            </w:r>
+          </w:p>
+        </w:tc>
+        <w:tc>
+          <w:tcPr>
+            <w:tcW w:type="dxa" w:w="4450"/>
+            <w:tcMar>
+              <w:top w:w="80" w:type="dxa"/>
+              <w:start w:w="120" w:type="dxa"/>
+              <w:bottom w:w="80" w:type="dxa"/>
+              <w:end w:w="120" w:type="dxa"/>
+            </w:tcMar>
+            <w:vAlign w:val="center"/>
+            <w:shd w:fill="FFFFFF"/>
+          </w:tcPr>
+          <w:p>
+            <w:pPr>
+              <w:spacing w:before="0" w:after="40" w:line="252" w:lineRule="auto"/>
+              <w:jc w:val="left"/>
+            </w:pPr>
+            <w:r>
+              <w:rPr>
+                <w:rFonts w:ascii="Calibri" w:hAnsi="Calibri"/>
+                <w:b w:val="0"/>
+                <w:color w:val="111827"/>
+                <w:sz w:val="17"/>
+              </w:rPr>
+              <w:t>Reuse exact command evidence without duplicate observability.</w:t>
+            </w:r>
+          </w:p>
+        </w:tc>
+        <w:tc>
+          <w:tcPr>
+            <w:tcW w:type="dxa" w:w="3260"/>
+            <w:tcMar>
+              <w:top w:w="80" w:type="dxa"/>
+              <w:start w:w="120" w:type="dxa"/>
+              <w:bottom w:w="80" w:type="dxa"/>
+              <w:end w:w="120" w:type="dxa"/>
+            </w:tcMar>
+            <w:vAlign w:val="center"/>
+            <w:shd w:fill="FFFFFF"/>
+          </w:tcPr>
+          <w:p>
+            <w:pPr>
+              <w:spacing w:before="0" w:after="40" w:line="252" w:lineRule="auto"/>
+              <w:jc w:val="left"/>
+            </w:pPr>
+            <w:r>
+              <w:rPr>
+                <w:rFonts w:ascii="Calibri" w:hAnsi="Calibri"/>
+                <w:b w:val="0"/>
+                <w:color w:val="111827"/>
+                <w:sz w:val="17"/>
+              </w:rPr>
+              <w:t>Service/API</w:t>
+            </w:r>
+          </w:p>
+        </w:tc>
+      </w:tr>
+      <w:tr>
+        <w:trPr>
+          <w:cantSplit/>
+        </w:trPr>
+        <w:tc>
+          <w:tcPr>
+            <w:tcW w:type="dxa" w:w="1650"/>
+            <w:tcMar>
+              <w:top w:w="80" w:type="dxa"/>
+              <w:start w:w="120" w:type="dxa"/>
+              <w:bottom w:w="80" w:type="dxa"/>
+              <w:end w:w="120" w:type="dxa"/>
+            </w:tcMar>
+            <w:vAlign w:val="center"/>
+            <w:shd w:fill="FFFFFF"/>
+          </w:tcPr>
+          <w:p>
+            <w:pPr>
+              <w:spacing w:before="0" w:after="40" w:line="252" w:lineRule="auto"/>
+              <w:jc w:val="center"/>
+            </w:pPr>
+            <w:r>
+              <w:rPr>
+                <w:rFonts w:ascii="Calibri" w:hAnsi="Calibri"/>
+                <w:b w:val="0"/>
+                <w:color w:val="111827"/>
+                <w:sz w:val="17"/>
+              </w:rPr>
+              <w:t>Codec conflict</w:t>
+            </w:r>
+          </w:p>
+        </w:tc>
+        <w:tc>
+          <w:tcPr>
+            <w:tcW w:type="dxa" w:w="4450"/>
+            <w:tcMar>
+              <w:top w:w="80" w:type="dxa"/>
+              <w:start w:w="120" w:type="dxa"/>
+              <w:bottom w:w="80" w:type="dxa"/>
+              <w:end w:w="120" w:type="dxa"/>
+            </w:tcMar>
+            <w:vAlign w:val="center"/>
+            <w:shd w:fill="FFFFFF"/>
+          </w:tcPr>
+          <w:p>
+            <w:pPr>
+              <w:spacing w:before="0" w:after="40" w:line="252" w:lineRule="auto"/>
+              <w:jc w:val="left"/>
+            </w:pPr>
+            <w:r>
+              <w:rPr>
+                <w:rFonts w:ascii="Calibri" w:hAnsi="Calibri"/>
+                <w:b w:val="0"/>
+                <w:color w:val="111827"/>
+                <w:sz w:val="17"/>
+              </w:rPr>
+              <w:t>Reject changed command reuse with a stable error.</w:t>
+            </w:r>
+          </w:p>
+        </w:tc>
+        <w:tc>
+          <w:tcPr>
+            <w:tcW w:type="dxa" w:w="3260"/>
+            <w:tcMar>
+              <w:top w:w="80" w:type="dxa"/>
+              <w:start w:w="120" w:type="dxa"/>
+              <w:bottom w:w="80" w:type="dxa"/>
+              <w:end w:w="120" w:type="dxa"/>
+            </w:tcMar>
+            <w:vAlign w:val="center"/>
+            <w:shd w:fill="FFFFFF"/>
+          </w:tcPr>
+          <w:p>
+            <w:pPr>
+              <w:spacing w:before="0" w:after="40" w:line="252" w:lineRule="auto"/>
+              <w:jc w:val="left"/>
+            </w:pPr>
+            <w:r>
+              <w:rPr>
+                <w:rFonts w:ascii="Calibri" w:hAnsi="Calibri"/>
+                <w:b w:val="0"/>
+                <w:color w:val="111827"/>
+                <w:sz w:val="17"/>
+              </w:rPr>
+              <w:t>Service/API</w:t>
+            </w:r>
+          </w:p>
+        </w:tc>
+      </w:tr>
+      <w:tr>
+        <w:trPr>
+          <w:cantSplit/>
+        </w:trPr>
+        <w:tc>
+          <w:tcPr>
+            <w:tcW w:type="dxa" w:w="1650"/>
+            <w:tcMar>
+              <w:top w:w="80" w:type="dxa"/>
+              <w:start w:w="120" w:type="dxa"/>
+              <w:bottom w:w="80" w:type="dxa"/>
+              <w:end w:w="120" w:type="dxa"/>
+            </w:tcMar>
+            <w:vAlign w:val="center"/>
+            <w:shd w:fill="FFFFFF"/>
+          </w:tcPr>
+          <w:p>
+            <w:pPr>
+              <w:spacing w:before="0" w:after="40" w:line="252" w:lineRule="auto"/>
+              <w:jc w:val="center"/>
+            </w:pPr>
+            <w:r>
+              <w:rPr>
+                <w:rFonts w:ascii="Calibri" w:hAnsi="Calibri"/>
+                <w:b w:val="0"/>
+                <w:color w:val="111827"/>
+                <w:sz w:val="17"/>
+              </w:rPr>
+              <w:t>Codec concurrency</w:t>
+            </w:r>
+          </w:p>
+        </w:tc>
+        <w:tc>
+          <w:tcPr>
+            <w:tcW w:type="dxa" w:w="4450"/>
+            <w:tcMar>
+              <w:top w:w="80" w:type="dxa"/>
+              <w:start w:w="120" w:type="dxa"/>
+              <w:bottom w:w="80" w:type="dxa"/>
+              <w:end w:w="120" w:type="dxa"/>
+            </w:tcMar>
+            <w:vAlign w:val="center"/>
+            <w:shd w:fill="FFFFFF"/>
+          </w:tcPr>
+          <w:p>
+            <w:pPr>
+              <w:spacing w:before="0" w:after="40" w:line="252" w:lineRule="auto"/>
+              <w:jc w:val="left"/>
+            </w:pPr>
+            <w:r>
+              <w:rPr>
+                <w:rFonts w:ascii="Calibri" w:hAnsi="Calibri"/>
+                <w:b w:val="0"/>
+                <w:color w:val="111827"/>
+                <w:sz w:val="17"/>
+              </w:rPr>
+              <w:t>Serialize command identity checks on the network row.</w:t>
+            </w:r>
+          </w:p>
+        </w:tc>
+        <w:tc>
+          <w:tcPr>
+            <w:tcW w:type="dxa" w:w="3260"/>
+            <w:tcMar>
+              <w:top w:w="80" w:type="dxa"/>
+              <w:start w:w="120" w:type="dxa"/>
+              <w:bottom w:w="80" w:type="dxa"/>
+              <w:end w:w="120" w:type="dxa"/>
+            </w:tcMar>
+            <w:vAlign w:val="center"/>
+            <w:shd w:fill="FFFFFF"/>
+          </w:tcPr>
+          <w:p>
+            <w:pPr>
+              <w:spacing w:before="0" w:after="40" w:line="252" w:lineRule="auto"/>
+              <w:jc w:val="left"/>
+            </w:pPr>
+            <w:r>
+              <w:rPr>
+                <w:rFonts w:ascii="Calibri" w:hAnsi="Calibri"/>
+                <w:b w:val="0"/>
+                <w:color w:val="111827"/>
+                <w:sz w:val="17"/>
+              </w:rPr>
+              <w:t>Integration</w:t>
+            </w:r>
+          </w:p>
+        </w:tc>
+      </w:tr>
+      <w:tr>
+        <w:trPr>
+          <w:cantSplit/>
+        </w:trPr>
+        <w:tc>
+          <w:tcPr>
+            <w:tcW w:type="dxa" w:w="1650"/>
+            <w:tcMar>
+              <w:top w:w="80" w:type="dxa"/>
+              <w:start w:w="120" w:type="dxa"/>
+              <w:bottom w:w="80" w:type="dxa"/>
+              <w:end w:w="120" w:type="dxa"/>
+            </w:tcMar>
+            <w:vAlign w:val="center"/>
+            <w:shd w:fill="FFFFFF"/>
+          </w:tcPr>
+          <w:p>
+            <w:pPr>
+              <w:spacing w:before="0" w:after="40" w:line="252" w:lineRule="auto"/>
+              <w:jc w:val="center"/>
+            </w:pPr>
+            <w:r>
+              <w:rPr>
+                <w:rFonts w:ascii="Calibri" w:hAnsi="Calibri"/>
+                <w:b w:val="0"/>
+                <w:color w:val="111827"/>
+                <w:sz w:val="17"/>
+              </w:rPr>
+              <w:t>Codec minimization</w:t>
+            </w:r>
+          </w:p>
+        </w:tc>
+        <w:tc>
+          <w:tcPr>
+            <w:tcW w:type="dxa" w:w="4450"/>
+            <w:tcMar>
+              <w:top w:w="80" w:type="dxa"/>
+              <w:start w:w="120" w:type="dxa"/>
+              <w:bottom w:w="80" w:type="dxa"/>
+              <w:end w:w="120" w:type="dxa"/>
+            </w:tcMar>
+            <w:vAlign w:val="center"/>
+            <w:shd w:fill="FFFFFF"/>
+          </w:tcPr>
+          <w:p>
+            <w:pPr>
+              <w:spacing w:before="0" w:after="40" w:line="252" w:lineRule="auto"/>
+              <w:jc w:val="left"/>
+            </w:pPr>
+            <w:r>
+              <w:rPr>
+                <w:rFonts w:ascii="Calibri" w:hAnsi="Calibri"/>
+                <w:b w:val="0"/>
+                <w:color w:val="111827"/>
+                <w:sz w:val="17"/>
+              </w:rPr>
+              <w:t>Exclude payload and values from audit and events.</w:t>
+            </w:r>
+          </w:p>
+        </w:tc>
+        <w:tc>
+          <w:tcPr>
+            <w:tcW w:type="dxa" w:w="3260"/>
+            <w:tcMar>
+              <w:top w:w="80" w:type="dxa"/>
+              <w:start w:w="120" w:type="dxa"/>
+              <w:bottom w:w="80" w:type="dxa"/>
+              <w:end w:w="120" w:type="dxa"/>
+            </w:tcMar>
+            <w:vAlign w:val="center"/>
+            <w:shd w:fill="FFFFFF"/>
+          </w:tcPr>
+          <w:p>
+            <w:pPr>
+              <w:spacing w:before="0" w:after="40" w:line="252" w:lineRule="auto"/>
+              <w:jc w:val="left"/>
+            </w:pPr>
+            <w:r>
+              <w:rPr>
+                <w:rFonts w:ascii="Calibri" w:hAnsi="Calibri"/>
+                <w:b w:val="0"/>
+                <w:color w:val="111827"/>
+                <w:sz w:val="17"/>
+              </w:rPr>
+              <w:t>Service</w:t>
+            </w:r>
+          </w:p>
+        </w:tc>
+      </w:tr>
     </w:tbl>
     <w:p>
       <w:pPr>
@@ -6034,7 +8528,7 @@
           <w:color w:val="111827"/>
           <w:sz w:val="22"/>
         </w:rPr>
-        <w:t xml:space="preserve"> and </w:t>
+        <w:t xml:space="preserve">, </w:t>
       </w:r>
       <w:r>
         <w:rPr>
@@ -6043,6 +8537,22 @@
           <w:sz w:val="19"/>
         </w:rPr>
         <w:t>0025_can_arbitration</w:t>
+      </w:r>
+      <w:r>
+        <w:rPr>
+          <w:rFonts w:ascii="Calibri" w:hAnsi="Calibri"/>
+          <w:color w:val="111827"/>
+          <w:sz w:val="22"/>
+        </w:rPr>
+        <w:t xml:space="preserve">, and </w:t>
+      </w:r>
+      <w:r>
+        <w:rPr>
+          <w:rFonts w:ascii="Consolas" w:hAnsi="Consolas"/>
+          <w:color w:val="1F4D78"/>
+          <w:sz w:val="19"/>
+        </w:rPr>
+        <w:t>0026_can_dbc_codec</w:t>
       </w:r>
       <w:r>
         <w:rPr>
@@ -6099,10 +8609,8 @@
           <w:color w:val="111827"/>
           <w:sz w:val="22"/>
         </w:rPr>
-        <w:t>, and</w:t>
+        <w:t xml:space="preserve">, and </w:t>
       </w:r>
-    </w:p>
-    <w:p>
       <w:r>
         <w:rPr>
           <w:rFonts w:ascii="Consolas" w:hAnsi="Consolas"/>
@@ -6125,7 +8633,56 @@
         <w:pStyle w:val="ListBullet"/>
         <w:numPr>
           <w:ilvl w:val="0"/>
-          <w:numId w:val="14"/>
+          <w:numId w:val="13"/>
+        </w:numPr>
+      </w:pPr>
+      <w:r>
+        <w:rPr>
+          <w:rFonts w:ascii="Calibri" w:hAnsi="Calibri"/>
+          <w:color w:val="111827"/>
+          <w:sz w:val="22"/>
+        </w:rPr>
+        <w:t xml:space="preserve">DBC events are </w:t>
+      </w:r>
+      <w:r>
+        <w:rPr>
+          <w:rFonts w:ascii="Consolas" w:hAnsi="Consolas"/>
+          <w:color w:val="1F4D78"/>
+          <w:sz w:val="19"/>
+        </w:rPr>
+        <w:t>atep.can.dbc.catalogue.created.v1</w:t>
+      </w:r>
+      <w:r>
+        <w:rPr>
+          <w:rFonts w:ascii="Calibri" w:hAnsi="Calibri"/>
+          <w:color w:val="111827"/>
+          <w:sz w:val="22"/>
+        </w:rPr>
+        <w:t xml:space="preserve"> and </w:t>
+      </w:r>
+      <w:r>
+        <w:rPr>
+          <w:rFonts w:ascii="Consolas" w:hAnsi="Consolas"/>
+          <w:color w:val="1F4D78"/>
+          <w:sz w:val="19"/>
+        </w:rPr>
+        <w:t>atep.can.signal.codec.completed.v1</w:t>
+      </w:r>
+      <w:r>
+        <w:rPr>
+          <w:rFonts w:ascii="Calibri" w:hAnsi="Calibri"/>
+          <w:color w:val="111827"/>
+          <w:sz w:val="22"/>
+        </w:rPr>
+        <w:t>.</w:t>
+      </w:r>
+    </w:p>
+    <w:p>
+      <w:pPr>
+        <w:pStyle w:val="ListBullet"/>
+        <w:numPr>
+          <w:ilvl w:val="0"/>
+          <w:numId w:val="13"/>
         </w:numPr>
       </w:pPr>
       <w:r>
@@ -6174,7 +8731,7 @@
         <w:pStyle w:val="ListBullet"/>
         <w:numPr>
           <w:ilvl w:val="0"/>
-          <w:numId w:val="14"/>
+          <w:numId w:val="13"/>
         </w:numPr>
       </w:pPr>
       <w:r>
@@ -6183,17 +8740,7 @@
           <w:color w:val="111827"/>
           <w:sz w:val="22"/>
         </w:rPr>
-        <w:t>Automated tests cover validation, priority, timing mathematics, readiness, delivery, utilization,</w:t>
-      </w:r>
-    </w:p>
-    <w:p>
-      <w:r>
-        <w:rPr>
-          <w:rFonts w:ascii="Calibri" w:hAnsi="Calibri"/>
-          <w:color w:val="111827"/>
-          <w:sz w:val="22"/>
-        </w:rPr>
-        <w:t>versioning, replay, errors, evidence minimization, persistence, and OpenAPI.</w:t>
+        <w:t>Automated tests cover validation, priority, timing mathematics, readiness, delivery, utilization, versioning, replay, errors, DBC bit placement, signed scaling, exact conversion, evidence minimization, persistence, and OpenAPI.</w:t>
       </w:r>
     </w:p>
     <w:p>
@@ -6211,7 +8758,7 @@
         <w:pStyle w:val="ListBullet"/>
         <w:numPr>
           <w:ilvl w:val="0"/>
-          <w:numId w:val="15"/>
+          <w:numId w:val="14"/>
         </w:numPr>
       </w:pPr>
       <w:r>
@@ -6228,7 +8775,7 @@
         <w:pStyle w:val="ListBullet"/>
         <w:numPr>
           <w:ilvl w:val="0"/>
-          <w:numId w:val="15"/>
+          <w:numId w:val="14"/>
         </w:numPr>
       </w:pPr>
       <w:r>
@@ -6245,7 +8792,7 @@
         <w:pStyle w:val="ListBullet"/>
         <w:numPr>
           <w:ilvl w:val="0"/>
-          <w:numId w:val="15"/>
+          <w:numId w:val="14"/>
         </w:numPr>
       </w:pPr>
       <w:r>
@@ -6262,7 +8809,7 @@
         <w:pStyle w:val="ListBullet"/>
         <w:numPr>
           <w:ilvl w:val="0"/>
-          <w:numId w:val="15"/>
+          <w:numId w:val="14"/>
         </w:numPr>
       </w:pPr>
       <w:r>
@@ -6279,7 +8826,7 @@
         <w:pStyle w:val="ListBullet"/>
         <w:numPr>
           <w:ilvl w:val="0"/>
-          <w:numId w:val="15"/>
+          <w:numId w:val="14"/>
         </w:numPr>
       </w:pPr>
       <w:r>
@@ -6296,7 +8843,7 @@
         <w:pStyle w:val="ListBullet"/>
         <w:numPr>
           <w:ilvl w:val="0"/>
-          <w:numId w:val="15"/>
+          <w:numId w:val="14"/>
         </w:numPr>
       </w:pPr>
       <w:r>
@@ -6305,7 +8852,57 @@
           <w:color w:val="111827"/>
           <w:sz w:val="22"/>
         </w:rPr>
-        <w:t>No DBC adapter currently maps Volume III semantic values into payload bytes.</w:t>
+        <w:t xml:space="preserve">The catalogue is structured JSON; importing and exporting textual </w:t>
+      </w:r>
+      <w:r>
+        <w:rPr>
+          <w:rFonts w:ascii="Consolas" w:hAnsi="Consolas"/>
+          <w:color w:val="1F4D78"/>
+          <w:sz w:val="19"/>
+        </w:rPr>
+        <w:t>.dbc</w:t>
+      </w:r>
+      <w:r>
+        <w:rPr>
+          <w:rFonts w:ascii="Calibri" w:hAnsi="Calibri"/>
+          <w:color w:val="111827"/>
+          <w:sz w:val="22"/>
+        </w:rPr>
+        <w:t xml:space="preserve"> files remains future work.</w:t>
+      </w:r>
+    </w:p>
+    <w:p>
+      <w:pPr>
+        <w:pStyle w:val="ListBullet"/>
+        <w:numPr>
+          <w:ilvl w:val="0"/>
+          <w:numId w:val="14"/>
+        </w:numPr>
+      </w:pPr>
+      <w:r>
+        <w:rPr>
+          <w:rFonts w:ascii="Calibri" w:hAnsi="Calibri"/>
+          <w:color w:val="111827"/>
+          <w:sz w:val="22"/>
+        </w:rPr>
+        <w:t>Multiplexed signals, value tables, attributes, and comments are not yet represented.</w:t>
+      </w:r>
+    </w:p>
+    <w:p>
+      <w:pPr>
+        <w:pStyle w:val="ListBullet"/>
+        <w:numPr>
+          <w:ilvl w:val="0"/>
+          <w:numId w:val="14"/>
+        </w:numPr>
+      </w:pPr>
+      <w:r>
+        <w:rPr>
+          <w:rFonts w:ascii="Calibri" w:hAnsi="Calibri"/>
+          <w:color w:val="111827"/>
+          <w:sz w:val="22"/>
+        </w:rPr>
+        <w:t>Encoding produces evidence but does not automatically submit the frame to the simulated bus.</w:t>
       </w:r>
     </w:p>
     <w:p>
@@ -6325,7 +8922,7 @@
           <w:color w:val="111827"/>
           <w:sz w:val="22"/>
         </w:rPr>
-        <w:t xml:space="preserve">The recommended next increment is IV-3: a DBC catalogue with signal encoding/decoding, scaling, offsets, signed values, and byte order. See </w:t>
+        <w:t xml:space="preserve">The recommended next increment is IV-4: CAN FD payload and timing contracts with explicit nominal and data-phase bitrate plus mixed classic/FD compatibility. See </w:t>
       </w:r>
       <w:r>
         <w:rPr>
@@ -6359,7 +8956,7 @@
         <w:pStyle w:val="ListNumber"/>
         <w:numPr>
           <w:ilvl w:val="0"/>
-          <w:numId w:val="16"/>
+          <w:numId w:val="15"/>
         </w:numPr>
       </w:pPr>
       <w:r>
@@ -6376,7 +8973,7 @@
         <w:pStyle w:val="ListNumber"/>
         <w:numPr>
           <w:ilvl w:val="0"/>
-          <w:numId w:val="16"/>
+          <w:numId w:val="15"/>
         </w:numPr>
       </w:pPr>
       <w:r>
@@ -6393,7 +8990,7 @@
         <w:pStyle w:val="ListNumber"/>
         <w:numPr>
           <w:ilvl w:val="0"/>
-          <w:numId w:val="16"/>
+          <w:numId w:val="15"/>
         </w:numPr>
       </w:pPr>
       <w:r>
@@ -6410,7 +9007,7 @@
         <w:pStyle w:val="ListNumber"/>
         <w:numPr>
           <w:ilvl w:val="0"/>
-          <w:numId w:val="16"/>
+          <w:numId w:val="15"/>
         </w:numPr>
       </w:pPr>
       <w:r>
@@ -6427,7 +9024,7 @@
         <w:pStyle w:val="ListNumber"/>
         <w:numPr>
           <w:ilvl w:val="0"/>
-          <w:numId w:val="16"/>
+          <w:numId w:val="15"/>
         </w:numPr>
       </w:pPr>
       <w:r>
@@ -6444,7 +9041,7 @@
         <w:pStyle w:val="ListNumber"/>
         <w:numPr>
           <w:ilvl w:val="0"/>
-          <w:numId w:val="16"/>
+          <w:numId w:val="15"/>
         </w:numPr>
       </w:pPr>
       <w:r>
@@ -6461,7 +9058,7 @@
         <w:pStyle w:val="ListNumber"/>
         <w:numPr>
           <w:ilvl w:val="0"/>
-          <w:numId w:val="16"/>
+          <w:numId w:val="15"/>
         </w:numPr>
       </w:pPr>
       <w:r>
@@ -6510,7 +9107,7 @@
         <w:pStyle w:val="ListNumber"/>
         <w:numPr>
           <w:ilvl w:val="0"/>
-          <w:numId w:val="16"/>
+          <w:numId w:val="15"/>
         </w:numPr>
       </w:pPr>
       <w:r>
@@ -6527,7 +9124,7 @@
         <w:pStyle w:val="ListNumber"/>
         <w:numPr>
           <w:ilvl w:val="0"/>
-          <w:numId w:val="16"/>
+          <w:numId w:val="15"/>
         </w:numPr>
       </w:pPr>
       <w:r>
@@ -6592,7 +9189,7 @@
         <w:pStyle w:val="ListNumber"/>
         <w:numPr>
           <w:ilvl w:val="0"/>
-          <w:numId w:val="16"/>
+          <w:numId w:val="15"/>
         </w:numPr>
       </w:pPr>
       <w:r>
@@ -6609,7 +9206,7 @@
         <w:pStyle w:val="ListNumber"/>
         <w:numPr>
           <w:ilvl w:val="0"/>
-          <w:numId w:val="16"/>
+          <w:numId w:val="15"/>
         </w:numPr>
       </w:pPr>
       <w:r>
@@ -6626,7 +9223,7 @@
         <w:pStyle w:val="ListNumber"/>
         <w:numPr>
           <w:ilvl w:val="0"/>
-          <w:numId w:val="16"/>
+          <w:numId w:val="15"/>
         </w:numPr>
       </w:pPr>
       <w:r>
@@ -6643,7 +9240,7 @@
         <w:pStyle w:val="ListNumber"/>
         <w:numPr>
           <w:ilvl w:val="0"/>
-          <w:numId w:val="16"/>
+          <w:numId w:val="15"/>
         </w:numPr>
       </w:pPr>
       <w:r>
@@ -6660,7 +9257,7 @@
         <w:pStyle w:val="ListNumber"/>
         <w:numPr>
           <w:ilvl w:val="0"/>
-          <w:numId w:val="16"/>
+          <w:numId w:val="15"/>
         </w:numPr>
       </w:pPr>
       <w:r>
@@ -6677,7 +9274,7 @@
         <w:pStyle w:val="ListNumber"/>
         <w:numPr>
           <w:ilvl w:val="0"/>
-          <w:numId w:val="16"/>
+          <w:numId w:val="15"/>
         </w:numPr>
       </w:pPr>
       <w:r>
@@ -6694,7 +9291,7 @@
         <w:pStyle w:val="ListNumber"/>
         <w:numPr>
           <w:ilvl w:val="0"/>
-          <w:numId w:val="16"/>
+          <w:numId w:val="15"/>
         </w:numPr>
       </w:pPr>
       <w:r>
@@ -6704,6 +9301,206 @@
           <w:sz w:val="22"/>
         </w:rPr>
         <w:t>Design an acknowledgement-failure extension without changing the nominal IV-2 evidence.</w:t>
+      </w:r>
+    </w:p>
+    <w:p>
+      <w:pPr>
+        <w:pStyle w:val="ListNumber"/>
+        <w:numPr>
+          <w:ilvl w:val="0"/>
+          <w:numId w:val="15"/>
+        </w:numPr>
+      </w:pPr>
+      <w:r>
+        <w:rPr>
+          <w:rFonts w:ascii="Calibri" w:hAnsi="Calibri"/>
+          <w:color w:val="111827"/>
+          <w:sz w:val="22"/>
+        </w:rPr>
+        <w:t xml:space="preserve">Encode a 12-bit Intel value </w:t>
+      </w:r>
+      <w:r>
+        <w:rPr>
+          <w:rFonts w:ascii="Consolas" w:hAnsi="Consolas"/>
+          <w:color w:val="1F4D78"/>
+          <w:sz w:val="19"/>
+        </w:rPr>
+        <w:t>0xABC</w:t>
+      </w:r>
+      <w:r>
+        <w:rPr>
+          <w:rFonts w:ascii="Calibri" w:hAnsi="Calibri"/>
+          <w:color w:val="111827"/>
+          <w:sz w:val="22"/>
+        </w:rPr>
+        <w:t xml:space="preserve"> beginning at bit 0 and list the resulting bytes.</w:t>
+      </w:r>
+    </w:p>
+    <w:p>
+      <w:pPr>
+        <w:pStyle w:val="ListNumber"/>
+        <w:numPr>
+          <w:ilvl w:val="0"/>
+          <w:numId w:val="15"/>
+        </w:numPr>
+      </w:pPr>
+      <w:r>
+        <w:rPr>
+          <w:rFonts w:ascii="Calibri" w:hAnsi="Calibri"/>
+          <w:color w:val="111827"/>
+          <w:sz w:val="22"/>
+        </w:rPr>
+        <w:t>Trace a 12-bit Motorola value beginning at bit 7 through sawtooth bit positions.</w:t>
+      </w:r>
+    </w:p>
+    <w:p>
+      <w:pPr>
+        <w:pStyle w:val="ListNumber"/>
+        <w:numPr>
+          <w:ilvl w:val="0"/>
+          <w:numId w:val="15"/>
+        </w:numPr>
+      </w:pPr>
+      <w:r>
+        <w:rPr>
+          <w:rFonts w:ascii="Calibri" w:hAnsi="Calibri"/>
+          <w:color w:val="111827"/>
+          <w:sz w:val="22"/>
+        </w:rPr>
+        <w:t>Explain how two's-complement decoding reconstructs a negative raw value.</w:t>
+      </w:r>
+    </w:p>
+    <w:p>
+      <w:pPr>
+        <w:pStyle w:val="ListNumber"/>
+        <w:numPr>
+          <w:ilvl w:val="0"/>
+          <w:numId w:val="15"/>
+        </w:numPr>
+      </w:pPr>
+      <w:r>
+        <w:rPr>
+          <w:rFonts w:ascii="Calibri" w:hAnsi="Calibri"/>
+          <w:color w:val="111827"/>
+          <w:sz w:val="22"/>
+        </w:rPr>
+        <w:t xml:space="preserve">Prove why </w:t>
+      </w:r>
+      <w:r>
+        <w:rPr>
+          <w:rFonts w:ascii="Consolas" w:hAnsi="Consolas"/>
+          <w:color w:val="1F4D78"/>
+          <w:sz w:val="19"/>
+        </w:rPr>
+        <w:t>300.05</w:t>
+      </w:r>
+      <w:r>
+        <w:rPr>
+          <w:rFonts w:ascii="Calibri" w:hAnsi="Calibri"/>
+          <w:color w:val="111827"/>
+          <w:sz w:val="22"/>
+        </w:rPr>
+        <w:t xml:space="preserve"> is not representable when factor is </w:t>
+      </w:r>
+      <w:r>
+        <w:rPr>
+          <w:rFonts w:ascii="Consolas" w:hAnsi="Consolas"/>
+          <w:color w:val="1F4D78"/>
+          <w:sz w:val="19"/>
+        </w:rPr>
+        <w:t>0.1</w:t>
+      </w:r>
+      <w:r>
+        <w:rPr>
+          <w:rFonts w:ascii="Calibri" w:hAnsi="Calibri"/>
+          <w:color w:val="111827"/>
+          <w:sz w:val="22"/>
+        </w:rPr>
+        <w:t xml:space="preserve"> and offset is zero.</w:t>
+      </w:r>
+    </w:p>
+    <w:p>
+      <w:pPr>
+        <w:pStyle w:val="ListNumber"/>
+        <w:numPr>
+          <w:ilvl w:val="0"/>
+          <w:numId w:val="15"/>
+        </w:numPr>
+      </w:pPr>
+      <w:r>
+        <w:rPr>
+          <w:rFonts w:ascii="Calibri" w:hAnsi="Calibri"/>
+          <w:color w:val="111827"/>
+          <w:sz w:val="22"/>
+        </w:rPr>
+        <w:t>Explain why DBC messages reference frame contracts instead of repeating their metadata.</w:t>
+      </w:r>
+    </w:p>
+    <w:p>
+      <w:pPr>
+        <w:pStyle w:val="ListNumber"/>
+        <w:numPr>
+          <w:ilvl w:val="0"/>
+          <w:numId w:val="15"/>
+        </w:numPr>
+      </w:pPr>
+      <w:r>
+        <w:rPr>
+          <w:rFonts w:ascii="Calibri" w:hAnsi="Calibri"/>
+          <w:color w:val="111827"/>
+          <w:sz w:val="22"/>
+        </w:rPr>
+        <w:t>Design a test that detects overlap between one Intel and one Motorola signal.</w:t>
+      </w:r>
+    </w:p>
+    <w:p>
+      <w:pPr>
+        <w:pStyle w:val="ListNumber"/>
+        <w:numPr>
+          <w:ilvl w:val="0"/>
+          <w:numId w:val="15"/>
+        </w:numPr>
+      </w:pPr>
+      <w:r>
+        <w:rPr>
+          <w:rFonts w:ascii="Calibri" w:hAnsi="Calibri"/>
+          <w:color w:val="111827"/>
+          <w:sz w:val="22"/>
+        </w:rPr>
+        <w:t>Trace encode evidence into a later arbitration command without coupling the two operations.</w:t>
+      </w:r>
+    </w:p>
+    <w:p>
+      <w:pPr>
+        <w:pStyle w:val="ListNumber"/>
+        <w:numPr>
+          <w:ilvl w:val="0"/>
+          <w:numId w:val="15"/>
+        </w:numPr>
+      </w:pPr>
+      <w:r>
+        <w:rPr>
+          <w:rFonts w:ascii="Calibri" w:hAnsi="Calibri"/>
+          <w:color w:val="111827"/>
+          <w:sz w:val="22"/>
+        </w:rPr>
+        <w:t xml:space="preserve">Propose a backward-compatible textual </w:t>
+      </w:r>
+      <w:r>
+        <w:rPr>
+          <w:rFonts w:ascii="Consolas" w:hAnsi="Consolas"/>
+          <w:color w:val="1F4D78"/>
+          <w:sz w:val="19"/>
+        </w:rPr>
+        <w:t>.dbc</w:t>
+      </w:r>
+      <w:r>
+        <w:rPr>
+          <w:rFonts w:ascii="Calibri" w:hAnsi="Calibri"/>
+          <w:color w:val="111827"/>
+          <w:sz w:val="22"/>
+        </w:rPr>
+        <w:t xml:space="preserve"> import boundary.</w:t>
       </w:r>
     </w:p>
     <w:sectPr>
@@ -6735,7 +9532,7 @@
         <w:color w:val="667085"/>
         <w:sz w:val="17"/>
       </w:rPr>
-      <w:t>ATEP Volume IV Workbook  |  Version 0.2.0</w:t>
+      <w:t>ATEP Volume IV Workbook  |  Version 0.3.0</w:t>
     </w:r>
     <w:r>
       <w:rPr>
@@ -7047,12 +9844,6 @@
     </w:lvlOverride>
   </w:num>
   <w:num w:numId="15">
-    <w:abstractNumId w:val="10"/>
-    <w:lvlOverride w:ilvl="0">
-      <w:startOverride w:val="1"/>
-    </w:lvlOverride>
-  </w:num>
-  <w:num w:numId="16">
     <w:abstractNumId w:val="9"/>
     <w:lvlOverride w:ilvl="0">
       <w:startOverride w:val="1"/>

</xml_diff>

<commit_message>
feat(can): add deterministic CAN FD timing
</commit_message>
<xml_diff>
--- a/docs/ATEP_Volume_IV_CAN_Network_Engineering_Workbook.docx
+++ b/docs/ATEP_Volume_IV_CAN_Network_Engineering_Workbook.docx
@@ -143,7 +143,7 @@
                 <w:color w:val="0B2545"/>
                 <w:sz w:val="19"/>
               </w:rPr>
-              <w:t>0.3.0</w:t>
+              <w:t>0.4.0</w:t>
             </w:r>
           </w:p>
         </w:tc>
@@ -265,7 +265,7 @@
                 <w:color w:val="111827"/>
                 <w:sz w:val="19"/>
               </w:rPr>
-              <w:t>Increments IV-1 through IV-3 implemented</w:t>
+              <w:t>Implemented increments: IV-1 to IV-4</w:t>
             </w:r>
           </w:p>
         </w:tc>
@@ -893,7 +893,7 @@
                 <w:color w:val="111827"/>
                 <w:sz w:val="17"/>
               </w:rPr>
-              <w:t>Increments IV-1 through IV-3</w:t>
+              <w:t>Increments IV-1 through IV-4</w:t>
             </w:r>
           </w:p>
         </w:tc>
@@ -1475,6 +1475,95 @@
           </w:p>
         </w:tc>
       </w:tr>
+      <w:tr>
+        <w:trPr>
+          <w:cantSplit/>
+        </w:trPr>
+        <w:tc>
+          <w:tcPr>
+            <w:tcW w:type="dxa" w:w="1650"/>
+            <w:tcMar>
+              <w:top w:w="80" w:type="dxa"/>
+              <w:start w:w="120" w:type="dxa"/>
+              <w:bottom w:w="80" w:type="dxa"/>
+              <w:end w:w="120" w:type="dxa"/>
+            </w:tcMar>
+            <w:vAlign w:val="center"/>
+            <w:shd w:fill="FFFFFF"/>
+          </w:tcPr>
+          <w:p>
+            <w:pPr>
+              <w:spacing w:before="0" w:after="40" w:line="252" w:lineRule="auto"/>
+              <w:jc w:val="center"/>
+            </w:pPr>
+            <w:r>
+              <w:rPr>
+                <w:rFonts w:ascii="Calibri" w:hAnsi="Calibri"/>
+                <w:b w:val="0"/>
+                <w:color w:val="111827"/>
+                <w:sz w:val="17"/>
+              </w:rPr>
+              <w:t>0.4.0</w:t>
+            </w:r>
+          </w:p>
+        </w:tc>
+        <w:tc>
+          <w:tcPr>
+            <w:tcW w:type="dxa" w:w="4450"/>
+            <w:tcMar>
+              <w:top w:w="80" w:type="dxa"/>
+              <w:start w:w="120" w:type="dxa"/>
+              <w:bottom w:w="80" w:type="dxa"/>
+              <w:end w:w="120" w:type="dxa"/>
+            </w:tcMar>
+            <w:vAlign w:val="center"/>
+            <w:shd w:fill="FFFFFF"/>
+          </w:tcPr>
+          <w:p>
+            <w:pPr>
+              <w:spacing w:before="0" w:after="40" w:line="252" w:lineRule="auto"/>
+              <w:jc w:val="left"/>
+            </w:pPr>
+            <w:r>
+              <w:rPr>
+                <w:rFonts w:ascii="Calibri" w:hAnsi="Calibri"/>
+                <w:b w:val="0"/>
+                <w:color w:val="111827"/>
+                <w:sz w:val="17"/>
+              </w:rPr>
+              <w:t>2026-08-24</w:t>
+            </w:r>
+          </w:p>
+        </w:tc>
+        <w:tc>
+          <w:tcPr>
+            <w:tcW w:type="dxa" w:w="3260"/>
+            <w:tcMar>
+              <w:top w:w="80" w:type="dxa"/>
+              <w:start w:w="120" w:type="dxa"/>
+              <w:bottom w:w="80" w:type="dxa"/>
+              <w:end w:w="120" w:type="dxa"/>
+            </w:tcMar>
+            <w:vAlign w:val="center"/>
+            <w:shd w:fill="FFFFFF"/>
+          </w:tcPr>
+          <w:p>
+            <w:pPr>
+              <w:spacing w:before="0" w:after="40" w:line="252" w:lineRule="auto"/>
+              <w:jc w:val="left"/>
+            </w:pPr>
+            <w:r>
+              <w:rPr>
+                <w:rFonts w:ascii="Calibri" w:hAnsi="Calibri"/>
+                <w:b w:val="0"/>
+                <w:color w:val="111827"/>
+                <w:sz w:val="17"/>
+              </w:rPr>
+              <w:t>Added CAN FD network configuration, ISO payload lengths through 64 bytes, BRS, dual-rate phase timing, mixed classic/FD arbitration, extended DBC payloads, migration, and tests.</w:t>
+            </w:r>
+          </w:p>
+        </w:tc>
+      </w:tr>
     </w:tbl>
     <w:p>
       <w:pPr>
@@ -1515,7 +1604,7 @@
           <w:color w:val="111827"/>
           <w:sz w:val="22"/>
         </w:rPr>
-        <w:t>One classic CAN network per vehicle.</w:t>
+        <w:t>One classic or CAN FD-enabled network per vehicle.</w:t>
       </w:r>
     </w:p>
     <w:p>
@@ -1583,7 +1672,24 @@
           <w:color w:val="111827"/>
           <w:sz w:val="22"/>
         </w:rPr>
-        <w:t>Classic CAN payloads from zero to eight bytes.</w:t>
+        <w:t>Classic CAN payloads from zero to eight bytes and ISO-defined CAN FD payloads through 64 bytes.</w:t>
+      </w:r>
+    </w:p>
+    <w:p>
+      <w:pPr>
+        <w:pStyle w:val="ListBullet"/>
+        <w:numPr>
+          <w:ilvl w:val="0"/>
+          <w:numId w:val="11"/>
+        </w:numPr>
+      </w:pPr>
+      <w:r>
+        <w:rPr>
+          <w:rFonts w:ascii="Calibri" w:hAnsi="Calibri"/>
+          <w:color w:val="111827"/>
+          <w:sz w:val="22"/>
+        </w:rPr>
+        <w:t>Nominal and data-phase bitrates, frame protocol, and bitrate-switch contracts.</w:t>
       </w:r>
     </w:p>
     <w:p>
@@ -1758,6 +1864,40 @@
     </w:p>
     <w:p>
       <w:pPr>
+        <w:pStyle w:val="ListBullet"/>
+        <w:numPr>
+          <w:ilvl w:val="0"/>
+          <w:numId w:val="11"/>
+        </w:numPr>
+      </w:pPr>
+      <w:r>
+        <w:rPr>
+          <w:rFonts w:ascii="Calibri" w:hAnsi="Calibri"/>
+          <w:color w:val="111827"/>
+          <w:sz w:val="22"/>
+        </w:rPr>
+        <w:t>Deterministic mixed classic/FD arbitration with phase-specific timing evidence.</w:t>
+      </w:r>
+    </w:p>
+    <w:p>
+      <w:pPr>
+        <w:pStyle w:val="ListBullet"/>
+        <w:numPr>
+          <w:ilvl w:val="0"/>
+          <w:numId w:val="11"/>
+        </w:numPr>
+      </w:pPr>
+      <w:r>
+        <w:rPr>
+          <w:rFonts w:ascii="Calibri" w:hAnsi="Calibri"/>
+          <w:color w:val="111827"/>
+          <w:sz w:val="22"/>
+        </w:rPr>
+        <w:t>DBC signal placement and codec payloads through 512 contracted bits.</w:t>
+      </w:r>
+    </w:p>
+    <w:p>
+      <w:pPr>
         <w:pStyle w:val="Heading2"/>
         <w:keepNext/>
         <w:keepLines/>
@@ -1814,23 +1954,6 @@
           <w:sz w:val="22"/>
         </w:rPr>
         <w:t xml:space="preserve"> parsing, attributes, value tables, comments, and multiplexing.</w:t>
-      </w:r>
-    </w:p>
-    <w:p>
-      <w:pPr>
-        <w:pStyle w:val="ListBullet"/>
-        <w:numPr>
-          <w:ilvl w:val="0"/>
-          <w:numId w:val="12"/>
-        </w:numPr>
-      </w:pPr>
-      <w:r>
-        <w:rPr>
-          <w:rFonts w:ascii="Calibri" w:hAnsi="Calibri"/>
-          <w:color w:val="111827"/>
-          <w:sz w:val="22"/>
-        </w:rPr>
-        <w:t>CAN FD payloads and data-phase bitrate.</w:t>
       </w:r>
     </w:p>
     <w:p>
@@ -1938,7 +2061,7 @@
           <w:color w:val="111827"/>
           <w:sz w:val="22"/>
         </w:rPr>
-        <w:t xml:space="preserve"> stores vehicle ownership, identity, bitrate, nodes, frame contracts, version, logical microsecond time, and the next sequence. </w:t>
+        <w:t xml:space="preserve"> stores vehicle ownership, identity, nominal bitrate, optional CAN FD data bitrate, FD enablement, nodes, frame contracts, version, logical microsecond time, and the next sequence. </w:t>
       </w:r>
       <w:r>
         <w:rPr>
@@ -2006,7 +2129,7 @@
           <w:color w:val="111827"/>
           <w:sz w:val="22"/>
         </w:rPr>
-        <w:t xml:space="preserve"> stores the canonical encode/decode request and deterministic payload, raw, and physical result for exact replay.</w:t>
+        <w:t xml:space="preserve"> stores the canonical encode/decode request and deterministic payload, raw, and physical result for exact replay. Frame contracts and transmissions preserve classic/FD protocol and BRS identity; arbitration results also preserve per-phase bit counts and durations.</w:t>
       </w:r>
     </w:p>
     <w:p>
@@ -2016,7 +2139,7 @@
           <w:color w:val="111827"/>
           <w:sz w:val="22"/>
         </w:rPr>
-        <w:t>Bounds are architectural controls: 64 nodes, 256 contracts, 8 payload bytes, a 10-second maximum logical advance per submission, safe history pagination, and one network aggregate per vehicle.</w:t>
+        <w:t>Bounds are architectural controls: 64 nodes, 256 contracts, 8 classic or 64 FD payload bytes, a 10-second maximum logical advance per submission, safe history pagination, and one network aggregate per vehicle.</w:t>
       </w:r>
     </w:p>
     <w:p>
@@ -3940,6 +4063,46 @@
     </w:p>
     <w:p>
       <w:pPr>
+        <w:pStyle w:val="Heading2"/>
+        <w:keepNext/>
+        <w:keepLines/>
+      </w:pPr>
+      <w:r>
+        <w:t>8.3 CAN FD and Mixed-Bus Semantics</w:t>
+      </w:r>
+    </w:p>
+    <w:p>
+      <w:r>
+        <w:rPr>
+          <w:rFonts w:ascii="Calibri" w:hAnsi="Calibri"/>
+          <w:color w:val="111827"/>
+          <w:sz w:val="22"/>
+        </w:rPr>
+        <w:t>A CAN FD-enabled network defines a nominal bitrate and a data bitrate no lower than the nominal rate. Classic contracts remain limited to eight bytes. FD contracts accept only the ISO-defined payload lengths 0-8, 12, 16, 20, 24, 32, 48, and 64 bytes. BRS is valid only for FD contracts.</w:t>
+      </w:r>
+    </w:p>
+    <w:p>
+      <w:r>
+        <w:rPr>
+          <w:rFonts w:ascii="Calibri" w:hAnsi="Calibri"/>
+          <w:color w:val="111827"/>
+          <w:sz w:val="22"/>
+        </w:rPr>
+        <w:t>The deterministic timing model excludes bit stuffing and electrical effects. Standard and extended FD frames allocate 32 and 52 nominal-phase bits. The data phase contains payload bits plus a 17-bit CRC through 16 bytes or 21-bit CRC above 16 bytes. Nominal and data phase durations are rounded up independently. BRS selects the data bitrate only for the data phase; without BRS, both phases use the nominal bitrate.</w:t>
+      </w:r>
+    </w:p>
+    <w:p>
+      <w:r>
+        <w:rPr>
+          <w:rFonts w:ascii="Calibri" w:hAnsi="Calibri"/>
+          <w:color w:val="111827"/>
+          <w:sz w:val="22"/>
+        </w:rPr>
+        <w:t>Classic and FD contenders use the same CAN identifier, format, and contract tie-break rules. The protocol does not alter priority. Persisted arbitration evidence reports protocol, BRS, phase bit counts, phase durations, total duration, deliveries, and utilization. Audit and outbox metrics report FD and BRS frame counts without payload bytes.</w:t>
+      </w:r>
+    </w:p>
+    <w:p>
+      <w:pPr>
         <w:pStyle w:val="Heading1"/>
         <w:keepNext/>
         <w:keepLines/>
@@ -3971,7 +4134,7 @@
           <w:color w:val="111827"/>
           <w:sz w:val="22"/>
         </w:rPr>
-        <w:t>. IV-1 through IV-3 implement CAN-F-001 through CAN-F-030 and CAN-NF-001 through CAN-NF-011.</w:t>
+        <w:t>. IV-1 through IV-4 implement CAN-F-001 through CAN-F-040 and CAN-NF-001 through CAN-NF-014.</w:t>
       </w:r>
     </w:p>
     <w:p>
@@ -4222,6 +4385,82 @@
           <w:sz w:val="22"/>
         </w:rPr>
         <w:t>Encoding creates a payload but does not automatically transmit it. A later caller may submit or arbitrate that payload, keeping semantic conversion and transport execution independently testable.</w:t>
+      </w:r>
+    </w:p>
+    <w:p>
+      <w:pPr>
+        <w:pStyle w:val="Heading2"/>
+        <w:keepNext/>
+        <w:keepLines/>
+      </w:pPr>
+      <w:r>
+        <w:t>ADR-CAN-013 - Model CAN FD as a Backward-Compatible Contract Extension</w:t>
+      </w:r>
+    </w:p>
+    <w:p>
+      <w:r>
+        <w:rPr>
+          <w:rFonts w:ascii="Calibri" w:hAnsi="Calibri"/>
+          <w:color w:val="111827"/>
+          <w:sz w:val="22"/>
+        </w:rPr>
+        <w:t>Classic is the default protocol for existing contracts and persisted rows. An FD-enabled network may carry classic and FD frames, so IV-1 through IV-3 clients remain valid while new clients opt into FD.</w:t>
+      </w:r>
+    </w:p>
+    <w:p>
+      <w:pPr>
+        <w:pStyle w:val="Heading2"/>
+        <w:keepNext/>
+        <w:keepLines/>
+      </w:pPr>
+      <w:r>
+        <w:t>ADR-CAN-014 - Separate Nominal and Data Timing Phases</w:t>
+      </w:r>
+    </w:p>
+    <w:p>
+      <w:r>
+        <w:rPr>
+          <w:rFonts w:ascii="Calibri" w:hAnsi="Calibri"/>
+          <w:color w:val="111827"/>
+          <w:sz w:val="22"/>
+        </w:rPr>
+        <w:t>CAN FD arbitration remains at the nominal rate. Only an FD data phase with BRS uses the configured data bitrate. Persisting both phases makes timing assumptions observable and independently testable.</w:t>
+      </w:r>
+    </w:p>
+    <w:p>
+      <w:pPr>
+        <w:pStyle w:val="Heading2"/>
+        <w:keepNext/>
+        <w:keepLines/>
+      </w:pPr>
+      <w:r>
+        <w:t>ADR-CAN-015 - Use Payload Length Semantics at the API Boundary</w:t>
+      </w:r>
+    </w:p>
+    <w:p>
+      <w:r>
+        <w:rPr>
+          <w:rFonts w:ascii="Calibri" w:hAnsi="Calibri"/>
+          <w:color w:val="111827"/>
+          <w:sz w:val="22"/>
+        </w:rPr>
+        <w:t xml:space="preserve">The public </w:t>
+      </w:r>
+      <w:r>
+        <w:rPr>
+          <w:rFonts w:ascii="Consolas" w:hAnsi="Consolas"/>
+          <w:color w:val="1F4D78"/>
+          <w:sz w:val="19"/>
+        </w:rPr>
+        <w:t>dlc</w:t>
+      </w:r>
+      <w:r>
+        <w:rPr>
+          <w:rFonts w:ascii="Calibri" w:hAnsi="Calibri"/>
+          <w:color w:val="111827"/>
+          <w:sz w:val="22"/>
+        </w:rPr>
+        <w:t xml:space="preserve"> field continues to represent payload bytes for compatibility. Validation restricts FD values to ISO-defined payload sizes, while a future wire adapter can map larger lengths to their four-bit encoded DLC values.</w:t>
       </w:r>
     </w:p>
     <w:p>
@@ -8457,6 +8696,985 @@
           </w:p>
         </w:tc>
       </w:tr>
+      <w:tr>
+        <w:trPr>
+          <w:cantSplit/>
+        </w:trPr>
+        <w:tc>
+          <w:tcPr>
+            <w:tcW w:type="dxa" w:w="1650"/>
+            <w:tcMar>
+              <w:top w:w="80" w:type="dxa"/>
+              <w:start w:w="120" w:type="dxa"/>
+              <w:bottom w:w="80" w:type="dxa"/>
+              <w:end w:w="120" w:type="dxa"/>
+            </w:tcMar>
+            <w:vAlign w:val="center"/>
+            <w:shd w:fill="FFFFFF"/>
+          </w:tcPr>
+          <w:p>
+            <w:pPr>
+              <w:spacing w:before="0" w:after="40" w:line="252" w:lineRule="auto"/>
+              <w:jc w:val="center"/>
+            </w:pPr>
+            <w:r>
+              <w:rPr>
+                <w:rFonts w:ascii="Calibri" w:hAnsi="Calibri"/>
+                <w:b w:val="0"/>
+                <w:color w:val="111827"/>
+                <w:sz w:val="17"/>
+              </w:rPr>
+              <w:t>FD enablement</w:t>
+            </w:r>
+          </w:p>
+        </w:tc>
+        <w:tc>
+          <w:tcPr>
+            <w:tcW w:type="dxa" w:w="4450"/>
+            <w:tcMar>
+              <w:top w:w="80" w:type="dxa"/>
+              <w:start w:w="120" w:type="dxa"/>
+              <w:bottom w:w="80" w:type="dxa"/>
+              <w:end w:w="120" w:type="dxa"/>
+            </w:tcMar>
+            <w:vAlign w:val="center"/>
+            <w:shd w:fill="FFFFFF"/>
+          </w:tcPr>
+          <w:p>
+            <w:pPr>
+              <w:spacing w:before="0" w:after="40" w:line="252" w:lineRule="auto"/>
+              <w:jc w:val="left"/>
+            </w:pPr>
+            <w:r>
+              <w:rPr>
+                <w:rFonts w:ascii="Calibri" w:hAnsi="Calibri"/>
+                <w:b w:val="0"/>
+                <w:color w:val="111827"/>
+                <w:sz w:val="17"/>
+              </w:rPr>
+              <w:t>Require a bounded data bitrate for an FD-enabled network.</w:t>
+            </w:r>
+          </w:p>
+        </w:tc>
+        <w:tc>
+          <w:tcPr>
+            <w:tcW w:type="dxa" w:w="3260"/>
+            <w:tcMar>
+              <w:top w:w="80" w:type="dxa"/>
+              <w:start w:w="120" w:type="dxa"/>
+              <w:bottom w:w="80" w:type="dxa"/>
+              <w:end w:w="120" w:type="dxa"/>
+            </w:tcMar>
+            <w:vAlign w:val="center"/>
+            <w:shd w:fill="FFFFFF"/>
+          </w:tcPr>
+          <w:p>
+            <w:pPr>
+              <w:spacing w:before="0" w:after="40" w:line="252" w:lineRule="auto"/>
+              <w:jc w:val="left"/>
+            </w:pPr>
+            <w:r>
+              <w:rPr>
+                <w:rFonts w:ascii="Calibri" w:hAnsi="Calibri"/>
+                <w:b w:val="0"/>
+                <w:color w:val="111827"/>
+                <w:sz w:val="17"/>
+              </w:rPr>
+              <w:t>Schema/service</w:t>
+            </w:r>
+          </w:p>
+        </w:tc>
+      </w:tr>
+      <w:tr>
+        <w:trPr>
+          <w:cantSplit/>
+        </w:trPr>
+        <w:tc>
+          <w:tcPr>
+            <w:tcW w:type="dxa" w:w="1650"/>
+            <w:tcMar>
+              <w:top w:w="80" w:type="dxa"/>
+              <w:start w:w="120" w:type="dxa"/>
+              <w:bottom w:w="80" w:type="dxa"/>
+              <w:end w:w="120" w:type="dxa"/>
+            </w:tcMar>
+            <w:vAlign w:val="center"/>
+            <w:shd w:fill="FFFFFF"/>
+          </w:tcPr>
+          <w:p>
+            <w:pPr>
+              <w:spacing w:before="0" w:after="40" w:line="252" w:lineRule="auto"/>
+              <w:jc w:val="center"/>
+            </w:pPr>
+            <w:r>
+              <w:rPr>
+                <w:rFonts w:ascii="Calibri" w:hAnsi="Calibri"/>
+                <w:b w:val="0"/>
+                <w:color w:val="111827"/>
+                <w:sz w:val="17"/>
+              </w:rPr>
+              <w:t>ISO FD length</w:t>
+            </w:r>
+          </w:p>
+        </w:tc>
+        <w:tc>
+          <w:tcPr>
+            <w:tcW w:type="dxa" w:w="4450"/>
+            <w:tcMar>
+              <w:top w:w="80" w:type="dxa"/>
+              <w:start w:w="120" w:type="dxa"/>
+              <w:bottom w:w="80" w:type="dxa"/>
+              <w:end w:w="120" w:type="dxa"/>
+            </w:tcMar>
+            <w:vAlign w:val="center"/>
+            <w:shd w:fill="FFFFFF"/>
+          </w:tcPr>
+          <w:p>
+            <w:pPr>
+              <w:spacing w:before="0" w:after="40" w:line="252" w:lineRule="auto"/>
+              <w:jc w:val="left"/>
+            </w:pPr>
+            <w:r>
+              <w:rPr>
+                <w:rFonts w:ascii="Calibri" w:hAnsi="Calibri"/>
+                <w:b w:val="0"/>
+                <w:color w:val="111827"/>
+                <w:sz w:val="17"/>
+              </w:rPr>
+              <w:t>Accept only 0-8, 12, 16, 20, 24, 32, 48, and 64-byte FD payloads.</w:t>
+            </w:r>
+          </w:p>
+        </w:tc>
+        <w:tc>
+          <w:tcPr>
+            <w:tcW w:type="dxa" w:w="3260"/>
+            <w:tcMar>
+              <w:top w:w="80" w:type="dxa"/>
+              <w:start w:w="120" w:type="dxa"/>
+              <w:bottom w:w="80" w:type="dxa"/>
+              <w:end w:w="120" w:type="dxa"/>
+            </w:tcMar>
+            <w:vAlign w:val="center"/>
+            <w:shd w:fill="FFFFFF"/>
+          </w:tcPr>
+          <w:p>
+            <w:pPr>
+              <w:spacing w:before="0" w:after="40" w:line="252" w:lineRule="auto"/>
+              <w:jc w:val="left"/>
+            </w:pPr>
+            <w:r>
+              <w:rPr>
+                <w:rFonts w:ascii="Calibri" w:hAnsi="Calibri"/>
+                <w:b w:val="0"/>
+                <w:color w:val="111827"/>
+                <w:sz w:val="17"/>
+              </w:rPr>
+              <w:t>Schema</w:t>
+            </w:r>
+          </w:p>
+        </w:tc>
+      </w:tr>
+      <w:tr>
+        <w:trPr>
+          <w:cantSplit/>
+        </w:trPr>
+        <w:tc>
+          <w:tcPr>
+            <w:tcW w:type="dxa" w:w="1650"/>
+            <w:tcMar>
+              <w:top w:w="80" w:type="dxa"/>
+              <w:start w:w="120" w:type="dxa"/>
+              <w:bottom w:w="80" w:type="dxa"/>
+              <w:end w:w="120" w:type="dxa"/>
+            </w:tcMar>
+            <w:vAlign w:val="center"/>
+            <w:shd w:fill="FFFFFF"/>
+          </w:tcPr>
+          <w:p>
+            <w:pPr>
+              <w:spacing w:before="0" w:after="40" w:line="252" w:lineRule="auto"/>
+              <w:jc w:val="center"/>
+            </w:pPr>
+            <w:r>
+              <w:rPr>
+                <w:rFonts w:ascii="Calibri" w:hAnsi="Calibri"/>
+                <w:b w:val="0"/>
+                <w:color w:val="111827"/>
+                <w:sz w:val="17"/>
+              </w:rPr>
+              <w:t>Classic compatibility</w:t>
+            </w:r>
+          </w:p>
+        </w:tc>
+        <w:tc>
+          <w:tcPr>
+            <w:tcW w:type="dxa" w:w="4450"/>
+            <w:tcMar>
+              <w:top w:w="80" w:type="dxa"/>
+              <w:start w:w="120" w:type="dxa"/>
+              <w:bottom w:w="80" w:type="dxa"/>
+              <w:end w:w="120" w:type="dxa"/>
+            </w:tcMar>
+            <w:vAlign w:val="center"/>
+            <w:shd w:fill="FFFFFF"/>
+          </w:tcPr>
+          <w:p>
+            <w:pPr>
+              <w:spacing w:before="0" w:after="40" w:line="252" w:lineRule="auto"/>
+              <w:jc w:val="left"/>
+            </w:pPr>
+            <w:r>
+              <w:rPr>
+                <w:rFonts w:ascii="Calibri" w:hAnsi="Calibri"/>
+                <w:b w:val="0"/>
+                <w:color w:val="111827"/>
+                <w:sz w:val="17"/>
+              </w:rPr>
+              <w:t>Preserve eight-byte limits and prior timing results.</w:t>
+            </w:r>
+          </w:p>
+        </w:tc>
+        <w:tc>
+          <w:tcPr>
+            <w:tcW w:type="dxa" w:w="3260"/>
+            <w:tcMar>
+              <w:top w:w="80" w:type="dxa"/>
+              <w:start w:w="120" w:type="dxa"/>
+              <w:bottom w:w="80" w:type="dxa"/>
+              <w:end w:w="120" w:type="dxa"/>
+            </w:tcMar>
+            <w:vAlign w:val="center"/>
+            <w:shd w:fill="FFFFFF"/>
+          </w:tcPr>
+          <w:p>
+            <w:pPr>
+              <w:spacing w:before="0" w:after="40" w:line="252" w:lineRule="auto"/>
+              <w:jc w:val="left"/>
+            </w:pPr>
+            <w:r>
+              <w:rPr>
+                <w:rFonts w:ascii="Calibri" w:hAnsi="Calibri"/>
+                <w:b w:val="0"/>
+                <w:color w:val="111827"/>
+                <w:sz w:val="17"/>
+              </w:rPr>
+              <w:t>Regression</w:t>
+            </w:r>
+          </w:p>
+        </w:tc>
+      </w:tr>
+      <w:tr>
+        <w:trPr>
+          <w:cantSplit/>
+        </w:trPr>
+        <w:tc>
+          <w:tcPr>
+            <w:tcW w:type="dxa" w:w="1650"/>
+            <w:tcMar>
+              <w:top w:w="80" w:type="dxa"/>
+              <w:start w:w="120" w:type="dxa"/>
+              <w:bottom w:w="80" w:type="dxa"/>
+              <w:end w:w="120" w:type="dxa"/>
+            </w:tcMar>
+            <w:vAlign w:val="center"/>
+            <w:shd w:fill="FFFFFF"/>
+          </w:tcPr>
+          <w:p>
+            <w:pPr>
+              <w:spacing w:before="0" w:after="40" w:line="252" w:lineRule="auto"/>
+              <w:jc w:val="center"/>
+            </w:pPr>
+            <w:r>
+              <w:rPr>
+                <w:rFonts w:ascii="Calibri" w:hAnsi="Calibri"/>
+                <w:b w:val="0"/>
+                <w:color w:val="111827"/>
+                <w:sz w:val="17"/>
+              </w:rPr>
+              <w:t>BRS restriction</w:t>
+            </w:r>
+          </w:p>
+        </w:tc>
+        <w:tc>
+          <w:tcPr>
+            <w:tcW w:type="dxa" w:w="4450"/>
+            <w:tcMar>
+              <w:top w:w="80" w:type="dxa"/>
+              <w:start w:w="120" w:type="dxa"/>
+              <w:bottom w:w="80" w:type="dxa"/>
+              <w:end w:w="120" w:type="dxa"/>
+            </w:tcMar>
+            <w:vAlign w:val="center"/>
+            <w:shd w:fill="FFFFFF"/>
+          </w:tcPr>
+          <w:p>
+            <w:pPr>
+              <w:spacing w:before="0" w:after="40" w:line="252" w:lineRule="auto"/>
+              <w:jc w:val="left"/>
+            </w:pPr>
+            <w:r>
+              <w:rPr>
+                <w:rFonts w:ascii="Calibri" w:hAnsi="Calibri"/>
+                <w:b w:val="0"/>
+                <w:color w:val="111827"/>
+                <w:sz w:val="17"/>
+              </w:rPr>
+              <w:t>Reject bitrate switching on classic contracts.</w:t>
+            </w:r>
+          </w:p>
+        </w:tc>
+        <w:tc>
+          <w:tcPr>
+            <w:tcW w:type="dxa" w:w="3260"/>
+            <w:tcMar>
+              <w:top w:w="80" w:type="dxa"/>
+              <w:start w:w="120" w:type="dxa"/>
+              <w:bottom w:w="80" w:type="dxa"/>
+              <w:end w:w="120" w:type="dxa"/>
+            </w:tcMar>
+            <w:vAlign w:val="center"/>
+            <w:shd w:fill="FFFFFF"/>
+          </w:tcPr>
+          <w:p>
+            <w:pPr>
+              <w:spacing w:before="0" w:after="40" w:line="252" w:lineRule="auto"/>
+              <w:jc w:val="left"/>
+            </w:pPr>
+            <w:r>
+              <w:rPr>
+                <w:rFonts w:ascii="Calibri" w:hAnsi="Calibri"/>
+                <w:b w:val="0"/>
+                <w:color w:val="111827"/>
+                <w:sz w:val="17"/>
+              </w:rPr>
+              <w:t>Schema</w:t>
+            </w:r>
+          </w:p>
+        </w:tc>
+      </w:tr>
+      <w:tr>
+        <w:trPr>
+          <w:cantSplit/>
+        </w:trPr>
+        <w:tc>
+          <w:tcPr>
+            <w:tcW w:type="dxa" w:w="1650"/>
+            <w:tcMar>
+              <w:top w:w="80" w:type="dxa"/>
+              <w:start w:w="120" w:type="dxa"/>
+              <w:bottom w:w="80" w:type="dxa"/>
+              <w:end w:w="120" w:type="dxa"/>
+            </w:tcMar>
+            <w:vAlign w:val="center"/>
+            <w:shd w:fill="FFFFFF"/>
+          </w:tcPr>
+          <w:p>
+            <w:pPr>
+              <w:spacing w:before="0" w:after="40" w:line="252" w:lineRule="auto"/>
+              <w:jc w:val="center"/>
+            </w:pPr>
+            <w:r>
+              <w:rPr>
+                <w:rFonts w:ascii="Calibri" w:hAnsi="Calibri"/>
+                <w:b w:val="0"/>
+                <w:color w:val="111827"/>
+                <w:sz w:val="17"/>
+              </w:rPr>
+              <w:t>Dual-rate timing</w:t>
+            </w:r>
+          </w:p>
+        </w:tc>
+        <w:tc>
+          <w:tcPr>
+            <w:tcW w:type="dxa" w:w="4450"/>
+            <w:tcMar>
+              <w:top w:w="80" w:type="dxa"/>
+              <w:start w:w="120" w:type="dxa"/>
+              <w:bottom w:w="80" w:type="dxa"/>
+              <w:end w:w="120" w:type="dxa"/>
+            </w:tcMar>
+            <w:vAlign w:val="center"/>
+            <w:shd w:fill="FFFFFF"/>
+          </w:tcPr>
+          <w:p>
+            <w:pPr>
+              <w:spacing w:before="0" w:after="40" w:line="252" w:lineRule="auto"/>
+              <w:jc w:val="left"/>
+            </w:pPr>
+            <w:r>
+              <w:rPr>
+                <w:rFonts w:ascii="Calibri" w:hAnsi="Calibri"/>
+                <w:b w:val="0"/>
+                <w:color w:val="111827"/>
+                <w:sz w:val="17"/>
+              </w:rPr>
+              <w:t>Calculate and expose nominal and data-phase durations separately.</w:t>
+            </w:r>
+          </w:p>
+        </w:tc>
+        <w:tc>
+          <w:tcPr>
+            <w:tcW w:type="dxa" w:w="3260"/>
+            <w:tcMar>
+              <w:top w:w="80" w:type="dxa"/>
+              <w:start w:w="120" w:type="dxa"/>
+              <w:bottom w:w="80" w:type="dxa"/>
+              <w:end w:w="120" w:type="dxa"/>
+            </w:tcMar>
+            <w:vAlign w:val="center"/>
+            <w:shd w:fill="FFFFFF"/>
+          </w:tcPr>
+          <w:p>
+            <w:pPr>
+              <w:spacing w:before="0" w:after="40" w:line="252" w:lineRule="auto"/>
+              <w:jc w:val="left"/>
+            </w:pPr>
+            <w:r>
+              <w:rPr>
+                <w:rFonts w:ascii="Calibri" w:hAnsi="Calibri"/>
+                <w:b w:val="0"/>
+                <w:color w:val="111827"/>
+                <w:sz w:val="17"/>
+              </w:rPr>
+              <w:t>Unit/service</w:t>
+            </w:r>
+          </w:p>
+        </w:tc>
+      </w:tr>
+      <w:tr>
+        <w:trPr>
+          <w:cantSplit/>
+        </w:trPr>
+        <w:tc>
+          <w:tcPr>
+            <w:tcW w:type="dxa" w:w="1650"/>
+            <w:tcMar>
+              <w:top w:w="80" w:type="dxa"/>
+              <w:start w:w="120" w:type="dxa"/>
+              <w:bottom w:w="80" w:type="dxa"/>
+              <w:end w:w="120" w:type="dxa"/>
+            </w:tcMar>
+            <w:vAlign w:val="center"/>
+            <w:shd w:fill="FFFFFF"/>
+          </w:tcPr>
+          <w:p>
+            <w:pPr>
+              <w:spacing w:before="0" w:after="40" w:line="252" w:lineRule="auto"/>
+              <w:jc w:val="center"/>
+            </w:pPr>
+            <w:r>
+              <w:rPr>
+                <w:rFonts w:ascii="Calibri" w:hAnsi="Calibri"/>
+                <w:b w:val="0"/>
+                <w:color w:val="111827"/>
+                <w:sz w:val="17"/>
+              </w:rPr>
+              <w:t>BRS timing</w:t>
+            </w:r>
+          </w:p>
+        </w:tc>
+        <w:tc>
+          <w:tcPr>
+            <w:tcW w:type="dxa" w:w="4450"/>
+            <w:tcMar>
+              <w:top w:w="80" w:type="dxa"/>
+              <w:start w:w="120" w:type="dxa"/>
+              <w:bottom w:w="80" w:type="dxa"/>
+              <w:end w:w="120" w:type="dxa"/>
+            </w:tcMar>
+            <w:vAlign w:val="center"/>
+            <w:shd w:fill="FFFFFF"/>
+          </w:tcPr>
+          <w:p>
+            <w:pPr>
+              <w:spacing w:before="0" w:after="40" w:line="252" w:lineRule="auto"/>
+              <w:jc w:val="left"/>
+            </w:pPr>
+            <w:r>
+              <w:rPr>
+                <w:rFonts w:ascii="Calibri" w:hAnsi="Calibri"/>
+                <w:b w:val="0"/>
+                <w:color w:val="111827"/>
+                <w:sz w:val="17"/>
+              </w:rPr>
+              <w:t>Apply data bitrate only to BRS-enabled FD data phases.</w:t>
+            </w:r>
+          </w:p>
+        </w:tc>
+        <w:tc>
+          <w:tcPr>
+            <w:tcW w:type="dxa" w:w="3260"/>
+            <w:tcMar>
+              <w:top w:w="80" w:type="dxa"/>
+              <w:start w:w="120" w:type="dxa"/>
+              <w:bottom w:w="80" w:type="dxa"/>
+              <w:end w:w="120" w:type="dxa"/>
+            </w:tcMar>
+            <w:vAlign w:val="center"/>
+            <w:shd w:fill="FFFFFF"/>
+          </w:tcPr>
+          <w:p>
+            <w:pPr>
+              <w:spacing w:before="0" w:after="40" w:line="252" w:lineRule="auto"/>
+              <w:jc w:val="left"/>
+            </w:pPr>
+            <w:r>
+              <w:rPr>
+                <w:rFonts w:ascii="Calibri" w:hAnsi="Calibri"/>
+                <w:b w:val="0"/>
+                <w:color w:val="111827"/>
+                <w:sz w:val="17"/>
+              </w:rPr>
+              <w:t>Unit</w:t>
+            </w:r>
+          </w:p>
+        </w:tc>
+      </w:tr>
+      <w:tr>
+        <w:trPr>
+          <w:cantSplit/>
+        </w:trPr>
+        <w:tc>
+          <w:tcPr>
+            <w:tcW w:type="dxa" w:w="1650"/>
+            <w:tcMar>
+              <w:top w:w="80" w:type="dxa"/>
+              <w:start w:w="120" w:type="dxa"/>
+              <w:bottom w:w="80" w:type="dxa"/>
+              <w:end w:w="120" w:type="dxa"/>
+            </w:tcMar>
+            <w:vAlign w:val="center"/>
+            <w:shd w:fill="FFFFFF"/>
+          </w:tcPr>
+          <w:p>
+            <w:pPr>
+              <w:spacing w:before="0" w:after="40" w:line="252" w:lineRule="auto"/>
+              <w:jc w:val="center"/>
+            </w:pPr>
+            <w:r>
+              <w:rPr>
+                <w:rFonts w:ascii="Calibri" w:hAnsi="Calibri"/>
+                <w:b w:val="0"/>
+                <w:color w:val="111827"/>
+                <w:sz w:val="17"/>
+              </w:rPr>
+              <w:t>Mixed arbitration</w:t>
+            </w:r>
+          </w:p>
+        </w:tc>
+        <w:tc>
+          <w:tcPr>
+            <w:tcW w:type="dxa" w:w="4450"/>
+            <w:tcMar>
+              <w:top w:w="80" w:type="dxa"/>
+              <w:start w:w="120" w:type="dxa"/>
+              <w:bottom w:w="80" w:type="dxa"/>
+              <w:end w:w="120" w:type="dxa"/>
+            </w:tcMar>
+            <w:vAlign w:val="center"/>
+            <w:shd w:fill="FFFFFF"/>
+          </w:tcPr>
+          <w:p>
+            <w:pPr>
+              <w:spacing w:before="0" w:after="40" w:line="252" w:lineRule="auto"/>
+              <w:jc w:val="left"/>
+            </w:pPr>
+            <w:r>
+              <w:rPr>
+                <w:rFonts w:ascii="Calibri" w:hAnsi="Calibri"/>
+                <w:b w:val="0"/>
+                <w:color w:val="111827"/>
+                <w:sz w:val="17"/>
+              </w:rPr>
+              <w:t>Preserve identifier priority across classic and FD contenders.</w:t>
+            </w:r>
+          </w:p>
+        </w:tc>
+        <w:tc>
+          <w:tcPr>
+            <w:tcW w:type="dxa" w:w="3260"/>
+            <w:tcMar>
+              <w:top w:w="80" w:type="dxa"/>
+              <w:start w:w="120" w:type="dxa"/>
+              <w:bottom w:w="80" w:type="dxa"/>
+              <w:end w:w="120" w:type="dxa"/>
+            </w:tcMar>
+            <w:vAlign w:val="center"/>
+            <w:shd w:fill="FFFFFF"/>
+          </w:tcPr>
+          <w:p>
+            <w:pPr>
+              <w:spacing w:before="0" w:after="40" w:line="252" w:lineRule="auto"/>
+              <w:jc w:val="left"/>
+            </w:pPr>
+            <w:r>
+              <w:rPr>
+                <w:rFonts w:ascii="Calibri" w:hAnsi="Calibri"/>
+                <w:b w:val="0"/>
+                <w:color w:val="111827"/>
+                <w:sz w:val="17"/>
+              </w:rPr>
+              <w:t>Service</w:t>
+            </w:r>
+          </w:p>
+        </w:tc>
+      </w:tr>
+      <w:tr>
+        <w:trPr>
+          <w:cantSplit/>
+        </w:trPr>
+        <w:tc>
+          <w:tcPr>
+            <w:tcW w:type="dxa" w:w="1650"/>
+            <w:tcMar>
+              <w:top w:w="80" w:type="dxa"/>
+              <w:start w:w="120" w:type="dxa"/>
+              <w:bottom w:w="80" w:type="dxa"/>
+              <w:end w:w="120" w:type="dxa"/>
+            </w:tcMar>
+            <w:vAlign w:val="center"/>
+            <w:shd w:fill="FFFFFF"/>
+          </w:tcPr>
+          <w:p>
+            <w:pPr>
+              <w:spacing w:before="0" w:after="40" w:line="252" w:lineRule="auto"/>
+              <w:jc w:val="center"/>
+            </w:pPr>
+            <w:r>
+              <w:rPr>
+                <w:rFonts w:ascii="Calibri" w:hAnsi="Calibri"/>
+                <w:b w:val="0"/>
+                <w:color w:val="111827"/>
+                <w:sz w:val="17"/>
+              </w:rPr>
+              <w:t>FD submission</w:t>
+            </w:r>
+          </w:p>
+        </w:tc>
+        <w:tc>
+          <w:tcPr>
+            <w:tcW w:type="dxa" w:w="4450"/>
+            <w:tcMar>
+              <w:top w:w="80" w:type="dxa"/>
+              <w:start w:w="120" w:type="dxa"/>
+              <w:bottom w:w="80" w:type="dxa"/>
+              <w:end w:w="120" w:type="dxa"/>
+            </w:tcMar>
+            <w:vAlign w:val="center"/>
+            <w:shd w:fill="FFFFFF"/>
+          </w:tcPr>
+          <w:p>
+            <w:pPr>
+              <w:spacing w:before="0" w:after="40" w:line="252" w:lineRule="auto"/>
+              <w:jc w:val="left"/>
+            </w:pPr>
+            <w:r>
+              <w:rPr>
+                <w:rFonts w:ascii="Calibri" w:hAnsi="Calibri"/>
+                <w:b w:val="0"/>
+                <w:color w:val="111827"/>
+                <w:sz w:val="17"/>
+              </w:rPr>
+              <w:t>Persist and replay 64-byte frames with protocol and BRS metadata.</w:t>
+            </w:r>
+          </w:p>
+        </w:tc>
+        <w:tc>
+          <w:tcPr>
+            <w:tcW w:type="dxa" w:w="3260"/>
+            <w:tcMar>
+              <w:top w:w="80" w:type="dxa"/>
+              <w:start w:w="120" w:type="dxa"/>
+              <w:bottom w:w="80" w:type="dxa"/>
+              <w:end w:w="120" w:type="dxa"/>
+            </w:tcMar>
+            <w:vAlign w:val="center"/>
+            <w:shd w:fill="FFFFFF"/>
+          </w:tcPr>
+          <w:p>
+            <w:pPr>
+              <w:spacing w:before="0" w:after="40" w:line="252" w:lineRule="auto"/>
+              <w:jc w:val="left"/>
+            </w:pPr>
+            <w:r>
+              <w:rPr>
+                <w:rFonts w:ascii="Calibri" w:hAnsi="Calibri"/>
+                <w:b w:val="0"/>
+                <w:color w:val="111827"/>
+                <w:sz w:val="17"/>
+              </w:rPr>
+              <w:t>Service/API</w:t>
+            </w:r>
+          </w:p>
+        </w:tc>
+      </w:tr>
+      <w:tr>
+        <w:trPr>
+          <w:cantSplit/>
+        </w:trPr>
+        <w:tc>
+          <w:tcPr>
+            <w:tcW w:type="dxa" w:w="1650"/>
+            <w:tcMar>
+              <w:top w:w="80" w:type="dxa"/>
+              <w:start w:w="120" w:type="dxa"/>
+              <w:bottom w:w="80" w:type="dxa"/>
+              <w:end w:w="120" w:type="dxa"/>
+            </w:tcMar>
+            <w:vAlign w:val="center"/>
+            <w:shd w:fill="FFFFFF"/>
+          </w:tcPr>
+          <w:p>
+            <w:pPr>
+              <w:spacing w:before="0" w:after="40" w:line="252" w:lineRule="auto"/>
+              <w:jc w:val="center"/>
+            </w:pPr>
+            <w:r>
+              <w:rPr>
+                <w:rFonts w:ascii="Calibri" w:hAnsi="Calibri"/>
+                <w:b w:val="0"/>
+                <w:color w:val="111827"/>
+                <w:sz w:val="17"/>
+              </w:rPr>
+              <w:t>FD DBC boundary</w:t>
+            </w:r>
+          </w:p>
+        </w:tc>
+        <w:tc>
+          <w:tcPr>
+            <w:tcW w:type="dxa" w:w="4450"/>
+            <w:tcMar>
+              <w:top w:w="80" w:type="dxa"/>
+              <w:start w:w="120" w:type="dxa"/>
+              <w:bottom w:w="80" w:type="dxa"/>
+              <w:end w:w="120" w:type="dxa"/>
+            </w:tcMar>
+            <w:vAlign w:val="center"/>
+            <w:shd w:fill="FFFFFF"/>
+          </w:tcPr>
+          <w:p>
+            <w:pPr>
+              <w:spacing w:before="0" w:after="40" w:line="252" w:lineRule="auto"/>
+              <w:jc w:val="left"/>
+            </w:pPr>
+            <w:r>
+              <w:rPr>
+                <w:rFonts w:ascii="Calibri" w:hAnsi="Calibri"/>
+                <w:b w:val="0"/>
+                <w:color w:val="111827"/>
+                <w:sz w:val="17"/>
+              </w:rPr>
+              <w:t>Encode and decode signals through bit 511 of a 64-byte payload.</w:t>
+            </w:r>
+          </w:p>
+        </w:tc>
+        <w:tc>
+          <w:tcPr>
+            <w:tcW w:type="dxa" w:w="3260"/>
+            <w:tcMar>
+              <w:top w:w="80" w:type="dxa"/>
+              <w:start w:w="120" w:type="dxa"/>
+              <w:bottom w:w="80" w:type="dxa"/>
+              <w:end w:w="120" w:type="dxa"/>
+            </w:tcMar>
+            <w:vAlign w:val="center"/>
+            <w:shd w:fill="FFFFFF"/>
+          </w:tcPr>
+          <w:p>
+            <w:pPr>
+              <w:spacing w:before="0" w:after="40" w:line="252" w:lineRule="auto"/>
+              <w:jc w:val="left"/>
+            </w:pPr>
+            <w:r>
+              <w:rPr>
+                <w:rFonts w:ascii="Calibri" w:hAnsi="Calibri"/>
+                <w:b w:val="0"/>
+                <w:color w:val="111827"/>
+                <w:sz w:val="17"/>
+              </w:rPr>
+              <w:t>Unit/service</w:t>
+            </w:r>
+          </w:p>
+        </w:tc>
+      </w:tr>
+      <w:tr>
+        <w:trPr>
+          <w:cantSplit/>
+        </w:trPr>
+        <w:tc>
+          <w:tcPr>
+            <w:tcW w:type="dxa" w:w="1650"/>
+            <w:tcMar>
+              <w:top w:w="80" w:type="dxa"/>
+              <w:start w:w="120" w:type="dxa"/>
+              <w:bottom w:w="80" w:type="dxa"/>
+              <w:end w:w="120" w:type="dxa"/>
+            </w:tcMar>
+            <w:vAlign w:val="center"/>
+            <w:shd w:fill="FFFFFF"/>
+          </w:tcPr>
+          <w:p>
+            <w:pPr>
+              <w:spacing w:before="0" w:after="40" w:line="252" w:lineRule="auto"/>
+              <w:jc w:val="center"/>
+            </w:pPr>
+            <w:r>
+              <w:rPr>
+                <w:rFonts w:ascii="Calibri" w:hAnsi="Calibri"/>
+                <w:b w:val="0"/>
+                <w:color w:val="111827"/>
+                <w:sz w:val="17"/>
+              </w:rPr>
+              <w:t>FD minimization</w:t>
+            </w:r>
+          </w:p>
+        </w:tc>
+        <w:tc>
+          <w:tcPr>
+            <w:tcW w:type="dxa" w:w="4450"/>
+            <w:tcMar>
+              <w:top w:w="80" w:type="dxa"/>
+              <w:start w:w="120" w:type="dxa"/>
+              <w:bottom w:w="80" w:type="dxa"/>
+              <w:end w:w="120" w:type="dxa"/>
+            </w:tcMar>
+            <w:vAlign w:val="center"/>
+            <w:shd w:fill="FFFFFF"/>
+          </w:tcPr>
+          <w:p>
+            <w:pPr>
+              <w:spacing w:before="0" w:after="40" w:line="252" w:lineRule="auto"/>
+              <w:jc w:val="left"/>
+            </w:pPr>
+            <w:r>
+              <w:rPr>
+                <w:rFonts w:ascii="Calibri" w:hAnsi="Calibri"/>
+                <w:b w:val="0"/>
+                <w:color w:val="111827"/>
+                <w:sz w:val="17"/>
+              </w:rPr>
+              <w:t>Exclude 64-byte payloads from audit and outbox evidence.</w:t>
+            </w:r>
+          </w:p>
+        </w:tc>
+        <w:tc>
+          <w:tcPr>
+            <w:tcW w:type="dxa" w:w="3260"/>
+            <w:tcMar>
+              <w:top w:w="80" w:type="dxa"/>
+              <w:start w:w="120" w:type="dxa"/>
+              <w:bottom w:w="80" w:type="dxa"/>
+              <w:end w:w="120" w:type="dxa"/>
+            </w:tcMar>
+            <w:vAlign w:val="center"/>
+            <w:shd w:fill="FFFFFF"/>
+          </w:tcPr>
+          <w:p>
+            <w:pPr>
+              <w:spacing w:before="0" w:after="40" w:line="252" w:lineRule="auto"/>
+              <w:jc w:val="left"/>
+            </w:pPr>
+            <w:r>
+              <w:rPr>
+                <w:rFonts w:ascii="Calibri" w:hAnsi="Calibri"/>
+                <w:b w:val="0"/>
+                <w:color w:val="111827"/>
+                <w:sz w:val="17"/>
+              </w:rPr>
+              <w:t>Service</w:t>
+            </w:r>
+          </w:p>
+        </w:tc>
+      </w:tr>
+      <w:tr>
+        <w:trPr>
+          <w:cantSplit/>
+        </w:trPr>
+        <w:tc>
+          <w:tcPr>
+            <w:tcW w:type="dxa" w:w="1650"/>
+            <w:tcMar>
+              <w:top w:w="80" w:type="dxa"/>
+              <w:start w:w="120" w:type="dxa"/>
+              <w:bottom w:w="80" w:type="dxa"/>
+              <w:end w:w="120" w:type="dxa"/>
+            </w:tcMar>
+            <w:vAlign w:val="center"/>
+            <w:shd w:fill="FFFFFF"/>
+          </w:tcPr>
+          <w:p>
+            <w:pPr>
+              <w:spacing w:before="0" w:after="40" w:line="252" w:lineRule="auto"/>
+              <w:jc w:val="center"/>
+            </w:pPr>
+            <w:r>
+              <w:rPr>
+                <w:rFonts w:ascii="Calibri" w:hAnsi="Calibri"/>
+                <w:b w:val="0"/>
+                <w:color w:val="111827"/>
+                <w:sz w:val="17"/>
+              </w:rPr>
+              <w:t>FD migration</w:t>
+            </w:r>
+          </w:p>
+        </w:tc>
+        <w:tc>
+          <w:tcPr>
+            <w:tcW w:type="dxa" w:w="4450"/>
+            <w:tcMar>
+              <w:top w:w="80" w:type="dxa"/>
+              <w:start w:w="120" w:type="dxa"/>
+              <w:bottom w:w="80" w:type="dxa"/>
+              <w:end w:w="120" w:type="dxa"/>
+            </w:tcMar>
+            <w:vAlign w:val="center"/>
+            <w:shd w:fill="FFFFFF"/>
+          </w:tcPr>
+          <w:p>
+            <w:pPr>
+              <w:spacing w:before="0" w:after="40" w:line="252" w:lineRule="auto"/>
+              <w:jc w:val="left"/>
+            </w:pPr>
+            <w:r>
+              <w:rPr>
+                <w:rFonts w:ascii="Calibri" w:hAnsi="Calibri"/>
+                <w:b w:val="0"/>
+                <w:color w:val="111827"/>
+                <w:sz w:val="17"/>
+              </w:rPr>
+              <w:t>Upgrade and downgrade CAN FD columns with safe classic defaults.</w:t>
+            </w:r>
+          </w:p>
+        </w:tc>
+        <w:tc>
+          <w:tcPr>
+            <w:tcW w:type="dxa" w:w="3260"/>
+            <w:tcMar>
+              <w:top w:w="80" w:type="dxa"/>
+              <w:start w:w="120" w:type="dxa"/>
+              <w:bottom w:w="80" w:type="dxa"/>
+              <w:end w:w="120" w:type="dxa"/>
+            </w:tcMar>
+            <w:vAlign w:val="center"/>
+            <w:shd w:fill="FFFFFF"/>
+          </w:tcPr>
+          <w:p>
+            <w:pPr>
+              <w:spacing w:before="0" w:after="40" w:line="252" w:lineRule="auto"/>
+              <w:jc w:val="left"/>
+            </w:pPr>
+            <w:r>
+              <w:rPr>
+                <w:rFonts w:ascii="Calibri" w:hAnsi="Calibri"/>
+                <w:b w:val="0"/>
+                <w:color w:val="111827"/>
+                <w:sz w:val="17"/>
+              </w:rPr>
+              <w:t>Integration</w:t>
+            </w:r>
+          </w:p>
+        </w:tc>
+      </w:tr>
     </w:tbl>
     <w:p>
       <w:pPr>
@@ -8528,7 +9746,7 @@
           <w:color w:val="111827"/>
           <w:sz w:val="22"/>
         </w:rPr>
-        <w:t xml:space="preserve">, </w:t>
+        <w:t xml:space="preserve"> through </w:t>
       </w:r>
       <w:r>
         <w:rPr>
@@ -8536,23 +9754,7 @@
           <w:color w:val="1F4D78"/>
           <w:sz w:val="19"/>
         </w:rPr>
-        <w:t>0025_can_arbitration</w:t>
-      </w:r>
-      <w:r>
-        <w:rPr>
-          <w:rFonts w:ascii="Calibri" w:hAnsi="Calibri"/>
-          <w:color w:val="111827"/>
-          <w:sz w:val="22"/>
-        </w:rPr>
-        <w:t xml:space="preserve">, and </w:t>
-      </w:r>
-      <w:r>
-        <w:rPr>
-          <w:rFonts w:ascii="Consolas" w:hAnsi="Consolas"/>
-          <w:color w:val="1F4D78"/>
-          <w:sz w:val="19"/>
-        </w:rPr>
-        <w:t>0026_can_dbc_codec</w:t>
+        <w:t>0027_can_fd</w:t>
       </w:r>
       <w:r>
         <w:rPr>
@@ -8740,7 +9942,7 @@
           <w:color w:val="111827"/>
           <w:sz w:val="22"/>
         </w:rPr>
-        <w:t>Automated tests cover validation, priority, timing mathematics, readiness, delivery, utilization, versioning, replay, errors, DBC bit placement, signed scaling, exact conversion, evidence minimization, persistence, and OpenAPI.</w:t>
+        <w:t>Automated tests cover validation, priority, classic and FD timing mathematics, mixed arbitration, readiness, delivery, utilization, versioning, replay, errors, DBC bit placement through 512 bits, signed scaling, exact conversion, evidence minimization, persistence, and OpenAPI.</w:t>
       </w:r>
     </w:p>
     <w:p>
@@ -8907,6 +10109,40 @@
     </w:p>
     <w:p>
       <w:pPr>
+        <w:pStyle w:val="ListBullet"/>
+        <w:numPr>
+          <w:ilvl w:val="0"/>
+          <w:numId w:val="14"/>
+        </w:numPr>
+      </w:pPr>
+      <w:r>
+        <w:rPr>
+          <w:rFonts w:ascii="Calibri" w:hAnsi="Calibri"/>
+          <w:color w:val="111827"/>
+          <w:sz w:val="22"/>
+        </w:rPr>
+        <w:t>CAN FD timing is a deterministic transparent model, not a bit-accurate physical trace; stuffing, synchronization, acknowledgement, and transceiver delay remain deferred.</w:t>
+      </w:r>
+    </w:p>
+    <w:p>
+      <w:pPr>
+        <w:pStyle w:val="ListBullet"/>
+        <w:numPr>
+          <w:ilvl w:val="0"/>
+          <w:numId w:val="14"/>
+        </w:numPr>
+      </w:pPr>
+      <w:r>
+        <w:rPr>
+          <w:rFonts w:ascii="Calibri" w:hAnsi="Calibri"/>
+          <w:color w:val="111827"/>
+          <w:sz w:val="22"/>
+        </w:rPr>
+        <w:t>The public DLC value represents payload length rather than the encoded four-bit wire DLC.</w:t>
+      </w:r>
+    </w:p>
+    <w:p>
+      <w:pPr>
         <w:pStyle w:val="Heading1"/>
         <w:keepNext/>
         <w:keepLines/>
@@ -8922,7 +10158,7 @@
           <w:color w:val="111827"/>
           <w:sz w:val="22"/>
         </w:rPr>
-        <w:t xml:space="preserve">The recommended next increment is IV-4: CAN FD payload and timing contracts with explicit nominal and data-phase bitrate plus mixed classic/FD compatibility. See </w:t>
+        <w:t xml:space="preserve">The recommended next increment is IV-5: deterministic error frames, transmit/receive error counters, bus-off and recovery, plus bounded fault injection. See </w:t>
       </w:r>
       <w:r>
         <w:rPr>
@@ -9503,6 +10739,108 @@
         <w:t xml:space="preserve"> import boundary.</w:t>
       </w:r>
     </w:p>
+    <w:p>
+      <w:pPr>
+        <w:pStyle w:val="ListNumber"/>
+        <w:numPr>
+          <w:ilvl w:val="0"/>
+          <w:numId w:val="15"/>
+        </w:numPr>
+      </w:pPr>
+      <w:r>
+        <w:rPr>
+          <w:rFonts w:ascii="Calibri" w:hAnsi="Calibri"/>
+          <w:color w:val="111827"/>
+          <w:sz w:val="22"/>
+        </w:rPr>
+        <w:t>Compare a 64-byte FD frame with and without BRS at 500/2000 kbit/s.</w:t>
+      </w:r>
+    </w:p>
+    <w:p>
+      <w:pPr>
+        <w:pStyle w:val="ListNumber"/>
+        <w:numPr>
+          <w:ilvl w:val="0"/>
+          <w:numId w:val="15"/>
+        </w:numPr>
+      </w:pPr>
+      <w:r>
+        <w:rPr>
+          <w:rFonts w:ascii="Calibri" w:hAnsi="Calibri"/>
+          <w:color w:val="111827"/>
+          <w:sz w:val="22"/>
+        </w:rPr>
+        <w:t>Explain why classic and FD frames share identifier arbitration priority.</w:t>
+      </w:r>
+    </w:p>
+    <w:p>
+      <w:pPr>
+        <w:pStyle w:val="ListNumber"/>
+        <w:numPr>
+          <w:ilvl w:val="0"/>
+          <w:numId w:val="15"/>
+        </w:numPr>
+      </w:pPr>
+      <w:r>
+        <w:rPr>
+          <w:rFonts w:ascii="Calibri" w:hAnsi="Calibri"/>
+          <w:color w:val="111827"/>
+          <w:sz w:val="22"/>
+        </w:rPr>
+        <w:t>Map the ISO 64-byte payload length to a future four-bit wire DLC adapter.</w:t>
+      </w:r>
+    </w:p>
+    <w:p>
+      <w:pPr>
+        <w:pStyle w:val="ListNumber"/>
+        <w:numPr>
+          <w:ilvl w:val="0"/>
+          <w:numId w:val="15"/>
+        </w:numPr>
+      </w:pPr>
+      <w:r>
+        <w:rPr>
+          <w:rFonts w:ascii="Calibri" w:hAnsi="Calibri"/>
+          <w:color w:val="111827"/>
+          <w:sz w:val="22"/>
+        </w:rPr>
+        <w:t>Design a mixed arbitration test in which a classic frame has a lower CAN ID than an FD frame.</w:t>
+      </w:r>
+    </w:p>
+    <w:p>
+      <w:pPr>
+        <w:pStyle w:val="ListNumber"/>
+        <w:numPr>
+          <w:ilvl w:val="0"/>
+          <w:numId w:val="15"/>
+        </w:numPr>
+      </w:pPr>
+      <w:r>
+        <w:rPr>
+          <w:rFonts w:ascii="Calibri" w:hAnsi="Calibri"/>
+          <w:color w:val="111827"/>
+          <w:sz w:val="22"/>
+        </w:rPr>
+        <w:t>Explain why nominal and data phase durations are rounded upward independently.</w:t>
+      </w:r>
+    </w:p>
+    <w:p>
+      <w:pPr>
+        <w:pStyle w:val="ListNumber"/>
+        <w:numPr>
+          <w:ilvl w:val="0"/>
+          <w:numId w:val="15"/>
+        </w:numPr>
+      </w:pPr>
+      <w:r>
+        <w:rPr>
+          <w:rFonts w:ascii="Calibri" w:hAnsi="Calibri"/>
+          <w:color w:val="111827"/>
+          <w:sz w:val="22"/>
+        </w:rPr>
+        <w:t>Propose a bit-stuffing extension that preserves the IV-4 transparent timing evidence.</w:t>
+      </w:r>
+    </w:p>
     <w:sectPr>
       <w:headerReference w:type="default" r:id="rId9"/>
       <w:footerReference w:type="default" r:id="rId10"/>
@@ -9532,7 +10870,7 @@
         <w:color w:val="667085"/>
         <w:sz w:val="17"/>
       </w:rPr>
-      <w:t>ATEP Volume IV Workbook  |  Version 0.3.0</w:t>
+      <w:t>ATEP Volume IV Workbook  |  Version 0.4.0</w:t>
     </w:r>
     <w:r>
       <w:rPr>

</xml_diff>

<commit_message>
feat(can): add deterministic CAN FD timing (#60)
</commit_message>
<xml_diff>
--- a/docs/ATEP_Volume_IV_CAN_Network_Engineering_Workbook.docx
+++ b/docs/ATEP_Volume_IV_CAN_Network_Engineering_Workbook.docx
@@ -143,7 +143,7 @@
                 <w:color w:val="0B2545"/>
                 <w:sz w:val="19"/>
               </w:rPr>
-              <w:t>0.3.0</w:t>
+              <w:t>0.4.0</w:t>
             </w:r>
           </w:p>
         </w:tc>
@@ -265,7 +265,7 @@
                 <w:color w:val="111827"/>
                 <w:sz w:val="19"/>
               </w:rPr>
-              <w:t>Increments IV-1 through IV-3 implemented</w:t>
+              <w:t>Implemented increments: IV-1 to IV-4</w:t>
             </w:r>
           </w:p>
         </w:tc>
@@ -893,7 +893,7 @@
                 <w:color w:val="111827"/>
                 <w:sz w:val="17"/>
               </w:rPr>
-              <w:t>Increments IV-1 through IV-3</w:t>
+              <w:t>Increments IV-1 through IV-4</w:t>
             </w:r>
           </w:p>
         </w:tc>
@@ -1475,6 +1475,95 @@
           </w:p>
         </w:tc>
       </w:tr>
+      <w:tr>
+        <w:trPr>
+          <w:cantSplit/>
+        </w:trPr>
+        <w:tc>
+          <w:tcPr>
+            <w:tcW w:type="dxa" w:w="1650"/>
+            <w:tcMar>
+              <w:top w:w="80" w:type="dxa"/>
+              <w:start w:w="120" w:type="dxa"/>
+              <w:bottom w:w="80" w:type="dxa"/>
+              <w:end w:w="120" w:type="dxa"/>
+            </w:tcMar>
+            <w:vAlign w:val="center"/>
+            <w:shd w:fill="FFFFFF"/>
+          </w:tcPr>
+          <w:p>
+            <w:pPr>
+              <w:spacing w:before="0" w:after="40" w:line="252" w:lineRule="auto"/>
+              <w:jc w:val="center"/>
+            </w:pPr>
+            <w:r>
+              <w:rPr>
+                <w:rFonts w:ascii="Calibri" w:hAnsi="Calibri"/>
+                <w:b w:val="0"/>
+                <w:color w:val="111827"/>
+                <w:sz w:val="17"/>
+              </w:rPr>
+              <w:t>0.4.0</w:t>
+            </w:r>
+          </w:p>
+        </w:tc>
+        <w:tc>
+          <w:tcPr>
+            <w:tcW w:type="dxa" w:w="4450"/>
+            <w:tcMar>
+              <w:top w:w="80" w:type="dxa"/>
+              <w:start w:w="120" w:type="dxa"/>
+              <w:bottom w:w="80" w:type="dxa"/>
+              <w:end w:w="120" w:type="dxa"/>
+            </w:tcMar>
+            <w:vAlign w:val="center"/>
+            <w:shd w:fill="FFFFFF"/>
+          </w:tcPr>
+          <w:p>
+            <w:pPr>
+              <w:spacing w:before="0" w:after="40" w:line="252" w:lineRule="auto"/>
+              <w:jc w:val="left"/>
+            </w:pPr>
+            <w:r>
+              <w:rPr>
+                <w:rFonts w:ascii="Calibri" w:hAnsi="Calibri"/>
+                <w:b w:val="0"/>
+                <w:color w:val="111827"/>
+                <w:sz w:val="17"/>
+              </w:rPr>
+              <w:t>2026-08-24</w:t>
+            </w:r>
+          </w:p>
+        </w:tc>
+        <w:tc>
+          <w:tcPr>
+            <w:tcW w:type="dxa" w:w="3260"/>
+            <w:tcMar>
+              <w:top w:w="80" w:type="dxa"/>
+              <w:start w:w="120" w:type="dxa"/>
+              <w:bottom w:w="80" w:type="dxa"/>
+              <w:end w:w="120" w:type="dxa"/>
+            </w:tcMar>
+            <w:vAlign w:val="center"/>
+            <w:shd w:fill="FFFFFF"/>
+          </w:tcPr>
+          <w:p>
+            <w:pPr>
+              <w:spacing w:before="0" w:after="40" w:line="252" w:lineRule="auto"/>
+              <w:jc w:val="left"/>
+            </w:pPr>
+            <w:r>
+              <w:rPr>
+                <w:rFonts w:ascii="Calibri" w:hAnsi="Calibri"/>
+                <w:b w:val="0"/>
+                <w:color w:val="111827"/>
+                <w:sz w:val="17"/>
+              </w:rPr>
+              <w:t>Added CAN FD network configuration, ISO payload lengths through 64 bytes, BRS, dual-rate phase timing, mixed classic/FD arbitration, extended DBC payloads, migration, and tests.</w:t>
+            </w:r>
+          </w:p>
+        </w:tc>
+      </w:tr>
     </w:tbl>
     <w:p>
       <w:pPr>
@@ -1515,7 +1604,7 @@
           <w:color w:val="111827"/>
           <w:sz w:val="22"/>
         </w:rPr>
-        <w:t>One classic CAN network per vehicle.</w:t>
+        <w:t>One classic or CAN FD-enabled network per vehicle.</w:t>
       </w:r>
     </w:p>
     <w:p>
@@ -1583,7 +1672,24 @@
           <w:color w:val="111827"/>
           <w:sz w:val="22"/>
         </w:rPr>
-        <w:t>Classic CAN payloads from zero to eight bytes.</w:t>
+        <w:t>Classic CAN payloads from zero to eight bytes and ISO-defined CAN FD payloads through 64 bytes.</w:t>
+      </w:r>
+    </w:p>
+    <w:p>
+      <w:pPr>
+        <w:pStyle w:val="ListBullet"/>
+        <w:numPr>
+          <w:ilvl w:val="0"/>
+          <w:numId w:val="11"/>
+        </w:numPr>
+      </w:pPr>
+      <w:r>
+        <w:rPr>
+          <w:rFonts w:ascii="Calibri" w:hAnsi="Calibri"/>
+          <w:color w:val="111827"/>
+          <w:sz w:val="22"/>
+        </w:rPr>
+        <w:t>Nominal and data-phase bitrates, frame protocol, and bitrate-switch contracts.</w:t>
       </w:r>
     </w:p>
     <w:p>
@@ -1758,6 +1864,40 @@
     </w:p>
     <w:p>
       <w:pPr>
+        <w:pStyle w:val="ListBullet"/>
+        <w:numPr>
+          <w:ilvl w:val="0"/>
+          <w:numId w:val="11"/>
+        </w:numPr>
+      </w:pPr>
+      <w:r>
+        <w:rPr>
+          <w:rFonts w:ascii="Calibri" w:hAnsi="Calibri"/>
+          <w:color w:val="111827"/>
+          <w:sz w:val="22"/>
+        </w:rPr>
+        <w:t>Deterministic mixed classic/FD arbitration with phase-specific timing evidence.</w:t>
+      </w:r>
+    </w:p>
+    <w:p>
+      <w:pPr>
+        <w:pStyle w:val="ListBullet"/>
+        <w:numPr>
+          <w:ilvl w:val="0"/>
+          <w:numId w:val="11"/>
+        </w:numPr>
+      </w:pPr>
+      <w:r>
+        <w:rPr>
+          <w:rFonts w:ascii="Calibri" w:hAnsi="Calibri"/>
+          <w:color w:val="111827"/>
+          <w:sz w:val="22"/>
+        </w:rPr>
+        <w:t>DBC signal placement and codec payloads through 512 contracted bits.</w:t>
+      </w:r>
+    </w:p>
+    <w:p>
+      <w:pPr>
         <w:pStyle w:val="Heading2"/>
         <w:keepNext/>
         <w:keepLines/>
@@ -1814,23 +1954,6 @@
           <w:sz w:val="22"/>
         </w:rPr>
         <w:t xml:space="preserve"> parsing, attributes, value tables, comments, and multiplexing.</w:t>
-      </w:r>
-    </w:p>
-    <w:p>
-      <w:pPr>
-        <w:pStyle w:val="ListBullet"/>
-        <w:numPr>
-          <w:ilvl w:val="0"/>
-          <w:numId w:val="12"/>
-        </w:numPr>
-      </w:pPr>
-      <w:r>
-        <w:rPr>
-          <w:rFonts w:ascii="Calibri" w:hAnsi="Calibri"/>
-          <w:color w:val="111827"/>
-          <w:sz w:val="22"/>
-        </w:rPr>
-        <w:t>CAN FD payloads and data-phase bitrate.</w:t>
       </w:r>
     </w:p>
     <w:p>
@@ -1938,7 +2061,7 @@
           <w:color w:val="111827"/>
           <w:sz w:val="22"/>
         </w:rPr>
-        <w:t xml:space="preserve"> stores vehicle ownership, identity, bitrate, nodes, frame contracts, version, logical microsecond time, and the next sequence. </w:t>
+        <w:t xml:space="preserve"> stores vehicle ownership, identity, nominal bitrate, optional CAN FD data bitrate, FD enablement, nodes, frame contracts, version, logical microsecond time, and the next sequence. </w:t>
       </w:r>
       <w:r>
         <w:rPr>
@@ -2006,7 +2129,7 @@
           <w:color w:val="111827"/>
           <w:sz w:val="22"/>
         </w:rPr>
-        <w:t xml:space="preserve"> stores the canonical encode/decode request and deterministic payload, raw, and physical result for exact replay.</w:t>
+        <w:t xml:space="preserve"> stores the canonical encode/decode request and deterministic payload, raw, and physical result for exact replay. Frame contracts and transmissions preserve classic/FD protocol and BRS identity; arbitration results also preserve per-phase bit counts and durations.</w:t>
       </w:r>
     </w:p>
     <w:p>
@@ -2016,7 +2139,7 @@
           <w:color w:val="111827"/>
           <w:sz w:val="22"/>
         </w:rPr>
-        <w:t>Bounds are architectural controls: 64 nodes, 256 contracts, 8 payload bytes, a 10-second maximum logical advance per submission, safe history pagination, and one network aggregate per vehicle.</w:t>
+        <w:t>Bounds are architectural controls: 64 nodes, 256 contracts, 8 classic or 64 FD payload bytes, a 10-second maximum logical advance per submission, safe history pagination, and one network aggregate per vehicle.</w:t>
       </w:r>
     </w:p>
     <w:p>
@@ -3940,6 +4063,46 @@
     </w:p>
     <w:p>
       <w:pPr>
+        <w:pStyle w:val="Heading2"/>
+        <w:keepNext/>
+        <w:keepLines/>
+      </w:pPr>
+      <w:r>
+        <w:t>8.3 CAN FD and Mixed-Bus Semantics</w:t>
+      </w:r>
+    </w:p>
+    <w:p>
+      <w:r>
+        <w:rPr>
+          <w:rFonts w:ascii="Calibri" w:hAnsi="Calibri"/>
+          <w:color w:val="111827"/>
+          <w:sz w:val="22"/>
+        </w:rPr>
+        <w:t>A CAN FD-enabled network defines a nominal bitrate and a data bitrate no lower than the nominal rate. Classic contracts remain limited to eight bytes. FD contracts accept only the ISO-defined payload lengths 0-8, 12, 16, 20, 24, 32, 48, and 64 bytes. BRS is valid only for FD contracts.</w:t>
+      </w:r>
+    </w:p>
+    <w:p>
+      <w:r>
+        <w:rPr>
+          <w:rFonts w:ascii="Calibri" w:hAnsi="Calibri"/>
+          <w:color w:val="111827"/>
+          <w:sz w:val="22"/>
+        </w:rPr>
+        <w:t>The deterministic timing model excludes bit stuffing and electrical effects. Standard and extended FD frames allocate 32 and 52 nominal-phase bits. The data phase contains payload bits plus a 17-bit CRC through 16 bytes or 21-bit CRC above 16 bytes. Nominal and data phase durations are rounded up independently. BRS selects the data bitrate only for the data phase; without BRS, both phases use the nominal bitrate.</w:t>
+      </w:r>
+    </w:p>
+    <w:p>
+      <w:r>
+        <w:rPr>
+          <w:rFonts w:ascii="Calibri" w:hAnsi="Calibri"/>
+          <w:color w:val="111827"/>
+          <w:sz w:val="22"/>
+        </w:rPr>
+        <w:t>Classic and FD contenders use the same CAN identifier, format, and contract tie-break rules. The protocol does not alter priority. Persisted arbitration evidence reports protocol, BRS, phase bit counts, phase durations, total duration, deliveries, and utilization. Audit and outbox metrics report FD and BRS frame counts without payload bytes.</w:t>
+      </w:r>
+    </w:p>
+    <w:p>
+      <w:pPr>
         <w:pStyle w:val="Heading1"/>
         <w:keepNext/>
         <w:keepLines/>
@@ -3971,7 +4134,7 @@
           <w:color w:val="111827"/>
           <w:sz w:val="22"/>
         </w:rPr>
-        <w:t>. IV-1 through IV-3 implement CAN-F-001 through CAN-F-030 and CAN-NF-001 through CAN-NF-011.</w:t>
+        <w:t>. IV-1 through IV-4 implement CAN-F-001 through CAN-F-040 and CAN-NF-001 through CAN-NF-014.</w:t>
       </w:r>
     </w:p>
     <w:p>
@@ -4222,6 +4385,82 @@
           <w:sz w:val="22"/>
         </w:rPr>
         <w:t>Encoding creates a payload but does not automatically transmit it. A later caller may submit or arbitrate that payload, keeping semantic conversion and transport execution independently testable.</w:t>
+      </w:r>
+    </w:p>
+    <w:p>
+      <w:pPr>
+        <w:pStyle w:val="Heading2"/>
+        <w:keepNext/>
+        <w:keepLines/>
+      </w:pPr>
+      <w:r>
+        <w:t>ADR-CAN-013 - Model CAN FD as a Backward-Compatible Contract Extension</w:t>
+      </w:r>
+    </w:p>
+    <w:p>
+      <w:r>
+        <w:rPr>
+          <w:rFonts w:ascii="Calibri" w:hAnsi="Calibri"/>
+          <w:color w:val="111827"/>
+          <w:sz w:val="22"/>
+        </w:rPr>
+        <w:t>Classic is the default protocol for existing contracts and persisted rows. An FD-enabled network may carry classic and FD frames, so IV-1 through IV-3 clients remain valid while new clients opt into FD.</w:t>
+      </w:r>
+    </w:p>
+    <w:p>
+      <w:pPr>
+        <w:pStyle w:val="Heading2"/>
+        <w:keepNext/>
+        <w:keepLines/>
+      </w:pPr>
+      <w:r>
+        <w:t>ADR-CAN-014 - Separate Nominal and Data Timing Phases</w:t>
+      </w:r>
+    </w:p>
+    <w:p>
+      <w:r>
+        <w:rPr>
+          <w:rFonts w:ascii="Calibri" w:hAnsi="Calibri"/>
+          <w:color w:val="111827"/>
+          <w:sz w:val="22"/>
+        </w:rPr>
+        <w:t>CAN FD arbitration remains at the nominal rate. Only an FD data phase with BRS uses the configured data bitrate. Persisting both phases makes timing assumptions observable and independently testable.</w:t>
+      </w:r>
+    </w:p>
+    <w:p>
+      <w:pPr>
+        <w:pStyle w:val="Heading2"/>
+        <w:keepNext/>
+        <w:keepLines/>
+      </w:pPr>
+      <w:r>
+        <w:t>ADR-CAN-015 - Use Payload Length Semantics at the API Boundary</w:t>
+      </w:r>
+    </w:p>
+    <w:p>
+      <w:r>
+        <w:rPr>
+          <w:rFonts w:ascii="Calibri" w:hAnsi="Calibri"/>
+          <w:color w:val="111827"/>
+          <w:sz w:val="22"/>
+        </w:rPr>
+        <w:t xml:space="preserve">The public </w:t>
+      </w:r>
+      <w:r>
+        <w:rPr>
+          <w:rFonts w:ascii="Consolas" w:hAnsi="Consolas"/>
+          <w:color w:val="1F4D78"/>
+          <w:sz w:val="19"/>
+        </w:rPr>
+        <w:t>dlc</w:t>
+      </w:r>
+      <w:r>
+        <w:rPr>
+          <w:rFonts w:ascii="Calibri" w:hAnsi="Calibri"/>
+          <w:color w:val="111827"/>
+          <w:sz w:val="22"/>
+        </w:rPr>
+        <w:t xml:space="preserve"> field continues to represent payload bytes for compatibility. Validation restricts FD values to ISO-defined payload sizes, while a future wire adapter can map larger lengths to their four-bit encoded DLC values.</w:t>
       </w:r>
     </w:p>
     <w:p>
@@ -8457,6 +8696,985 @@
           </w:p>
         </w:tc>
       </w:tr>
+      <w:tr>
+        <w:trPr>
+          <w:cantSplit/>
+        </w:trPr>
+        <w:tc>
+          <w:tcPr>
+            <w:tcW w:type="dxa" w:w="1650"/>
+            <w:tcMar>
+              <w:top w:w="80" w:type="dxa"/>
+              <w:start w:w="120" w:type="dxa"/>
+              <w:bottom w:w="80" w:type="dxa"/>
+              <w:end w:w="120" w:type="dxa"/>
+            </w:tcMar>
+            <w:vAlign w:val="center"/>
+            <w:shd w:fill="FFFFFF"/>
+          </w:tcPr>
+          <w:p>
+            <w:pPr>
+              <w:spacing w:before="0" w:after="40" w:line="252" w:lineRule="auto"/>
+              <w:jc w:val="center"/>
+            </w:pPr>
+            <w:r>
+              <w:rPr>
+                <w:rFonts w:ascii="Calibri" w:hAnsi="Calibri"/>
+                <w:b w:val="0"/>
+                <w:color w:val="111827"/>
+                <w:sz w:val="17"/>
+              </w:rPr>
+              <w:t>FD enablement</w:t>
+            </w:r>
+          </w:p>
+        </w:tc>
+        <w:tc>
+          <w:tcPr>
+            <w:tcW w:type="dxa" w:w="4450"/>
+            <w:tcMar>
+              <w:top w:w="80" w:type="dxa"/>
+              <w:start w:w="120" w:type="dxa"/>
+              <w:bottom w:w="80" w:type="dxa"/>
+              <w:end w:w="120" w:type="dxa"/>
+            </w:tcMar>
+            <w:vAlign w:val="center"/>
+            <w:shd w:fill="FFFFFF"/>
+          </w:tcPr>
+          <w:p>
+            <w:pPr>
+              <w:spacing w:before="0" w:after="40" w:line="252" w:lineRule="auto"/>
+              <w:jc w:val="left"/>
+            </w:pPr>
+            <w:r>
+              <w:rPr>
+                <w:rFonts w:ascii="Calibri" w:hAnsi="Calibri"/>
+                <w:b w:val="0"/>
+                <w:color w:val="111827"/>
+                <w:sz w:val="17"/>
+              </w:rPr>
+              <w:t>Require a bounded data bitrate for an FD-enabled network.</w:t>
+            </w:r>
+          </w:p>
+        </w:tc>
+        <w:tc>
+          <w:tcPr>
+            <w:tcW w:type="dxa" w:w="3260"/>
+            <w:tcMar>
+              <w:top w:w="80" w:type="dxa"/>
+              <w:start w:w="120" w:type="dxa"/>
+              <w:bottom w:w="80" w:type="dxa"/>
+              <w:end w:w="120" w:type="dxa"/>
+            </w:tcMar>
+            <w:vAlign w:val="center"/>
+            <w:shd w:fill="FFFFFF"/>
+          </w:tcPr>
+          <w:p>
+            <w:pPr>
+              <w:spacing w:before="0" w:after="40" w:line="252" w:lineRule="auto"/>
+              <w:jc w:val="left"/>
+            </w:pPr>
+            <w:r>
+              <w:rPr>
+                <w:rFonts w:ascii="Calibri" w:hAnsi="Calibri"/>
+                <w:b w:val="0"/>
+                <w:color w:val="111827"/>
+                <w:sz w:val="17"/>
+              </w:rPr>
+              <w:t>Schema/service</w:t>
+            </w:r>
+          </w:p>
+        </w:tc>
+      </w:tr>
+      <w:tr>
+        <w:trPr>
+          <w:cantSplit/>
+        </w:trPr>
+        <w:tc>
+          <w:tcPr>
+            <w:tcW w:type="dxa" w:w="1650"/>
+            <w:tcMar>
+              <w:top w:w="80" w:type="dxa"/>
+              <w:start w:w="120" w:type="dxa"/>
+              <w:bottom w:w="80" w:type="dxa"/>
+              <w:end w:w="120" w:type="dxa"/>
+            </w:tcMar>
+            <w:vAlign w:val="center"/>
+            <w:shd w:fill="FFFFFF"/>
+          </w:tcPr>
+          <w:p>
+            <w:pPr>
+              <w:spacing w:before="0" w:after="40" w:line="252" w:lineRule="auto"/>
+              <w:jc w:val="center"/>
+            </w:pPr>
+            <w:r>
+              <w:rPr>
+                <w:rFonts w:ascii="Calibri" w:hAnsi="Calibri"/>
+                <w:b w:val="0"/>
+                <w:color w:val="111827"/>
+                <w:sz w:val="17"/>
+              </w:rPr>
+              <w:t>ISO FD length</w:t>
+            </w:r>
+          </w:p>
+        </w:tc>
+        <w:tc>
+          <w:tcPr>
+            <w:tcW w:type="dxa" w:w="4450"/>
+            <w:tcMar>
+              <w:top w:w="80" w:type="dxa"/>
+              <w:start w:w="120" w:type="dxa"/>
+              <w:bottom w:w="80" w:type="dxa"/>
+              <w:end w:w="120" w:type="dxa"/>
+            </w:tcMar>
+            <w:vAlign w:val="center"/>
+            <w:shd w:fill="FFFFFF"/>
+          </w:tcPr>
+          <w:p>
+            <w:pPr>
+              <w:spacing w:before="0" w:after="40" w:line="252" w:lineRule="auto"/>
+              <w:jc w:val="left"/>
+            </w:pPr>
+            <w:r>
+              <w:rPr>
+                <w:rFonts w:ascii="Calibri" w:hAnsi="Calibri"/>
+                <w:b w:val="0"/>
+                <w:color w:val="111827"/>
+                <w:sz w:val="17"/>
+              </w:rPr>
+              <w:t>Accept only 0-8, 12, 16, 20, 24, 32, 48, and 64-byte FD payloads.</w:t>
+            </w:r>
+          </w:p>
+        </w:tc>
+        <w:tc>
+          <w:tcPr>
+            <w:tcW w:type="dxa" w:w="3260"/>
+            <w:tcMar>
+              <w:top w:w="80" w:type="dxa"/>
+              <w:start w:w="120" w:type="dxa"/>
+              <w:bottom w:w="80" w:type="dxa"/>
+              <w:end w:w="120" w:type="dxa"/>
+            </w:tcMar>
+            <w:vAlign w:val="center"/>
+            <w:shd w:fill="FFFFFF"/>
+          </w:tcPr>
+          <w:p>
+            <w:pPr>
+              <w:spacing w:before="0" w:after="40" w:line="252" w:lineRule="auto"/>
+              <w:jc w:val="left"/>
+            </w:pPr>
+            <w:r>
+              <w:rPr>
+                <w:rFonts w:ascii="Calibri" w:hAnsi="Calibri"/>
+                <w:b w:val="0"/>
+                <w:color w:val="111827"/>
+                <w:sz w:val="17"/>
+              </w:rPr>
+              <w:t>Schema</w:t>
+            </w:r>
+          </w:p>
+        </w:tc>
+      </w:tr>
+      <w:tr>
+        <w:trPr>
+          <w:cantSplit/>
+        </w:trPr>
+        <w:tc>
+          <w:tcPr>
+            <w:tcW w:type="dxa" w:w="1650"/>
+            <w:tcMar>
+              <w:top w:w="80" w:type="dxa"/>
+              <w:start w:w="120" w:type="dxa"/>
+              <w:bottom w:w="80" w:type="dxa"/>
+              <w:end w:w="120" w:type="dxa"/>
+            </w:tcMar>
+            <w:vAlign w:val="center"/>
+            <w:shd w:fill="FFFFFF"/>
+          </w:tcPr>
+          <w:p>
+            <w:pPr>
+              <w:spacing w:before="0" w:after="40" w:line="252" w:lineRule="auto"/>
+              <w:jc w:val="center"/>
+            </w:pPr>
+            <w:r>
+              <w:rPr>
+                <w:rFonts w:ascii="Calibri" w:hAnsi="Calibri"/>
+                <w:b w:val="0"/>
+                <w:color w:val="111827"/>
+                <w:sz w:val="17"/>
+              </w:rPr>
+              <w:t>Classic compatibility</w:t>
+            </w:r>
+          </w:p>
+        </w:tc>
+        <w:tc>
+          <w:tcPr>
+            <w:tcW w:type="dxa" w:w="4450"/>
+            <w:tcMar>
+              <w:top w:w="80" w:type="dxa"/>
+              <w:start w:w="120" w:type="dxa"/>
+              <w:bottom w:w="80" w:type="dxa"/>
+              <w:end w:w="120" w:type="dxa"/>
+            </w:tcMar>
+            <w:vAlign w:val="center"/>
+            <w:shd w:fill="FFFFFF"/>
+          </w:tcPr>
+          <w:p>
+            <w:pPr>
+              <w:spacing w:before="0" w:after="40" w:line="252" w:lineRule="auto"/>
+              <w:jc w:val="left"/>
+            </w:pPr>
+            <w:r>
+              <w:rPr>
+                <w:rFonts w:ascii="Calibri" w:hAnsi="Calibri"/>
+                <w:b w:val="0"/>
+                <w:color w:val="111827"/>
+                <w:sz w:val="17"/>
+              </w:rPr>
+              <w:t>Preserve eight-byte limits and prior timing results.</w:t>
+            </w:r>
+          </w:p>
+        </w:tc>
+        <w:tc>
+          <w:tcPr>
+            <w:tcW w:type="dxa" w:w="3260"/>
+            <w:tcMar>
+              <w:top w:w="80" w:type="dxa"/>
+              <w:start w:w="120" w:type="dxa"/>
+              <w:bottom w:w="80" w:type="dxa"/>
+              <w:end w:w="120" w:type="dxa"/>
+            </w:tcMar>
+            <w:vAlign w:val="center"/>
+            <w:shd w:fill="FFFFFF"/>
+          </w:tcPr>
+          <w:p>
+            <w:pPr>
+              <w:spacing w:before="0" w:after="40" w:line="252" w:lineRule="auto"/>
+              <w:jc w:val="left"/>
+            </w:pPr>
+            <w:r>
+              <w:rPr>
+                <w:rFonts w:ascii="Calibri" w:hAnsi="Calibri"/>
+                <w:b w:val="0"/>
+                <w:color w:val="111827"/>
+                <w:sz w:val="17"/>
+              </w:rPr>
+              <w:t>Regression</w:t>
+            </w:r>
+          </w:p>
+        </w:tc>
+      </w:tr>
+      <w:tr>
+        <w:trPr>
+          <w:cantSplit/>
+        </w:trPr>
+        <w:tc>
+          <w:tcPr>
+            <w:tcW w:type="dxa" w:w="1650"/>
+            <w:tcMar>
+              <w:top w:w="80" w:type="dxa"/>
+              <w:start w:w="120" w:type="dxa"/>
+              <w:bottom w:w="80" w:type="dxa"/>
+              <w:end w:w="120" w:type="dxa"/>
+            </w:tcMar>
+            <w:vAlign w:val="center"/>
+            <w:shd w:fill="FFFFFF"/>
+          </w:tcPr>
+          <w:p>
+            <w:pPr>
+              <w:spacing w:before="0" w:after="40" w:line="252" w:lineRule="auto"/>
+              <w:jc w:val="center"/>
+            </w:pPr>
+            <w:r>
+              <w:rPr>
+                <w:rFonts w:ascii="Calibri" w:hAnsi="Calibri"/>
+                <w:b w:val="0"/>
+                <w:color w:val="111827"/>
+                <w:sz w:val="17"/>
+              </w:rPr>
+              <w:t>BRS restriction</w:t>
+            </w:r>
+          </w:p>
+        </w:tc>
+        <w:tc>
+          <w:tcPr>
+            <w:tcW w:type="dxa" w:w="4450"/>
+            <w:tcMar>
+              <w:top w:w="80" w:type="dxa"/>
+              <w:start w:w="120" w:type="dxa"/>
+              <w:bottom w:w="80" w:type="dxa"/>
+              <w:end w:w="120" w:type="dxa"/>
+            </w:tcMar>
+            <w:vAlign w:val="center"/>
+            <w:shd w:fill="FFFFFF"/>
+          </w:tcPr>
+          <w:p>
+            <w:pPr>
+              <w:spacing w:before="0" w:after="40" w:line="252" w:lineRule="auto"/>
+              <w:jc w:val="left"/>
+            </w:pPr>
+            <w:r>
+              <w:rPr>
+                <w:rFonts w:ascii="Calibri" w:hAnsi="Calibri"/>
+                <w:b w:val="0"/>
+                <w:color w:val="111827"/>
+                <w:sz w:val="17"/>
+              </w:rPr>
+              <w:t>Reject bitrate switching on classic contracts.</w:t>
+            </w:r>
+          </w:p>
+        </w:tc>
+        <w:tc>
+          <w:tcPr>
+            <w:tcW w:type="dxa" w:w="3260"/>
+            <w:tcMar>
+              <w:top w:w="80" w:type="dxa"/>
+              <w:start w:w="120" w:type="dxa"/>
+              <w:bottom w:w="80" w:type="dxa"/>
+              <w:end w:w="120" w:type="dxa"/>
+            </w:tcMar>
+            <w:vAlign w:val="center"/>
+            <w:shd w:fill="FFFFFF"/>
+          </w:tcPr>
+          <w:p>
+            <w:pPr>
+              <w:spacing w:before="0" w:after="40" w:line="252" w:lineRule="auto"/>
+              <w:jc w:val="left"/>
+            </w:pPr>
+            <w:r>
+              <w:rPr>
+                <w:rFonts w:ascii="Calibri" w:hAnsi="Calibri"/>
+                <w:b w:val="0"/>
+                <w:color w:val="111827"/>
+                <w:sz w:val="17"/>
+              </w:rPr>
+              <w:t>Schema</w:t>
+            </w:r>
+          </w:p>
+        </w:tc>
+      </w:tr>
+      <w:tr>
+        <w:trPr>
+          <w:cantSplit/>
+        </w:trPr>
+        <w:tc>
+          <w:tcPr>
+            <w:tcW w:type="dxa" w:w="1650"/>
+            <w:tcMar>
+              <w:top w:w="80" w:type="dxa"/>
+              <w:start w:w="120" w:type="dxa"/>
+              <w:bottom w:w="80" w:type="dxa"/>
+              <w:end w:w="120" w:type="dxa"/>
+            </w:tcMar>
+            <w:vAlign w:val="center"/>
+            <w:shd w:fill="FFFFFF"/>
+          </w:tcPr>
+          <w:p>
+            <w:pPr>
+              <w:spacing w:before="0" w:after="40" w:line="252" w:lineRule="auto"/>
+              <w:jc w:val="center"/>
+            </w:pPr>
+            <w:r>
+              <w:rPr>
+                <w:rFonts w:ascii="Calibri" w:hAnsi="Calibri"/>
+                <w:b w:val="0"/>
+                <w:color w:val="111827"/>
+                <w:sz w:val="17"/>
+              </w:rPr>
+              <w:t>Dual-rate timing</w:t>
+            </w:r>
+          </w:p>
+        </w:tc>
+        <w:tc>
+          <w:tcPr>
+            <w:tcW w:type="dxa" w:w="4450"/>
+            <w:tcMar>
+              <w:top w:w="80" w:type="dxa"/>
+              <w:start w:w="120" w:type="dxa"/>
+              <w:bottom w:w="80" w:type="dxa"/>
+              <w:end w:w="120" w:type="dxa"/>
+            </w:tcMar>
+            <w:vAlign w:val="center"/>
+            <w:shd w:fill="FFFFFF"/>
+          </w:tcPr>
+          <w:p>
+            <w:pPr>
+              <w:spacing w:before="0" w:after="40" w:line="252" w:lineRule="auto"/>
+              <w:jc w:val="left"/>
+            </w:pPr>
+            <w:r>
+              <w:rPr>
+                <w:rFonts w:ascii="Calibri" w:hAnsi="Calibri"/>
+                <w:b w:val="0"/>
+                <w:color w:val="111827"/>
+                <w:sz w:val="17"/>
+              </w:rPr>
+              <w:t>Calculate and expose nominal and data-phase durations separately.</w:t>
+            </w:r>
+          </w:p>
+        </w:tc>
+        <w:tc>
+          <w:tcPr>
+            <w:tcW w:type="dxa" w:w="3260"/>
+            <w:tcMar>
+              <w:top w:w="80" w:type="dxa"/>
+              <w:start w:w="120" w:type="dxa"/>
+              <w:bottom w:w="80" w:type="dxa"/>
+              <w:end w:w="120" w:type="dxa"/>
+            </w:tcMar>
+            <w:vAlign w:val="center"/>
+            <w:shd w:fill="FFFFFF"/>
+          </w:tcPr>
+          <w:p>
+            <w:pPr>
+              <w:spacing w:before="0" w:after="40" w:line="252" w:lineRule="auto"/>
+              <w:jc w:val="left"/>
+            </w:pPr>
+            <w:r>
+              <w:rPr>
+                <w:rFonts w:ascii="Calibri" w:hAnsi="Calibri"/>
+                <w:b w:val="0"/>
+                <w:color w:val="111827"/>
+                <w:sz w:val="17"/>
+              </w:rPr>
+              <w:t>Unit/service</w:t>
+            </w:r>
+          </w:p>
+        </w:tc>
+      </w:tr>
+      <w:tr>
+        <w:trPr>
+          <w:cantSplit/>
+        </w:trPr>
+        <w:tc>
+          <w:tcPr>
+            <w:tcW w:type="dxa" w:w="1650"/>
+            <w:tcMar>
+              <w:top w:w="80" w:type="dxa"/>
+              <w:start w:w="120" w:type="dxa"/>
+              <w:bottom w:w="80" w:type="dxa"/>
+              <w:end w:w="120" w:type="dxa"/>
+            </w:tcMar>
+            <w:vAlign w:val="center"/>
+            <w:shd w:fill="FFFFFF"/>
+          </w:tcPr>
+          <w:p>
+            <w:pPr>
+              <w:spacing w:before="0" w:after="40" w:line="252" w:lineRule="auto"/>
+              <w:jc w:val="center"/>
+            </w:pPr>
+            <w:r>
+              <w:rPr>
+                <w:rFonts w:ascii="Calibri" w:hAnsi="Calibri"/>
+                <w:b w:val="0"/>
+                <w:color w:val="111827"/>
+                <w:sz w:val="17"/>
+              </w:rPr>
+              <w:t>BRS timing</w:t>
+            </w:r>
+          </w:p>
+        </w:tc>
+        <w:tc>
+          <w:tcPr>
+            <w:tcW w:type="dxa" w:w="4450"/>
+            <w:tcMar>
+              <w:top w:w="80" w:type="dxa"/>
+              <w:start w:w="120" w:type="dxa"/>
+              <w:bottom w:w="80" w:type="dxa"/>
+              <w:end w:w="120" w:type="dxa"/>
+            </w:tcMar>
+            <w:vAlign w:val="center"/>
+            <w:shd w:fill="FFFFFF"/>
+          </w:tcPr>
+          <w:p>
+            <w:pPr>
+              <w:spacing w:before="0" w:after="40" w:line="252" w:lineRule="auto"/>
+              <w:jc w:val="left"/>
+            </w:pPr>
+            <w:r>
+              <w:rPr>
+                <w:rFonts w:ascii="Calibri" w:hAnsi="Calibri"/>
+                <w:b w:val="0"/>
+                <w:color w:val="111827"/>
+                <w:sz w:val="17"/>
+              </w:rPr>
+              <w:t>Apply data bitrate only to BRS-enabled FD data phases.</w:t>
+            </w:r>
+          </w:p>
+        </w:tc>
+        <w:tc>
+          <w:tcPr>
+            <w:tcW w:type="dxa" w:w="3260"/>
+            <w:tcMar>
+              <w:top w:w="80" w:type="dxa"/>
+              <w:start w:w="120" w:type="dxa"/>
+              <w:bottom w:w="80" w:type="dxa"/>
+              <w:end w:w="120" w:type="dxa"/>
+            </w:tcMar>
+            <w:vAlign w:val="center"/>
+            <w:shd w:fill="FFFFFF"/>
+          </w:tcPr>
+          <w:p>
+            <w:pPr>
+              <w:spacing w:before="0" w:after="40" w:line="252" w:lineRule="auto"/>
+              <w:jc w:val="left"/>
+            </w:pPr>
+            <w:r>
+              <w:rPr>
+                <w:rFonts w:ascii="Calibri" w:hAnsi="Calibri"/>
+                <w:b w:val="0"/>
+                <w:color w:val="111827"/>
+                <w:sz w:val="17"/>
+              </w:rPr>
+              <w:t>Unit</w:t>
+            </w:r>
+          </w:p>
+        </w:tc>
+      </w:tr>
+      <w:tr>
+        <w:trPr>
+          <w:cantSplit/>
+        </w:trPr>
+        <w:tc>
+          <w:tcPr>
+            <w:tcW w:type="dxa" w:w="1650"/>
+            <w:tcMar>
+              <w:top w:w="80" w:type="dxa"/>
+              <w:start w:w="120" w:type="dxa"/>
+              <w:bottom w:w="80" w:type="dxa"/>
+              <w:end w:w="120" w:type="dxa"/>
+            </w:tcMar>
+            <w:vAlign w:val="center"/>
+            <w:shd w:fill="FFFFFF"/>
+          </w:tcPr>
+          <w:p>
+            <w:pPr>
+              <w:spacing w:before="0" w:after="40" w:line="252" w:lineRule="auto"/>
+              <w:jc w:val="center"/>
+            </w:pPr>
+            <w:r>
+              <w:rPr>
+                <w:rFonts w:ascii="Calibri" w:hAnsi="Calibri"/>
+                <w:b w:val="0"/>
+                <w:color w:val="111827"/>
+                <w:sz w:val="17"/>
+              </w:rPr>
+              <w:t>Mixed arbitration</w:t>
+            </w:r>
+          </w:p>
+        </w:tc>
+        <w:tc>
+          <w:tcPr>
+            <w:tcW w:type="dxa" w:w="4450"/>
+            <w:tcMar>
+              <w:top w:w="80" w:type="dxa"/>
+              <w:start w:w="120" w:type="dxa"/>
+              <w:bottom w:w="80" w:type="dxa"/>
+              <w:end w:w="120" w:type="dxa"/>
+            </w:tcMar>
+            <w:vAlign w:val="center"/>
+            <w:shd w:fill="FFFFFF"/>
+          </w:tcPr>
+          <w:p>
+            <w:pPr>
+              <w:spacing w:before="0" w:after="40" w:line="252" w:lineRule="auto"/>
+              <w:jc w:val="left"/>
+            </w:pPr>
+            <w:r>
+              <w:rPr>
+                <w:rFonts w:ascii="Calibri" w:hAnsi="Calibri"/>
+                <w:b w:val="0"/>
+                <w:color w:val="111827"/>
+                <w:sz w:val="17"/>
+              </w:rPr>
+              <w:t>Preserve identifier priority across classic and FD contenders.</w:t>
+            </w:r>
+          </w:p>
+        </w:tc>
+        <w:tc>
+          <w:tcPr>
+            <w:tcW w:type="dxa" w:w="3260"/>
+            <w:tcMar>
+              <w:top w:w="80" w:type="dxa"/>
+              <w:start w:w="120" w:type="dxa"/>
+              <w:bottom w:w="80" w:type="dxa"/>
+              <w:end w:w="120" w:type="dxa"/>
+            </w:tcMar>
+            <w:vAlign w:val="center"/>
+            <w:shd w:fill="FFFFFF"/>
+          </w:tcPr>
+          <w:p>
+            <w:pPr>
+              <w:spacing w:before="0" w:after="40" w:line="252" w:lineRule="auto"/>
+              <w:jc w:val="left"/>
+            </w:pPr>
+            <w:r>
+              <w:rPr>
+                <w:rFonts w:ascii="Calibri" w:hAnsi="Calibri"/>
+                <w:b w:val="0"/>
+                <w:color w:val="111827"/>
+                <w:sz w:val="17"/>
+              </w:rPr>
+              <w:t>Service</w:t>
+            </w:r>
+          </w:p>
+        </w:tc>
+      </w:tr>
+      <w:tr>
+        <w:trPr>
+          <w:cantSplit/>
+        </w:trPr>
+        <w:tc>
+          <w:tcPr>
+            <w:tcW w:type="dxa" w:w="1650"/>
+            <w:tcMar>
+              <w:top w:w="80" w:type="dxa"/>
+              <w:start w:w="120" w:type="dxa"/>
+              <w:bottom w:w="80" w:type="dxa"/>
+              <w:end w:w="120" w:type="dxa"/>
+            </w:tcMar>
+            <w:vAlign w:val="center"/>
+            <w:shd w:fill="FFFFFF"/>
+          </w:tcPr>
+          <w:p>
+            <w:pPr>
+              <w:spacing w:before="0" w:after="40" w:line="252" w:lineRule="auto"/>
+              <w:jc w:val="center"/>
+            </w:pPr>
+            <w:r>
+              <w:rPr>
+                <w:rFonts w:ascii="Calibri" w:hAnsi="Calibri"/>
+                <w:b w:val="0"/>
+                <w:color w:val="111827"/>
+                <w:sz w:val="17"/>
+              </w:rPr>
+              <w:t>FD submission</w:t>
+            </w:r>
+          </w:p>
+        </w:tc>
+        <w:tc>
+          <w:tcPr>
+            <w:tcW w:type="dxa" w:w="4450"/>
+            <w:tcMar>
+              <w:top w:w="80" w:type="dxa"/>
+              <w:start w:w="120" w:type="dxa"/>
+              <w:bottom w:w="80" w:type="dxa"/>
+              <w:end w:w="120" w:type="dxa"/>
+            </w:tcMar>
+            <w:vAlign w:val="center"/>
+            <w:shd w:fill="FFFFFF"/>
+          </w:tcPr>
+          <w:p>
+            <w:pPr>
+              <w:spacing w:before="0" w:after="40" w:line="252" w:lineRule="auto"/>
+              <w:jc w:val="left"/>
+            </w:pPr>
+            <w:r>
+              <w:rPr>
+                <w:rFonts w:ascii="Calibri" w:hAnsi="Calibri"/>
+                <w:b w:val="0"/>
+                <w:color w:val="111827"/>
+                <w:sz w:val="17"/>
+              </w:rPr>
+              <w:t>Persist and replay 64-byte frames with protocol and BRS metadata.</w:t>
+            </w:r>
+          </w:p>
+        </w:tc>
+        <w:tc>
+          <w:tcPr>
+            <w:tcW w:type="dxa" w:w="3260"/>
+            <w:tcMar>
+              <w:top w:w="80" w:type="dxa"/>
+              <w:start w:w="120" w:type="dxa"/>
+              <w:bottom w:w="80" w:type="dxa"/>
+              <w:end w:w="120" w:type="dxa"/>
+            </w:tcMar>
+            <w:vAlign w:val="center"/>
+            <w:shd w:fill="FFFFFF"/>
+          </w:tcPr>
+          <w:p>
+            <w:pPr>
+              <w:spacing w:before="0" w:after="40" w:line="252" w:lineRule="auto"/>
+              <w:jc w:val="left"/>
+            </w:pPr>
+            <w:r>
+              <w:rPr>
+                <w:rFonts w:ascii="Calibri" w:hAnsi="Calibri"/>
+                <w:b w:val="0"/>
+                <w:color w:val="111827"/>
+                <w:sz w:val="17"/>
+              </w:rPr>
+              <w:t>Service/API</w:t>
+            </w:r>
+          </w:p>
+        </w:tc>
+      </w:tr>
+      <w:tr>
+        <w:trPr>
+          <w:cantSplit/>
+        </w:trPr>
+        <w:tc>
+          <w:tcPr>
+            <w:tcW w:type="dxa" w:w="1650"/>
+            <w:tcMar>
+              <w:top w:w="80" w:type="dxa"/>
+              <w:start w:w="120" w:type="dxa"/>
+              <w:bottom w:w="80" w:type="dxa"/>
+              <w:end w:w="120" w:type="dxa"/>
+            </w:tcMar>
+            <w:vAlign w:val="center"/>
+            <w:shd w:fill="FFFFFF"/>
+          </w:tcPr>
+          <w:p>
+            <w:pPr>
+              <w:spacing w:before="0" w:after="40" w:line="252" w:lineRule="auto"/>
+              <w:jc w:val="center"/>
+            </w:pPr>
+            <w:r>
+              <w:rPr>
+                <w:rFonts w:ascii="Calibri" w:hAnsi="Calibri"/>
+                <w:b w:val="0"/>
+                <w:color w:val="111827"/>
+                <w:sz w:val="17"/>
+              </w:rPr>
+              <w:t>FD DBC boundary</w:t>
+            </w:r>
+          </w:p>
+        </w:tc>
+        <w:tc>
+          <w:tcPr>
+            <w:tcW w:type="dxa" w:w="4450"/>
+            <w:tcMar>
+              <w:top w:w="80" w:type="dxa"/>
+              <w:start w:w="120" w:type="dxa"/>
+              <w:bottom w:w="80" w:type="dxa"/>
+              <w:end w:w="120" w:type="dxa"/>
+            </w:tcMar>
+            <w:vAlign w:val="center"/>
+            <w:shd w:fill="FFFFFF"/>
+          </w:tcPr>
+          <w:p>
+            <w:pPr>
+              <w:spacing w:before="0" w:after="40" w:line="252" w:lineRule="auto"/>
+              <w:jc w:val="left"/>
+            </w:pPr>
+            <w:r>
+              <w:rPr>
+                <w:rFonts w:ascii="Calibri" w:hAnsi="Calibri"/>
+                <w:b w:val="0"/>
+                <w:color w:val="111827"/>
+                <w:sz w:val="17"/>
+              </w:rPr>
+              <w:t>Encode and decode signals through bit 511 of a 64-byte payload.</w:t>
+            </w:r>
+          </w:p>
+        </w:tc>
+        <w:tc>
+          <w:tcPr>
+            <w:tcW w:type="dxa" w:w="3260"/>
+            <w:tcMar>
+              <w:top w:w="80" w:type="dxa"/>
+              <w:start w:w="120" w:type="dxa"/>
+              <w:bottom w:w="80" w:type="dxa"/>
+              <w:end w:w="120" w:type="dxa"/>
+            </w:tcMar>
+            <w:vAlign w:val="center"/>
+            <w:shd w:fill="FFFFFF"/>
+          </w:tcPr>
+          <w:p>
+            <w:pPr>
+              <w:spacing w:before="0" w:after="40" w:line="252" w:lineRule="auto"/>
+              <w:jc w:val="left"/>
+            </w:pPr>
+            <w:r>
+              <w:rPr>
+                <w:rFonts w:ascii="Calibri" w:hAnsi="Calibri"/>
+                <w:b w:val="0"/>
+                <w:color w:val="111827"/>
+                <w:sz w:val="17"/>
+              </w:rPr>
+              <w:t>Unit/service</w:t>
+            </w:r>
+          </w:p>
+        </w:tc>
+      </w:tr>
+      <w:tr>
+        <w:trPr>
+          <w:cantSplit/>
+        </w:trPr>
+        <w:tc>
+          <w:tcPr>
+            <w:tcW w:type="dxa" w:w="1650"/>
+            <w:tcMar>
+              <w:top w:w="80" w:type="dxa"/>
+              <w:start w:w="120" w:type="dxa"/>
+              <w:bottom w:w="80" w:type="dxa"/>
+              <w:end w:w="120" w:type="dxa"/>
+            </w:tcMar>
+            <w:vAlign w:val="center"/>
+            <w:shd w:fill="FFFFFF"/>
+          </w:tcPr>
+          <w:p>
+            <w:pPr>
+              <w:spacing w:before="0" w:after="40" w:line="252" w:lineRule="auto"/>
+              <w:jc w:val="center"/>
+            </w:pPr>
+            <w:r>
+              <w:rPr>
+                <w:rFonts w:ascii="Calibri" w:hAnsi="Calibri"/>
+                <w:b w:val="0"/>
+                <w:color w:val="111827"/>
+                <w:sz w:val="17"/>
+              </w:rPr>
+              <w:t>FD minimization</w:t>
+            </w:r>
+          </w:p>
+        </w:tc>
+        <w:tc>
+          <w:tcPr>
+            <w:tcW w:type="dxa" w:w="4450"/>
+            <w:tcMar>
+              <w:top w:w="80" w:type="dxa"/>
+              <w:start w:w="120" w:type="dxa"/>
+              <w:bottom w:w="80" w:type="dxa"/>
+              <w:end w:w="120" w:type="dxa"/>
+            </w:tcMar>
+            <w:vAlign w:val="center"/>
+            <w:shd w:fill="FFFFFF"/>
+          </w:tcPr>
+          <w:p>
+            <w:pPr>
+              <w:spacing w:before="0" w:after="40" w:line="252" w:lineRule="auto"/>
+              <w:jc w:val="left"/>
+            </w:pPr>
+            <w:r>
+              <w:rPr>
+                <w:rFonts w:ascii="Calibri" w:hAnsi="Calibri"/>
+                <w:b w:val="0"/>
+                <w:color w:val="111827"/>
+                <w:sz w:val="17"/>
+              </w:rPr>
+              <w:t>Exclude 64-byte payloads from audit and outbox evidence.</w:t>
+            </w:r>
+          </w:p>
+        </w:tc>
+        <w:tc>
+          <w:tcPr>
+            <w:tcW w:type="dxa" w:w="3260"/>
+            <w:tcMar>
+              <w:top w:w="80" w:type="dxa"/>
+              <w:start w:w="120" w:type="dxa"/>
+              <w:bottom w:w="80" w:type="dxa"/>
+              <w:end w:w="120" w:type="dxa"/>
+            </w:tcMar>
+            <w:vAlign w:val="center"/>
+            <w:shd w:fill="FFFFFF"/>
+          </w:tcPr>
+          <w:p>
+            <w:pPr>
+              <w:spacing w:before="0" w:after="40" w:line="252" w:lineRule="auto"/>
+              <w:jc w:val="left"/>
+            </w:pPr>
+            <w:r>
+              <w:rPr>
+                <w:rFonts w:ascii="Calibri" w:hAnsi="Calibri"/>
+                <w:b w:val="0"/>
+                <w:color w:val="111827"/>
+                <w:sz w:val="17"/>
+              </w:rPr>
+              <w:t>Service</w:t>
+            </w:r>
+          </w:p>
+        </w:tc>
+      </w:tr>
+      <w:tr>
+        <w:trPr>
+          <w:cantSplit/>
+        </w:trPr>
+        <w:tc>
+          <w:tcPr>
+            <w:tcW w:type="dxa" w:w="1650"/>
+            <w:tcMar>
+              <w:top w:w="80" w:type="dxa"/>
+              <w:start w:w="120" w:type="dxa"/>
+              <w:bottom w:w="80" w:type="dxa"/>
+              <w:end w:w="120" w:type="dxa"/>
+            </w:tcMar>
+            <w:vAlign w:val="center"/>
+            <w:shd w:fill="FFFFFF"/>
+          </w:tcPr>
+          <w:p>
+            <w:pPr>
+              <w:spacing w:before="0" w:after="40" w:line="252" w:lineRule="auto"/>
+              <w:jc w:val="center"/>
+            </w:pPr>
+            <w:r>
+              <w:rPr>
+                <w:rFonts w:ascii="Calibri" w:hAnsi="Calibri"/>
+                <w:b w:val="0"/>
+                <w:color w:val="111827"/>
+                <w:sz w:val="17"/>
+              </w:rPr>
+              <w:t>FD migration</w:t>
+            </w:r>
+          </w:p>
+        </w:tc>
+        <w:tc>
+          <w:tcPr>
+            <w:tcW w:type="dxa" w:w="4450"/>
+            <w:tcMar>
+              <w:top w:w="80" w:type="dxa"/>
+              <w:start w:w="120" w:type="dxa"/>
+              <w:bottom w:w="80" w:type="dxa"/>
+              <w:end w:w="120" w:type="dxa"/>
+            </w:tcMar>
+            <w:vAlign w:val="center"/>
+            <w:shd w:fill="FFFFFF"/>
+          </w:tcPr>
+          <w:p>
+            <w:pPr>
+              <w:spacing w:before="0" w:after="40" w:line="252" w:lineRule="auto"/>
+              <w:jc w:val="left"/>
+            </w:pPr>
+            <w:r>
+              <w:rPr>
+                <w:rFonts w:ascii="Calibri" w:hAnsi="Calibri"/>
+                <w:b w:val="0"/>
+                <w:color w:val="111827"/>
+                <w:sz w:val="17"/>
+              </w:rPr>
+              <w:t>Upgrade and downgrade CAN FD columns with safe classic defaults.</w:t>
+            </w:r>
+          </w:p>
+        </w:tc>
+        <w:tc>
+          <w:tcPr>
+            <w:tcW w:type="dxa" w:w="3260"/>
+            <w:tcMar>
+              <w:top w:w="80" w:type="dxa"/>
+              <w:start w:w="120" w:type="dxa"/>
+              <w:bottom w:w="80" w:type="dxa"/>
+              <w:end w:w="120" w:type="dxa"/>
+            </w:tcMar>
+            <w:vAlign w:val="center"/>
+            <w:shd w:fill="FFFFFF"/>
+          </w:tcPr>
+          <w:p>
+            <w:pPr>
+              <w:spacing w:before="0" w:after="40" w:line="252" w:lineRule="auto"/>
+              <w:jc w:val="left"/>
+            </w:pPr>
+            <w:r>
+              <w:rPr>
+                <w:rFonts w:ascii="Calibri" w:hAnsi="Calibri"/>
+                <w:b w:val="0"/>
+                <w:color w:val="111827"/>
+                <w:sz w:val="17"/>
+              </w:rPr>
+              <w:t>Integration</w:t>
+            </w:r>
+          </w:p>
+        </w:tc>
+      </w:tr>
     </w:tbl>
     <w:p>
       <w:pPr>
@@ -8528,7 +9746,7 @@
           <w:color w:val="111827"/>
           <w:sz w:val="22"/>
         </w:rPr>
-        <w:t xml:space="preserve">, </w:t>
+        <w:t xml:space="preserve"> through </w:t>
       </w:r>
       <w:r>
         <w:rPr>
@@ -8536,23 +9754,7 @@
           <w:color w:val="1F4D78"/>
           <w:sz w:val="19"/>
         </w:rPr>
-        <w:t>0025_can_arbitration</w:t>
-      </w:r>
-      <w:r>
-        <w:rPr>
-          <w:rFonts w:ascii="Calibri" w:hAnsi="Calibri"/>
-          <w:color w:val="111827"/>
-          <w:sz w:val="22"/>
-        </w:rPr>
-        <w:t xml:space="preserve">, and </w:t>
-      </w:r>
-      <w:r>
-        <w:rPr>
-          <w:rFonts w:ascii="Consolas" w:hAnsi="Consolas"/>
-          <w:color w:val="1F4D78"/>
-          <w:sz w:val="19"/>
-        </w:rPr>
-        <w:t>0026_can_dbc_codec</w:t>
+        <w:t>0027_can_fd</w:t>
       </w:r>
       <w:r>
         <w:rPr>
@@ -8740,7 +9942,7 @@
           <w:color w:val="111827"/>
           <w:sz w:val="22"/>
         </w:rPr>
-        <w:t>Automated tests cover validation, priority, timing mathematics, readiness, delivery, utilization, versioning, replay, errors, DBC bit placement, signed scaling, exact conversion, evidence minimization, persistence, and OpenAPI.</w:t>
+        <w:t>Automated tests cover validation, priority, classic and FD timing mathematics, mixed arbitration, readiness, delivery, utilization, versioning, replay, errors, DBC bit placement through 512 bits, signed scaling, exact conversion, evidence minimization, persistence, and OpenAPI.</w:t>
       </w:r>
     </w:p>
     <w:p>
@@ -8907,6 +10109,40 @@
     </w:p>
     <w:p>
       <w:pPr>
+        <w:pStyle w:val="ListBullet"/>
+        <w:numPr>
+          <w:ilvl w:val="0"/>
+          <w:numId w:val="14"/>
+        </w:numPr>
+      </w:pPr>
+      <w:r>
+        <w:rPr>
+          <w:rFonts w:ascii="Calibri" w:hAnsi="Calibri"/>
+          <w:color w:val="111827"/>
+          <w:sz w:val="22"/>
+        </w:rPr>
+        <w:t>CAN FD timing is a deterministic transparent model, not a bit-accurate physical trace; stuffing, synchronization, acknowledgement, and transceiver delay remain deferred.</w:t>
+      </w:r>
+    </w:p>
+    <w:p>
+      <w:pPr>
+        <w:pStyle w:val="ListBullet"/>
+        <w:numPr>
+          <w:ilvl w:val="0"/>
+          <w:numId w:val="14"/>
+        </w:numPr>
+      </w:pPr>
+      <w:r>
+        <w:rPr>
+          <w:rFonts w:ascii="Calibri" w:hAnsi="Calibri"/>
+          <w:color w:val="111827"/>
+          <w:sz w:val="22"/>
+        </w:rPr>
+        <w:t>The public DLC value represents payload length rather than the encoded four-bit wire DLC.</w:t>
+      </w:r>
+    </w:p>
+    <w:p>
+      <w:pPr>
         <w:pStyle w:val="Heading1"/>
         <w:keepNext/>
         <w:keepLines/>
@@ -8922,7 +10158,7 @@
           <w:color w:val="111827"/>
           <w:sz w:val="22"/>
         </w:rPr>
-        <w:t xml:space="preserve">The recommended next increment is IV-4: CAN FD payload and timing contracts with explicit nominal and data-phase bitrate plus mixed classic/FD compatibility. See </w:t>
+        <w:t xml:space="preserve">The recommended next increment is IV-5: deterministic error frames, transmit/receive error counters, bus-off and recovery, plus bounded fault injection. See </w:t>
       </w:r>
       <w:r>
         <w:rPr>
@@ -9503,6 +10739,108 @@
         <w:t xml:space="preserve"> import boundary.</w:t>
       </w:r>
     </w:p>
+    <w:p>
+      <w:pPr>
+        <w:pStyle w:val="ListNumber"/>
+        <w:numPr>
+          <w:ilvl w:val="0"/>
+          <w:numId w:val="15"/>
+        </w:numPr>
+      </w:pPr>
+      <w:r>
+        <w:rPr>
+          <w:rFonts w:ascii="Calibri" w:hAnsi="Calibri"/>
+          <w:color w:val="111827"/>
+          <w:sz w:val="22"/>
+        </w:rPr>
+        <w:t>Compare a 64-byte FD frame with and without BRS at 500/2000 kbit/s.</w:t>
+      </w:r>
+    </w:p>
+    <w:p>
+      <w:pPr>
+        <w:pStyle w:val="ListNumber"/>
+        <w:numPr>
+          <w:ilvl w:val="0"/>
+          <w:numId w:val="15"/>
+        </w:numPr>
+      </w:pPr>
+      <w:r>
+        <w:rPr>
+          <w:rFonts w:ascii="Calibri" w:hAnsi="Calibri"/>
+          <w:color w:val="111827"/>
+          <w:sz w:val="22"/>
+        </w:rPr>
+        <w:t>Explain why classic and FD frames share identifier arbitration priority.</w:t>
+      </w:r>
+    </w:p>
+    <w:p>
+      <w:pPr>
+        <w:pStyle w:val="ListNumber"/>
+        <w:numPr>
+          <w:ilvl w:val="0"/>
+          <w:numId w:val="15"/>
+        </w:numPr>
+      </w:pPr>
+      <w:r>
+        <w:rPr>
+          <w:rFonts w:ascii="Calibri" w:hAnsi="Calibri"/>
+          <w:color w:val="111827"/>
+          <w:sz w:val="22"/>
+        </w:rPr>
+        <w:t>Map the ISO 64-byte payload length to a future four-bit wire DLC adapter.</w:t>
+      </w:r>
+    </w:p>
+    <w:p>
+      <w:pPr>
+        <w:pStyle w:val="ListNumber"/>
+        <w:numPr>
+          <w:ilvl w:val="0"/>
+          <w:numId w:val="15"/>
+        </w:numPr>
+      </w:pPr>
+      <w:r>
+        <w:rPr>
+          <w:rFonts w:ascii="Calibri" w:hAnsi="Calibri"/>
+          <w:color w:val="111827"/>
+          <w:sz w:val="22"/>
+        </w:rPr>
+        <w:t>Design a mixed arbitration test in which a classic frame has a lower CAN ID than an FD frame.</w:t>
+      </w:r>
+    </w:p>
+    <w:p>
+      <w:pPr>
+        <w:pStyle w:val="ListNumber"/>
+        <w:numPr>
+          <w:ilvl w:val="0"/>
+          <w:numId w:val="15"/>
+        </w:numPr>
+      </w:pPr>
+      <w:r>
+        <w:rPr>
+          <w:rFonts w:ascii="Calibri" w:hAnsi="Calibri"/>
+          <w:color w:val="111827"/>
+          <w:sz w:val="22"/>
+        </w:rPr>
+        <w:t>Explain why nominal and data phase durations are rounded upward independently.</w:t>
+      </w:r>
+    </w:p>
+    <w:p>
+      <w:pPr>
+        <w:pStyle w:val="ListNumber"/>
+        <w:numPr>
+          <w:ilvl w:val="0"/>
+          <w:numId w:val="15"/>
+        </w:numPr>
+      </w:pPr>
+      <w:r>
+        <w:rPr>
+          <w:rFonts w:ascii="Calibri" w:hAnsi="Calibri"/>
+          <w:color w:val="111827"/>
+          <w:sz w:val="22"/>
+        </w:rPr>
+        <w:t>Propose a bit-stuffing extension that preserves the IV-4 transparent timing evidence.</w:t>
+      </w:r>
+    </w:p>
     <w:sectPr>
       <w:headerReference w:type="default" r:id="rId9"/>
       <w:footerReference w:type="default" r:id="rId10"/>
@@ -9532,7 +10870,7 @@
         <w:color w:val="667085"/>
         <w:sz w:val="17"/>
       </w:rPr>
-      <w:t>ATEP Volume IV Workbook  |  Version 0.3.0</w:t>
+      <w:t>ATEP Volume IV Workbook  |  Version 0.4.0</w:t>
     </w:r>
     <w:r>
       <w:rPr>

</xml_diff>

<commit_message>
feat(can): add deterministic error confinement
</commit_message>
<xml_diff>
--- a/docs/ATEP_Volume_IV_CAN_Network_Engineering_Workbook.docx
+++ b/docs/ATEP_Volume_IV_CAN_Network_Engineering_Workbook.docx
@@ -143,7 +143,7 @@
                 <w:color w:val="0B2545"/>
                 <w:sz w:val="19"/>
               </w:rPr>
-              <w:t>0.4.0</w:t>
+              <w:t>0.5.0</w:t>
             </w:r>
           </w:p>
         </w:tc>
@@ -204,7 +204,7 @@
                 <w:color w:val="111827"/>
                 <w:sz w:val="19"/>
               </w:rPr>
-              <w:t>24 August 2026</w:t>
+              <w:t>25 August 2026</w:t>
             </w:r>
           </w:p>
         </w:tc>
@@ -265,7 +265,7 @@
                 <w:color w:val="111827"/>
                 <w:sz w:val="19"/>
               </w:rPr>
-              <w:t>Implemented increments: IV-1 to IV-4</w:t>
+              <w:t>Implemented increments: IV-1 to IV-5</w:t>
             </w:r>
           </w:p>
         </w:tc>
@@ -893,7 +893,7 @@
                 <w:color w:val="111827"/>
                 <w:sz w:val="17"/>
               </w:rPr>
-              <w:t>Increments IV-1 through IV-4</w:t>
+              <w:t>Increments IV-1 through IV-5</w:t>
             </w:r>
           </w:p>
         </w:tc>
@@ -1564,6 +1564,95 @@
           </w:p>
         </w:tc>
       </w:tr>
+      <w:tr>
+        <w:trPr>
+          <w:cantSplit/>
+        </w:trPr>
+        <w:tc>
+          <w:tcPr>
+            <w:tcW w:type="dxa" w:w="1650"/>
+            <w:tcMar>
+              <w:top w:w="80" w:type="dxa"/>
+              <w:start w:w="120" w:type="dxa"/>
+              <w:bottom w:w="80" w:type="dxa"/>
+              <w:end w:w="120" w:type="dxa"/>
+            </w:tcMar>
+            <w:vAlign w:val="center"/>
+            <w:shd w:fill="FFFFFF"/>
+          </w:tcPr>
+          <w:p>
+            <w:pPr>
+              <w:spacing w:before="0" w:after="40" w:line="252" w:lineRule="auto"/>
+              <w:jc w:val="center"/>
+            </w:pPr>
+            <w:r>
+              <w:rPr>
+                <w:rFonts w:ascii="Calibri" w:hAnsi="Calibri"/>
+                <w:b w:val="0"/>
+                <w:color w:val="111827"/>
+                <w:sz w:val="17"/>
+              </w:rPr>
+              <w:t>0.5.0</w:t>
+            </w:r>
+          </w:p>
+        </w:tc>
+        <w:tc>
+          <w:tcPr>
+            <w:tcW w:type="dxa" w:w="4450"/>
+            <w:tcMar>
+              <w:top w:w="80" w:type="dxa"/>
+              <w:start w:w="120" w:type="dxa"/>
+              <w:bottom w:w="80" w:type="dxa"/>
+              <w:end w:w="120" w:type="dxa"/>
+            </w:tcMar>
+            <w:vAlign w:val="center"/>
+            <w:shd w:fill="FFFFFF"/>
+          </w:tcPr>
+          <w:p>
+            <w:pPr>
+              <w:spacing w:before="0" w:after="40" w:line="252" w:lineRule="auto"/>
+              <w:jc w:val="left"/>
+            </w:pPr>
+            <w:r>
+              <w:rPr>
+                <w:rFonts w:ascii="Calibri" w:hAnsi="Calibri"/>
+                <w:b w:val="0"/>
+                <w:color w:val="111827"/>
+                <w:sz w:val="17"/>
+              </w:rPr>
+              <w:t>2026-08-25</w:t>
+            </w:r>
+          </w:p>
+        </w:tc>
+        <w:tc>
+          <w:tcPr>
+            <w:tcW w:type="dxa" w:w="3260"/>
+            <w:tcMar>
+              <w:top w:w="80" w:type="dxa"/>
+              <w:start w:w="120" w:type="dxa"/>
+              <w:bottom w:w="80" w:type="dxa"/>
+              <w:end w:w="120" w:type="dxa"/>
+            </w:tcMar>
+            <w:vAlign w:val="center"/>
+            <w:shd w:fill="FFFFFF"/>
+          </w:tcPr>
+          <w:p>
+            <w:pPr>
+              <w:spacing w:before="0" w:after="40" w:line="252" w:lineRule="auto"/>
+              <w:jc w:val="left"/>
+            </w:pPr>
+            <w:r>
+              <w:rPr>
+                <w:rFonts w:ascii="Calibri" w:hAnsi="Calibri"/>
+                <w:b w:val="0"/>
+                <w:color w:val="111827"/>
+                <w:sz w:val="17"/>
+              </w:rPr>
+              <w:t>Added TEC/REC error confinement, deterministic transmission/reception faults and loss, bus-off enforcement and recovery, replay-safe evidence, APIs, migration, and tests.</w:t>
+            </w:r>
+          </w:p>
+        </w:tc>
+      </w:tr>
     </w:tbl>
     <w:p>
       <w:pPr>
@@ -1898,6 +1987,23 @@
     </w:p>
     <w:p>
       <w:pPr>
+        <w:pStyle w:val="ListBullet"/>
+        <w:numPr>
+          <w:ilvl w:val="0"/>
+          <w:numId w:val="11"/>
+        </w:numPr>
+      </w:pPr>
+      <w:r>
+        <w:rPr>
+          <w:rFonts w:ascii="Calibri" w:hAnsi="Calibri"/>
+          <w:color w:val="111827"/>
+          <w:sz w:val="22"/>
+        </w:rPr>
+        <w:t>TEC/REC error confinement, bounded fault injection, frame loss, bus-off enforcement, and recovery.</w:t>
+      </w:r>
+    </w:p>
+    <w:p>
+      <w:pPr>
         <w:pStyle w:val="Heading2"/>
         <w:keepNext/>
         <w:keepLines/>
@@ -1970,7 +2076,7 @@
           <w:color w:val="111827"/>
           <w:sz w:val="22"/>
         </w:rPr>
-        <w:t>Error frames, error counters, bus-off, recovery, loss, latency, and corruption.</w:t>
+        <w:t>Payload corruption, overload frames, acknowledgement errors, and automatic retransmission.</w:t>
       </w:r>
     </w:p>
     <w:p>
@@ -2130,6 +2236,40 @@
           <w:sz w:val="22"/>
         </w:rPr>
         <w:t xml:space="preserve"> stores the canonical encode/decode request and deterministic payload, raw, and physical result for exact replay. Frame contracts and transmissions preserve classic/FD protocol and BRS identity; arbitration results also preserve per-phase bit counts and durations.</w:t>
+      </w:r>
+    </w:p>
+    <w:p>
+      <w:r>
+        <w:rPr>
+          <w:rFonts w:ascii="Consolas" w:hAnsi="Consolas"/>
+          <w:color w:val="1F4D78"/>
+          <w:sz w:val="19"/>
+        </w:rPr>
+        <w:t>CanNetwork.error_states</w:t>
+      </w:r>
+      <w:r>
+        <w:rPr>
+          <w:rFonts w:ascii="Calibri" w:hAnsi="Calibri"/>
+          <w:color w:val="111827"/>
+          <w:sz w:val="22"/>
+        </w:rPr>
+        <w:t xml:space="preserve"> stores affected node TEC, REC, and derived state without duplicating ECU semantics. </w:t>
+      </w:r>
+      <w:r>
+        <w:rPr>
+          <w:rFonts w:ascii="Consolas" w:hAnsi="Consolas"/>
+          <w:color w:val="1F4D78"/>
+          <w:sz w:val="19"/>
+        </w:rPr>
+        <w:t>CanFaultExecution</w:t>
+      </w:r>
+      <w:r>
+        <w:rPr>
+          <w:rFonts w:ascii="Calibri" w:hAnsi="Calibri"/>
+          <w:color w:val="111827"/>
+          <w:sz w:val="22"/>
+        </w:rPr>
+        <w:t xml:space="preserve"> stores canonical injection/recovery requests, before/after state, logical timing, versions, target, and actor for exact replay.</w:t>
       </w:r>
     </w:p>
     <w:p>
@@ -3813,6 +3953,474 @@
           </w:p>
         </w:tc>
       </w:tr>
+      <w:tr>
+        <w:trPr>
+          <w:cantSplit/>
+        </w:trPr>
+        <w:tc>
+          <w:tcPr>
+            <w:tcW w:type="dxa" w:w="1150"/>
+            <w:tcMar>
+              <w:top w:w="80" w:type="dxa"/>
+              <w:start w:w="120" w:type="dxa"/>
+              <w:bottom w:w="80" w:type="dxa"/>
+              <w:end w:w="120" w:type="dxa"/>
+            </w:tcMar>
+            <w:vAlign w:val="center"/>
+            <w:shd w:fill="FFFFFF"/>
+          </w:tcPr>
+          <w:p>
+            <w:pPr>
+              <w:spacing w:before="0" w:after="40" w:line="252" w:lineRule="auto"/>
+              <w:jc w:val="center"/>
+            </w:pPr>
+            <w:r>
+              <w:rPr>
+                <w:rFonts w:ascii="Calibri" w:hAnsi="Calibri"/>
+                <w:b w:val="0"/>
+                <w:color w:val="111827"/>
+                <w:sz w:val="16"/>
+              </w:rPr>
+              <w:t>POST</w:t>
+            </w:r>
+          </w:p>
+        </w:tc>
+        <w:tc>
+          <w:tcPr>
+            <w:tcW w:type="dxa" w:w="3700"/>
+            <w:tcMar>
+              <w:top w:w="80" w:type="dxa"/>
+              <w:start w:w="120" w:type="dxa"/>
+              <w:bottom w:w="80" w:type="dxa"/>
+              <w:end w:w="120" w:type="dxa"/>
+            </w:tcMar>
+            <w:vAlign w:val="center"/>
+            <w:shd w:fill="FFFFFF"/>
+          </w:tcPr>
+          <w:p>
+            <w:pPr>
+              <w:spacing w:before="0" w:after="40" w:line="252" w:lineRule="auto"/>
+              <w:jc w:val="left"/>
+            </w:pPr>
+            <w:r>
+              <w:rPr>
+                <w:rFonts w:ascii="Calibri" w:hAnsi="Calibri"/>
+                <w:b w:val="0"/>
+                <w:color w:val="111827"/>
+                <w:sz w:val="16"/>
+              </w:rPr>
+              <w:t>/api/v1/vehicles/{vehicle_id}/can-networks/faults/inject</w:t>
+            </w:r>
+          </w:p>
+        </w:tc>
+        <w:tc>
+          <w:tcPr>
+            <w:tcW w:type="dxa" w:w="3100"/>
+            <w:tcMar>
+              <w:top w:w="80" w:type="dxa"/>
+              <w:start w:w="120" w:type="dxa"/>
+              <w:bottom w:w="80" w:type="dxa"/>
+              <w:end w:w="120" w:type="dxa"/>
+            </w:tcMar>
+            <w:vAlign w:val="center"/>
+            <w:shd w:fill="FFFFFF"/>
+          </w:tcPr>
+          <w:p>
+            <w:pPr>
+              <w:spacing w:before="0" w:after="40" w:line="252" w:lineRule="auto"/>
+              <w:jc w:val="left"/>
+            </w:pPr>
+            <w:r>
+              <w:rPr>
+                <w:rFonts w:ascii="Calibri" w:hAnsi="Calibri"/>
+                <w:b w:val="0"/>
+                <w:color w:val="111827"/>
+                <w:sz w:val="16"/>
+              </w:rPr>
+              <w:t>can_networks:manage</w:t>
+            </w:r>
+          </w:p>
+        </w:tc>
+        <w:tc>
+          <w:tcPr>
+            <w:tcW w:type="dxa" w:w="1410"/>
+            <w:tcMar>
+              <w:top w:w="80" w:type="dxa"/>
+              <w:start w:w="120" w:type="dxa"/>
+              <w:bottom w:w="80" w:type="dxa"/>
+              <w:end w:w="120" w:type="dxa"/>
+            </w:tcMar>
+            <w:vAlign w:val="center"/>
+            <w:shd w:fill="FFFFFF"/>
+          </w:tcPr>
+          <w:p>
+            <w:pPr>
+              <w:spacing w:before="0" w:after="40" w:line="252" w:lineRule="auto"/>
+              <w:jc w:val="left"/>
+            </w:pPr>
+            <w:r>
+              <w:rPr>
+                <w:rFonts w:ascii="Calibri" w:hAnsi="Calibri"/>
+                <w:b w:val="0"/>
+                <w:color w:val="111827"/>
+                <w:sz w:val="16"/>
+              </w:rPr>
+              <w:t>Inject a bounded deterministic fault.</w:t>
+            </w:r>
+          </w:p>
+        </w:tc>
+      </w:tr>
+      <w:tr>
+        <w:trPr>
+          <w:cantSplit/>
+        </w:trPr>
+        <w:tc>
+          <w:tcPr>
+            <w:tcW w:type="dxa" w:w="1150"/>
+            <w:tcMar>
+              <w:top w:w="80" w:type="dxa"/>
+              <w:start w:w="120" w:type="dxa"/>
+              <w:bottom w:w="80" w:type="dxa"/>
+              <w:end w:w="120" w:type="dxa"/>
+            </w:tcMar>
+            <w:vAlign w:val="center"/>
+            <w:shd w:fill="FFFFFF"/>
+          </w:tcPr>
+          <w:p>
+            <w:pPr>
+              <w:spacing w:before="0" w:after="40" w:line="252" w:lineRule="auto"/>
+              <w:jc w:val="center"/>
+            </w:pPr>
+            <w:r>
+              <w:rPr>
+                <w:rFonts w:ascii="Calibri" w:hAnsi="Calibri"/>
+                <w:b w:val="0"/>
+                <w:color w:val="111827"/>
+                <w:sz w:val="16"/>
+              </w:rPr>
+              <w:t>POST</w:t>
+            </w:r>
+          </w:p>
+        </w:tc>
+        <w:tc>
+          <w:tcPr>
+            <w:tcW w:type="dxa" w:w="3700"/>
+            <w:tcMar>
+              <w:top w:w="80" w:type="dxa"/>
+              <w:start w:w="120" w:type="dxa"/>
+              <w:bottom w:w="80" w:type="dxa"/>
+              <w:end w:w="120" w:type="dxa"/>
+            </w:tcMar>
+            <w:vAlign w:val="center"/>
+            <w:shd w:fill="FFFFFF"/>
+          </w:tcPr>
+          <w:p>
+            <w:pPr>
+              <w:spacing w:before="0" w:after="40" w:line="252" w:lineRule="auto"/>
+              <w:jc w:val="left"/>
+            </w:pPr>
+            <w:r>
+              <w:rPr>
+                <w:rFonts w:ascii="Calibri" w:hAnsi="Calibri"/>
+                <w:b w:val="0"/>
+                <w:color w:val="111827"/>
+                <w:sz w:val="16"/>
+              </w:rPr>
+              <w:t>/api/v1/vehicles/{vehicle_id}/can-networks/faults/recover</w:t>
+            </w:r>
+          </w:p>
+        </w:tc>
+        <w:tc>
+          <w:tcPr>
+            <w:tcW w:type="dxa" w:w="3100"/>
+            <w:tcMar>
+              <w:top w:w="80" w:type="dxa"/>
+              <w:start w:w="120" w:type="dxa"/>
+              <w:bottom w:w="80" w:type="dxa"/>
+              <w:end w:w="120" w:type="dxa"/>
+            </w:tcMar>
+            <w:vAlign w:val="center"/>
+            <w:shd w:fill="FFFFFF"/>
+          </w:tcPr>
+          <w:p>
+            <w:pPr>
+              <w:spacing w:before="0" w:after="40" w:line="252" w:lineRule="auto"/>
+              <w:jc w:val="left"/>
+            </w:pPr>
+            <w:r>
+              <w:rPr>
+                <w:rFonts w:ascii="Calibri" w:hAnsi="Calibri"/>
+                <w:b w:val="0"/>
+                <w:color w:val="111827"/>
+                <w:sz w:val="16"/>
+              </w:rPr>
+              <w:t>can_networks:manage</w:t>
+            </w:r>
+          </w:p>
+        </w:tc>
+        <w:tc>
+          <w:tcPr>
+            <w:tcW w:type="dxa" w:w="1410"/>
+            <w:tcMar>
+              <w:top w:w="80" w:type="dxa"/>
+              <w:start w:w="120" w:type="dxa"/>
+              <w:bottom w:w="80" w:type="dxa"/>
+              <w:end w:w="120" w:type="dxa"/>
+            </w:tcMar>
+            <w:vAlign w:val="center"/>
+            <w:shd w:fill="FFFFFF"/>
+          </w:tcPr>
+          <w:p>
+            <w:pPr>
+              <w:spacing w:before="0" w:after="40" w:line="252" w:lineRule="auto"/>
+              <w:jc w:val="left"/>
+            </w:pPr>
+            <w:r>
+              <w:rPr>
+                <w:rFonts w:ascii="Calibri" w:hAnsi="Calibri"/>
+                <w:b w:val="0"/>
+                <w:color w:val="111827"/>
+                <w:sz w:val="16"/>
+              </w:rPr>
+              <w:t>Recover a bus-off node.</w:t>
+            </w:r>
+          </w:p>
+        </w:tc>
+      </w:tr>
+      <w:tr>
+        <w:trPr>
+          <w:cantSplit/>
+        </w:trPr>
+        <w:tc>
+          <w:tcPr>
+            <w:tcW w:type="dxa" w:w="1150"/>
+            <w:tcMar>
+              <w:top w:w="80" w:type="dxa"/>
+              <w:start w:w="120" w:type="dxa"/>
+              <w:bottom w:w="80" w:type="dxa"/>
+              <w:end w:w="120" w:type="dxa"/>
+            </w:tcMar>
+            <w:vAlign w:val="center"/>
+            <w:shd w:fill="FFFFFF"/>
+          </w:tcPr>
+          <w:p>
+            <w:pPr>
+              <w:spacing w:before="0" w:after="40" w:line="252" w:lineRule="auto"/>
+              <w:jc w:val="center"/>
+            </w:pPr>
+            <w:r>
+              <w:rPr>
+                <w:rFonts w:ascii="Calibri" w:hAnsi="Calibri"/>
+                <w:b w:val="0"/>
+                <w:color w:val="111827"/>
+                <w:sz w:val="16"/>
+              </w:rPr>
+              <w:t>GET</w:t>
+            </w:r>
+          </w:p>
+        </w:tc>
+        <w:tc>
+          <w:tcPr>
+            <w:tcW w:type="dxa" w:w="3700"/>
+            <w:tcMar>
+              <w:top w:w="80" w:type="dxa"/>
+              <w:start w:w="120" w:type="dxa"/>
+              <w:bottom w:w="80" w:type="dxa"/>
+              <w:end w:w="120" w:type="dxa"/>
+            </w:tcMar>
+            <w:vAlign w:val="center"/>
+            <w:shd w:fill="FFFFFF"/>
+          </w:tcPr>
+          <w:p>
+            <w:pPr>
+              <w:spacing w:before="0" w:after="40" w:line="252" w:lineRule="auto"/>
+              <w:jc w:val="left"/>
+            </w:pPr>
+            <w:r>
+              <w:rPr>
+                <w:rFonts w:ascii="Calibri" w:hAnsi="Calibri"/>
+                <w:b w:val="0"/>
+                <w:color w:val="111827"/>
+                <w:sz w:val="16"/>
+              </w:rPr>
+              <w:t>/api/v1/vehicles/{vehicle_id}/can-networks/faults</w:t>
+            </w:r>
+          </w:p>
+        </w:tc>
+        <w:tc>
+          <w:tcPr>
+            <w:tcW w:type="dxa" w:w="3100"/>
+            <w:tcMar>
+              <w:top w:w="80" w:type="dxa"/>
+              <w:start w:w="120" w:type="dxa"/>
+              <w:bottom w:w="80" w:type="dxa"/>
+              <w:end w:w="120" w:type="dxa"/>
+            </w:tcMar>
+            <w:vAlign w:val="center"/>
+            <w:shd w:fill="FFFFFF"/>
+          </w:tcPr>
+          <w:p>
+            <w:pPr>
+              <w:spacing w:before="0" w:after="40" w:line="252" w:lineRule="auto"/>
+              <w:jc w:val="left"/>
+            </w:pPr>
+            <w:r>
+              <w:rPr>
+                <w:rFonts w:ascii="Calibri" w:hAnsi="Calibri"/>
+                <w:b w:val="0"/>
+                <w:color w:val="111827"/>
+                <w:sz w:val="16"/>
+              </w:rPr>
+              <w:t>can_networks:read</w:t>
+            </w:r>
+          </w:p>
+        </w:tc>
+        <w:tc>
+          <w:tcPr>
+            <w:tcW w:type="dxa" w:w="1410"/>
+            <w:tcMar>
+              <w:top w:w="80" w:type="dxa"/>
+              <w:start w:w="120" w:type="dxa"/>
+              <w:bottom w:w="80" w:type="dxa"/>
+              <w:end w:w="120" w:type="dxa"/>
+            </w:tcMar>
+            <w:vAlign w:val="center"/>
+            <w:shd w:fill="FFFFFF"/>
+          </w:tcPr>
+          <w:p>
+            <w:pPr>
+              <w:spacing w:before="0" w:after="40" w:line="252" w:lineRule="auto"/>
+              <w:jc w:val="left"/>
+            </w:pPr>
+            <w:r>
+              <w:rPr>
+                <w:rFonts w:ascii="Calibri" w:hAnsi="Calibri"/>
+                <w:b w:val="0"/>
+                <w:color w:val="111827"/>
+                <w:sz w:val="16"/>
+              </w:rPr>
+              <w:t>List fault and recovery evidence.</w:t>
+            </w:r>
+          </w:p>
+        </w:tc>
+      </w:tr>
+      <w:tr>
+        <w:trPr>
+          <w:cantSplit/>
+        </w:trPr>
+        <w:tc>
+          <w:tcPr>
+            <w:tcW w:type="dxa" w:w="1150"/>
+            <w:tcMar>
+              <w:top w:w="80" w:type="dxa"/>
+              <w:start w:w="120" w:type="dxa"/>
+              <w:bottom w:w="80" w:type="dxa"/>
+              <w:end w:w="120" w:type="dxa"/>
+            </w:tcMar>
+            <w:vAlign w:val="center"/>
+            <w:shd w:fill="FFFFFF"/>
+          </w:tcPr>
+          <w:p>
+            <w:pPr>
+              <w:spacing w:before="0" w:after="40" w:line="252" w:lineRule="auto"/>
+              <w:jc w:val="center"/>
+            </w:pPr>
+            <w:r>
+              <w:rPr>
+                <w:rFonts w:ascii="Calibri" w:hAnsi="Calibri"/>
+                <w:b w:val="0"/>
+                <w:color w:val="111827"/>
+                <w:sz w:val="16"/>
+              </w:rPr>
+              <w:t>GET</w:t>
+            </w:r>
+          </w:p>
+        </w:tc>
+        <w:tc>
+          <w:tcPr>
+            <w:tcW w:type="dxa" w:w="3700"/>
+            <w:tcMar>
+              <w:top w:w="80" w:type="dxa"/>
+              <w:start w:w="120" w:type="dxa"/>
+              <w:bottom w:w="80" w:type="dxa"/>
+              <w:end w:w="120" w:type="dxa"/>
+            </w:tcMar>
+            <w:vAlign w:val="center"/>
+            <w:shd w:fill="FFFFFF"/>
+          </w:tcPr>
+          <w:p>
+            <w:pPr>
+              <w:spacing w:before="0" w:after="40" w:line="252" w:lineRule="auto"/>
+              <w:jc w:val="left"/>
+            </w:pPr>
+            <w:r>
+              <w:rPr>
+                <w:rFonts w:ascii="Calibri" w:hAnsi="Calibri"/>
+                <w:b w:val="0"/>
+                <w:color w:val="111827"/>
+                <w:sz w:val="16"/>
+              </w:rPr>
+              <w:t>/api/v1/vehicles/{vehicle_id}/can-networks/faults/{command_id}</w:t>
+            </w:r>
+          </w:p>
+        </w:tc>
+        <w:tc>
+          <w:tcPr>
+            <w:tcW w:type="dxa" w:w="3100"/>
+            <w:tcMar>
+              <w:top w:w="80" w:type="dxa"/>
+              <w:start w:w="120" w:type="dxa"/>
+              <w:bottom w:w="80" w:type="dxa"/>
+              <w:end w:w="120" w:type="dxa"/>
+            </w:tcMar>
+            <w:vAlign w:val="center"/>
+            <w:shd w:fill="FFFFFF"/>
+          </w:tcPr>
+          <w:p>
+            <w:pPr>
+              <w:spacing w:before="0" w:after="40" w:line="252" w:lineRule="auto"/>
+              <w:jc w:val="left"/>
+            </w:pPr>
+            <w:r>
+              <w:rPr>
+                <w:rFonts w:ascii="Calibri" w:hAnsi="Calibri"/>
+                <w:b w:val="0"/>
+                <w:color w:val="111827"/>
+                <w:sz w:val="16"/>
+              </w:rPr>
+              <w:t>can_networks:read</w:t>
+            </w:r>
+          </w:p>
+        </w:tc>
+        <w:tc>
+          <w:tcPr>
+            <w:tcW w:type="dxa" w:w="1410"/>
+            <w:tcMar>
+              <w:top w:w="80" w:type="dxa"/>
+              <w:start w:w="120" w:type="dxa"/>
+              <w:bottom w:w="80" w:type="dxa"/>
+              <w:end w:w="120" w:type="dxa"/>
+            </w:tcMar>
+            <w:vAlign w:val="center"/>
+            <w:shd w:fill="FFFFFF"/>
+          </w:tcPr>
+          <w:p>
+            <w:pPr>
+              <w:spacing w:before="0" w:after="40" w:line="252" w:lineRule="auto"/>
+              <w:jc w:val="left"/>
+            </w:pPr>
+            <w:r>
+              <w:rPr>
+                <w:rFonts w:ascii="Calibri" w:hAnsi="Calibri"/>
+                <w:b w:val="0"/>
+                <w:color w:val="111827"/>
+                <w:sz w:val="16"/>
+              </w:rPr>
+              <w:t>Retrieve one fault execution.</w:t>
+            </w:r>
+          </w:p>
+        </w:tc>
+      </w:tr>
     </w:tbl>
     <w:p>
       <w:pPr>
@@ -4103,6 +4711,46 @@
     </w:p>
     <w:p>
       <w:pPr>
+        <w:pStyle w:val="Heading2"/>
+        <w:keepNext/>
+        <w:keepLines/>
+      </w:pPr>
+      <w:r>
+        <w:t>8.4 Error Confinement and Fault Injection</w:t>
+      </w:r>
+    </w:p>
+    <w:p>
+      <w:r>
+        <w:rPr>
+          <w:rFonts w:ascii="Calibri" w:hAnsi="Calibri"/>
+          <w:color w:val="111827"/>
+          <w:sz w:val="22"/>
+        </w:rPr>
+        <w:t>Each affected node has deterministic transmit and receive error counters (TEC and REC). A transmission error adds eight to TEC; a reception error adds one to REC. A node is error-active below 128, error-passive when either counter reaches 128, and bus-off when TEC reaches 256. A bus-off producer cannot submit a frame or enter arbitration.</w:t>
+      </w:r>
+    </w:p>
+    <w:p>
+      <w:r>
+        <w:rPr>
+          <w:rFonts w:ascii="Calibri" w:hAnsi="Calibri"/>
+          <w:color w:val="111827"/>
+          <w:sz w:val="22"/>
+        </w:rPr>
+        <w:t>Fault commands are scoped to a frame contract. Transmission faults must target its producer; reception faults and frame loss must target a declared consumer. Frame loss records delivery loss without changing TEC or REC. Each error frame consumes 14 nominal-rate bits in logical time, while loss itself consumes no error-frame time. Exact command replay is mutation-free.</w:t>
+      </w:r>
+    </w:p>
+    <w:p>
+      <w:r>
+        <w:rPr>
+          <w:rFonts w:ascii="Calibri" w:hAnsi="Calibri"/>
+          <w:color w:val="111827"/>
+          <w:sz w:val="22"/>
+        </w:rPr>
+        <w:t>Recovery is explicit and allowed only from bus-off. It requires at least 128 sequences of 11 recessive bits, advances logical time at the nominal bitrate, and resets both counters. Atomic audit and outbox evidence records state, counts, timing, and versions without CAN payload bytes.</w:t>
+      </w:r>
+    </w:p>
+    <w:p>
+      <w:pPr>
         <w:pStyle w:val="Heading1"/>
         <w:keepNext/>
         <w:keepLines/>
@@ -4134,7 +4782,7 @@
           <w:color w:val="111827"/>
           <w:sz w:val="22"/>
         </w:rPr>
-        <w:t>. IV-1 through IV-4 implement CAN-F-001 through CAN-F-040 and CAN-NF-001 through CAN-NF-014.</w:t>
+        <w:t>. IV-1 through IV-5 implement CAN-F-001 through CAN-F-050 and CAN-NF-001 through CAN-NF-017.</w:t>
       </w:r>
     </w:p>
     <w:p>
@@ -9675,6 +10323,985 @@
           </w:p>
         </w:tc>
       </w:tr>
+      <w:tr>
+        <w:trPr>
+          <w:cantSplit/>
+        </w:trPr>
+        <w:tc>
+          <w:tcPr>
+            <w:tcW w:type="dxa" w:w="1650"/>
+            <w:tcMar>
+              <w:top w:w="80" w:type="dxa"/>
+              <w:start w:w="120" w:type="dxa"/>
+              <w:bottom w:w="80" w:type="dxa"/>
+              <w:end w:w="120" w:type="dxa"/>
+            </w:tcMar>
+            <w:vAlign w:val="center"/>
+            <w:shd w:fill="FFFFFF"/>
+          </w:tcPr>
+          <w:p>
+            <w:pPr>
+              <w:spacing w:before="0" w:after="40" w:line="252" w:lineRule="auto"/>
+              <w:jc w:val="center"/>
+            </w:pPr>
+            <w:r>
+              <w:rPr>
+                <w:rFonts w:ascii="Calibri" w:hAnsi="Calibri"/>
+                <w:b w:val="0"/>
+                <w:color w:val="111827"/>
+                <w:sz w:val="17"/>
+              </w:rPr>
+              <w:t>TEC threshold</w:t>
+            </w:r>
+          </w:p>
+        </w:tc>
+        <w:tc>
+          <w:tcPr>
+            <w:tcW w:type="dxa" w:w="4450"/>
+            <w:tcMar>
+              <w:top w:w="80" w:type="dxa"/>
+              <w:start w:w="120" w:type="dxa"/>
+              <w:bottom w:w="80" w:type="dxa"/>
+              <w:end w:w="120" w:type="dxa"/>
+            </w:tcMar>
+            <w:vAlign w:val="center"/>
+            <w:shd w:fill="FFFFFF"/>
+          </w:tcPr>
+          <w:p>
+            <w:pPr>
+              <w:spacing w:before="0" w:after="40" w:line="252" w:lineRule="auto"/>
+              <w:jc w:val="left"/>
+            </w:pPr>
+            <w:r>
+              <w:rPr>
+                <w:rFonts w:ascii="Calibri" w:hAnsi="Calibri"/>
+                <w:b w:val="0"/>
+                <w:color w:val="111827"/>
+                <w:sz w:val="17"/>
+              </w:rPr>
+              <w:t>Verify 16 transmission errors produce error-passive and 32 produce bus-off.</w:t>
+            </w:r>
+          </w:p>
+        </w:tc>
+        <w:tc>
+          <w:tcPr>
+            <w:tcW w:type="dxa" w:w="3260"/>
+            <w:tcMar>
+              <w:top w:w="80" w:type="dxa"/>
+              <w:start w:w="120" w:type="dxa"/>
+              <w:bottom w:w="80" w:type="dxa"/>
+              <w:end w:w="120" w:type="dxa"/>
+            </w:tcMar>
+            <w:vAlign w:val="center"/>
+            <w:shd w:fill="FFFFFF"/>
+          </w:tcPr>
+          <w:p>
+            <w:pPr>
+              <w:spacing w:before="0" w:after="40" w:line="252" w:lineRule="auto"/>
+              <w:jc w:val="left"/>
+            </w:pPr>
+            <w:r>
+              <w:rPr>
+                <w:rFonts w:ascii="Calibri" w:hAnsi="Calibri"/>
+                <w:b w:val="0"/>
+                <w:color w:val="111827"/>
+                <w:sz w:val="17"/>
+              </w:rPr>
+              <w:t>Unit/service</w:t>
+            </w:r>
+          </w:p>
+        </w:tc>
+      </w:tr>
+      <w:tr>
+        <w:trPr>
+          <w:cantSplit/>
+        </w:trPr>
+        <w:tc>
+          <w:tcPr>
+            <w:tcW w:type="dxa" w:w="1650"/>
+            <w:tcMar>
+              <w:top w:w="80" w:type="dxa"/>
+              <w:start w:w="120" w:type="dxa"/>
+              <w:bottom w:w="80" w:type="dxa"/>
+              <w:end w:w="120" w:type="dxa"/>
+            </w:tcMar>
+            <w:vAlign w:val="center"/>
+            <w:shd w:fill="FFFFFF"/>
+          </w:tcPr>
+          <w:p>
+            <w:pPr>
+              <w:spacing w:before="0" w:after="40" w:line="252" w:lineRule="auto"/>
+              <w:jc w:val="center"/>
+            </w:pPr>
+            <w:r>
+              <w:rPr>
+                <w:rFonts w:ascii="Calibri" w:hAnsi="Calibri"/>
+                <w:b w:val="0"/>
+                <w:color w:val="111827"/>
+                <w:sz w:val="17"/>
+              </w:rPr>
+              <w:t>REC threshold</w:t>
+            </w:r>
+          </w:p>
+        </w:tc>
+        <w:tc>
+          <w:tcPr>
+            <w:tcW w:type="dxa" w:w="4450"/>
+            <w:tcMar>
+              <w:top w:w="80" w:type="dxa"/>
+              <w:start w:w="120" w:type="dxa"/>
+              <w:bottom w:w="80" w:type="dxa"/>
+              <w:end w:w="120" w:type="dxa"/>
+            </w:tcMar>
+            <w:vAlign w:val="center"/>
+            <w:shd w:fill="FFFFFF"/>
+          </w:tcPr>
+          <w:p>
+            <w:pPr>
+              <w:spacing w:before="0" w:after="40" w:line="252" w:lineRule="auto"/>
+              <w:jc w:val="left"/>
+            </w:pPr>
+            <w:r>
+              <w:rPr>
+                <w:rFonts w:ascii="Calibri" w:hAnsi="Calibri"/>
+                <w:b w:val="0"/>
+                <w:color w:val="111827"/>
+                <w:sz w:val="17"/>
+              </w:rPr>
+              <w:t>Verify reception errors produce error-passive at 128.</w:t>
+            </w:r>
+          </w:p>
+        </w:tc>
+        <w:tc>
+          <w:tcPr>
+            <w:tcW w:type="dxa" w:w="3260"/>
+            <w:tcMar>
+              <w:top w:w="80" w:type="dxa"/>
+              <w:start w:w="120" w:type="dxa"/>
+              <w:bottom w:w="80" w:type="dxa"/>
+              <w:end w:w="120" w:type="dxa"/>
+            </w:tcMar>
+            <w:vAlign w:val="center"/>
+            <w:shd w:fill="FFFFFF"/>
+          </w:tcPr>
+          <w:p>
+            <w:pPr>
+              <w:spacing w:before="0" w:after="40" w:line="252" w:lineRule="auto"/>
+              <w:jc w:val="left"/>
+            </w:pPr>
+            <w:r>
+              <w:rPr>
+                <w:rFonts w:ascii="Calibri" w:hAnsi="Calibri"/>
+                <w:b w:val="0"/>
+                <w:color w:val="111827"/>
+                <w:sz w:val="17"/>
+              </w:rPr>
+              <w:t>Unit</w:t>
+            </w:r>
+          </w:p>
+        </w:tc>
+      </w:tr>
+      <w:tr>
+        <w:trPr>
+          <w:cantSplit/>
+        </w:trPr>
+        <w:tc>
+          <w:tcPr>
+            <w:tcW w:type="dxa" w:w="1650"/>
+            <w:tcMar>
+              <w:top w:w="80" w:type="dxa"/>
+              <w:start w:w="120" w:type="dxa"/>
+              <w:bottom w:w="80" w:type="dxa"/>
+              <w:end w:w="120" w:type="dxa"/>
+            </w:tcMar>
+            <w:vAlign w:val="center"/>
+            <w:shd w:fill="FFFFFF"/>
+          </w:tcPr>
+          <w:p>
+            <w:pPr>
+              <w:spacing w:before="0" w:after="40" w:line="252" w:lineRule="auto"/>
+              <w:jc w:val="center"/>
+            </w:pPr>
+            <w:r>
+              <w:rPr>
+                <w:rFonts w:ascii="Calibri" w:hAnsi="Calibri"/>
+                <w:b w:val="0"/>
+                <w:color w:val="111827"/>
+                <w:sz w:val="17"/>
+              </w:rPr>
+              <w:t>Fault role</w:t>
+            </w:r>
+          </w:p>
+        </w:tc>
+        <w:tc>
+          <w:tcPr>
+            <w:tcW w:type="dxa" w:w="4450"/>
+            <w:tcMar>
+              <w:top w:w="80" w:type="dxa"/>
+              <w:start w:w="120" w:type="dxa"/>
+              <w:bottom w:w="80" w:type="dxa"/>
+              <w:end w:w="120" w:type="dxa"/>
+            </w:tcMar>
+            <w:vAlign w:val="center"/>
+            <w:shd w:fill="FFFFFF"/>
+          </w:tcPr>
+          <w:p>
+            <w:pPr>
+              <w:spacing w:before="0" w:after="40" w:line="252" w:lineRule="auto"/>
+              <w:jc w:val="left"/>
+            </w:pPr>
+            <w:r>
+              <w:rPr>
+                <w:rFonts w:ascii="Calibri" w:hAnsi="Calibri"/>
+                <w:b w:val="0"/>
+                <w:color w:val="111827"/>
+                <w:sz w:val="17"/>
+              </w:rPr>
+              <w:t>Reject producer/consumer targets that violate the frame contract.</w:t>
+            </w:r>
+          </w:p>
+        </w:tc>
+        <w:tc>
+          <w:tcPr>
+            <w:tcW w:type="dxa" w:w="3260"/>
+            <w:tcMar>
+              <w:top w:w="80" w:type="dxa"/>
+              <w:start w:w="120" w:type="dxa"/>
+              <w:bottom w:w="80" w:type="dxa"/>
+              <w:end w:w="120" w:type="dxa"/>
+            </w:tcMar>
+            <w:vAlign w:val="center"/>
+            <w:shd w:fill="FFFFFF"/>
+          </w:tcPr>
+          <w:p>
+            <w:pPr>
+              <w:spacing w:before="0" w:after="40" w:line="252" w:lineRule="auto"/>
+              <w:jc w:val="left"/>
+            </w:pPr>
+            <w:r>
+              <w:rPr>
+                <w:rFonts w:ascii="Calibri" w:hAnsi="Calibri"/>
+                <w:b w:val="0"/>
+                <w:color w:val="111827"/>
+                <w:sz w:val="17"/>
+              </w:rPr>
+              <w:t>Service</w:t>
+            </w:r>
+          </w:p>
+        </w:tc>
+      </w:tr>
+      <w:tr>
+        <w:trPr>
+          <w:cantSplit/>
+        </w:trPr>
+        <w:tc>
+          <w:tcPr>
+            <w:tcW w:type="dxa" w:w="1650"/>
+            <w:tcMar>
+              <w:top w:w="80" w:type="dxa"/>
+              <w:start w:w="120" w:type="dxa"/>
+              <w:bottom w:w="80" w:type="dxa"/>
+              <w:end w:w="120" w:type="dxa"/>
+            </w:tcMar>
+            <w:vAlign w:val="center"/>
+            <w:shd w:fill="FFFFFF"/>
+          </w:tcPr>
+          <w:p>
+            <w:pPr>
+              <w:spacing w:before="0" w:after="40" w:line="252" w:lineRule="auto"/>
+              <w:jc w:val="center"/>
+            </w:pPr>
+            <w:r>
+              <w:rPr>
+                <w:rFonts w:ascii="Calibri" w:hAnsi="Calibri"/>
+                <w:b w:val="0"/>
+                <w:color w:val="111827"/>
+                <w:sz w:val="17"/>
+              </w:rPr>
+              <w:t>Frame loss</w:t>
+            </w:r>
+          </w:p>
+        </w:tc>
+        <w:tc>
+          <w:tcPr>
+            <w:tcW w:type="dxa" w:w="4450"/>
+            <w:tcMar>
+              <w:top w:w="80" w:type="dxa"/>
+              <w:start w:w="120" w:type="dxa"/>
+              <w:bottom w:w="80" w:type="dxa"/>
+              <w:end w:w="120" w:type="dxa"/>
+            </w:tcMar>
+            <w:vAlign w:val="center"/>
+            <w:shd w:fill="FFFFFF"/>
+          </w:tcPr>
+          <w:p>
+            <w:pPr>
+              <w:spacing w:before="0" w:after="40" w:line="252" w:lineRule="auto"/>
+              <w:jc w:val="left"/>
+            </w:pPr>
+            <w:r>
+              <w:rPr>
+                <w:rFonts w:ascii="Calibri" w:hAnsi="Calibri"/>
+                <w:b w:val="0"/>
+                <w:color w:val="111827"/>
+                <w:sz w:val="17"/>
+              </w:rPr>
+              <w:t>Record loss without modifying TEC, REC, sequence, or payload evidence.</w:t>
+            </w:r>
+          </w:p>
+        </w:tc>
+        <w:tc>
+          <w:tcPr>
+            <w:tcW w:type="dxa" w:w="3260"/>
+            <w:tcMar>
+              <w:top w:w="80" w:type="dxa"/>
+              <w:start w:w="120" w:type="dxa"/>
+              <w:bottom w:w="80" w:type="dxa"/>
+              <w:end w:w="120" w:type="dxa"/>
+            </w:tcMar>
+            <w:vAlign w:val="center"/>
+            <w:shd w:fill="FFFFFF"/>
+          </w:tcPr>
+          <w:p>
+            <w:pPr>
+              <w:spacing w:before="0" w:after="40" w:line="252" w:lineRule="auto"/>
+              <w:jc w:val="left"/>
+            </w:pPr>
+            <w:r>
+              <w:rPr>
+                <w:rFonts w:ascii="Calibri" w:hAnsi="Calibri"/>
+                <w:b w:val="0"/>
+                <w:color w:val="111827"/>
+                <w:sz w:val="17"/>
+              </w:rPr>
+              <w:t>Service</w:t>
+            </w:r>
+          </w:p>
+        </w:tc>
+      </w:tr>
+      <w:tr>
+        <w:trPr>
+          <w:cantSplit/>
+        </w:trPr>
+        <w:tc>
+          <w:tcPr>
+            <w:tcW w:type="dxa" w:w="1650"/>
+            <w:tcMar>
+              <w:top w:w="80" w:type="dxa"/>
+              <w:start w:w="120" w:type="dxa"/>
+              <w:bottom w:w="80" w:type="dxa"/>
+              <w:end w:w="120" w:type="dxa"/>
+            </w:tcMar>
+            <w:vAlign w:val="center"/>
+            <w:shd w:fill="FFFFFF"/>
+          </w:tcPr>
+          <w:p>
+            <w:pPr>
+              <w:spacing w:before="0" w:after="40" w:line="252" w:lineRule="auto"/>
+              <w:jc w:val="center"/>
+            </w:pPr>
+            <w:r>
+              <w:rPr>
+                <w:rFonts w:ascii="Calibri" w:hAnsi="Calibri"/>
+                <w:b w:val="0"/>
+                <w:color w:val="111827"/>
+                <w:sz w:val="17"/>
+              </w:rPr>
+              <w:t>Bus-off enforcement</w:t>
+            </w:r>
+          </w:p>
+        </w:tc>
+        <w:tc>
+          <w:tcPr>
+            <w:tcW w:type="dxa" w:w="4450"/>
+            <w:tcMar>
+              <w:top w:w="80" w:type="dxa"/>
+              <w:start w:w="120" w:type="dxa"/>
+              <w:bottom w:w="80" w:type="dxa"/>
+              <w:end w:w="120" w:type="dxa"/>
+            </w:tcMar>
+            <w:vAlign w:val="center"/>
+            <w:shd w:fill="FFFFFF"/>
+          </w:tcPr>
+          <w:p>
+            <w:pPr>
+              <w:spacing w:before="0" w:after="40" w:line="252" w:lineRule="auto"/>
+              <w:jc w:val="left"/>
+            </w:pPr>
+            <w:r>
+              <w:rPr>
+                <w:rFonts w:ascii="Calibri" w:hAnsi="Calibri"/>
+                <w:b w:val="0"/>
+                <w:color w:val="111827"/>
+                <w:sz w:val="17"/>
+              </w:rPr>
+              <w:t>Reject direct submission and arbitration by a bus-off producer.</w:t>
+            </w:r>
+          </w:p>
+        </w:tc>
+        <w:tc>
+          <w:tcPr>
+            <w:tcW w:type="dxa" w:w="3260"/>
+            <w:tcMar>
+              <w:top w:w="80" w:type="dxa"/>
+              <w:start w:w="120" w:type="dxa"/>
+              <w:bottom w:w="80" w:type="dxa"/>
+              <w:end w:w="120" w:type="dxa"/>
+            </w:tcMar>
+            <w:vAlign w:val="center"/>
+            <w:shd w:fill="FFFFFF"/>
+          </w:tcPr>
+          <w:p>
+            <w:pPr>
+              <w:spacing w:before="0" w:after="40" w:line="252" w:lineRule="auto"/>
+              <w:jc w:val="left"/>
+            </w:pPr>
+            <w:r>
+              <w:rPr>
+                <w:rFonts w:ascii="Calibri" w:hAnsi="Calibri"/>
+                <w:b w:val="0"/>
+                <w:color w:val="111827"/>
+                <w:sz w:val="17"/>
+              </w:rPr>
+              <w:t>Service/API</w:t>
+            </w:r>
+          </w:p>
+        </w:tc>
+      </w:tr>
+      <w:tr>
+        <w:trPr>
+          <w:cantSplit/>
+        </w:trPr>
+        <w:tc>
+          <w:tcPr>
+            <w:tcW w:type="dxa" w:w="1650"/>
+            <w:tcMar>
+              <w:top w:w="80" w:type="dxa"/>
+              <w:start w:w="120" w:type="dxa"/>
+              <w:bottom w:w="80" w:type="dxa"/>
+              <w:end w:w="120" w:type="dxa"/>
+            </w:tcMar>
+            <w:vAlign w:val="center"/>
+            <w:shd w:fill="FFFFFF"/>
+          </w:tcPr>
+          <w:p>
+            <w:pPr>
+              <w:spacing w:before="0" w:after="40" w:line="252" w:lineRule="auto"/>
+              <w:jc w:val="center"/>
+            </w:pPr>
+            <w:r>
+              <w:rPr>
+                <w:rFonts w:ascii="Calibri" w:hAnsi="Calibri"/>
+                <w:b w:val="0"/>
+                <w:color w:val="111827"/>
+                <w:sz w:val="17"/>
+              </w:rPr>
+              <w:t>Recovery timing</w:t>
+            </w:r>
+          </w:p>
+        </w:tc>
+        <w:tc>
+          <w:tcPr>
+            <w:tcW w:type="dxa" w:w="4450"/>
+            <w:tcMar>
+              <w:top w:w="80" w:type="dxa"/>
+              <w:start w:w="120" w:type="dxa"/>
+              <w:bottom w:w="80" w:type="dxa"/>
+              <w:end w:w="120" w:type="dxa"/>
+            </w:tcMar>
+            <w:vAlign w:val="center"/>
+            <w:shd w:fill="FFFFFF"/>
+          </w:tcPr>
+          <w:p>
+            <w:pPr>
+              <w:spacing w:before="0" w:after="40" w:line="252" w:lineRule="auto"/>
+              <w:jc w:val="left"/>
+            </w:pPr>
+            <w:r>
+              <w:rPr>
+                <w:rFonts w:ascii="Calibri" w:hAnsi="Calibri"/>
+                <w:b w:val="0"/>
+                <w:color w:val="111827"/>
+                <w:sz w:val="17"/>
+              </w:rPr>
+              <w:t>Verify 128 × 11 recessive bits at the nominal bitrate and counter reset.</w:t>
+            </w:r>
+          </w:p>
+        </w:tc>
+        <w:tc>
+          <w:tcPr>
+            <w:tcW w:type="dxa" w:w="3260"/>
+            <w:tcMar>
+              <w:top w:w="80" w:type="dxa"/>
+              <w:start w:w="120" w:type="dxa"/>
+              <w:bottom w:w="80" w:type="dxa"/>
+              <w:end w:w="120" w:type="dxa"/>
+            </w:tcMar>
+            <w:vAlign w:val="center"/>
+            <w:shd w:fill="FFFFFF"/>
+          </w:tcPr>
+          <w:p>
+            <w:pPr>
+              <w:spacing w:before="0" w:after="40" w:line="252" w:lineRule="auto"/>
+              <w:jc w:val="left"/>
+            </w:pPr>
+            <w:r>
+              <w:rPr>
+                <w:rFonts w:ascii="Calibri" w:hAnsi="Calibri"/>
+                <w:b w:val="0"/>
+                <w:color w:val="111827"/>
+                <w:sz w:val="17"/>
+              </w:rPr>
+              <w:t>Unit/service</w:t>
+            </w:r>
+          </w:p>
+        </w:tc>
+      </w:tr>
+      <w:tr>
+        <w:trPr>
+          <w:cantSplit/>
+        </w:trPr>
+        <w:tc>
+          <w:tcPr>
+            <w:tcW w:type="dxa" w:w="1650"/>
+            <w:tcMar>
+              <w:top w:w="80" w:type="dxa"/>
+              <w:start w:w="120" w:type="dxa"/>
+              <w:bottom w:w="80" w:type="dxa"/>
+              <w:end w:w="120" w:type="dxa"/>
+            </w:tcMar>
+            <w:vAlign w:val="center"/>
+            <w:shd w:fill="FFFFFF"/>
+          </w:tcPr>
+          <w:p>
+            <w:pPr>
+              <w:spacing w:before="0" w:after="40" w:line="252" w:lineRule="auto"/>
+              <w:jc w:val="center"/>
+            </w:pPr>
+            <w:r>
+              <w:rPr>
+                <w:rFonts w:ascii="Calibri" w:hAnsi="Calibri"/>
+                <w:b w:val="0"/>
+                <w:color w:val="111827"/>
+                <w:sz w:val="17"/>
+              </w:rPr>
+              <w:t>Fault replay</w:t>
+            </w:r>
+          </w:p>
+        </w:tc>
+        <w:tc>
+          <w:tcPr>
+            <w:tcW w:type="dxa" w:w="4450"/>
+            <w:tcMar>
+              <w:top w:w="80" w:type="dxa"/>
+              <w:start w:w="120" w:type="dxa"/>
+              <w:bottom w:w="80" w:type="dxa"/>
+              <w:end w:w="120" w:type="dxa"/>
+            </w:tcMar>
+            <w:vAlign w:val="center"/>
+            <w:shd w:fill="FFFFFF"/>
+          </w:tcPr>
+          <w:p>
+            <w:pPr>
+              <w:spacing w:before="0" w:after="40" w:line="252" w:lineRule="auto"/>
+              <w:jc w:val="left"/>
+            </w:pPr>
+            <w:r>
+              <w:rPr>
+                <w:rFonts w:ascii="Calibri" w:hAnsi="Calibri"/>
+                <w:b w:val="0"/>
+                <w:color w:val="111827"/>
+                <w:sz w:val="17"/>
+              </w:rPr>
+              <w:t>Return exact persisted evidence without repeating counters or time.</w:t>
+            </w:r>
+          </w:p>
+        </w:tc>
+        <w:tc>
+          <w:tcPr>
+            <w:tcW w:type="dxa" w:w="3260"/>
+            <w:tcMar>
+              <w:top w:w="80" w:type="dxa"/>
+              <w:start w:w="120" w:type="dxa"/>
+              <w:bottom w:w="80" w:type="dxa"/>
+              <w:end w:w="120" w:type="dxa"/>
+            </w:tcMar>
+            <w:vAlign w:val="center"/>
+            <w:shd w:fill="FFFFFF"/>
+          </w:tcPr>
+          <w:p>
+            <w:pPr>
+              <w:spacing w:before="0" w:after="40" w:line="252" w:lineRule="auto"/>
+              <w:jc w:val="left"/>
+            </w:pPr>
+            <w:r>
+              <w:rPr>
+                <w:rFonts w:ascii="Calibri" w:hAnsi="Calibri"/>
+                <w:b w:val="0"/>
+                <w:color w:val="111827"/>
+                <w:sz w:val="17"/>
+              </w:rPr>
+              <w:t>Service/API</w:t>
+            </w:r>
+          </w:p>
+        </w:tc>
+      </w:tr>
+      <w:tr>
+        <w:trPr>
+          <w:cantSplit/>
+        </w:trPr>
+        <w:tc>
+          <w:tcPr>
+            <w:tcW w:type="dxa" w:w="1650"/>
+            <w:tcMar>
+              <w:top w:w="80" w:type="dxa"/>
+              <w:start w:w="120" w:type="dxa"/>
+              <w:bottom w:w="80" w:type="dxa"/>
+              <w:end w:w="120" w:type="dxa"/>
+            </w:tcMar>
+            <w:vAlign w:val="center"/>
+            <w:shd w:fill="FFFFFF"/>
+          </w:tcPr>
+          <w:p>
+            <w:pPr>
+              <w:spacing w:before="0" w:after="40" w:line="252" w:lineRule="auto"/>
+              <w:jc w:val="center"/>
+            </w:pPr>
+            <w:r>
+              <w:rPr>
+                <w:rFonts w:ascii="Calibri" w:hAnsi="Calibri"/>
+                <w:b w:val="0"/>
+                <w:color w:val="111827"/>
+                <w:sz w:val="17"/>
+              </w:rPr>
+              <w:t>Fault conflict</w:t>
+            </w:r>
+          </w:p>
+        </w:tc>
+        <w:tc>
+          <w:tcPr>
+            <w:tcW w:type="dxa" w:w="4450"/>
+            <w:tcMar>
+              <w:top w:w="80" w:type="dxa"/>
+              <w:start w:w="120" w:type="dxa"/>
+              <w:bottom w:w="80" w:type="dxa"/>
+              <w:end w:w="120" w:type="dxa"/>
+            </w:tcMar>
+            <w:vAlign w:val="center"/>
+            <w:shd w:fill="FFFFFF"/>
+          </w:tcPr>
+          <w:p>
+            <w:pPr>
+              <w:spacing w:before="0" w:after="40" w:line="252" w:lineRule="auto"/>
+              <w:jc w:val="left"/>
+            </w:pPr>
+            <w:r>
+              <w:rPr>
+                <w:rFonts w:ascii="Calibri" w:hAnsi="Calibri"/>
+                <w:b w:val="0"/>
+                <w:color w:val="111827"/>
+                <w:sz w:val="17"/>
+              </w:rPr>
+              <w:t>Reject changed command-ID reuse with a stable error.</w:t>
+            </w:r>
+          </w:p>
+        </w:tc>
+        <w:tc>
+          <w:tcPr>
+            <w:tcW w:type="dxa" w:w="3260"/>
+            <w:tcMar>
+              <w:top w:w="80" w:type="dxa"/>
+              <w:start w:w="120" w:type="dxa"/>
+              <w:bottom w:w="80" w:type="dxa"/>
+              <w:end w:w="120" w:type="dxa"/>
+            </w:tcMar>
+            <w:vAlign w:val="center"/>
+            <w:shd w:fill="FFFFFF"/>
+          </w:tcPr>
+          <w:p>
+            <w:pPr>
+              <w:spacing w:before="0" w:after="40" w:line="252" w:lineRule="auto"/>
+              <w:jc w:val="left"/>
+            </w:pPr>
+            <w:r>
+              <w:rPr>
+                <w:rFonts w:ascii="Calibri" w:hAnsi="Calibri"/>
+                <w:b w:val="0"/>
+                <w:color w:val="111827"/>
+                <w:sz w:val="17"/>
+              </w:rPr>
+              <w:t>Service/API</w:t>
+            </w:r>
+          </w:p>
+        </w:tc>
+      </w:tr>
+      <w:tr>
+        <w:trPr>
+          <w:cantSplit/>
+        </w:trPr>
+        <w:tc>
+          <w:tcPr>
+            <w:tcW w:type="dxa" w:w="1650"/>
+            <w:tcMar>
+              <w:top w:w="80" w:type="dxa"/>
+              <w:start w:w="120" w:type="dxa"/>
+              <w:bottom w:w="80" w:type="dxa"/>
+              <w:end w:w="120" w:type="dxa"/>
+            </w:tcMar>
+            <w:vAlign w:val="center"/>
+            <w:shd w:fill="FFFFFF"/>
+          </w:tcPr>
+          <w:p>
+            <w:pPr>
+              <w:spacing w:before="0" w:after="40" w:line="252" w:lineRule="auto"/>
+              <w:jc w:val="center"/>
+            </w:pPr>
+            <w:r>
+              <w:rPr>
+                <w:rFonts w:ascii="Calibri" w:hAnsi="Calibri"/>
+                <w:b w:val="0"/>
+                <w:color w:val="111827"/>
+                <w:sz w:val="17"/>
+              </w:rPr>
+              <w:t>Fault RBAC</w:t>
+            </w:r>
+          </w:p>
+        </w:tc>
+        <w:tc>
+          <w:tcPr>
+            <w:tcW w:type="dxa" w:w="4450"/>
+            <w:tcMar>
+              <w:top w:w="80" w:type="dxa"/>
+              <w:start w:w="120" w:type="dxa"/>
+              <w:bottom w:w="80" w:type="dxa"/>
+              <w:end w:w="120" w:type="dxa"/>
+            </w:tcMar>
+            <w:vAlign w:val="center"/>
+            <w:shd w:fill="FFFFFF"/>
+          </w:tcPr>
+          <w:p>
+            <w:pPr>
+              <w:spacing w:before="0" w:after="40" w:line="252" w:lineRule="auto"/>
+              <w:jc w:val="left"/>
+            </w:pPr>
+            <w:r>
+              <w:rPr>
+                <w:rFonts w:ascii="Calibri" w:hAnsi="Calibri"/>
+                <w:b w:val="0"/>
+                <w:color w:val="111827"/>
+                <w:sz w:val="17"/>
+              </w:rPr>
+              <w:t>Require manage for mutation and read for history/detail.</w:t>
+            </w:r>
+          </w:p>
+        </w:tc>
+        <w:tc>
+          <w:tcPr>
+            <w:tcW w:type="dxa" w:w="3260"/>
+            <w:tcMar>
+              <w:top w:w="80" w:type="dxa"/>
+              <w:start w:w="120" w:type="dxa"/>
+              <w:bottom w:w="80" w:type="dxa"/>
+              <w:end w:w="120" w:type="dxa"/>
+            </w:tcMar>
+            <w:vAlign w:val="center"/>
+            <w:shd w:fill="FFFFFF"/>
+          </w:tcPr>
+          <w:p>
+            <w:pPr>
+              <w:spacing w:before="0" w:after="40" w:line="252" w:lineRule="auto"/>
+              <w:jc w:val="left"/>
+            </w:pPr>
+            <w:r>
+              <w:rPr>
+                <w:rFonts w:ascii="Calibri" w:hAnsi="Calibri"/>
+                <w:b w:val="0"/>
+                <w:color w:val="111827"/>
+                <w:sz w:val="17"/>
+              </w:rPr>
+              <w:t>API/integration</w:t>
+            </w:r>
+          </w:p>
+        </w:tc>
+      </w:tr>
+      <w:tr>
+        <w:trPr>
+          <w:cantSplit/>
+        </w:trPr>
+        <w:tc>
+          <w:tcPr>
+            <w:tcW w:type="dxa" w:w="1650"/>
+            <w:tcMar>
+              <w:top w:w="80" w:type="dxa"/>
+              <w:start w:w="120" w:type="dxa"/>
+              <w:bottom w:w="80" w:type="dxa"/>
+              <w:end w:w="120" w:type="dxa"/>
+            </w:tcMar>
+            <w:vAlign w:val="center"/>
+            <w:shd w:fill="FFFFFF"/>
+          </w:tcPr>
+          <w:p>
+            <w:pPr>
+              <w:spacing w:before="0" w:after="40" w:line="252" w:lineRule="auto"/>
+              <w:jc w:val="center"/>
+            </w:pPr>
+            <w:r>
+              <w:rPr>
+                <w:rFonts w:ascii="Calibri" w:hAnsi="Calibri"/>
+                <w:b w:val="0"/>
+                <w:color w:val="111827"/>
+                <w:sz w:val="17"/>
+              </w:rPr>
+              <w:t>Fault minimization</w:t>
+            </w:r>
+          </w:p>
+        </w:tc>
+        <w:tc>
+          <w:tcPr>
+            <w:tcW w:type="dxa" w:w="4450"/>
+            <w:tcMar>
+              <w:top w:w="80" w:type="dxa"/>
+              <w:start w:w="120" w:type="dxa"/>
+              <w:bottom w:w="80" w:type="dxa"/>
+              <w:end w:w="120" w:type="dxa"/>
+            </w:tcMar>
+            <w:vAlign w:val="center"/>
+            <w:shd w:fill="FFFFFF"/>
+          </w:tcPr>
+          <w:p>
+            <w:pPr>
+              <w:spacing w:before="0" w:after="40" w:line="252" w:lineRule="auto"/>
+              <w:jc w:val="left"/>
+            </w:pPr>
+            <w:r>
+              <w:rPr>
+                <w:rFonts w:ascii="Calibri" w:hAnsi="Calibri"/>
+                <w:b w:val="0"/>
+                <w:color w:val="111827"/>
+                <w:sz w:val="17"/>
+              </w:rPr>
+              <w:t>Exclude payload and full request bodies from audit and outbox.</w:t>
+            </w:r>
+          </w:p>
+        </w:tc>
+        <w:tc>
+          <w:tcPr>
+            <w:tcW w:type="dxa" w:w="3260"/>
+            <w:tcMar>
+              <w:top w:w="80" w:type="dxa"/>
+              <w:start w:w="120" w:type="dxa"/>
+              <w:bottom w:w="80" w:type="dxa"/>
+              <w:end w:w="120" w:type="dxa"/>
+            </w:tcMar>
+            <w:vAlign w:val="center"/>
+            <w:shd w:fill="FFFFFF"/>
+          </w:tcPr>
+          <w:p>
+            <w:pPr>
+              <w:spacing w:before="0" w:after="40" w:line="252" w:lineRule="auto"/>
+              <w:jc w:val="left"/>
+            </w:pPr>
+            <w:r>
+              <w:rPr>
+                <w:rFonts w:ascii="Calibri" w:hAnsi="Calibri"/>
+                <w:b w:val="0"/>
+                <w:color w:val="111827"/>
+                <w:sz w:val="17"/>
+              </w:rPr>
+              <w:t>Service</w:t>
+            </w:r>
+          </w:p>
+        </w:tc>
+      </w:tr>
+      <w:tr>
+        <w:trPr>
+          <w:cantSplit/>
+        </w:trPr>
+        <w:tc>
+          <w:tcPr>
+            <w:tcW w:type="dxa" w:w="1650"/>
+            <w:tcMar>
+              <w:top w:w="80" w:type="dxa"/>
+              <w:start w:w="120" w:type="dxa"/>
+              <w:bottom w:w="80" w:type="dxa"/>
+              <w:end w:w="120" w:type="dxa"/>
+            </w:tcMar>
+            <w:vAlign w:val="center"/>
+            <w:shd w:fill="FFFFFF"/>
+          </w:tcPr>
+          <w:p>
+            <w:pPr>
+              <w:spacing w:before="0" w:after="40" w:line="252" w:lineRule="auto"/>
+              <w:jc w:val="center"/>
+            </w:pPr>
+            <w:r>
+              <w:rPr>
+                <w:rFonts w:ascii="Calibri" w:hAnsi="Calibri"/>
+                <w:b w:val="0"/>
+                <w:color w:val="111827"/>
+                <w:sz w:val="17"/>
+              </w:rPr>
+              <w:t>Fault migration</w:t>
+            </w:r>
+          </w:p>
+        </w:tc>
+        <w:tc>
+          <w:tcPr>
+            <w:tcW w:type="dxa" w:w="4450"/>
+            <w:tcMar>
+              <w:top w:w="80" w:type="dxa"/>
+              <w:start w:w="120" w:type="dxa"/>
+              <w:bottom w:w="80" w:type="dxa"/>
+              <w:end w:w="120" w:type="dxa"/>
+            </w:tcMar>
+            <w:vAlign w:val="center"/>
+            <w:shd w:fill="FFFFFF"/>
+          </w:tcPr>
+          <w:p>
+            <w:pPr>
+              <w:spacing w:before="0" w:after="40" w:line="252" w:lineRule="auto"/>
+              <w:jc w:val="left"/>
+            </w:pPr>
+            <w:r>
+              <w:rPr>
+                <w:rFonts w:ascii="Calibri" w:hAnsi="Calibri"/>
+                <w:b w:val="0"/>
+                <w:color w:val="111827"/>
+                <w:sz w:val="17"/>
+              </w:rPr>
+              <w:t>Upgrade and downgrade error-state and execution persistence.</w:t>
+            </w:r>
+          </w:p>
+        </w:tc>
+        <w:tc>
+          <w:tcPr>
+            <w:tcW w:type="dxa" w:w="3260"/>
+            <w:tcMar>
+              <w:top w:w="80" w:type="dxa"/>
+              <w:start w:w="120" w:type="dxa"/>
+              <w:bottom w:w="80" w:type="dxa"/>
+              <w:end w:w="120" w:type="dxa"/>
+            </w:tcMar>
+            <w:vAlign w:val="center"/>
+            <w:shd w:fill="FFFFFF"/>
+          </w:tcPr>
+          <w:p>
+            <w:pPr>
+              <w:spacing w:before="0" w:after="40" w:line="252" w:lineRule="auto"/>
+              <w:jc w:val="left"/>
+            </w:pPr>
+            <w:r>
+              <w:rPr>
+                <w:rFonts w:ascii="Calibri" w:hAnsi="Calibri"/>
+                <w:b w:val="0"/>
+                <w:color w:val="111827"/>
+                <w:sz w:val="17"/>
+              </w:rPr>
+              <w:t>Integration</w:t>
+            </w:r>
+          </w:p>
+        </w:tc>
+      </w:tr>
     </w:tbl>
     <w:p>
       <w:pPr>
@@ -9754,7 +11381,7 @@
           <w:color w:val="1F4D78"/>
           <w:sz w:val="19"/>
         </w:rPr>
-        <w:t>0027_can_fd</w:t>
+        <w:t>0028_can_faults</w:t>
       </w:r>
       <w:r>
         <w:rPr>
@@ -9893,6 +11520,55 @@
           <w:color w:val="111827"/>
           <w:sz w:val="22"/>
         </w:rPr>
+        <w:t xml:space="preserve">Fault events are </w:t>
+      </w:r>
+      <w:r>
+        <w:rPr>
+          <w:rFonts w:ascii="Consolas" w:hAnsi="Consolas"/>
+          <w:color w:val="1F4D78"/>
+          <w:sz w:val="19"/>
+        </w:rPr>
+        <w:t>atep.can.fault.injected.v1</w:t>
+      </w:r>
+      <w:r>
+        <w:rPr>
+          <w:rFonts w:ascii="Calibri" w:hAnsi="Calibri"/>
+          <w:color w:val="111827"/>
+          <w:sz w:val="22"/>
+        </w:rPr>
+        <w:t xml:space="preserve"> and </w:t>
+      </w:r>
+      <w:r>
+        <w:rPr>
+          <w:rFonts w:ascii="Consolas" w:hAnsi="Consolas"/>
+          <w:color w:val="1F4D78"/>
+          <w:sz w:val="19"/>
+        </w:rPr>
+        <w:t>atep.can.bus.recovered.v1</w:t>
+      </w:r>
+      <w:r>
+        <w:rPr>
+          <w:rFonts w:ascii="Calibri" w:hAnsi="Calibri"/>
+          <w:color w:val="111827"/>
+          <w:sz w:val="22"/>
+        </w:rPr>
+        <w:t>.</w:t>
+      </w:r>
+    </w:p>
+    <w:p>
+      <w:pPr>
+        <w:pStyle w:val="ListBullet"/>
+        <w:numPr>
+          <w:ilvl w:val="0"/>
+          <w:numId w:val="13"/>
+        </w:numPr>
+      </w:pPr>
+      <w:r>
+        <w:rPr>
+          <w:rFonts w:ascii="Calibri" w:hAnsi="Calibri"/>
+          <w:color w:val="111827"/>
+          <w:sz w:val="22"/>
+        </w:rPr>
         <w:t xml:space="preserve">Permissions are </w:t>
       </w:r>
       <w:r>
@@ -9942,7 +11618,7 @@
           <w:color w:val="111827"/>
           <w:sz w:val="22"/>
         </w:rPr>
-        <w:t>Automated tests cover validation, priority, classic and FD timing mathematics, mixed arbitration, readiness, delivery, utilization, versioning, replay, errors, DBC bit placement through 512 bits, signed scaling, exact conversion, evidence minimization, persistence, and OpenAPI.</w:t>
+        <w:t>Automated tests cover validation, priority, classic and FD timing mathematics, mixed arbitration, readiness, delivery, utilization, versioning, replay, errors, DBC bit placement through 512 bits, signed scaling, exact conversion, TEC/REC thresholds, loss, bus-off enforcement, recovery timing, evidence minimization, persistence, and OpenAPI.</w:t>
       </w:r>
     </w:p>
     <w:p>
@@ -10143,6 +11819,23 @@
     </w:p>
     <w:p>
       <w:pPr>
+        <w:pStyle w:val="ListBullet"/>
+        <w:numPr>
+          <w:ilvl w:val="0"/>
+          <w:numId w:val="14"/>
+        </w:numPr>
+      </w:pPr>
+      <w:r>
+        <w:rPr>
+          <w:rFonts w:ascii="Calibri" w:hAnsi="Calibri"/>
+          <w:color w:val="111827"/>
+          <w:sz w:val="22"/>
+        </w:rPr>
+        <w:t>Error-frame timing intentionally excludes bit stuffing, intermission, overload frames, acknowledgement errors, and automatic retransmission.</w:t>
+      </w:r>
+    </w:p>
+    <w:p>
+      <w:pPr>
         <w:pStyle w:val="Heading1"/>
         <w:keepNext/>
         <w:keepLines/>
@@ -10158,7 +11851,7 @@
           <w:color w:val="111827"/>
           <w:sz w:val="22"/>
         </w:rPr>
-        <w:t xml:space="preserve">The recommended next increment is IV-5: deterministic error frames, transmit/receive error counters, bus-off and recovery, plus bounded fault injection. See </w:t>
+        <w:t xml:space="preserve">The recommended next increment is IV-6: LIN and automotive Ethernet adapters plus deterministic gateway routing. See </w:t>
       </w:r>
       <w:r>
         <w:rPr>
@@ -10870,7 +12563,7 @@
         <w:color w:val="667085"/>
         <w:sz w:val="17"/>
       </w:rPr>
-      <w:t>ATEP Volume IV Workbook  |  Version 0.4.0</w:t>
+      <w:t>ATEP Volume IV Workbook  |  Version 0.5.0</w:t>
     </w:r>
     <w:r>
       <w:rPr>

</xml_diff>

<commit_message>
feat(can): add deterministic error confinement (#61)
</commit_message>
<xml_diff>
--- a/docs/ATEP_Volume_IV_CAN_Network_Engineering_Workbook.docx
+++ b/docs/ATEP_Volume_IV_CAN_Network_Engineering_Workbook.docx
@@ -143,7 +143,7 @@
                 <w:color w:val="0B2545"/>
                 <w:sz w:val="19"/>
               </w:rPr>
-              <w:t>0.4.0</w:t>
+              <w:t>0.5.0</w:t>
             </w:r>
           </w:p>
         </w:tc>
@@ -204,7 +204,7 @@
                 <w:color w:val="111827"/>
                 <w:sz w:val="19"/>
               </w:rPr>
-              <w:t>24 August 2026</w:t>
+              <w:t>25 August 2026</w:t>
             </w:r>
           </w:p>
         </w:tc>
@@ -265,7 +265,7 @@
                 <w:color w:val="111827"/>
                 <w:sz w:val="19"/>
               </w:rPr>
-              <w:t>Implemented increments: IV-1 to IV-4</w:t>
+              <w:t>Implemented increments: IV-1 to IV-5</w:t>
             </w:r>
           </w:p>
         </w:tc>
@@ -893,7 +893,7 @@
                 <w:color w:val="111827"/>
                 <w:sz w:val="17"/>
               </w:rPr>
-              <w:t>Increments IV-1 through IV-4</w:t>
+              <w:t>Increments IV-1 through IV-5</w:t>
             </w:r>
           </w:p>
         </w:tc>
@@ -1564,6 +1564,95 @@
           </w:p>
         </w:tc>
       </w:tr>
+      <w:tr>
+        <w:trPr>
+          <w:cantSplit/>
+        </w:trPr>
+        <w:tc>
+          <w:tcPr>
+            <w:tcW w:type="dxa" w:w="1650"/>
+            <w:tcMar>
+              <w:top w:w="80" w:type="dxa"/>
+              <w:start w:w="120" w:type="dxa"/>
+              <w:bottom w:w="80" w:type="dxa"/>
+              <w:end w:w="120" w:type="dxa"/>
+            </w:tcMar>
+            <w:vAlign w:val="center"/>
+            <w:shd w:fill="FFFFFF"/>
+          </w:tcPr>
+          <w:p>
+            <w:pPr>
+              <w:spacing w:before="0" w:after="40" w:line="252" w:lineRule="auto"/>
+              <w:jc w:val="center"/>
+            </w:pPr>
+            <w:r>
+              <w:rPr>
+                <w:rFonts w:ascii="Calibri" w:hAnsi="Calibri"/>
+                <w:b w:val="0"/>
+                <w:color w:val="111827"/>
+                <w:sz w:val="17"/>
+              </w:rPr>
+              <w:t>0.5.0</w:t>
+            </w:r>
+          </w:p>
+        </w:tc>
+        <w:tc>
+          <w:tcPr>
+            <w:tcW w:type="dxa" w:w="4450"/>
+            <w:tcMar>
+              <w:top w:w="80" w:type="dxa"/>
+              <w:start w:w="120" w:type="dxa"/>
+              <w:bottom w:w="80" w:type="dxa"/>
+              <w:end w:w="120" w:type="dxa"/>
+            </w:tcMar>
+            <w:vAlign w:val="center"/>
+            <w:shd w:fill="FFFFFF"/>
+          </w:tcPr>
+          <w:p>
+            <w:pPr>
+              <w:spacing w:before="0" w:after="40" w:line="252" w:lineRule="auto"/>
+              <w:jc w:val="left"/>
+            </w:pPr>
+            <w:r>
+              <w:rPr>
+                <w:rFonts w:ascii="Calibri" w:hAnsi="Calibri"/>
+                <w:b w:val="0"/>
+                <w:color w:val="111827"/>
+                <w:sz w:val="17"/>
+              </w:rPr>
+              <w:t>2026-08-25</w:t>
+            </w:r>
+          </w:p>
+        </w:tc>
+        <w:tc>
+          <w:tcPr>
+            <w:tcW w:type="dxa" w:w="3260"/>
+            <w:tcMar>
+              <w:top w:w="80" w:type="dxa"/>
+              <w:start w:w="120" w:type="dxa"/>
+              <w:bottom w:w="80" w:type="dxa"/>
+              <w:end w:w="120" w:type="dxa"/>
+            </w:tcMar>
+            <w:vAlign w:val="center"/>
+            <w:shd w:fill="FFFFFF"/>
+          </w:tcPr>
+          <w:p>
+            <w:pPr>
+              <w:spacing w:before="0" w:after="40" w:line="252" w:lineRule="auto"/>
+              <w:jc w:val="left"/>
+            </w:pPr>
+            <w:r>
+              <w:rPr>
+                <w:rFonts w:ascii="Calibri" w:hAnsi="Calibri"/>
+                <w:b w:val="0"/>
+                <w:color w:val="111827"/>
+                <w:sz w:val="17"/>
+              </w:rPr>
+              <w:t>Added TEC/REC error confinement, deterministic transmission/reception faults and loss, bus-off enforcement and recovery, replay-safe evidence, APIs, migration, and tests.</w:t>
+            </w:r>
+          </w:p>
+        </w:tc>
+      </w:tr>
     </w:tbl>
     <w:p>
       <w:pPr>
@@ -1898,6 +1987,23 @@
     </w:p>
     <w:p>
       <w:pPr>
+        <w:pStyle w:val="ListBullet"/>
+        <w:numPr>
+          <w:ilvl w:val="0"/>
+          <w:numId w:val="11"/>
+        </w:numPr>
+      </w:pPr>
+      <w:r>
+        <w:rPr>
+          <w:rFonts w:ascii="Calibri" w:hAnsi="Calibri"/>
+          <w:color w:val="111827"/>
+          <w:sz w:val="22"/>
+        </w:rPr>
+        <w:t>TEC/REC error confinement, bounded fault injection, frame loss, bus-off enforcement, and recovery.</w:t>
+      </w:r>
+    </w:p>
+    <w:p>
+      <w:pPr>
         <w:pStyle w:val="Heading2"/>
         <w:keepNext/>
         <w:keepLines/>
@@ -1970,7 +2076,7 @@
           <w:color w:val="111827"/>
           <w:sz w:val="22"/>
         </w:rPr>
-        <w:t>Error frames, error counters, bus-off, recovery, loss, latency, and corruption.</w:t>
+        <w:t>Payload corruption, overload frames, acknowledgement errors, and automatic retransmission.</w:t>
       </w:r>
     </w:p>
     <w:p>
@@ -2130,6 +2236,40 @@
           <w:sz w:val="22"/>
         </w:rPr>
         <w:t xml:space="preserve"> stores the canonical encode/decode request and deterministic payload, raw, and physical result for exact replay. Frame contracts and transmissions preserve classic/FD protocol and BRS identity; arbitration results also preserve per-phase bit counts and durations.</w:t>
+      </w:r>
+    </w:p>
+    <w:p>
+      <w:r>
+        <w:rPr>
+          <w:rFonts w:ascii="Consolas" w:hAnsi="Consolas"/>
+          <w:color w:val="1F4D78"/>
+          <w:sz w:val="19"/>
+        </w:rPr>
+        <w:t>CanNetwork.error_states</w:t>
+      </w:r>
+      <w:r>
+        <w:rPr>
+          <w:rFonts w:ascii="Calibri" w:hAnsi="Calibri"/>
+          <w:color w:val="111827"/>
+          <w:sz w:val="22"/>
+        </w:rPr>
+        <w:t xml:space="preserve"> stores affected node TEC, REC, and derived state without duplicating ECU semantics. </w:t>
+      </w:r>
+      <w:r>
+        <w:rPr>
+          <w:rFonts w:ascii="Consolas" w:hAnsi="Consolas"/>
+          <w:color w:val="1F4D78"/>
+          <w:sz w:val="19"/>
+        </w:rPr>
+        <w:t>CanFaultExecution</w:t>
+      </w:r>
+      <w:r>
+        <w:rPr>
+          <w:rFonts w:ascii="Calibri" w:hAnsi="Calibri"/>
+          <w:color w:val="111827"/>
+          <w:sz w:val="22"/>
+        </w:rPr>
+        <w:t xml:space="preserve"> stores canonical injection/recovery requests, before/after state, logical timing, versions, target, and actor for exact replay.</w:t>
       </w:r>
     </w:p>
     <w:p>
@@ -3813,6 +3953,474 @@
           </w:p>
         </w:tc>
       </w:tr>
+      <w:tr>
+        <w:trPr>
+          <w:cantSplit/>
+        </w:trPr>
+        <w:tc>
+          <w:tcPr>
+            <w:tcW w:type="dxa" w:w="1150"/>
+            <w:tcMar>
+              <w:top w:w="80" w:type="dxa"/>
+              <w:start w:w="120" w:type="dxa"/>
+              <w:bottom w:w="80" w:type="dxa"/>
+              <w:end w:w="120" w:type="dxa"/>
+            </w:tcMar>
+            <w:vAlign w:val="center"/>
+            <w:shd w:fill="FFFFFF"/>
+          </w:tcPr>
+          <w:p>
+            <w:pPr>
+              <w:spacing w:before="0" w:after="40" w:line="252" w:lineRule="auto"/>
+              <w:jc w:val="center"/>
+            </w:pPr>
+            <w:r>
+              <w:rPr>
+                <w:rFonts w:ascii="Calibri" w:hAnsi="Calibri"/>
+                <w:b w:val="0"/>
+                <w:color w:val="111827"/>
+                <w:sz w:val="16"/>
+              </w:rPr>
+              <w:t>POST</w:t>
+            </w:r>
+          </w:p>
+        </w:tc>
+        <w:tc>
+          <w:tcPr>
+            <w:tcW w:type="dxa" w:w="3700"/>
+            <w:tcMar>
+              <w:top w:w="80" w:type="dxa"/>
+              <w:start w:w="120" w:type="dxa"/>
+              <w:bottom w:w="80" w:type="dxa"/>
+              <w:end w:w="120" w:type="dxa"/>
+            </w:tcMar>
+            <w:vAlign w:val="center"/>
+            <w:shd w:fill="FFFFFF"/>
+          </w:tcPr>
+          <w:p>
+            <w:pPr>
+              <w:spacing w:before="0" w:after="40" w:line="252" w:lineRule="auto"/>
+              <w:jc w:val="left"/>
+            </w:pPr>
+            <w:r>
+              <w:rPr>
+                <w:rFonts w:ascii="Calibri" w:hAnsi="Calibri"/>
+                <w:b w:val="0"/>
+                <w:color w:val="111827"/>
+                <w:sz w:val="16"/>
+              </w:rPr>
+              <w:t>/api/v1/vehicles/{vehicle_id}/can-networks/faults/inject</w:t>
+            </w:r>
+          </w:p>
+        </w:tc>
+        <w:tc>
+          <w:tcPr>
+            <w:tcW w:type="dxa" w:w="3100"/>
+            <w:tcMar>
+              <w:top w:w="80" w:type="dxa"/>
+              <w:start w:w="120" w:type="dxa"/>
+              <w:bottom w:w="80" w:type="dxa"/>
+              <w:end w:w="120" w:type="dxa"/>
+            </w:tcMar>
+            <w:vAlign w:val="center"/>
+            <w:shd w:fill="FFFFFF"/>
+          </w:tcPr>
+          <w:p>
+            <w:pPr>
+              <w:spacing w:before="0" w:after="40" w:line="252" w:lineRule="auto"/>
+              <w:jc w:val="left"/>
+            </w:pPr>
+            <w:r>
+              <w:rPr>
+                <w:rFonts w:ascii="Calibri" w:hAnsi="Calibri"/>
+                <w:b w:val="0"/>
+                <w:color w:val="111827"/>
+                <w:sz w:val="16"/>
+              </w:rPr>
+              <w:t>can_networks:manage</w:t>
+            </w:r>
+          </w:p>
+        </w:tc>
+        <w:tc>
+          <w:tcPr>
+            <w:tcW w:type="dxa" w:w="1410"/>
+            <w:tcMar>
+              <w:top w:w="80" w:type="dxa"/>
+              <w:start w:w="120" w:type="dxa"/>
+              <w:bottom w:w="80" w:type="dxa"/>
+              <w:end w:w="120" w:type="dxa"/>
+            </w:tcMar>
+            <w:vAlign w:val="center"/>
+            <w:shd w:fill="FFFFFF"/>
+          </w:tcPr>
+          <w:p>
+            <w:pPr>
+              <w:spacing w:before="0" w:after="40" w:line="252" w:lineRule="auto"/>
+              <w:jc w:val="left"/>
+            </w:pPr>
+            <w:r>
+              <w:rPr>
+                <w:rFonts w:ascii="Calibri" w:hAnsi="Calibri"/>
+                <w:b w:val="0"/>
+                <w:color w:val="111827"/>
+                <w:sz w:val="16"/>
+              </w:rPr>
+              <w:t>Inject a bounded deterministic fault.</w:t>
+            </w:r>
+          </w:p>
+        </w:tc>
+      </w:tr>
+      <w:tr>
+        <w:trPr>
+          <w:cantSplit/>
+        </w:trPr>
+        <w:tc>
+          <w:tcPr>
+            <w:tcW w:type="dxa" w:w="1150"/>
+            <w:tcMar>
+              <w:top w:w="80" w:type="dxa"/>
+              <w:start w:w="120" w:type="dxa"/>
+              <w:bottom w:w="80" w:type="dxa"/>
+              <w:end w:w="120" w:type="dxa"/>
+            </w:tcMar>
+            <w:vAlign w:val="center"/>
+            <w:shd w:fill="FFFFFF"/>
+          </w:tcPr>
+          <w:p>
+            <w:pPr>
+              <w:spacing w:before="0" w:after="40" w:line="252" w:lineRule="auto"/>
+              <w:jc w:val="center"/>
+            </w:pPr>
+            <w:r>
+              <w:rPr>
+                <w:rFonts w:ascii="Calibri" w:hAnsi="Calibri"/>
+                <w:b w:val="0"/>
+                <w:color w:val="111827"/>
+                <w:sz w:val="16"/>
+              </w:rPr>
+              <w:t>POST</w:t>
+            </w:r>
+          </w:p>
+        </w:tc>
+        <w:tc>
+          <w:tcPr>
+            <w:tcW w:type="dxa" w:w="3700"/>
+            <w:tcMar>
+              <w:top w:w="80" w:type="dxa"/>
+              <w:start w:w="120" w:type="dxa"/>
+              <w:bottom w:w="80" w:type="dxa"/>
+              <w:end w:w="120" w:type="dxa"/>
+            </w:tcMar>
+            <w:vAlign w:val="center"/>
+            <w:shd w:fill="FFFFFF"/>
+          </w:tcPr>
+          <w:p>
+            <w:pPr>
+              <w:spacing w:before="0" w:after="40" w:line="252" w:lineRule="auto"/>
+              <w:jc w:val="left"/>
+            </w:pPr>
+            <w:r>
+              <w:rPr>
+                <w:rFonts w:ascii="Calibri" w:hAnsi="Calibri"/>
+                <w:b w:val="0"/>
+                <w:color w:val="111827"/>
+                <w:sz w:val="16"/>
+              </w:rPr>
+              <w:t>/api/v1/vehicles/{vehicle_id}/can-networks/faults/recover</w:t>
+            </w:r>
+          </w:p>
+        </w:tc>
+        <w:tc>
+          <w:tcPr>
+            <w:tcW w:type="dxa" w:w="3100"/>
+            <w:tcMar>
+              <w:top w:w="80" w:type="dxa"/>
+              <w:start w:w="120" w:type="dxa"/>
+              <w:bottom w:w="80" w:type="dxa"/>
+              <w:end w:w="120" w:type="dxa"/>
+            </w:tcMar>
+            <w:vAlign w:val="center"/>
+            <w:shd w:fill="FFFFFF"/>
+          </w:tcPr>
+          <w:p>
+            <w:pPr>
+              <w:spacing w:before="0" w:after="40" w:line="252" w:lineRule="auto"/>
+              <w:jc w:val="left"/>
+            </w:pPr>
+            <w:r>
+              <w:rPr>
+                <w:rFonts w:ascii="Calibri" w:hAnsi="Calibri"/>
+                <w:b w:val="0"/>
+                <w:color w:val="111827"/>
+                <w:sz w:val="16"/>
+              </w:rPr>
+              <w:t>can_networks:manage</w:t>
+            </w:r>
+          </w:p>
+        </w:tc>
+        <w:tc>
+          <w:tcPr>
+            <w:tcW w:type="dxa" w:w="1410"/>
+            <w:tcMar>
+              <w:top w:w="80" w:type="dxa"/>
+              <w:start w:w="120" w:type="dxa"/>
+              <w:bottom w:w="80" w:type="dxa"/>
+              <w:end w:w="120" w:type="dxa"/>
+            </w:tcMar>
+            <w:vAlign w:val="center"/>
+            <w:shd w:fill="FFFFFF"/>
+          </w:tcPr>
+          <w:p>
+            <w:pPr>
+              <w:spacing w:before="0" w:after="40" w:line="252" w:lineRule="auto"/>
+              <w:jc w:val="left"/>
+            </w:pPr>
+            <w:r>
+              <w:rPr>
+                <w:rFonts w:ascii="Calibri" w:hAnsi="Calibri"/>
+                <w:b w:val="0"/>
+                <w:color w:val="111827"/>
+                <w:sz w:val="16"/>
+              </w:rPr>
+              <w:t>Recover a bus-off node.</w:t>
+            </w:r>
+          </w:p>
+        </w:tc>
+      </w:tr>
+      <w:tr>
+        <w:trPr>
+          <w:cantSplit/>
+        </w:trPr>
+        <w:tc>
+          <w:tcPr>
+            <w:tcW w:type="dxa" w:w="1150"/>
+            <w:tcMar>
+              <w:top w:w="80" w:type="dxa"/>
+              <w:start w:w="120" w:type="dxa"/>
+              <w:bottom w:w="80" w:type="dxa"/>
+              <w:end w:w="120" w:type="dxa"/>
+            </w:tcMar>
+            <w:vAlign w:val="center"/>
+            <w:shd w:fill="FFFFFF"/>
+          </w:tcPr>
+          <w:p>
+            <w:pPr>
+              <w:spacing w:before="0" w:after="40" w:line="252" w:lineRule="auto"/>
+              <w:jc w:val="center"/>
+            </w:pPr>
+            <w:r>
+              <w:rPr>
+                <w:rFonts w:ascii="Calibri" w:hAnsi="Calibri"/>
+                <w:b w:val="0"/>
+                <w:color w:val="111827"/>
+                <w:sz w:val="16"/>
+              </w:rPr>
+              <w:t>GET</w:t>
+            </w:r>
+          </w:p>
+        </w:tc>
+        <w:tc>
+          <w:tcPr>
+            <w:tcW w:type="dxa" w:w="3700"/>
+            <w:tcMar>
+              <w:top w:w="80" w:type="dxa"/>
+              <w:start w:w="120" w:type="dxa"/>
+              <w:bottom w:w="80" w:type="dxa"/>
+              <w:end w:w="120" w:type="dxa"/>
+            </w:tcMar>
+            <w:vAlign w:val="center"/>
+            <w:shd w:fill="FFFFFF"/>
+          </w:tcPr>
+          <w:p>
+            <w:pPr>
+              <w:spacing w:before="0" w:after="40" w:line="252" w:lineRule="auto"/>
+              <w:jc w:val="left"/>
+            </w:pPr>
+            <w:r>
+              <w:rPr>
+                <w:rFonts w:ascii="Calibri" w:hAnsi="Calibri"/>
+                <w:b w:val="0"/>
+                <w:color w:val="111827"/>
+                <w:sz w:val="16"/>
+              </w:rPr>
+              <w:t>/api/v1/vehicles/{vehicle_id}/can-networks/faults</w:t>
+            </w:r>
+          </w:p>
+        </w:tc>
+        <w:tc>
+          <w:tcPr>
+            <w:tcW w:type="dxa" w:w="3100"/>
+            <w:tcMar>
+              <w:top w:w="80" w:type="dxa"/>
+              <w:start w:w="120" w:type="dxa"/>
+              <w:bottom w:w="80" w:type="dxa"/>
+              <w:end w:w="120" w:type="dxa"/>
+            </w:tcMar>
+            <w:vAlign w:val="center"/>
+            <w:shd w:fill="FFFFFF"/>
+          </w:tcPr>
+          <w:p>
+            <w:pPr>
+              <w:spacing w:before="0" w:after="40" w:line="252" w:lineRule="auto"/>
+              <w:jc w:val="left"/>
+            </w:pPr>
+            <w:r>
+              <w:rPr>
+                <w:rFonts w:ascii="Calibri" w:hAnsi="Calibri"/>
+                <w:b w:val="0"/>
+                <w:color w:val="111827"/>
+                <w:sz w:val="16"/>
+              </w:rPr>
+              <w:t>can_networks:read</w:t>
+            </w:r>
+          </w:p>
+        </w:tc>
+        <w:tc>
+          <w:tcPr>
+            <w:tcW w:type="dxa" w:w="1410"/>
+            <w:tcMar>
+              <w:top w:w="80" w:type="dxa"/>
+              <w:start w:w="120" w:type="dxa"/>
+              <w:bottom w:w="80" w:type="dxa"/>
+              <w:end w:w="120" w:type="dxa"/>
+            </w:tcMar>
+            <w:vAlign w:val="center"/>
+            <w:shd w:fill="FFFFFF"/>
+          </w:tcPr>
+          <w:p>
+            <w:pPr>
+              <w:spacing w:before="0" w:after="40" w:line="252" w:lineRule="auto"/>
+              <w:jc w:val="left"/>
+            </w:pPr>
+            <w:r>
+              <w:rPr>
+                <w:rFonts w:ascii="Calibri" w:hAnsi="Calibri"/>
+                <w:b w:val="0"/>
+                <w:color w:val="111827"/>
+                <w:sz w:val="16"/>
+              </w:rPr>
+              <w:t>List fault and recovery evidence.</w:t>
+            </w:r>
+          </w:p>
+        </w:tc>
+      </w:tr>
+      <w:tr>
+        <w:trPr>
+          <w:cantSplit/>
+        </w:trPr>
+        <w:tc>
+          <w:tcPr>
+            <w:tcW w:type="dxa" w:w="1150"/>
+            <w:tcMar>
+              <w:top w:w="80" w:type="dxa"/>
+              <w:start w:w="120" w:type="dxa"/>
+              <w:bottom w:w="80" w:type="dxa"/>
+              <w:end w:w="120" w:type="dxa"/>
+            </w:tcMar>
+            <w:vAlign w:val="center"/>
+            <w:shd w:fill="FFFFFF"/>
+          </w:tcPr>
+          <w:p>
+            <w:pPr>
+              <w:spacing w:before="0" w:after="40" w:line="252" w:lineRule="auto"/>
+              <w:jc w:val="center"/>
+            </w:pPr>
+            <w:r>
+              <w:rPr>
+                <w:rFonts w:ascii="Calibri" w:hAnsi="Calibri"/>
+                <w:b w:val="0"/>
+                <w:color w:val="111827"/>
+                <w:sz w:val="16"/>
+              </w:rPr>
+              <w:t>GET</w:t>
+            </w:r>
+          </w:p>
+        </w:tc>
+        <w:tc>
+          <w:tcPr>
+            <w:tcW w:type="dxa" w:w="3700"/>
+            <w:tcMar>
+              <w:top w:w="80" w:type="dxa"/>
+              <w:start w:w="120" w:type="dxa"/>
+              <w:bottom w:w="80" w:type="dxa"/>
+              <w:end w:w="120" w:type="dxa"/>
+            </w:tcMar>
+            <w:vAlign w:val="center"/>
+            <w:shd w:fill="FFFFFF"/>
+          </w:tcPr>
+          <w:p>
+            <w:pPr>
+              <w:spacing w:before="0" w:after="40" w:line="252" w:lineRule="auto"/>
+              <w:jc w:val="left"/>
+            </w:pPr>
+            <w:r>
+              <w:rPr>
+                <w:rFonts w:ascii="Calibri" w:hAnsi="Calibri"/>
+                <w:b w:val="0"/>
+                <w:color w:val="111827"/>
+                <w:sz w:val="16"/>
+              </w:rPr>
+              <w:t>/api/v1/vehicles/{vehicle_id}/can-networks/faults/{command_id}</w:t>
+            </w:r>
+          </w:p>
+        </w:tc>
+        <w:tc>
+          <w:tcPr>
+            <w:tcW w:type="dxa" w:w="3100"/>
+            <w:tcMar>
+              <w:top w:w="80" w:type="dxa"/>
+              <w:start w:w="120" w:type="dxa"/>
+              <w:bottom w:w="80" w:type="dxa"/>
+              <w:end w:w="120" w:type="dxa"/>
+            </w:tcMar>
+            <w:vAlign w:val="center"/>
+            <w:shd w:fill="FFFFFF"/>
+          </w:tcPr>
+          <w:p>
+            <w:pPr>
+              <w:spacing w:before="0" w:after="40" w:line="252" w:lineRule="auto"/>
+              <w:jc w:val="left"/>
+            </w:pPr>
+            <w:r>
+              <w:rPr>
+                <w:rFonts w:ascii="Calibri" w:hAnsi="Calibri"/>
+                <w:b w:val="0"/>
+                <w:color w:val="111827"/>
+                <w:sz w:val="16"/>
+              </w:rPr>
+              <w:t>can_networks:read</w:t>
+            </w:r>
+          </w:p>
+        </w:tc>
+        <w:tc>
+          <w:tcPr>
+            <w:tcW w:type="dxa" w:w="1410"/>
+            <w:tcMar>
+              <w:top w:w="80" w:type="dxa"/>
+              <w:start w:w="120" w:type="dxa"/>
+              <w:bottom w:w="80" w:type="dxa"/>
+              <w:end w:w="120" w:type="dxa"/>
+            </w:tcMar>
+            <w:vAlign w:val="center"/>
+            <w:shd w:fill="FFFFFF"/>
+          </w:tcPr>
+          <w:p>
+            <w:pPr>
+              <w:spacing w:before="0" w:after="40" w:line="252" w:lineRule="auto"/>
+              <w:jc w:val="left"/>
+            </w:pPr>
+            <w:r>
+              <w:rPr>
+                <w:rFonts w:ascii="Calibri" w:hAnsi="Calibri"/>
+                <w:b w:val="0"/>
+                <w:color w:val="111827"/>
+                <w:sz w:val="16"/>
+              </w:rPr>
+              <w:t>Retrieve one fault execution.</w:t>
+            </w:r>
+          </w:p>
+        </w:tc>
+      </w:tr>
     </w:tbl>
     <w:p>
       <w:pPr>
@@ -4103,6 +4711,46 @@
     </w:p>
     <w:p>
       <w:pPr>
+        <w:pStyle w:val="Heading2"/>
+        <w:keepNext/>
+        <w:keepLines/>
+      </w:pPr>
+      <w:r>
+        <w:t>8.4 Error Confinement and Fault Injection</w:t>
+      </w:r>
+    </w:p>
+    <w:p>
+      <w:r>
+        <w:rPr>
+          <w:rFonts w:ascii="Calibri" w:hAnsi="Calibri"/>
+          <w:color w:val="111827"/>
+          <w:sz w:val="22"/>
+        </w:rPr>
+        <w:t>Each affected node has deterministic transmit and receive error counters (TEC and REC). A transmission error adds eight to TEC; a reception error adds one to REC. A node is error-active below 128, error-passive when either counter reaches 128, and bus-off when TEC reaches 256. A bus-off producer cannot submit a frame or enter arbitration.</w:t>
+      </w:r>
+    </w:p>
+    <w:p>
+      <w:r>
+        <w:rPr>
+          <w:rFonts w:ascii="Calibri" w:hAnsi="Calibri"/>
+          <w:color w:val="111827"/>
+          <w:sz w:val="22"/>
+        </w:rPr>
+        <w:t>Fault commands are scoped to a frame contract. Transmission faults must target its producer; reception faults and frame loss must target a declared consumer. Frame loss records delivery loss without changing TEC or REC. Each error frame consumes 14 nominal-rate bits in logical time, while loss itself consumes no error-frame time. Exact command replay is mutation-free.</w:t>
+      </w:r>
+    </w:p>
+    <w:p>
+      <w:r>
+        <w:rPr>
+          <w:rFonts w:ascii="Calibri" w:hAnsi="Calibri"/>
+          <w:color w:val="111827"/>
+          <w:sz w:val="22"/>
+        </w:rPr>
+        <w:t>Recovery is explicit and allowed only from bus-off. It requires at least 128 sequences of 11 recessive bits, advances logical time at the nominal bitrate, and resets both counters. Atomic audit and outbox evidence records state, counts, timing, and versions without CAN payload bytes.</w:t>
+      </w:r>
+    </w:p>
+    <w:p>
+      <w:pPr>
         <w:pStyle w:val="Heading1"/>
         <w:keepNext/>
         <w:keepLines/>
@@ -4134,7 +4782,7 @@
           <w:color w:val="111827"/>
           <w:sz w:val="22"/>
         </w:rPr>
-        <w:t>. IV-1 through IV-4 implement CAN-F-001 through CAN-F-040 and CAN-NF-001 through CAN-NF-014.</w:t>
+        <w:t>. IV-1 through IV-5 implement CAN-F-001 through CAN-F-050 and CAN-NF-001 through CAN-NF-017.</w:t>
       </w:r>
     </w:p>
     <w:p>
@@ -9675,6 +10323,985 @@
           </w:p>
         </w:tc>
       </w:tr>
+      <w:tr>
+        <w:trPr>
+          <w:cantSplit/>
+        </w:trPr>
+        <w:tc>
+          <w:tcPr>
+            <w:tcW w:type="dxa" w:w="1650"/>
+            <w:tcMar>
+              <w:top w:w="80" w:type="dxa"/>
+              <w:start w:w="120" w:type="dxa"/>
+              <w:bottom w:w="80" w:type="dxa"/>
+              <w:end w:w="120" w:type="dxa"/>
+            </w:tcMar>
+            <w:vAlign w:val="center"/>
+            <w:shd w:fill="FFFFFF"/>
+          </w:tcPr>
+          <w:p>
+            <w:pPr>
+              <w:spacing w:before="0" w:after="40" w:line="252" w:lineRule="auto"/>
+              <w:jc w:val="center"/>
+            </w:pPr>
+            <w:r>
+              <w:rPr>
+                <w:rFonts w:ascii="Calibri" w:hAnsi="Calibri"/>
+                <w:b w:val="0"/>
+                <w:color w:val="111827"/>
+                <w:sz w:val="17"/>
+              </w:rPr>
+              <w:t>TEC threshold</w:t>
+            </w:r>
+          </w:p>
+        </w:tc>
+        <w:tc>
+          <w:tcPr>
+            <w:tcW w:type="dxa" w:w="4450"/>
+            <w:tcMar>
+              <w:top w:w="80" w:type="dxa"/>
+              <w:start w:w="120" w:type="dxa"/>
+              <w:bottom w:w="80" w:type="dxa"/>
+              <w:end w:w="120" w:type="dxa"/>
+            </w:tcMar>
+            <w:vAlign w:val="center"/>
+            <w:shd w:fill="FFFFFF"/>
+          </w:tcPr>
+          <w:p>
+            <w:pPr>
+              <w:spacing w:before="0" w:after="40" w:line="252" w:lineRule="auto"/>
+              <w:jc w:val="left"/>
+            </w:pPr>
+            <w:r>
+              <w:rPr>
+                <w:rFonts w:ascii="Calibri" w:hAnsi="Calibri"/>
+                <w:b w:val="0"/>
+                <w:color w:val="111827"/>
+                <w:sz w:val="17"/>
+              </w:rPr>
+              <w:t>Verify 16 transmission errors produce error-passive and 32 produce bus-off.</w:t>
+            </w:r>
+          </w:p>
+        </w:tc>
+        <w:tc>
+          <w:tcPr>
+            <w:tcW w:type="dxa" w:w="3260"/>
+            <w:tcMar>
+              <w:top w:w="80" w:type="dxa"/>
+              <w:start w:w="120" w:type="dxa"/>
+              <w:bottom w:w="80" w:type="dxa"/>
+              <w:end w:w="120" w:type="dxa"/>
+            </w:tcMar>
+            <w:vAlign w:val="center"/>
+            <w:shd w:fill="FFFFFF"/>
+          </w:tcPr>
+          <w:p>
+            <w:pPr>
+              <w:spacing w:before="0" w:after="40" w:line="252" w:lineRule="auto"/>
+              <w:jc w:val="left"/>
+            </w:pPr>
+            <w:r>
+              <w:rPr>
+                <w:rFonts w:ascii="Calibri" w:hAnsi="Calibri"/>
+                <w:b w:val="0"/>
+                <w:color w:val="111827"/>
+                <w:sz w:val="17"/>
+              </w:rPr>
+              <w:t>Unit/service</w:t>
+            </w:r>
+          </w:p>
+        </w:tc>
+      </w:tr>
+      <w:tr>
+        <w:trPr>
+          <w:cantSplit/>
+        </w:trPr>
+        <w:tc>
+          <w:tcPr>
+            <w:tcW w:type="dxa" w:w="1650"/>
+            <w:tcMar>
+              <w:top w:w="80" w:type="dxa"/>
+              <w:start w:w="120" w:type="dxa"/>
+              <w:bottom w:w="80" w:type="dxa"/>
+              <w:end w:w="120" w:type="dxa"/>
+            </w:tcMar>
+            <w:vAlign w:val="center"/>
+            <w:shd w:fill="FFFFFF"/>
+          </w:tcPr>
+          <w:p>
+            <w:pPr>
+              <w:spacing w:before="0" w:after="40" w:line="252" w:lineRule="auto"/>
+              <w:jc w:val="center"/>
+            </w:pPr>
+            <w:r>
+              <w:rPr>
+                <w:rFonts w:ascii="Calibri" w:hAnsi="Calibri"/>
+                <w:b w:val="0"/>
+                <w:color w:val="111827"/>
+                <w:sz w:val="17"/>
+              </w:rPr>
+              <w:t>REC threshold</w:t>
+            </w:r>
+          </w:p>
+        </w:tc>
+        <w:tc>
+          <w:tcPr>
+            <w:tcW w:type="dxa" w:w="4450"/>
+            <w:tcMar>
+              <w:top w:w="80" w:type="dxa"/>
+              <w:start w:w="120" w:type="dxa"/>
+              <w:bottom w:w="80" w:type="dxa"/>
+              <w:end w:w="120" w:type="dxa"/>
+            </w:tcMar>
+            <w:vAlign w:val="center"/>
+            <w:shd w:fill="FFFFFF"/>
+          </w:tcPr>
+          <w:p>
+            <w:pPr>
+              <w:spacing w:before="0" w:after="40" w:line="252" w:lineRule="auto"/>
+              <w:jc w:val="left"/>
+            </w:pPr>
+            <w:r>
+              <w:rPr>
+                <w:rFonts w:ascii="Calibri" w:hAnsi="Calibri"/>
+                <w:b w:val="0"/>
+                <w:color w:val="111827"/>
+                <w:sz w:val="17"/>
+              </w:rPr>
+              <w:t>Verify reception errors produce error-passive at 128.</w:t>
+            </w:r>
+          </w:p>
+        </w:tc>
+        <w:tc>
+          <w:tcPr>
+            <w:tcW w:type="dxa" w:w="3260"/>
+            <w:tcMar>
+              <w:top w:w="80" w:type="dxa"/>
+              <w:start w:w="120" w:type="dxa"/>
+              <w:bottom w:w="80" w:type="dxa"/>
+              <w:end w:w="120" w:type="dxa"/>
+            </w:tcMar>
+            <w:vAlign w:val="center"/>
+            <w:shd w:fill="FFFFFF"/>
+          </w:tcPr>
+          <w:p>
+            <w:pPr>
+              <w:spacing w:before="0" w:after="40" w:line="252" w:lineRule="auto"/>
+              <w:jc w:val="left"/>
+            </w:pPr>
+            <w:r>
+              <w:rPr>
+                <w:rFonts w:ascii="Calibri" w:hAnsi="Calibri"/>
+                <w:b w:val="0"/>
+                <w:color w:val="111827"/>
+                <w:sz w:val="17"/>
+              </w:rPr>
+              <w:t>Unit</w:t>
+            </w:r>
+          </w:p>
+        </w:tc>
+      </w:tr>
+      <w:tr>
+        <w:trPr>
+          <w:cantSplit/>
+        </w:trPr>
+        <w:tc>
+          <w:tcPr>
+            <w:tcW w:type="dxa" w:w="1650"/>
+            <w:tcMar>
+              <w:top w:w="80" w:type="dxa"/>
+              <w:start w:w="120" w:type="dxa"/>
+              <w:bottom w:w="80" w:type="dxa"/>
+              <w:end w:w="120" w:type="dxa"/>
+            </w:tcMar>
+            <w:vAlign w:val="center"/>
+            <w:shd w:fill="FFFFFF"/>
+          </w:tcPr>
+          <w:p>
+            <w:pPr>
+              <w:spacing w:before="0" w:after="40" w:line="252" w:lineRule="auto"/>
+              <w:jc w:val="center"/>
+            </w:pPr>
+            <w:r>
+              <w:rPr>
+                <w:rFonts w:ascii="Calibri" w:hAnsi="Calibri"/>
+                <w:b w:val="0"/>
+                <w:color w:val="111827"/>
+                <w:sz w:val="17"/>
+              </w:rPr>
+              <w:t>Fault role</w:t>
+            </w:r>
+          </w:p>
+        </w:tc>
+        <w:tc>
+          <w:tcPr>
+            <w:tcW w:type="dxa" w:w="4450"/>
+            <w:tcMar>
+              <w:top w:w="80" w:type="dxa"/>
+              <w:start w:w="120" w:type="dxa"/>
+              <w:bottom w:w="80" w:type="dxa"/>
+              <w:end w:w="120" w:type="dxa"/>
+            </w:tcMar>
+            <w:vAlign w:val="center"/>
+            <w:shd w:fill="FFFFFF"/>
+          </w:tcPr>
+          <w:p>
+            <w:pPr>
+              <w:spacing w:before="0" w:after="40" w:line="252" w:lineRule="auto"/>
+              <w:jc w:val="left"/>
+            </w:pPr>
+            <w:r>
+              <w:rPr>
+                <w:rFonts w:ascii="Calibri" w:hAnsi="Calibri"/>
+                <w:b w:val="0"/>
+                <w:color w:val="111827"/>
+                <w:sz w:val="17"/>
+              </w:rPr>
+              <w:t>Reject producer/consumer targets that violate the frame contract.</w:t>
+            </w:r>
+          </w:p>
+        </w:tc>
+        <w:tc>
+          <w:tcPr>
+            <w:tcW w:type="dxa" w:w="3260"/>
+            <w:tcMar>
+              <w:top w:w="80" w:type="dxa"/>
+              <w:start w:w="120" w:type="dxa"/>
+              <w:bottom w:w="80" w:type="dxa"/>
+              <w:end w:w="120" w:type="dxa"/>
+            </w:tcMar>
+            <w:vAlign w:val="center"/>
+            <w:shd w:fill="FFFFFF"/>
+          </w:tcPr>
+          <w:p>
+            <w:pPr>
+              <w:spacing w:before="0" w:after="40" w:line="252" w:lineRule="auto"/>
+              <w:jc w:val="left"/>
+            </w:pPr>
+            <w:r>
+              <w:rPr>
+                <w:rFonts w:ascii="Calibri" w:hAnsi="Calibri"/>
+                <w:b w:val="0"/>
+                <w:color w:val="111827"/>
+                <w:sz w:val="17"/>
+              </w:rPr>
+              <w:t>Service</w:t>
+            </w:r>
+          </w:p>
+        </w:tc>
+      </w:tr>
+      <w:tr>
+        <w:trPr>
+          <w:cantSplit/>
+        </w:trPr>
+        <w:tc>
+          <w:tcPr>
+            <w:tcW w:type="dxa" w:w="1650"/>
+            <w:tcMar>
+              <w:top w:w="80" w:type="dxa"/>
+              <w:start w:w="120" w:type="dxa"/>
+              <w:bottom w:w="80" w:type="dxa"/>
+              <w:end w:w="120" w:type="dxa"/>
+            </w:tcMar>
+            <w:vAlign w:val="center"/>
+            <w:shd w:fill="FFFFFF"/>
+          </w:tcPr>
+          <w:p>
+            <w:pPr>
+              <w:spacing w:before="0" w:after="40" w:line="252" w:lineRule="auto"/>
+              <w:jc w:val="center"/>
+            </w:pPr>
+            <w:r>
+              <w:rPr>
+                <w:rFonts w:ascii="Calibri" w:hAnsi="Calibri"/>
+                <w:b w:val="0"/>
+                <w:color w:val="111827"/>
+                <w:sz w:val="17"/>
+              </w:rPr>
+              <w:t>Frame loss</w:t>
+            </w:r>
+          </w:p>
+        </w:tc>
+        <w:tc>
+          <w:tcPr>
+            <w:tcW w:type="dxa" w:w="4450"/>
+            <w:tcMar>
+              <w:top w:w="80" w:type="dxa"/>
+              <w:start w:w="120" w:type="dxa"/>
+              <w:bottom w:w="80" w:type="dxa"/>
+              <w:end w:w="120" w:type="dxa"/>
+            </w:tcMar>
+            <w:vAlign w:val="center"/>
+            <w:shd w:fill="FFFFFF"/>
+          </w:tcPr>
+          <w:p>
+            <w:pPr>
+              <w:spacing w:before="0" w:after="40" w:line="252" w:lineRule="auto"/>
+              <w:jc w:val="left"/>
+            </w:pPr>
+            <w:r>
+              <w:rPr>
+                <w:rFonts w:ascii="Calibri" w:hAnsi="Calibri"/>
+                <w:b w:val="0"/>
+                <w:color w:val="111827"/>
+                <w:sz w:val="17"/>
+              </w:rPr>
+              <w:t>Record loss without modifying TEC, REC, sequence, or payload evidence.</w:t>
+            </w:r>
+          </w:p>
+        </w:tc>
+        <w:tc>
+          <w:tcPr>
+            <w:tcW w:type="dxa" w:w="3260"/>
+            <w:tcMar>
+              <w:top w:w="80" w:type="dxa"/>
+              <w:start w:w="120" w:type="dxa"/>
+              <w:bottom w:w="80" w:type="dxa"/>
+              <w:end w:w="120" w:type="dxa"/>
+            </w:tcMar>
+            <w:vAlign w:val="center"/>
+            <w:shd w:fill="FFFFFF"/>
+          </w:tcPr>
+          <w:p>
+            <w:pPr>
+              <w:spacing w:before="0" w:after="40" w:line="252" w:lineRule="auto"/>
+              <w:jc w:val="left"/>
+            </w:pPr>
+            <w:r>
+              <w:rPr>
+                <w:rFonts w:ascii="Calibri" w:hAnsi="Calibri"/>
+                <w:b w:val="0"/>
+                <w:color w:val="111827"/>
+                <w:sz w:val="17"/>
+              </w:rPr>
+              <w:t>Service</w:t>
+            </w:r>
+          </w:p>
+        </w:tc>
+      </w:tr>
+      <w:tr>
+        <w:trPr>
+          <w:cantSplit/>
+        </w:trPr>
+        <w:tc>
+          <w:tcPr>
+            <w:tcW w:type="dxa" w:w="1650"/>
+            <w:tcMar>
+              <w:top w:w="80" w:type="dxa"/>
+              <w:start w:w="120" w:type="dxa"/>
+              <w:bottom w:w="80" w:type="dxa"/>
+              <w:end w:w="120" w:type="dxa"/>
+            </w:tcMar>
+            <w:vAlign w:val="center"/>
+            <w:shd w:fill="FFFFFF"/>
+          </w:tcPr>
+          <w:p>
+            <w:pPr>
+              <w:spacing w:before="0" w:after="40" w:line="252" w:lineRule="auto"/>
+              <w:jc w:val="center"/>
+            </w:pPr>
+            <w:r>
+              <w:rPr>
+                <w:rFonts w:ascii="Calibri" w:hAnsi="Calibri"/>
+                <w:b w:val="0"/>
+                <w:color w:val="111827"/>
+                <w:sz w:val="17"/>
+              </w:rPr>
+              <w:t>Bus-off enforcement</w:t>
+            </w:r>
+          </w:p>
+        </w:tc>
+        <w:tc>
+          <w:tcPr>
+            <w:tcW w:type="dxa" w:w="4450"/>
+            <w:tcMar>
+              <w:top w:w="80" w:type="dxa"/>
+              <w:start w:w="120" w:type="dxa"/>
+              <w:bottom w:w="80" w:type="dxa"/>
+              <w:end w:w="120" w:type="dxa"/>
+            </w:tcMar>
+            <w:vAlign w:val="center"/>
+            <w:shd w:fill="FFFFFF"/>
+          </w:tcPr>
+          <w:p>
+            <w:pPr>
+              <w:spacing w:before="0" w:after="40" w:line="252" w:lineRule="auto"/>
+              <w:jc w:val="left"/>
+            </w:pPr>
+            <w:r>
+              <w:rPr>
+                <w:rFonts w:ascii="Calibri" w:hAnsi="Calibri"/>
+                <w:b w:val="0"/>
+                <w:color w:val="111827"/>
+                <w:sz w:val="17"/>
+              </w:rPr>
+              <w:t>Reject direct submission and arbitration by a bus-off producer.</w:t>
+            </w:r>
+          </w:p>
+        </w:tc>
+        <w:tc>
+          <w:tcPr>
+            <w:tcW w:type="dxa" w:w="3260"/>
+            <w:tcMar>
+              <w:top w:w="80" w:type="dxa"/>
+              <w:start w:w="120" w:type="dxa"/>
+              <w:bottom w:w="80" w:type="dxa"/>
+              <w:end w:w="120" w:type="dxa"/>
+            </w:tcMar>
+            <w:vAlign w:val="center"/>
+            <w:shd w:fill="FFFFFF"/>
+          </w:tcPr>
+          <w:p>
+            <w:pPr>
+              <w:spacing w:before="0" w:after="40" w:line="252" w:lineRule="auto"/>
+              <w:jc w:val="left"/>
+            </w:pPr>
+            <w:r>
+              <w:rPr>
+                <w:rFonts w:ascii="Calibri" w:hAnsi="Calibri"/>
+                <w:b w:val="0"/>
+                <w:color w:val="111827"/>
+                <w:sz w:val="17"/>
+              </w:rPr>
+              <w:t>Service/API</w:t>
+            </w:r>
+          </w:p>
+        </w:tc>
+      </w:tr>
+      <w:tr>
+        <w:trPr>
+          <w:cantSplit/>
+        </w:trPr>
+        <w:tc>
+          <w:tcPr>
+            <w:tcW w:type="dxa" w:w="1650"/>
+            <w:tcMar>
+              <w:top w:w="80" w:type="dxa"/>
+              <w:start w:w="120" w:type="dxa"/>
+              <w:bottom w:w="80" w:type="dxa"/>
+              <w:end w:w="120" w:type="dxa"/>
+            </w:tcMar>
+            <w:vAlign w:val="center"/>
+            <w:shd w:fill="FFFFFF"/>
+          </w:tcPr>
+          <w:p>
+            <w:pPr>
+              <w:spacing w:before="0" w:after="40" w:line="252" w:lineRule="auto"/>
+              <w:jc w:val="center"/>
+            </w:pPr>
+            <w:r>
+              <w:rPr>
+                <w:rFonts w:ascii="Calibri" w:hAnsi="Calibri"/>
+                <w:b w:val="0"/>
+                <w:color w:val="111827"/>
+                <w:sz w:val="17"/>
+              </w:rPr>
+              <w:t>Recovery timing</w:t>
+            </w:r>
+          </w:p>
+        </w:tc>
+        <w:tc>
+          <w:tcPr>
+            <w:tcW w:type="dxa" w:w="4450"/>
+            <w:tcMar>
+              <w:top w:w="80" w:type="dxa"/>
+              <w:start w:w="120" w:type="dxa"/>
+              <w:bottom w:w="80" w:type="dxa"/>
+              <w:end w:w="120" w:type="dxa"/>
+            </w:tcMar>
+            <w:vAlign w:val="center"/>
+            <w:shd w:fill="FFFFFF"/>
+          </w:tcPr>
+          <w:p>
+            <w:pPr>
+              <w:spacing w:before="0" w:after="40" w:line="252" w:lineRule="auto"/>
+              <w:jc w:val="left"/>
+            </w:pPr>
+            <w:r>
+              <w:rPr>
+                <w:rFonts w:ascii="Calibri" w:hAnsi="Calibri"/>
+                <w:b w:val="0"/>
+                <w:color w:val="111827"/>
+                <w:sz w:val="17"/>
+              </w:rPr>
+              <w:t>Verify 128 × 11 recessive bits at the nominal bitrate and counter reset.</w:t>
+            </w:r>
+          </w:p>
+        </w:tc>
+        <w:tc>
+          <w:tcPr>
+            <w:tcW w:type="dxa" w:w="3260"/>
+            <w:tcMar>
+              <w:top w:w="80" w:type="dxa"/>
+              <w:start w:w="120" w:type="dxa"/>
+              <w:bottom w:w="80" w:type="dxa"/>
+              <w:end w:w="120" w:type="dxa"/>
+            </w:tcMar>
+            <w:vAlign w:val="center"/>
+            <w:shd w:fill="FFFFFF"/>
+          </w:tcPr>
+          <w:p>
+            <w:pPr>
+              <w:spacing w:before="0" w:after="40" w:line="252" w:lineRule="auto"/>
+              <w:jc w:val="left"/>
+            </w:pPr>
+            <w:r>
+              <w:rPr>
+                <w:rFonts w:ascii="Calibri" w:hAnsi="Calibri"/>
+                <w:b w:val="0"/>
+                <w:color w:val="111827"/>
+                <w:sz w:val="17"/>
+              </w:rPr>
+              <w:t>Unit/service</w:t>
+            </w:r>
+          </w:p>
+        </w:tc>
+      </w:tr>
+      <w:tr>
+        <w:trPr>
+          <w:cantSplit/>
+        </w:trPr>
+        <w:tc>
+          <w:tcPr>
+            <w:tcW w:type="dxa" w:w="1650"/>
+            <w:tcMar>
+              <w:top w:w="80" w:type="dxa"/>
+              <w:start w:w="120" w:type="dxa"/>
+              <w:bottom w:w="80" w:type="dxa"/>
+              <w:end w:w="120" w:type="dxa"/>
+            </w:tcMar>
+            <w:vAlign w:val="center"/>
+            <w:shd w:fill="FFFFFF"/>
+          </w:tcPr>
+          <w:p>
+            <w:pPr>
+              <w:spacing w:before="0" w:after="40" w:line="252" w:lineRule="auto"/>
+              <w:jc w:val="center"/>
+            </w:pPr>
+            <w:r>
+              <w:rPr>
+                <w:rFonts w:ascii="Calibri" w:hAnsi="Calibri"/>
+                <w:b w:val="0"/>
+                <w:color w:val="111827"/>
+                <w:sz w:val="17"/>
+              </w:rPr>
+              <w:t>Fault replay</w:t>
+            </w:r>
+          </w:p>
+        </w:tc>
+        <w:tc>
+          <w:tcPr>
+            <w:tcW w:type="dxa" w:w="4450"/>
+            <w:tcMar>
+              <w:top w:w="80" w:type="dxa"/>
+              <w:start w:w="120" w:type="dxa"/>
+              <w:bottom w:w="80" w:type="dxa"/>
+              <w:end w:w="120" w:type="dxa"/>
+            </w:tcMar>
+            <w:vAlign w:val="center"/>
+            <w:shd w:fill="FFFFFF"/>
+          </w:tcPr>
+          <w:p>
+            <w:pPr>
+              <w:spacing w:before="0" w:after="40" w:line="252" w:lineRule="auto"/>
+              <w:jc w:val="left"/>
+            </w:pPr>
+            <w:r>
+              <w:rPr>
+                <w:rFonts w:ascii="Calibri" w:hAnsi="Calibri"/>
+                <w:b w:val="0"/>
+                <w:color w:val="111827"/>
+                <w:sz w:val="17"/>
+              </w:rPr>
+              <w:t>Return exact persisted evidence without repeating counters or time.</w:t>
+            </w:r>
+          </w:p>
+        </w:tc>
+        <w:tc>
+          <w:tcPr>
+            <w:tcW w:type="dxa" w:w="3260"/>
+            <w:tcMar>
+              <w:top w:w="80" w:type="dxa"/>
+              <w:start w:w="120" w:type="dxa"/>
+              <w:bottom w:w="80" w:type="dxa"/>
+              <w:end w:w="120" w:type="dxa"/>
+            </w:tcMar>
+            <w:vAlign w:val="center"/>
+            <w:shd w:fill="FFFFFF"/>
+          </w:tcPr>
+          <w:p>
+            <w:pPr>
+              <w:spacing w:before="0" w:after="40" w:line="252" w:lineRule="auto"/>
+              <w:jc w:val="left"/>
+            </w:pPr>
+            <w:r>
+              <w:rPr>
+                <w:rFonts w:ascii="Calibri" w:hAnsi="Calibri"/>
+                <w:b w:val="0"/>
+                <w:color w:val="111827"/>
+                <w:sz w:val="17"/>
+              </w:rPr>
+              <w:t>Service/API</w:t>
+            </w:r>
+          </w:p>
+        </w:tc>
+      </w:tr>
+      <w:tr>
+        <w:trPr>
+          <w:cantSplit/>
+        </w:trPr>
+        <w:tc>
+          <w:tcPr>
+            <w:tcW w:type="dxa" w:w="1650"/>
+            <w:tcMar>
+              <w:top w:w="80" w:type="dxa"/>
+              <w:start w:w="120" w:type="dxa"/>
+              <w:bottom w:w="80" w:type="dxa"/>
+              <w:end w:w="120" w:type="dxa"/>
+            </w:tcMar>
+            <w:vAlign w:val="center"/>
+            <w:shd w:fill="FFFFFF"/>
+          </w:tcPr>
+          <w:p>
+            <w:pPr>
+              <w:spacing w:before="0" w:after="40" w:line="252" w:lineRule="auto"/>
+              <w:jc w:val="center"/>
+            </w:pPr>
+            <w:r>
+              <w:rPr>
+                <w:rFonts w:ascii="Calibri" w:hAnsi="Calibri"/>
+                <w:b w:val="0"/>
+                <w:color w:val="111827"/>
+                <w:sz w:val="17"/>
+              </w:rPr>
+              <w:t>Fault conflict</w:t>
+            </w:r>
+          </w:p>
+        </w:tc>
+        <w:tc>
+          <w:tcPr>
+            <w:tcW w:type="dxa" w:w="4450"/>
+            <w:tcMar>
+              <w:top w:w="80" w:type="dxa"/>
+              <w:start w:w="120" w:type="dxa"/>
+              <w:bottom w:w="80" w:type="dxa"/>
+              <w:end w:w="120" w:type="dxa"/>
+            </w:tcMar>
+            <w:vAlign w:val="center"/>
+            <w:shd w:fill="FFFFFF"/>
+          </w:tcPr>
+          <w:p>
+            <w:pPr>
+              <w:spacing w:before="0" w:after="40" w:line="252" w:lineRule="auto"/>
+              <w:jc w:val="left"/>
+            </w:pPr>
+            <w:r>
+              <w:rPr>
+                <w:rFonts w:ascii="Calibri" w:hAnsi="Calibri"/>
+                <w:b w:val="0"/>
+                <w:color w:val="111827"/>
+                <w:sz w:val="17"/>
+              </w:rPr>
+              <w:t>Reject changed command-ID reuse with a stable error.</w:t>
+            </w:r>
+          </w:p>
+        </w:tc>
+        <w:tc>
+          <w:tcPr>
+            <w:tcW w:type="dxa" w:w="3260"/>
+            <w:tcMar>
+              <w:top w:w="80" w:type="dxa"/>
+              <w:start w:w="120" w:type="dxa"/>
+              <w:bottom w:w="80" w:type="dxa"/>
+              <w:end w:w="120" w:type="dxa"/>
+            </w:tcMar>
+            <w:vAlign w:val="center"/>
+            <w:shd w:fill="FFFFFF"/>
+          </w:tcPr>
+          <w:p>
+            <w:pPr>
+              <w:spacing w:before="0" w:after="40" w:line="252" w:lineRule="auto"/>
+              <w:jc w:val="left"/>
+            </w:pPr>
+            <w:r>
+              <w:rPr>
+                <w:rFonts w:ascii="Calibri" w:hAnsi="Calibri"/>
+                <w:b w:val="0"/>
+                <w:color w:val="111827"/>
+                <w:sz w:val="17"/>
+              </w:rPr>
+              <w:t>Service/API</w:t>
+            </w:r>
+          </w:p>
+        </w:tc>
+      </w:tr>
+      <w:tr>
+        <w:trPr>
+          <w:cantSplit/>
+        </w:trPr>
+        <w:tc>
+          <w:tcPr>
+            <w:tcW w:type="dxa" w:w="1650"/>
+            <w:tcMar>
+              <w:top w:w="80" w:type="dxa"/>
+              <w:start w:w="120" w:type="dxa"/>
+              <w:bottom w:w="80" w:type="dxa"/>
+              <w:end w:w="120" w:type="dxa"/>
+            </w:tcMar>
+            <w:vAlign w:val="center"/>
+            <w:shd w:fill="FFFFFF"/>
+          </w:tcPr>
+          <w:p>
+            <w:pPr>
+              <w:spacing w:before="0" w:after="40" w:line="252" w:lineRule="auto"/>
+              <w:jc w:val="center"/>
+            </w:pPr>
+            <w:r>
+              <w:rPr>
+                <w:rFonts w:ascii="Calibri" w:hAnsi="Calibri"/>
+                <w:b w:val="0"/>
+                <w:color w:val="111827"/>
+                <w:sz w:val="17"/>
+              </w:rPr>
+              <w:t>Fault RBAC</w:t>
+            </w:r>
+          </w:p>
+        </w:tc>
+        <w:tc>
+          <w:tcPr>
+            <w:tcW w:type="dxa" w:w="4450"/>
+            <w:tcMar>
+              <w:top w:w="80" w:type="dxa"/>
+              <w:start w:w="120" w:type="dxa"/>
+              <w:bottom w:w="80" w:type="dxa"/>
+              <w:end w:w="120" w:type="dxa"/>
+            </w:tcMar>
+            <w:vAlign w:val="center"/>
+            <w:shd w:fill="FFFFFF"/>
+          </w:tcPr>
+          <w:p>
+            <w:pPr>
+              <w:spacing w:before="0" w:after="40" w:line="252" w:lineRule="auto"/>
+              <w:jc w:val="left"/>
+            </w:pPr>
+            <w:r>
+              <w:rPr>
+                <w:rFonts w:ascii="Calibri" w:hAnsi="Calibri"/>
+                <w:b w:val="0"/>
+                <w:color w:val="111827"/>
+                <w:sz w:val="17"/>
+              </w:rPr>
+              <w:t>Require manage for mutation and read for history/detail.</w:t>
+            </w:r>
+          </w:p>
+        </w:tc>
+        <w:tc>
+          <w:tcPr>
+            <w:tcW w:type="dxa" w:w="3260"/>
+            <w:tcMar>
+              <w:top w:w="80" w:type="dxa"/>
+              <w:start w:w="120" w:type="dxa"/>
+              <w:bottom w:w="80" w:type="dxa"/>
+              <w:end w:w="120" w:type="dxa"/>
+            </w:tcMar>
+            <w:vAlign w:val="center"/>
+            <w:shd w:fill="FFFFFF"/>
+          </w:tcPr>
+          <w:p>
+            <w:pPr>
+              <w:spacing w:before="0" w:after="40" w:line="252" w:lineRule="auto"/>
+              <w:jc w:val="left"/>
+            </w:pPr>
+            <w:r>
+              <w:rPr>
+                <w:rFonts w:ascii="Calibri" w:hAnsi="Calibri"/>
+                <w:b w:val="0"/>
+                <w:color w:val="111827"/>
+                <w:sz w:val="17"/>
+              </w:rPr>
+              <w:t>API/integration</w:t>
+            </w:r>
+          </w:p>
+        </w:tc>
+      </w:tr>
+      <w:tr>
+        <w:trPr>
+          <w:cantSplit/>
+        </w:trPr>
+        <w:tc>
+          <w:tcPr>
+            <w:tcW w:type="dxa" w:w="1650"/>
+            <w:tcMar>
+              <w:top w:w="80" w:type="dxa"/>
+              <w:start w:w="120" w:type="dxa"/>
+              <w:bottom w:w="80" w:type="dxa"/>
+              <w:end w:w="120" w:type="dxa"/>
+            </w:tcMar>
+            <w:vAlign w:val="center"/>
+            <w:shd w:fill="FFFFFF"/>
+          </w:tcPr>
+          <w:p>
+            <w:pPr>
+              <w:spacing w:before="0" w:after="40" w:line="252" w:lineRule="auto"/>
+              <w:jc w:val="center"/>
+            </w:pPr>
+            <w:r>
+              <w:rPr>
+                <w:rFonts w:ascii="Calibri" w:hAnsi="Calibri"/>
+                <w:b w:val="0"/>
+                <w:color w:val="111827"/>
+                <w:sz w:val="17"/>
+              </w:rPr>
+              <w:t>Fault minimization</w:t>
+            </w:r>
+          </w:p>
+        </w:tc>
+        <w:tc>
+          <w:tcPr>
+            <w:tcW w:type="dxa" w:w="4450"/>
+            <w:tcMar>
+              <w:top w:w="80" w:type="dxa"/>
+              <w:start w:w="120" w:type="dxa"/>
+              <w:bottom w:w="80" w:type="dxa"/>
+              <w:end w:w="120" w:type="dxa"/>
+            </w:tcMar>
+            <w:vAlign w:val="center"/>
+            <w:shd w:fill="FFFFFF"/>
+          </w:tcPr>
+          <w:p>
+            <w:pPr>
+              <w:spacing w:before="0" w:after="40" w:line="252" w:lineRule="auto"/>
+              <w:jc w:val="left"/>
+            </w:pPr>
+            <w:r>
+              <w:rPr>
+                <w:rFonts w:ascii="Calibri" w:hAnsi="Calibri"/>
+                <w:b w:val="0"/>
+                <w:color w:val="111827"/>
+                <w:sz w:val="17"/>
+              </w:rPr>
+              <w:t>Exclude payload and full request bodies from audit and outbox.</w:t>
+            </w:r>
+          </w:p>
+        </w:tc>
+        <w:tc>
+          <w:tcPr>
+            <w:tcW w:type="dxa" w:w="3260"/>
+            <w:tcMar>
+              <w:top w:w="80" w:type="dxa"/>
+              <w:start w:w="120" w:type="dxa"/>
+              <w:bottom w:w="80" w:type="dxa"/>
+              <w:end w:w="120" w:type="dxa"/>
+            </w:tcMar>
+            <w:vAlign w:val="center"/>
+            <w:shd w:fill="FFFFFF"/>
+          </w:tcPr>
+          <w:p>
+            <w:pPr>
+              <w:spacing w:before="0" w:after="40" w:line="252" w:lineRule="auto"/>
+              <w:jc w:val="left"/>
+            </w:pPr>
+            <w:r>
+              <w:rPr>
+                <w:rFonts w:ascii="Calibri" w:hAnsi="Calibri"/>
+                <w:b w:val="0"/>
+                <w:color w:val="111827"/>
+                <w:sz w:val="17"/>
+              </w:rPr>
+              <w:t>Service</w:t>
+            </w:r>
+          </w:p>
+        </w:tc>
+      </w:tr>
+      <w:tr>
+        <w:trPr>
+          <w:cantSplit/>
+        </w:trPr>
+        <w:tc>
+          <w:tcPr>
+            <w:tcW w:type="dxa" w:w="1650"/>
+            <w:tcMar>
+              <w:top w:w="80" w:type="dxa"/>
+              <w:start w:w="120" w:type="dxa"/>
+              <w:bottom w:w="80" w:type="dxa"/>
+              <w:end w:w="120" w:type="dxa"/>
+            </w:tcMar>
+            <w:vAlign w:val="center"/>
+            <w:shd w:fill="FFFFFF"/>
+          </w:tcPr>
+          <w:p>
+            <w:pPr>
+              <w:spacing w:before="0" w:after="40" w:line="252" w:lineRule="auto"/>
+              <w:jc w:val="center"/>
+            </w:pPr>
+            <w:r>
+              <w:rPr>
+                <w:rFonts w:ascii="Calibri" w:hAnsi="Calibri"/>
+                <w:b w:val="0"/>
+                <w:color w:val="111827"/>
+                <w:sz w:val="17"/>
+              </w:rPr>
+              <w:t>Fault migration</w:t>
+            </w:r>
+          </w:p>
+        </w:tc>
+        <w:tc>
+          <w:tcPr>
+            <w:tcW w:type="dxa" w:w="4450"/>
+            <w:tcMar>
+              <w:top w:w="80" w:type="dxa"/>
+              <w:start w:w="120" w:type="dxa"/>
+              <w:bottom w:w="80" w:type="dxa"/>
+              <w:end w:w="120" w:type="dxa"/>
+            </w:tcMar>
+            <w:vAlign w:val="center"/>
+            <w:shd w:fill="FFFFFF"/>
+          </w:tcPr>
+          <w:p>
+            <w:pPr>
+              <w:spacing w:before="0" w:after="40" w:line="252" w:lineRule="auto"/>
+              <w:jc w:val="left"/>
+            </w:pPr>
+            <w:r>
+              <w:rPr>
+                <w:rFonts w:ascii="Calibri" w:hAnsi="Calibri"/>
+                <w:b w:val="0"/>
+                <w:color w:val="111827"/>
+                <w:sz w:val="17"/>
+              </w:rPr>
+              <w:t>Upgrade and downgrade error-state and execution persistence.</w:t>
+            </w:r>
+          </w:p>
+        </w:tc>
+        <w:tc>
+          <w:tcPr>
+            <w:tcW w:type="dxa" w:w="3260"/>
+            <w:tcMar>
+              <w:top w:w="80" w:type="dxa"/>
+              <w:start w:w="120" w:type="dxa"/>
+              <w:bottom w:w="80" w:type="dxa"/>
+              <w:end w:w="120" w:type="dxa"/>
+            </w:tcMar>
+            <w:vAlign w:val="center"/>
+            <w:shd w:fill="FFFFFF"/>
+          </w:tcPr>
+          <w:p>
+            <w:pPr>
+              <w:spacing w:before="0" w:after="40" w:line="252" w:lineRule="auto"/>
+              <w:jc w:val="left"/>
+            </w:pPr>
+            <w:r>
+              <w:rPr>
+                <w:rFonts w:ascii="Calibri" w:hAnsi="Calibri"/>
+                <w:b w:val="0"/>
+                <w:color w:val="111827"/>
+                <w:sz w:val="17"/>
+              </w:rPr>
+              <w:t>Integration</w:t>
+            </w:r>
+          </w:p>
+        </w:tc>
+      </w:tr>
     </w:tbl>
     <w:p>
       <w:pPr>
@@ -9754,7 +11381,7 @@
           <w:color w:val="1F4D78"/>
           <w:sz w:val="19"/>
         </w:rPr>
-        <w:t>0027_can_fd</w:t>
+        <w:t>0028_can_faults</w:t>
       </w:r>
       <w:r>
         <w:rPr>
@@ -9893,6 +11520,55 @@
           <w:color w:val="111827"/>
           <w:sz w:val="22"/>
         </w:rPr>
+        <w:t xml:space="preserve">Fault events are </w:t>
+      </w:r>
+      <w:r>
+        <w:rPr>
+          <w:rFonts w:ascii="Consolas" w:hAnsi="Consolas"/>
+          <w:color w:val="1F4D78"/>
+          <w:sz w:val="19"/>
+        </w:rPr>
+        <w:t>atep.can.fault.injected.v1</w:t>
+      </w:r>
+      <w:r>
+        <w:rPr>
+          <w:rFonts w:ascii="Calibri" w:hAnsi="Calibri"/>
+          <w:color w:val="111827"/>
+          <w:sz w:val="22"/>
+        </w:rPr>
+        <w:t xml:space="preserve"> and </w:t>
+      </w:r>
+      <w:r>
+        <w:rPr>
+          <w:rFonts w:ascii="Consolas" w:hAnsi="Consolas"/>
+          <w:color w:val="1F4D78"/>
+          <w:sz w:val="19"/>
+        </w:rPr>
+        <w:t>atep.can.bus.recovered.v1</w:t>
+      </w:r>
+      <w:r>
+        <w:rPr>
+          <w:rFonts w:ascii="Calibri" w:hAnsi="Calibri"/>
+          <w:color w:val="111827"/>
+          <w:sz w:val="22"/>
+        </w:rPr>
+        <w:t>.</w:t>
+      </w:r>
+    </w:p>
+    <w:p>
+      <w:pPr>
+        <w:pStyle w:val="ListBullet"/>
+        <w:numPr>
+          <w:ilvl w:val="0"/>
+          <w:numId w:val="13"/>
+        </w:numPr>
+      </w:pPr>
+      <w:r>
+        <w:rPr>
+          <w:rFonts w:ascii="Calibri" w:hAnsi="Calibri"/>
+          <w:color w:val="111827"/>
+          <w:sz w:val="22"/>
+        </w:rPr>
         <w:t xml:space="preserve">Permissions are </w:t>
       </w:r>
       <w:r>
@@ -9942,7 +11618,7 @@
           <w:color w:val="111827"/>
           <w:sz w:val="22"/>
         </w:rPr>
-        <w:t>Automated tests cover validation, priority, classic and FD timing mathematics, mixed arbitration, readiness, delivery, utilization, versioning, replay, errors, DBC bit placement through 512 bits, signed scaling, exact conversion, evidence minimization, persistence, and OpenAPI.</w:t>
+        <w:t>Automated tests cover validation, priority, classic and FD timing mathematics, mixed arbitration, readiness, delivery, utilization, versioning, replay, errors, DBC bit placement through 512 bits, signed scaling, exact conversion, TEC/REC thresholds, loss, bus-off enforcement, recovery timing, evidence minimization, persistence, and OpenAPI.</w:t>
       </w:r>
     </w:p>
     <w:p>
@@ -10143,6 +11819,23 @@
     </w:p>
     <w:p>
       <w:pPr>
+        <w:pStyle w:val="ListBullet"/>
+        <w:numPr>
+          <w:ilvl w:val="0"/>
+          <w:numId w:val="14"/>
+        </w:numPr>
+      </w:pPr>
+      <w:r>
+        <w:rPr>
+          <w:rFonts w:ascii="Calibri" w:hAnsi="Calibri"/>
+          <w:color w:val="111827"/>
+          <w:sz w:val="22"/>
+        </w:rPr>
+        <w:t>Error-frame timing intentionally excludes bit stuffing, intermission, overload frames, acknowledgement errors, and automatic retransmission.</w:t>
+      </w:r>
+    </w:p>
+    <w:p>
+      <w:pPr>
         <w:pStyle w:val="Heading1"/>
         <w:keepNext/>
         <w:keepLines/>
@@ -10158,7 +11851,7 @@
           <w:color w:val="111827"/>
           <w:sz w:val="22"/>
         </w:rPr>
-        <w:t xml:space="preserve">The recommended next increment is IV-5: deterministic error frames, transmit/receive error counters, bus-off and recovery, plus bounded fault injection. See </w:t>
+        <w:t xml:space="preserve">The recommended next increment is IV-6: LIN and automotive Ethernet adapters plus deterministic gateway routing. See </w:t>
       </w:r>
       <w:r>
         <w:rPr>
@@ -10870,7 +12563,7 @@
         <w:color w:val="667085"/>
         <w:sz w:val="17"/>
       </w:rPr>
-      <w:t>ATEP Volume IV Workbook  |  Version 0.4.0</w:t>
+      <w:t>ATEP Volume IV Workbook  |  Version 0.5.0</w:t>
     </w:r>
     <w:r>
       <w:rPr>

</xml_diff>

<commit_message>
feat(can): add deterministic multibus gateway
</commit_message>
<xml_diff>
--- a/docs/ATEP_Volume_IV_CAN_Network_Engineering_Workbook.docx
+++ b/docs/ATEP_Volume_IV_CAN_Network_Engineering_Workbook.docx
@@ -143,7 +143,7 @@
                 <w:color w:val="0B2545"/>
                 <w:sz w:val="19"/>
               </w:rPr>
-              <w:t>0.5.0</w:t>
+              <w:t>0.6.0</w:t>
             </w:r>
           </w:p>
         </w:tc>
@@ -265,7 +265,7 @@
                 <w:color w:val="111827"/>
                 <w:sz w:val="19"/>
               </w:rPr>
-              <w:t>Implemented increments: IV-1 to IV-5</w:t>
+              <w:t>Implemented increments: IV-1 to IV-6</w:t>
             </w:r>
           </w:p>
         </w:tc>
@@ -893,7 +893,7 @@
                 <w:color w:val="111827"/>
                 <w:sz w:val="17"/>
               </w:rPr>
-              <w:t>Increments IV-1 through IV-5</w:t>
+              <w:t>Increments IV-1 through IV-6</w:t>
             </w:r>
           </w:p>
         </w:tc>
@@ -1653,6 +1653,95 @@
           </w:p>
         </w:tc>
       </w:tr>
+      <w:tr>
+        <w:trPr>
+          <w:cantSplit/>
+        </w:trPr>
+        <w:tc>
+          <w:tcPr>
+            <w:tcW w:type="dxa" w:w="1650"/>
+            <w:tcMar>
+              <w:top w:w="80" w:type="dxa"/>
+              <w:start w:w="120" w:type="dxa"/>
+              <w:bottom w:w="80" w:type="dxa"/>
+              <w:end w:w="120" w:type="dxa"/>
+            </w:tcMar>
+            <w:vAlign w:val="center"/>
+            <w:shd w:fill="FFFFFF"/>
+          </w:tcPr>
+          <w:p>
+            <w:pPr>
+              <w:spacing w:before="0" w:after="40" w:line="252" w:lineRule="auto"/>
+              <w:jc w:val="center"/>
+            </w:pPr>
+            <w:r>
+              <w:rPr>
+                <w:rFonts w:ascii="Calibri" w:hAnsi="Calibri"/>
+                <w:b w:val="0"/>
+                <w:color w:val="111827"/>
+                <w:sz w:val="17"/>
+              </w:rPr>
+              <w:t>0.6.0</w:t>
+            </w:r>
+          </w:p>
+        </w:tc>
+        <w:tc>
+          <w:tcPr>
+            <w:tcW w:type="dxa" w:w="4450"/>
+            <w:tcMar>
+              <w:top w:w="80" w:type="dxa"/>
+              <w:start w:w="120" w:type="dxa"/>
+              <w:bottom w:w="80" w:type="dxa"/>
+              <w:end w:w="120" w:type="dxa"/>
+            </w:tcMar>
+            <w:vAlign w:val="center"/>
+            <w:shd w:fill="FFFFFF"/>
+          </w:tcPr>
+          <w:p>
+            <w:pPr>
+              <w:spacing w:before="0" w:after="40" w:line="252" w:lineRule="auto"/>
+              <w:jc w:val="left"/>
+            </w:pPr>
+            <w:r>
+              <w:rPr>
+                <w:rFonts w:ascii="Calibri" w:hAnsi="Calibri"/>
+                <w:b w:val="0"/>
+                <w:color w:val="111827"/>
+                <w:sz w:val="17"/>
+              </w:rPr>
+              <w:t>2026-08-25</w:t>
+            </w:r>
+          </w:p>
+        </w:tc>
+        <w:tc>
+          <w:tcPr>
+            <w:tcW w:type="dxa" w:w="3260"/>
+            <w:tcMar>
+              <w:top w:w="80" w:type="dxa"/>
+              <w:start w:w="120" w:type="dxa"/>
+              <w:bottom w:w="80" w:type="dxa"/>
+              <w:end w:w="120" w:type="dxa"/>
+            </w:tcMar>
+            <w:vAlign w:val="center"/>
+            <w:shd w:fill="FFFFFF"/>
+          </w:tcPr>
+          <w:p>
+            <w:pPr>
+              <w:spacing w:before="0" w:after="40" w:line="252" w:lineRule="auto"/>
+              <w:jc w:val="left"/>
+            </w:pPr>
+            <w:r>
+              <w:rPr>
+                <w:rFonts w:ascii="Calibri" w:hAnsi="Calibri"/>
+                <w:b w:val="0"/>
+                <w:color w:val="111827"/>
+                <w:sz w:val="17"/>
+              </w:rPr>
+              <w:t>Added bounded LIN and automotive Ethernet contracts, cross-protocol gateway routing, deterministic protocol timing, replay-safe evidence, APIs, migration, and tests.</w:t>
+            </w:r>
+          </w:p>
+        </w:tc>
+      </w:tr>
     </w:tbl>
     <w:p>
       <w:pPr>
@@ -2004,6 +2093,23 @@
     </w:p>
     <w:p>
       <w:pPr>
+        <w:pStyle w:val="ListBullet"/>
+        <w:numPr>
+          <w:ilvl w:val="0"/>
+          <w:numId w:val="11"/>
+        </w:numPr>
+      </w:pPr>
+      <w:r>
+        <w:rPr>
+          <w:rFonts w:ascii="Calibri" w:hAnsi="Calibri"/>
+          <w:color w:val="111827"/>
+          <w:sz w:val="22"/>
+        </w:rPr>
+        <w:t>Bounded LIN channels, automotive Ethernet segments, and transparent gateway routes.</w:t>
+      </w:r>
+    </w:p>
+    <w:p>
+      <w:pPr>
         <w:pStyle w:val="Heading2"/>
         <w:keepNext/>
         <w:keepLines/>
@@ -2093,7 +2199,7 @@
           <w:color w:val="111827"/>
           <w:sz w:val="22"/>
         </w:rPr>
-        <w:t>LIN, automotive Ethernet, physical transceivers, and SocketCAN adapters.</w:t>
+        <w:t>Physical transceivers, SocketCAN adapters, SOME/IP, DoIP, and payload transformation.</w:t>
       </w:r>
     </w:p>
     <w:p>
@@ -2270,6 +2376,32 @@
           <w:sz w:val="22"/>
         </w:rPr>
         <w:t xml:space="preserve"> stores canonical injection/recovery requests, before/after state, logical timing, versions, target, and actor for exact replay.</w:t>
+      </w:r>
+    </w:p>
+    <w:p>
+      <w:r>
+        <w:rPr>
+          <w:rFonts w:ascii="Calibri" w:hAnsi="Calibri"/>
+          <w:color w:val="111827"/>
+          <w:sz w:val="22"/>
+        </w:rPr>
+        <w:t xml:space="preserve">The aggregate also stores bounded LIN channels, Ethernet segments, and gateway route contracts. </w:t>
+      </w:r>
+      <w:r>
+        <w:rPr>
+          <w:rFonts w:ascii="Consolas" w:hAnsi="Consolas"/>
+          <w:color w:val="1F4D78"/>
+          <w:sz w:val="19"/>
+        </w:rPr>
+        <w:t>MultiBusGatewayExecution</w:t>
+      </w:r>
+      <w:r>
+        <w:rPr>
+          <w:rFonts w:ascii="Calibri" w:hAnsi="Calibri"/>
+          <w:color w:val="111827"/>
+          <w:sz w:val="22"/>
+        </w:rPr>
+        <w:t xml:space="preserve"> persists canonical configuration or route commands, deterministic timing, sequence, versions, and actor. Routed payloads remain in command evidence but are excluded from audit and outbox records.</w:t>
       </w:r>
     </w:p>
     <w:p>
@@ -4421,6 +4553,474 @@
           </w:p>
         </w:tc>
       </w:tr>
+      <w:tr>
+        <w:trPr>
+          <w:cantSplit/>
+        </w:trPr>
+        <w:tc>
+          <w:tcPr>
+            <w:tcW w:type="dxa" w:w="1150"/>
+            <w:tcMar>
+              <w:top w:w="80" w:type="dxa"/>
+              <w:start w:w="120" w:type="dxa"/>
+              <w:bottom w:w="80" w:type="dxa"/>
+              <w:end w:w="120" w:type="dxa"/>
+            </w:tcMar>
+            <w:vAlign w:val="center"/>
+            <w:shd w:fill="FFFFFF"/>
+          </w:tcPr>
+          <w:p>
+            <w:pPr>
+              <w:spacing w:before="0" w:after="40" w:line="252" w:lineRule="auto"/>
+              <w:jc w:val="center"/>
+            </w:pPr>
+            <w:r>
+              <w:rPr>
+                <w:rFonts w:ascii="Calibri" w:hAnsi="Calibri"/>
+                <w:b w:val="0"/>
+                <w:color w:val="111827"/>
+                <w:sz w:val="16"/>
+              </w:rPr>
+              <w:t>POST</w:t>
+            </w:r>
+          </w:p>
+        </w:tc>
+        <w:tc>
+          <w:tcPr>
+            <w:tcW w:type="dxa" w:w="3700"/>
+            <w:tcMar>
+              <w:top w:w="80" w:type="dxa"/>
+              <w:start w:w="120" w:type="dxa"/>
+              <w:bottom w:w="80" w:type="dxa"/>
+              <w:end w:w="120" w:type="dxa"/>
+            </w:tcMar>
+            <w:vAlign w:val="center"/>
+            <w:shd w:fill="FFFFFF"/>
+          </w:tcPr>
+          <w:p>
+            <w:pPr>
+              <w:spacing w:before="0" w:after="40" w:line="252" w:lineRule="auto"/>
+              <w:jc w:val="left"/>
+            </w:pPr>
+            <w:r>
+              <w:rPr>
+                <w:rFonts w:ascii="Calibri" w:hAnsi="Calibri"/>
+                <w:b w:val="0"/>
+                <w:color w:val="111827"/>
+                <w:sz w:val="16"/>
+              </w:rPr>
+              <w:t>/api/v1/vehicles/{vehicle_id}/can-networks/multibus/configure</w:t>
+            </w:r>
+          </w:p>
+        </w:tc>
+        <w:tc>
+          <w:tcPr>
+            <w:tcW w:type="dxa" w:w="3100"/>
+            <w:tcMar>
+              <w:top w:w="80" w:type="dxa"/>
+              <w:start w:w="120" w:type="dxa"/>
+              <w:bottom w:w="80" w:type="dxa"/>
+              <w:end w:w="120" w:type="dxa"/>
+            </w:tcMar>
+            <w:vAlign w:val="center"/>
+            <w:shd w:fill="FFFFFF"/>
+          </w:tcPr>
+          <w:p>
+            <w:pPr>
+              <w:spacing w:before="0" w:after="40" w:line="252" w:lineRule="auto"/>
+              <w:jc w:val="left"/>
+            </w:pPr>
+            <w:r>
+              <w:rPr>
+                <w:rFonts w:ascii="Calibri" w:hAnsi="Calibri"/>
+                <w:b w:val="0"/>
+                <w:color w:val="111827"/>
+                <w:sz w:val="16"/>
+              </w:rPr>
+              <w:t>can_networks:manage</w:t>
+            </w:r>
+          </w:p>
+        </w:tc>
+        <w:tc>
+          <w:tcPr>
+            <w:tcW w:type="dxa" w:w="1410"/>
+            <w:tcMar>
+              <w:top w:w="80" w:type="dxa"/>
+              <w:start w:w="120" w:type="dxa"/>
+              <w:bottom w:w="80" w:type="dxa"/>
+              <w:end w:w="120" w:type="dxa"/>
+            </w:tcMar>
+            <w:vAlign w:val="center"/>
+            <w:shd w:fill="FFFFFF"/>
+          </w:tcPr>
+          <w:p>
+            <w:pPr>
+              <w:spacing w:before="0" w:after="40" w:line="252" w:lineRule="auto"/>
+              <w:jc w:val="left"/>
+            </w:pPr>
+            <w:r>
+              <w:rPr>
+                <w:rFonts w:ascii="Calibri" w:hAnsi="Calibri"/>
+                <w:b w:val="0"/>
+                <w:color w:val="111827"/>
+                <w:sz w:val="16"/>
+              </w:rPr>
+              <w:t>Configure LIN, Ethernet, and routes.</w:t>
+            </w:r>
+          </w:p>
+        </w:tc>
+      </w:tr>
+      <w:tr>
+        <w:trPr>
+          <w:cantSplit/>
+        </w:trPr>
+        <w:tc>
+          <w:tcPr>
+            <w:tcW w:type="dxa" w:w="1150"/>
+            <w:tcMar>
+              <w:top w:w="80" w:type="dxa"/>
+              <w:start w:w="120" w:type="dxa"/>
+              <w:bottom w:w="80" w:type="dxa"/>
+              <w:end w:w="120" w:type="dxa"/>
+            </w:tcMar>
+            <w:vAlign w:val="center"/>
+            <w:shd w:fill="FFFFFF"/>
+          </w:tcPr>
+          <w:p>
+            <w:pPr>
+              <w:spacing w:before="0" w:after="40" w:line="252" w:lineRule="auto"/>
+              <w:jc w:val="center"/>
+            </w:pPr>
+            <w:r>
+              <w:rPr>
+                <w:rFonts w:ascii="Calibri" w:hAnsi="Calibri"/>
+                <w:b w:val="0"/>
+                <w:color w:val="111827"/>
+                <w:sz w:val="16"/>
+              </w:rPr>
+              <w:t>POST</w:t>
+            </w:r>
+          </w:p>
+        </w:tc>
+        <w:tc>
+          <w:tcPr>
+            <w:tcW w:type="dxa" w:w="3700"/>
+            <w:tcMar>
+              <w:top w:w="80" w:type="dxa"/>
+              <w:start w:w="120" w:type="dxa"/>
+              <w:bottom w:w="80" w:type="dxa"/>
+              <w:end w:w="120" w:type="dxa"/>
+            </w:tcMar>
+            <w:vAlign w:val="center"/>
+            <w:shd w:fill="FFFFFF"/>
+          </w:tcPr>
+          <w:p>
+            <w:pPr>
+              <w:spacing w:before="0" w:after="40" w:line="252" w:lineRule="auto"/>
+              <w:jc w:val="left"/>
+            </w:pPr>
+            <w:r>
+              <w:rPr>
+                <w:rFonts w:ascii="Calibri" w:hAnsi="Calibri"/>
+                <w:b w:val="0"/>
+                <w:color w:val="111827"/>
+                <w:sz w:val="16"/>
+              </w:rPr>
+              <w:t>/api/v1/vehicles/{vehicle_id}/can-networks/gateway/routes/execute</w:t>
+            </w:r>
+          </w:p>
+        </w:tc>
+        <w:tc>
+          <w:tcPr>
+            <w:tcW w:type="dxa" w:w="3100"/>
+            <w:tcMar>
+              <w:top w:w="80" w:type="dxa"/>
+              <w:start w:w="120" w:type="dxa"/>
+              <w:bottom w:w="80" w:type="dxa"/>
+              <w:end w:w="120" w:type="dxa"/>
+            </w:tcMar>
+            <w:vAlign w:val="center"/>
+            <w:shd w:fill="FFFFFF"/>
+          </w:tcPr>
+          <w:p>
+            <w:pPr>
+              <w:spacing w:before="0" w:after="40" w:line="252" w:lineRule="auto"/>
+              <w:jc w:val="left"/>
+            </w:pPr>
+            <w:r>
+              <w:rPr>
+                <w:rFonts w:ascii="Calibri" w:hAnsi="Calibri"/>
+                <w:b w:val="0"/>
+                <w:color w:val="111827"/>
+                <w:sz w:val="16"/>
+              </w:rPr>
+              <w:t>can_networks:manage</w:t>
+            </w:r>
+          </w:p>
+        </w:tc>
+        <w:tc>
+          <w:tcPr>
+            <w:tcW w:type="dxa" w:w="1410"/>
+            <w:tcMar>
+              <w:top w:w="80" w:type="dxa"/>
+              <w:start w:w="120" w:type="dxa"/>
+              <w:bottom w:w="80" w:type="dxa"/>
+              <w:end w:w="120" w:type="dxa"/>
+            </w:tcMar>
+            <w:vAlign w:val="center"/>
+            <w:shd w:fill="FFFFFF"/>
+          </w:tcPr>
+          <w:p>
+            <w:pPr>
+              <w:spacing w:before="0" w:after="40" w:line="252" w:lineRule="auto"/>
+              <w:jc w:val="left"/>
+            </w:pPr>
+            <w:r>
+              <w:rPr>
+                <w:rFonts w:ascii="Calibri" w:hAnsi="Calibri"/>
+                <w:b w:val="0"/>
+                <w:color w:val="111827"/>
+                <w:sz w:val="16"/>
+              </w:rPr>
+              <w:t>Execute a transparent route.</w:t>
+            </w:r>
+          </w:p>
+        </w:tc>
+      </w:tr>
+      <w:tr>
+        <w:trPr>
+          <w:cantSplit/>
+        </w:trPr>
+        <w:tc>
+          <w:tcPr>
+            <w:tcW w:type="dxa" w:w="1150"/>
+            <w:tcMar>
+              <w:top w:w="80" w:type="dxa"/>
+              <w:start w:w="120" w:type="dxa"/>
+              <w:bottom w:w="80" w:type="dxa"/>
+              <w:end w:w="120" w:type="dxa"/>
+            </w:tcMar>
+            <w:vAlign w:val="center"/>
+            <w:shd w:fill="FFFFFF"/>
+          </w:tcPr>
+          <w:p>
+            <w:pPr>
+              <w:spacing w:before="0" w:after="40" w:line="252" w:lineRule="auto"/>
+              <w:jc w:val="center"/>
+            </w:pPr>
+            <w:r>
+              <w:rPr>
+                <w:rFonts w:ascii="Calibri" w:hAnsi="Calibri"/>
+                <w:b w:val="0"/>
+                <w:color w:val="111827"/>
+                <w:sz w:val="16"/>
+              </w:rPr>
+              <w:t>GET</w:t>
+            </w:r>
+          </w:p>
+        </w:tc>
+        <w:tc>
+          <w:tcPr>
+            <w:tcW w:type="dxa" w:w="3700"/>
+            <w:tcMar>
+              <w:top w:w="80" w:type="dxa"/>
+              <w:start w:w="120" w:type="dxa"/>
+              <w:bottom w:w="80" w:type="dxa"/>
+              <w:end w:w="120" w:type="dxa"/>
+            </w:tcMar>
+            <w:vAlign w:val="center"/>
+            <w:shd w:fill="FFFFFF"/>
+          </w:tcPr>
+          <w:p>
+            <w:pPr>
+              <w:spacing w:before="0" w:after="40" w:line="252" w:lineRule="auto"/>
+              <w:jc w:val="left"/>
+            </w:pPr>
+            <w:r>
+              <w:rPr>
+                <w:rFonts w:ascii="Calibri" w:hAnsi="Calibri"/>
+                <w:b w:val="0"/>
+                <w:color w:val="111827"/>
+                <w:sz w:val="16"/>
+              </w:rPr>
+              <w:t>/api/v1/vehicles/{vehicle_id}/can-networks/gateway/executions</w:t>
+            </w:r>
+          </w:p>
+        </w:tc>
+        <w:tc>
+          <w:tcPr>
+            <w:tcW w:type="dxa" w:w="3100"/>
+            <w:tcMar>
+              <w:top w:w="80" w:type="dxa"/>
+              <w:start w:w="120" w:type="dxa"/>
+              <w:bottom w:w="80" w:type="dxa"/>
+              <w:end w:w="120" w:type="dxa"/>
+            </w:tcMar>
+            <w:vAlign w:val="center"/>
+            <w:shd w:fill="FFFFFF"/>
+          </w:tcPr>
+          <w:p>
+            <w:pPr>
+              <w:spacing w:before="0" w:after="40" w:line="252" w:lineRule="auto"/>
+              <w:jc w:val="left"/>
+            </w:pPr>
+            <w:r>
+              <w:rPr>
+                <w:rFonts w:ascii="Calibri" w:hAnsi="Calibri"/>
+                <w:b w:val="0"/>
+                <w:color w:val="111827"/>
+                <w:sz w:val="16"/>
+              </w:rPr>
+              <w:t>can_networks:read</w:t>
+            </w:r>
+          </w:p>
+        </w:tc>
+        <w:tc>
+          <w:tcPr>
+            <w:tcW w:type="dxa" w:w="1410"/>
+            <w:tcMar>
+              <w:top w:w="80" w:type="dxa"/>
+              <w:start w:w="120" w:type="dxa"/>
+              <w:bottom w:w="80" w:type="dxa"/>
+              <w:end w:w="120" w:type="dxa"/>
+            </w:tcMar>
+            <w:vAlign w:val="center"/>
+            <w:shd w:fill="FFFFFF"/>
+          </w:tcPr>
+          <w:p>
+            <w:pPr>
+              <w:spacing w:before="0" w:after="40" w:line="252" w:lineRule="auto"/>
+              <w:jc w:val="left"/>
+            </w:pPr>
+            <w:r>
+              <w:rPr>
+                <w:rFonts w:ascii="Calibri" w:hAnsi="Calibri"/>
+                <w:b w:val="0"/>
+                <w:color w:val="111827"/>
+                <w:sz w:val="16"/>
+              </w:rPr>
+              <w:t>List multi-bus evidence.</w:t>
+            </w:r>
+          </w:p>
+        </w:tc>
+      </w:tr>
+      <w:tr>
+        <w:trPr>
+          <w:cantSplit/>
+        </w:trPr>
+        <w:tc>
+          <w:tcPr>
+            <w:tcW w:type="dxa" w:w="1150"/>
+            <w:tcMar>
+              <w:top w:w="80" w:type="dxa"/>
+              <w:start w:w="120" w:type="dxa"/>
+              <w:bottom w:w="80" w:type="dxa"/>
+              <w:end w:w="120" w:type="dxa"/>
+            </w:tcMar>
+            <w:vAlign w:val="center"/>
+            <w:shd w:fill="FFFFFF"/>
+          </w:tcPr>
+          <w:p>
+            <w:pPr>
+              <w:spacing w:before="0" w:after="40" w:line="252" w:lineRule="auto"/>
+              <w:jc w:val="center"/>
+            </w:pPr>
+            <w:r>
+              <w:rPr>
+                <w:rFonts w:ascii="Calibri" w:hAnsi="Calibri"/>
+                <w:b w:val="0"/>
+                <w:color w:val="111827"/>
+                <w:sz w:val="16"/>
+              </w:rPr>
+              <w:t>GET</w:t>
+            </w:r>
+          </w:p>
+        </w:tc>
+        <w:tc>
+          <w:tcPr>
+            <w:tcW w:type="dxa" w:w="3700"/>
+            <w:tcMar>
+              <w:top w:w="80" w:type="dxa"/>
+              <w:start w:w="120" w:type="dxa"/>
+              <w:bottom w:w="80" w:type="dxa"/>
+              <w:end w:w="120" w:type="dxa"/>
+            </w:tcMar>
+            <w:vAlign w:val="center"/>
+            <w:shd w:fill="FFFFFF"/>
+          </w:tcPr>
+          <w:p>
+            <w:pPr>
+              <w:spacing w:before="0" w:after="40" w:line="252" w:lineRule="auto"/>
+              <w:jc w:val="left"/>
+            </w:pPr>
+            <w:r>
+              <w:rPr>
+                <w:rFonts w:ascii="Calibri" w:hAnsi="Calibri"/>
+                <w:b w:val="0"/>
+                <w:color w:val="111827"/>
+                <w:sz w:val="16"/>
+              </w:rPr>
+              <w:t>/api/v1/vehicles/{vehicle_id}/can-networks/gateway/executions/{command_id}</w:t>
+            </w:r>
+          </w:p>
+        </w:tc>
+        <w:tc>
+          <w:tcPr>
+            <w:tcW w:type="dxa" w:w="3100"/>
+            <w:tcMar>
+              <w:top w:w="80" w:type="dxa"/>
+              <w:start w:w="120" w:type="dxa"/>
+              <w:bottom w:w="80" w:type="dxa"/>
+              <w:end w:w="120" w:type="dxa"/>
+            </w:tcMar>
+            <w:vAlign w:val="center"/>
+            <w:shd w:fill="FFFFFF"/>
+          </w:tcPr>
+          <w:p>
+            <w:pPr>
+              <w:spacing w:before="0" w:after="40" w:line="252" w:lineRule="auto"/>
+              <w:jc w:val="left"/>
+            </w:pPr>
+            <w:r>
+              <w:rPr>
+                <w:rFonts w:ascii="Calibri" w:hAnsi="Calibri"/>
+                <w:b w:val="0"/>
+                <w:color w:val="111827"/>
+                <w:sz w:val="16"/>
+              </w:rPr>
+              <w:t>can_networks:read</w:t>
+            </w:r>
+          </w:p>
+        </w:tc>
+        <w:tc>
+          <w:tcPr>
+            <w:tcW w:type="dxa" w:w="1410"/>
+            <w:tcMar>
+              <w:top w:w="80" w:type="dxa"/>
+              <w:start w:w="120" w:type="dxa"/>
+              <w:bottom w:w="80" w:type="dxa"/>
+              <w:end w:w="120" w:type="dxa"/>
+            </w:tcMar>
+            <w:vAlign w:val="center"/>
+            <w:shd w:fill="FFFFFF"/>
+          </w:tcPr>
+          <w:p>
+            <w:pPr>
+              <w:spacing w:before="0" w:after="40" w:line="252" w:lineRule="auto"/>
+              <w:jc w:val="left"/>
+            </w:pPr>
+            <w:r>
+              <w:rPr>
+                <w:rFonts w:ascii="Calibri" w:hAnsi="Calibri"/>
+                <w:b w:val="0"/>
+                <w:color w:val="111827"/>
+                <w:sz w:val="16"/>
+              </w:rPr>
+              <w:t>Retrieve multi-bus evidence.</w:t>
+            </w:r>
+          </w:p>
+        </w:tc>
+      </w:tr>
     </w:tbl>
     <w:p>
       <w:pPr>
@@ -4751,6 +5351,62 @@
     </w:p>
     <w:p>
       <w:pPr>
+        <w:pStyle w:val="Heading2"/>
+        <w:keepNext/>
+        <w:keepLines/>
+      </w:pPr>
+      <w:r>
+        <w:t>8.5 LIN, Ethernet, and Gateway Semantics</w:t>
+      </w:r>
+    </w:p>
+    <w:p>
+      <w:r>
+        <w:rPr>
+          <w:rFonts w:ascii="Calibri" w:hAnsi="Calibri"/>
+          <w:color w:val="111827"/>
+          <w:sz w:val="22"/>
+        </w:rPr>
+        <w:t>LIN channels use 1-20 kbit/s, six-bit identifiers, one publisher, bounded subscribers, one to eight payload bytes, and explicit classic or enhanced checksum semantics. Destination duration uses a transparent model of 43 header/checksum bits plus ten transmitted bits per payload byte.</w:t>
+      </w:r>
+    </w:p>
+    <w:p>
+      <w:r>
+        <w:rPr>
+          <w:rFonts w:ascii="Calibri" w:hAnsi="Calibri"/>
+          <w:color w:val="111827"/>
+          <w:sz w:val="22"/>
+        </w:rPr>
+        <w:t xml:space="preserve">Automotive Ethernet segments operate at 100 or 1000 Mbit/s. Messages define EtherType, source, destinations, optional VLAN, and one to 1500 payload bytes. Timing includes preamble, Ethernet header, payload, frame check sequence, and inter-frame gap: </w:t>
+      </w:r>
+      <w:r>
+        <w:rPr>
+          <w:rFonts w:ascii="Consolas" w:hAnsi="Consolas"/>
+          <w:color w:val="1F4D78"/>
+          <w:sz w:val="19"/>
+        </w:rPr>
+        <w:t>(38 + payload_length) * 8</w:t>
+      </w:r>
+      <w:r>
+        <w:rPr>
+          <w:rFonts w:ascii="Calibri" w:hAnsi="Calibri"/>
+          <w:color w:val="111827"/>
+          <w:sz w:val="22"/>
+        </w:rPr>
+        <w:t xml:space="preserve"> bits.</w:t>
+      </w:r>
+    </w:p>
+    <w:p>
+      <w:r>
+        <w:rPr>
+          <w:rFonts w:ascii="Calibri" w:hAnsi="Calibri"/>
+          <w:color w:val="111827"/>
+          <w:sz w:val="22"/>
+        </w:rPr>
+        <w:t>Gateway routes must connect different protocols through an ECU declared with gateway role. Transparent routing requires equal source and destination payload lengths. Execution locks the aggregate, validates optimistic version, assigns one sequence, advances logical time using the destination protocol, and persists exact replay evidence atomically with audit and outbox records.</w:t>
+      </w:r>
+    </w:p>
+    <w:p>
+      <w:pPr>
         <w:pStyle w:val="Heading1"/>
         <w:keepNext/>
         <w:keepLines/>
@@ -4782,7 +5438,7 @@
           <w:color w:val="111827"/>
           <w:sz w:val="22"/>
         </w:rPr>
-        <w:t>. IV-1 through IV-5 implement CAN-F-001 through CAN-F-050 and CAN-NF-001 through CAN-NF-017.</w:t>
+        <w:t>. IV-1 through IV-6 implement CAN-F-001 through CAN-F-060 and CAN-NF-001 through CAN-NF-020.</w:t>
       </w:r>
     </w:p>
     <w:p>
@@ -5109,6 +5765,46 @@
           <w:sz w:val="22"/>
         </w:rPr>
         <w:t xml:space="preserve"> field continues to represent payload bytes for compatibility. Validation restricts FD values to ISO-defined payload sizes, while a future wire adapter can map larger lengths to their four-bit encoded DLC values.</w:t>
+      </w:r>
+    </w:p>
+    <w:p>
+      <w:pPr>
+        <w:pStyle w:val="Heading2"/>
+        <w:keepNext/>
+        <w:keepLines/>
+      </w:pPr>
+      <w:r>
+        <w:t>ADR-CAN-016 - Keep Multi-Bus Contracts in One Versioned Aggregate</w:t>
+      </w:r>
+    </w:p>
+    <w:p>
+      <w:r>
+        <w:rPr>
+          <w:rFonts w:ascii="Calibri" w:hAnsi="Calibri"/>
+          <w:color w:val="111827"/>
+          <w:sz w:val="22"/>
+        </w:rPr>
+        <w:t>LIN, Ethernet, and gateway routes share the CAN network aggregate so cross-protocol configuration, logical time, sequence, replay, and audit remain atomic during the bounded baseline.</w:t>
+      </w:r>
+    </w:p>
+    <w:p>
+      <w:pPr>
+        <w:pStyle w:val="Heading2"/>
+        <w:keepNext/>
+        <w:keepLines/>
+      </w:pPr>
+      <w:r>
+        <w:t>ADR-CAN-017 - Route Transparently Before Adding Signal Transformation</w:t>
+      </w:r>
+    </w:p>
+    <w:p>
+      <w:r>
+        <w:rPr>
+          <w:rFonts w:ascii="Calibri" w:hAnsi="Calibri"/>
+          <w:color w:val="111827"/>
+          <w:sz w:val="22"/>
+        </w:rPr>
+        <w:t>IV-6 requires equal payload lengths and preserves bytes unchanged. This separates deterministic transport timing and gateway control from future DBC-to-SOME/IP or application-level conversion.</w:t>
       </w:r>
     </w:p>
     <w:p>
@@ -11302,6 +11998,1163 @@
           </w:p>
         </w:tc>
       </w:tr>
+      <w:tr>
+        <w:trPr>
+          <w:cantSplit/>
+        </w:trPr>
+        <w:tc>
+          <w:tcPr>
+            <w:tcW w:type="dxa" w:w="1650"/>
+            <w:tcMar>
+              <w:top w:w="80" w:type="dxa"/>
+              <w:start w:w="120" w:type="dxa"/>
+              <w:bottom w:w="80" w:type="dxa"/>
+              <w:end w:w="120" w:type="dxa"/>
+            </w:tcMar>
+            <w:vAlign w:val="center"/>
+            <w:shd w:fill="FFFFFF"/>
+          </w:tcPr>
+          <w:p>
+            <w:pPr>
+              <w:spacing w:before="0" w:after="40" w:line="252" w:lineRule="auto"/>
+              <w:jc w:val="center"/>
+            </w:pPr>
+            <w:r>
+              <w:rPr>
+                <w:rFonts w:ascii="Calibri" w:hAnsi="Calibri"/>
+                <w:b w:val="0"/>
+                <w:color w:val="111827"/>
+                <w:sz w:val="17"/>
+              </w:rPr>
+              <w:t>LIN bounds</w:t>
+            </w:r>
+          </w:p>
+        </w:tc>
+        <w:tc>
+          <w:tcPr>
+            <w:tcW w:type="dxa" w:w="4450"/>
+            <w:tcMar>
+              <w:top w:w="80" w:type="dxa"/>
+              <w:start w:w="120" w:type="dxa"/>
+              <w:bottom w:w="80" w:type="dxa"/>
+              <w:end w:w="120" w:type="dxa"/>
+            </w:tcMar>
+            <w:vAlign w:val="center"/>
+            <w:shd w:fill="FFFFFF"/>
+          </w:tcPr>
+          <w:p>
+            <w:pPr>
+              <w:spacing w:before="0" w:after="40" w:line="252" w:lineRule="auto"/>
+              <w:jc w:val="left"/>
+            </w:pPr>
+            <w:r>
+              <w:rPr>
+                <w:rFonts w:ascii="Calibri" w:hAnsi="Calibri"/>
+                <w:b w:val="0"/>
+                <w:color w:val="111827"/>
+                <w:sz w:val="17"/>
+              </w:rPr>
+              <w:t>Reject bitrate above 20 kbit/s, IDs above 63, and payloads above eight bytes.</w:t>
+            </w:r>
+          </w:p>
+        </w:tc>
+        <w:tc>
+          <w:tcPr>
+            <w:tcW w:type="dxa" w:w="3260"/>
+            <w:tcMar>
+              <w:top w:w="80" w:type="dxa"/>
+              <w:start w:w="120" w:type="dxa"/>
+              <w:bottom w:w="80" w:type="dxa"/>
+              <w:end w:w="120" w:type="dxa"/>
+            </w:tcMar>
+            <w:vAlign w:val="center"/>
+            <w:shd w:fill="FFFFFF"/>
+          </w:tcPr>
+          <w:p>
+            <w:pPr>
+              <w:spacing w:before="0" w:after="40" w:line="252" w:lineRule="auto"/>
+              <w:jc w:val="left"/>
+            </w:pPr>
+            <w:r>
+              <w:rPr>
+                <w:rFonts w:ascii="Calibri" w:hAnsi="Calibri"/>
+                <w:b w:val="0"/>
+                <w:color w:val="111827"/>
+                <w:sz w:val="17"/>
+              </w:rPr>
+              <w:t>Schema</w:t>
+            </w:r>
+          </w:p>
+        </w:tc>
+      </w:tr>
+      <w:tr>
+        <w:trPr>
+          <w:cantSplit/>
+        </w:trPr>
+        <w:tc>
+          <w:tcPr>
+            <w:tcW w:type="dxa" w:w="1650"/>
+            <w:tcMar>
+              <w:top w:w="80" w:type="dxa"/>
+              <w:start w:w="120" w:type="dxa"/>
+              <w:bottom w:w="80" w:type="dxa"/>
+              <w:end w:w="120" w:type="dxa"/>
+            </w:tcMar>
+            <w:vAlign w:val="center"/>
+            <w:shd w:fill="FFFFFF"/>
+          </w:tcPr>
+          <w:p>
+            <w:pPr>
+              <w:spacing w:before="0" w:after="40" w:line="252" w:lineRule="auto"/>
+              <w:jc w:val="center"/>
+            </w:pPr>
+            <w:r>
+              <w:rPr>
+                <w:rFonts w:ascii="Calibri" w:hAnsi="Calibri"/>
+                <w:b w:val="0"/>
+                <w:color w:val="111827"/>
+                <w:sz w:val="17"/>
+              </w:rPr>
+              <w:t>Ethernet bounds</w:t>
+            </w:r>
+          </w:p>
+        </w:tc>
+        <w:tc>
+          <w:tcPr>
+            <w:tcW w:type="dxa" w:w="4450"/>
+            <w:tcMar>
+              <w:top w:w="80" w:type="dxa"/>
+              <w:start w:w="120" w:type="dxa"/>
+              <w:bottom w:w="80" w:type="dxa"/>
+              <w:end w:w="120" w:type="dxa"/>
+            </w:tcMar>
+            <w:vAlign w:val="center"/>
+            <w:shd w:fill="FFFFFF"/>
+          </w:tcPr>
+          <w:p>
+            <w:pPr>
+              <w:spacing w:before="0" w:after="40" w:line="252" w:lineRule="auto"/>
+              <w:jc w:val="left"/>
+            </w:pPr>
+            <w:r>
+              <w:rPr>
+                <w:rFonts w:ascii="Calibri" w:hAnsi="Calibri"/>
+                <w:b w:val="0"/>
+                <w:color w:val="111827"/>
+                <w:sz w:val="17"/>
+              </w:rPr>
+              <w:t>Accept only 100/1000 Mbit/s and payloads through 1500 bytes.</w:t>
+            </w:r>
+          </w:p>
+        </w:tc>
+        <w:tc>
+          <w:tcPr>
+            <w:tcW w:type="dxa" w:w="3260"/>
+            <w:tcMar>
+              <w:top w:w="80" w:type="dxa"/>
+              <w:start w:w="120" w:type="dxa"/>
+              <w:bottom w:w="80" w:type="dxa"/>
+              <w:end w:w="120" w:type="dxa"/>
+            </w:tcMar>
+            <w:vAlign w:val="center"/>
+            <w:shd w:fill="FFFFFF"/>
+          </w:tcPr>
+          <w:p>
+            <w:pPr>
+              <w:spacing w:before="0" w:after="40" w:line="252" w:lineRule="auto"/>
+              <w:jc w:val="left"/>
+            </w:pPr>
+            <w:r>
+              <w:rPr>
+                <w:rFonts w:ascii="Calibri" w:hAnsi="Calibri"/>
+                <w:b w:val="0"/>
+                <w:color w:val="111827"/>
+                <w:sz w:val="17"/>
+              </w:rPr>
+              <w:t>Schema</w:t>
+            </w:r>
+          </w:p>
+        </w:tc>
+      </w:tr>
+      <w:tr>
+        <w:trPr>
+          <w:cantSplit/>
+        </w:trPr>
+        <w:tc>
+          <w:tcPr>
+            <w:tcW w:type="dxa" w:w="1650"/>
+            <w:tcMar>
+              <w:top w:w="80" w:type="dxa"/>
+              <w:start w:w="120" w:type="dxa"/>
+              <w:bottom w:w="80" w:type="dxa"/>
+              <w:end w:w="120" w:type="dxa"/>
+            </w:tcMar>
+            <w:vAlign w:val="center"/>
+            <w:shd w:fill="FFFFFF"/>
+          </w:tcPr>
+          <w:p>
+            <w:pPr>
+              <w:spacing w:before="0" w:after="40" w:line="252" w:lineRule="auto"/>
+              <w:jc w:val="center"/>
+            </w:pPr>
+            <w:r>
+              <w:rPr>
+                <w:rFonts w:ascii="Calibri" w:hAnsi="Calibri"/>
+                <w:b w:val="0"/>
+                <w:color w:val="111827"/>
+                <w:sz w:val="17"/>
+              </w:rPr>
+              <w:t>Gateway role</w:t>
+            </w:r>
+          </w:p>
+        </w:tc>
+        <w:tc>
+          <w:tcPr>
+            <w:tcW w:type="dxa" w:w="4450"/>
+            <w:tcMar>
+              <w:top w:w="80" w:type="dxa"/>
+              <w:start w:w="120" w:type="dxa"/>
+              <w:bottom w:w="80" w:type="dxa"/>
+              <w:end w:w="120" w:type="dxa"/>
+            </w:tcMar>
+            <w:vAlign w:val="center"/>
+            <w:shd w:fill="FFFFFF"/>
+          </w:tcPr>
+          <w:p>
+            <w:pPr>
+              <w:spacing w:before="0" w:after="40" w:line="252" w:lineRule="auto"/>
+              <w:jc w:val="left"/>
+            </w:pPr>
+            <w:r>
+              <w:rPr>
+                <w:rFonts w:ascii="Calibri" w:hAnsi="Calibri"/>
+                <w:b w:val="0"/>
+                <w:color w:val="111827"/>
+                <w:sz w:val="17"/>
+              </w:rPr>
+              <w:t>Reject a route through a node without gateway role.</w:t>
+            </w:r>
+          </w:p>
+        </w:tc>
+        <w:tc>
+          <w:tcPr>
+            <w:tcW w:type="dxa" w:w="3260"/>
+            <w:tcMar>
+              <w:top w:w="80" w:type="dxa"/>
+              <w:start w:w="120" w:type="dxa"/>
+              <w:bottom w:w="80" w:type="dxa"/>
+              <w:end w:w="120" w:type="dxa"/>
+            </w:tcMar>
+            <w:vAlign w:val="center"/>
+            <w:shd w:fill="FFFFFF"/>
+          </w:tcPr>
+          <w:p>
+            <w:pPr>
+              <w:spacing w:before="0" w:after="40" w:line="252" w:lineRule="auto"/>
+              <w:jc w:val="left"/>
+            </w:pPr>
+            <w:r>
+              <w:rPr>
+                <w:rFonts w:ascii="Calibri" w:hAnsi="Calibri"/>
+                <w:b w:val="0"/>
+                <w:color w:val="111827"/>
+                <w:sz w:val="17"/>
+              </w:rPr>
+              <w:t>Service</w:t>
+            </w:r>
+          </w:p>
+        </w:tc>
+      </w:tr>
+      <w:tr>
+        <w:trPr>
+          <w:cantSplit/>
+        </w:trPr>
+        <w:tc>
+          <w:tcPr>
+            <w:tcW w:type="dxa" w:w="1650"/>
+            <w:tcMar>
+              <w:top w:w="80" w:type="dxa"/>
+              <w:start w:w="120" w:type="dxa"/>
+              <w:bottom w:w="80" w:type="dxa"/>
+              <w:end w:w="120" w:type="dxa"/>
+            </w:tcMar>
+            <w:vAlign w:val="center"/>
+            <w:shd w:fill="FFFFFF"/>
+          </w:tcPr>
+          <w:p>
+            <w:pPr>
+              <w:spacing w:before="0" w:after="40" w:line="252" w:lineRule="auto"/>
+              <w:jc w:val="center"/>
+            </w:pPr>
+            <w:r>
+              <w:rPr>
+                <w:rFonts w:ascii="Calibri" w:hAnsi="Calibri"/>
+                <w:b w:val="0"/>
+                <w:color w:val="111827"/>
+                <w:sz w:val="17"/>
+              </w:rPr>
+              <w:t>Cross-protocol route</w:t>
+            </w:r>
+          </w:p>
+        </w:tc>
+        <w:tc>
+          <w:tcPr>
+            <w:tcW w:type="dxa" w:w="4450"/>
+            <w:tcMar>
+              <w:top w:w="80" w:type="dxa"/>
+              <w:start w:w="120" w:type="dxa"/>
+              <w:bottom w:w="80" w:type="dxa"/>
+              <w:end w:w="120" w:type="dxa"/>
+            </w:tcMar>
+            <w:vAlign w:val="center"/>
+            <w:shd w:fill="FFFFFF"/>
+          </w:tcPr>
+          <w:p>
+            <w:pPr>
+              <w:spacing w:before="0" w:after="40" w:line="252" w:lineRule="auto"/>
+              <w:jc w:val="left"/>
+            </w:pPr>
+            <w:r>
+              <w:rPr>
+                <w:rFonts w:ascii="Calibri" w:hAnsi="Calibri"/>
+                <w:b w:val="0"/>
+                <w:color w:val="111827"/>
+                <w:sz w:val="17"/>
+              </w:rPr>
+              <w:t>Reject routes whose source and destination protocols are equal.</w:t>
+            </w:r>
+          </w:p>
+        </w:tc>
+        <w:tc>
+          <w:tcPr>
+            <w:tcW w:type="dxa" w:w="3260"/>
+            <w:tcMar>
+              <w:top w:w="80" w:type="dxa"/>
+              <w:start w:w="120" w:type="dxa"/>
+              <w:bottom w:w="80" w:type="dxa"/>
+              <w:end w:w="120" w:type="dxa"/>
+            </w:tcMar>
+            <w:vAlign w:val="center"/>
+            <w:shd w:fill="FFFFFF"/>
+          </w:tcPr>
+          <w:p>
+            <w:pPr>
+              <w:spacing w:before="0" w:after="40" w:line="252" w:lineRule="auto"/>
+              <w:jc w:val="left"/>
+            </w:pPr>
+            <w:r>
+              <w:rPr>
+                <w:rFonts w:ascii="Calibri" w:hAnsi="Calibri"/>
+                <w:b w:val="0"/>
+                <w:color w:val="111827"/>
+                <w:sz w:val="17"/>
+              </w:rPr>
+              <w:t>Schema</w:t>
+            </w:r>
+          </w:p>
+        </w:tc>
+      </w:tr>
+      <w:tr>
+        <w:trPr>
+          <w:cantSplit/>
+        </w:trPr>
+        <w:tc>
+          <w:tcPr>
+            <w:tcW w:type="dxa" w:w="1650"/>
+            <w:tcMar>
+              <w:top w:w="80" w:type="dxa"/>
+              <w:start w:w="120" w:type="dxa"/>
+              <w:bottom w:w="80" w:type="dxa"/>
+              <w:end w:w="120" w:type="dxa"/>
+            </w:tcMar>
+            <w:vAlign w:val="center"/>
+            <w:shd w:fill="FFFFFF"/>
+          </w:tcPr>
+          <w:p>
+            <w:pPr>
+              <w:spacing w:before="0" w:after="40" w:line="252" w:lineRule="auto"/>
+              <w:jc w:val="center"/>
+            </w:pPr>
+            <w:r>
+              <w:rPr>
+                <w:rFonts w:ascii="Calibri" w:hAnsi="Calibri"/>
+                <w:b w:val="0"/>
+                <w:color w:val="111827"/>
+                <w:sz w:val="17"/>
+              </w:rPr>
+              <w:t>Transparent length</w:t>
+            </w:r>
+          </w:p>
+        </w:tc>
+        <w:tc>
+          <w:tcPr>
+            <w:tcW w:type="dxa" w:w="4450"/>
+            <w:tcMar>
+              <w:top w:w="80" w:type="dxa"/>
+              <w:start w:w="120" w:type="dxa"/>
+              <w:bottom w:w="80" w:type="dxa"/>
+              <w:end w:w="120" w:type="dxa"/>
+            </w:tcMar>
+            <w:vAlign w:val="center"/>
+            <w:shd w:fill="FFFFFF"/>
+          </w:tcPr>
+          <w:p>
+            <w:pPr>
+              <w:spacing w:before="0" w:after="40" w:line="252" w:lineRule="auto"/>
+              <w:jc w:val="left"/>
+            </w:pPr>
+            <w:r>
+              <w:rPr>
+                <w:rFonts w:ascii="Calibri" w:hAnsi="Calibri"/>
+                <w:b w:val="0"/>
+                <w:color w:val="111827"/>
+                <w:sz w:val="17"/>
+              </w:rPr>
+              <w:t>Reject source and destination contracts with different payload lengths.</w:t>
+            </w:r>
+          </w:p>
+        </w:tc>
+        <w:tc>
+          <w:tcPr>
+            <w:tcW w:type="dxa" w:w="3260"/>
+            <w:tcMar>
+              <w:top w:w="80" w:type="dxa"/>
+              <w:start w:w="120" w:type="dxa"/>
+              <w:bottom w:w="80" w:type="dxa"/>
+              <w:end w:w="120" w:type="dxa"/>
+            </w:tcMar>
+            <w:vAlign w:val="center"/>
+            <w:shd w:fill="FFFFFF"/>
+          </w:tcPr>
+          <w:p>
+            <w:pPr>
+              <w:spacing w:before="0" w:after="40" w:line="252" w:lineRule="auto"/>
+              <w:jc w:val="left"/>
+            </w:pPr>
+            <w:r>
+              <w:rPr>
+                <w:rFonts w:ascii="Calibri" w:hAnsi="Calibri"/>
+                <w:b w:val="0"/>
+                <w:color w:val="111827"/>
+                <w:sz w:val="17"/>
+              </w:rPr>
+              <w:t>Service</w:t>
+            </w:r>
+          </w:p>
+        </w:tc>
+      </w:tr>
+      <w:tr>
+        <w:trPr>
+          <w:cantSplit/>
+        </w:trPr>
+        <w:tc>
+          <w:tcPr>
+            <w:tcW w:type="dxa" w:w="1650"/>
+            <w:tcMar>
+              <w:top w:w="80" w:type="dxa"/>
+              <w:start w:w="120" w:type="dxa"/>
+              <w:bottom w:w="80" w:type="dxa"/>
+              <w:end w:w="120" w:type="dxa"/>
+            </w:tcMar>
+            <w:vAlign w:val="center"/>
+            <w:shd w:fill="FFFFFF"/>
+          </w:tcPr>
+          <w:p>
+            <w:pPr>
+              <w:spacing w:before="0" w:after="40" w:line="252" w:lineRule="auto"/>
+              <w:jc w:val="center"/>
+            </w:pPr>
+            <w:r>
+              <w:rPr>
+                <w:rFonts w:ascii="Calibri" w:hAnsi="Calibri"/>
+                <w:b w:val="0"/>
+                <w:color w:val="111827"/>
+                <w:sz w:val="17"/>
+              </w:rPr>
+              <w:t>LIN timing</w:t>
+            </w:r>
+          </w:p>
+        </w:tc>
+        <w:tc>
+          <w:tcPr>
+            <w:tcW w:type="dxa" w:w="4450"/>
+            <w:tcMar>
+              <w:top w:w="80" w:type="dxa"/>
+              <w:start w:w="120" w:type="dxa"/>
+              <w:bottom w:w="80" w:type="dxa"/>
+              <w:end w:w="120" w:type="dxa"/>
+            </w:tcMar>
+            <w:vAlign w:val="center"/>
+            <w:shd w:fill="FFFFFF"/>
+          </w:tcPr>
+          <w:p>
+            <w:pPr>
+              <w:spacing w:before="0" w:after="40" w:line="252" w:lineRule="auto"/>
+              <w:jc w:val="left"/>
+            </w:pPr>
+            <w:r>
+              <w:rPr>
+                <w:rFonts w:ascii="Calibri" w:hAnsi="Calibri"/>
+                <w:b w:val="0"/>
+                <w:color w:val="111827"/>
+                <w:sz w:val="17"/>
+              </w:rPr>
+              <w:t>Verify 43 fixed bits plus ten bits per payload byte at channel bitrate.</w:t>
+            </w:r>
+          </w:p>
+        </w:tc>
+        <w:tc>
+          <w:tcPr>
+            <w:tcW w:type="dxa" w:w="3260"/>
+            <w:tcMar>
+              <w:top w:w="80" w:type="dxa"/>
+              <w:start w:w="120" w:type="dxa"/>
+              <w:bottom w:w="80" w:type="dxa"/>
+              <w:end w:w="120" w:type="dxa"/>
+            </w:tcMar>
+            <w:vAlign w:val="center"/>
+            <w:shd w:fill="FFFFFF"/>
+          </w:tcPr>
+          <w:p>
+            <w:pPr>
+              <w:spacing w:before="0" w:after="40" w:line="252" w:lineRule="auto"/>
+              <w:jc w:val="left"/>
+            </w:pPr>
+            <w:r>
+              <w:rPr>
+                <w:rFonts w:ascii="Calibri" w:hAnsi="Calibri"/>
+                <w:b w:val="0"/>
+                <w:color w:val="111827"/>
+                <w:sz w:val="17"/>
+              </w:rPr>
+              <w:t>Unit/service</w:t>
+            </w:r>
+          </w:p>
+        </w:tc>
+      </w:tr>
+      <w:tr>
+        <w:trPr>
+          <w:cantSplit/>
+        </w:trPr>
+        <w:tc>
+          <w:tcPr>
+            <w:tcW w:type="dxa" w:w="1650"/>
+            <w:tcMar>
+              <w:top w:w="80" w:type="dxa"/>
+              <w:start w:w="120" w:type="dxa"/>
+              <w:bottom w:w="80" w:type="dxa"/>
+              <w:end w:w="120" w:type="dxa"/>
+            </w:tcMar>
+            <w:vAlign w:val="center"/>
+            <w:shd w:fill="FFFFFF"/>
+          </w:tcPr>
+          <w:p>
+            <w:pPr>
+              <w:spacing w:before="0" w:after="40" w:line="252" w:lineRule="auto"/>
+              <w:jc w:val="center"/>
+            </w:pPr>
+            <w:r>
+              <w:rPr>
+                <w:rFonts w:ascii="Calibri" w:hAnsi="Calibri"/>
+                <w:b w:val="0"/>
+                <w:color w:val="111827"/>
+                <w:sz w:val="17"/>
+              </w:rPr>
+              <w:t>Ethernet timing</w:t>
+            </w:r>
+          </w:p>
+        </w:tc>
+        <w:tc>
+          <w:tcPr>
+            <w:tcW w:type="dxa" w:w="4450"/>
+            <w:tcMar>
+              <w:top w:w="80" w:type="dxa"/>
+              <w:start w:w="120" w:type="dxa"/>
+              <w:bottom w:w="80" w:type="dxa"/>
+              <w:end w:w="120" w:type="dxa"/>
+            </w:tcMar>
+            <w:vAlign w:val="center"/>
+            <w:shd w:fill="FFFFFF"/>
+          </w:tcPr>
+          <w:p>
+            <w:pPr>
+              <w:spacing w:before="0" w:after="40" w:line="252" w:lineRule="auto"/>
+              <w:jc w:val="left"/>
+            </w:pPr>
+            <w:r>
+              <w:rPr>
+                <w:rFonts w:ascii="Calibri" w:hAnsi="Calibri"/>
+                <w:b w:val="0"/>
+                <w:color w:val="111827"/>
+                <w:sz w:val="17"/>
+              </w:rPr>
+              <w:t>Verify preamble, header, FCS, and inter-frame gap duration with ceiling.</w:t>
+            </w:r>
+          </w:p>
+        </w:tc>
+        <w:tc>
+          <w:tcPr>
+            <w:tcW w:type="dxa" w:w="3260"/>
+            <w:tcMar>
+              <w:top w:w="80" w:type="dxa"/>
+              <w:start w:w="120" w:type="dxa"/>
+              <w:bottom w:w="80" w:type="dxa"/>
+              <w:end w:w="120" w:type="dxa"/>
+            </w:tcMar>
+            <w:vAlign w:val="center"/>
+            <w:shd w:fill="FFFFFF"/>
+          </w:tcPr>
+          <w:p>
+            <w:pPr>
+              <w:spacing w:before="0" w:after="40" w:line="252" w:lineRule="auto"/>
+              <w:jc w:val="left"/>
+            </w:pPr>
+            <w:r>
+              <w:rPr>
+                <w:rFonts w:ascii="Calibri" w:hAnsi="Calibri"/>
+                <w:b w:val="0"/>
+                <w:color w:val="111827"/>
+                <w:sz w:val="17"/>
+              </w:rPr>
+              <w:t>Unit/service</w:t>
+            </w:r>
+          </w:p>
+        </w:tc>
+      </w:tr>
+      <w:tr>
+        <w:trPr>
+          <w:cantSplit/>
+        </w:trPr>
+        <w:tc>
+          <w:tcPr>
+            <w:tcW w:type="dxa" w:w="1650"/>
+            <w:tcMar>
+              <w:top w:w="80" w:type="dxa"/>
+              <w:start w:w="120" w:type="dxa"/>
+              <w:bottom w:w="80" w:type="dxa"/>
+              <w:end w:w="120" w:type="dxa"/>
+            </w:tcMar>
+            <w:vAlign w:val="center"/>
+            <w:shd w:fill="FFFFFF"/>
+          </w:tcPr>
+          <w:p>
+            <w:pPr>
+              <w:spacing w:before="0" w:after="40" w:line="252" w:lineRule="auto"/>
+              <w:jc w:val="center"/>
+            </w:pPr>
+            <w:r>
+              <w:rPr>
+                <w:rFonts w:ascii="Calibri" w:hAnsi="Calibri"/>
+                <w:b w:val="0"/>
+                <w:color w:val="111827"/>
+                <w:sz w:val="17"/>
+              </w:rPr>
+              <w:t>Gateway sequence</w:t>
+            </w:r>
+          </w:p>
+        </w:tc>
+        <w:tc>
+          <w:tcPr>
+            <w:tcW w:type="dxa" w:w="4450"/>
+            <w:tcMar>
+              <w:top w:w="80" w:type="dxa"/>
+              <w:start w:w="120" w:type="dxa"/>
+              <w:bottom w:w="80" w:type="dxa"/>
+              <w:end w:w="120" w:type="dxa"/>
+            </w:tcMar>
+            <w:vAlign w:val="center"/>
+            <w:shd w:fill="FFFFFF"/>
+          </w:tcPr>
+          <w:p>
+            <w:pPr>
+              <w:spacing w:before="0" w:after="40" w:line="252" w:lineRule="auto"/>
+              <w:jc w:val="left"/>
+            </w:pPr>
+            <w:r>
+              <w:rPr>
+                <w:rFonts w:ascii="Calibri" w:hAnsi="Calibri"/>
+                <w:b w:val="0"/>
+                <w:color w:val="111827"/>
+                <w:sz w:val="17"/>
+              </w:rPr>
+              <w:t>Advance logical time, sequence, and version exactly once per route.</w:t>
+            </w:r>
+          </w:p>
+        </w:tc>
+        <w:tc>
+          <w:tcPr>
+            <w:tcW w:type="dxa" w:w="3260"/>
+            <w:tcMar>
+              <w:top w:w="80" w:type="dxa"/>
+              <w:start w:w="120" w:type="dxa"/>
+              <w:bottom w:w="80" w:type="dxa"/>
+              <w:end w:w="120" w:type="dxa"/>
+            </w:tcMar>
+            <w:vAlign w:val="center"/>
+            <w:shd w:fill="FFFFFF"/>
+          </w:tcPr>
+          <w:p>
+            <w:pPr>
+              <w:spacing w:before="0" w:after="40" w:line="252" w:lineRule="auto"/>
+              <w:jc w:val="left"/>
+            </w:pPr>
+            <w:r>
+              <w:rPr>
+                <w:rFonts w:ascii="Calibri" w:hAnsi="Calibri"/>
+                <w:b w:val="0"/>
+                <w:color w:val="111827"/>
+                <w:sz w:val="17"/>
+              </w:rPr>
+              <w:t>Service</w:t>
+            </w:r>
+          </w:p>
+        </w:tc>
+      </w:tr>
+      <w:tr>
+        <w:trPr>
+          <w:cantSplit/>
+        </w:trPr>
+        <w:tc>
+          <w:tcPr>
+            <w:tcW w:type="dxa" w:w="1650"/>
+            <w:tcMar>
+              <w:top w:w="80" w:type="dxa"/>
+              <w:start w:w="120" w:type="dxa"/>
+              <w:bottom w:w="80" w:type="dxa"/>
+              <w:end w:w="120" w:type="dxa"/>
+            </w:tcMar>
+            <w:vAlign w:val="center"/>
+            <w:shd w:fill="FFFFFF"/>
+          </w:tcPr>
+          <w:p>
+            <w:pPr>
+              <w:spacing w:before="0" w:after="40" w:line="252" w:lineRule="auto"/>
+              <w:jc w:val="center"/>
+            </w:pPr>
+            <w:r>
+              <w:rPr>
+                <w:rFonts w:ascii="Calibri" w:hAnsi="Calibri"/>
+                <w:b w:val="0"/>
+                <w:color w:val="111827"/>
+                <w:sz w:val="17"/>
+              </w:rPr>
+              <w:t>Gateway replay</w:t>
+            </w:r>
+          </w:p>
+        </w:tc>
+        <w:tc>
+          <w:tcPr>
+            <w:tcW w:type="dxa" w:w="4450"/>
+            <w:tcMar>
+              <w:top w:w="80" w:type="dxa"/>
+              <w:start w:w="120" w:type="dxa"/>
+              <w:bottom w:w="80" w:type="dxa"/>
+              <w:end w:w="120" w:type="dxa"/>
+            </w:tcMar>
+            <w:vAlign w:val="center"/>
+            <w:shd w:fill="FFFFFF"/>
+          </w:tcPr>
+          <w:p>
+            <w:pPr>
+              <w:spacing w:before="0" w:after="40" w:line="252" w:lineRule="auto"/>
+              <w:jc w:val="left"/>
+            </w:pPr>
+            <w:r>
+              <w:rPr>
+                <w:rFonts w:ascii="Calibri" w:hAnsi="Calibri"/>
+                <w:b w:val="0"/>
+                <w:color w:val="111827"/>
+                <w:sz w:val="17"/>
+              </w:rPr>
+              <w:t>Return exact persisted evidence without repeating routing state.</w:t>
+            </w:r>
+          </w:p>
+        </w:tc>
+        <w:tc>
+          <w:tcPr>
+            <w:tcW w:type="dxa" w:w="3260"/>
+            <w:tcMar>
+              <w:top w:w="80" w:type="dxa"/>
+              <w:start w:w="120" w:type="dxa"/>
+              <w:bottom w:w="80" w:type="dxa"/>
+              <w:end w:w="120" w:type="dxa"/>
+            </w:tcMar>
+            <w:vAlign w:val="center"/>
+            <w:shd w:fill="FFFFFF"/>
+          </w:tcPr>
+          <w:p>
+            <w:pPr>
+              <w:spacing w:before="0" w:after="40" w:line="252" w:lineRule="auto"/>
+              <w:jc w:val="left"/>
+            </w:pPr>
+            <w:r>
+              <w:rPr>
+                <w:rFonts w:ascii="Calibri" w:hAnsi="Calibri"/>
+                <w:b w:val="0"/>
+                <w:color w:val="111827"/>
+                <w:sz w:val="17"/>
+              </w:rPr>
+              <w:t>Service/API</w:t>
+            </w:r>
+          </w:p>
+        </w:tc>
+      </w:tr>
+      <w:tr>
+        <w:trPr>
+          <w:cantSplit/>
+        </w:trPr>
+        <w:tc>
+          <w:tcPr>
+            <w:tcW w:type="dxa" w:w="1650"/>
+            <w:tcMar>
+              <w:top w:w="80" w:type="dxa"/>
+              <w:start w:w="120" w:type="dxa"/>
+              <w:bottom w:w="80" w:type="dxa"/>
+              <w:end w:w="120" w:type="dxa"/>
+            </w:tcMar>
+            <w:vAlign w:val="center"/>
+            <w:shd w:fill="FFFFFF"/>
+          </w:tcPr>
+          <w:p>
+            <w:pPr>
+              <w:spacing w:before="0" w:after="40" w:line="252" w:lineRule="auto"/>
+              <w:jc w:val="center"/>
+            </w:pPr>
+            <w:r>
+              <w:rPr>
+                <w:rFonts w:ascii="Calibri" w:hAnsi="Calibri"/>
+                <w:b w:val="0"/>
+                <w:color w:val="111827"/>
+                <w:sz w:val="17"/>
+              </w:rPr>
+              <w:t>Gateway conflict</w:t>
+            </w:r>
+          </w:p>
+        </w:tc>
+        <w:tc>
+          <w:tcPr>
+            <w:tcW w:type="dxa" w:w="4450"/>
+            <w:tcMar>
+              <w:top w:w="80" w:type="dxa"/>
+              <w:start w:w="120" w:type="dxa"/>
+              <w:bottom w:w="80" w:type="dxa"/>
+              <w:end w:w="120" w:type="dxa"/>
+            </w:tcMar>
+            <w:vAlign w:val="center"/>
+            <w:shd w:fill="FFFFFF"/>
+          </w:tcPr>
+          <w:p>
+            <w:pPr>
+              <w:spacing w:before="0" w:after="40" w:line="252" w:lineRule="auto"/>
+              <w:jc w:val="left"/>
+            </w:pPr>
+            <w:r>
+              <w:rPr>
+                <w:rFonts w:ascii="Calibri" w:hAnsi="Calibri"/>
+                <w:b w:val="0"/>
+                <w:color w:val="111827"/>
+                <w:sz w:val="17"/>
+              </w:rPr>
+              <w:t>Reject changed command-ID reuse with a stable error.</w:t>
+            </w:r>
+          </w:p>
+        </w:tc>
+        <w:tc>
+          <w:tcPr>
+            <w:tcW w:type="dxa" w:w="3260"/>
+            <w:tcMar>
+              <w:top w:w="80" w:type="dxa"/>
+              <w:start w:w="120" w:type="dxa"/>
+              <w:bottom w:w="80" w:type="dxa"/>
+              <w:end w:w="120" w:type="dxa"/>
+            </w:tcMar>
+            <w:vAlign w:val="center"/>
+            <w:shd w:fill="FFFFFF"/>
+          </w:tcPr>
+          <w:p>
+            <w:pPr>
+              <w:spacing w:before="0" w:after="40" w:line="252" w:lineRule="auto"/>
+              <w:jc w:val="left"/>
+            </w:pPr>
+            <w:r>
+              <w:rPr>
+                <w:rFonts w:ascii="Calibri" w:hAnsi="Calibri"/>
+                <w:b w:val="0"/>
+                <w:color w:val="111827"/>
+                <w:sz w:val="17"/>
+              </w:rPr>
+              <w:t>Service/API</w:t>
+            </w:r>
+          </w:p>
+        </w:tc>
+      </w:tr>
+      <w:tr>
+        <w:trPr>
+          <w:cantSplit/>
+        </w:trPr>
+        <w:tc>
+          <w:tcPr>
+            <w:tcW w:type="dxa" w:w="1650"/>
+            <w:tcMar>
+              <w:top w:w="80" w:type="dxa"/>
+              <w:start w:w="120" w:type="dxa"/>
+              <w:bottom w:w="80" w:type="dxa"/>
+              <w:end w:w="120" w:type="dxa"/>
+            </w:tcMar>
+            <w:vAlign w:val="center"/>
+            <w:shd w:fill="FFFFFF"/>
+          </w:tcPr>
+          <w:p>
+            <w:pPr>
+              <w:spacing w:before="0" w:after="40" w:line="252" w:lineRule="auto"/>
+              <w:jc w:val="center"/>
+            </w:pPr>
+            <w:r>
+              <w:rPr>
+                <w:rFonts w:ascii="Calibri" w:hAnsi="Calibri"/>
+                <w:b w:val="0"/>
+                <w:color w:val="111827"/>
+                <w:sz w:val="17"/>
+              </w:rPr>
+              <w:t>Gateway RBAC</w:t>
+            </w:r>
+          </w:p>
+        </w:tc>
+        <w:tc>
+          <w:tcPr>
+            <w:tcW w:type="dxa" w:w="4450"/>
+            <w:tcMar>
+              <w:top w:w="80" w:type="dxa"/>
+              <w:start w:w="120" w:type="dxa"/>
+              <w:bottom w:w="80" w:type="dxa"/>
+              <w:end w:w="120" w:type="dxa"/>
+            </w:tcMar>
+            <w:vAlign w:val="center"/>
+            <w:shd w:fill="FFFFFF"/>
+          </w:tcPr>
+          <w:p>
+            <w:pPr>
+              <w:spacing w:before="0" w:after="40" w:line="252" w:lineRule="auto"/>
+              <w:jc w:val="left"/>
+            </w:pPr>
+            <w:r>
+              <w:rPr>
+                <w:rFonts w:ascii="Calibri" w:hAnsi="Calibri"/>
+                <w:b w:val="0"/>
+                <w:color w:val="111827"/>
+                <w:sz w:val="17"/>
+              </w:rPr>
+              <w:t>Require manage for configuration/routing and read for evidence.</w:t>
+            </w:r>
+          </w:p>
+        </w:tc>
+        <w:tc>
+          <w:tcPr>
+            <w:tcW w:type="dxa" w:w="3260"/>
+            <w:tcMar>
+              <w:top w:w="80" w:type="dxa"/>
+              <w:start w:w="120" w:type="dxa"/>
+              <w:bottom w:w="80" w:type="dxa"/>
+              <w:end w:w="120" w:type="dxa"/>
+            </w:tcMar>
+            <w:vAlign w:val="center"/>
+            <w:shd w:fill="FFFFFF"/>
+          </w:tcPr>
+          <w:p>
+            <w:pPr>
+              <w:spacing w:before="0" w:after="40" w:line="252" w:lineRule="auto"/>
+              <w:jc w:val="left"/>
+            </w:pPr>
+            <w:r>
+              <w:rPr>
+                <w:rFonts w:ascii="Calibri" w:hAnsi="Calibri"/>
+                <w:b w:val="0"/>
+                <w:color w:val="111827"/>
+                <w:sz w:val="17"/>
+              </w:rPr>
+              <w:t>API/integration</w:t>
+            </w:r>
+          </w:p>
+        </w:tc>
+      </w:tr>
+      <w:tr>
+        <w:trPr>
+          <w:cantSplit/>
+        </w:trPr>
+        <w:tc>
+          <w:tcPr>
+            <w:tcW w:type="dxa" w:w="1650"/>
+            <w:tcMar>
+              <w:top w:w="80" w:type="dxa"/>
+              <w:start w:w="120" w:type="dxa"/>
+              <w:bottom w:w="80" w:type="dxa"/>
+              <w:end w:w="120" w:type="dxa"/>
+            </w:tcMar>
+            <w:vAlign w:val="center"/>
+            <w:shd w:fill="FFFFFF"/>
+          </w:tcPr>
+          <w:p>
+            <w:pPr>
+              <w:spacing w:before="0" w:after="40" w:line="252" w:lineRule="auto"/>
+              <w:jc w:val="center"/>
+            </w:pPr>
+            <w:r>
+              <w:rPr>
+                <w:rFonts w:ascii="Calibri" w:hAnsi="Calibri"/>
+                <w:b w:val="0"/>
+                <w:color w:val="111827"/>
+                <w:sz w:val="17"/>
+              </w:rPr>
+              <w:t>Gateway minimization</w:t>
+            </w:r>
+          </w:p>
+        </w:tc>
+        <w:tc>
+          <w:tcPr>
+            <w:tcW w:type="dxa" w:w="4450"/>
+            <w:tcMar>
+              <w:top w:w="80" w:type="dxa"/>
+              <w:start w:w="120" w:type="dxa"/>
+              <w:bottom w:w="80" w:type="dxa"/>
+              <w:end w:w="120" w:type="dxa"/>
+            </w:tcMar>
+            <w:vAlign w:val="center"/>
+            <w:shd w:fill="FFFFFF"/>
+          </w:tcPr>
+          <w:p>
+            <w:pPr>
+              <w:spacing w:before="0" w:after="40" w:line="252" w:lineRule="auto"/>
+              <w:jc w:val="left"/>
+            </w:pPr>
+            <w:r>
+              <w:rPr>
+                <w:rFonts w:ascii="Calibri" w:hAnsi="Calibri"/>
+                <w:b w:val="0"/>
+                <w:color w:val="111827"/>
+                <w:sz w:val="17"/>
+              </w:rPr>
+              <w:t>Exclude routed payload and full configuration from audit/outbox.</w:t>
+            </w:r>
+          </w:p>
+        </w:tc>
+        <w:tc>
+          <w:tcPr>
+            <w:tcW w:type="dxa" w:w="3260"/>
+            <w:tcMar>
+              <w:top w:w="80" w:type="dxa"/>
+              <w:start w:w="120" w:type="dxa"/>
+              <w:bottom w:w="80" w:type="dxa"/>
+              <w:end w:w="120" w:type="dxa"/>
+            </w:tcMar>
+            <w:vAlign w:val="center"/>
+            <w:shd w:fill="FFFFFF"/>
+          </w:tcPr>
+          <w:p>
+            <w:pPr>
+              <w:spacing w:before="0" w:after="40" w:line="252" w:lineRule="auto"/>
+              <w:jc w:val="left"/>
+            </w:pPr>
+            <w:r>
+              <w:rPr>
+                <w:rFonts w:ascii="Calibri" w:hAnsi="Calibri"/>
+                <w:b w:val="0"/>
+                <w:color w:val="111827"/>
+                <w:sz w:val="17"/>
+              </w:rPr>
+              <w:t>Service</w:t>
+            </w:r>
+          </w:p>
+        </w:tc>
+      </w:tr>
+      <w:tr>
+        <w:trPr>
+          <w:cantSplit/>
+        </w:trPr>
+        <w:tc>
+          <w:tcPr>
+            <w:tcW w:type="dxa" w:w="1650"/>
+            <w:tcMar>
+              <w:top w:w="80" w:type="dxa"/>
+              <w:start w:w="120" w:type="dxa"/>
+              <w:bottom w:w="80" w:type="dxa"/>
+              <w:end w:w="120" w:type="dxa"/>
+            </w:tcMar>
+            <w:vAlign w:val="center"/>
+            <w:shd w:fill="FFFFFF"/>
+          </w:tcPr>
+          <w:p>
+            <w:pPr>
+              <w:spacing w:before="0" w:after="40" w:line="252" w:lineRule="auto"/>
+              <w:jc w:val="center"/>
+            </w:pPr>
+            <w:r>
+              <w:rPr>
+                <w:rFonts w:ascii="Calibri" w:hAnsi="Calibri"/>
+                <w:b w:val="0"/>
+                <w:color w:val="111827"/>
+                <w:sz w:val="17"/>
+              </w:rPr>
+              <w:t>Multi-bus migration</w:t>
+            </w:r>
+          </w:p>
+        </w:tc>
+        <w:tc>
+          <w:tcPr>
+            <w:tcW w:type="dxa" w:w="4450"/>
+            <w:tcMar>
+              <w:top w:w="80" w:type="dxa"/>
+              <w:start w:w="120" w:type="dxa"/>
+              <w:bottom w:w="80" w:type="dxa"/>
+              <w:end w:w="120" w:type="dxa"/>
+            </w:tcMar>
+            <w:vAlign w:val="center"/>
+            <w:shd w:fill="FFFFFF"/>
+          </w:tcPr>
+          <w:p>
+            <w:pPr>
+              <w:spacing w:before="0" w:after="40" w:line="252" w:lineRule="auto"/>
+              <w:jc w:val="left"/>
+            </w:pPr>
+            <w:r>
+              <w:rPr>
+                <w:rFonts w:ascii="Calibri" w:hAnsi="Calibri"/>
+                <w:b w:val="0"/>
+                <w:color w:val="111827"/>
+                <w:sz w:val="17"/>
+              </w:rPr>
+              <w:t>Upgrade and downgrade contracts and execution evidence.</w:t>
+            </w:r>
+          </w:p>
+        </w:tc>
+        <w:tc>
+          <w:tcPr>
+            <w:tcW w:type="dxa" w:w="3260"/>
+            <w:tcMar>
+              <w:top w:w="80" w:type="dxa"/>
+              <w:start w:w="120" w:type="dxa"/>
+              <w:bottom w:w="80" w:type="dxa"/>
+              <w:end w:w="120" w:type="dxa"/>
+            </w:tcMar>
+            <w:vAlign w:val="center"/>
+            <w:shd w:fill="FFFFFF"/>
+          </w:tcPr>
+          <w:p>
+            <w:pPr>
+              <w:spacing w:before="0" w:after="40" w:line="252" w:lineRule="auto"/>
+              <w:jc w:val="left"/>
+            </w:pPr>
+            <w:r>
+              <w:rPr>
+                <w:rFonts w:ascii="Calibri" w:hAnsi="Calibri"/>
+                <w:b w:val="0"/>
+                <w:color w:val="111827"/>
+                <w:sz w:val="17"/>
+              </w:rPr>
+              <w:t>Integration</w:t>
+            </w:r>
+          </w:p>
+        </w:tc>
+      </w:tr>
     </w:tbl>
     <w:p>
       <w:pPr>
@@ -11381,7 +13234,7 @@
           <w:color w:val="1F4D78"/>
           <w:sz w:val="19"/>
         </w:rPr>
-        <w:t>0028_can_faults</w:t>
+        <w:t>0029_multibus_gateway</w:t>
       </w:r>
       <w:r>
         <w:rPr>
@@ -11569,6 +13422,55 @@
           <w:color w:val="111827"/>
           <w:sz w:val="22"/>
         </w:rPr>
+        <w:t xml:space="preserve">Multi-bus events are </w:t>
+      </w:r>
+      <w:r>
+        <w:rPr>
+          <w:rFonts w:ascii="Consolas" w:hAnsi="Consolas"/>
+          <w:color w:val="1F4D78"/>
+          <w:sz w:val="19"/>
+        </w:rPr>
+        <w:t>atep.vehicle.multibus.configured.v1</w:t>
+      </w:r>
+      <w:r>
+        <w:rPr>
+          <w:rFonts w:ascii="Calibri" w:hAnsi="Calibri"/>
+          <w:color w:val="111827"/>
+          <w:sz w:val="22"/>
+        </w:rPr>
+        <w:t xml:space="preserve"> and </w:t>
+      </w:r>
+      <w:r>
+        <w:rPr>
+          <w:rFonts w:ascii="Consolas" w:hAnsi="Consolas"/>
+          <w:color w:val="1F4D78"/>
+          <w:sz w:val="19"/>
+        </w:rPr>
+        <w:t>atep.vehicle.gateway.routed.v1</w:t>
+      </w:r>
+      <w:r>
+        <w:rPr>
+          <w:rFonts w:ascii="Calibri" w:hAnsi="Calibri"/>
+          <w:color w:val="111827"/>
+          <w:sz w:val="22"/>
+        </w:rPr>
+        <w:t>.</w:t>
+      </w:r>
+    </w:p>
+    <w:p>
+      <w:pPr>
+        <w:pStyle w:val="ListBullet"/>
+        <w:numPr>
+          <w:ilvl w:val="0"/>
+          <w:numId w:val="13"/>
+        </w:numPr>
+      </w:pPr>
+      <w:r>
+        <w:rPr>
+          <w:rFonts w:ascii="Calibri" w:hAnsi="Calibri"/>
+          <w:color w:val="111827"/>
+          <w:sz w:val="22"/>
+        </w:rPr>
         <w:t xml:space="preserve">Permissions are </w:t>
       </w:r>
       <w:r>
@@ -11618,7 +13520,7 @@
           <w:color w:val="111827"/>
           <w:sz w:val="22"/>
         </w:rPr>
-        <w:t>Automated tests cover validation, priority, classic and FD timing mathematics, mixed arbitration, readiness, delivery, utilization, versioning, replay, errors, DBC bit placement through 512 bits, signed scaling, exact conversion, TEC/REC thresholds, loss, bus-off enforcement, recovery timing, evidence minimization, persistence, and OpenAPI.</w:t>
+        <w:t>Automated tests cover validation, priority, classic and FD timing mathematics, mixed arbitration, readiness, delivery, utilization, versioning, replay, errors, DBC bit placement through 512 bits, signed scaling, exact conversion, TEC/REC thresholds, loss, bus-off enforcement, recovery timing, LIN/Ethernet bounds and timing, gateway routing, evidence minimization, persistence, and OpenAPI.</w:t>
       </w:r>
     </w:p>
     <w:p>
@@ -11836,6 +13738,40 @@
     </w:p>
     <w:p>
       <w:pPr>
+        <w:pStyle w:val="ListBullet"/>
+        <w:numPr>
+          <w:ilvl w:val="0"/>
+          <w:numId w:val="14"/>
+        </w:numPr>
+      </w:pPr>
+      <w:r>
+        <w:rPr>
+          <w:rFonts w:ascii="Calibri" w:hAnsi="Calibri"/>
+          <w:color w:val="111827"/>
+          <w:sz w:val="22"/>
+        </w:rPr>
+        <w:t>LIN and Ethernet timing are transparent deterministic models, not physical transceiver simulations.</w:t>
+      </w:r>
+    </w:p>
+    <w:p>
+      <w:pPr>
+        <w:pStyle w:val="ListBullet"/>
+        <w:numPr>
+          <w:ilvl w:val="0"/>
+          <w:numId w:val="14"/>
+        </w:numPr>
+      </w:pPr>
+      <w:r>
+        <w:rPr>
+          <w:rFonts w:ascii="Calibri" w:hAnsi="Calibri"/>
+          <w:color w:val="111827"/>
+          <w:sz w:val="22"/>
+        </w:rPr>
+        <w:t>Gateway payload transformation, SOME/IP, DoIP, VLAN scheduling, and traffic shaping remain deferred.</w:t>
+      </w:r>
+    </w:p>
+    <w:p>
+      <w:pPr>
         <w:pStyle w:val="Heading1"/>
         <w:keepNext/>
         <w:keepLines/>
@@ -11851,7 +13787,7 @@
           <w:color w:val="111827"/>
           <w:sz w:val="22"/>
         </w:rPr>
-        <w:t xml:space="preserve">The recommended next increment is IV-6: LIN and automotive Ethernet adapters plus deterministic gateway routing. See </w:t>
+        <w:t xml:space="preserve">The recommended next increment is IV-7: multi-bus campaigns, traces, performance evidence, and integrated failure scenarios. See </w:t>
       </w:r>
       <w:r>
         <w:rPr>
@@ -12563,7 +14499,7 @@
         <w:color w:val="667085"/>
         <w:sz w:val="17"/>
       </w:rPr>
-      <w:t>ATEP Volume IV Workbook  |  Version 0.5.0</w:t>
+      <w:t>ATEP Volume IV Workbook  |  Version 0.6.0</w:t>
     </w:r>
     <w:r>
       <w:rPr>

</xml_diff>

<commit_message>
feat(can): add deterministic multibus gateway (#62)
</commit_message>
<xml_diff>
--- a/docs/ATEP_Volume_IV_CAN_Network_Engineering_Workbook.docx
+++ b/docs/ATEP_Volume_IV_CAN_Network_Engineering_Workbook.docx
@@ -143,7 +143,7 @@
                 <w:color w:val="0B2545"/>
                 <w:sz w:val="19"/>
               </w:rPr>
-              <w:t>0.5.0</w:t>
+              <w:t>0.6.0</w:t>
             </w:r>
           </w:p>
         </w:tc>
@@ -265,7 +265,7 @@
                 <w:color w:val="111827"/>
                 <w:sz w:val="19"/>
               </w:rPr>
-              <w:t>Implemented increments: IV-1 to IV-5</w:t>
+              <w:t>Implemented increments: IV-1 to IV-6</w:t>
             </w:r>
           </w:p>
         </w:tc>
@@ -893,7 +893,7 @@
                 <w:color w:val="111827"/>
                 <w:sz w:val="17"/>
               </w:rPr>
-              <w:t>Increments IV-1 through IV-5</w:t>
+              <w:t>Increments IV-1 through IV-6</w:t>
             </w:r>
           </w:p>
         </w:tc>
@@ -1653,6 +1653,95 @@
           </w:p>
         </w:tc>
       </w:tr>
+      <w:tr>
+        <w:trPr>
+          <w:cantSplit/>
+        </w:trPr>
+        <w:tc>
+          <w:tcPr>
+            <w:tcW w:type="dxa" w:w="1650"/>
+            <w:tcMar>
+              <w:top w:w="80" w:type="dxa"/>
+              <w:start w:w="120" w:type="dxa"/>
+              <w:bottom w:w="80" w:type="dxa"/>
+              <w:end w:w="120" w:type="dxa"/>
+            </w:tcMar>
+            <w:vAlign w:val="center"/>
+            <w:shd w:fill="FFFFFF"/>
+          </w:tcPr>
+          <w:p>
+            <w:pPr>
+              <w:spacing w:before="0" w:after="40" w:line="252" w:lineRule="auto"/>
+              <w:jc w:val="center"/>
+            </w:pPr>
+            <w:r>
+              <w:rPr>
+                <w:rFonts w:ascii="Calibri" w:hAnsi="Calibri"/>
+                <w:b w:val="0"/>
+                <w:color w:val="111827"/>
+                <w:sz w:val="17"/>
+              </w:rPr>
+              <w:t>0.6.0</w:t>
+            </w:r>
+          </w:p>
+        </w:tc>
+        <w:tc>
+          <w:tcPr>
+            <w:tcW w:type="dxa" w:w="4450"/>
+            <w:tcMar>
+              <w:top w:w="80" w:type="dxa"/>
+              <w:start w:w="120" w:type="dxa"/>
+              <w:bottom w:w="80" w:type="dxa"/>
+              <w:end w:w="120" w:type="dxa"/>
+            </w:tcMar>
+            <w:vAlign w:val="center"/>
+            <w:shd w:fill="FFFFFF"/>
+          </w:tcPr>
+          <w:p>
+            <w:pPr>
+              <w:spacing w:before="0" w:after="40" w:line="252" w:lineRule="auto"/>
+              <w:jc w:val="left"/>
+            </w:pPr>
+            <w:r>
+              <w:rPr>
+                <w:rFonts w:ascii="Calibri" w:hAnsi="Calibri"/>
+                <w:b w:val="0"/>
+                <w:color w:val="111827"/>
+                <w:sz w:val="17"/>
+              </w:rPr>
+              <w:t>2026-08-25</w:t>
+            </w:r>
+          </w:p>
+        </w:tc>
+        <w:tc>
+          <w:tcPr>
+            <w:tcW w:type="dxa" w:w="3260"/>
+            <w:tcMar>
+              <w:top w:w="80" w:type="dxa"/>
+              <w:start w:w="120" w:type="dxa"/>
+              <w:bottom w:w="80" w:type="dxa"/>
+              <w:end w:w="120" w:type="dxa"/>
+            </w:tcMar>
+            <w:vAlign w:val="center"/>
+            <w:shd w:fill="FFFFFF"/>
+          </w:tcPr>
+          <w:p>
+            <w:pPr>
+              <w:spacing w:before="0" w:after="40" w:line="252" w:lineRule="auto"/>
+              <w:jc w:val="left"/>
+            </w:pPr>
+            <w:r>
+              <w:rPr>
+                <w:rFonts w:ascii="Calibri" w:hAnsi="Calibri"/>
+                <w:b w:val="0"/>
+                <w:color w:val="111827"/>
+                <w:sz w:val="17"/>
+              </w:rPr>
+              <w:t>Added bounded LIN and automotive Ethernet contracts, cross-protocol gateway routing, deterministic protocol timing, replay-safe evidence, APIs, migration, and tests.</w:t>
+            </w:r>
+          </w:p>
+        </w:tc>
+      </w:tr>
     </w:tbl>
     <w:p>
       <w:pPr>
@@ -2004,6 +2093,23 @@
     </w:p>
     <w:p>
       <w:pPr>
+        <w:pStyle w:val="ListBullet"/>
+        <w:numPr>
+          <w:ilvl w:val="0"/>
+          <w:numId w:val="11"/>
+        </w:numPr>
+      </w:pPr>
+      <w:r>
+        <w:rPr>
+          <w:rFonts w:ascii="Calibri" w:hAnsi="Calibri"/>
+          <w:color w:val="111827"/>
+          <w:sz w:val="22"/>
+        </w:rPr>
+        <w:t>Bounded LIN channels, automotive Ethernet segments, and transparent gateway routes.</w:t>
+      </w:r>
+    </w:p>
+    <w:p>
+      <w:pPr>
         <w:pStyle w:val="Heading2"/>
         <w:keepNext/>
         <w:keepLines/>
@@ -2093,7 +2199,7 @@
           <w:color w:val="111827"/>
           <w:sz w:val="22"/>
         </w:rPr>
-        <w:t>LIN, automotive Ethernet, physical transceivers, and SocketCAN adapters.</w:t>
+        <w:t>Physical transceivers, SocketCAN adapters, SOME/IP, DoIP, and payload transformation.</w:t>
       </w:r>
     </w:p>
     <w:p>
@@ -2270,6 +2376,32 @@
           <w:sz w:val="22"/>
         </w:rPr>
         <w:t xml:space="preserve"> stores canonical injection/recovery requests, before/after state, logical timing, versions, target, and actor for exact replay.</w:t>
+      </w:r>
+    </w:p>
+    <w:p>
+      <w:r>
+        <w:rPr>
+          <w:rFonts w:ascii="Calibri" w:hAnsi="Calibri"/>
+          <w:color w:val="111827"/>
+          <w:sz w:val="22"/>
+        </w:rPr>
+        <w:t xml:space="preserve">The aggregate also stores bounded LIN channels, Ethernet segments, and gateway route contracts. </w:t>
+      </w:r>
+      <w:r>
+        <w:rPr>
+          <w:rFonts w:ascii="Consolas" w:hAnsi="Consolas"/>
+          <w:color w:val="1F4D78"/>
+          <w:sz w:val="19"/>
+        </w:rPr>
+        <w:t>MultiBusGatewayExecution</w:t>
+      </w:r>
+      <w:r>
+        <w:rPr>
+          <w:rFonts w:ascii="Calibri" w:hAnsi="Calibri"/>
+          <w:color w:val="111827"/>
+          <w:sz w:val="22"/>
+        </w:rPr>
+        <w:t xml:space="preserve"> persists canonical configuration or route commands, deterministic timing, sequence, versions, and actor. Routed payloads remain in command evidence but are excluded from audit and outbox records.</w:t>
       </w:r>
     </w:p>
     <w:p>
@@ -4421,6 +4553,474 @@
           </w:p>
         </w:tc>
       </w:tr>
+      <w:tr>
+        <w:trPr>
+          <w:cantSplit/>
+        </w:trPr>
+        <w:tc>
+          <w:tcPr>
+            <w:tcW w:type="dxa" w:w="1150"/>
+            <w:tcMar>
+              <w:top w:w="80" w:type="dxa"/>
+              <w:start w:w="120" w:type="dxa"/>
+              <w:bottom w:w="80" w:type="dxa"/>
+              <w:end w:w="120" w:type="dxa"/>
+            </w:tcMar>
+            <w:vAlign w:val="center"/>
+            <w:shd w:fill="FFFFFF"/>
+          </w:tcPr>
+          <w:p>
+            <w:pPr>
+              <w:spacing w:before="0" w:after="40" w:line="252" w:lineRule="auto"/>
+              <w:jc w:val="center"/>
+            </w:pPr>
+            <w:r>
+              <w:rPr>
+                <w:rFonts w:ascii="Calibri" w:hAnsi="Calibri"/>
+                <w:b w:val="0"/>
+                <w:color w:val="111827"/>
+                <w:sz w:val="16"/>
+              </w:rPr>
+              <w:t>POST</w:t>
+            </w:r>
+          </w:p>
+        </w:tc>
+        <w:tc>
+          <w:tcPr>
+            <w:tcW w:type="dxa" w:w="3700"/>
+            <w:tcMar>
+              <w:top w:w="80" w:type="dxa"/>
+              <w:start w:w="120" w:type="dxa"/>
+              <w:bottom w:w="80" w:type="dxa"/>
+              <w:end w:w="120" w:type="dxa"/>
+            </w:tcMar>
+            <w:vAlign w:val="center"/>
+            <w:shd w:fill="FFFFFF"/>
+          </w:tcPr>
+          <w:p>
+            <w:pPr>
+              <w:spacing w:before="0" w:after="40" w:line="252" w:lineRule="auto"/>
+              <w:jc w:val="left"/>
+            </w:pPr>
+            <w:r>
+              <w:rPr>
+                <w:rFonts w:ascii="Calibri" w:hAnsi="Calibri"/>
+                <w:b w:val="0"/>
+                <w:color w:val="111827"/>
+                <w:sz w:val="16"/>
+              </w:rPr>
+              <w:t>/api/v1/vehicles/{vehicle_id}/can-networks/multibus/configure</w:t>
+            </w:r>
+          </w:p>
+        </w:tc>
+        <w:tc>
+          <w:tcPr>
+            <w:tcW w:type="dxa" w:w="3100"/>
+            <w:tcMar>
+              <w:top w:w="80" w:type="dxa"/>
+              <w:start w:w="120" w:type="dxa"/>
+              <w:bottom w:w="80" w:type="dxa"/>
+              <w:end w:w="120" w:type="dxa"/>
+            </w:tcMar>
+            <w:vAlign w:val="center"/>
+            <w:shd w:fill="FFFFFF"/>
+          </w:tcPr>
+          <w:p>
+            <w:pPr>
+              <w:spacing w:before="0" w:after="40" w:line="252" w:lineRule="auto"/>
+              <w:jc w:val="left"/>
+            </w:pPr>
+            <w:r>
+              <w:rPr>
+                <w:rFonts w:ascii="Calibri" w:hAnsi="Calibri"/>
+                <w:b w:val="0"/>
+                <w:color w:val="111827"/>
+                <w:sz w:val="16"/>
+              </w:rPr>
+              <w:t>can_networks:manage</w:t>
+            </w:r>
+          </w:p>
+        </w:tc>
+        <w:tc>
+          <w:tcPr>
+            <w:tcW w:type="dxa" w:w="1410"/>
+            <w:tcMar>
+              <w:top w:w="80" w:type="dxa"/>
+              <w:start w:w="120" w:type="dxa"/>
+              <w:bottom w:w="80" w:type="dxa"/>
+              <w:end w:w="120" w:type="dxa"/>
+            </w:tcMar>
+            <w:vAlign w:val="center"/>
+            <w:shd w:fill="FFFFFF"/>
+          </w:tcPr>
+          <w:p>
+            <w:pPr>
+              <w:spacing w:before="0" w:after="40" w:line="252" w:lineRule="auto"/>
+              <w:jc w:val="left"/>
+            </w:pPr>
+            <w:r>
+              <w:rPr>
+                <w:rFonts w:ascii="Calibri" w:hAnsi="Calibri"/>
+                <w:b w:val="0"/>
+                <w:color w:val="111827"/>
+                <w:sz w:val="16"/>
+              </w:rPr>
+              <w:t>Configure LIN, Ethernet, and routes.</w:t>
+            </w:r>
+          </w:p>
+        </w:tc>
+      </w:tr>
+      <w:tr>
+        <w:trPr>
+          <w:cantSplit/>
+        </w:trPr>
+        <w:tc>
+          <w:tcPr>
+            <w:tcW w:type="dxa" w:w="1150"/>
+            <w:tcMar>
+              <w:top w:w="80" w:type="dxa"/>
+              <w:start w:w="120" w:type="dxa"/>
+              <w:bottom w:w="80" w:type="dxa"/>
+              <w:end w:w="120" w:type="dxa"/>
+            </w:tcMar>
+            <w:vAlign w:val="center"/>
+            <w:shd w:fill="FFFFFF"/>
+          </w:tcPr>
+          <w:p>
+            <w:pPr>
+              <w:spacing w:before="0" w:after="40" w:line="252" w:lineRule="auto"/>
+              <w:jc w:val="center"/>
+            </w:pPr>
+            <w:r>
+              <w:rPr>
+                <w:rFonts w:ascii="Calibri" w:hAnsi="Calibri"/>
+                <w:b w:val="0"/>
+                <w:color w:val="111827"/>
+                <w:sz w:val="16"/>
+              </w:rPr>
+              <w:t>POST</w:t>
+            </w:r>
+          </w:p>
+        </w:tc>
+        <w:tc>
+          <w:tcPr>
+            <w:tcW w:type="dxa" w:w="3700"/>
+            <w:tcMar>
+              <w:top w:w="80" w:type="dxa"/>
+              <w:start w:w="120" w:type="dxa"/>
+              <w:bottom w:w="80" w:type="dxa"/>
+              <w:end w:w="120" w:type="dxa"/>
+            </w:tcMar>
+            <w:vAlign w:val="center"/>
+            <w:shd w:fill="FFFFFF"/>
+          </w:tcPr>
+          <w:p>
+            <w:pPr>
+              <w:spacing w:before="0" w:after="40" w:line="252" w:lineRule="auto"/>
+              <w:jc w:val="left"/>
+            </w:pPr>
+            <w:r>
+              <w:rPr>
+                <w:rFonts w:ascii="Calibri" w:hAnsi="Calibri"/>
+                <w:b w:val="0"/>
+                <w:color w:val="111827"/>
+                <w:sz w:val="16"/>
+              </w:rPr>
+              <w:t>/api/v1/vehicles/{vehicle_id}/can-networks/gateway/routes/execute</w:t>
+            </w:r>
+          </w:p>
+        </w:tc>
+        <w:tc>
+          <w:tcPr>
+            <w:tcW w:type="dxa" w:w="3100"/>
+            <w:tcMar>
+              <w:top w:w="80" w:type="dxa"/>
+              <w:start w:w="120" w:type="dxa"/>
+              <w:bottom w:w="80" w:type="dxa"/>
+              <w:end w:w="120" w:type="dxa"/>
+            </w:tcMar>
+            <w:vAlign w:val="center"/>
+            <w:shd w:fill="FFFFFF"/>
+          </w:tcPr>
+          <w:p>
+            <w:pPr>
+              <w:spacing w:before="0" w:after="40" w:line="252" w:lineRule="auto"/>
+              <w:jc w:val="left"/>
+            </w:pPr>
+            <w:r>
+              <w:rPr>
+                <w:rFonts w:ascii="Calibri" w:hAnsi="Calibri"/>
+                <w:b w:val="0"/>
+                <w:color w:val="111827"/>
+                <w:sz w:val="16"/>
+              </w:rPr>
+              <w:t>can_networks:manage</w:t>
+            </w:r>
+          </w:p>
+        </w:tc>
+        <w:tc>
+          <w:tcPr>
+            <w:tcW w:type="dxa" w:w="1410"/>
+            <w:tcMar>
+              <w:top w:w="80" w:type="dxa"/>
+              <w:start w:w="120" w:type="dxa"/>
+              <w:bottom w:w="80" w:type="dxa"/>
+              <w:end w:w="120" w:type="dxa"/>
+            </w:tcMar>
+            <w:vAlign w:val="center"/>
+            <w:shd w:fill="FFFFFF"/>
+          </w:tcPr>
+          <w:p>
+            <w:pPr>
+              <w:spacing w:before="0" w:after="40" w:line="252" w:lineRule="auto"/>
+              <w:jc w:val="left"/>
+            </w:pPr>
+            <w:r>
+              <w:rPr>
+                <w:rFonts w:ascii="Calibri" w:hAnsi="Calibri"/>
+                <w:b w:val="0"/>
+                <w:color w:val="111827"/>
+                <w:sz w:val="16"/>
+              </w:rPr>
+              <w:t>Execute a transparent route.</w:t>
+            </w:r>
+          </w:p>
+        </w:tc>
+      </w:tr>
+      <w:tr>
+        <w:trPr>
+          <w:cantSplit/>
+        </w:trPr>
+        <w:tc>
+          <w:tcPr>
+            <w:tcW w:type="dxa" w:w="1150"/>
+            <w:tcMar>
+              <w:top w:w="80" w:type="dxa"/>
+              <w:start w:w="120" w:type="dxa"/>
+              <w:bottom w:w="80" w:type="dxa"/>
+              <w:end w:w="120" w:type="dxa"/>
+            </w:tcMar>
+            <w:vAlign w:val="center"/>
+            <w:shd w:fill="FFFFFF"/>
+          </w:tcPr>
+          <w:p>
+            <w:pPr>
+              <w:spacing w:before="0" w:after="40" w:line="252" w:lineRule="auto"/>
+              <w:jc w:val="center"/>
+            </w:pPr>
+            <w:r>
+              <w:rPr>
+                <w:rFonts w:ascii="Calibri" w:hAnsi="Calibri"/>
+                <w:b w:val="0"/>
+                <w:color w:val="111827"/>
+                <w:sz w:val="16"/>
+              </w:rPr>
+              <w:t>GET</w:t>
+            </w:r>
+          </w:p>
+        </w:tc>
+        <w:tc>
+          <w:tcPr>
+            <w:tcW w:type="dxa" w:w="3700"/>
+            <w:tcMar>
+              <w:top w:w="80" w:type="dxa"/>
+              <w:start w:w="120" w:type="dxa"/>
+              <w:bottom w:w="80" w:type="dxa"/>
+              <w:end w:w="120" w:type="dxa"/>
+            </w:tcMar>
+            <w:vAlign w:val="center"/>
+            <w:shd w:fill="FFFFFF"/>
+          </w:tcPr>
+          <w:p>
+            <w:pPr>
+              <w:spacing w:before="0" w:after="40" w:line="252" w:lineRule="auto"/>
+              <w:jc w:val="left"/>
+            </w:pPr>
+            <w:r>
+              <w:rPr>
+                <w:rFonts w:ascii="Calibri" w:hAnsi="Calibri"/>
+                <w:b w:val="0"/>
+                <w:color w:val="111827"/>
+                <w:sz w:val="16"/>
+              </w:rPr>
+              <w:t>/api/v1/vehicles/{vehicle_id}/can-networks/gateway/executions</w:t>
+            </w:r>
+          </w:p>
+        </w:tc>
+        <w:tc>
+          <w:tcPr>
+            <w:tcW w:type="dxa" w:w="3100"/>
+            <w:tcMar>
+              <w:top w:w="80" w:type="dxa"/>
+              <w:start w:w="120" w:type="dxa"/>
+              <w:bottom w:w="80" w:type="dxa"/>
+              <w:end w:w="120" w:type="dxa"/>
+            </w:tcMar>
+            <w:vAlign w:val="center"/>
+            <w:shd w:fill="FFFFFF"/>
+          </w:tcPr>
+          <w:p>
+            <w:pPr>
+              <w:spacing w:before="0" w:after="40" w:line="252" w:lineRule="auto"/>
+              <w:jc w:val="left"/>
+            </w:pPr>
+            <w:r>
+              <w:rPr>
+                <w:rFonts w:ascii="Calibri" w:hAnsi="Calibri"/>
+                <w:b w:val="0"/>
+                <w:color w:val="111827"/>
+                <w:sz w:val="16"/>
+              </w:rPr>
+              <w:t>can_networks:read</w:t>
+            </w:r>
+          </w:p>
+        </w:tc>
+        <w:tc>
+          <w:tcPr>
+            <w:tcW w:type="dxa" w:w="1410"/>
+            <w:tcMar>
+              <w:top w:w="80" w:type="dxa"/>
+              <w:start w:w="120" w:type="dxa"/>
+              <w:bottom w:w="80" w:type="dxa"/>
+              <w:end w:w="120" w:type="dxa"/>
+            </w:tcMar>
+            <w:vAlign w:val="center"/>
+            <w:shd w:fill="FFFFFF"/>
+          </w:tcPr>
+          <w:p>
+            <w:pPr>
+              <w:spacing w:before="0" w:after="40" w:line="252" w:lineRule="auto"/>
+              <w:jc w:val="left"/>
+            </w:pPr>
+            <w:r>
+              <w:rPr>
+                <w:rFonts w:ascii="Calibri" w:hAnsi="Calibri"/>
+                <w:b w:val="0"/>
+                <w:color w:val="111827"/>
+                <w:sz w:val="16"/>
+              </w:rPr>
+              <w:t>List multi-bus evidence.</w:t>
+            </w:r>
+          </w:p>
+        </w:tc>
+      </w:tr>
+      <w:tr>
+        <w:trPr>
+          <w:cantSplit/>
+        </w:trPr>
+        <w:tc>
+          <w:tcPr>
+            <w:tcW w:type="dxa" w:w="1150"/>
+            <w:tcMar>
+              <w:top w:w="80" w:type="dxa"/>
+              <w:start w:w="120" w:type="dxa"/>
+              <w:bottom w:w="80" w:type="dxa"/>
+              <w:end w:w="120" w:type="dxa"/>
+            </w:tcMar>
+            <w:vAlign w:val="center"/>
+            <w:shd w:fill="FFFFFF"/>
+          </w:tcPr>
+          <w:p>
+            <w:pPr>
+              <w:spacing w:before="0" w:after="40" w:line="252" w:lineRule="auto"/>
+              <w:jc w:val="center"/>
+            </w:pPr>
+            <w:r>
+              <w:rPr>
+                <w:rFonts w:ascii="Calibri" w:hAnsi="Calibri"/>
+                <w:b w:val="0"/>
+                <w:color w:val="111827"/>
+                <w:sz w:val="16"/>
+              </w:rPr>
+              <w:t>GET</w:t>
+            </w:r>
+          </w:p>
+        </w:tc>
+        <w:tc>
+          <w:tcPr>
+            <w:tcW w:type="dxa" w:w="3700"/>
+            <w:tcMar>
+              <w:top w:w="80" w:type="dxa"/>
+              <w:start w:w="120" w:type="dxa"/>
+              <w:bottom w:w="80" w:type="dxa"/>
+              <w:end w:w="120" w:type="dxa"/>
+            </w:tcMar>
+            <w:vAlign w:val="center"/>
+            <w:shd w:fill="FFFFFF"/>
+          </w:tcPr>
+          <w:p>
+            <w:pPr>
+              <w:spacing w:before="0" w:after="40" w:line="252" w:lineRule="auto"/>
+              <w:jc w:val="left"/>
+            </w:pPr>
+            <w:r>
+              <w:rPr>
+                <w:rFonts w:ascii="Calibri" w:hAnsi="Calibri"/>
+                <w:b w:val="0"/>
+                <w:color w:val="111827"/>
+                <w:sz w:val="16"/>
+              </w:rPr>
+              <w:t>/api/v1/vehicles/{vehicle_id}/can-networks/gateway/executions/{command_id}</w:t>
+            </w:r>
+          </w:p>
+        </w:tc>
+        <w:tc>
+          <w:tcPr>
+            <w:tcW w:type="dxa" w:w="3100"/>
+            <w:tcMar>
+              <w:top w:w="80" w:type="dxa"/>
+              <w:start w:w="120" w:type="dxa"/>
+              <w:bottom w:w="80" w:type="dxa"/>
+              <w:end w:w="120" w:type="dxa"/>
+            </w:tcMar>
+            <w:vAlign w:val="center"/>
+            <w:shd w:fill="FFFFFF"/>
+          </w:tcPr>
+          <w:p>
+            <w:pPr>
+              <w:spacing w:before="0" w:after="40" w:line="252" w:lineRule="auto"/>
+              <w:jc w:val="left"/>
+            </w:pPr>
+            <w:r>
+              <w:rPr>
+                <w:rFonts w:ascii="Calibri" w:hAnsi="Calibri"/>
+                <w:b w:val="0"/>
+                <w:color w:val="111827"/>
+                <w:sz w:val="16"/>
+              </w:rPr>
+              <w:t>can_networks:read</w:t>
+            </w:r>
+          </w:p>
+        </w:tc>
+        <w:tc>
+          <w:tcPr>
+            <w:tcW w:type="dxa" w:w="1410"/>
+            <w:tcMar>
+              <w:top w:w="80" w:type="dxa"/>
+              <w:start w:w="120" w:type="dxa"/>
+              <w:bottom w:w="80" w:type="dxa"/>
+              <w:end w:w="120" w:type="dxa"/>
+            </w:tcMar>
+            <w:vAlign w:val="center"/>
+            <w:shd w:fill="FFFFFF"/>
+          </w:tcPr>
+          <w:p>
+            <w:pPr>
+              <w:spacing w:before="0" w:after="40" w:line="252" w:lineRule="auto"/>
+              <w:jc w:val="left"/>
+            </w:pPr>
+            <w:r>
+              <w:rPr>
+                <w:rFonts w:ascii="Calibri" w:hAnsi="Calibri"/>
+                <w:b w:val="0"/>
+                <w:color w:val="111827"/>
+                <w:sz w:val="16"/>
+              </w:rPr>
+              <w:t>Retrieve multi-bus evidence.</w:t>
+            </w:r>
+          </w:p>
+        </w:tc>
+      </w:tr>
     </w:tbl>
     <w:p>
       <w:pPr>
@@ -4751,6 +5351,62 @@
     </w:p>
     <w:p>
       <w:pPr>
+        <w:pStyle w:val="Heading2"/>
+        <w:keepNext/>
+        <w:keepLines/>
+      </w:pPr>
+      <w:r>
+        <w:t>8.5 LIN, Ethernet, and Gateway Semantics</w:t>
+      </w:r>
+    </w:p>
+    <w:p>
+      <w:r>
+        <w:rPr>
+          <w:rFonts w:ascii="Calibri" w:hAnsi="Calibri"/>
+          <w:color w:val="111827"/>
+          <w:sz w:val="22"/>
+        </w:rPr>
+        <w:t>LIN channels use 1-20 kbit/s, six-bit identifiers, one publisher, bounded subscribers, one to eight payload bytes, and explicit classic or enhanced checksum semantics. Destination duration uses a transparent model of 43 header/checksum bits plus ten transmitted bits per payload byte.</w:t>
+      </w:r>
+    </w:p>
+    <w:p>
+      <w:r>
+        <w:rPr>
+          <w:rFonts w:ascii="Calibri" w:hAnsi="Calibri"/>
+          <w:color w:val="111827"/>
+          <w:sz w:val="22"/>
+        </w:rPr>
+        <w:t xml:space="preserve">Automotive Ethernet segments operate at 100 or 1000 Mbit/s. Messages define EtherType, source, destinations, optional VLAN, and one to 1500 payload bytes. Timing includes preamble, Ethernet header, payload, frame check sequence, and inter-frame gap: </w:t>
+      </w:r>
+      <w:r>
+        <w:rPr>
+          <w:rFonts w:ascii="Consolas" w:hAnsi="Consolas"/>
+          <w:color w:val="1F4D78"/>
+          <w:sz w:val="19"/>
+        </w:rPr>
+        <w:t>(38 + payload_length) * 8</w:t>
+      </w:r>
+      <w:r>
+        <w:rPr>
+          <w:rFonts w:ascii="Calibri" w:hAnsi="Calibri"/>
+          <w:color w:val="111827"/>
+          <w:sz w:val="22"/>
+        </w:rPr>
+        <w:t xml:space="preserve"> bits.</w:t>
+      </w:r>
+    </w:p>
+    <w:p>
+      <w:r>
+        <w:rPr>
+          <w:rFonts w:ascii="Calibri" w:hAnsi="Calibri"/>
+          <w:color w:val="111827"/>
+          <w:sz w:val="22"/>
+        </w:rPr>
+        <w:t>Gateway routes must connect different protocols through an ECU declared with gateway role. Transparent routing requires equal source and destination payload lengths. Execution locks the aggregate, validates optimistic version, assigns one sequence, advances logical time using the destination protocol, and persists exact replay evidence atomically with audit and outbox records.</w:t>
+      </w:r>
+    </w:p>
+    <w:p>
+      <w:pPr>
         <w:pStyle w:val="Heading1"/>
         <w:keepNext/>
         <w:keepLines/>
@@ -4782,7 +5438,7 @@
           <w:color w:val="111827"/>
           <w:sz w:val="22"/>
         </w:rPr>
-        <w:t>. IV-1 through IV-5 implement CAN-F-001 through CAN-F-050 and CAN-NF-001 through CAN-NF-017.</w:t>
+        <w:t>. IV-1 through IV-6 implement CAN-F-001 through CAN-F-060 and CAN-NF-001 through CAN-NF-020.</w:t>
       </w:r>
     </w:p>
     <w:p>
@@ -5109,6 +5765,46 @@
           <w:sz w:val="22"/>
         </w:rPr>
         <w:t xml:space="preserve"> field continues to represent payload bytes for compatibility. Validation restricts FD values to ISO-defined payload sizes, while a future wire adapter can map larger lengths to their four-bit encoded DLC values.</w:t>
+      </w:r>
+    </w:p>
+    <w:p>
+      <w:pPr>
+        <w:pStyle w:val="Heading2"/>
+        <w:keepNext/>
+        <w:keepLines/>
+      </w:pPr>
+      <w:r>
+        <w:t>ADR-CAN-016 - Keep Multi-Bus Contracts in One Versioned Aggregate</w:t>
+      </w:r>
+    </w:p>
+    <w:p>
+      <w:r>
+        <w:rPr>
+          <w:rFonts w:ascii="Calibri" w:hAnsi="Calibri"/>
+          <w:color w:val="111827"/>
+          <w:sz w:val="22"/>
+        </w:rPr>
+        <w:t>LIN, Ethernet, and gateway routes share the CAN network aggregate so cross-protocol configuration, logical time, sequence, replay, and audit remain atomic during the bounded baseline.</w:t>
+      </w:r>
+    </w:p>
+    <w:p>
+      <w:pPr>
+        <w:pStyle w:val="Heading2"/>
+        <w:keepNext/>
+        <w:keepLines/>
+      </w:pPr>
+      <w:r>
+        <w:t>ADR-CAN-017 - Route Transparently Before Adding Signal Transformation</w:t>
+      </w:r>
+    </w:p>
+    <w:p>
+      <w:r>
+        <w:rPr>
+          <w:rFonts w:ascii="Calibri" w:hAnsi="Calibri"/>
+          <w:color w:val="111827"/>
+          <w:sz w:val="22"/>
+        </w:rPr>
+        <w:t>IV-6 requires equal payload lengths and preserves bytes unchanged. This separates deterministic transport timing and gateway control from future DBC-to-SOME/IP or application-level conversion.</w:t>
       </w:r>
     </w:p>
     <w:p>
@@ -11302,6 +11998,1163 @@
           </w:p>
         </w:tc>
       </w:tr>
+      <w:tr>
+        <w:trPr>
+          <w:cantSplit/>
+        </w:trPr>
+        <w:tc>
+          <w:tcPr>
+            <w:tcW w:type="dxa" w:w="1650"/>
+            <w:tcMar>
+              <w:top w:w="80" w:type="dxa"/>
+              <w:start w:w="120" w:type="dxa"/>
+              <w:bottom w:w="80" w:type="dxa"/>
+              <w:end w:w="120" w:type="dxa"/>
+            </w:tcMar>
+            <w:vAlign w:val="center"/>
+            <w:shd w:fill="FFFFFF"/>
+          </w:tcPr>
+          <w:p>
+            <w:pPr>
+              <w:spacing w:before="0" w:after="40" w:line="252" w:lineRule="auto"/>
+              <w:jc w:val="center"/>
+            </w:pPr>
+            <w:r>
+              <w:rPr>
+                <w:rFonts w:ascii="Calibri" w:hAnsi="Calibri"/>
+                <w:b w:val="0"/>
+                <w:color w:val="111827"/>
+                <w:sz w:val="17"/>
+              </w:rPr>
+              <w:t>LIN bounds</w:t>
+            </w:r>
+          </w:p>
+        </w:tc>
+        <w:tc>
+          <w:tcPr>
+            <w:tcW w:type="dxa" w:w="4450"/>
+            <w:tcMar>
+              <w:top w:w="80" w:type="dxa"/>
+              <w:start w:w="120" w:type="dxa"/>
+              <w:bottom w:w="80" w:type="dxa"/>
+              <w:end w:w="120" w:type="dxa"/>
+            </w:tcMar>
+            <w:vAlign w:val="center"/>
+            <w:shd w:fill="FFFFFF"/>
+          </w:tcPr>
+          <w:p>
+            <w:pPr>
+              <w:spacing w:before="0" w:after="40" w:line="252" w:lineRule="auto"/>
+              <w:jc w:val="left"/>
+            </w:pPr>
+            <w:r>
+              <w:rPr>
+                <w:rFonts w:ascii="Calibri" w:hAnsi="Calibri"/>
+                <w:b w:val="0"/>
+                <w:color w:val="111827"/>
+                <w:sz w:val="17"/>
+              </w:rPr>
+              <w:t>Reject bitrate above 20 kbit/s, IDs above 63, and payloads above eight bytes.</w:t>
+            </w:r>
+          </w:p>
+        </w:tc>
+        <w:tc>
+          <w:tcPr>
+            <w:tcW w:type="dxa" w:w="3260"/>
+            <w:tcMar>
+              <w:top w:w="80" w:type="dxa"/>
+              <w:start w:w="120" w:type="dxa"/>
+              <w:bottom w:w="80" w:type="dxa"/>
+              <w:end w:w="120" w:type="dxa"/>
+            </w:tcMar>
+            <w:vAlign w:val="center"/>
+            <w:shd w:fill="FFFFFF"/>
+          </w:tcPr>
+          <w:p>
+            <w:pPr>
+              <w:spacing w:before="0" w:after="40" w:line="252" w:lineRule="auto"/>
+              <w:jc w:val="left"/>
+            </w:pPr>
+            <w:r>
+              <w:rPr>
+                <w:rFonts w:ascii="Calibri" w:hAnsi="Calibri"/>
+                <w:b w:val="0"/>
+                <w:color w:val="111827"/>
+                <w:sz w:val="17"/>
+              </w:rPr>
+              <w:t>Schema</w:t>
+            </w:r>
+          </w:p>
+        </w:tc>
+      </w:tr>
+      <w:tr>
+        <w:trPr>
+          <w:cantSplit/>
+        </w:trPr>
+        <w:tc>
+          <w:tcPr>
+            <w:tcW w:type="dxa" w:w="1650"/>
+            <w:tcMar>
+              <w:top w:w="80" w:type="dxa"/>
+              <w:start w:w="120" w:type="dxa"/>
+              <w:bottom w:w="80" w:type="dxa"/>
+              <w:end w:w="120" w:type="dxa"/>
+            </w:tcMar>
+            <w:vAlign w:val="center"/>
+            <w:shd w:fill="FFFFFF"/>
+          </w:tcPr>
+          <w:p>
+            <w:pPr>
+              <w:spacing w:before="0" w:after="40" w:line="252" w:lineRule="auto"/>
+              <w:jc w:val="center"/>
+            </w:pPr>
+            <w:r>
+              <w:rPr>
+                <w:rFonts w:ascii="Calibri" w:hAnsi="Calibri"/>
+                <w:b w:val="0"/>
+                <w:color w:val="111827"/>
+                <w:sz w:val="17"/>
+              </w:rPr>
+              <w:t>Ethernet bounds</w:t>
+            </w:r>
+          </w:p>
+        </w:tc>
+        <w:tc>
+          <w:tcPr>
+            <w:tcW w:type="dxa" w:w="4450"/>
+            <w:tcMar>
+              <w:top w:w="80" w:type="dxa"/>
+              <w:start w:w="120" w:type="dxa"/>
+              <w:bottom w:w="80" w:type="dxa"/>
+              <w:end w:w="120" w:type="dxa"/>
+            </w:tcMar>
+            <w:vAlign w:val="center"/>
+            <w:shd w:fill="FFFFFF"/>
+          </w:tcPr>
+          <w:p>
+            <w:pPr>
+              <w:spacing w:before="0" w:after="40" w:line="252" w:lineRule="auto"/>
+              <w:jc w:val="left"/>
+            </w:pPr>
+            <w:r>
+              <w:rPr>
+                <w:rFonts w:ascii="Calibri" w:hAnsi="Calibri"/>
+                <w:b w:val="0"/>
+                <w:color w:val="111827"/>
+                <w:sz w:val="17"/>
+              </w:rPr>
+              <w:t>Accept only 100/1000 Mbit/s and payloads through 1500 bytes.</w:t>
+            </w:r>
+          </w:p>
+        </w:tc>
+        <w:tc>
+          <w:tcPr>
+            <w:tcW w:type="dxa" w:w="3260"/>
+            <w:tcMar>
+              <w:top w:w="80" w:type="dxa"/>
+              <w:start w:w="120" w:type="dxa"/>
+              <w:bottom w:w="80" w:type="dxa"/>
+              <w:end w:w="120" w:type="dxa"/>
+            </w:tcMar>
+            <w:vAlign w:val="center"/>
+            <w:shd w:fill="FFFFFF"/>
+          </w:tcPr>
+          <w:p>
+            <w:pPr>
+              <w:spacing w:before="0" w:after="40" w:line="252" w:lineRule="auto"/>
+              <w:jc w:val="left"/>
+            </w:pPr>
+            <w:r>
+              <w:rPr>
+                <w:rFonts w:ascii="Calibri" w:hAnsi="Calibri"/>
+                <w:b w:val="0"/>
+                <w:color w:val="111827"/>
+                <w:sz w:val="17"/>
+              </w:rPr>
+              <w:t>Schema</w:t>
+            </w:r>
+          </w:p>
+        </w:tc>
+      </w:tr>
+      <w:tr>
+        <w:trPr>
+          <w:cantSplit/>
+        </w:trPr>
+        <w:tc>
+          <w:tcPr>
+            <w:tcW w:type="dxa" w:w="1650"/>
+            <w:tcMar>
+              <w:top w:w="80" w:type="dxa"/>
+              <w:start w:w="120" w:type="dxa"/>
+              <w:bottom w:w="80" w:type="dxa"/>
+              <w:end w:w="120" w:type="dxa"/>
+            </w:tcMar>
+            <w:vAlign w:val="center"/>
+            <w:shd w:fill="FFFFFF"/>
+          </w:tcPr>
+          <w:p>
+            <w:pPr>
+              <w:spacing w:before="0" w:after="40" w:line="252" w:lineRule="auto"/>
+              <w:jc w:val="center"/>
+            </w:pPr>
+            <w:r>
+              <w:rPr>
+                <w:rFonts w:ascii="Calibri" w:hAnsi="Calibri"/>
+                <w:b w:val="0"/>
+                <w:color w:val="111827"/>
+                <w:sz w:val="17"/>
+              </w:rPr>
+              <w:t>Gateway role</w:t>
+            </w:r>
+          </w:p>
+        </w:tc>
+        <w:tc>
+          <w:tcPr>
+            <w:tcW w:type="dxa" w:w="4450"/>
+            <w:tcMar>
+              <w:top w:w="80" w:type="dxa"/>
+              <w:start w:w="120" w:type="dxa"/>
+              <w:bottom w:w="80" w:type="dxa"/>
+              <w:end w:w="120" w:type="dxa"/>
+            </w:tcMar>
+            <w:vAlign w:val="center"/>
+            <w:shd w:fill="FFFFFF"/>
+          </w:tcPr>
+          <w:p>
+            <w:pPr>
+              <w:spacing w:before="0" w:after="40" w:line="252" w:lineRule="auto"/>
+              <w:jc w:val="left"/>
+            </w:pPr>
+            <w:r>
+              <w:rPr>
+                <w:rFonts w:ascii="Calibri" w:hAnsi="Calibri"/>
+                <w:b w:val="0"/>
+                <w:color w:val="111827"/>
+                <w:sz w:val="17"/>
+              </w:rPr>
+              <w:t>Reject a route through a node without gateway role.</w:t>
+            </w:r>
+          </w:p>
+        </w:tc>
+        <w:tc>
+          <w:tcPr>
+            <w:tcW w:type="dxa" w:w="3260"/>
+            <w:tcMar>
+              <w:top w:w="80" w:type="dxa"/>
+              <w:start w:w="120" w:type="dxa"/>
+              <w:bottom w:w="80" w:type="dxa"/>
+              <w:end w:w="120" w:type="dxa"/>
+            </w:tcMar>
+            <w:vAlign w:val="center"/>
+            <w:shd w:fill="FFFFFF"/>
+          </w:tcPr>
+          <w:p>
+            <w:pPr>
+              <w:spacing w:before="0" w:after="40" w:line="252" w:lineRule="auto"/>
+              <w:jc w:val="left"/>
+            </w:pPr>
+            <w:r>
+              <w:rPr>
+                <w:rFonts w:ascii="Calibri" w:hAnsi="Calibri"/>
+                <w:b w:val="0"/>
+                <w:color w:val="111827"/>
+                <w:sz w:val="17"/>
+              </w:rPr>
+              <w:t>Service</w:t>
+            </w:r>
+          </w:p>
+        </w:tc>
+      </w:tr>
+      <w:tr>
+        <w:trPr>
+          <w:cantSplit/>
+        </w:trPr>
+        <w:tc>
+          <w:tcPr>
+            <w:tcW w:type="dxa" w:w="1650"/>
+            <w:tcMar>
+              <w:top w:w="80" w:type="dxa"/>
+              <w:start w:w="120" w:type="dxa"/>
+              <w:bottom w:w="80" w:type="dxa"/>
+              <w:end w:w="120" w:type="dxa"/>
+            </w:tcMar>
+            <w:vAlign w:val="center"/>
+            <w:shd w:fill="FFFFFF"/>
+          </w:tcPr>
+          <w:p>
+            <w:pPr>
+              <w:spacing w:before="0" w:after="40" w:line="252" w:lineRule="auto"/>
+              <w:jc w:val="center"/>
+            </w:pPr>
+            <w:r>
+              <w:rPr>
+                <w:rFonts w:ascii="Calibri" w:hAnsi="Calibri"/>
+                <w:b w:val="0"/>
+                <w:color w:val="111827"/>
+                <w:sz w:val="17"/>
+              </w:rPr>
+              <w:t>Cross-protocol route</w:t>
+            </w:r>
+          </w:p>
+        </w:tc>
+        <w:tc>
+          <w:tcPr>
+            <w:tcW w:type="dxa" w:w="4450"/>
+            <w:tcMar>
+              <w:top w:w="80" w:type="dxa"/>
+              <w:start w:w="120" w:type="dxa"/>
+              <w:bottom w:w="80" w:type="dxa"/>
+              <w:end w:w="120" w:type="dxa"/>
+            </w:tcMar>
+            <w:vAlign w:val="center"/>
+            <w:shd w:fill="FFFFFF"/>
+          </w:tcPr>
+          <w:p>
+            <w:pPr>
+              <w:spacing w:before="0" w:after="40" w:line="252" w:lineRule="auto"/>
+              <w:jc w:val="left"/>
+            </w:pPr>
+            <w:r>
+              <w:rPr>
+                <w:rFonts w:ascii="Calibri" w:hAnsi="Calibri"/>
+                <w:b w:val="0"/>
+                <w:color w:val="111827"/>
+                <w:sz w:val="17"/>
+              </w:rPr>
+              <w:t>Reject routes whose source and destination protocols are equal.</w:t>
+            </w:r>
+          </w:p>
+        </w:tc>
+        <w:tc>
+          <w:tcPr>
+            <w:tcW w:type="dxa" w:w="3260"/>
+            <w:tcMar>
+              <w:top w:w="80" w:type="dxa"/>
+              <w:start w:w="120" w:type="dxa"/>
+              <w:bottom w:w="80" w:type="dxa"/>
+              <w:end w:w="120" w:type="dxa"/>
+            </w:tcMar>
+            <w:vAlign w:val="center"/>
+            <w:shd w:fill="FFFFFF"/>
+          </w:tcPr>
+          <w:p>
+            <w:pPr>
+              <w:spacing w:before="0" w:after="40" w:line="252" w:lineRule="auto"/>
+              <w:jc w:val="left"/>
+            </w:pPr>
+            <w:r>
+              <w:rPr>
+                <w:rFonts w:ascii="Calibri" w:hAnsi="Calibri"/>
+                <w:b w:val="0"/>
+                <w:color w:val="111827"/>
+                <w:sz w:val="17"/>
+              </w:rPr>
+              <w:t>Schema</w:t>
+            </w:r>
+          </w:p>
+        </w:tc>
+      </w:tr>
+      <w:tr>
+        <w:trPr>
+          <w:cantSplit/>
+        </w:trPr>
+        <w:tc>
+          <w:tcPr>
+            <w:tcW w:type="dxa" w:w="1650"/>
+            <w:tcMar>
+              <w:top w:w="80" w:type="dxa"/>
+              <w:start w:w="120" w:type="dxa"/>
+              <w:bottom w:w="80" w:type="dxa"/>
+              <w:end w:w="120" w:type="dxa"/>
+            </w:tcMar>
+            <w:vAlign w:val="center"/>
+            <w:shd w:fill="FFFFFF"/>
+          </w:tcPr>
+          <w:p>
+            <w:pPr>
+              <w:spacing w:before="0" w:after="40" w:line="252" w:lineRule="auto"/>
+              <w:jc w:val="center"/>
+            </w:pPr>
+            <w:r>
+              <w:rPr>
+                <w:rFonts w:ascii="Calibri" w:hAnsi="Calibri"/>
+                <w:b w:val="0"/>
+                <w:color w:val="111827"/>
+                <w:sz w:val="17"/>
+              </w:rPr>
+              <w:t>Transparent length</w:t>
+            </w:r>
+          </w:p>
+        </w:tc>
+        <w:tc>
+          <w:tcPr>
+            <w:tcW w:type="dxa" w:w="4450"/>
+            <w:tcMar>
+              <w:top w:w="80" w:type="dxa"/>
+              <w:start w:w="120" w:type="dxa"/>
+              <w:bottom w:w="80" w:type="dxa"/>
+              <w:end w:w="120" w:type="dxa"/>
+            </w:tcMar>
+            <w:vAlign w:val="center"/>
+            <w:shd w:fill="FFFFFF"/>
+          </w:tcPr>
+          <w:p>
+            <w:pPr>
+              <w:spacing w:before="0" w:after="40" w:line="252" w:lineRule="auto"/>
+              <w:jc w:val="left"/>
+            </w:pPr>
+            <w:r>
+              <w:rPr>
+                <w:rFonts w:ascii="Calibri" w:hAnsi="Calibri"/>
+                <w:b w:val="0"/>
+                <w:color w:val="111827"/>
+                <w:sz w:val="17"/>
+              </w:rPr>
+              <w:t>Reject source and destination contracts with different payload lengths.</w:t>
+            </w:r>
+          </w:p>
+        </w:tc>
+        <w:tc>
+          <w:tcPr>
+            <w:tcW w:type="dxa" w:w="3260"/>
+            <w:tcMar>
+              <w:top w:w="80" w:type="dxa"/>
+              <w:start w:w="120" w:type="dxa"/>
+              <w:bottom w:w="80" w:type="dxa"/>
+              <w:end w:w="120" w:type="dxa"/>
+            </w:tcMar>
+            <w:vAlign w:val="center"/>
+            <w:shd w:fill="FFFFFF"/>
+          </w:tcPr>
+          <w:p>
+            <w:pPr>
+              <w:spacing w:before="0" w:after="40" w:line="252" w:lineRule="auto"/>
+              <w:jc w:val="left"/>
+            </w:pPr>
+            <w:r>
+              <w:rPr>
+                <w:rFonts w:ascii="Calibri" w:hAnsi="Calibri"/>
+                <w:b w:val="0"/>
+                <w:color w:val="111827"/>
+                <w:sz w:val="17"/>
+              </w:rPr>
+              <w:t>Service</w:t>
+            </w:r>
+          </w:p>
+        </w:tc>
+      </w:tr>
+      <w:tr>
+        <w:trPr>
+          <w:cantSplit/>
+        </w:trPr>
+        <w:tc>
+          <w:tcPr>
+            <w:tcW w:type="dxa" w:w="1650"/>
+            <w:tcMar>
+              <w:top w:w="80" w:type="dxa"/>
+              <w:start w:w="120" w:type="dxa"/>
+              <w:bottom w:w="80" w:type="dxa"/>
+              <w:end w:w="120" w:type="dxa"/>
+            </w:tcMar>
+            <w:vAlign w:val="center"/>
+            <w:shd w:fill="FFFFFF"/>
+          </w:tcPr>
+          <w:p>
+            <w:pPr>
+              <w:spacing w:before="0" w:after="40" w:line="252" w:lineRule="auto"/>
+              <w:jc w:val="center"/>
+            </w:pPr>
+            <w:r>
+              <w:rPr>
+                <w:rFonts w:ascii="Calibri" w:hAnsi="Calibri"/>
+                <w:b w:val="0"/>
+                <w:color w:val="111827"/>
+                <w:sz w:val="17"/>
+              </w:rPr>
+              <w:t>LIN timing</w:t>
+            </w:r>
+          </w:p>
+        </w:tc>
+        <w:tc>
+          <w:tcPr>
+            <w:tcW w:type="dxa" w:w="4450"/>
+            <w:tcMar>
+              <w:top w:w="80" w:type="dxa"/>
+              <w:start w:w="120" w:type="dxa"/>
+              <w:bottom w:w="80" w:type="dxa"/>
+              <w:end w:w="120" w:type="dxa"/>
+            </w:tcMar>
+            <w:vAlign w:val="center"/>
+            <w:shd w:fill="FFFFFF"/>
+          </w:tcPr>
+          <w:p>
+            <w:pPr>
+              <w:spacing w:before="0" w:after="40" w:line="252" w:lineRule="auto"/>
+              <w:jc w:val="left"/>
+            </w:pPr>
+            <w:r>
+              <w:rPr>
+                <w:rFonts w:ascii="Calibri" w:hAnsi="Calibri"/>
+                <w:b w:val="0"/>
+                <w:color w:val="111827"/>
+                <w:sz w:val="17"/>
+              </w:rPr>
+              <w:t>Verify 43 fixed bits plus ten bits per payload byte at channel bitrate.</w:t>
+            </w:r>
+          </w:p>
+        </w:tc>
+        <w:tc>
+          <w:tcPr>
+            <w:tcW w:type="dxa" w:w="3260"/>
+            <w:tcMar>
+              <w:top w:w="80" w:type="dxa"/>
+              <w:start w:w="120" w:type="dxa"/>
+              <w:bottom w:w="80" w:type="dxa"/>
+              <w:end w:w="120" w:type="dxa"/>
+            </w:tcMar>
+            <w:vAlign w:val="center"/>
+            <w:shd w:fill="FFFFFF"/>
+          </w:tcPr>
+          <w:p>
+            <w:pPr>
+              <w:spacing w:before="0" w:after="40" w:line="252" w:lineRule="auto"/>
+              <w:jc w:val="left"/>
+            </w:pPr>
+            <w:r>
+              <w:rPr>
+                <w:rFonts w:ascii="Calibri" w:hAnsi="Calibri"/>
+                <w:b w:val="0"/>
+                <w:color w:val="111827"/>
+                <w:sz w:val="17"/>
+              </w:rPr>
+              <w:t>Unit/service</w:t>
+            </w:r>
+          </w:p>
+        </w:tc>
+      </w:tr>
+      <w:tr>
+        <w:trPr>
+          <w:cantSplit/>
+        </w:trPr>
+        <w:tc>
+          <w:tcPr>
+            <w:tcW w:type="dxa" w:w="1650"/>
+            <w:tcMar>
+              <w:top w:w="80" w:type="dxa"/>
+              <w:start w:w="120" w:type="dxa"/>
+              <w:bottom w:w="80" w:type="dxa"/>
+              <w:end w:w="120" w:type="dxa"/>
+            </w:tcMar>
+            <w:vAlign w:val="center"/>
+            <w:shd w:fill="FFFFFF"/>
+          </w:tcPr>
+          <w:p>
+            <w:pPr>
+              <w:spacing w:before="0" w:after="40" w:line="252" w:lineRule="auto"/>
+              <w:jc w:val="center"/>
+            </w:pPr>
+            <w:r>
+              <w:rPr>
+                <w:rFonts w:ascii="Calibri" w:hAnsi="Calibri"/>
+                <w:b w:val="0"/>
+                <w:color w:val="111827"/>
+                <w:sz w:val="17"/>
+              </w:rPr>
+              <w:t>Ethernet timing</w:t>
+            </w:r>
+          </w:p>
+        </w:tc>
+        <w:tc>
+          <w:tcPr>
+            <w:tcW w:type="dxa" w:w="4450"/>
+            <w:tcMar>
+              <w:top w:w="80" w:type="dxa"/>
+              <w:start w:w="120" w:type="dxa"/>
+              <w:bottom w:w="80" w:type="dxa"/>
+              <w:end w:w="120" w:type="dxa"/>
+            </w:tcMar>
+            <w:vAlign w:val="center"/>
+            <w:shd w:fill="FFFFFF"/>
+          </w:tcPr>
+          <w:p>
+            <w:pPr>
+              <w:spacing w:before="0" w:after="40" w:line="252" w:lineRule="auto"/>
+              <w:jc w:val="left"/>
+            </w:pPr>
+            <w:r>
+              <w:rPr>
+                <w:rFonts w:ascii="Calibri" w:hAnsi="Calibri"/>
+                <w:b w:val="0"/>
+                <w:color w:val="111827"/>
+                <w:sz w:val="17"/>
+              </w:rPr>
+              <w:t>Verify preamble, header, FCS, and inter-frame gap duration with ceiling.</w:t>
+            </w:r>
+          </w:p>
+        </w:tc>
+        <w:tc>
+          <w:tcPr>
+            <w:tcW w:type="dxa" w:w="3260"/>
+            <w:tcMar>
+              <w:top w:w="80" w:type="dxa"/>
+              <w:start w:w="120" w:type="dxa"/>
+              <w:bottom w:w="80" w:type="dxa"/>
+              <w:end w:w="120" w:type="dxa"/>
+            </w:tcMar>
+            <w:vAlign w:val="center"/>
+            <w:shd w:fill="FFFFFF"/>
+          </w:tcPr>
+          <w:p>
+            <w:pPr>
+              <w:spacing w:before="0" w:after="40" w:line="252" w:lineRule="auto"/>
+              <w:jc w:val="left"/>
+            </w:pPr>
+            <w:r>
+              <w:rPr>
+                <w:rFonts w:ascii="Calibri" w:hAnsi="Calibri"/>
+                <w:b w:val="0"/>
+                <w:color w:val="111827"/>
+                <w:sz w:val="17"/>
+              </w:rPr>
+              <w:t>Unit/service</w:t>
+            </w:r>
+          </w:p>
+        </w:tc>
+      </w:tr>
+      <w:tr>
+        <w:trPr>
+          <w:cantSplit/>
+        </w:trPr>
+        <w:tc>
+          <w:tcPr>
+            <w:tcW w:type="dxa" w:w="1650"/>
+            <w:tcMar>
+              <w:top w:w="80" w:type="dxa"/>
+              <w:start w:w="120" w:type="dxa"/>
+              <w:bottom w:w="80" w:type="dxa"/>
+              <w:end w:w="120" w:type="dxa"/>
+            </w:tcMar>
+            <w:vAlign w:val="center"/>
+            <w:shd w:fill="FFFFFF"/>
+          </w:tcPr>
+          <w:p>
+            <w:pPr>
+              <w:spacing w:before="0" w:after="40" w:line="252" w:lineRule="auto"/>
+              <w:jc w:val="center"/>
+            </w:pPr>
+            <w:r>
+              <w:rPr>
+                <w:rFonts w:ascii="Calibri" w:hAnsi="Calibri"/>
+                <w:b w:val="0"/>
+                <w:color w:val="111827"/>
+                <w:sz w:val="17"/>
+              </w:rPr>
+              <w:t>Gateway sequence</w:t>
+            </w:r>
+          </w:p>
+        </w:tc>
+        <w:tc>
+          <w:tcPr>
+            <w:tcW w:type="dxa" w:w="4450"/>
+            <w:tcMar>
+              <w:top w:w="80" w:type="dxa"/>
+              <w:start w:w="120" w:type="dxa"/>
+              <w:bottom w:w="80" w:type="dxa"/>
+              <w:end w:w="120" w:type="dxa"/>
+            </w:tcMar>
+            <w:vAlign w:val="center"/>
+            <w:shd w:fill="FFFFFF"/>
+          </w:tcPr>
+          <w:p>
+            <w:pPr>
+              <w:spacing w:before="0" w:after="40" w:line="252" w:lineRule="auto"/>
+              <w:jc w:val="left"/>
+            </w:pPr>
+            <w:r>
+              <w:rPr>
+                <w:rFonts w:ascii="Calibri" w:hAnsi="Calibri"/>
+                <w:b w:val="0"/>
+                <w:color w:val="111827"/>
+                <w:sz w:val="17"/>
+              </w:rPr>
+              <w:t>Advance logical time, sequence, and version exactly once per route.</w:t>
+            </w:r>
+          </w:p>
+        </w:tc>
+        <w:tc>
+          <w:tcPr>
+            <w:tcW w:type="dxa" w:w="3260"/>
+            <w:tcMar>
+              <w:top w:w="80" w:type="dxa"/>
+              <w:start w:w="120" w:type="dxa"/>
+              <w:bottom w:w="80" w:type="dxa"/>
+              <w:end w:w="120" w:type="dxa"/>
+            </w:tcMar>
+            <w:vAlign w:val="center"/>
+            <w:shd w:fill="FFFFFF"/>
+          </w:tcPr>
+          <w:p>
+            <w:pPr>
+              <w:spacing w:before="0" w:after="40" w:line="252" w:lineRule="auto"/>
+              <w:jc w:val="left"/>
+            </w:pPr>
+            <w:r>
+              <w:rPr>
+                <w:rFonts w:ascii="Calibri" w:hAnsi="Calibri"/>
+                <w:b w:val="0"/>
+                <w:color w:val="111827"/>
+                <w:sz w:val="17"/>
+              </w:rPr>
+              <w:t>Service</w:t>
+            </w:r>
+          </w:p>
+        </w:tc>
+      </w:tr>
+      <w:tr>
+        <w:trPr>
+          <w:cantSplit/>
+        </w:trPr>
+        <w:tc>
+          <w:tcPr>
+            <w:tcW w:type="dxa" w:w="1650"/>
+            <w:tcMar>
+              <w:top w:w="80" w:type="dxa"/>
+              <w:start w:w="120" w:type="dxa"/>
+              <w:bottom w:w="80" w:type="dxa"/>
+              <w:end w:w="120" w:type="dxa"/>
+            </w:tcMar>
+            <w:vAlign w:val="center"/>
+            <w:shd w:fill="FFFFFF"/>
+          </w:tcPr>
+          <w:p>
+            <w:pPr>
+              <w:spacing w:before="0" w:after="40" w:line="252" w:lineRule="auto"/>
+              <w:jc w:val="center"/>
+            </w:pPr>
+            <w:r>
+              <w:rPr>
+                <w:rFonts w:ascii="Calibri" w:hAnsi="Calibri"/>
+                <w:b w:val="0"/>
+                <w:color w:val="111827"/>
+                <w:sz w:val="17"/>
+              </w:rPr>
+              <w:t>Gateway replay</w:t>
+            </w:r>
+          </w:p>
+        </w:tc>
+        <w:tc>
+          <w:tcPr>
+            <w:tcW w:type="dxa" w:w="4450"/>
+            <w:tcMar>
+              <w:top w:w="80" w:type="dxa"/>
+              <w:start w:w="120" w:type="dxa"/>
+              <w:bottom w:w="80" w:type="dxa"/>
+              <w:end w:w="120" w:type="dxa"/>
+            </w:tcMar>
+            <w:vAlign w:val="center"/>
+            <w:shd w:fill="FFFFFF"/>
+          </w:tcPr>
+          <w:p>
+            <w:pPr>
+              <w:spacing w:before="0" w:after="40" w:line="252" w:lineRule="auto"/>
+              <w:jc w:val="left"/>
+            </w:pPr>
+            <w:r>
+              <w:rPr>
+                <w:rFonts w:ascii="Calibri" w:hAnsi="Calibri"/>
+                <w:b w:val="0"/>
+                <w:color w:val="111827"/>
+                <w:sz w:val="17"/>
+              </w:rPr>
+              <w:t>Return exact persisted evidence without repeating routing state.</w:t>
+            </w:r>
+          </w:p>
+        </w:tc>
+        <w:tc>
+          <w:tcPr>
+            <w:tcW w:type="dxa" w:w="3260"/>
+            <w:tcMar>
+              <w:top w:w="80" w:type="dxa"/>
+              <w:start w:w="120" w:type="dxa"/>
+              <w:bottom w:w="80" w:type="dxa"/>
+              <w:end w:w="120" w:type="dxa"/>
+            </w:tcMar>
+            <w:vAlign w:val="center"/>
+            <w:shd w:fill="FFFFFF"/>
+          </w:tcPr>
+          <w:p>
+            <w:pPr>
+              <w:spacing w:before="0" w:after="40" w:line="252" w:lineRule="auto"/>
+              <w:jc w:val="left"/>
+            </w:pPr>
+            <w:r>
+              <w:rPr>
+                <w:rFonts w:ascii="Calibri" w:hAnsi="Calibri"/>
+                <w:b w:val="0"/>
+                <w:color w:val="111827"/>
+                <w:sz w:val="17"/>
+              </w:rPr>
+              <w:t>Service/API</w:t>
+            </w:r>
+          </w:p>
+        </w:tc>
+      </w:tr>
+      <w:tr>
+        <w:trPr>
+          <w:cantSplit/>
+        </w:trPr>
+        <w:tc>
+          <w:tcPr>
+            <w:tcW w:type="dxa" w:w="1650"/>
+            <w:tcMar>
+              <w:top w:w="80" w:type="dxa"/>
+              <w:start w:w="120" w:type="dxa"/>
+              <w:bottom w:w="80" w:type="dxa"/>
+              <w:end w:w="120" w:type="dxa"/>
+            </w:tcMar>
+            <w:vAlign w:val="center"/>
+            <w:shd w:fill="FFFFFF"/>
+          </w:tcPr>
+          <w:p>
+            <w:pPr>
+              <w:spacing w:before="0" w:after="40" w:line="252" w:lineRule="auto"/>
+              <w:jc w:val="center"/>
+            </w:pPr>
+            <w:r>
+              <w:rPr>
+                <w:rFonts w:ascii="Calibri" w:hAnsi="Calibri"/>
+                <w:b w:val="0"/>
+                <w:color w:val="111827"/>
+                <w:sz w:val="17"/>
+              </w:rPr>
+              <w:t>Gateway conflict</w:t>
+            </w:r>
+          </w:p>
+        </w:tc>
+        <w:tc>
+          <w:tcPr>
+            <w:tcW w:type="dxa" w:w="4450"/>
+            <w:tcMar>
+              <w:top w:w="80" w:type="dxa"/>
+              <w:start w:w="120" w:type="dxa"/>
+              <w:bottom w:w="80" w:type="dxa"/>
+              <w:end w:w="120" w:type="dxa"/>
+            </w:tcMar>
+            <w:vAlign w:val="center"/>
+            <w:shd w:fill="FFFFFF"/>
+          </w:tcPr>
+          <w:p>
+            <w:pPr>
+              <w:spacing w:before="0" w:after="40" w:line="252" w:lineRule="auto"/>
+              <w:jc w:val="left"/>
+            </w:pPr>
+            <w:r>
+              <w:rPr>
+                <w:rFonts w:ascii="Calibri" w:hAnsi="Calibri"/>
+                <w:b w:val="0"/>
+                <w:color w:val="111827"/>
+                <w:sz w:val="17"/>
+              </w:rPr>
+              <w:t>Reject changed command-ID reuse with a stable error.</w:t>
+            </w:r>
+          </w:p>
+        </w:tc>
+        <w:tc>
+          <w:tcPr>
+            <w:tcW w:type="dxa" w:w="3260"/>
+            <w:tcMar>
+              <w:top w:w="80" w:type="dxa"/>
+              <w:start w:w="120" w:type="dxa"/>
+              <w:bottom w:w="80" w:type="dxa"/>
+              <w:end w:w="120" w:type="dxa"/>
+            </w:tcMar>
+            <w:vAlign w:val="center"/>
+            <w:shd w:fill="FFFFFF"/>
+          </w:tcPr>
+          <w:p>
+            <w:pPr>
+              <w:spacing w:before="0" w:after="40" w:line="252" w:lineRule="auto"/>
+              <w:jc w:val="left"/>
+            </w:pPr>
+            <w:r>
+              <w:rPr>
+                <w:rFonts w:ascii="Calibri" w:hAnsi="Calibri"/>
+                <w:b w:val="0"/>
+                <w:color w:val="111827"/>
+                <w:sz w:val="17"/>
+              </w:rPr>
+              <w:t>Service/API</w:t>
+            </w:r>
+          </w:p>
+        </w:tc>
+      </w:tr>
+      <w:tr>
+        <w:trPr>
+          <w:cantSplit/>
+        </w:trPr>
+        <w:tc>
+          <w:tcPr>
+            <w:tcW w:type="dxa" w:w="1650"/>
+            <w:tcMar>
+              <w:top w:w="80" w:type="dxa"/>
+              <w:start w:w="120" w:type="dxa"/>
+              <w:bottom w:w="80" w:type="dxa"/>
+              <w:end w:w="120" w:type="dxa"/>
+            </w:tcMar>
+            <w:vAlign w:val="center"/>
+            <w:shd w:fill="FFFFFF"/>
+          </w:tcPr>
+          <w:p>
+            <w:pPr>
+              <w:spacing w:before="0" w:after="40" w:line="252" w:lineRule="auto"/>
+              <w:jc w:val="center"/>
+            </w:pPr>
+            <w:r>
+              <w:rPr>
+                <w:rFonts w:ascii="Calibri" w:hAnsi="Calibri"/>
+                <w:b w:val="0"/>
+                <w:color w:val="111827"/>
+                <w:sz w:val="17"/>
+              </w:rPr>
+              <w:t>Gateway RBAC</w:t>
+            </w:r>
+          </w:p>
+        </w:tc>
+        <w:tc>
+          <w:tcPr>
+            <w:tcW w:type="dxa" w:w="4450"/>
+            <w:tcMar>
+              <w:top w:w="80" w:type="dxa"/>
+              <w:start w:w="120" w:type="dxa"/>
+              <w:bottom w:w="80" w:type="dxa"/>
+              <w:end w:w="120" w:type="dxa"/>
+            </w:tcMar>
+            <w:vAlign w:val="center"/>
+            <w:shd w:fill="FFFFFF"/>
+          </w:tcPr>
+          <w:p>
+            <w:pPr>
+              <w:spacing w:before="0" w:after="40" w:line="252" w:lineRule="auto"/>
+              <w:jc w:val="left"/>
+            </w:pPr>
+            <w:r>
+              <w:rPr>
+                <w:rFonts w:ascii="Calibri" w:hAnsi="Calibri"/>
+                <w:b w:val="0"/>
+                <w:color w:val="111827"/>
+                <w:sz w:val="17"/>
+              </w:rPr>
+              <w:t>Require manage for configuration/routing and read for evidence.</w:t>
+            </w:r>
+          </w:p>
+        </w:tc>
+        <w:tc>
+          <w:tcPr>
+            <w:tcW w:type="dxa" w:w="3260"/>
+            <w:tcMar>
+              <w:top w:w="80" w:type="dxa"/>
+              <w:start w:w="120" w:type="dxa"/>
+              <w:bottom w:w="80" w:type="dxa"/>
+              <w:end w:w="120" w:type="dxa"/>
+            </w:tcMar>
+            <w:vAlign w:val="center"/>
+            <w:shd w:fill="FFFFFF"/>
+          </w:tcPr>
+          <w:p>
+            <w:pPr>
+              <w:spacing w:before="0" w:after="40" w:line="252" w:lineRule="auto"/>
+              <w:jc w:val="left"/>
+            </w:pPr>
+            <w:r>
+              <w:rPr>
+                <w:rFonts w:ascii="Calibri" w:hAnsi="Calibri"/>
+                <w:b w:val="0"/>
+                <w:color w:val="111827"/>
+                <w:sz w:val="17"/>
+              </w:rPr>
+              <w:t>API/integration</w:t>
+            </w:r>
+          </w:p>
+        </w:tc>
+      </w:tr>
+      <w:tr>
+        <w:trPr>
+          <w:cantSplit/>
+        </w:trPr>
+        <w:tc>
+          <w:tcPr>
+            <w:tcW w:type="dxa" w:w="1650"/>
+            <w:tcMar>
+              <w:top w:w="80" w:type="dxa"/>
+              <w:start w:w="120" w:type="dxa"/>
+              <w:bottom w:w="80" w:type="dxa"/>
+              <w:end w:w="120" w:type="dxa"/>
+            </w:tcMar>
+            <w:vAlign w:val="center"/>
+            <w:shd w:fill="FFFFFF"/>
+          </w:tcPr>
+          <w:p>
+            <w:pPr>
+              <w:spacing w:before="0" w:after="40" w:line="252" w:lineRule="auto"/>
+              <w:jc w:val="center"/>
+            </w:pPr>
+            <w:r>
+              <w:rPr>
+                <w:rFonts w:ascii="Calibri" w:hAnsi="Calibri"/>
+                <w:b w:val="0"/>
+                <w:color w:val="111827"/>
+                <w:sz w:val="17"/>
+              </w:rPr>
+              <w:t>Gateway minimization</w:t>
+            </w:r>
+          </w:p>
+        </w:tc>
+        <w:tc>
+          <w:tcPr>
+            <w:tcW w:type="dxa" w:w="4450"/>
+            <w:tcMar>
+              <w:top w:w="80" w:type="dxa"/>
+              <w:start w:w="120" w:type="dxa"/>
+              <w:bottom w:w="80" w:type="dxa"/>
+              <w:end w:w="120" w:type="dxa"/>
+            </w:tcMar>
+            <w:vAlign w:val="center"/>
+            <w:shd w:fill="FFFFFF"/>
+          </w:tcPr>
+          <w:p>
+            <w:pPr>
+              <w:spacing w:before="0" w:after="40" w:line="252" w:lineRule="auto"/>
+              <w:jc w:val="left"/>
+            </w:pPr>
+            <w:r>
+              <w:rPr>
+                <w:rFonts w:ascii="Calibri" w:hAnsi="Calibri"/>
+                <w:b w:val="0"/>
+                <w:color w:val="111827"/>
+                <w:sz w:val="17"/>
+              </w:rPr>
+              <w:t>Exclude routed payload and full configuration from audit/outbox.</w:t>
+            </w:r>
+          </w:p>
+        </w:tc>
+        <w:tc>
+          <w:tcPr>
+            <w:tcW w:type="dxa" w:w="3260"/>
+            <w:tcMar>
+              <w:top w:w="80" w:type="dxa"/>
+              <w:start w:w="120" w:type="dxa"/>
+              <w:bottom w:w="80" w:type="dxa"/>
+              <w:end w:w="120" w:type="dxa"/>
+            </w:tcMar>
+            <w:vAlign w:val="center"/>
+            <w:shd w:fill="FFFFFF"/>
+          </w:tcPr>
+          <w:p>
+            <w:pPr>
+              <w:spacing w:before="0" w:after="40" w:line="252" w:lineRule="auto"/>
+              <w:jc w:val="left"/>
+            </w:pPr>
+            <w:r>
+              <w:rPr>
+                <w:rFonts w:ascii="Calibri" w:hAnsi="Calibri"/>
+                <w:b w:val="0"/>
+                <w:color w:val="111827"/>
+                <w:sz w:val="17"/>
+              </w:rPr>
+              <w:t>Service</w:t>
+            </w:r>
+          </w:p>
+        </w:tc>
+      </w:tr>
+      <w:tr>
+        <w:trPr>
+          <w:cantSplit/>
+        </w:trPr>
+        <w:tc>
+          <w:tcPr>
+            <w:tcW w:type="dxa" w:w="1650"/>
+            <w:tcMar>
+              <w:top w:w="80" w:type="dxa"/>
+              <w:start w:w="120" w:type="dxa"/>
+              <w:bottom w:w="80" w:type="dxa"/>
+              <w:end w:w="120" w:type="dxa"/>
+            </w:tcMar>
+            <w:vAlign w:val="center"/>
+            <w:shd w:fill="FFFFFF"/>
+          </w:tcPr>
+          <w:p>
+            <w:pPr>
+              <w:spacing w:before="0" w:after="40" w:line="252" w:lineRule="auto"/>
+              <w:jc w:val="center"/>
+            </w:pPr>
+            <w:r>
+              <w:rPr>
+                <w:rFonts w:ascii="Calibri" w:hAnsi="Calibri"/>
+                <w:b w:val="0"/>
+                <w:color w:val="111827"/>
+                <w:sz w:val="17"/>
+              </w:rPr>
+              <w:t>Multi-bus migration</w:t>
+            </w:r>
+          </w:p>
+        </w:tc>
+        <w:tc>
+          <w:tcPr>
+            <w:tcW w:type="dxa" w:w="4450"/>
+            <w:tcMar>
+              <w:top w:w="80" w:type="dxa"/>
+              <w:start w:w="120" w:type="dxa"/>
+              <w:bottom w:w="80" w:type="dxa"/>
+              <w:end w:w="120" w:type="dxa"/>
+            </w:tcMar>
+            <w:vAlign w:val="center"/>
+            <w:shd w:fill="FFFFFF"/>
+          </w:tcPr>
+          <w:p>
+            <w:pPr>
+              <w:spacing w:before="0" w:after="40" w:line="252" w:lineRule="auto"/>
+              <w:jc w:val="left"/>
+            </w:pPr>
+            <w:r>
+              <w:rPr>
+                <w:rFonts w:ascii="Calibri" w:hAnsi="Calibri"/>
+                <w:b w:val="0"/>
+                <w:color w:val="111827"/>
+                <w:sz w:val="17"/>
+              </w:rPr>
+              <w:t>Upgrade and downgrade contracts and execution evidence.</w:t>
+            </w:r>
+          </w:p>
+        </w:tc>
+        <w:tc>
+          <w:tcPr>
+            <w:tcW w:type="dxa" w:w="3260"/>
+            <w:tcMar>
+              <w:top w:w="80" w:type="dxa"/>
+              <w:start w:w="120" w:type="dxa"/>
+              <w:bottom w:w="80" w:type="dxa"/>
+              <w:end w:w="120" w:type="dxa"/>
+            </w:tcMar>
+            <w:vAlign w:val="center"/>
+            <w:shd w:fill="FFFFFF"/>
+          </w:tcPr>
+          <w:p>
+            <w:pPr>
+              <w:spacing w:before="0" w:after="40" w:line="252" w:lineRule="auto"/>
+              <w:jc w:val="left"/>
+            </w:pPr>
+            <w:r>
+              <w:rPr>
+                <w:rFonts w:ascii="Calibri" w:hAnsi="Calibri"/>
+                <w:b w:val="0"/>
+                <w:color w:val="111827"/>
+                <w:sz w:val="17"/>
+              </w:rPr>
+              <w:t>Integration</w:t>
+            </w:r>
+          </w:p>
+        </w:tc>
+      </w:tr>
     </w:tbl>
     <w:p>
       <w:pPr>
@@ -11381,7 +13234,7 @@
           <w:color w:val="1F4D78"/>
           <w:sz w:val="19"/>
         </w:rPr>
-        <w:t>0028_can_faults</w:t>
+        <w:t>0029_multibus_gateway</w:t>
       </w:r>
       <w:r>
         <w:rPr>
@@ -11569,6 +13422,55 @@
           <w:color w:val="111827"/>
           <w:sz w:val="22"/>
         </w:rPr>
+        <w:t xml:space="preserve">Multi-bus events are </w:t>
+      </w:r>
+      <w:r>
+        <w:rPr>
+          <w:rFonts w:ascii="Consolas" w:hAnsi="Consolas"/>
+          <w:color w:val="1F4D78"/>
+          <w:sz w:val="19"/>
+        </w:rPr>
+        <w:t>atep.vehicle.multibus.configured.v1</w:t>
+      </w:r>
+      <w:r>
+        <w:rPr>
+          <w:rFonts w:ascii="Calibri" w:hAnsi="Calibri"/>
+          <w:color w:val="111827"/>
+          <w:sz w:val="22"/>
+        </w:rPr>
+        <w:t xml:space="preserve"> and </w:t>
+      </w:r>
+      <w:r>
+        <w:rPr>
+          <w:rFonts w:ascii="Consolas" w:hAnsi="Consolas"/>
+          <w:color w:val="1F4D78"/>
+          <w:sz w:val="19"/>
+        </w:rPr>
+        <w:t>atep.vehicle.gateway.routed.v1</w:t>
+      </w:r>
+      <w:r>
+        <w:rPr>
+          <w:rFonts w:ascii="Calibri" w:hAnsi="Calibri"/>
+          <w:color w:val="111827"/>
+          <w:sz w:val="22"/>
+        </w:rPr>
+        <w:t>.</w:t>
+      </w:r>
+    </w:p>
+    <w:p>
+      <w:pPr>
+        <w:pStyle w:val="ListBullet"/>
+        <w:numPr>
+          <w:ilvl w:val="0"/>
+          <w:numId w:val="13"/>
+        </w:numPr>
+      </w:pPr>
+      <w:r>
+        <w:rPr>
+          <w:rFonts w:ascii="Calibri" w:hAnsi="Calibri"/>
+          <w:color w:val="111827"/>
+          <w:sz w:val="22"/>
+        </w:rPr>
         <w:t xml:space="preserve">Permissions are </w:t>
       </w:r>
       <w:r>
@@ -11618,7 +13520,7 @@
           <w:color w:val="111827"/>
           <w:sz w:val="22"/>
         </w:rPr>
-        <w:t>Automated tests cover validation, priority, classic and FD timing mathematics, mixed arbitration, readiness, delivery, utilization, versioning, replay, errors, DBC bit placement through 512 bits, signed scaling, exact conversion, TEC/REC thresholds, loss, bus-off enforcement, recovery timing, evidence minimization, persistence, and OpenAPI.</w:t>
+        <w:t>Automated tests cover validation, priority, classic and FD timing mathematics, mixed arbitration, readiness, delivery, utilization, versioning, replay, errors, DBC bit placement through 512 bits, signed scaling, exact conversion, TEC/REC thresholds, loss, bus-off enforcement, recovery timing, LIN/Ethernet bounds and timing, gateway routing, evidence minimization, persistence, and OpenAPI.</w:t>
       </w:r>
     </w:p>
     <w:p>
@@ -11836,6 +13738,40 @@
     </w:p>
     <w:p>
       <w:pPr>
+        <w:pStyle w:val="ListBullet"/>
+        <w:numPr>
+          <w:ilvl w:val="0"/>
+          <w:numId w:val="14"/>
+        </w:numPr>
+      </w:pPr>
+      <w:r>
+        <w:rPr>
+          <w:rFonts w:ascii="Calibri" w:hAnsi="Calibri"/>
+          <w:color w:val="111827"/>
+          <w:sz w:val="22"/>
+        </w:rPr>
+        <w:t>LIN and Ethernet timing are transparent deterministic models, not physical transceiver simulations.</w:t>
+      </w:r>
+    </w:p>
+    <w:p>
+      <w:pPr>
+        <w:pStyle w:val="ListBullet"/>
+        <w:numPr>
+          <w:ilvl w:val="0"/>
+          <w:numId w:val="14"/>
+        </w:numPr>
+      </w:pPr>
+      <w:r>
+        <w:rPr>
+          <w:rFonts w:ascii="Calibri" w:hAnsi="Calibri"/>
+          <w:color w:val="111827"/>
+          <w:sz w:val="22"/>
+        </w:rPr>
+        <w:t>Gateway payload transformation, SOME/IP, DoIP, VLAN scheduling, and traffic shaping remain deferred.</w:t>
+      </w:r>
+    </w:p>
+    <w:p>
+      <w:pPr>
         <w:pStyle w:val="Heading1"/>
         <w:keepNext/>
         <w:keepLines/>
@@ -11851,7 +13787,7 @@
           <w:color w:val="111827"/>
           <w:sz w:val="22"/>
         </w:rPr>
-        <w:t xml:space="preserve">The recommended next increment is IV-6: LIN and automotive Ethernet adapters plus deterministic gateway routing. See </w:t>
+        <w:t xml:space="preserve">The recommended next increment is IV-7: multi-bus campaigns, traces, performance evidence, and integrated failure scenarios. See </w:t>
       </w:r>
       <w:r>
         <w:rPr>
@@ -12563,7 +14499,7 @@
         <w:color w:val="667085"/>
         <w:sz w:val="17"/>
       </w:rPr>
-      <w:t>ATEP Volume IV Workbook  |  Version 0.5.0</w:t>
+      <w:t>ATEP Volume IV Workbook  |  Version 0.6.0</w:t>
     </w:r>
     <w:r>
       <w:rPr>

</xml_diff>

<commit_message>
feat(can): add deterministic multibus campaigns
</commit_message>
<xml_diff>
--- a/docs/ATEP_Volume_IV_CAN_Network_Engineering_Workbook.docx
+++ b/docs/ATEP_Volume_IV_CAN_Network_Engineering_Workbook.docx
@@ -143,7 +143,7 @@
                 <w:color w:val="0B2545"/>
                 <w:sz w:val="19"/>
               </w:rPr>
-              <w:t>0.6.0</w:t>
+              <w:t>0.7.0</w:t>
             </w:r>
           </w:p>
         </w:tc>
@@ -265,7 +265,7 @@
                 <w:color w:val="111827"/>
                 <w:sz w:val="19"/>
               </w:rPr>
-              <w:t>Implemented increments: IV-1 to IV-6</w:t>
+              <w:t>Implemented increments: IV-1 to IV-7</w:t>
             </w:r>
           </w:p>
         </w:tc>
@@ -893,7 +893,7 @@
                 <w:color w:val="111827"/>
                 <w:sz w:val="17"/>
               </w:rPr>
-              <w:t>Increments IV-1 through IV-6</w:t>
+              <w:t>Increments IV-1 through IV-7</w:t>
             </w:r>
           </w:p>
         </w:tc>
@@ -1738,6 +1738,95 @@
                 <w:sz w:val="17"/>
               </w:rPr>
               <w:t>Added bounded LIN and automotive Ethernet contracts, cross-protocol gateway routing, deterministic protocol timing, replay-safe evidence, APIs, migration, and tests.</w:t>
+            </w:r>
+          </w:p>
+        </w:tc>
+      </w:tr>
+      <w:tr>
+        <w:trPr>
+          <w:cantSplit/>
+        </w:trPr>
+        <w:tc>
+          <w:tcPr>
+            <w:tcW w:type="dxa" w:w="1650"/>
+            <w:tcMar>
+              <w:top w:w="80" w:type="dxa"/>
+              <w:start w:w="120" w:type="dxa"/>
+              <w:bottom w:w="80" w:type="dxa"/>
+              <w:end w:w="120" w:type="dxa"/>
+            </w:tcMar>
+            <w:vAlign w:val="center"/>
+            <w:shd w:fill="FFFFFF"/>
+          </w:tcPr>
+          <w:p>
+            <w:pPr>
+              <w:spacing w:before="0" w:after="40" w:line="252" w:lineRule="auto"/>
+              <w:jc w:val="center"/>
+            </w:pPr>
+            <w:r>
+              <w:rPr>
+                <w:rFonts w:ascii="Calibri" w:hAnsi="Calibri"/>
+                <w:b w:val="0"/>
+                <w:color w:val="111827"/>
+                <w:sz w:val="17"/>
+              </w:rPr>
+              <w:t>0.7.0</w:t>
+            </w:r>
+          </w:p>
+        </w:tc>
+        <w:tc>
+          <w:tcPr>
+            <w:tcW w:type="dxa" w:w="4450"/>
+            <w:tcMar>
+              <w:top w:w="80" w:type="dxa"/>
+              <w:start w:w="120" w:type="dxa"/>
+              <w:bottom w:w="80" w:type="dxa"/>
+              <w:end w:w="120" w:type="dxa"/>
+            </w:tcMar>
+            <w:vAlign w:val="center"/>
+            <w:shd w:fill="FFFFFF"/>
+          </w:tcPr>
+          <w:p>
+            <w:pPr>
+              <w:spacing w:before="0" w:after="40" w:line="252" w:lineRule="auto"/>
+              <w:jc w:val="left"/>
+            </w:pPr>
+            <w:r>
+              <w:rPr>
+                <w:rFonts w:ascii="Calibri" w:hAnsi="Calibri"/>
+                <w:b w:val="0"/>
+                <w:color w:val="111827"/>
+                <w:sz w:val="17"/>
+              </w:rPr>
+              <w:t>2026-08-25</w:t>
+            </w:r>
+          </w:p>
+        </w:tc>
+        <w:tc>
+          <w:tcPr>
+            <w:tcW w:type="dxa" w:w="3260"/>
+            <w:tcMar>
+              <w:top w:w="80" w:type="dxa"/>
+              <w:start w:w="120" w:type="dxa"/>
+              <w:bottom w:w="80" w:type="dxa"/>
+              <w:end w:w="120" w:type="dxa"/>
+            </w:tcMar>
+            <w:vAlign w:val="center"/>
+            <w:shd w:fill="FFFFFF"/>
+          </w:tcPr>
+          <w:p>
+            <w:pPr>
+              <w:spacing w:before="0" w:after="40" w:line="252" w:lineRule="auto"/>
+              <w:jc w:val="left"/>
+            </w:pPr>
+            <w:r>
+              <w:rPr>
+                <w:rFonts w:ascii="Calibri" w:hAnsi="Calibri"/>
+                <w:b w:val="0"/>
+                <w:color w:val="111827"/>
+                <w:sz w:val="17"/>
+              </w:rPr>
+              <w:t>Added atomic multi-bus campaigns, ordered traces, deterministic performance metrics, integrated failure scenarios, fingerprinted replay, APIs, migration, and tests.</w:t>
             </w:r>
           </w:p>
         </w:tc>
@@ -2110,6 +2199,40 @@
     </w:p>
     <w:p>
       <w:pPr>
+        <w:pStyle w:val="ListBullet"/>
+        <w:numPr>
+          <w:ilvl w:val="0"/>
+          <w:numId w:val="11"/>
+        </w:numPr>
+      </w:pPr>
+      <w:r>
+        <w:rPr>
+          <w:rFonts w:ascii="Calibri" w:hAnsi="Calibri"/>
+          <w:color w:val="111827"/>
+          <w:sz w:val="22"/>
+        </w:rPr>
+        <w:t>Atomic campaigns of one to 64 route steps with latency budgets and integrated fault modes.</w:t>
+      </w:r>
+    </w:p>
+    <w:p>
+      <w:pPr>
+        <w:pStyle w:val="ListBullet"/>
+        <w:numPr>
+          <w:ilvl w:val="0"/>
+          <w:numId w:val="11"/>
+        </w:numPr>
+      </w:pPr>
+      <w:r>
+        <w:rPr>
+          <w:rFonts w:ascii="Calibri" w:hAnsi="Calibri"/>
+          <w:color w:val="111827"/>
+          <w:sz w:val="22"/>
+        </w:rPr>
+        <w:t>Ordered payload-free traces, utilization, maximum and p95 latency, protocol and outcome metrics.</w:t>
+      </w:r>
+    </w:p>
+    <w:p>
+      <w:pPr>
         <w:pStyle w:val="Heading2"/>
         <w:keepNext/>
         <w:keepLines/>
@@ -2407,6 +2530,24 @@
     <w:p>
       <w:r>
         <w:rPr>
+          <w:rFonts w:ascii="Consolas" w:hAnsi="Consolas"/>
+          <w:color w:val="1F4D78"/>
+          <w:sz w:val="19"/>
+        </w:rPr>
+        <w:t>MultiBusCampaignExecution</w:t>
+      </w:r>
+      <w:r>
+        <w:rPr>
+          <w:rFonts w:ascii="Calibri" w:hAnsi="Calibri"/>
+          <w:color w:val="111827"/>
+          <w:sz w:val="22"/>
+        </w:rPr>
+        <w:t xml:space="preserve"> stores a canonical SHA-256 request fingerprint, payload-free request summary, passed/degraded/failed status, ordered trace, deterministic performance result, aggregate versions, and actor. The service prevalidates all steps before mutating logical time or sequence.</w:t>
+      </w:r>
+    </w:p>
+    <w:p>
+      <w:r>
+        <w:rPr>
           <w:rFonts w:ascii="Calibri" w:hAnsi="Calibri"/>
           <w:color w:val="111827"/>
           <w:sz w:val="22"/>
@@ -5017,6 +5158,357 @@
                 <w:sz w:val="16"/>
               </w:rPr>
               <w:t>Retrieve multi-bus evidence.</w:t>
+            </w:r>
+          </w:p>
+        </w:tc>
+      </w:tr>
+      <w:tr>
+        <w:trPr>
+          <w:cantSplit/>
+        </w:trPr>
+        <w:tc>
+          <w:tcPr>
+            <w:tcW w:type="dxa" w:w="1150"/>
+            <w:tcMar>
+              <w:top w:w="80" w:type="dxa"/>
+              <w:start w:w="120" w:type="dxa"/>
+              <w:bottom w:w="80" w:type="dxa"/>
+              <w:end w:w="120" w:type="dxa"/>
+            </w:tcMar>
+            <w:vAlign w:val="center"/>
+            <w:shd w:fill="FFFFFF"/>
+          </w:tcPr>
+          <w:p>
+            <w:pPr>
+              <w:spacing w:before="0" w:after="40" w:line="252" w:lineRule="auto"/>
+              <w:jc w:val="center"/>
+            </w:pPr>
+            <w:r>
+              <w:rPr>
+                <w:rFonts w:ascii="Calibri" w:hAnsi="Calibri"/>
+                <w:b w:val="0"/>
+                <w:color w:val="111827"/>
+                <w:sz w:val="16"/>
+              </w:rPr>
+              <w:t>POST</w:t>
+            </w:r>
+          </w:p>
+        </w:tc>
+        <w:tc>
+          <w:tcPr>
+            <w:tcW w:type="dxa" w:w="3700"/>
+            <w:tcMar>
+              <w:top w:w="80" w:type="dxa"/>
+              <w:start w:w="120" w:type="dxa"/>
+              <w:bottom w:w="80" w:type="dxa"/>
+              <w:end w:w="120" w:type="dxa"/>
+            </w:tcMar>
+            <w:vAlign w:val="center"/>
+            <w:shd w:fill="FFFFFF"/>
+          </w:tcPr>
+          <w:p>
+            <w:pPr>
+              <w:spacing w:before="0" w:after="40" w:line="252" w:lineRule="auto"/>
+              <w:jc w:val="left"/>
+            </w:pPr>
+            <w:r>
+              <w:rPr>
+                <w:rFonts w:ascii="Calibri" w:hAnsi="Calibri"/>
+                <w:b w:val="0"/>
+                <w:color w:val="111827"/>
+                <w:sz w:val="16"/>
+              </w:rPr>
+              <w:t>/api/v1/vehicles/{vehicle_id}/can-networks/multibus/campaigns/execute</w:t>
+            </w:r>
+          </w:p>
+        </w:tc>
+        <w:tc>
+          <w:tcPr>
+            <w:tcW w:type="dxa" w:w="3100"/>
+            <w:tcMar>
+              <w:top w:w="80" w:type="dxa"/>
+              <w:start w:w="120" w:type="dxa"/>
+              <w:bottom w:w="80" w:type="dxa"/>
+              <w:end w:w="120" w:type="dxa"/>
+            </w:tcMar>
+            <w:vAlign w:val="center"/>
+            <w:shd w:fill="FFFFFF"/>
+          </w:tcPr>
+          <w:p>
+            <w:pPr>
+              <w:spacing w:before="0" w:after="40" w:line="252" w:lineRule="auto"/>
+              <w:jc w:val="left"/>
+            </w:pPr>
+            <w:r>
+              <w:rPr>
+                <w:rFonts w:ascii="Calibri" w:hAnsi="Calibri"/>
+                <w:b w:val="0"/>
+                <w:color w:val="111827"/>
+                <w:sz w:val="16"/>
+              </w:rPr>
+              <w:t>can_networks:manage</w:t>
+            </w:r>
+          </w:p>
+        </w:tc>
+        <w:tc>
+          <w:tcPr>
+            <w:tcW w:type="dxa" w:w="1410"/>
+            <w:tcMar>
+              <w:top w:w="80" w:type="dxa"/>
+              <w:start w:w="120" w:type="dxa"/>
+              <w:bottom w:w="80" w:type="dxa"/>
+              <w:end w:w="120" w:type="dxa"/>
+            </w:tcMar>
+            <w:vAlign w:val="center"/>
+            <w:shd w:fill="FFFFFF"/>
+          </w:tcPr>
+          <w:p>
+            <w:pPr>
+              <w:spacing w:before="0" w:after="40" w:line="252" w:lineRule="auto"/>
+              <w:jc w:val="left"/>
+            </w:pPr>
+            <w:r>
+              <w:rPr>
+                <w:rFonts w:ascii="Calibri" w:hAnsi="Calibri"/>
+                <w:b w:val="0"/>
+                <w:color w:val="111827"/>
+                <w:sz w:val="16"/>
+              </w:rPr>
+              <w:t>Execute an atomic bounded campaign.</w:t>
+            </w:r>
+          </w:p>
+        </w:tc>
+      </w:tr>
+      <w:tr>
+        <w:trPr>
+          <w:cantSplit/>
+        </w:trPr>
+        <w:tc>
+          <w:tcPr>
+            <w:tcW w:type="dxa" w:w="1150"/>
+            <w:tcMar>
+              <w:top w:w="80" w:type="dxa"/>
+              <w:start w:w="120" w:type="dxa"/>
+              <w:bottom w:w="80" w:type="dxa"/>
+              <w:end w:w="120" w:type="dxa"/>
+            </w:tcMar>
+            <w:vAlign w:val="center"/>
+            <w:shd w:fill="FFFFFF"/>
+          </w:tcPr>
+          <w:p>
+            <w:pPr>
+              <w:spacing w:before="0" w:after="40" w:line="252" w:lineRule="auto"/>
+              <w:jc w:val="center"/>
+            </w:pPr>
+            <w:r>
+              <w:rPr>
+                <w:rFonts w:ascii="Calibri" w:hAnsi="Calibri"/>
+                <w:b w:val="0"/>
+                <w:color w:val="111827"/>
+                <w:sz w:val="16"/>
+              </w:rPr>
+              <w:t>GET</w:t>
+            </w:r>
+          </w:p>
+        </w:tc>
+        <w:tc>
+          <w:tcPr>
+            <w:tcW w:type="dxa" w:w="3700"/>
+            <w:tcMar>
+              <w:top w:w="80" w:type="dxa"/>
+              <w:start w:w="120" w:type="dxa"/>
+              <w:bottom w:w="80" w:type="dxa"/>
+              <w:end w:w="120" w:type="dxa"/>
+            </w:tcMar>
+            <w:vAlign w:val="center"/>
+            <w:shd w:fill="FFFFFF"/>
+          </w:tcPr>
+          <w:p>
+            <w:pPr>
+              <w:spacing w:before="0" w:after="40" w:line="252" w:lineRule="auto"/>
+              <w:jc w:val="left"/>
+            </w:pPr>
+            <w:r>
+              <w:rPr>
+                <w:rFonts w:ascii="Calibri" w:hAnsi="Calibri"/>
+                <w:b w:val="0"/>
+                <w:color w:val="111827"/>
+                <w:sz w:val="16"/>
+              </w:rPr>
+              <w:t>/api/v1/vehicles/{vehicle_id}/can-networks/multibus/campaigns</w:t>
+            </w:r>
+          </w:p>
+        </w:tc>
+        <w:tc>
+          <w:tcPr>
+            <w:tcW w:type="dxa" w:w="3100"/>
+            <w:tcMar>
+              <w:top w:w="80" w:type="dxa"/>
+              <w:start w:w="120" w:type="dxa"/>
+              <w:bottom w:w="80" w:type="dxa"/>
+              <w:end w:w="120" w:type="dxa"/>
+            </w:tcMar>
+            <w:vAlign w:val="center"/>
+            <w:shd w:fill="FFFFFF"/>
+          </w:tcPr>
+          <w:p>
+            <w:pPr>
+              <w:spacing w:before="0" w:after="40" w:line="252" w:lineRule="auto"/>
+              <w:jc w:val="left"/>
+            </w:pPr>
+            <w:r>
+              <w:rPr>
+                <w:rFonts w:ascii="Calibri" w:hAnsi="Calibri"/>
+                <w:b w:val="0"/>
+                <w:color w:val="111827"/>
+                <w:sz w:val="16"/>
+              </w:rPr>
+              <w:t>can_networks:read</w:t>
+            </w:r>
+          </w:p>
+        </w:tc>
+        <w:tc>
+          <w:tcPr>
+            <w:tcW w:type="dxa" w:w="1410"/>
+            <w:tcMar>
+              <w:top w:w="80" w:type="dxa"/>
+              <w:start w:w="120" w:type="dxa"/>
+              <w:bottom w:w="80" w:type="dxa"/>
+              <w:end w:w="120" w:type="dxa"/>
+            </w:tcMar>
+            <w:vAlign w:val="center"/>
+            <w:shd w:fill="FFFFFF"/>
+          </w:tcPr>
+          <w:p>
+            <w:pPr>
+              <w:spacing w:before="0" w:after="40" w:line="252" w:lineRule="auto"/>
+              <w:jc w:val="left"/>
+            </w:pPr>
+            <w:r>
+              <w:rPr>
+                <w:rFonts w:ascii="Calibri" w:hAnsi="Calibri"/>
+                <w:b w:val="0"/>
+                <w:color w:val="111827"/>
+                <w:sz w:val="16"/>
+              </w:rPr>
+              <w:t>List safely paginated campaign evidence.</w:t>
+            </w:r>
+          </w:p>
+        </w:tc>
+      </w:tr>
+      <w:tr>
+        <w:trPr>
+          <w:cantSplit/>
+        </w:trPr>
+        <w:tc>
+          <w:tcPr>
+            <w:tcW w:type="dxa" w:w="1150"/>
+            <w:tcMar>
+              <w:top w:w="80" w:type="dxa"/>
+              <w:start w:w="120" w:type="dxa"/>
+              <w:bottom w:w="80" w:type="dxa"/>
+              <w:end w:w="120" w:type="dxa"/>
+            </w:tcMar>
+            <w:vAlign w:val="center"/>
+            <w:shd w:fill="FFFFFF"/>
+          </w:tcPr>
+          <w:p>
+            <w:pPr>
+              <w:spacing w:before="0" w:after="40" w:line="252" w:lineRule="auto"/>
+              <w:jc w:val="center"/>
+            </w:pPr>
+            <w:r>
+              <w:rPr>
+                <w:rFonts w:ascii="Calibri" w:hAnsi="Calibri"/>
+                <w:b w:val="0"/>
+                <w:color w:val="111827"/>
+                <w:sz w:val="16"/>
+              </w:rPr>
+              <w:t>GET</w:t>
+            </w:r>
+          </w:p>
+        </w:tc>
+        <w:tc>
+          <w:tcPr>
+            <w:tcW w:type="dxa" w:w="3700"/>
+            <w:tcMar>
+              <w:top w:w="80" w:type="dxa"/>
+              <w:start w:w="120" w:type="dxa"/>
+              <w:bottom w:w="80" w:type="dxa"/>
+              <w:end w:w="120" w:type="dxa"/>
+            </w:tcMar>
+            <w:vAlign w:val="center"/>
+            <w:shd w:fill="FFFFFF"/>
+          </w:tcPr>
+          <w:p>
+            <w:pPr>
+              <w:spacing w:before="0" w:after="40" w:line="252" w:lineRule="auto"/>
+              <w:jc w:val="left"/>
+            </w:pPr>
+            <w:r>
+              <w:rPr>
+                <w:rFonts w:ascii="Calibri" w:hAnsi="Calibri"/>
+                <w:b w:val="0"/>
+                <w:color w:val="111827"/>
+                <w:sz w:val="16"/>
+              </w:rPr>
+              <w:t>/api/v1/vehicles/{vehicle_id}/can-networks/multibus/campaigns/{command_id}</w:t>
+            </w:r>
+          </w:p>
+        </w:tc>
+        <w:tc>
+          <w:tcPr>
+            <w:tcW w:type="dxa" w:w="3100"/>
+            <w:tcMar>
+              <w:top w:w="80" w:type="dxa"/>
+              <w:start w:w="120" w:type="dxa"/>
+              <w:bottom w:w="80" w:type="dxa"/>
+              <w:end w:w="120" w:type="dxa"/>
+            </w:tcMar>
+            <w:vAlign w:val="center"/>
+            <w:shd w:fill="FFFFFF"/>
+          </w:tcPr>
+          <w:p>
+            <w:pPr>
+              <w:spacing w:before="0" w:after="40" w:line="252" w:lineRule="auto"/>
+              <w:jc w:val="left"/>
+            </w:pPr>
+            <w:r>
+              <w:rPr>
+                <w:rFonts w:ascii="Calibri" w:hAnsi="Calibri"/>
+                <w:b w:val="0"/>
+                <w:color w:val="111827"/>
+                <w:sz w:val="16"/>
+              </w:rPr>
+              <w:t>can_networks:read</w:t>
+            </w:r>
+          </w:p>
+        </w:tc>
+        <w:tc>
+          <w:tcPr>
+            <w:tcW w:type="dxa" w:w="1410"/>
+            <w:tcMar>
+              <w:top w:w="80" w:type="dxa"/>
+              <w:start w:w="120" w:type="dxa"/>
+              <w:bottom w:w="80" w:type="dxa"/>
+              <w:end w:w="120" w:type="dxa"/>
+            </w:tcMar>
+            <w:vAlign w:val="center"/>
+            <w:shd w:fill="FFFFFF"/>
+          </w:tcPr>
+          <w:p>
+            <w:pPr>
+              <w:spacing w:before="0" w:after="40" w:line="252" w:lineRule="auto"/>
+              <w:jc w:val="left"/>
+            </w:pPr>
+            <w:r>
+              <w:rPr>
+                <w:rFonts w:ascii="Calibri" w:hAnsi="Calibri"/>
+                <w:b w:val="0"/>
+                <w:color w:val="111827"/>
+                <w:sz w:val="16"/>
+              </w:rPr>
+              <w:t>Retrieve one campaign trace and result.</w:t>
             </w:r>
           </w:p>
         </w:tc>
@@ -5407,6 +5899,94 @@
     </w:p>
     <w:p>
       <w:pPr>
+        <w:pStyle w:val="Heading2"/>
+        <w:keepNext/>
+        <w:keepLines/>
+      </w:pPr>
+      <w:r>
+        <w:t>8.6 Campaign, Trace, and Performance Semantics</w:t>
+      </w:r>
+    </w:p>
+    <w:p>
+      <w:r>
+        <w:rPr>
+          <w:rFonts w:ascii="Calibri" w:hAnsi="Calibri"/>
+          <w:color w:val="111827"/>
+          <w:sz w:val="22"/>
+        </w:rPr>
+        <w:t>A campaign contains one to 64 uniquely identified route steps. Each step supplies its payload, logical advance, optional latency budget, and explicit fault mode. All routes and payload lengths are validated before the first mutation, so a rejected campaign cannot partially advance the aggregate.</w:t>
+      </w:r>
+    </w:p>
+    <w:p>
+      <w:r>
+        <w:rPr>
+          <w:rFonts w:ascii="Calibri" w:hAnsi="Calibri"/>
+          <w:color w:val="111827"/>
+          <w:sz w:val="22"/>
+        </w:rPr>
+        <w:t>Normal and frame-loss steps consume destination-protocol duration and one sequence. Frame loss records failed delivery after consuming bus time. A gateway-unavailable step consumes only its requested idle advance and allocates no sequence. The ordered trace records route and protocol identity, outcome, fault, budget result, logical start/completion, duration, and timing metadata, but never payload byte values.</w:t>
+      </w:r>
+    </w:p>
+    <w:p>
+      <w:r>
+        <w:rPr>
+          <w:rFonts w:ascii="Calibri" w:hAnsi="Calibri"/>
+          <w:color w:val="111827"/>
+          <w:sz w:val="22"/>
+        </w:rPr>
+        <w:t xml:space="preserve">Campaign evidence derives total window, occupied and idle microseconds, utilization percentage, maximum latency, nearest-rank p95 latency, protocol counts, delivery/failure counts, and latency budget violations. Status is </w:t>
+      </w:r>
+      <w:r>
+        <w:rPr>
+          <w:rFonts w:ascii="Consolas" w:hAnsi="Consolas"/>
+          <w:color w:val="1F4D78"/>
+          <w:sz w:val="19"/>
+        </w:rPr>
+        <w:t>passed</w:t>
+      </w:r>
+      <w:r>
+        <w:rPr>
+          <w:rFonts w:ascii="Calibri" w:hAnsi="Calibri"/>
+          <w:color w:val="111827"/>
+          <w:sz w:val="22"/>
+        </w:rPr>
+        <w:t xml:space="preserve">, </w:t>
+      </w:r>
+      <w:r>
+        <w:rPr>
+          <w:rFonts w:ascii="Consolas" w:hAnsi="Consolas"/>
+          <w:color w:val="1F4D78"/>
+          <w:sz w:val="19"/>
+        </w:rPr>
+        <w:t>performance_degraded</w:t>
+      </w:r>
+      <w:r>
+        <w:rPr>
+          <w:rFonts w:ascii="Calibri" w:hAnsi="Calibri"/>
+          <w:color w:val="111827"/>
+          <w:sz w:val="22"/>
+        </w:rPr>
+        <w:t xml:space="preserve">, or </w:t>
+      </w:r>
+      <w:r>
+        <w:rPr>
+          <w:rFonts w:ascii="Consolas" w:hAnsi="Consolas"/>
+          <w:color w:val="1F4D78"/>
+          <w:sz w:val="19"/>
+        </w:rPr>
+        <w:t>failed</w:t>
+      </w:r>
+      <w:r>
+        <w:rPr>
+          <w:rFonts w:ascii="Calibri" w:hAnsi="Calibri"/>
+          <w:color w:val="111827"/>
+          <w:sz w:val="22"/>
+        </w:rPr>
+        <w:t>. One campaign increments the aggregate version once. A canonical SHA-256 fingerprint distinguishes an exact retry from changed command reuse without persisting payload values in the request summary.</w:t>
+      </w:r>
+    </w:p>
+    <w:p>
+      <w:pPr>
         <w:pStyle w:val="Heading1"/>
         <w:keepNext/>
         <w:keepLines/>
@@ -5438,7 +6018,7 @@
           <w:color w:val="111827"/>
           <w:sz w:val="22"/>
         </w:rPr>
-        <w:t>. IV-1 through IV-6 implement CAN-F-001 through CAN-F-060 and CAN-NF-001 through CAN-NF-020.</w:t>
+        <w:t>. IV-1 through IV-7 implement CAN-F-001 through CAN-F-070 and CAN-NF-001 through CAN-NF-023.</w:t>
       </w:r>
     </w:p>
     <w:p>
@@ -5809,6 +6389,46 @@
     </w:p>
     <w:p>
       <w:pPr>
+        <w:pStyle w:val="Heading2"/>
+        <w:keepNext/>
+        <w:keepLines/>
+      </w:pPr>
+      <w:r>
+        <w:t>ADR-CAN-018 - Execute Campaigns as One Aggregate Transaction</w:t>
+      </w:r>
+    </w:p>
+    <w:p>
+      <w:r>
+        <w:rPr>
+          <w:rFonts w:ascii="Calibri" w:hAnsi="Calibri"/>
+          <w:color w:val="111827"/>
+          <w:sz w:val="22"/>
+        </w:rPr>
+        <w:t>All steps are prevalidated and then applied under one network row lock. This prevents partial campaign state, makes one version represent one test action, and preserves deterministic sequence and logical-time evidence across normal and failed routes.</w:t>
+      </w:r>
+    </w:p>
+    <w:p>
+      <w:pPr>
+        <w:pStyle w:val="Heading2"/>
+        <w:keepNext/>
+        <w:keepLines/>
+      </w:pPr>
+      <w:r>
+        <w:t>ADR-CAN-019 - Fingerprint Full Input and Persist Minimized Summaries</w:t>
+      </w:r>
+    </w:p>
+    <w:p>
+      <w:r>
+        <w:rPr>
+          <w:rFonts w:ascii="Calibri" w:hAnsi="Calibri"/>
+          <w:color w:val="111827"/>
+          <w:sz w:val="22"/>
+        </w:rPr>
+        <w:t>Exact idempotency must account for payload values, but traces and queryable metadata do not need them. The service hashes canonical full input and persists only lengths and control fields alongside the fingerprint, reducing sensitive evidence duplication without weakening conflict detection.</w:t>
+      </w:r>
+    </w:p>
+    <w:p>
+      <w:pPr>
         <w:pStyle w:val="Heading1"/>
         <w:keepNext/>
         <w:keepLines/>
@@ -13123,6 +13743,1252 @@
                 <w:sz w:val="17"/>
               </w:rPr>
               <w:t>Upgrade and downgrade contracts and execution evidence.</w:t>
+            </w:r>
+          </w:p>
+        </w:tc>
+        <w:tc>
+          <w:tcPr>
+            <w:tcW w:type="dxa" w:w="3260"/>
+            <w:tcMar>
+              <w:top w:w="80" w:type="dxa"/>
+              <w:start w:w="120" w:type="dxa"/>
+              <w:bottom w:w="80" w:type="dxa"/>
+              <w:end w:w="120" w:type="dxa"/>
+            </w:tcMar>
+            <w:vAlign w:val="center"/>
+            <w:shd w:fill="FFFFFF"/>
+          </w:tcPr>
+          <w:p>
+            <w:pPr>
+              <w:spacing w:before="0" w:after="40" w:line="252" w:lineRule="auto"/>
+              <w:jc w:val="left"/>
+            </w:pPr>
+            <w:r>
+              <w:rPr>
+                <w:rFonts w:ascii="Calibri" w:hAnsi="Calibri"/>
+                <w:b w:val="0"/>
+                <w:color w:val="111827"/>
+                <w:sz w:val="17"/>
+              </w:rPr>
+              <w:t>Integration</w:t>
+            </w:r>
+          </w:p>
+        </w:tc>
+      </w:tr>
+      <w:tr>
+        <w:trPr>
+          <w:cantSplit/>
+        </w:trPr>
+        <w:tc>
+          <w:tcPr>
+            <w:tcW w:type="dxa" w:w="1650"/>
+            <w:tcMar>
+              <w:top w:w="80" w:type="dxa"/>
+              <w:start w:w="120" w:type="dxa"/>
+              <w:bottom w:w="80" w:type="dxa"/>
+              <w:end w:w="120" w:type="dxa"/>
+            </w:tcMar>
+            <w:vAlign w:val="center"/>
+            <w:shd w:fill="FFFFFF"/>
+          </w:tcPr>
+          <w:p>
+            <w:pPr>
+              <w:spacing w:before="0" w:after="40" w:line="252" w:lineRule="auto"/>
+              <w:jc w:val="center"/>
+            </w:pPr>
+            <w:r>
+              <w:rPr>
+                <w:rFonts w:ascii="Calibri" w:hAnsi="Calibri"/>
+                <w:b w:val="0"/>
+                <w:color w:val="111827"/>
+                <w:sz w:val="17"/>
+              </w:rPr>
+              <w:t>Campaign bounds</w:t>
+            </w:r>
+          </w:p>
+        </w:tc>
+        <w:tc>
+          <w:tcPr>
+            <w:tcW w:type="dxa" w:w="4450"/>
+            <w:tcMar>
+              <w:top w:w="80" w:type="dxa"/>
+              <w:start w:w="120" w:type="dxa"/>
+              <w:bottom w:w="80" w:type="dxa"/>
+              <w:end w:w="120" w:type="dxa"/>
+            </w:tcMar>
+            <w:vAlign w:val="center"/>
+            <w:shd w:fill="FFFFFF"/>
+          </w:tcPr>
+          <w:p>
+            <w:pPr>
+              <w:spacing w:before="0" w:after="40" w:line="252" w:lineRule="auto"/>
+              <w:jc w:val="left"/>
+            </w:pPr>
+            <w:r>
+              <w:rPr>
+                <w:rFonts w:ascii="Calibri" w:hAnsi="Calibri"/>
+                <w:b w:val="0"/>
+                <w:color w:val="111827"/>
+                <w:sz w:val="17"/>
+              </w:rPr>
+              <w:t>Reject zero, duplicate, or more than 64 campaign steps.</w:t>
+            </w:r>
+          </w:p>
+        </w:tc>
+        <w:tc>
+          <w:tcPr>
+            <w:tcW w:type="dxa" w:w="3260"/>
+            <w:tcMar>
+              <w:top w:w="80" w:type="dxa"/>
+              <w:start w:w="120" w:type="dxa"/>
+              <w:bottom w:w="80" w:type="dxa"/>
+              <w:end w:w="120" w:type="dxa"/>
+            </w:tcMar>
+            <w:vAlign w:val="center"/>
+            <w:shd w:fill="FFFFFF"/>
+          </w:tcPr>
+          <w:p>
+            <w:pPr>
+              <w:spacing w:before="0" w:after="40" w:line="252" w:lineRule="auto"/>
+              <w:jc w:val="left"/>
+            </w:pPr>
+            <w:r>
+              <w:rPr>
+                <w:rFonts w:ascii="Calibri" w:hAnsi="Calibri"/>
+                <w:b w:val="0"/>
+                <w:color w:val="111827"/>
+                <w:sz w:val="17"/>
+              </w:rPr>
+              <w:t>Schema</w:t>
+            </w:r>
+          </w:p>
+        </w:tc>
+      </w:tr>
+      <w:tr>
+        <w:trPr>
+          <w:cantSplit/>
+        </w:trPr>
+        <w:tc>
+          <w:tcPr>
+            <w:tcW w:type="dxa" w:w="1650"/>
+            <w:tcMar>
+              <w:top w:w="80" w:type="dxa"/>
+              <w:start w:w="120" w:type="dxa"/>
+              <w:bottom w:w="80" w:type="dxa"/>
+              <w:end w:w="120" w:type="dxa"/>
+            </w:tcMar>
+            <w:vAlign w:val="center"/>
+            <w:shd w:fill="FFFFFF"/>
+          </w:tcPr>
+          <w:p>
+            <w:pPr>
+              <w:spacing w:before="0" w:after="40" w:line="252" w:lineRule="auto"/>
+              <w:jc w:val="center"/>
+            </w:pPr>
+            <w:r>
+              <w:rPr>
+                <w:rFonts w:ascii="Calibri" w:hAnsi="Calibri"/>
+                <w:b w:val="0"/>
+                <w:color w:val="111827"/>
+                <w:sz w:val="17"/>
+              </w:rPr>
+              <w:t>Campaign prevalidation</w:t>
+            </w:r>
+          </w:p>
+        </w:tc>
+        <w:tc>
+          <w:tcPr>
+            <w:tcW w:type="dxa" w:w="4450"/>
+            <w:tcMar>
+              <w:top w:w="80" w:type="dxa"/>
+              <w:start w:w="120" w:type="dxa"/>
+              <w:bottom w:w="80" w:type="dxa"/>
+              <w:end w:w="120" w:type="dxa"/>
+            </w:tcMar>
+            <w:vAlign w:val="center"/>
+            <w:shd w:fill="FFFFFF"/>
+          </w:tcPr>
+          <w:p>
+            <w:pPr>
+              <w:spacing w:before="0" w:after="40" w:line="252" w:lineRule="auto"/>
+              <w:jc w:val="left"/>
+            </w:pPr>
+            <w:r>
+              <w:rPr>
+                <w:rFonts w:ascii="Calibri" w:hAnsi="Calibri"/>
+                <w:b w:val="0"/>
+                <w:color w:val="111827"/>
+                <w:sz w:val="17"/>
+              </w:rPr>
+              <w:t>Reject an invalid route or payload before any state mutation.</w:t>
+            </w:r>
+          </w:p>
+        </w:tc>
+        <w:tc>
+          <w:tcPr>
+            <w:tcW w:type="dxa" w:w="3260"/>
+            <w:tcMar>
+              <w:top w:w="80" w:type="dxa"/>
+              <w:start w:w="120" w:type="dxa"/>
+              <w:bottom w:w="80" w:type="dxa"/>
+              <w:end w:w="120" w:type="dxa"/>
+            </w:tcMar>
+            <w:vAlign w:val="center"/>
+            <w:shd w:fill="FFFFFF"/>
+          </w:tcPr>
+          <w:p>
+            <w:pPr>
+              <w:spacing w:before="0" w:after="40" w:line="252" w:lineRule="auto"/>
+              <w:jc w:val="left"/>
+            </w:pPr>
+            <w:r>
+              <w:rPr>
+                <w:rFonts w:ascii="Calibri" w:hAnsi="Calibri"/>
+                <w:b w:val="0"/>
+                <w:color w:val="111827"/>
+                <w:sz w:val="17"/>
+              </w:rPr>
+              <w:t>Service</w:t>
+            </w:r>
+          </w:p>
+        </w:tc>
+      </w:tr>
+      <w:tr>
+        <w:trPr>
+          <w:cantSplit/>
+        </w:trPr>
+        <w:tc>
+          <w:tcPr>
+            <w:tcW w:type="dxa" w:w="1650"/>
+            <w:tcMar>
+              <w:top w:w="80" w:type="dxa"/>
+              <w:start w:w="120" w:type="dxa"/>
+              <w:bottom w:w="80" w:type="dxa"/>
+              <w:end w:w="120" w:type="dxa"/>
+            </w:tcMar>
+            <w:vAlign w:val="center"/>
+            <w:shd w:fill="FFFFFF"/>
+          </w:tcPr>
+          <w:p>
+            <w:pPr>
+              <w:spacing w:before="0" w:after="40" w:line="252" w:lineRule="auto"/>
+              <w:jc w:val="center"/>
+            </w:pPr>
+            <w:r>
+              <w:rPr>
+                <w:rFonts w:ascii="Calibri" w:hAnsi="Calibri"/>
+                <w:b w:val="0"/>
+                <w:color w:val="111827"/>
+                <w:sz w:val="17"/>
+              </w:rPr>
+              <w:t>Campaign ordering</w:t>
+            </w:r>
+          </w:p>
+        </w:tc>
+        <w:tc>
+          <w:tcPr>
+            <w:tcW w:type="dxa" w:w="4450"/>
+            <w:tcMar>
+              <w:top w:w="80" w:type="dxa"/>
+              <w:start w:w="120" w:type="dxa"/>
+              <w:bottom w:w="80" w:type="dxa"/>
+              <w:end w:w="120" w:type="dxa"/>
+            </w:tcMar>
+            <w:vAlign w:val="center"/>
+            <w:shd w:fill="FFFFFF"/>
+          </w:tcPr>
+          <w:p>
+            <w:pPr>
+              <w:spacing w:before="0" w:after="40" w:line="252" w:lineRule="auto"/>
+              <w:jc w:val="left"/>
+            </w:pPr>
+            <w:r>
+              <w:rPr>
+                <w:rFonts w:ascii="Calibri" w:hAnsi="Calibri"/>
+                <w:b w:val="0"/>
+                <w:color w:val="111827"/>
+                <w:sz w:val="17"/>
+              </w:rPr>
+              <w:t>Preserve declared step order in trace and sequence evidence.</w:t>
+            </w:r>
+          </w:p>
+        </w:tc>
+        <w:tc>
+          <w:tcPr>
+            <w:tcW w:type="dxa" w:w="3260"/>
+            <w:tcMar>
+              <w:top w:w="80" w:type="dxa"/>
+              <w:start w:w="120" w:type="dxa"/>
+              <w:bottom w:w="80" w:type="dxa"/>
+              <w:end w:w="120" w:type="dxa"/>
+            </w:tcMar>
+            <w:vAlign w:val="center"/>
+            <w:shd w:fill="FFFFFF"/>
+          </w:tcPr>
+          <w:p>
+            <w:pPr>
+              <w:spacing w:before="0" w:after="40" w:line="252" w:lineRule="auto"/>
+              <w:jc w:val="left"/>
+            </w:pPr>
+            <w:r>
+              <w:rPr>
+                <w:rFonts w:ascii="Calibri" w:hAnsi="Calibri"/>
+                <w:b w:val="0"/>
+                <w:color w:val="111827"/>
+                <w:sz w:val="17"/>
+              </w:rPr>
+              <w:t>Service</w:t>
+            </w:r>
+          </w:p>
+        </w:tc>
+      </w:tr>
+      <w:tr>
+        <w:trPr>
+          <w:cantSplit/>
+        </w:trPr>
+        <w:tc>
+          <w:tcPr>
+            <w:tcW w:type="dxa" w:w="1650"/>
+            <w:tcMar>
+              <w:top w:w="80" w:type="dxa"/>
+              <w:start w:w="120" w:type="dxa"/>
+              <w:bottom w:w="80" w:type="dxa"/>
+              <w:end w:w="120" w:type="dxa"/>
+            </w:tcMar>
+            <w:vAlign w:val="center"/>
+            <w:shd w:fill="FFFFFF"/>
+          </w:tcPr>
+          <w:p>
+            <w:pPr>
+              <w:spacing w:before="0" w:after="40" w:line="252" w:lineRule="auto"/>
+              <w:jc w:val="center"/>
+            </w:pPr>
+            <w:r>
+              <w:rPr>
+                <w:rFonts w:ascii="Calibri" w:hAnsi="Calibri"/>
+                <w:b w:val="0"/>
+                <w:color w:val="111827"/>
+                <w:sz w:val="17"/>
+              </w:rPr>
+              <w:t>Campaign timing</w:t>
+            </w:r>
+          </w:p>
+        </w:tc>
+        <w:tc>
+          <w:tcPr>
+            <w:tcW w:type="dxa" w:w="4450"/>
+            <w:tcMar>
+              <w:top w:w="80" w:type="dxa"/>
+              <w:start w:w="120" w:type="dxa"/>
+              <w:bottom w:w="80" w:type="dxa"/>
+              <w:end w:w="120" w:type="dxa"/>
+            </w:tcMar>
+            <w:vAlign w:val="center"/>
+            <w:shd w:fill="FFFFFF"/>
+          </w:tcPr>
+          <w:p>
+            <w:pPr>
+              <w:spacing w:before="0" w:after="40" w:line="252" w:lineRule="auto"/>
+              <w:jc w:val="left"/>
+            </w:pPr>
+            <w:r>
+              <w:rPr>
+                <w:rFonts w:ascii="Calibri" w:hAnsi="Calibri"/>
+                <w:b w:val="0"/>
+                <w:color w:val="111827"/>
+                <w:sz w:val="17"/>
+              </w:rPr>
+              <w:t>Derive idle, occupied, window, and utilization only from logical inputs.</w:t>
+            </w:r>
+          </w:p>
+        </w:tc>
+        <w:tc>
+          <w:tcPr>
+            <w:tcW w:type="dxa" w:w="3260"/>
+            <w:tcMar>
+              <w:top w:w="80" w:type="dxa"/>
+              <w:start w:w="120" w:type="dxa"/>
+              <w:bottom w:w="80" w:type="dxa"/>
+              <w:end w:w="120" w:type="dxa"/>
+            </w:tcMar>
+            <w:vAlign w:val="center"/>
+            <w:shd w:fill="FFFFFF"/>
+          </w:tcPr>
+          <w:p>
+            <w:pPr>
+              <w:spacing w:before="0" w:after="40" w:line="252" w:lineRule="auto"/>
+              <w:jc w:val="left"/>
+            </w:pPr>
+            <w:r>
+              <w:rPr>
+                <w:rFonts w:ascii="Calibri" w:hAnsi="Calibri"/>
+                <w:b w:val="0"/>
+                <w:color w:val="111827"/>
+                <w:sz w:val="17"/>
+              </w:rPr>
+              <w:t>Unit/service</w:t>
+            </w:r>
+          </w:p>
+        </w:tc>
+      </w:tr>
+      <w:tr>
+        <w:trPr>
+          <w:cantSplit/>
+        </w:trPr>
+        <w:tc>
+          <w:tcPr>
+            <w:tcW w:type="dxa" w:w="1650"/>
+            <w:tcMar>
+              <w:top w:w="80" w:type="dxa"/>
+              <w:start w:w="120" w:type="dxa"/>
+              <w:bottom w:w="80" w:type="dxa"/>
+              <w:end w:w="120" w:type="dxa"/>
+            </w:tcMar>
+            <w:vAlign w:val="center"/>
+            <w:shd w:fill="FFFFFF"/>
+          </w:tcPr>
+          <w:p>
+            <w:pPr>
+              <w:spacing w:before="0" w:after="40" w:line="252" w:lineRule="auto"/>
+              <w:jc w:val="center"/>
+            </w:pPr>
+            <w:r>
+              <w:rPr>
+                <w:rFonts w:ascii="Calibri" w:hAnsi="Calibri"/>
+                <w:b w:val="0"/>
+                <w:color w:val="111827"/>
+                <w:sz w:val="17"/>
+              </w:rPr>
+              <w:t>Campaign percentile</w:t>
+            </w:r>
+          </w:p>
+        </w:tc>
+        <w:tc>
+          <w:tcPr>
+            <w:tcW w:type="dxa" w:w="4450"/>
+            <w:tcMar>
+              <w:top w:w="80" w:type="dxa"/>
+              <w:start w:w="120" w:type="dxa"/>
+              <w:bottom w:w="80" w:type="dxa"/>
+              <w:end w:w="120" w:type="dxa"/>
+            </w:tcMar>
+            <w:vAlign w:val="center"/>
+            <w:shd w:fill="FFFFFF"/>
+          </w:tcPr>
+          <w:p>
+            <w:pPr>
+              <w:spacing w:before="0" w:after="40" w:line="252" w:lineRule="auto"/>
+              <w:jc w:val="left"/>
+            </w:pPr>
+            <w:r>
+              <w:rPr>
+                <w:rFonts w:ascii="Calibri" w:hAnsi="Calibri"/>
+                <w:b w:val="0"/>
+                <w:color w:val="111827"/>
+                <w:sz w:val="17"/>
+              </w:rPr>
+              <w:t>Calculate nearest-rank p95 deterministically from routed durations.</w:t>
+            </w:r>
+          </w:p>
+        </w:tc>
+        <w:tc>
+          <w:tcPr>
+            <w:tcW w:type="dxa" w:w="3260"/>
+            <w:tcMar>
+              <w:top w:w="80" w:type="dxa"/>
+              <w:start w:w="120" w:type="dxa"/>
+              <w:bottom w:w="80" w:type="dxa"/>
+              <w:end w:w="120" w:type="dxa"/>
+            </w:tcMar>
+            <w:vAlign w:val="center"/>
+            <w:shd w:fill="FFFFFF"/>
+          </w:tcPr>
+          <w:p>
+            <w:pPr>
+              <w:spacing w:before="0" w:after="40" w:line="252" w:lineRule="auto"/>
+              <w:jc w:val="left"/>
+            </w:pPr>
+            <w:r>
+              <w:rPr>
+                <w:rFonts w:ascii="Calibri" w:hAnsi="Calibri"/>
+                <w:b w:val="0"/>
+                <w:color w:val="111827"/>
+                <w:sz w:val="17"/>
+              </w:rPr>
+              <w:t>Unit/service</w:t>
+            </w:r>
+          </w:p>
+        </w:tc>
+      </w:tr>
+      <w:tr>
+        <w:trPr>
+          <w:cantSplit/>
+        </w:trPr>
+        <w:tc>
+          <w:tcPr>
+            <w:tcW w:type="dxa" w:w="1650"/>
+            <w:tcMar>
+              <w:top w:w="80" w:type="dxa"/>
+              <w:start w:w="120" w:type="dxa"/>
+              <w:bottom w:w="80" w:type="dxa"/>
+              <w:end w:w="120" w:type="dxa"/>
+            </w:tcMar>
+            <w:vAlign w:val="center"/>
+            <w:shd w:fill="FFFFFF"/>
+          </w:tcPr>
+          <w:p>
+            <w:pPr>
+              <w:spacing w:before="0" w:after="40" w:line="252" w:lineRule="auto"/>
+              <w:jc w:val="center"/>
+            </w:pPr>
+            <w:r>
+              <w:rPr>
+                <w:rFonts w:ascii="Calibri" w:hAnsi="Calibri"/>
+                <w:b w:val="0"/>
+                <w:color w:val="111827"/>
+                <w:sz w:val="17"/>
+              </w:rPr>
+              <w:t>Latency budget</w:t>
+            </w:r>
+          </w:p>
+        </w:tc>
+        <w:tc>
+          <w:tcPr>
+            <w:tcW w:type="dxa" w:w="4450"/>
+            <w:tcMar>
+              <w:top w:w="80" w:type="dxa"/>
+              <w:start w:w="120" w:type="dxa"/>
+              <w:bottom w:w="80" w:type="dxa"/>
+              <w:end w:w="120" w:type="dxa"/>
+            </w:tcMar>
+            <w:vAlign w:val="center"/>
+            <w:shd w:fill="FFFFFF"/>
+          </w:tcPr>
+          <w:p>
+            <w:pPr>
+              <w:spacing w:before="0" w:after="40" w:line="252" w:lineRule="auto"/>
+              <w:jc w:val="left"/>
+            </w:pPr>
+            <w:r>
+              <w:rPr>
+                <w:rFonts w:ascii="Calibri" w:hAnsi="Calibri"/>
+                <w:b w:val="0"/>
+                <w:color w:val="111827"/>
+                <w:sz w:val="17"/>
+              </w:rPr>
+              <w:t>Mark delivered steps and campaign status when a budget is exceeded.</w:t>
+            </w:r>
+          </w:p>
+        </w:tc>
+        <w:tc>
+          <w:tcPr>
+            <w:tcW w:type="dxa" w:w="3260"/>
+            <w:tcMar>
+              <w:top w:w="80" w:type="dxa"/>
+              <w:start w:w="120" w:type="dxa"/>
+              <w:bottom w:w="80" w:type="dxa"/>
+              <w:end w:w="120" w:type="dxa"/>
+            </w:tcMar>
+            <w:vAlign w:val="center"/>
+            <w:shd w:fill="FFFFFF"/>
+          </w:tcPr>
+          <w:p>
+            <w:pPr>
+              <w:spacing w:before="0" w:after="40" w:line="252" w:lineRule="auto"/>
+              <w:jc w:val="left"/>
+            </w:pPr>
+            <w:r>
+              <w:rPr>
+                <w:rFonts w:ascii="Calibri" w:hAnsi="Calibri"/>
+                <w:b w:val="0"/>
+                <w:color w:val="111827"/>
+                <w:sz w:val="17"/>
+              </w:rPr>
+              <w:t>Service</w:t>
+            </w:r>
+          </w:p>
+        </w:tc>
+      </w:tr>
+      <w:tr>
+        <w:trPr>
+          <w:cantSplit/>
+        </w:trPr>
+        <w:tc>
+          <w:tcPr>
+            <w:tcW w:type="dxa" w:w="1650"/>
+            <w:tcMar>
+              <w:top w:w="80" w:type="dxa"/>
+              <w:start w:w="120" w:type="dxa"/>
+              <w:bottom w:w="80" w:type="dxa"/>
+              <w:end w:w="120" w:type="dxa"/>
+            </w:tcMar>
+            <w:vAlign w:val="center"/>
+            <w:shd w:fill="FFFFFF"/>
+          </w:tcPr>
+          <w:p>
+            <w:pPr>
+              <w:spacing w:before="0" w:after="40" w:line="252" w:lineRule="auto"/>
+              <w:jc w:val="center"/>
+            </w:pPr>
+            <w:r>
+              <w:rPr>
+                <w:rFonts w:ascii="Calibri" w:hAnsi="Calibri"/>
+                <w:b w:val="0"/>
+                <w:color w:val="111827"/>
+                <w:sz w:val="17"/>
+              </w:rPr>
+              <w:t>Integrated loss</w:t>
+            </w:r>
+          </w:p>
+        </w:tc>
+        <w:tc>
+          <w:tcPr>
+            <w:tcW w:type="dxa" w:w="4450"/>
+            <w:tcMar>
+              <w:top w:w="80" w:type="dxa"/>
+              <w:start w:w="120" w:type="dxa"/>
+              <w:bottom w:w="80" w:type="dxa"/>
+              <w:end w:w="120" w:type="dxa"/>
+            </w:tcMar>
+            <w:vAlign w:val="center"/>
+            <w:shd w:fill="FFFFFF"/>
+          </w:tcPr>
+          <w:p>
+            <w:pPr>
+              <w:spacing w:before="0" w:after="40" w:line="252" w:lineRule="auto"/>
+              <w:jc w:val="left"/>
+            </w:pPr>
+            <w:r>
+              <w:rPr>
+                <w:rFonts w:ascii="Calibri" w:hAnsi="Calibri"/>
+                <w:b w:val="0"/>
+                <w:color w:val="111827"/>
+                <w:sz w:val="17"/>
+              </w:rPr>
+              <w:t>Consume route duration and sequence while recording failed delivery.</w:t>
+            </w:r>
+          </w:p>
+        </w:tc>
+        <w:tc>
+          <w:tcPr>
+            <w:tcW w:type="dxa" w:w="3260"/>
+            <w:tcMar>
+              <w:top w:w="80" w:type="dxa"/>
+              <w:start w:w="120" w:type="dxa"/>
+              <w:bottom w:w="80" w:type="dxa"/>
+              <w:end w:w="120" w:type="dxa"/>
+            </w:tcMar>
+            <w:vAlign w:val="center"/>
+            <w:shd w:fill="FFFFFF"/>
+          </w:tcPr>
+          <w:p>
+            <w:pPr>
+              <w:spacing w:before="0" w:after="40" w:line="252" w:lineRule="auto"/>
+              <w:jc w:val="left"/>
+            </w:pPr>
+            <w:r>
+              <w:rPr>
+                <w:rFonts w:ascii="Calibri" w:hAnsi="Calibri"/>
+                <w:b w:val="0"/>
+                <w:color w:val="111827"/>
+                <w:sz w:val="17"/>
+              </w:rPr>
+              <w:t>Service</w:t>
+            </w:r>
+          </w:p>
+        </w:tc>
+      </w:tr>
+      <w:tr>
+        <w:trPr>
+          <w:cantSplit/>
+        </w:trPr>
+        <w:tc>
+          <w:tcPr>
+            <w:tcW w:type="dxa" w:w="1650"/>
+            <w:tcMar>
+              <w:top w:w="80" w:type="dxa"/>
+              <w:start w:w="120" w:type="dxa"/>
+              <w:bottom w:w="80" w:type="dxa"/>
+              <w:end w:w="120" w:type="dxa"/>
+            </w:tcMar>
+            <w:vAlign w:val="center"/>
+            <w:shd w:fill="FFFFFF"/>
+          </w:tcPr>
+          <w:p>
+            <w:pPr>
+              <w:spacing w:before="0" w:after="40" w:line="252" w:lineRule="auto"/>
+              <w:jc w:val="center"/>
+            </w:pPr>
+            <w:r>
+              <w:rPr>
+                <w:rFonts w:ascii="Calibri" w:hAnsi="Calibri"/>
+                <w:b w:val="0"/>
+                <w:color w:val="111827"/>
+                <w:sz w:val="17"/>
+              </w:rPr>
+              <w:t>Gateway unavailable</w:t>
+            </w:r>
+          </w:p>
+        </w:tc>
+        <w:tc>
+          <w:tcPr>
+            <w:tcW w:type="dxa" w:w="4450"/>
+            <w:tcMar>
+              <w:top w:w="80" w:type="dxa"/>
+              <w:start w:w="120" w:type="dxa"/>
+              <w:bottom w:w="80" w:type="dxa"/>
+              <w:end w:w="120" w:type="dxa"/>
+            </w:tcMar>
+            <w:vAlign w:val="center"/>
+            <w:shd w:fill="FFFFFF"/>
+          </w:tcPr>
+          <w:p>
+            <w:pPr>
+              <w:spacing w:before="0" w:after="40" w:line="252" w:lineRule="auto"/>
+              <w:jc w:val="left"/>
+            </w:pPr>
+            <w:r>
+              <w:rPr>
+                <w:rFonts w:ascii="Calibri" w:hAnsi="Calibri"/>
+                <w:b w:val="0"/>
+                <w:color w:val="111827"/>
+                <w:sz w:val="17"/>
+              </w:rPr>
+              <w:t>Consume idle advance without route duration or sequence allocation.</w:t>
+            </w:r>
+          </w:p>
+        </w:tc>
+        <w:tc>
+          <w:tcPr>
+            <w:tcW w:type="dxa" w:w="3260"/>
+            <w:tcMar>
+              <w:top w:w="80" w:type="dxa"/>
+              <w:start w:w="120" w:type="dxa"/>
+              <w:bottom w:w="80" w:type="dxa"/>
+              <w:end w:w="120" w:type="dxa"/>
+            </w:tcMar>
+            <w:vAlign w:val="center"/>
+            <w:shd w:fill="FFFFFF"/>
+          </w:tcPr>
+          <w:p>
+            <w:pPr>
+              <w:spacing w:before="0" w:after="40" w:line="252" w:lineRule="auto"/>
+              <w:jc w:val="left"/>
+            </w:pPr>
+            <w:r>
+              <w:rPr>
+                <w:rFonts w:ascii="Calibri" w:hAnsi="Calibri"/>
+                <w:b w:val="0"/>
+                <w:color w:val="111827"/>
+                <w:sz w:val="17"/>
+              </w:rPr>
+              <w:t>Service</w:t>
+            </w:r>
+          </w:p>
+        </w:tc>
+      </w:tr>
+      <w:tr>
+        <w:trPr>
+          <w:cantSplit/>
+        </w:trPr>
+        <w:tc>
+          <w:tcPr>
+            <w:tcW w:type="dxa" w:w="1650"/>
+            <w:tcMar>
+              <w:top w:w="80" w:type="dxa"/>
+              <w:start w:w="120" w:type="dxa"/>
+              <w:bottom w:w="80" w:type="dxa"/>
+              <w:end w:w="120" w:type="dxa"/>
+            </w:tcMar>
+            <w:vAlign w:val="center"/>
+            <w:shd w:fill="FFFFFF"/>
+          </w:tcPr>
+          <w:p>
+            <w:pPr>
+              <w:spacing w:before="0" w:after="40" w:line="252" w:lineRule="auto"/>
+              <w:jc w:val="center"/>
+            </w:pPr>
+            <w:r>
+              <w:rPr>
+                <w:rFonts w:ascii="Calibri" w:hAnsi="Calibri"/>
+                <w:b w:val="0"/>
+                <w:color w:val="111827"/>
+                <w:sz w:val="17"/>
+              </w:rPr>
+              <w:t>Campaign status</w:t>
+            </w:r>
+          </w:p>
+        </w:tc>
+        <w:tc>
+          <w:tcPr>
+            <w:tcW w:type="dxa" w:w="4450"/>
+            <w:tcMar>
+              <w:top w:w="80" w:type="dxa"/>
+              <w:start w:w="120" w:type="dxa"/>
+              <w:bottom w:w="80" w:type="dxa"/>
+              <w:end w:w="120" w:type="dxa"/>
+            </w:tcMar>
+            <w:vAlign w:val="center"/>
+            <w:shd w:fill="FFFFFF"/>
+          </w:tcPr>
+          <w:p>
+            <w:pPr>
+              <w:spacing w:before="0" w:after="40" w:line="252" w:lineRule="auto"/>
+              <w:jc w:val="left"/>
+            </w:pPr>
+            <w:r>
+              <w:rPr>
+                <w:rFonts w:ascii="Calibri" w:hAnsi="Calibri"/>
+                <w:b w:val="0"/>
+                <w:color w:val="111827"/>
+                <w:sz w:val="17"/>
+              </w:rPr>
+              <w:t>Distinguish passed, performance-degraded, and failed results.</w:t>
+            </w:r>
+          </w:p>
+        </w:tc>
+        <w:tc>
+          <w:tcPr>
+            <w:tcW w:type="dxa" w:w="3260"/>
+            <w:tcMar>
+              <w:top w:w="80" w:type="dxa"/>
+              <w:start w:w="120" w:type="dxa"/>
+              <w:bottom w:w="80" w:type="dxa"/>
+              <w:end w:w="120" w:type="dxa"/>
+            </w:tcMar>
+            <w:vAlign w:val="center"/>
+            <w:shd w:fill="FFFFFF"/>
+          </w:tcPr>
+          <w:p>
+            <w:pPr>
+              <w:spacing w:before="0" w:after="40" w:line="252" w:lineRule="auto"/>
+              <w:jc w:val="left"/>
+            </w:pPr>
+            <w:r>
+              <w:rPr>
+                <w:rFonts w:ascii="Calibri" w:hAnsi="Calibri"/>
+                <w:b w:val="0"/>
+                <w:color w:val="111827"/>
+                <w:sz w:val="17"/>
+              </w:rPr>
+              <w:t>Service</w:t>
+            </w:r>
+          </w:p>
+        </w:tc>
+      </w:tr>
+      <w:tr>
+        <w:trPr>
+          <w:cantSplit/>
+        </w:trPr>
+        <w:tc>
+          <w:tcPr>
+            <w:tcW w:type="dxa" w:w="1650"/>
+            <w:tcMar>
+              <w:top w:w="80" w:type="dxa"/>
+              <w:start w:w="120" w:type="dxa"/>
+              <w:bottom w:w="80" w:type="dxa"/>
+              <w:end w:w="120" w:type="dxa"/>
+            </w:tcMar>
+            <w:vAlign w:val="center"/>
+            <w:shd w:fill="FFFFFF"/>
+          </w:tcPr>
+          <w:p>
+            <w:pPr>
+              <w:spacing w:before="0" w:after="40" w:line="252" w:lineRule="auto"/>
+              <w:jc w:val="center"/>
+            </w:pPr>
+            <w:r>
+              <w:rPr>
+                <w:rFonts w:ascii="Calibri" w:hAnsi="Calibri"/>
+                <w:b w:val="0"/>
+                <w:color w:val="111827"/>
+                <w:sz w:val="17"/>
+              </w:rPr>
+              <w:t>Campaign replay</w:t>
+            </w:r>
+          </w:p>
+        </w:tc>
+        <w:tc>
+          <w:tcPr>
+            <w:tcW w:type="dxa" w:w="4450"/>
+            <w:tcMar>
+              <w:top w:w="80" w:type="dxa"/>
+              <w:start w:w="120" w:type="dxa"/>
+              <w:bottom w:w="80" w:type="dxa"/>
+              <w:end w:w="120" w:type="dxa"/>
+            </w:tcMar>
+            <w:vAlign w:val="center"/>
+            <w:shd w:fill="FFFFFF"/>
+          </w:tcPr>
+          <w:p>
+            <w:pPr>
+              <w:spacing w:before="0" w:after="40" w:line="252" w:lineRule="auto"/>
+              <w:jc w:val="left"/>
+            </w:pPr>
+            <w:r>
+              <w:rPr>
+                <w:rFonts w:ascii="Calibri" w:hAnsi="Calibri"/>
+                <w:b w:val="0"/>
+                <w:color w:val="111827"/>
+                <w:sz w:val="17"/>
+              </w:rPr>
+              <w:t>Return exact persisted evidence without repeating time or sequence.</w:t>
+            </w:r>
+          </w:p>
+        </w:tc>
+        <w:tc>
+          <w:tcPr>
+            <w:tcW w:type="dxa" w:w="3260"/>
+            <w:tcMar>
+              <w:top w:w="80" w:type="dxa"/>
+              <w:start w:w="120" w:type="dxa"/>
+              <w:bottom w:w="80" w:type="dxa"/>
+              <w:end w:w="120" w:type="dxa"/>
+            </w:tcMar>
+            <w:vAlign w:val="center"/>
+            <w:shd w:fill="FFFFFF"/>
+          </w:tcPr>
+          <w:p>
+            <w:pPr>
+              <w:spacing w:before="0" w:after="40" w:line="252" w:lineRule="auto"/>
+              <w:jc w:val="left"/>
+            </w:pPr>
+            <w:r>
+              <w:rPr>
+                <w:rFonts w:ascii="Calibri" w:hAnsi="Calibri"/>
+                <w:b w:val="0"/>
+                <w:color w:val="111827"/>
+                <w:sz w:val="17"/>
+              </w:rPr>
+              <w:t>Service/API</w:t>
+            </w:r>
+          </w:p>
+        </w:tc>
+      </w:tr>
+      <w:tr>
+        <w:trPr>
+          <w:cantSplit/>
+        </w:trPr>
+        <w:tc>
+          <w:tcPr>
+            <w:tcW w:type="dxa" w:w="1650"/>
+            <w:tcMar>
+              <w:top w:w="80" w:type="dxa"/>
+              <w:start w:w="120" w:type="dxa"/>
+              <w:bottom w:w="80" w:type="dxa"/>
+              <w:end w:w="120" w:type="dxa"/>
+            </w:tcMar>
+            <w:vAlign w:val="center"/>
+            <w:shd w:fill="FFFFFF"/>
+          </w:tcPr>
+          <w:p>
+            <w:pPr>
+              <w:spacing w:before="0" w:after="40" w:line="252" w:lineRule="auto"/>
+              <w:jc w:val="center"/>
+            </w:pPr>
+            <w:r>
+              <w:rPr>
+                <w:rFonts w:ascii="Calibri" w:hAnsi="Calibri"/>
+                <w:b w:val="0"/>
+                <w:color w:val="111827"/>
+                <w:sz w:val="17"/>
+              </w:rPr>
+              <w:t>Campaign conflict</w:t>
+            </w:r>
+          </w:p>
+        </w:tc>
+        <w:tc>
+          <w:tcPr>
+            <w:tcW w:type="dxa" w:w="4450"/>
+            <w:tcMar>
+              <w:top w:w="80" w:type="dxa"/>
+              <w:start w:w="120" w:type="dxa"/>
+              <w:bottom w:w="80" w:type="dxa"/>
+              <w:end w:w="120" w:type="dxa"/>
+            </w:tcMar>
+            <w:vAlign w:val="center"/>
+            <w:shd w:fill="FFFFFF"/>
+          </w:tcPr>
+          <w:p>
+            <w:pPr>
+              <w:spacing w:before="0" w:after="40" w:line="252" w:lineRule="auto"/>
+              <w:jc w:val="left"/>
+            </w:pPr>
+            <w:r>
+              <w:rPr>
+                <w:rFonts w:ascii="Calibri" w:hAnsi="Calibri"/>
+                <w:b w:val="0"/>
+                <w:color w:val="111827"/>
+                <w:sz w:val="17"/>
+              </w:rPr>
+              <w:t>Reject changed command-ID reuse using the canonical fingerprint.</w:t>
+            </w:r>
+          </w:p>
+        </w:tc>
+        <w:tc>
+          <w:tcPr>
+            <w:tcW w:type="dxa" w:w="3260"/>
+            <w:tcMar>
+              <w:top w:w="80" w:type="dxa"/>
+              <w:start w:w="120" w:type="dxa"/>
+              <w:bottom w:w="80" w:type="dxa"/>
+              <w:end w:w="120" w:type="dxa"/>
+            </w:tcMar>
+            <w:vAlign w:val="center"/>
+            <w:shd w:fill="FFFFFF"/>
+          </w:tcPr>
+          <w:p>
+            <w:pPr>
+              <w:spacing w:before="0" w:after="40" w:line="252" w:lineRule="auto"/>
+              <w:jc w:val="left"/>
+            </w:pPr>
+            <w:r>
+              <w:rPr>
+                <w:rFonts w:ascii="Calibri" w:hAnsi="Calibri"/>
+                <w:b w:val="0"/>
+                <w:color w:val="111827"/>
+                <w:sz w:val="17"/>
+              </w:rPr>
+              <w:t>Service/API</w:t>
+            </w:r>
+          </w:p>
+        </w:tc>
+      </w:tr>
+      <w:tr>
+        <w:trPr>
+          <w:cantSplit/>
+        </w:trPr>
+        <w:tc>
+          <w:tcPr>
+            <w:tcW w:type="dxa" w:w="1650"/>
+            <w:tcMar>
+              <w:top w:w="80" w:type="dxa"/>
+              <w:start w:w="120" w:type="dxa"/>
+              <w:bottom w:w="80" w:type="dxa"/>
+              <w:end w:w="120" w:type="dxa"/>
+            </w:tcMar>
+            <w:vAlign w:val="center"/>
+            <w:shd w:fill="FFFFFF"/>
+          </w:tcPr>
+          <w:p>
+            <w:pPr>
+              <w:spacing w:before="0" w:after="40" w:line="252" w:lineRule="auto"/>
+              <w:jc w:val="center"/>
+            </w:pPr>
+            <w:r>
+              <w:rPr>
+                <w:rFonts w:ascii="Calibri" w:hAnsi="Calibri"/>
+                <w:b w:val="0"/>
+                <w:color w:val="111827"/>
+                <w:sz w:val="17"/>
+              </w:rPr>
+              <w:t>Campaign minimization</w:t>
+            </w:r>
+          </w:p>
+        </w:tc>
+        <w:tc>
+          <w:tcPr>
+            <w:tcW w:type="dxa" w:w="4450"/>
+            <w:tcMar>
+              <w:top w:w="80" w:type="dxa"/>
+              <w:start w:w="120" w:type="dxa"/>
+              <w:bottom w:w="80" w:type="dxa"/>
+              <w:end w:w="120" w:type="dxa"/>
+            </w:tcMar>
+            <w:vAlign w:val="center"/>
+            <w:shd w:fill="FFFFFF"/>
+          </w:tcPr>
+          <w:p>
+            <w:pPr>
+              <w:spacing w:before="0" w:after="40" w:line="252" w:lineRule="auto"/>
+              <w:jc w:val="left"/>
+            </w:pPr>
+            <w:r>
+              <w:rPr>
+                <w:rFonts w:ascii="Calibri" w:hAnsi="Calibri"/>
+                <w:b w:val="0"/>
+                <w:color w:val="111827"/>
+                <w:sz w:val="17"/>
+              </w:rPr>
+              <w:t>Exclude payload values from summaries, traces, audit, and outbox.</w:t>
+            </w:r>
+          </w:p>
+        </w:tc>
+        <w:tc>
+          <w:tcPr>
+            <w:tcW w:type="dxa" w:w="3260"/>
+            <w:tcMar>
+              <w:top w:w="80" w:type="dxa"/>
+              <w:start w:w="120" w:type="dxa"/>
+              <w:bottom w:w="80" w:type="dxa"/>
+              <w:end w:w="120" w:type="dxa"/>
+            </w:tcMar>
+            <w:vAlign w:val="center"/>
+            <w:shd w:fill="FFFFFF"/>
+          </w:tcPr>
+          <w:p>
+            <w:pPr>
+              <w:spacing w:before="0" w:after="40" w:line="252" w:lineRule="auto"/>
+              <w:jc w:val="left"/>
+            </w:pPr>
+            <w:r>
+              <w:rPr>
+                <w:rFonts w:ascii="Calibri" w:hAnsi="Calibri"/>
+                <w:b w:val="0"/>
+                <w:color w:val="111827"/>
+                <w:sz w:val="17"/>
+              </w:rPr>
+              <w:t>Service</w:t>
+            </w:r>
+          </w:p>
+        </w:tc>
+      </w:tr>
+      <w:tr>
+        <w:trPr>
+          <w:cantSplit/>
+        </w:trPr>
+        <w:tc>
+          <w:tcPr>
+            <w:tcW w:type="dxa" w:w="1650"/>
+            <w:tcMar>
+              <w:top w:w="80" w:type="dxa"/>
+              <w:start w:w="120" w:type="dxa"/>
+              <w:bottom w:w="80" w:type="dxa"/>
+              <w:end w:w="120" w:type="dxa"/>
+            </w:tcMar>
+            <w:vAlign w:val="center"/>
+            <w:shd w:fill="FFFFFF"/>
+          </w:tcPr>
+          <w:p>
+            <w:pPr>
+              <w:spacing w:before="0" w:after="40" w:line="252" w:lineRule="auto"/>
+              <w:jc w:val="center"/>
+            </w:pPr>
+            <w:r>
+              <w:rPr>
+                <w:rFonts w:ascii="Calibri" w:hAnsi="Calibri"/>
+                <w:b w:val="0"/>
+                <w:color w:val="111827"/>
+                <w:sz w:val="17"/>
+              </w:rPr>
+              <w:t>Campaign RBAC</w:t>
+            </w:r>
+          </w:p>
+        </w:tc>
+        <w:tc>
+          <w:tcPr>
+            <w:tcW w:type="dxa" w:w="4450"/>
+            <w:tcMar>
+              <w:top w:w="80" w:type="dxa"/>
+              <w:start w:w="120" w:type="dxa"/>
+              <w:bottom w:w="80" w:type="dxa"/>
+              <w:end w:w="120" w:type="dxa"/>
+            </w:tcMar>
+            <w:vAlign w:val="center"/>
+            <w:shd w:fill="FFFFFF"/>
+          </w:tcPr>
+          <w:p>
+            <w:pPr>
+              <w:spacing w:before="0" w:after="40" w:line="252" w:lineRule="auto"/>
+              <w:jc w:val="left"/>
+            </w:pPr>
+            <w:r>
+              <w:rPr>
+                <w:rFonts w:ascii="Calibri" w:hAnsi="Calibri"/>
+                <w:b w:val="0"/>
+                <w:color w:val="111827"/>
+                <w:sz w:val="17"/>
+              </w:rPr>
+              <w:t>Require manage for execution and read for history/detail.</w:t>
+            </w:r>
+          </w:p>
+        </w:tc>
+        <w:tc>
+          <w:tcPr>
+            <w:tcW w:type="dxa" w:w="3260"/>
+            <w:tcMar>
+              <w:top w:w="80" w:type="dxa"/>
+              <w:start w:w="120" w:type="dxa"/>
+              <w:bottom w:w="80" w:type="dxa"/>
+              <w:end w:w="120" w:type="dxa"/>
+            </w:tcMar>
+            <w:vAlign w:val="center"/>
+            <w:shd w:fill="FFFFFF"/>
+          </w:tcPr>
+          <w:p>
+            <w:pPr>
+              <w:spacing w:before="0" w:after="40" w:line="252" w:lineRule="auto"/>
+              <w:jc w:val="left"/>
+            </w:pPr>
+            <w:r>
+              <w:rPr>
+                <w:rFonts w:ascii="Calibri" w:hAnsi="Calibri"/>
+                <w:b w:val="0"/>
+                <w:color w:val="111827"/>
+                <w:sz w:val="17"/>
+              </w:rPr>
+              <w:t>API/integration</w:t>
+            </w:r>
+          </w:p>
+        </w:tc>
+      </w:tr>
+      <w:tr>
+        <w:trPr>
+          <w:cantSplit/>
+        </w:trPr>
+        <w:tc>
+          <w:tcPr>
+            <w:tcW w:type="dxa" w:w="1650"/>
+            <w:tcMar>
+              <w:top w:w="80" w:type="dxa"/>
+              <w:start w:w="120" w:type="dxa"/>
+              <w:bottom w:w="80" w:type="dxa"/>
+              <w:end w:w="120" w:type="dxa"/>
+            </w:tcMar>
+            <w:vAlign w:val="center"/>
+            <w:shd w:fill="FFFFFF"/>
+          </w:tcPr>
+          <w:p>
+            <w:pPr>
+              <w:spacing w:before="0" w:after="40" w:line="252" w:lineRule="auto"/>
+              <w:jc w:val="center"/>
+            </w:pPr>
+            <w:r>
+              <w:rPr>
+                <w:rFonts w:ascii="Calibri" w:hAnsi="Calibri"/>
+                <w:b w:val="0"/>
+                <w:color w:val="111827"/>
+                <w:sz w:val="17"/>
+              </w:rPr>
+              <w:t>Campaign migration</w:t>
+            </w:r>
+          </w:p>
+        </w:tc>
+        <w:tc>
+          <w:tcPr>
+            <w:tcW w:type="dxa" w:w="4450"/>
+            <w:tcMar>
+              <w:top w:w="80" w:type="dxa"/>
+              <w:start w:w="120" w:type="dxa"/>
+              <w:bottom w:w="80" w:type="dxa"/>
+              <w:end w:w="120" w:type="dxa"/>
+            </w:tcMar>
+            <w:vAlign w:val="center"/>
+            <w:shd w:fill="FFFFFF"/>
+          </w:tcPr>
+          <w:p>
+            <w:pPr>
+              <w:spacing w:before="0" w:after="40" w:line="252" w:lineRule="auto"/>
+              <w:jc w:val="left"/>
+            </w:pPr>
+            <w:r>
+              <w:rPr>
+                <w:rFonts w:ascii="Calibri" w:hAnsi="Calibri"/>
+                <w:b w:val="0"/>
+                <w:color w:val="111827"/>
+                <w:sz w:val="17"/>
+              </w:rPr>
+              <w:t>Upgrade and downgrade execution persistence and indexes.</w:t>
             </w:r>
           </w:p>
         </w:tc>
@@ -13234,7 +15100,7 @@
           <w:color w:val="1F4D78"/>
           <w:sz w:val="19"/>
         </w:rPr>
-        <w:t>0029_multibus_gateway</w:t>
+        <w:t>0030_multibus_campaigns</w:t>
       </w:r>
       <w:r>
         <w:rPr>
@@ -13438,7 +15304,7 @@
           <w:color w:val="111827"/>
           <w:sz w:val="22"/>
         </w:rPr>
-        <w:t xml:space="preserve"> and </w:t>
+        <w:t xml:space="preserve">, </w:t>
       </w:r>
       <w:r>
         <w:rPr>
@@ -13447,6 +15313,22 @@
           <w:sz w:val="19"/>
         </w:rPr>
         <w:t>atep.vehicle.gateway.routed.v1</w:t>
+      </w:r>
+      <w:r>
+        <w:rPr>
+          <w:rFonts w:ascii="Calibri" w:hAnsi="Calibri"/>
+          <w:color w:val="111827"/>
+          <w:sz w:val="22"/>
+        </w:rPr>
+        <w:t xml:space="preserve">, and </w:t>
+      </w:r>
+      <w:r>
+        <w:rPr>
+          <w:rFonts w:ascii="Consolas" w:hAnsi="Consolas"/>
+          <w:color w:val="1F4D78"/>
+          <w:sz w:val="19"/>
+        </w:rPr>
+        <w:t>atep.vehicle.multibus.campaign.completed.v1</w:t>
       </w:r>
       <w:r>
         <w:rPr>
@@ -13520,7 +15402,7 @@
           <w:color w:val="111827"/>
           <w:sz w:val="22"/>
         </w:rPr>
-        <w:t>Automated tests cover validation, priority, classic and FD timing mathematics, mixed arbitration, readiness, delivery, utilization, versioning, replay, errors, DBC bit placement through 512 bits, signed scaling, exact conversion, TEC/REC thresholds, loss, bus-off enforcement, recovery timing, LIN/Ethernet bounds and timing, gateway routing, evidence minimization, persistence, and OpenAPI.</w:t>
+        <w:t>Automated tests cover validation, priority, classic and FD timing mathematics, mixed arbitration, readiness, delivery, utilization, versioning, replay, errors, DBC bit placement through 512 bits, signed scaling, exact conversion, TEC/REC thresholds, loss, bus-off enforcement, recovery timing, LIN/Ethernet bounds and timing, gateway routing, campaign traces, latency budgets, integrated failures, evidence minimization, persistence, and OpenAPI.</w:t>
       </w:r>
     </w:p>
     <w:p>
@@ -13772,6 +15654,40 @@
     </w:p>
     <w:p>
       <w:pPr>
+        <w:pStyle w:val="ListBullet"/>
+        <w:numPr>
+          <w:ilvl w:val="0"/>
+          <w:numId w:val="14"/>
+        </w:numPr>
+      </w:pPr>
+      <w:r>
+        <w:rPr>
+          <w:rFonts w:ascii="Calibri" w:hAnsi="Calibri"/>
+          <w:color w:val="111827"/>
+          <w:sz w:val="22"/>
+        </w:rPr>
+        <w:t>Campaign percentiles operate on bounded in-memory duration sets; large fleet analytics belong in the future Data Lake volume.</w:t>
+      </w:r>
+    </w:p>
+    <w:p>
+      <w:pPr>
+        <w:pStyle w:val="ListBullet"/>
+        <w:numPr>
+          <w:ilvl w:val="0"/>
+          <w:numId w:val="14"/>
+        </w:numPr>
+      </w:pPr>
+      <w:r>
+        <w:rPr>
+          <w:rFonts w:ascii="Calibri" w:hAnsi="Calibri"/>
+          <w:color w:val="111827"/>
+          <w:sz w:val="22"/>
+        </w:rPr>
+        <w:t>Failure modes are deterministic test controls, not electrical or physical gateway-failure simulations.</w:t>
+      </w:r>
+    </w:p>
+    <w:p>
+      <w:pPr>
         <w:pStyle w:val="Heading1"/>
         <w:keepNext/>
         <w:keepLines/>
@@ -13787,23 +15703,7 @@
           <w:color w:val="111827"/>
           <w:sz w:val="22"/>
         </w:rPr>
-        <w:t xml:space="preserve">The recommended next increment is IV-7: multi-bus campaigns, traces, performance evidence, and integrated failure scenarios. See </w:t>
-      </w:r>
-      <w:r>
-        <w:rPr>
-          <w:rFonts w:ascii="Consolas" w:hAnsi="Consolas"/>
-          <w:color w:val="1F4D78"/>
-          <w:sz w:val="19"/>
-        </w:rPr>
-        <w:t>docs/roadmap-volume-iv.md</w:t>
-      </w:r>
-      <w:r>
-        <w:rPr>
-          <w:rFonts w:ascii="Calibri" w:hAnsi="Calibri"/>
-          <w:color w:val="111827"/>
-          <w:sz w:val="22"/>
-        </w:rPr>
-        <w:t>.</w:t>
+        <w:t>Volume IV is complete through IV-7. The recommended next development is Volume V-1: diagnostic sessions, DTC storage, and foundational UDS service contracts.</w:t>
       </w:r>
     </w:p>
     <w:p>
@@ -14470,6 +16370,91 @@
         <w:t>Propose a bit-stuffing extension that preserves the IV-4 transparent timing evidence.</w:t>
       </w:r>
     </w:p>
+    <w:p>
+      <w:pPr>
+        <w:pStyle w:val="ListNumber"/>
+        <w:numPr>
+          <w:ilvl w:val="0"/>
+          <w:numId w:val="15"/>
+        </w:numPr>
+      </w:pPr>
+      <w:r>
+        <w:rPr>
+          <w:rFonts w:ascii="Calibri" w:hAnsi="Calibri"/>
+          <w:color w:val="111827"/>
+          <w:sz w:val="22"/>
+        </w:rPr>
+        <w:t>Calculate campaign utilization for 3154 occupied microseconds in a 3229-microsecond window.</w:t>
+      </w:r>
+    </w:p>
+    <w:p>
+      <w:pPr>
+        <w:pStyle w:val="ListNumber"/>
+        <w:numPr>
+          <w:ilvl w:val="0"/>
+          <w:numId w:val="15"/>
+        </w:numPr>
+      </w:pPr>
+      <w:r>
+        <w:rPr>
+          <w:rFonts w:ascii="Calibri" w:hAnsi="Calibri"/>
+          <w:color w:val="111827"/>
+          <w:sz w:val="22"/>
+        </w:rPr>
+        <w:t>Explain why a lost routed frame consumes sequence and bus time while an unavailable gateway does not.</w:t>
+      </w:r>
+    </w:p>
+    <w:p>
+      <w:pPr>
+        <w:pStyle w:val="ListNumber"/>
+        <w:numPr>
+          <w:ilvl w:val="0"/>
+          <w:numId w:val="15"/>
+        </w:numPr>
+      </w:pPr>
+      <w:r>
+        <w:rPr>
+          <w:rFonts w:ascii="Calibri" w:hAnsi="Calibri"/>
+          <w:color w:val="111827"/>
+          <w:sz w:val="22"/>
+        </w:rPr>
+        <w:t>Prove the nearest-rank p95 result for a campaign containing durations of 4 and 3150 microseconds.</w:t>
+      </w:r>
+    </w:p>
+    <w:p>
+      <w:pPr>
+        <w:pStyle w:val="ListNumber"/>
+        <w:numPr>
+          <w:ilvl w:val="0"/>
+          <w:numId w:val="15"/>
+        </w:numPr>
+      </w:pPr>
+      <w:r>
+        <w:rPr>
+          <w:rFonts w:ascii="Calibri" w:hAnsi="Calibri"/>
+          <w:color w:val="111827"/>
+          <w:sz w:val="22"/>
+        </w:rPr>
+        <w:t>Design a three-step campaign that becomes performance-degraded without any delivery failure.</w:t>
+      </w:r>
+    </w:p>
+    <w:p>
+      <w:pPr>
+        <w:pStyle w:val="ListNumber"/>
+        <w:numPr>
+          <w:ilvl w:val="0"/>
+          <w:numId w:val="15"/>
+        </w:numPr>
+      </w:pPr>
+      <w:r>
+        <w:rPr>
+          <w:rFonts w:ascii="Calibri" w:hAnsi="Calibri"/>
+          <w:color w:val="111827"/>
+          <w:sz w:val="22"/>
+        </w:rPr>
+        <w:t>Explain how a full-input fingerprint permits payload-free persisted request summaries.</w:t>
+      </w:r>
+    </w:p>
     <w:sectPr>
       <w:headerReference w:type="default" r:id="rId9"/>
       <w:footerReference w:type="default" r:id="rId10"/>
@@ -14499,7 +16484,7 @@
         <w:color w:val="667085"/>
         <w:sz w:val="17"/>
       </w:rPr>
-      <w:t>ATEP Volume IV Workbook  |  Version 0.6.0</w:t>
+      <w:t>ATEP Volume IV Workbook  |  Version 0.7.0</w:t>
     </w:r>
     <w:r>
       <w:rPr>

</xml_diff>

<commit_message>
feat(can): add deterministic multibus campaigns (#63)
</commit_message>
<xml_diff>
--- a/docs/ATEP_Volume_IV_CAN_Network_Engineering_Workbook.docx
+++ b/docs/ATEP_Volume_IV_CAN_Network_Engineering_Workbook.docx
@@ -143,7 +143,7 @@
                 <w:color w:val="0B2545"/>
                 <w:sz w:val="19"/>
               </w:rPr>
-              <w:t>0.6.0</w:t>
+              <w:t>0.7.0</w:t>
             </w:r>
           </w:p>
         </w:tc>
@@ -265,7 +265,7 @@
                 <w:color w:val="111827"/>
                 <w:sz w:val="19"/>
               </w:rPr>
-              <w:t>Implemented increments: IV-1 to IV-6</w:t>
+              <w:t>Implemented increments: IV-1 to IV-7</w:t>
             </w:r>
           </w:p>
         </w:tc>
@@ -893,7 +893,7 @@
                 <w:color w:val="111827"/>
                 <w:sz w:val="17"/>
               </w:rPr>
-              <w:t>Increments IV-1 through IV-6</w:t>
+              <w:t>Increments IV-1 through IV-7</w:t>
             </w:r>
           </w:p>
         </w:tc>
@@ -1738,6 +1738,95 @@
                 <w:sz w:val="17"/>
               </w:rPr>
               <w:t>Added bounded LIN and automotive Ethernet contracts, cross-protocol gateway routing, deterministic protocol timing, replay-safe evidence, APIs, migration, and tests.</w:t>
+            </w:r>
+          </w:p>
+        </w:tc>
+      </w:tr>
+      <w:tr>
+        <w:trPr>
+          <w:cantSplit/>
+        </w:trPr>
+        <w:tc>
+          <w:tcPr>
+            <w:tcW w:type="dxa" w:w="1650"/>
+            <w:tcMar>
+              <w:top w:w="80" w:type="dxa"/>
+              <w:start w:w="120" w:type="dxa"/>
+              <w:bottom w:w="80" w:type="dxa"/>
+              <w:end w:w="120" w:type="dxa"/>
+            </w:tcMar>
+            <w:vAlign w:val="center"/>
+            <w:shd w:fill="FFFFFF"/>
+          </w:tcPr>
+          <w:p>
+            <w:pPr>
+              <w:spacing w:before="0" w:after="40" w:line="252" w:lineRule="auto"/>
+              <w:jc w:val="center"/>
+            </w:pPr>
+            <w:r>
+              <w:rPr>
+                <w:rFonts w:ascii="Calibri" w:hAnsi="Calibri"/>
+                <w:b w:val="0"/>
+                <w:color w:val="111827"/>
+                <w:sz w:val="17"/>
+              </w:rPr>
+              <w:t>0.7.0</w:t>
+            </w:r>
+          </w:p>
+        </w:tc>
+        <w:tc>
+          <w:tcPr>
+            <w:tcW w:type="dxa" w:w="4450"/>
+            <w:tcMar>
+              <w:top w:w="80" w:type="dxa"/>
+              <w:start w:w="120" w:type="dxa"/>
+              <w:bottom w:w="80" w:type="dxa"/>
+              <w:end w:w="120" w:type="dxa"/>
+            </w:tcMar>
+            <w:vAlign w:val="center"/>
+            <w:shd w:fill="FFFFFF"/>
+          </w:tcPr>
+          <w:p>
+            <w:pPr>
+              <w:spacing w:before="0" w:after="40" w:line="252" w:lineRule="auto"/>
+              <w:jc w:val="left"/>
+            </w:pPr>
+            <w:r>
+              <w:rPr>
+                <w:rFonts w:ascii="Calibri" w:hAnsi="Calibri"/>
+                <w:b w:val="0"/>
+                <w:color w:val="111827"/>
+                <w:sz w:val="17"/>
+              </w:rPr>
+              <w:t>2026-08-25</w:t>
+            </w:r>
+          </w:p>
+        </w:tc>
+        <w:tc>
+          <w:tcPr>
+            <w:tcW w:type="dxa" w:w="3260"/>
+            <w:tcMar>
+              <w:top w:w="80" w:type="dxa"/>
+              <w:start w:w="120" w:type="dxa"/>
+              <w:bottom w:w="80" w:type="dxa"/>
+              <w:end w:w="120" w:type="dxa"/>
+            </w:tcMar>
+            <w:vAlign w:val="center"/>
+            <w:shd w:fill="FFFFFF"/>
+          </w:tcPr>
+          <w:p>
+            <w:pPr>
+              <w:spacing w:before="0" w:after="40" w:line="252" w:lineRule="auto"/>
+              <w:jc w:val="left"/>
+            </w:pPr>
+            <w:r>
+              <w:rPr>
+                <w:rFonts w:ascii="Calibri" w:hAnsi="Calibri"/>
+                <w:b w:val="0"/>
+                <w:color w:val="111827"/>
+                <w:sz w:val="17"/>
+              </w:rPr>
+              <w:t>Added atomic multi-bus campaigns, ordered traces, deterministic performance metrics, integrated failure scenarios, fingerprinted replay, APIs, migration, and tests.</w:t>
             </w:r>
           </w:p>
         </w:tc>
@@ -2110,6 +2199,40 @@
     </w:p>
     <w:p>
       <w:pPr>
+        <w:pStyle w:val="ListBullet"/>
+        <w:numPr>
+          <w:ilvl w:val="0"/>
+          <w:numId w:val="11"/>
+        </w:numPr>
+      </w:pPr>
+      <w:r>
+        <w:rPr>
+          <w:rFonts w:ascii="Calibri" w:hAnsi="Calibri"/>
+          <w:color w:val="111827"/>
+          <w:sz w:val="22"/>
+        </w:rPr>
+        <w:t>Atomic campaigns of one to 64 route steps with latency budgets and integrated fault modes.</w:t>
+      </w:r>
+    </w:p>
+    <w:p>
+      <w:pPr>
+        <w:pStyle w:val="ListBullet"/>
+        <w:numPr>
+          <w:ilvl w:val="0"/>
+          <w:numId w:val="11"/>
+        </w:numPr>
+      </w:pPr>
+      <w:r>
+        <w:rPr>
+          <w:rFonts w:ascii="Calibri" w:hAnsi="Calibri"/>
+          <w:color w:val="111827"/>
+          <w:sz w:val="22"/>
+        </w:rPr>
+        <w:t>Ordered payload-free traces, utilization, maximum and p95 latency, protocol and outcome metrics.</w:t>
+      </w:r>
+    </w:p>
+    <w:p>
+      <w:pPr>
         <w:pStyle w:val="Heading2"/>
         <w:keepNext/>
         <w:keepLines/>
@@ -2407,6 +2530,24 @@
     <w:p>
       <w:r>
         <w:rPr>
+          <w:rFonts w:ascii="Consolas" w:hAnsi="Consolas"/>
+          <w:color w:val="1F4D78"/>
+          <w:sz w:val="19"/>
+        </w:rPr>
+        <w:t>MultiBusCampaignExecution</w:t>
+      </w:r>
+      <w:r>
+        <w:rPr>
+          <w:rFonts w:ascii="Calibri" w:hAnsi="Calibri"/>
+          <w:color w:val="111827"/>
+          <w:sz w:val="22"/>
+        </w:rPr>
+        <w:t xml:space="preserve"> stores a canonical SHA-256 request fingerprint, payload-free request summary, passed/degraded/failed status, ordered trace, deterministic performance result, aggregate versions, and actor. The service prevalidates all steps before mutating logical time or sequence.</w:t>
+      </w:r>
+    </w:p>
+    <w:p>
+      <w:r>
+        <w:rPr>
           <w:rFonts w:ascii="Calibri" w:hAnsi="Calibri"/>
           <w:color w:val="111827"/>
           <w:sz w:val="22"/>
@@ -5017,6 +5158,357 @@
                 <w:sz w:val="16"/>
               </w:rPr>
               <w:t>Retrieve multi-bus evidence.</w:t>
+            </w:r>
+          </w:p>
+        </w:tc>
+      </w:tr>
+      <w:tr>
+        <w:trPr>
+          <w:cantSplit/>
+        </w:trPr>
+        <w:tc>
+          <w:tcPr>
+            <w:tcW w:type="dxa" w:w="1150"/>
+            <w:tcMar>
+              <w:top w:w="80" w:type="dxa"/>
+              <w:start w:w="120" w:type="dxa"/>
+              <w:bottom w:w="80" w:type="dxa"/>
+              <w:end w:w="120" w:type="dxa"/>
+            </w:tcMar>
+            <w:vAlign w:val="center"/>
+            <w:shd w:fill="FFFFFF"/>
+          </w:tcPr>
+          <w:p>
+            <w:pPr>
+              <w:spacing w:before="0" w:after="40" w:line="252" w:lineRule="auto"/>
+              <w:jc w:val="center"/>
+            </w:pPr>
+            <w:r>
+              <w:rPr>
+                <w:rFonts w:ascii="Calibri" w:hAnsi="Calibri"/>
+                <w:b w:val="0"/>
+                <w:color w:val="111827"/>
+                <w:sz w:val="16"/>
+              </w:rPr>
+              <w:t>POST</w:t>
+            </w:r>
+          </w:p>
+        </w:tc>
+        <w:tc>
+          <w:tcPr>
+            <w:tcW w:type="dxa" w:w="3700"/>
+            <w:tcMar>
+              <w:top w:w="80" w:type="dxa"/>
+              <w:start w:w="120" w:type="dxa"/>
+              <w:bottom w:w="80" w:type="dxa"/>
+              <w:end w:w="120" w:type="dxa"/>
+            </w:tcMar>
+            <w:vAlign w:val="center"/>
+            <w:shd w:fill="FFFFFF"/>
+          </w:tcPr>
+          <w:p>
+            <w:pPr>
+              <w:spacing w:before="0" w:after="40" w:line="252" w:lineRule="auto"/>
+              <w:jc w:val="left"/>
+            </w:pPr>
+            <w:r>
+              <w:rPr>
+                <w:rFonts w:ascii="Calibri" w:hAnsi="Calibri"/>
+                <w:b w:val="0"/>
+                <w:color w:val="111827"/>
+                <w:sz w:val="16"/>
+              </w:rPr>
+              <w:t>/api/v1/vehicles/{vehicle_id}/can-networks/multibus/campaigns/execute</w:t>
+            </w:r>
+          </w:p>
+        </w:tc>
+        <w:tc>
+          <w:tcPr>
+            <w:tcW w:type="dxa" w:w="3100"/>
+            <w:tcMar>
+              <w:top w:w="80" w:type="dxa"/>
+              <w:start w:w="120" w:type="dxa"/>
+              <w:bottom w:w="80" w:type="dxa"/>
+              <w:end w:w="120" w:type="dxa"/>
+            </w:tcMar>
+            <w:vAlign w:val="center"/>
+            <w:shd w:fill="FFFFFF"/>
+          </w:tcPr>
+          <w:p>
+            <w:pPr>
+              <w:spacing w:before="0" w:after="40" w:line="252" w:lineRule="auto"/>
+              <w:jc w:val="left"/>
+            </w:pPr>
+            <w:r>
+              <w:rPr>
+                <w:rFonts w:ascii="Calibri" w:hAnsi="Calibri"/>
+                <w:b w:val="0"/>
+                <w:color w:val="111827"/>
+                <w:sz w:val="16"/>
+              </w:rPr>
+              <w:t>can_networks:manage</w:t>
+            </w:r>
+          </w:p>
+        </w:tc>
+        <w:tc>
+          <w:tcPr>
+            <w:tcW w:type="dxa" w:w="1410"/>
+            <w:tcMar>
+              <w:top w:w="80" w:type="dxa"/>
+              <w:start w:w="120" w:type="dxa"/>
+              <w:bottom w:w="80" w:type="dxa"/>
+              <w:end w:w="120" w:type="dxa"/>
+            </w:tcMar>
+            <w:vAlign w:val="center"/>
+            <w:shd w:fill="FFFFFF"/>
+          </w:tcPr>
+          <w:p>
+            <w:pPr>
+              <w:spacing w:before="0" w:after="40" w:line="252" w:lineRule="auto"/>
+              <w:jc w:val="left"/>
+            </w:pPr>
+            <w:r>
+              <w:rPr>
+                <w:rFonts w:ascii="Calibri" w:hAnsi="Calibri"/>
+                <w:b w:val="0"/>
+                <w:color w:val="111827"/>
+                <w:sz w:val="16"/>
+              </w:rPr>
+              <w:t>Execute an atomic bounded campaign.</w:t>
+            </w:r>
+          </w:p>
+        </w:tc>
+      </w:tr>
+      <w:tr>
+        <w:trPr>
+          <w:cantSplit/>
+        </w:trPr>
+        <w:tc>
+          <w:tcPr>
+            <w:tcW w:type="dxa" w:w="1150"/>
+            <w:tcMar>
+              <w:top w:w="80" w:type="dxa"/>
+              <w:start w:w="120" w:type="dxa"/>
+              <w:bottom w:w="80" w:type="dxa"/>
+              <w:end w:w="120" w:type="dxa"/>
+            </w:tcMar>
+            <w:vAlign w:val="center"/>
+            <w:shd w:fill="FFFFFF"/>
+          </w:tcPr>
+          <w:p>
+            <w:pPr>
+              <w:spacing w:before="0" w:after="40" w:line="252" w:lineRule="auto"/>
+              <w:jc w:val="center"/>
+            </w:pPr>
+            <w:r>
+              <w:rPr>
+                <w:rFonts w:ascii="Calibri" w:hAnsi="Calibri"/>
+                <w:b w:val="0"/>
+                <w:color w:val="111827"/>
+                <w:sz w:val="16"/>
+              </w:rPr>
+              <w:t>GET</w:t>
+            </w:r>
+          </w:p>
+        </w:tc>
+        <w:tc>
+          <w:tcPr>
+            <w:tcW w:type="dxa" w:w="3700"/>
+            <w:tcMar>
+              <w:top w:w="80" w:type="dxa"/>
+              <w:start w:w="120" w:type="dxa"/>
+              <w:bottom w:w="80" w:type="dxa"/>
+              <w:end w:w="120" w:type="dxa"/>
+            </w:tcMar>
+            <w:vAlign w:val="center"/>
+            <w:shd w:fill="FFFFFF"/>
+          </w:tcPr>
+          <w:p>
+            <w:pPr>
+              <w:spacing w:before="0" w:after="40" w:line="252" w:lineRule="auto"/>
+              <w:jc w:val="left"/>
+            </w:pPr>
+            <w:r>
+              <w:rPr>
+                <w:rFonts w:ascii="Calibri" w:hAnsi="Calibri"/>
+                <w:b w:val="0"/>
+                <w:color w:val="111827"/>
+                <w:sz w:val="16"/>
+              </w:rPr>
+              <w:t>/api/v1/vehicles/{vehicle_id}/can-networks/multibus/campaigns</w:t>
+            </w:r>
+          </w:p>
+        </w:tc>
+        <w:tc>
+          <w:tcPr>
+            <w:tcW w:type="dxa" w:w="3100"/>
+            <w:tcMar>
+              <w:top w:w="80" w:type="dxa"/>
+              <w:start w:w="120" w:type="dxa"/>
+              <w:bottom w:w="80" w:type="dxa"/>
+              <w:end w:w="120" w:type="dxa"/>
+            </w:tcMar>
+            <w:vAlign w:val="center"/>
+            <w:shd w:fill="FFFFFF"/>
+          </w:tcPr>
+          <w:p>
+            <w:pPr>
+              <w:spacing w:before="0" w:after="40" w:line="252" w:lineRule="auto"/>
+              <w:jc w:val="left"/>
+            </w:pPr>
+            <w:r>
+              <w:rPr>
+                <w:rFonts w:ascii="Calibri" w:hAnsi="Calibri"/>
+                <w:b w:val="0"/>
+                <w:color w:val="111827"/>
+                <w:sz w:val="16"/>
+              </w:rPr>
+              <w:t>can_networks:read</w:t>
+            </w:r>
+          </w:p>
+        </w:tc>
+        <w:tc>
+          <w:tcPr>
+            <w:tcW w:type="dxa" w:w="1410"/>
+            <w:tcMar>
+              <w:top w:w="80" w:type="dxa"/>
+              <w:start w:w="120" w:type="dxa"/>
+              <w:bottom w:w="80" w:type="dxa"/>
+              <w:end w:w="120" w:type="dxa"/>
+            </w:tcMar>
+            <w:vAlign w:val="center"/>
+            <w:shd w:fill="FFFFFF"/>
+          </w:tcPr>
+          <w:p>
+            <w:pPr>
+              <w:spacing w:before="0" w:after="40" w:line="252" w:lineRule="auto"/>
+              <w:jc w:val="left"/>
+            </w:pPr>
+            <w:r>
+              <w:rPr>
+                <w:rFonts w:ascii="Calibri" w:hAnsi="Calibri"/>
+                <w:b w:val="0"/>
+                <w:color w:val="111827"/>
+                <w:sz w:val="16"/>
+              </w:rPr>
+              <w:t>List safely paginated campaign evidence.</w:t>
+            </w:r>
+          </w:p>
+        </w:tc>
+      </w:tr>
+      <w:tr>
+        <w:trPr>
+          <w:cantSplit/>
+        </w:trPr>
+        <w:tc>
+          <w:tcPr>
+            <w:tcW w:type="dxa" w:w="1150"/>
+            <w:tcMar>
+              <w:top w:w="80" w:type="dxa"/>
+              <w:start w:w="120" w:type="dxa"/>
+              <w:bottom w:w="80" w:type="dxa"/>
+              <w:end w:w="120" w:type="dxa"/>
+            </w:tcMar>
+            <w:vAlign w:val="center"/>
+            <w:shd w:fill="FFFFFF"/>
+          </w:tcPr>
+          <w:p>
+            <w:pPr>
+              <w:spacing w:before="0" w:after="40" w:line="252" w:lineRule="auto"/>
+              <w:jc w:val="center"/>
+            </w:pPr>
+            <w:r>
+              <w:rPr>
+                <w:rFonts w:ascii="Calibri" w:hAnsi="Calibri"/>
+                <w:b w:val="0"/>
+                <w:color w:val="111827"/>
+                <w:sz w:val="16"/>
+              </w:rPr>
+              <w:t>GET</w:t>
+            </w:r>
+          </w:p>
+        </w:tc>
+        <w:tc>
+          <w:tcPr>
+            <w:tcW w:type="dxa" w:w="3700"/>
+            <w:tcMar>
+              <w:top w:w="80" w:type="dxa"/>
+              <w:start w:w="120" w:type="dxa"/>
+              <w:bottom w:w="80" w:type="dxa"/>
+              <w:end w:w="120" w:type="dxa"/>
+            </w:tcMar>
+            <w:vAlign w:val="center"/>
+            <w:shd w:fill="FFFFFF"/>
+          </w:tcPr>
+          <w:p>
+            <w:pPr>
+              <w:spacing w:before="0" w:after="40" w:line="252" w:lineRule="auto"/>
+              <w:jc w:val="left"/>
+            </w:pPr>
+            <w:r>
+              <w:rPr>
+                <w:rFonts w:ascii="Calibri" w:hAnsi="Calibri"/>
+                <w:b w:val="0"/>
+                <w:color w:val="111827"/>
+                <w:sz w:val="16"/>
+              </w:rPr>
+              <w:t>/api/v1/vehicles/{vehicle_id}/can-networks/multibus/campaigns/{command_id}</w:t>
+            </w:r>
+          </w:p>
+        </w:tc>
+        <w:tc>
+          <w:tcPr>
+            <w:tcW w:type="dxa" w:w="3100"/>
+            <w:tcMar>
+              <w:top w:w="80" w:type="dxa"/>
+              <w:start w:w="120" w:type="dxa"/>
+              <w:bottom w:w="80" w:type="dxa"/>
+              <w:end w:w="120" w:type="dxa"/>
+            </w:tcMar>
+            <w:vAlign w:val="center"/>
+            <w:shd w:fill="FFFFFF"/>
+          </w:tcPr>
+          <w:p>
+            <w:pPr>
+              <w:spacing w:before="0" w:after="40" w:line="252" w:lineRule="auto"/>
+              <w:jc w:val="left"/>
+            </w:pPr>
+            <w:r>
+              <w:rPr>
+                <w:rFonts w:ascii="Calibri" w:hAnsi="Calibri"/>
+                <w:b w:val="0"/>
+                <w:color w:val="111827"/>
+                <w:sz w:val="16"/>
+              </w:rPr>
+              <w:t>can_networks:read</w:t>
+            </w:r>
+          </w:p>
+        </w:tc>
+        <w:tc>
+          <w:tcPr>
+            <w:tcW w:type="dxa" w:w="1410"/>
+            <w:tcMar>
+              <w:top w:w="80" w:type="dxa"/>
+              <w:start w:w="120" w:type="dxa"/>
+              <w:bottom w:w="80" w:type="dxa"/>
+              <w:end w:w="120" w:type="dxa"/>
+            </w:tcMar>
+            <w:vAlign w:val="center"/>
+            <w:shd w:fill="FFFFFF"/>
+          </w:tcPr>
+          <w:p>
+            <w:pPr>
+              <w:spacing w:before="0" w:after="40" w:line="252" w:lineRule="auto"/>
+              <w:jc w:val="left"/>
+            </w:pPr>
+            <w:r>
+              <w:rPr>
+                <w:rFonts w:ascii="Calibri" w:hAnsi="Calibri"/>
+                <w:b w:val="0"/>
+                <w:color w:val="111827"/>
+                <w:sz w:val="16"/>
+              </w:rPr>
+              <w:t>Retrieve one campaign trace and result.</w:t>
             </w:r>
           </w:p>
         </w:tc>
@@ -5407,6 +5899,94 @@
     </w:p>
     <w:p>
       <w:pPr>
+        <w:pStyle w:val="Heading2"/>
+        <w:keepNext/>
+        <w:keepLines/>
+      </w:pPr>
+      <w:r>
+        <w:t>8.6 Campaign, Trace, and Performance Semantics</w:t>
+      </w:r>
+    </w:p>
+    <w:p>
+      <w:r>
+        <w:rPr>
+          <w:rFonts w:ascii="Calibri" w:hAnsi="Calibri"/>
+          <w:color w:val="111827"/>
+          <w:sz w:val="22"/>
+        </w:rPr>
+        <w:t>A campaign contains one to 64 uniquely identified route steps. Each step supplies its payload, logical advance, optional latency budget, and explicit fault mode. All routes and payload lengths are validated before the first mutation, so a rejected campaign cannot partially advance the aggregate.</w:t>
+      </w:r>
+    </w:p>
+    <w:p>
+      <w:r>
+        <w:rPr>
+          <w:rFonts w:ascii="Calibri" w:hAnsi="Calibri"/>
+          <w:color w:val="111827"/>
+          <w:sz w:val="22"/>
+        </w:rPr>
+        <w:t>Normal and frame-loss steps consume destination-protocol duration and one sequence. Frame loss records failed delivery after consuming bus time. A gateway-unavailable step consumes only its requested idle advance and allocates no sequence. The ordered trace records route and protocol identity, outcome, fault, budget result, logical start/completion, duration, and timing metadata, but never payload byte values.</w:t>
+      </w:r>
+    </w:p>
+    <w:p>
+      <w:r>
+        <w:rPr>
+          <w:rFonts w:ascii="Calibri" w:hAnsi="Calibri"/>
+          <w:color w:val="111827"/>
+          <w:sz w:val="22"/>
+        </w:rPr>
+        <w:t xml:space="preserve">Campaign evidence derives total window, occupied and idle microseconds, utilization percentage, maximum latency, nearest-rank p95 latency, protocol counts, delivery/failure counts, and latency budget violations. Status is </w:t>
+      </w:r>
+      <w:r>
+        <w:rPr>
+          <w:rFonts w:ascii="Consolas" w:hAnsi="Consolas"/>
+          <w:color w:val="1F4D78"/>
+          <w:sz w:val="19"/>
+        </w:rPr>
+        <w:t>passed</w:t>
+      </w:r>
+      <w:r>
+        <w:rPr>
+          <w:rFonts w:ascii="Calibri" w:hAnsi="Calibri"/>
+          <w:color w:val="111827"/>
+          <w:sz w:val="22"/>
+        </w:rPr>
+        <w:t xml:space="preserve">, </w:t>
+      </w:r>
+      <w:r>
+        <w:rPr>
+          <w:rFonts w:ascii="Consolas" w:hAnsi="Consolas"/>
+          <w:color w:val="1F4D78"/>
+          <w:sz w:val="19"/>
+        </w:rPr>
+        <w:t>performance_degraded</w:t>
+      </w:r>
+      <w:r>
+        <w:rPr>
+          <w:rFonts w:ascii="Calibri" w:hAnsi="Calibri"/>
+          <w:color w:val="111827"/>
+          <w:sz w:val="22"/>
+        </w:rPr>
+        <w:t xml:space="preserve">, or </w:t>
+      </w:r>
+      <w:r>
+        <w:rPr>
+          <w:rFonts w:ascii="Consolas" w:hAnsi="Consolas"/>
+          <w:color w:val="1F4D78"/>
+          <w:sz w:val="19"/>
+        </w:rPr>
+        <w:t>failed</w:t>
+      </w:r>
+      <w:r>
+        <w:rPr>
+          <w:rFonts w:ascii="Calibri" w:hAnsi="Calibri"/>
+          <w:color w:val="111827"/>
+          <w:sz w:val="22"/>
+        </w:rPr>
+        <w:t>. One campaign increments the aggregate version once. A canonical SHA-256 fingerprint distinguishes an exact retry from changed command reuse without persisting payload values in the request summary.</w:t>
+      </w:r>
+    </w:p>
+    <w:p>
+      <w:pPr>
         <w:pStyle w:val="Heading1"/>
         <w:keepNext/>
         <w:keepLines/>
@@ -5438,7 +6018,7 @@
           <w:color w:val="111827"/>
           <w:sz w:val="22"/>
         </w:rPr>
-        <w:t>. IV-1 through IV-6 implement CAN-F-001 through CAN-F-060 and CAN-NF-001 through CAN-NF-020.</w:t>
+        <w:t>. IV-1 through IV-7 implement CAN-F-001 through CAN-F-070 and CAN-NF-001 through CAN-NF-023.</w:t>
       </w:r>
     </w:p>
     <w:p>
@@ -5809,6 +6389,46 @@
     </w:p>
     <w:p>
       <w:pPr>
+        <w:pStyle w:val="Heading2"/>
+        <w:keepNext/>
+        <w:keepLines/>
+      </w:pPr>
+      <w:r>
+        <w:t>ADR-CAN-018 - Execute Campaigns as One Aggregate Transaction</w:t>
+      </w:r>
+    </w:p>
+    <w:p>
+      <w:r>
+        <w:rPr>
+          <w:rFonts w:ascii="Calibri" w:hAnsi="Calibri"/>
+          <w:color w:val="111827"/>
+          <w:sz w:val="22"/>
+        </w:rPr>
+        <w:t>All steps are prevalidated and then applied under one network row lock. This prevents partial campaign state, makes one version represent one test action, and preserves deterministic sequence and logical-time evidence across normal and failed routes.</w:t>
+      </w:r>
+    </w:p>
+    <w:p>
+      <w:pPr>
+        <w:pStyle w:val="Heading2"/>
+        <w:keepNext/>
+        <w:keepLines/>
+      </w:pPr>
+      <w:r>
+        <w:t>ADR-CAN-019 - Fingerprint Full Input and Persist Minimized Summaries</w:t>
+      </w:r>
+    </w:p>
+    <w:p>
+      <w:r>
+        <w:rPr>
+          <w:rFonts w:ascii="Calibri" w:hAnsi="Calibri"/>
+          <w:color w:val="111827"/>
+          <w:sz w:val="22"/>
+        </w:rPr>
+        <w:t>Exact idempotency must account for payload values, but traces and queryable metadata do not need them. The service hashes canonical full input and persists only lengths and control fields alongside the fingerprint, reducing sensitive evidence duplication without weakening conflict detection.</w:t>
+      </w:r>
+    </w:p>
+    <w:p>
+      <w:pPr>
         <w:pStyle w:val="Heading1"/>
         <w:keepNext/>
         <w:keepLines/>
@@ -13123,6 +13743,1252 @@
                 <w:sz w:val="17"/>
               </w:rPr>
               <w:t>Upgrade and downgrade contracts and execution evidence.</w:t>
+            </w:r>
+          </w:p>
+        </w:tc>
+        <w:tc>
+          <w:tcPr>
+            <w:tcW w:type="dxa" w:w="3260"/>
+            <w:tcMar>
+              <w:top w:w="80" w:type="dxa"/>
+              <w:start w:w="120" w:type="dxa"/>
+              <w:bottom w:w="80" w:type="dxa"/>
+              <w:end w:w="120" w:type="dxa"/>
+            </w:tcMar>
+            <w:vAlign w:val="center"/>
+            <w:shd w:fill="FFFFFF"/>
+          </w:tcPr>
+          <w:p>
+            <w:pPr>
+              <w:spacing w:before="0" w:after="40" w:line="252" w:lineRule="auto"/>
+              <w:jc w:val="left"/>
+            </w:pPr>
+            <w:r>
+              <w:rPr>
+                <w:rFonts w:ascii="Calibri" w:hAnsi="Calibri"/>
+                <w:b w:val="0"/>
+                <w:color w:val="111827"/>
+                <w:sz w:val="17"/>
+              </w:rPr>
+              <w:t>Integration</w:t>
+            </w:r>
+          </w:p>
+        </w:tc>
+      </w:tr>
+      <w:tr>
+        <w:trPr>
+          <w:cantSplit/>
+        </w:trPr>
+        <w:tc>
+          <w:tcPr>
+            <w:tcW w:type="dxa" w:w="1650"/>
+            <w:tcMar>
+              <w:top w:w="80" w:type="dxa"/>
+              <w:start w:w="120" w:type="dxa"/>
+              <w:bottom w:w="80" w:type="dxa"/>
+              <w:end w:w="120" w:type="dxa"/>
+            </w:tcMar>
+            <w:vAlign w:val="center"/>
+            <w:shd w:fill="FFFFFF"/>
+          </w:tcPr>
+          <w:p>
+            <w:pPr>
+              <w:spacing w:before="0" w:after="40" w:line="252" w:lineRule="auto"/>
+              <w:jc w:val="center"/>
+            </w:pPr>
+            <w:r>
+              <w:rPr>
+                <w:rFonts w:ascii="Calibri" w:hAnsi="Calibri"/>
+                <w:b w:val="0"/>
+                <w:color w:val="111827"/>
+                <w:sz w:val="17"/>
+              </w:rPr>
+              <w:t>Campaign bounds</w:t>
+            </w:r>
+          </w:p>
+        </w:tc>
+        <w:tc>
+          <w:tcPr>
+            <w:tcW w:type="dxa" w:w="4450"/>
+            <w:tcMar>
+              <w:top w:w="80" w:type="dxa"/>
+              <w:start w:w="120" w:type="dxa"/>
+              <w:bottom w:w="80" w:type="dxa"/>
+              <w:end w:w="120" w:type="dxa"/>
+            </w:tcMar>
+            <w:vAlign w:val="center"/>
+            <w:shd w:fill="FFFFFF"/>
+          </w:tcPr>
+          <w:p>
+            <w:pPr>
+              <w:spacing w:before="0" w:after="40" w:line="252" w:lineRule="auto"/>
+              <w:jc w:val="left"/>
+            </w:pPr>
+            <w:r>
+              <w:rPr>
+                <w:rFonts w:ascii="Calibri" w:hAnsi="Calibri"/>
+                <w:b w:val="0"/>
+                <w:color w:val="111827"/>
+                <w:sz w:val="17"/>
+              </w:rPr>
+              <w:t>Reject zero, duplicate, or more than 64 campaign steps.</w:t>
+            </w:r>
+          </w:p>
+        </w:tc>
+        <w:tc>
+          <w:tcPr>
+            <w:tcW w:type="dxa" w:w="3260"/>
+            <w:tcMar>
+              <w:top w:w="80" w:type="dxa"/>
+              <w:start w:w="120" w:type="dxa"/>
+              <w:bottom w:w="80" w:type="dxa"/>
+              <w:end w:w="120" w:type="dxa"/>
+            </w:tcMar>
+            <w:vAlign w:val="center"/>
+            <w:shd w:fill="FFFFFF"/>
+          </w:tcPr>
+          <w:p>
+            <w:pPr>
+              <w:spacing w:before="0" w:after="40" w:line="252" w:lineRule="auto"/>
+              <w:jc w:val="left"/>
+            </w:pPr>
+            <w:r>
+              <w:rPr>
+                <w:rFonts w:ascii="Calibri" w:hAnsi="Calibri"/>
+                <w:b w:val="0"/>
+                <w:color w:val="111827"/>
+                <w:sz w:val="17"/>
+              </w:rPr>
+              <w:t>Schema</w:t>
+            </w:r>
+          </w:p>
+        </w:tc>
+      </w:tr>
+      <w:tr>
+        <w:trPr>
+          <w:cantSplit/>
+        </w:trPr>
+        <w:tc>
+          <w:tcPr>
+            <w:tcW w:type="dxa" w:w="1650"/>
+            <w:tcMar>
+              <w:top w:w="80" w:type="dxa"/>
+              <w:start w:w="120" w:type="dxa"/>
+              <w:bottom w:w="80" w:type="dxa"/>
+              <w:end w:w="120" w:type="dxa"/>
+            </w:tcMar>
+            <w:vAlign w:val="center"/>
+            <w:shd w:fill="FFFFFF"/>
+          </w:tcPr>
+          <w:p>
+            <w:pPr>
+              <w:spacing w:before="0" w:after="40" w:line="252" w:lineRule="auto"/>
+              <w:jc w:val="center"/>
+            </w:pPr>
+            <w:r>
+              <w:rPr>
+                <w:rFonts w:ascii="Calibri" w:hAnsi="Calibri"/>
+                <w:b w:val="0"/>
+                <w:color w:val="111827"/>
+                <w:sz w:val="17"/>
+              </w:rPr>
+              <w:t>Campaign prevalidation</w:t>
+            </w:r>
+          </w:p>
+        </w:tc>
+        <w:tc>
+          <w:tcPr>
+            <w:tcW w:type="dxa" w:w="4450"/>
+            <w:tcMar>
+              <w:top w:w="80" w:type="dxa"/>
+              <w:start w:w="120" w:type="dxa"/>
+              <w:bottom w:w="80" w:type="dxa"/>
+              <w:end w:w="120" w:type="dxa"/>
+            </w:tcMar>
+            <w:vAlign w:val="center"/>
+            <w:shd w:fill="FFFFFF"/>
+          </w:tcPr>
+          <w:p>
+            <w:pPr>
+              <w:spacing w:before="0" w:after="40" w:line="252" w:lineRule="auto"/>
+              <w:jc w:val="left"/>
+            </w:pPr>
+            <w:r>
+              <w:rPr>
+                <w:rFonts w:ascii="Calibri" w:hAnsi="Calibri"/>
+                <w:b w:val="0"/>
+                <w:color w:val="111827"/>
+                <w:sz w:val="17"/>
+              </w:rPr>
+              <w:t>Reject an invalid route or payload before any state mutation.</w:t>
+            </w:r>
+          </w:p>
+        </w:tc>
+        <w:tc>
+          <w:tcPr>
+            <w:tcW w:type="dxa" w:w="3260"/>
+            <w:tcMar>
+              <w:top w:w="80" w:type="dxa"/>
+              <w:start w:w="120" w:type="dxa"/>
+              <w:bottom w:w="80" w:type="dxa"/>
+              <w:end w:w="120" w:type="dxa"/>
+            </w:tcMar>
+            <w:vAlign w:val="center"/>
+            <w:shd w:fill="FFFFFF"/>
+          </w:tcPr>
+          <w:p>
+            <w:pPr>
+              <w:spacing w:before="0" w:after="40" w:line="252" w:lineRule="auto"/>
+              <w:jc w:val="left"/>
+            </w:pPr>
+            <w:r>
+              <w:rPr>
+                <w:rFonts w:ascii="Calibri" w:hAnsi="Calibri"/>
+                <w:b w:val="0"/>
+                <w:color w:val="111827"/>
+                <w:sz w:val="17"/>
+              </w:rPr>
+              <w:t>Service</w:t>
+            </w:r>
+          </w:p>
+        </w:tc>
+      </w:tr>
+      <w:tr>
+        <w:trPr>
+          <w:cantSplit/>
+        </w:trPr>
+        <w:tc>
+          <w:tcPr>
+            <w:tcW w:type="dxa" w:w="1650"/>
+            <w:tcMar>
+              <w:top w:w="80" w:type="dxa"/>
+              <w:start w:w="120" w:type="dxa"/>
+              <w:bottom w:w="80" w:type="dxa"/>
+              <w:end w:w="120" w:type="dxa"/>
+            </w:tcMar>
+            <w:vAlign w:val="center"/>
+            <w:shd w:fill="FFFFFF"/>
+          </w:tcPr>
+          <w:p>
+            <w:pPr>
+              <w:spacing w:before="0" w:after="40" w:line="252" w:lineRule="auto"/>
+              <w:jc w:val="center"/>
+            </w:pPr>
+            <w:r>
+              <w:rPr>
+                <w:rFonts w:ascii="Calibri" w:hAnsi="Calibri"/>
+                <w:b w:val="0"/>
+                <w:color w:val="111827"/>
+                <w:sz w:val="17"/>
+              </w:rPr>
+              <w:t>Campaign ordering</w:t>
+            </w:r>
+          </w:p>
+        </w:tc>
+        <w:tc>
+          <w:tcPr>
+            <w:tcW w:type="dxa" w:w="4450"/>
+            <w:tcMar>
+              <w:top w:w="80" w:type="dxa"/>
+              <w:start w:w="120" w:type="dxa"/>
+              <w:bottom w:w="80" w:type="dxa"/>
+              <w:end w:w="120" w:type="dxa"/>
+            </w:tcMar>
+            <w:vAlign w:val="center"/>
+            <w:shd w:fill="FFFFFF"/>
+          </w:tcPr>
+          <w:p>
+            <w:pPr>
+              <w:spacing w:before="0" w:after="40" w:line="252" w:lineRule="auto"/>
+              <w:jc w:val="left"/>
+            </w:pPr>
+            <w:r>
+              <w:rPr>
+                <w:rFonts w:ascii="Calibri" w:hAnsi="Calibri"/>
+                <w:b w:val="0"/>
+                <w:color w:val="111827"/>
+                <w:sz w:val="17"/>
+              </w:rPr>
+              <w:t>Preserve declared step order in trace and sequence evidence.</w:t>
+            </w:r>
+          </w:p>
+        </w:tc>
+        <w:tc>
+          <w:tcPr>
+            <w:tcW w:type="dxa" w:w="3260"/>
+            <w:tcMar>
+              <w:top w:w="80" w:type="dxa"/>
+              <w:start w:w="120" w:type="dxa"/>
+              <w:bottom w:w="80" w:type="dxa"/>
+              <w:end w:w="120" w:type="dxa"/>
+            </w:tcMar>
+            <w:vAlign w:val="center"/>
+            <w:shd w:fill="FFFFFF"/>
+          </w:tcPr>
+          <w:p>
+            <w:pPr>
+              <w:spacing w:before="0" w:after="40" w:line="252" w:lineRule="auto"/>
+              <w:jc w:val="left"/>
+            </w:pPr>
+            <w:r>
+              <w:rPr>
+                <w:rFonts w:ascii="Calibri" w:hAnsi="Calibri"/>
+                <w:b w:val="0"/>
+                <w:color w:val="111827"/>
+                <w:sz w:val="17"/>
+              </w:rPr>
+              <w:t>Service</w:t>
+            </w:r>
+          </w:p>
+        </w:tc>
+      </w:tr>
+      <w:tr>
+        <w:trPr>
+          <w:cantSplit/>
+        </w:trPr>
+        <w:tc>
+          <w:tcPr>
+            <w:tcW w:type="dxa" w:w="1650"/>
+            <w:tcMar>
+              <w:top w:w="80" w:type="dxa"/>
+              <w:start w:w="120" w:type="dxa"/>
+              <w:bottom w:w="80" w:type="dxa"/>
+              <w:end w:w="120" w:type="dxa"/>
+            </w:tcMar>
+            <w:vAlign w:val="center"/>
+            <w:shd w:fill="FFFFFF"/>
+          </w:tcPr>
+          <w:p>
+            <w:pPr>
+              <w:spacing w:before="0" w:after="40" w:line="252" w:lineRule="auto"/>
+              <w:jc w:val="center"/>
+            </w:pPr>
+            <w:r>
+              <w:rPr>
+                <w:rFonts w:ascii="Calibri" w:hAnsi="Calibri"/>
+                <w:b w:val="0"/>
+                <w:color w:val="111827"/>
+                <w:sz w:val="17"/>
+              </w:rPr>
+              <w:t>Campaign timing</w:t>
+            </w:r>
+          </w:p>
+        </w:tc>
+        <w:tc>
+          <w:tcPr>
+            <w:tcW w:type="dxa" w:w="4450"/>
+            <w:tcMar>
+              <w:top w:w="80" w:type="dxa"/>
+              <w:start w:w="120" w:type="dxa"/>
+              <w:bottom w:w="80" w:type="dxa"/>
+              <w:end w:w="120" w:type="dxa"/>
+            </w:tcMar>
+            <w:vAlign w:val="center"/>
+            <w:shd w:fill="FFFFFF"/>
+          </w:tcPr>
+          <w:p>
+            <w:pPr>
+              <w:spacing w:before="0" w:after="40" w:line="252" w:lineRule="auto"/>
+              <w:jc w:val="left"/>
+            </w:pPr>
+            <w:r>
+              <w:rPr>
+                <w:rFonts w:ascii="Calibri" w:hAnsi="Calibri"/>
+                <w:b w:val="0"/>
+                <w:color w:val="111827"/>
+                <w:sz w:val="17"/>
+              </w:rPr>
+              <w:t>Derive idle, occupied, window, and utilization only from logical inputs.</w:t>
+            </w:r>
+          </w:p>
+        </w:tc>
+        <w:tc>
+          <w:tcPr>
+            <w:tcW w:type="dxa" w:w="3260"/>
+            <w:tcMar>
+              <w:top w:w="80" w:type="dxa"/>
+              <w:start w:w="120" w:type="dxa"/>
+              <w:bottom w:w="80" w:type="dxa"/>
+              <w:end w:w="120" w:type="dxa"/>
+            </w:tcMar>
+            <w:vAlign w:val="center"/>
+            <w:shd w:fill="FFFFFF"/>
+          </w:tcPr>
+          <w:p>
+            <w:pPr>
+              <w:spacing w:before="0" w:after="40" w:line="252" w:lineRule="auto"/>
+              <w:jc w:val="left"/>
+            </w:pPr>
+            <w:r>
+              <w:rPr>
+                <w:rFonts w:ascii="Calibri" w:hAnsi="Calibri"/>
+                <w:b w:val="0"/>
+                <w:color w:val="111827"/>
+                <w:sz w:val="17"/>
+              </w:rPr>
+              <w:t>Unit/service</w:t>
+            </w:r>
+          </w:p>
+        </w:tc>
+      </w:tr>
+      <w:tr>
+        <w:trPr>
+          <w:cantSplit/>
+        </w:trPr>
+        <w:tc>
+          <w:tcPr>
+            <w:tcW w:type="dxa" w:w="1650"/>
+            <w:tcMar>
+              <w:top w:w="80" w:type="dxa"/>
+              <w:start w:w="120" w:type="dxa"/>
+              <w:bottom w:w="80" w:type="dxa"/>
+              <w:end w:w="120" w:type="dxa"/>
+            </w:tcMar>
+            <w:vAlign w:val="center"/>
+            <w:shd w:fill="FFFFFF"/>
+          </w:tcPr>
+          <w:p>
+            <w:pPr>
+              <w:spacing w:before="0" w:after="40" w:line="252" w:lineRule="auto"/>
+              <w:jc w:val="center"/>
+            </w:pPr>
+            <w:r>
+              <w:rPr>
+                <w:rFonts w:ascii="Calibri" w:hAnsi="Calibri"/>
+                <w:b w:val="0"/>
+                <w:color w:val="111827"/>
+                <w:sz w:val="17"/>
+              </w:rPr>
+              <w:t>Campaign percentile</w:t>
+            </w:r>
+          </w:p>
+        </w:tc>
+        <w:tc>
+          <w:tcPr>
+            <w:tcW w:type="dxa" w:w="4450"/>
+            <w:tcMar>
+              <w:top w:w="80" w:type="dxa"/>
+              <w:start w:w="120" w:type="dxa"/>
+              <w:bottom w:w="80" w:type="dxa"/>
+              <w:end w:w="120" w:type="dxa"/>
+            </w:tcMar>
+            <w:vAlign w:val="center"/>
+            <w:shd w:fill="FFFFFF"/>
+          </w:tcPr>
+          <w:p>
+            <w:pPr>
+              <w:spacing w:before="0" w:after="40" w:line="252" w:lineRule="auto"/>
+              <w:jc w:val="left"/>
+            </w:pPr>
+            <w:r>
+              <w:rPr>
+                <w:rFonts w:ascii="Calibri" w:hAnsi="Calibri"/>
+                <w:b w:val="0"/>
+                <w:color w:val="111827"/>
+                <w:sz w:val="17"/>
+              </w:rPr>
+              <w:t>Calculate nearest-rank p95 deterministically from routed durations.</w:t>
+            </w:r>
+          </w:p>
+        </w:tc>
+        <w:tc>
+          <w:tcPr>
+            <w:tcW w:type="dxa" w:w="3260"/>
+            <w:tcMar>
+              <w:top w:w="80" w:type="dxa"/>
+              <w:start w:w="120" w:type="dxa"/>
+              <w:bottom w:w="80" w:type="dxa"/>
+              <w:end w:w="120" w:type="dxa"/>
+            </w:tcMar>
+            <w:vAlign w:val="center"/>
+            <w:shd w:fill="FFFFFF"/>
+          </w:tcPr>
+          <w:p>
+            <w:pPr>
+              <w:spacing w:before="0" w:after="40" w:line="252" w:lineRule="auto"/>
+              <w:jc w:val="left"/>
+            </w:pPr>
+            <w:r>
+              <w:rPr>
+                <w:rFonts w:ascii="Calibri" w:hAnsi="Calibri"/>
+                <w:b w:val="0"/>
+                <w:color w:val="111827"/>
+                <w:sz w:val="17"/>
+              </w:rPr>
+              <w:t>Unit/service</w:t>
+            </w:r>
+          </w:p>
+        </w:tc>
+      </w:tr>
+      <w:tr>
+        <w:trPr>
+          <w:cantSplit/>
+        </w:trPr>
+        <w:tc>
+          <w:tcPr>
+            <w:tcW w:type="dxa" w:w="1650"/>
+            <w:tcMar>
+              <w:top w:w="80" w:type="dxa"/>
+              <w:start w:w="120" w:type="dxa"/>
+              <w:bottom w:w="80" w:type="dxa"/>
+              <w:end w:w="120" w:type="dxa"/>
+            </w:tcMar>
+            <w:vAlign w:val="center"/>
+            <w:shd w:fill="FFFFFF"/>
+          </w:tcPr>
+          <w:p>
+            <w:pPr>
+              <w:spacing w:before="0" w:after="40" w:line="252" w:lineRule="auto"/>
+              <w:jc w:val="center"/>
+            </w:pPr>
+            <w:r>
+              <w:rPr>
+                <w:rFonts w:ascii="Calibri" w:hAnsi="Calibri"/>
+                <w:b w:val="0"/>
+                <w:color w:val="111827"/>
+                <w:sz w:val="17"/>
+              </w:rPr>
+              <w:t>Latency budget</w:t>
+            </w:r>
+          </w:p>
+        </w:tc>
+        <w:tc>
+          <w:tcPr>
+            <w:tcW w:type="dxa" w:w="4450"/>
+            <w:tcMar>
+              <w:top w:w="80" w:type="dxa"/>
+              <w:start w:w="120" w:type="dxa"/>
+              <w:bottom w:w="80" w:type="dxa"/>
+              <w:end w:w="120" w:type="dxa"/>
+            </w:tcMar>
+            <w:vAlign w:val="center"/>
+            <w:shd w:fill="FFFFFF"/>
+          </w:tcPr>
+          <w:p>
+            <w:pPr>
+              <w:spacing w:before="0" w:after="40" w:line="252" w:lineRule="auto"/>
+              <w:jc w:val="left"/>
+            </w:pPr>
+            <w:r>
+              <w:rPr>
+                <w:rFonts w:ascii="Calibri" w:hAnsi="Calibri"/>
+                <w:b w:val="0"/>
+                <w:color w:val="111827"/>
+                <w:sz w:val="17"/>
+              </w:rPr>
+              <w:t>Mark delivered steps and campaign status when a budget is exceeded.</w:t>
+            </w:r>
+          </w:p>
+        </w:tc>
+        <w:tc>
+          <w:tcPr>
+            <w:tcW w:type="dxa" w:w="3260"/>
+            <w:tcMar>
+              <w:top w:w="80" w:type="dxa"/>
+              <w:start w:w="120" w:type="dxa"/>
+              <w:bottom w:w="80" w:type="dxa"/>
+              <w:end w:w="120" w:type="dxa"/>
+            </w:tcMar>
+            <w:vAlign w:val="center"/>
+            <w:shd w:fill="FFFFFF"/>
+          </w:tcPr>
+          <w:p>
+            <w:pPr>
+              <w:spacing w:before="0" w:after="40" w:line="252" w:lineRule="auto"/>
+              <w:jc w:val="left"/>
+            </w:pPr>
+            <w:r>
+              <w:rPr>
+                <w:rFonts w:ascii="Calibri" w:hAnsi="Calibri"/>
+                <w:b w:val="0"/>
+                <w:color w:val="111827"/>
+                <w:sz w:val="17"/>
+              </w:rPr>
+              <w:t>Service</w:t>
+            </w:r>
+          </w:p>
+        </w:tc>
+      </w:tr>
+      <w:tr>
+        <w:trPr>
+          <w:cantSplit/>
+        </w:trPr>
+        <w:tc>
+          <w:tcPr>
+            <w:tcW w:type="dxa" w:w="1650"/>
+            <w:tcMar>
+              <w:top w:w="80" w:type="dxa"/>
+              <w:start w:w="120" w:type="dxa"/>
+              <w:bottom w:w="80" w:type="dxa"/>
+              <w:end w:w="120" w:type="dxa"/>
+            </w:tcMar>
+            <w:vAlign w:val="center"/>
+            <w:shd w:fill="FFFFFF"/>
+          </w:tcPr>
+          <w:p>
+            <w:pPr>
+              <w:spacing w:before="0" w:after="40" w:line="252" w:lineRule="auto"/>
+              <w:jc w:val="center"/>
+            </w:pPr>
+            <w:r>
+              <w:rPr>
+                <w:rFonts w:ascii="Calibri" w:hAnsi="Calibri"/>
+                <w:b w:val="0"/>
+                <w:color w:val="111827"/>
+                <w:sz w:val="17"/>
+              </w:rPr>
+              <w:t>Integrated loss</w:t>
+            </w:r>
+          </w:p>
+        </w:tc>
+        <w:tc>
+          <w:tcPr>
+            <w:tcW w:type="dxa" w:w="4450"/>
+            <w:tcMar>
+              <w:top w:w="80" w:type="dxa"/>
+              <w:start w:w="120" w:type="dxa"/>
+              <w:bottom w:w="80" w:type="dxa"/>
+              <w:end w:w="120" w:type="dxa"/>
+            </w:tcMar>
+            <w:vAlign w:val="center"/>
+            <w:shd w:fill="FFFFFF"/>
+          </w:tcPr>
+          <w:p>
+            <w:pPr>
+              <w:spacing w:before="0" w:after="40" w:line="252" w:lineRule="auto"/>
+              <w:jc w:val="left"/>
+            </w:pPr>
+            <w:r>
+              <w:rPr>
+                <w:rFonts w:ascii="Calibri" w:hAnsi="Calibri"/>
+                <w:b w:val="0"/>
+                <w:color w:val="111827"/>
+                <w:sz w:val="17"/>
+              </w:rPr>
+              <w:t>Consume route duration and sequence while recording failed delivery.</w:t>
+            </w:r>
+          </w:p>
+        </w:tc>
+        <w:tc>
+          <w:tcPr>
+            <w:tcW w:type="dxa" w:w="3260"/>
+            <w:tcMar>
+              <w:top w:w="80" w:type="dxa"/>
+              <w:start w:w="120" w:type="dxa"/>
+              <w:bottom w:w="80" w:type="dxa"/>
+              <w:end w:w="120" w:type="dxa"/>
+            </w:tcMar>
+            <w:vAlign w:val="center"/>
+            <w:shd w:fill="FFFFFF"/>
+          </w:tcPr>
+          <w:p>
+            <w:pPr>
+              <w:spacing w:before="0" w:after="40" w:line="252" w:lineRule="auto"/>
+              <w:jc w:val="left"/>
+            </w:pPr>
+            <w:r>
+              <w:rPr>
+                <w:rFonts w:ascii="Calibri" w:hAnsi="Calibri"/>
+                <w:b w:val="0"/>
+                <w:color w:val="111827"/>
+                <w:sz w:val="17"/>
+              </w:rPr>
+              <w:t>Service</w:t>
+            </w:r>
+          </w:p>
+        </w:tc>
+      </w:tr>
+      <w:tr>
+        <w:trPr>
+          <w:cantSplit/>
+        </w:trPr>
+        <w:tc>
+          <w:tcPr>
+            <w:tcW w:type="dxa" w:w="1650"/>
+            <w:tcMar>
+              <w:top w:w="80" w:type="dxa"/>
+              <w:start w:w="120" w:type="dxa"/>
+              <w:bottom w:w="80" w:type="dxa"/>
+              <w:end w:w="120" w:type="dxa"/>
+            </w:tcMar>
+            <w:vAlign w:val="center"/>
+            <w:shd w:fill="FFFFFF"/>
+          </w:tcPr>
+          <w:p>
+            <w:pPr>
+              <w:spacing w:before="0" w:after="40" w:line="252" w:lineRule="auto"/>
+              <w:jc w:val="center"/>
+            </w:pPr>
+            <w:r>
+              <w:rPr>
+                <w:rFonts w:ascii="Calibri" w:hAnsi="Calibri"/>
+                <w:b w:val="0"/>
+                <w:color w:val="111827"/>
+                <w:sz w:val="17"/>
+              </w:rPr>
+              <w:t>Gateway unavailable</w:t>
+            </w:r>
+          </w:p>
+        </w:tc>
+        <w:tc>
+          <w:tcPr>
+            <w:tcW w:type="dxa" w:w="4450"/>
+            <w:tcMar>
+              <w:top w:w="80" w:type="dxa"/>
+              <w:start w:w="120" w:type="dxa"/>
+              <w:bottom w:w="80" w:type="dxa"/>
+              <w:end w:w="120" w:type="dxa"/>
+            </w:tcMar>
+            <w:vAlign w:val="center"/>
+            <w:shd w:fill="FFFFFF"/>
+          </w:tcPr>
+          <w:p>
+            <w:pPr>
+              <w:spacing w:before="0" w:after="40" w:line="252" w:lineRule="auto"/>
+              <w:jc w:val="left"/>
+            </w:pPr>
+            <w:r>
+              <w:rPr>
+                <w:rFonts w:ascii="Calibri" w:hAnsi="Calibri"/>
+                <w:b w:val="0"/>
+                <w:color w:val="111827"/>
+                <w:sz w:val="17"/>
+              </w:rPr>
+              <w:t>Consume idle advance without route duration or sequence allocation.</w:t>
+            </w:r>
+          </w:p>
+        </w:tc>
+        <w:tc>
+          <w:tcPr>
+            <w:tcW w:type="dxa" w:w="3260"/>
+            <w:tcMar>
+              <w:top w:w="80" w:type="dxa"/>
+              <w:start w:w="120" w:type="dxa"/>
+              <w:bottom w:w="80" w:type="dxa"/>
+              <w:end w:w="120" w:type="dxa"/>
+            </w:tcMar>
+            <w:vAlign w:val="center"/>
+            <w:shd w:fill="FFFFFF"/>
+          </w:tcPr>
+          <w:p>
+            <w:pPr>
+              <w:spacing w:before="0" w:after="40" w:line="252" w:lineRule="auto"/>
+              <w:jc w:val="left"/>
+            </w:pPr>
+            <w:r>
+              <w:rPr>
+                <w:rFonts w:ascii="Calibri" w:hAnsi="Calibri"/>
+                <w:b w:val="0"/>
+                <w:color w:val="111827"/>
+                <w:sz w:val="17"/>
+              </w:rPr>
+              <w:t>Service</w:t>
+            </w:r>
+          </w:p>
+        </w:tc>
+      </w:tr>
+      <w:tr>
+        <w:trPr>
+          <w:cantSplit/>
+        </w:trPr>
+        <w:tc>
+          <w:tcPr>
+            <w:tcW w:type="dxa" w:w="1650"/>
+            <w:tcMar>
+              <w:top w:w="80" w:type="dxa"/>
+              <w:start w:w="120" w:type="dxa"/>
+              <w:bottom w:w="80" w:type="dxa"/>
+              <w:end w:w="120" w:type="dxa"/>
+            </w:tcMar>
+            <w:vAlign w:val="center"/>
+            <w:shd w:fill="FFFFFF"/>
+          </w:tcPr>
+          <w:p>
+            <w:pPr>
+              <w:spacing w:before="0" w:after="40" w:line="252" w:lineRule="auto"/>
+              <w:jc w:val="center"/>
+            </w:pPr>
+            <w:r>
+              <w:rPr>
+                <w:rFonts w:ascii="Calibri" w:hAnsi="Calibri"/>
+                <w:b w:val="0"/>
+                <w:color w:val="111827"/>
+                <w:sz w:val="17"/>
+              </w:rPr>
+              <w:t>Campaign status</w:t>
+            </w:r>
+          </w:p>
+        </w:tc>
+        <w:tc>
+          <w:tcPr>
+            <w:tcW w:type="dxa" w:w="4450"/>
+            <w:tcMar>
+              <w:top w:w="80" w:type="dxa"/>
+              <w:start w:w="120" w:type="dxa"/>
+              <w:bottom w:w="80" w:type="dxa"/>
+              <w:end w:w="120" w:type="dxa"/>
+            </w:tcMar>
+            <w:vAlign w:val="center"/>
+            <w:shd w:fill="FFFFFF"/>
+          </w:tcPr>
+          <w:p>
+            <w:pPr>
+              <w:spacing w:before="0" w:after="40" w:line="252" w:lineRule="auto"/>
+              <w:jc w:val="left"/>
+            </w:pPr>
+            <w:r>
+              <w:rPr>
+                <w:rFonts w:ascii="Calibri" w:hAnsi="Calibri"/>
+                <w:b w:val="0"/>
+                <w:color w:val="111827"/>
+                <w:sz w:val="17"/>
+              </w:rPr>
+              <w:t>Distinguish passed, performance-degraded, and failed results.</w:t>
+            </w:r>
+          </w:p>
+        </w:tc>
+        <w:tc>
+          <w:tcPr>
+            <w:tcW w:type="dxa" w:w="3260"/>
+            <w:tcMar>
+              <w:top w:w="80" w:type="dxa"/>
+              <w:start w:w="120" w:type="dxa"/>
+              <w:bottom w:w="80" w:type="dxa"/>
+              <w:end w:w="120" w:type="dxa"/>
+            </w:tcMar>
+            <w:vAlign w:val="center"/>
+            <w:shd w:fill="FFFFFF"/>
+          </w:tcPr>
+          <w:p>
+            <w:pPr>
+              <w:spacing w:before="0" w:after="40" w:line="252" w:lineRule="auto"/>
+              <w:jc w:val="left"/>
+            </w:pPr>
+            <w:r>
+              <w:rPr>
+                <w:rFonts w:ascii="Calibri" w:hAnsi="Calibri"/>
+                <w:b w:val="0"/>
+                <w:color w:val="111827"/>
+                <w:sz w:val="17"/>
+              </w:rPr>
+              <w:t>Service</w:t>
+            </w:r>
+          </w:p>
+        </w:tc>
+      </w:tr>
+      <w:tr>
+        <w:trPr>
+          <w:cantSplit/>
+        </w:trPr>
+        <w:tc>
+          <w:tcPr>
+            <w:tcW w:type="dxa" w:w="1650"/>
+            <w:tcMar>
+              <w:top w:w="80" w:type="dxa"/>
+              <w:start w:w="120" w:type="dxa"/>
+              <w:bottom w:w="80" w:type="dxa"/>
+              <w:end w:w="120" w:type="dxa"/>
+            </w:tcMar>
+            <w:vAlign w:val="center"/>
+            <w:shd w:fill="FFFFFF"/>
+          </w:tcPr>
+          <w:p>
+            <w:pPr>
+              <w:spacing w:before="0" w:after="40" w:line="252" w:lineRule="auto"/>
+              <w:jc w:val="center"/>
+            </w:pPr>
+            <w:r>
+              <w:rPr>
+                <w:rFonts w:ascii="Calibri" w:hAnsi="Calibri"/>
+                <w:b w:val="0"/>
+                <w:color w:val="111827"/>
+                <w:sz w:val="17"/>
+              </w:rPr>
+              <w:t>Campaign replay</w:t>
+            </w:r>
+          </w:p>
+        </w:tc>
+        <w:tc>
+          <w:tcPr>
+            <w:tcW w:type="dxa" w:w="4450"/>
+            <w:tcMar>
+              <w:top w:w="80" w:type="dxa"/>
+              <w:start w:w="120" w:type="dxa"/>
+              <w:bottom w:w="80" w:type="dxa"/>
+              <w:end w:w="120" w:type="dxa"/>
+            </w:tcMar>
+            <w:vAlign w:val="center"/>
+            <w:shd w:fill="FFFFFF"/>
+          </w:tcPr>
+          <w:p>
+            <w:pPr>
+              <w:spacing w:before="0" w:after="40" w:line="252" w:lineRule="auto"/>
+              <w:jc w:val="left"/>
+            </w:pPr>
+            <w:r>
+              <w:rPr>
+                <w:rFonts w:ascii="Calibri" w:hAnsi="Calibri"/>
+                <w:b w:val="0"/>
+                <w:color w:val="111827"/>
+                <w:sz w:val="17"/>
+              </w:rPr>
+              <w:t>Return exact persisted evidence without repeating time or sequence.</w:t>
+            </w:r>
+          </w:p>
+        </w:tc>
+        <w:tc>
+          <w:tcPr>
+            <w:tcW w:type="dxa" w:w="3260"/>
+            <w:tcMar>
+              <w:top w:w="80" w:type="dxa"/>
+              <w:start w:w="120" w:type="dxa"/>
+              <w:bottom w:w="80" w:type="dxa"/>
+              <w:end w:w="120" w:type="dxa"/>
+            </w:tcMar>
+            <w:vAlign w:val="center"/>
+            <w:shd w:fill="FFFFFF"/>
+          </w:tcPr>
+          <w:p>
+            <w:pPr>
+              <w:spacing w:before="0" w:after="40" w:line="252" w:lineRule="auto"/>
+              <w:jc w:val="left"/>
+            </w:pPr>
+            <w:r>
+              <w:rPr>
+                <w:rFonts w:ascii="Calibri" w:hAnsi="Calibri"/>
+                <w:b w:val="0"/>
+                <w:color w:val="111827"/>
+                <w:sz w:val="17"/>
+              </w:rPr>
+              <w:t>Service/API</w:t>
+            </w:r>
+          </w:p>
+        </w:tc>
+      </w:tr>
+      <w:tr>
+        <w:trPr>
+          <w:cantSplit/>
+        </w:trPr>
+        <w:tc>
+          <w:tcPr>
+            <w:tcW w:type="dxa" w:w="1650"/>
+            <w:tcMar>
+              <w:top w:w="80" w:type="dxa"/>
+              <w:start w:w="120" w:type="dxa"/>
+              <w:bottom w:w="80" w:type="dxa"/>
+              <w:end w:w="120" w:type="dxa"/>
+            </w:tcMar>
+            <w:vAlign w:val="center"/>
+            <w:shd w:fill="FFFFFF"/>
+          </w:tcPr>
+          <w:p>
+            <w:pPr>
+              <w:spacing w:before="0" w:after="40" w:line="252" w:lineRule="auto"/>
+              <w:jc w:val="center"/>
+            </w:pPr>
+            <w:r>
+              <w:rPr>
+                <w:rFonts w:ascii="Calibri" w:hAnsi="Calibri"/>
+                <w:b w:val="0"/>
+                <w:color w:val="111827"/>
+                <w:sz w:val="17"/>
+              </w:rPr>
+              <w:t>Campaign conflict</w:t>
+            </w:r>
+          </w:p>
+        </w:tc>
+        <w:tc>
+          <w:tcPr>
+            <w:tcW w:type="dxa" w:w="4450"/>
+            <w:tcMar>
+              <w:top w:w="80" w:type="dxa"/>
+              <w:start w:w="120" w:type="dxa"/>
+              <w:bottom w:w="80" w:type="dxa"/>
+              <w:end w:w="120" w:type="dxa"/>
+            </w:tcMar>
+            <w:vAlign w:val="center"/>
+            <w:shd w:fill="FFFFFF"/>
+          </w:tcPr>
+          <w:p>
+            <w:pPr>
+              <w:spacing w:before="0" w:after="40" w:line="252" w:lineRule="auto"/>
+              <w:jc w:val="left"/>
+            </w:pPr>
+            <w:r>
+              <w:rPr>
+                <w:rFonts w:ascii="Calibri" w:hAnsi="Calibri"/>
+                <w:b w:val="0"/>
+                <w:color w:val="111827"/>
+                <w:sz w:val="17"/>
+              </w:rPr>
+              <w:t>Reject changed command-ID reuse using the canonical fingerprint.</w:t>
+            </w:r>
+          </w:p>
+        </w:tc>
+        <w:tc>
+          <w:tcPr>
+            <w:tcW w:type="dxa" w:w="3260"/>
+            <w:tcMar>
+              <w:top w:w="80" w:type="dxa"/>
+              <w:start w:w="120" w:type="dxa"/>
+              <w:bottom w:w="80" w:type="dxa"/>
+              <w:end w:w="120" w:type="dxa"/>
+            </w:tcMar>
+            <w:vAlign w:val="center"/>
+            <w:shd w:fill="FFFFFF"/>
+          </w:tcPr>
+          <w:p>
+            <w:pPr>
+              <w:spacing w:before="0" w:after="40" w:line="252" w:lineRule="auto"/>
+              <w:jc w:val="left"/>
+            </w:pPr>
+            <w:r>
+              <w:rPr>
+                <w:rFonts w:ascii="Calibri" w:hAnsi="Calibri"/>
+                <w:b w:val="0"/>
+                <w:color w:val="111827"/>
+                <w:sz w:val="17"/>
+              </w:rPr>
+              <w:t>Service/API</w:t>
+            </w:r>
+          </w:p>
+        </w:tc>
+      </w:tr>
+      <w:tr>
+        <w:trPr>
+          <w:cantSplit/>
+        </w:trPr>
+        <w:tc>
+          <w:tcPr>
+            <w:tcW w:type="dxa" w:w="1650"/>
+            <w:tcMar>
+              <w:top w:w="80" w:type="dxa"/>
+              <w:start w:w="120" w:type="dxa"/>
+              <w:bottom w:w="80" w:type="dxa"/>
+              <w:end w:w="120" w:type="dxa"/>
+            </w:tcMar>
+            <w:vAlign w:val="center"/>
+            <w:shd w:fill="FFFFFF"/>
+          </w:tcPr>
+          <w:p>
+            <w:pPr>
+              <w:spacing w:before="0" w:after="40" w:line="252" w:lineRule="auto"/>
+              <w:jc w:val="center"/>
+            </w:pPr>
+            <w:r>
+              <w:rPr>
+                <w:rFonts w:ascii="Calibri" w:hAnsi="Calibri"/>
+                <w:b w:val="0"/>
+                <w:color w:val="111827"/>
+                <w:sz w:val="17"/>
+              </w:rPr>
+              <w:t>Campaign minimization</w:t>
+            </w:r>
+          </w:p>
+        </w:tc>
+        <w:tc>
+          <w:tcPr>
+            <w:tcW w:type="dxa" w:w="4450"/>
+            <w:tcMar>
+              <w:top w:w="80" w:type="dxa"/>
+              <w:start w:w="120" w:type="dxa"/>
+              <w:bottom w:w="80" w:type="dxa"/>
+              <w:end w:w="120" w:type="dxa"/>
+            </w:tcMar>
+            <w:vAlign w:val="center"/>
+            <w:shd w:fill="FFFFFF"/>
+          </w:tcPr>
+          <w:p>
+            <w:pPr>
+              <w:spacing w:before="0" w:after="40" w:line="252" w:lineRule="auto"/>
+              <w:jc w:val="left"/>
+            </w:pPr>
+            <w:r>
+              <w:rPr>
+                <w:rFonts w:ascii="Calibri" w:hAnsi="Calibri"/>
+                <w:b w:val="0"/>
+                <w:color w:val="111827"/>
+                <w:sz w:val="17"/>
+              </w:rPr>
+              <w:t>Exclude payload values from summaries, traces, audit, and outbox.</w:t>
+            </w:r>
+          </w:p>
+        </w:tc>
+        <w:tc>
+          <w:tcPr>
+            <w:tcW w:type="dxa" w:w="3260"/>
+            <w:tcMar>
+              <w:top w:w="80" w:type="dxa"/>
+              <w:start w:w="120" w:type="dxa"/>
+              <w:bottom w:w="80" w:type="dxa"/>
+              <w:end w:w="120" w:type="dxa"/>
+            </w:tcMar>
+            <w:vAlign w:val="center"/>
+            <w:shd w:fill="FFFFFF"/>
+          </w:tcPr>
+          <w:p>
+            <w:pPr>
+              <w:spacing w:before="0" w:after="40" w:line="252" w:lineRule="auto"/>
+              <w:jc w:val="left"/>
+            </w:pPr>
+            <w:r>
+              <w:rPr>
+                <w:rFonts w:ascii="Calibri" w:hAnsi="Calibri"/>
+                <w:b w:val="0"/>
+                <w:color w:val="111827"/>
+                <w:sz w:val="17"/>
+              </w:rPr>
+              <w:t>Service</w:t>
+            </w:r>
+          </w:p>
+        </w:tc>
+      </w:tr>
+      <w:tr>
+        <w:trPr>
+          <w:cantSplit/>
+        </w:trPr>
+        <w:tc>
+          <w:tcPr>
+            <w:tcW w:type="dxa" w:w="1650"/>
+            <w:tcMar>
+              <w:top w:w="80" w:type="dxa"/>
+              <w:start w:w="120" w:type="dxa"/>
+              <w:bottom w:w="80" w:type="dxa"/>
+              <w:end w:w="120" w:type="dxa"/>
+            </w:tcMar>
+            <w:vAlign w:val="center"/>
+            <w:shd w:fill="FFFFFF"/>
+          </w:tcPr>
+          <w:p>
+            <w:pPr>
+              <w:spacing w:before="0" w:after="40" w:line="252" w:lineRule="auto"/>
+              <w:jc w:val="center"/>
+            </w:pPr>
+            <w:r>
+              <w:rPr>
+                <w:rFonts w:ascii="Calibri" w:hAnsi="Calibri"/>
+                <w:b w:val="0"/>
+                <w:color w:val="111827"/>
+                <w:sz w:val="17"/>
+              </w:rPr>
+              <w:t>Campaign RBAC</w:t>
+            </w:r>
+          </w:p>
+        </w:tc>
+        <w:tc>
+          <w:tcPr>
+            <w:tcW w:type="dxa" w:w="4450"/>
+            <w:tcMar>
+              <w:top w:w="80" w:type="dxa"/>
+              <w:start w:w="120" w:type="dxa"/>
+              <w:bottom w:w="80" w:type="dxa"/>
+              <w:end w:w="120" w:type="dxa"/>
+            </w:tcMar>
+            <w:vAlign w:val="center"/>
+            <w:shd w:fill="FFFFFF"/>
+          </w:tcPr>
+          <w:p>
+            <w:pPr>
+              <w:spacing w:before="0" w:after="40" w:line="252" w:lineRule="auto"/>
+              <w:jc w:val="left"/>
+            </w:pPr>
+            <w:r>
+              <w:rPr>
+                <w:rFonts w:ascii="Calibri" w:hAnsi="Calibri"/>
+                <w:b w:val="0"/>
+                <w:color w:val="111827"/>
+                <w:sz w:val="17"/>
+              </w:rPr>
+              <w:t>Require manage for execution and read for history/detail.</w:t>
+            </w:r>
+          </w:p>
+        </w:tc>
+        <w:tc>
+          <w:tcPr>
+            <w:tcW w:type="dxa" w:w="3260"/>
+            <w:tcMar>
+              <w:top w:w="80" w:type="dxa"/>
+              <w:start w:w="120" w:type="dxa"/>
+              <w:bottom w:w="80" w:type="dxa"/>
+              <w:end w:w="120" w:type="dxa"/>
+            </w:tcMar>
+            <w:vAlign w:val="center"/>
+            <w:shd w:fill="FFFFFF"/>
+          </w:tcPr>
+          <w:p>
+            <w:pPr>
+              <w:spacing w:before="0" w:after="40" w:line="252" w:lineRule="auto"/>
+              <w:jc w:val="left"/>
+            </w:pPr>
+            <w:r>
+              <w:rPr>
+                <w:rFonts w:ascii="Calibri" w:hAnsi="Calibri"/>
+                <w:b w:val="0"/>
+                <w:color w:val="111827"/>
+                <w:sz w:val="17"/>
+              </w:rPr>
+              <w:t>API/integration</w:t>
+            </w:r>
+          </w:p>
+        </w:tc>
+      </w:tr>
+      <w:tr>
+        <w:trPr>
+          <w:cantSplit/>
+        </w:trPr>
+        <w:tc>
+          <w:tcPr>
+            <w:tcW w:type="dxa" w:w="1650"/>
+            <w:tcMar>
+              <w:top w:w="80" w:type="dxa"/>
+              <w:start w:w="120" w:type="dxa"/>
+              <w:bottom w:w="80" w:type="dxa"/>
+              <w:end w:w="120" w:type="dxa"/>
+            </w:tcMar>
+            <w:vAlign w:val="center"/>
+            <w:shd w:fill="FFFFFF"/>
+          </w:tcPr>
+          <w:p>
+            <w:pPr>
+              <w:spacing w:before="0" w:after="40" w:line="252" w:lineRule="auto"/>
+              <w:jc w:val="center"/>
+            </w:pPr>
+            <w:r>
+              <w:rPr>
+                <w:rFonts w:ascii="Calibri" w:hAnsi="Calibri"/>
+                <w:b w:val="0"/>
+                <w:color w:val="111827"/>
+                <w:sz w:val="17"/>
+              </w:rPr>
+              <w:t>Campaign migration</w:t>
+            </w:r>
+          </w:p>
+        </w:tc>
+        <w:tc>
+          <w:tcPr>
+            <w:tcW w:type="dxa" w:w="4450"/>
+            <w:tcMar>
+              <w:top w:w="80" w:type="dxa"/>
+              <w:start w:w="120" w:type="dxa"/>
+              <w:bottom w:w="80" w:type="dxa"/>
+              <w:end w:w="120" w:type="dxa"/>
+            </w:tcMar>
+            <w:vAlign w:val="center"/>
+            <w:shd w:fill="FFFFFF"/>
+          </w:tcPr>
+          <w:p>
+            <w:pPr>
+              <w:spacing w:before="0" w:after="40" w:line="252" w:lineRule="auto"/>
+              <w:jc w:val="left"/>
+            </w:pPr>
+            <w:r>
+              <w:rPr>
+                <w:rFonts w:ascii="Calibri" w:hAnsi="Calibri"/>
+                <w:b w:val="0"/>
+                <w:color w:val="111827"/>
+                <w:sz w:val="17"/>
+              </w:rPr>
+              <w:t>Upgrade and downgrade execution persistence and indexes.</w:t>
             </w:r>
           </w:p>
         </w:tc>
@@ -13234,7 +15100,7 @@
           <w:color w:val="1F4D78"/>
           <w:sz w:val="19"/>
         </w:rPr>
-        <w:t>0029_multibus_gateway</w:t>
+        <w:t>0030_multibus_campaigns</w:t>
       </w:r>
       <w:r>
         <w:rPr>
@@ -13438,7 +15304,7 @@
           <w:color w:val="111827"/>
           <w:sz w:val="22"/>
         </w:rPr>
-        <w:t xml:space="preserve"> and </w:t>
+        <w:t xml:space="preserve">, </w:t>
       </w:r>
       <w:r>
         <w:rPr>
@@ -13447,6 +15313,22 @@
           <w:sz w:val="19"/>
         </w:rPr>
         <w:t>atep.vehicle.gateway.routed.v1</w:t>
+      </w:r>
+      <w:r>
+        <w:rPr>
+          <w:rFonts w:ascii="Calibri" w:hAnsi="Calibri"/>
+          <w:color w:val="111827"/>
+          <w:sz w:val="22"/>
+        </w:rPr>
+        <w:t xml:space="preserve">, and </w:t>
+      </w:r>
+      <w:r>
+        <w:rPr>
+          <w:rFonts w:ascii="Consolas" w:hAnsi="Consolas"/>
+          <w:color w:val="1F4D78"/>
+          <w:sz w:val="19"/>
+        </w:rPr>
+        <w:t>atep.vehicle.multibus.campaign.completed.v1</w:t>
       </w:r>
       <w:r>
         <w:rPr>
@@ -13520,7 +15402,7 @@
           <w:color w:val="111827"/>
           <w:sz w:val="22"/>
         </w:rPr>
-        <w:t>Automated tests cover validation, priority, classic and FD timing mathematics, mixed arbitration, readiness, delivery, utilization, versioning, replay, errors, DBC bit placement through 512 bits, signed scaling, exact conversion, TEC/REC thresholds, loss, bus-off enforcement, recovery timing, LIN/Ethernet bounds and timing, gateway routing, evidence minimization, persistence, and OpenAPI.</w:t>
+        <w:t>Automated tests cover validation, priority, classic and FD timing mathematics, mixed arbitration, readiness, delivery, utilization, versioning, replay, errors, DBC bit placement through 512 bits, signed scaling, exact conversion, TEC/REC thresholds, loss, bus-off enforcement, recovery timing, LIN/Ethernet bounds and timing, gateway routing, campaign traces, latency budgets, integrated failures, evidence minimization, persistence, and OpenAPI.</w:t>
       </w:r>
     </w:p>
     <w:p>
@@ -13772,6 +15654,40 @@
     </w:p>
     <w:p>
       <w:pPr>
+        <w:pStyle w:val="ListBullet"/>
+        <w:numPr>
+          <w:ilvl w:val="0"/>
+          <w:numId w:val="14"/>
+        </w:numPr>
+      </w:pPr>
+      <w:r>
+        <w:rPr>
+          <w:rFonts w:ascii="Calibri" w:hAnsi="Calibri"/>
+          <w:color w:val="111827"/>
+          <w:sz w:val="22"/>
+        </w:rPr>
+        <w:t>Campaign percentiles operate on bounded in-memory duration sets; large fleet analytics belong in the future Data Lake volume.</w:t>
+      </w:r>
+    </w:p>
+    <w:p>
+      <w:pPr>
+        <w:pStyle w:val="ListBullet"/>
+        <w:numPr>
+          <w:ilvl w:val="0"/>
+          <w:numId w:val="14"/>
+        </w:numPr>
+      </w:pPr>
+      <w:r>
+        <w:rPr>
+          <w:rFonts w:ascii="Calibri" w:hAnsi="Calibri"/>
+          <w:color w:val="111827"/>
+          <w:sz w:val="22"/>
+        </w:rPr>
+        <w:t>Failure modes are deterministic test controls, not electrical or physical gateway-failure simulations.</w:t>
+      </w:r>
+    </w:p>
+    <w:p>
+      <w:pPr>
         <w:pStyle w:val="Heading1"/>
         <w:keepNext/>
         <w:keepLines/>
@@ -13787,23 +15703,7 @@
           <w:color w:val="111827"/>
           <w:sz w:val="22"/>
         </w:rPr>
-        <w:t xml:space="preserve">The recommended next increment is IV-7: multi-bus campaigns, traces, performance evidence, and integrated failure scenarios. See </w:t>
-      </w:r>
-      <w:r>
-        <w:rPr>
-          <w:rFonts w:ascii="Consolas" w:hAnsi="Consolas"/>
-          <w:color w:val="1F4D78"/>
-          <w:sz w:val="19"/>
-        </w:rPr>
-        <w:t>docs/roadmap-volume-iv.md</w:t>
-      </w:r>
-      <w:r>
-        <w:rPr>
-          <w:rFonts w:ascii="Calibri" w:hAnsi="Calibri"/>
-          <w:color w:val="111827"/>
-          <w:sz w:val="22"/>
-        </w:rPr>
-        <w:t>.</w:t>
+        <w:t>Volume IV is complete through IV-7. The recommended next development is Volume V-1: diagnostic sessions, DTC storage, and foundational UDS service contracts.</w:t>
       </w:r>
     </w:p>
     <w:p>
@@ -14470,6 +16370,91 @@
         <w:t>Propose a bit-stuffing extension that preserves the IV-4 transparent timing evidence.</w:t>
       </w:r>
     </w:p>
+    <w:p>
+      <w:pPr>
+        <w:pStyle w:val="ListNumber"/>
+        <w:numPr>
+          <w:ilvl w:val="0"/>
+          <w:numId w:val="15"/>
+        </w:numPr>
+      </w:pPr>
+      <w:r>
+        <w:rPr>
+          <w:rFonts w:ascii="Calibri" w:hAnsi="Calibri"/>
+          <w:color w:val="111827"/>
+          <w:sz w:val="22"/>
+        </w:rPr>
+        <w:t>Calculate campaign utilization for 3154 occupied microseconds in a 3229-microsecond window.</w:t>
+      </w:r>
+    </w:p>
+    <w:p>
+      <w:pPr>
+        <w:pStyle w:val="ListNumber"/>
+        <w:numPr>
+          <w:ilvl w:val="0"/>
+          <w:numId w:val="15"/>
+        </w:numPr>
+      </w:pPr>
+      <w:r>
+        <w:rPr>
+          <w:rFonts w:ascii="Calibri" w:hAnsi="Calibri"/>
+          <w:color w:val="111827"/>
+          <w:sz w:val="22"/>
+        </w:rPr>
+        <w:t>Explain why a lost routed frame consumes sequence and bus time while an unavailable gateway does not.</w:t>
+      </w:r>
+    </w:p>
+    <w:p>
+      <w:pPr>
+        <w:pStyle w:val="ListNumber"/>
+        <w:numPr>
+          <w:ilvl w:val="0"/>
+          <w:numId w:val="15"/>
+        </w:numPr>
+      </w:pPr>
+      <w:r>
+        <w:rPr>
+          <w:rFonts w:ascii="Calibri" w:hAnsi="Calibri"/>
+          <w:color w:val="111827"/>
+          <w:sz w:val="22"/>
+        </w:rPr>
+        <w:t>Prove the nearest-rank p95 result for a campaign containing durations of 4 and 3150 microseconds.</w:t>
+      </w:r>
+    </w:p>
+    <w:p>
+      <w:pPr>
+        <w:pStyle w:val="ListNumber"/>
+        <w:numPr>
+          <w:ilvl w:val="0"/>
+          <w:numId w:val="15"/>
+        </w:numPr>
+      </w:pPr>
+      <w:r>
+        <w:rPr>
+          <w:rFonts w:ascii="Calibri" w:hAnsi="Calibri"/>
+          <w:color w:val="111827"/>
+          <w:sz w:val="22"/>
+        </w:rPr>
+        <w:t>Design a three-step campaign that becomes performance-degraded without any delivery failure.</w:t>
+      </w:r>
+    </w:p>
+    <w:p>
+      <w:pPr>
+        <w:pStyle w:val="ListNumber"/>
+        <w:numPr>
+          <w:ilvl w:val="0"/>
+          <w:numId w:val="15"/>
+        </w:numPr>
+      </w:pPr>
+      <w:r>
+        <w:rPr>
+          <w:rFonts w:ascii="Calibri" w:hAnsi="Calibri"/>
+          <w:color w:val="111827"/>
+          <w:sz w:val="22"/>
+        </w:rPr>
+        <w:t>Explain how a full-input fingerprint permits payload-free persisted request summaries.</w:t>
+      </w:r>
+    </w:p>
     <w:sectPr>
       <w:headerReference w:type="default" r:id="rId9"/>
       <w:footerReference w:type="default" r:id="rId10"/>
@@ -14499,7 +16484,7 @@
         <w:color w:val="667085"/>
         <w:sz w:val="17"/>
       </w:rPr>
-      <w:t>ATEP Volume IV Workbook  |  Version 0.6.0</w:t>
+      <w:t>ATEP Volume IV Workbook  |  Version 0.7.0</w:t>
     </w:r>
     <w:r>
       <w:rPr>

</xml_diff>